<commit_message>
Dolphins: replace 'Chapter N' headings with each chapter's time period (_generate.js, chapter .md, Complete Manuscript .md/.docx, chapter .docx); notes updated with the new rule. Old versions in D:\bak\2026-10-02 Dolphins chapter-periods
</commit_message>
<xml_diff>
--- a/The Dolphins' View of History/The Dolphins' View of History - Complete Manuscript.docx
+++ b/The Dolphins' View of History/The Dolphins' View of History - Complete Manuscript.docx
@@ -471,7 +471,7 @@
           <w:sz w:val="36"/>
           <w:szCs w:val="36"/>
         </w:rPr>
-        <w:t xml:space="preserve">Chapter 1: No Hands, No Cities — Why the Dolphins Only Watched</w:t>
+        <w:t xml:space="preserve">The Last Fifty Million Years: No Hands, No Cities — Why the Dolphins Only Watched</w:t>
       </w:r>
     </w:p>
     <w:p>
@@ -751,7 +751,7 @@
           <w:sz w:val="36"/>
           <w:szCs w:val="36"/>
         </w:rPr>
-        <w:t xml:space="preserve">Chapter 2: Where Everyone Is From — Africa and the Making of Humans</w:t>
+        <w:t xml:space="preserve">7 Million to 300,000 Years Ago: Where Everyone Is From — Africa and the Making of Humans</w:t>
       </w:r>
     </w:p>
     <w:p>
@@ -899,7 +899,7 @@
           <w:sz w:val="36"/>
           <w:szCs w:val="36"/>
         </w:rPr>
-        <w:t xml:space="preserve">Chapter 3: The First Fires — Early Humans and the Spark of Culture</w:t>
+        <w:t xml:space="preserve">The Old Stone Age, a Million Years Ago: The First Fires — Early Humans and the Spark of Culture</w:t>
       </w:r>
     </w:p>
     <w:p>
@@ -1059,7 +1059,7 @@
           <w:sz w:val="36"/>
           <w:szCs w:val="36"/>
         </w:rPr>
-        <w:t xml:space="preserve">Chapter 4: Out of Africa — The Long Walk Across the World</w:t>
+        <w:t xml:space="preserve">70,000 to 15,000 Years Ago: Out of Africa — The Long Walk Across the World</w:t>
       </w:r>
     </w:p>
     <w:p>
@@ -1227,7 +1227,7 @@
           <w:sz w:val="36"/>
           <w:szCs w:val="36"/>
         </w:rPr>
-        <w:t xml:space="preserve">Chapter 5: The First Villages — Agriculture and the End of Wandering</w:t>
+        <w:t xml:space="preserve">The Neolithic, from 10,000 BCE: The First Villages — Agriculture and the End of Wandering</w:t>
       </w:r>
     </w:p>
     <w:p>
@@ -1423,7 +1423,7 @@
           <w:sz w:val="36"/>
           <w:szCs w:val="36"/>
         </w:rPr>
-        <w:t xml:space="preserve">Chapter 6: Writing and Memory — How Humans Learned to Speak to the Future</w:t>
+        <w:t xml:space="preserve">From 3200 BCE: Writing and Memory — How Humans Learned to Speak to the Future</w:t>
       </w:r>
     </w:p>
     <w:p>
@@ -1599,7 +1599,7 @@
           <w:sz w:val="36"/>
           <w:szCs w:val="36"/>
         </w:rPr>
-        <w:t xml:space="preserve">Chapter 7: Gods and Kings — Mesopotamia, Egypt, and the First Empires</w:t>
+        <w:t xml:space="preserve">The Bronze Age, 3100–1150 BCE: Gods and Kings — Mesopotamia, Egypt, and the First Empires</w:t>
       </w:r>
     </w:p>
     <w:p>
@@ -1775,7 +1775,7 @@
           <w:sz w:val="36"/>
           <w:szCs w:val="36"/>
         </w:rPr>
-        <w:t xml:space="preserve">Chapter 8: The Middle Kingdom — China's Long Civilization</w:t>
+        <w:t xml:space="preserve">1600 BCE to 589 CE: The Middle Kingdom — China's Long Civilization</w:t>
       </w:r>
     </w:p>
     <w:p>
@@ -1923,7 +1923,7 @@
           <w:sz w:val="36"/>
           <w:szCs w:val="36"/>
         </w:rPr>
-        <w:t xml:space="preserve">Chapter 9: The Subcontinent — Zero, Gods, and Glorious Complexity</w:t>
+        <w:t xml:space="preserve">2600 BCE to 550 CE: The Subcontinent — Zero, Gods, and Glorious Complexity</w:t>
       </w:r>
     </w:p>
     <w:p>
@@ -2079,7 +2079,7 @@
           <w:sz w:val="36"/>
           <w:szCs w:val="36"/>
         </w:rPr>
-        <w:t xml:space="preserve">Chapter 10: Democracy's Experiment — Ancient Greece</w:t>
+        <w:t xml:space="preserve">Classical Greece, 508–323 BCE: Democracy's Experiment — Ancient Greece</w:t>
       </w:r>
     </w:p>
     <w:p>
@@ -2207,7 +2207,7 @@
           <w:sz w:val="36"/>
           <w:szCs w:val="36"/>
         </w:rPr>
-        <w:t xml:space="preserve">Chapter 11: Rome — The Empire That Built the World and Broke It</w:t>
+        <w:t xml:space="preserve">The 8th Century BCE to 476 CE: Rome — The Empire That Built the World and Broke It</w:t>
       </w:r>
     </w:p>
     <w:p>
@@ -2367,7 +2367,7 @@
           <w:sz w:val="36"/>
           <w:szCs w:val="36"/>
         </w:rPr>
-        <w:t xml:space="preserve">Chapter 12: Faiths, Crusades, and the Medieval World</w:t>
+        <w:t xml:space="preserve">The 5th Century BCE to 1291 CE: Faiths, Crusades, and the Medieval World</w:t>
       </w:r>
     </w:p>
     <w:p>
@@ -2531,7 +2531,7 @@
           <w:sz w:val="36"/>
           <w:szCs w:val="36"/>
         </w:rPr>
-        <w:t xml:space="preserve">Chapter 13: The Allegedly Dark Ages</w:t>
+        <w:t xml:space="preserve">The Early Middle Ages, 476–1000 CE: The Allegedly Dark Ages</w:t>
       </w:r>
     </w:p>
     <w:p>
@@ -2823,7 +2823,7 @@
           <w:sz w:val="36"/>
           <w:szCs w:val="36"/>
         </w:rPr>
-        <w:t xml:space="preserve">Chapter 14: Silk, Steppe, and Plague — The Roads That Connected Everyone, Including the Germs</w:t>
+        <w:t xml:space="preserve">The 2nd Century BCE to 1368 CE: Silk, Steppe, and Plague — The Roads That Connected Everyone, Including the Germs</w:t>
       </w:r>
     </w:p>
     <w:p>
@@ -2955,7 +2955,7 @@
           <w:sz w:val="36"/>
           <w:szCs w:val="36"/>
         </w:rPr>
-        <w:t xml:space="preserve">Chapter 15: Gold, Salt, and Stone — The Kingdoms of Africa</w:t>
+        <w:t xml:space="preserve">The 8th Century BCE to 1897 CE: Gold, Salt, and Stone — The Kingdoms of Africa</w:t>
       </w:r>
     </w:p>
     <w:p>
@@ -3087,7 +3087,7 @@
           <w:sz w:val="36"/>
           <w:szCs w:val="36"/>
         </w:rPr>
-        <w:t xml:space="preserve">Chapter 16: Before Columbus — Cities, Corn, and Knotted String</w:t>
+        <w:t xml:space="preserve">2600 BCE to 1491 CE: Before Columbus — Cities, Corn, and Knotted String</w:t>
       </w:r>
     </w:p>
     <w:p>
@@ -3219,7 +3219,7 @@
           <w:sz w:val="36"/>
           <w:szCs w:val="36"/>
         </w:rPr>
-        <w:t xml:space="preserve">Chapter 17: Ships, Gunpowder, and Gold — Exploration, Conquest, and the Colonial Age</w:t>
+        <w:t xml:space="preserve">The 15th to 17th Centuries: Ships, Gunpowder, and Gold — Exploration, Conquest, and the Colonial Age</w:t>
       </w:r>
     </w:p>
     <w:p>
@@ -3391,7 +3391,7 @@
           <w:sz w:val="36"/>
           <w:szCs w:val="36"/>
         </w:rPr>
-        <w:t xml:space="preserve">Chapter 18: Machines and Manifestos — Renaissance, Enlightenment, and Industry</w:t>
+        <w:t xml:space="preserve">1450 to the Late 1800s: Machines and Manifestos — Renaissance, Enlightenment, and Industry</w:t>
       </w:r>
     </w:p>
     <w:p>
@@ -3551,7 +3551,7 @@
           <w:sz w:val="36"/>
           <w:szCs w:val="36"/>
         </w:rPr>
-        <w:t xml:space="preserve">Chapter 19: The Republic, With Exceptions — America, 1776-1865</w:t>
+        <w:t xml:space="preserve">1776–1865: The Republic, With Exceptions — America</w:t>
       </w:r>
     </w:p>
     <w:p>
@@ -3675,7 +3675,7 @@
           <w:sz w:val="36"/>
           <w:szCs w:val="36"/>
         </w:rPr>
-        <w:t xml:space="preserve">Chapter 20: God's Own Experiment — Religion in America</w:t>
+        <w:t xml:space="preserve">1620 to 1993: God's Own Experiment — Religion in America</w:t>
       </w:r>
     </w:p>
     <w:p>
@@ -3819,7 +3819,7 @@
           <w:sz w:val="36"/>
           <w:szCs w:val="36"/>
         </w:rPr>
-        <w:t xml:space="preserve">Chapter 21: Home by Christmas — The First World War</w:t>
+        <w:t xml:space="preserve">1914–1918: Home by Christmas — The First World War</w:t>
       </w:r>
     </w:p>
     <w:p>
@@ -3971,7 +3971,7 @@
           <w:sz w:val="36"/>
           <w:szCs w:val="36"/>
         </w:rPr>
-        <w:t xml:space="preserve">Chapter 22: Genius and Catastrophe — Great Countries, Terrible Decades</w:t>
+        <w:t xml:space="preserve">The Twentieth Century: Genius and Catastrophe — Great Countries, Terrible Decades</w:t>
       </w:r>
     </w:p>
     <w:p>
@@ -4227,7 +4227,7 @@
           <w:sz w:val="36"/>
           <w:szCs w:val="36"/>
         </w:rPr>
-        <w:t xml:space="preserve">Chapter 23: Japan, Restoration, and Empire</w:t>
+        <w:t xml:space="preserve">1853–1947: Japan, Restoration, and Empire</w:t>
       </w:r>
     </w:p>
     <w:p>
@@ -4363,7 +4363,7 @@
           <w:sz w:val="36"/>
           <w:szCs w:val="36"/>
         </w:rPr>
-        <w:t xml:space="preserve">Chapter 24: Italy, Rome's Heir and the Fascist Detour</w:t>
+        <w:t xml:space="preserve">1861–1946: Italy, Rome's Heir and the Fascist Detour</w:t>
       </w:r>
     </w:p>
     <w:p>
@@ -4507,7 +4507,7 @@
           <w:sz w:val="36"/>
           <w:szCs w:val="36"/>
         </w:rPr>
-        <w:t xml:space="preserve">Chapter 25: Spain, Convivencia and the General</w:t>
+        <w:t xml:space="preserve">Medieval Córdoba to 1981: Spain, Convivencia and the General</w:t>
       </w:r>
     </w:p>
     <w:p>
@@ -4655,7 +4655,7 @@
           <w:sz w:val="36"/>
           <w:szCs w:val="36"/>
         </w:rPr>
-        <w:t xml:space="preserve">Chapter 26: The Soviet Union, Ideals and Iron</w:t>
+        <w:t xml:space="preserve">1917–1991: The Soviet Union, Ideals and Iron</w:t>
       </w:r>
     </w:p>
     <w:p>
@@ -4807,7 +4807,7 @@
           <w:sz w:val="36"/>
           <w:szCs w:val="36"/>
         </w:rPr>
-        <w:t xml:space="preserve">Chapter 27: China, the Long Memory and the Great Leap</w:t>
+        <w:t xml:space="preserve">1949 to Today: China, the Long Memory and the Great Leap</w:t>
       </w:r>
     </w:p>
     <w:p>
@@ -4971,7 +4971,7 @@
           <w:sz w:val="36"/>
           <w:szCs w:val="36"/>
         </w:rPr>
-        <w:t xml:space="preserve">Chapter 28: The People Who Kept Their Story — A Complete History of the Jews</w:t>
+        <w:t xml:space="preserve">The 13th Century BCE to 1948 CE: The People Who Kept Their Story — A Complete History of the Jews</w:t>
       </w:r>
     </w:p>
     <w:p>
@@ -5187,7 +5187,7 @@
           <w:sz w:val="36"/>
           <w:szCs w:val="36"/>
         </w:rPr>
-        <w:t xml:space="preserve">Chapter 29: Cold War — Two Powers, One Planet</w:t>
+        <w:t xml:space="preserve">1945–1991: Cold War — Two Powers, One Planet</w:t>
       </w:r>
     </w:p>
     <w:p>
@@ -5347,7 +5347,7 @@
           <w:sz w:val="36"/>
           <w:szCs w:val="36"/>
         </w:rPr>
-        <w:t xml:space="preserve">Chapter 30: Leaving the Cradle — Space Travel, the Moon, Mars, and (Maybe) the Galaxy</w:t>
+        <w:t xml:space="preserve">1957 to 2026: Leaving the Cradle — Space Travel, the Moon, Mars, and (Maybe) the Galaxy</w:t>
       </w:r>
     </w:p>
     <w:p>
@@ -5479,7 +5479,7 @@
           <w:sz w:val="36"/>
           <w:szCs w:val="36"/>
         </w:rPr>
-        <w:t xml:space="preserve">Chapter 31: The Physics That Finally Made Sense to Someone</w:t>
+        <w:t xml:space="preserve">1905 Onward: The Physics That Finally Made Sense to Someone</w:t>
       </w:r>
     </w:p>
     <w:p>
@@ -5631,7 +5631,7 @@
           <w:sz w:val="36"/>
           <w:szCs w:val="36"/>
         </w:rPr>
-        <w:t xml:space="preserve">Chapter 32: Decolonization — The World Redraws Itself</w:t>
+        <w:t xml:space="preserve">The 1940s to the 1970s: Decolonization — The World Redraws Itself</w:t>
       </w:r>
     </w:p>
     <w:p>
@@ -5759,7 +5759,7 @@
           <w:sz w:val="36"/>
           <w:szCs w:val="36"/>
         </w:rPr>
-        <w:t xml:space="preserve">Chapter 33: Civil Rights and Liberation — Humanity Argues With Itself</w:t>
+        <w:t xml:space="preserve">1893 to 1994: Civil Rights and Liberation — Humanity Argues With Itself</w:t>
       </w:r>
     </w:p>
     <w:p>
@@ -5875,7 +5875,7 @@
           <w:sz w:val="36"/>
           <w:szCs w:val="36"/>
         </w:rPr>
-        <w:t xml:space="preserve">Chapter 34: The Digital Leap — Computers, Networks, and a Connected World</w:t>
+        <w:t xml:space="preserve">1843 to 2007: The Digital Leap — Computers, Networks, and a Connected World</w:t>
       </w:r>
     </w:p>
     <w:p>
@@ -6015,7 +6015,7 @@
           <w:sz w:val="36"/>
           <w:szCs w:val="36"/>
         </w:rPr>
-        <w:t xml:space="preserve">Chapter 35: The World Was Supposed to End in 2012 (It Didn't)</w:t>
+        <w:t xml:space="preserve">The Thirteenth B'ak'tun, 2012: The World Was Supposed to End in 2012 (It Didn't)</w:t>
       </w:r>
     </w:p>
     <w:p>
@@ -6155,7 +6155,7 @@
           <w:sz w:val="36"/>
           <w:szCs w:val="36"/>
         </w:rPr>
-        <w:t xml:space="preserve">Chapter 36: Something Might Be Watching (Probably Not What You Think)</w:t>
+        <w:t xml:space="preserve">1950 to the 2020s: Something Might Be Watching (Probably Not What You Think)</w:t>
       </w:r>
     </w:p>
     <w:p>
@@ -6303,7 +6303,7 @@
           <w:sz w:val="36"/>
           <w:szCs w:val="36"/>
         </w:rPr>
-        <w:t xml:space="preserve">Chapter 37: Medicine and Its Cost — How Humans Learned to Heal</w:t>
+        <w:t xml:space="preserve">1796 to Today: Medicine and Its Cost — How Humans Learned to Heal</w:t>
       </w:r>
     </w:p>
     <w:p>
@@ -6447,7 +6447,7 @@
           <w:sz w:val="36"/>
           <w:szCs w:val="36"/>
         </w:rPr>
-        <w:t xml:space="preserve">Chapter 38: Climate and Consequence — The Price of Progress</w:t>
+        <w:t xml:space="preserve">1896 to Today: Climate and Consequence — The Price of Progress</w:t>
       </w:r>
     </w:p>
     <w:p>
@@ -6611,7 +6611,7 @@
           <w:sz w:val="36"/>
           <w:szCs w:val="36"/>
         </w:rPr>
-        <w:t xml:space="preserve">Chapter 39: A Fractured Present — Democracy, Authoritarianism, and the Information Age</w:t>
+        <w:t xml:space="preserve">1991 to Today: A Fractured Present — Democracy, Authoritarianism, and the Information Age</w:t>
       </w:r>
     </w:p>
     <w:p>
@@ -6763,7 +6763,7 @@
           <w:sz w:val="36"/>
           <w:szCs w:val="36"/>
         </w:rPr>
-        <w:t xml:space="preserve">Chapter 40: The Dolphins' Long View — What a Non-Human Species Makes of Human History</w:t>
+        <w:t xml:space="preserve">Seven Million Years to Today: The Dolphins' Long View — What a Non-Human Species Makes of Human History</w:t>
       </w:r>
     </w:p>
     <w:p>
@@ -7034,7 +7034,7 @@
           <w:sz w:val="36"/>
           <w:szCs w:val="36"/>
         </w:rPr>
-        <w:t xml:space="preserve">Chapter 41: Half the World, All the Time — The Timelines This Book Almost Skipped</w:t>
+        <w:t xml:space="preserve">1804 to 2022: Half the World, All the Time — The Timelines This Book Almost Skipped</w:t>
       </w:r>
     </w:p>
     <w:p>

</xml_diff>

<commit_message>
The Dolphins' View of History: Writing and Memory chapter adds the memory-drifts aside and a Professor Click-Click-Whoosh margin note on the Mandela effect; md tracks, _generate.js and docx rebuilt
</commit_message>
<xml_diff>
--- a/The Dolphins' View of History/The Dolphins' View of History - Complete Manuscript.docx
+++ b/The Dolphins' View of History/The Dolphins' View of History - Complete Manuscript.docx
@@ -1515,6 +1515,26 @@
         <w:spacing w:after="200"/>
       </w:pPr>
       <w:r>
+        <w:t xml:space="preserve">A mark also does not drift. Human memory does, and it drifts in company. Each time a human recalls something, the brain rebuilds it, and the rebuilt version quietly takes in whatever the rememberer has heard since. A story passed through enough mouths comes out smoother, simpler, and more like what the listeners expected to hear.</w:t>
+      </w:r>
+    </w:p>
+    <w:p>
+      <w:pPr>
+        <w:spacing w:after="200"/>
+      </w:pPr>
+      <w:r>
+        <w:rPr>
+          <w:i/>
+          <w:iCs/>
+        </w:rPr>
+        <w:t xml:space="preserve">Professor Click-Click-Whoosh, in the margin: “Modern humans have a name for the same wrong memory held by many heads at once: the Mandela effect, after the large number of them who remember Nelson Mandela dying in prison in the 1980s. He walked free in 1990, became president of South Africa, and died in 2013. The newspapers of 1990 say so, and they have not changed their minds. That is the whole case for clay.”</w:t>
+      </w:r>
+    </w:p>
+    <w:p>
+      <w:pPr>
+        <w:spacing w:after="200"/>
+      </w:pPr>
+      <w:r>
         <w:t xml:space="preserve">The Library of Ashurbanipal, assembled in Nineveh in the 7th century BCE, held thousands of tablets on medicine, astronomy, and literature, deliberately collected — the first evidence of a society building a memory on purpose, for readers not yet born.</w:t>
       </w:r>
     </w:p>
@@ -10261,416 +10281,494 @@
     <w:p>
       <w:pPr>
         <w:keepNext/>
-        <w:spacing w:after="40" w:before="160"/>
-        <w:ind w:left="0" w:firstLine="0" w:right="0"/>
-        <w:jc w:val="left"/>
-      </w:pPr>
-      <w:r>
-        <w:rPr>
-          <w:b/>
+        <w:spacing w:after="80" w:before="200"/>
+      </w:pPr>
+      <w:r>
+        <w:rPr>
+          <w:b/>
+          <w:bCs/>
         </w:rPr>
         <w:t xml:space="preserve">Physics, Actually</w:t>
       </w:r>
     </w:p>
     <w:p>
       <w:pPr>
-        <w:spacing w:after="20" w:before="0"/>
-        <w:ind w:left="360" w:firstLine="0" w:right="0"/>
-        <w:jc w:val="left"/>
-      </w:pPr>
-      <w:r>
+        <w:spacing w:after="60"/>
+        <w:ind w:left="360"/>
+      </w:pPr>
+      <w:r>
+        <w:rPr>
+          <w:i/>
+          <w:iCs/>
+        </w:rPr>
         <w:t xml:space="preserve">Physics, Actually, Volume 1: Motion, Forces, Time, and Relativity</w:t>
       </w:r>
     </w:p>
     <w:p>
       <w:pPr>
-        <w:spacing w:after="20" w:before="0"/>
-        <w:ind w:left="360" w:firstLine="0" w:right="0"/>
-        <w:jc w:val="left"/>
-      </w:pPr>
-      <w:r>
+        <w:spacing w:after="60"/>
+        <w:ind w:left="360"/>
+      </w:pPr>
+      <w:r>
+        <w:rPr>
+          <w:i/>
+          <w:iCs/>
+        </w:rPr>
         <w:t xml:space="preserve">Physics, Actually, Volume 2: Gravity, Cosmology, and the Limits of Spacetime</w:t>
       </w:r>
     </w:p>
     <w:p>
       <w:pPr>
-        <w:spacing w:after="20" w:before="0"/>
-        <w:ind w:left="360" w:firstLine="0" w:right="0"/>
-        <w:jc w:val="left"/>
-      </w:pPr>
-      <w:r>
+        <w:spacing w:after="60"/>
+        <w:ind w:left="360"/>
+      </w:pPr>
+      <w:r>
+        <w:rPr>
+          <w:i/>
+          <w:iCs/>
+        </w:rPr>
         <w:t xml:space="preserve">Physics, Actually, Volume 3: The Standard Model, Chaos, and the Edge of Knowledge</w:t>
       </w:r>
     </w:p>
     <w:p>
       <w:pPr>
-        <w:spacing w:after="20" w:before="0"/>
-        <w:ind w:left="360" w:firstLine="0" w:right="0"/>
-        <w:jc w:val="left"/>
-      </w:pPr>
-      <w:r>
+        <w:spacing w:after="60"/>
+        <w:ind w:left="360"/>
+      </w:pPr>
+      <w:r>
+        <w:rPr>
+          <w:i/>
+          <w:iCs/>
+        </w:rPr>
         <w:t xml:space="preserve">Life, Actually: From the First Cell to the Edited Genome and the Search for Life Elsewhere</w:t>
       </w:r>
     </w:p>
     <w:p>
       <w:pPr>
         <w:keepNext/>
-        <w:spacing w:after="40" w:before="160"/>
-        <w:ind w:left="0" w:firstLine="0" w:right="0"/>
-        <w:jc w:val="left"/>
-      </w:pPr>
-      <w:r>
-        <w:rPr>
-          <w:b/>
+        <w:spacing w:after="80" w:before="200"/>
+      </w:pPr>
+      <w:r>
+        <w:rPr>
+          <w:b/>
+          <w:bCs/>
         </w:rPr>
         <w:t xml:space="preserve">Math, Actually</w:t>
       </w:r>
     </w:p>
     <w:p>
       <w:pPr>
-        <w:spacing w:after="20" w:before="0"/>
-        <w:ind w:left="360" w:firstLine="0" w:right="0"/>
-        <w:jc w:val="left"/>
-      </w:pPr>
-      <w:r>
+        <w:spacing w:after="60"/>
+        <w:ind w:left="360"/>
+      </w:pPr>
+      <w:r>
+        <w:rPr>
+          <w:i/>
+          <w:iCs/>
+        </w:rPr>
         <w:t xml:space="preserve">Math, Actually, Volume 1: From Arithmetic to Calculus</w:t>
       </w:r>
     </w:p>
     <w:p>
       <w:pPr>
-        <w:spacing w:after="20" w:before="0"/>
-        <w:ind w:left="360" w:firstLine="0" w:right="0"/>
-        <w:jc w:val="left"/>
-      </w:pPr>
-      <w:r>
+        <w:spacing w:after="60"/>
+        <w:ind w:left="360"/>
+      </w:pPr>
+      <w:r>
+        <w:rPr>
+          <w:i/>
+          <w:iCs/>
+        </w:rPr>
         <w:t xml:space="preserve">Math, Actually, Volume 2: From Multivariable Calculus to Set Theory &amp; Logic</w:t>
       </w:r>
     </w:p>
     <w:p>
       <w:pPr>
-        <w:spacing w:after="20" w:before="0"/>
-        <w:ind w:left="360" w:firstLine="0" w:right="0"/>
-        <w:jc w:val="left"/>
-      </w:pPr>
-      <w:r>
+        <w:spacing w:after="60"/>
+        <w:ind w:left="360"/>
+      </w:pPr>
+      <w:r>
+        <w:rPr>
+          <w:i/>
+          <w:iCs/>
+        </w:rPr>
         <w:t xml:space="preserve">Math, Actually, Volume 3: From Differential Equations to Abstract Algebra</w:t>
       </w:r>
     </w:p>
     <w:p>
       <w:pPr>
-        <w:spacing w:after="20" w:before="0"/>
-        <w:ind w:left="360" w:firstLine="0" w:right="0"/>
-        <w:jc w:val="left"/>
-      </w:pPr>
-      <w:r>
+        <w:spacing w:after="60"/>
+        <w:ind w:left="360"/>
+      </w:pPr>
+      <w:r>
+        <w:rPr>
+          <w:i/>
+          <w:iCs/>
+        </w:rPr>
         <w:t xml:space="preserve">Math, Actually, Volume 4: From Category Theory to the Frontier</w:t>
       </w:r>
     </w:p>
     <w:p>
       <w:pPr>
         <w:keepNext/>
-        <w:spacing w:after="40" w:before="160"/>
-        <w:ind w:left="0" w:firstLine="0" w:right="0"/>
-        <w:jc w:val="left"/>
-      </w:pPr>
-      <w:r>
-        <w:rPr>
-          <w:b/>
+        <w:spacing w:after="80" w:before="200"/>
+      </w:pPr>
+      <w:r>
+        <w:rPr>
+          <w:b/>
+          <w:bCs/>
         </w:rPr>
         <w:t xml:space="preserve">Quanta, Actually</w:t>
       </w:r>
     </w:p>
     <w:p>
       <w:pPr>
-        <w:spacing w:after="20" w:before="0"/>
-        <w:ind w:left="360" w:firstLine="0" w:right="0"/>
-        <w:jc w:val="left"/>
-      </w:pPr>
-      <w:r>
+        <w:spacing w:after="60"/>
+        <w:ind w:left="360"/>
+      </w:pPr>
+      <w:r>
+        <w:rPr>
+          <w:i/>
+          <w:iCs/>
+        </w:rPr>
         <w:t xml:space="preserve">Quanta, Actually, Volume 1: The Quantum World</w:t>
       </w:r>
     </w:p>
     <w:p>
       <w:pPr>
-        <w:spacing w:after="20" w:before="0"/>
-        <w:ind w:left="360" w:firstLine="0" w:right="0"/>
-        <w:jc w:val="left"/>
-      </w:pPr>
-      <w:r>
+        <w:spacing w:after="60"/>
+        <w:ind w:left="360"/>
+      </w:pPr>
+      <w:r>
+        <w:rPr>
+          <w:i/>
+          <w:iCs/>
+        </w:rPr>
         <w:t xml:space="preserve">Quanta, Actually, Volume 2: The Quantum Conversation</w:t>
       </w:r>
     </w:p>
     <w:p>
       <w:pPr>
-        <w:spacing w:after="20" w:before="0"/>
-        <w:ind w:left="360" w:firstLine="0" w:right="0"/>
-        <w:jc w:val="left"/>
-      </w:pPr>
-      <w:r>
+        <w:spacing w:after="60"/>
+        <w:ind w:left="360"/>
+      </w:pPr>
+      <w:r>
+        <w:rPr>
+          <w:i/>
+          <w:iCs/>
+        </w:rPr>
         <w:t xml:space="preserve">Quanta, Actually, Volume 3: Complete Quantum Electrodynamics Course</w:t>
       </w:r>
     </w:p>
     <w:p>
       <w:pPr>
         <w:keepNext/>
-        <w:spacing w:after="40" w:before="160"/>
-        <w:ind w:left="0" w:firstLine="0" w:right="0"/>
-        <w:jc w:val="left"/>
-      </w:pPr>
-      <w:r>
-        <w:rPr>
-          <w:b/>
+        <w:spacing w:after="80" w:before="200"/>
+      </w:pPr>
+      <w:r>
+        <w:rPr>
+          <w:b/>
+          <w:bCs/>
         </w:rPr>
         <w:t xml:space="preserve">Science Sparks</w:t>
       </w:r>
     </w:p>
     <w:p>
       <w:pPr>
-        <w:spacing w:after="20" w:before="0"/>
-        <w:ind w:left="360" w:firstLine="0" w:right="0"/>
-        <w:jc w:val="left"/>
-      </w:pPr>
-      <w:r>
+        <w:spacing w:after="60"/>
+        <w:ind w:left="360"/>
+      </w:pPr>
+      <w:r>
+        <w:rPr>
+          <w:i/>
+          <w:iCs/>
+        </w:rPr>
         <w:t xml:space="preserve">Science Sparks: Physics, Life, and Mathematics — The Same Few Rules, Told in Highlights</w:t>
       </w:r>
     </w:p>
     <w:p>
       <w:pPr>
         <w:keepNext/>
-        <w:spacing w:after="40" w:before="160"/>
-        <w:ind w:left="0" w:firstLine="0" w:right="0"/>
-        <w:jc w:val="left"/>
-      </w:pPr>
-      <w:r>
-        <w:rPr>
-          <w:b/>
+        <w:spacing w:after="80" w:before="200"/>
+      </w:pPr>
+      <w:r>
+        <w:rPr>
+          <w:b/>
+          <w:bCs/>
         </w:rPr>
         <w:t xml:space="preserve">Look First</w:t>
       </w:r>
     </w:p>
     <w:p>
       <w:pPr>
-        <w:spacing w:after="20" w:before="0"/>
-        <w:ind w:left="360" w:firstLine="0" w:right="0"/>
-        <w:jc w:val="left"/>
-      </w:pPr>
-      <w:r>
+        <w:spacing w:after="60"/>
+        <w:ind w:left="360"/>
+      </w:pPr>
+      <w:r>
+        <w:rPr>
+          <w:i/>
+          <w:iCs/>
+        </w:rPr>
         <w:t xml:space="preserve">Look First, Volume 1: The Universe Has No Now</w:t>
       </w:r>
     </w:p>
     <w:p>
       <w:pPr>
-        <w:spacing w:after="20" w:before="0"/>
-        <w:ind w:left="360" w:firstLine="0" w:right="0"/>
-        <w:jc w:val="left"/>
-      </w:pPr>
-      <w:r>
+        <w:spacing w:after="60"/>
+        <w:ind w:left="360"/>
+      </w:pPr>
+      <w:r>
+        <w:rPr>
+          <w:i/>
+          <w:iCs/>
+        </w:rPr>
         <w:t xml:space="preserve">Look First, Volume 2: A Trip Is Not a New Life</w:t>
       </w:r>
     </w:p>
     <w:p>
       <w:pPr>
         <w:keepNext/>
-        <w:spacing w:after="40" w:before="160"/>
-        <w:ind w:left="0" w:firstLine="0" w:right="0"/>
-        <w:jc w:val="left"/>
-      </w:pPr>
-      <w:r>
-        <w:rPr>
-          <w:b/>
+        <w:spacing w:after="80" w:before="200"/>
+      </w:pPr>
+      <w:r>
+        <w:rPr>
+          <w:b/>
+          <w:bCs/>
         </w:rPr>
         <w:t xml:space="preserve">Electrical Engineering Series</w:t>
       </w:r>
     </w:p>
     <w:p>
       <w:pPr>
-        <w:spacing w:after="20" w:before="0"/>
-        <w:ind w:left="360" w:firstLine="0" w:right="0"/>
-        <w:jc w:val="left"/>
-      </w:pPr>
-      <w:r>
+        <w:spacing w:after="60"/>
+        <w:ind w:left="360"/>
+      </w:pPr>
+      <w:r>
+        <w:rPr>
+          <w:i/>
+          <w:iCs/>
+        </w:rPr>
         <w:t xml:space="preserve">Foundations of Electronics (Book 1)</w:t>
       </w:r>
     </w:p>
     <w:p>
       <w:pPr>
-        <w:spacing w:after="20" w:before="0"/>
-        <w:ind w:left="360" w:firstLine="0" w:right="0"/>
-        <w:jc w:val="left"/>
-      </w:pPr>
-      <w:r>
+        <w:spacing w:after="60"/>
+        <w:ind w:left="360"/>
+      </w:pPr>
+      <w:r>
+        <w:rPr>
+          <w:i/>
+          <w:iCs/>
+        </w:rPr>
         <w:t xml:space="preserve">Circuits, Components, and Control (Book 2)</w:t>
       </w:r>
     </w:p>
     <w:p>
       <w:pPr>
-        <w:spacing w:after="20" w:before="0"/>
-        <w:ind w:left="360" w:firstLine="0" w:right="0"/>
-        <w:jc w:val="left"/>
-      </w:pPr>
-      <w:r>
+        <w:spacing w:after="60"/>
+        <w:ind w:left="360"/>
+      </w:pPr>
+      <w:r>
+        <w:rPr>
+          <w:i/>
+          <w:iCs/>
+        </w:rPr>
         <w:t xml:space="preserve">Semiconductor Physics and Devices (Book 3)</w:t>
       </w:r>
     </w:p>
     <w:p>
       <w:pPr>
-        <w:spacing w:after="20" w:before="0"/>
-        <w:ind w:left="360" w:firstLine="0" w:right="0"/>
-        <w:jc w:val="left"/>
-      </w:pPr>
-      <w:r>
+        <w:spacing w:after="60"/>
+        <w:ind w:left="360"/>
+      </w:pPr>
+      <w:r>
+        <w:rPr>
+          <w:i/>
+          <w:iCs/>
+        </w:rPr>
         <w:t xml:space="preserve">RF, Microwave, and Transceivers (Book 4)</w:t>
       </w:r>
     </w:p>
     <w:p>
       <w:pPr>
-        <w:spacing w:after="20" w:before="0"/>
-        <w:ind w:left="360" w:firstLine="0" w:right="0"/>
-        <w:jc w:val="left"/>
-      </w:pPr>
-      <w:r>
+        <w:spacing w:after="60"/>
+        <w:ind w:left="360"/>
+      </w:pPr>
+      <w:r>
+        <w:rPr>
+          <w:i/>
+          <w:iCs/>
+        </w:rPr>
         <w:t xml:space="preserve">Communications, Wireless, and SDR (Book 5)</w:t>
       </w:r>
     </w:p>
     <w:p>
       <w:pPr>
-        <w:spacing w:after="20" w:before="0"/>
-        <w:ind w:left="360" w:firstLine="0" w:right="0"/>
-        <w:jc w:val="left"/>
-      </w:pPr>
-      <w:r>
+        <w:spacing w:after="60"/>
+        <w:ind w:left="360"/>
+      </w:pPr>
+      <w:r>
+        <w:rPr>
+          <w:i/>
+          <w:iCs/>
+        </w:rPr>
         <w:t xml:space="preserve">Power and Energy (Book 6)</w:t>
       </w:r>
     </w:p>
     <w:p>
       <w:pPr>
-        <w:spacing w:after="20" w:before="0"/>
-        <w:ind w:left="360" w:firstLine="0" w:right="0"/>
-        <w:jc w:val="left"/>
-      </w:pPr>
-      <w:r>
+        <w:spacing w:after="60"/>
+        <w:ind w:left="360"/>
+      </w:pPr>
+      <w:r>
+        <w:rPr>
+          <w:i/>
+          <w:iCs/>
+        </w:rPr>
         <w:t xml:space="preserve">Packaging, Layout, EMC, and Test (Book 7)</w:t>
       </w:r>
     </w:p>
     <w:p>
       <w:pPr>
         <w:keepNext/>
-        <w:spacing w:after="40" w:before="160"/>
-        <w:ind w:left="0" w:firstLine="0" w:right="0"/>
-        <w:jc w:val="left"/>
-      </w:pPr>
-      <w:r>
-        <w:rPr>
-          <w:b/>
+        <w:spacing w:after="80" w:before="200"/>
+      </w:pPr>
+      <w:r>
+        <w:rPr>
+          <w:b/>
+          <w:bCs/>
         </w:rPr>
         <w:t xml:space="preserve">History</w:t>
       </w:r>
     </w:p>
     <w:p>
       <w:pPr>
-        <w:spacing w:after="20" w:before="0"/>
-        <w:ind w:left="360" w:firstLine="0" w:right="0"/>
-        <w:jc w:val="left"/>
-      </w:pPr>
-      <w:r>
+        <w:spacing w:after="60"/>
+        <w:ind w:left="360"/>
+      </w:pPr>
+      <w:r>
+        <w:rPr>
+          <w:i/>
+          <w:iCs/>
+        </w:rPr>
         <w:t xml:space="preserve">The Dolphins' View of History</w:t>
       </w:r>
     </w:p>
     <w:p>
       <w:pPr>
         <w:keepNext/>
-        <w:spacing w:after="40" w:before="160"/>
-        <w:ind w:left="0" w:firstLine="0" w:right="0"/>
-        <w:jc w:val="left"/>
-      </w:pPr>
-      <w:r>
-        <w:rPr>
-          <w:b/>
+        <w:spacing w:after="80" w:before="200"/>
+      </w:pPr>
+      <w:r>
+        <w:rPr>
+          <w:b/>
+          <w:bCs/>
         </w:rPr>
         <w:t xml:space="preserve">Fiction</w:t>
       </w:r>
     </w:p>
     <w:p>
       <w:pPr>
-        <w:spacing w:after="20" w:before="0"/>
-        <w:ind w:left="360" w:firstLine="0" w:right="0"/>
-        <w:jc w:val="left"/>
-      </w:pPr>
-      <w:r>
+        <w:spacing w:after="60"/>
+        <w:ind w:left="360"/>
+      </w:pPr>
+      <w:r>
+        <w:rPr>
+          <w:i/>
+          <w:iCs/>
+        </w:rPr>
         <w:t xml:space="preserve">The Murder That Hadn't Happened Yet (The Relativistic Investigation Bureau, Book 1)</w:t>
       </w:r>
     </w:p>
     <w:p>
       <w:pPr>
-        <w:spacing w:after="20" w:before="0"/>
-        <w:ind w:left="360" w:firstLine="0" w:right="0"/>
-        <w:jc w:val="left"/>
-      </w:pPr>
-      <w:r>
+        <w:spacing w:after="60"/>
+        <w:ind w:left="360"/>
+      </w:pPr>
+      <w:r>
+        <w:rPr>
+          <w:i/>
+          <w:iCs/>
+        </w:rPr>
         <w:t xml:space="preserve">The Warning That Was Sent Too Late (The Relativistic Investigation Bureau, Book 2)</w:t>
       </w:r>
     </w:p>
     <w:p>
       <w:pPr>
-        <w:spacing w:after="20" w:before="0"/>
-        <w:ind w:left="360" w:firstLine="0" w:right="0"/>
-        <w:jc w:val="left"/>
-      </w:pPr>
-      <w:r>
+        <w:spacing w:after="60"/>
+        <w:ind w:left="360"/>
+      </w:pPr>
+      <w:r>
+        <w:rPr>
+          <w:i/>
+          <w:iCs/>
+        </w:rPr>
         <w:t xml:space="preserve">Schrödinger’s Paperwork (Lolly Wren’s Curious Science Adventures, Book 1)</w:t>
       </w:r>
     </w:p>
     <w:p>
       <w:pPr>
-        <w:spacing w:after="20" w:before="0"/>
-        <w:ind w:left="360" w:firstLine="0" w:right="0"/>
-        <w:jc w:val="left"/>
-      </w:pPr>
-      <w:r>
+        <w:spacing w:after="60"/>
+        <w:ind w:left="360"/>
+      </w:pPr>
+      <w:r>
+        <w:rPr>
+          <w:i/>
+          <w:iCs/>
+        </w:rPr>
         <w:t xml:space="preserve">The Permitted Options (Lolly Wren’s Curious Science Adventures, Book 2)</w:t>
       </w:r>
     </w:p>
     <w:p>
       <w:pPr>
-        <w:spacing w:after="20" w:before="0"/>
-        <w:ind w:left="360" w:firstLine="0" w:right="0"/>
-        <w:jc w:val="left"/>
-      </w:pPr>
-      <w:r>
+        <w:spacing w:after="60"/>
+        <w:ind w:left="360"/>
+      </w:pPr>
+      <w:r>
+        <w:rPr>
+          <w:i/>
+          <w:iCs/>
+        </w:rPr>
         <w:t xml:space="preserve">Protocol Flamingo (The Invasion Storybooks, Book 1), as George Herbert Fontaine</w:t>
       </w:r>
     </w:p>
     <w:p>
       <w:pPr>
         <w:keepNext/>
-        <w:spacing w:after="40" w:before="160"/>
-        <w:ind w:left="0" w:firstLine="0" w:right="0"/>
-        <w:jc w:val="left"/>
-      </w:pPr>
-      <w:r>
-        <w:rPr>
-          <w:b/>
+        <w:spacing w:after="80" w:before="200"/>
+      </w:pPr>
+      <w:r>
+        <w:rPr>
+          <w:b/>
+          <w:bCs/>
         </w:rPr>
         <w:t xml:space="preserve">How-To</w:t>
       </w:r>
     </w:p>
     <w:p>
       <w:pPr>
-        <w:spacing w:after="20" w:before="0"/>
-        <w:ind w:left="360" w:firstLine="0" w:right="0"/>
-        <w:jc w:val="left"/>
-      </w:pPr>
-      <w:r>
+        <w:spacing w:after="60"/>
+        <w:ind w:left="360"/>
+      </w:pPr>
+      <w:r>
+        <w:rPr>
+          <w:i/>
+          <w:iCs/>
+        </w:rPr>
         <w:t xml:space="preserve">Your First Book That Sells</w:t>
       </w:r>
     </w:p>
     <w:p>
       <w:pPr>
-        <w:spacing w:after="20" w:before="0"/>
-        <w:ind w:left="360" w:firstLine="0" w:right="0"/>
-        <w:jc w:val="left"/>
-      </w:pPr>
-      <w:r>
+        <w:spacing w:after="60"/>
+        <w:ind w:left="360"/>
+      </w:pPr>
+      <w:r>
+        <w:rPr>
+          <w:i/>
+          <w:iCs/>
+        </w:rPr>
         <w:t xml:space="preserve">Your First YouTube Channel That Rocks</w:t>
       </w:r>
     </w:p>

</xml_diff>

<commit_message>
Dolphins: remove repeated sentences, add a repeat checker
A scan of the built book (exact duplicates, shared runs of seven words,
near-duplicates by word order) found and fixed three kinds of repeat:
- Timeline: 19 entries rewritten so they stop restating chapter sentences
- chapters 1, 18, 24, 41: the ratchet frame, "insist on stating it",
  "by the time this book was written", and a coda of mine in chapter 24
- the two "From the minutes of the Society" labels now name their questions;
  a duplicate voyages-database note in Notes and Sources replaced

scripts/check_repeats.js enforces the rule on the built chapters: no findings
now, 27 on the build from before these fixes. The rule and the deliberate
exemptions (margin-note lead-in, minutes label, Jefferson echo, a shared
Timeline date label) are recorded in notes/CLAUDE.md and the Book Plan.
Both tracks, the Complete Manuscript, and all docx rebuilt.

Co-Authored-By: Claude Sonnet 5.5 <noreply@anthropic.com>
</commit_message>
<xml_diff>
--- a/The Dolphins' View of History/The Dolphins' View of History - Complete Manuscript.docx
+++ b/The Dolphins' View of History/The Dolphins' View of History - Complete Manuscript.docx
@@ -663,7 +663,7 @@
         <w:spacing w:after="200"/>
       </w:pPr>
       <w:r>
-        <w:t xml:space="preserve">Wisdom does not compound the same way. It cannot be stored in a tool or inherited with one. Each generation has to learn it again, mostly from its own mistakes and sometimes from its parents' graves. A big brain guarantees cleverness. It does not guarantee wisdom. The two arrive on separate schedules, and the rest of this book is the record of how far apart those schedules drifted.</w:t>
+        <w:t xml:space="preserve">Wisdom does not compound the same way. It cannot be stored in a tool or inherited with one. Each generation has to learn it again, mostly from its own mistakes and sometimes from its parents' graves. A big brain guarantees cleverness. It does not guarantee wisdom. The two arrive on separate schedules, and the chapters that follow trace how far apart those schedules drifted.</w:t>
       </w:r>
     </w:p>
     <w:p>
@@ -1379,7 +1379,7 @@
           <w:b/>
           <w:bCs/>
         </w:rPr>
-        <w:t xml:space="preserve">From the minutes of the Society:</w:t>
+        <w:t xml:space="preserve">From the minutes of the Society, on the question of farming:</w:t>
       </w:r>
     </w:p>
     <w:p>
@@ -2687,7 +2687,7 @@
           <w:b/>
           <w:bCs/>
         </w:rPr>
-        <w:t xml:space="preserve">From the minutes of the Society:</w:t>
+        <w:t xml:space="preserve">From the minutes of the Society, on the question of the Dark Ages:</w:t>
       </w:r>
     </w:p>
     <w:p>
@@ -3403,15 +3403,15 @@
         <w:spacing w:after="200"/>
       </w:pPr>
       <w:r>
-        <w:t xml:space="preserve">This is where the ratchet from the first chapter acquires an engine. For a million years the stored know-how of the species had been multiplied by muscle, its own or an animal's. Coal multiplied it by sunlight buried three hundred million years earlier. Wisdom had no equivalent fuel. Factory laws, public sanitation, and limits on child labor all came eventually, but each had to be argued for, one parliament and one generation at a time, after the damage was done.</w:t>
-      </w:r>
-    </w:p>
-    <w:p>
-      <w:pPr>
-        <w:spacing w:after="200"/>
-      </w:pPr>
-      <w:r>
-        <w:t xml:space="preserve">The other side of the ledger was immediate, and dolphin historians insist on stating it beside the productivity gains, not tucked in afterward: children as young as five or six worked textile mill floors on twelve-hour shifts; new industrial cities like Manchester grew so fast that sanitation and housing never caught up, and cholera outbreaks followed accordingly.</w:t>
+        <w:t xml:space="preserve">The ratchet found an engine. For a million years the stored know-how of the species had been multiplied by muscle, its own or an animal's. Coal multiplied it by sunlight buried three hundred million years earlier. Wisdom had no equivalent fuel. Factory laws, public sanitation, and limits on child labor all came eventually, but each had to be argued for, one parliament and one generation at a time, after the damage was done.</w:t>
+      </w:r>
+    </w:p>
+    <w:p>
+      <w:pPr>
+        <w:spacing w:after="200"/>
+      </w:pPr>
+      <w:r>
+        <w:t xml:space="preserve">The other side of the ledger was immediate, and dolphin historians set it beside the productivity gains, not tucked in afterward: children as young as five or six worked textile mill floors on twelve-hour shifts; new industrial cities like Manchester grew so fast that sanitation and housing never caught up, and cholera outbreaks followed accordingly.</w:t>
       </w:r>
     </w:p>
     <w:p>
@@ -4287,7 +4287,7 @@
         <w:spacing w:after="200"/>
       </w:pPr>
       <w:r>
-        <w:t xml:space="preserve">The file also has thin pages, and dolphin historians check those as carefully as the full ones. Scandinavia spent the twentieth century with the same offer on the table, order, pride, and someone to blame, and mostly declined it. It was not innocent. Sweden stayed neutral in the Second World War and sold iron ore to Germany, and sterilized tens of thousands of its own citizens under a public-health program that ran into the 1970s; Norway produced Quisling, whose name became a word. Denmark, occupied, got most of its Jews to Sweden in a few nights in October 1943. A thin page in a thick file is an achievement, and it was not an accident.</w:t>
+        <w:t xml:space="preserve">The file also has thin pages, and dolphin historians check those as carefully as the full ones. Scandinavia spent the twentieth century with the same offer on the table, and mostly declined it. It was not innocent. Sweden stayed neutral in the Second World War and sold iron ore to Germany, and sterilized tens of thousands of its own citizens under a public-health program that ran into the 1970s; Norway produced Quisling, whose name became a word. Denmark, occupied, got most of its Jews to Sweden in a few nights in October 1943. A thin page in a thick file is an achievement, and it was not an accident.</w:t>
       </w:r>
     </w:p>
     <w:p>
@@ -6723,7 +6723,7 @@
         <w:spacing w:after="200"/>
       </w:pPr>
       <w:r>
-        <w:t xml:space="preserve">Freedom House, the organization most often cited for these annual surveys, recorded a net decline in global political rights and civil liberties every single year from 2006 onward, a streak unbroken for close to two decades by the time this book was written — long enough that an entire generation of political scientists has spent its career studying backsliding instead of the steady consolidation the 1990s mood assumed would be the field's real subject.</w:t>
+        <w:t xml:space="preserve">Freedom House, the organization most often cited for these annual surveys, recorded a net decline in global political rights and civil liberties every single year from 2006 onward, a streak unbroken for close to two decades at the time of writing — long enough that an entire generation of political scientists has spent its career studying backsliding instead of the steady consolidation the 1990s mood assumed would be the field's real subject.</w:t>
       </w:r>
     </w:p>
     <w:p>
@@ -7489,7 +7489,7 @@
         <w:t xml:space="preserve">~1.7 million years ago. </w:t>
       </w:r>
       <w:r>
-        <w:t xml:space="preserve">Homo erectus begins making the Acheulean hand axe, a design that stays in use, largely unchanged, for over a million years.</w:t>
+        <w:t xml:space="preserve">Homo erectus starts shaping the Acheulean hand axe, a teardrop-shaped tool that goes on being made with little change for a million years and more.</w:t>
       </w:r>
     </w:p>
     <w:p>
@@ -7564,7 +7564,7 @@
         <w:t xml:space="preserve">~70,000-50,000 years ago. </w:t>
       </w:r>
       <w:r>
-        <w:t xml:space="preserve">The migration that gives rise to nearly everyone alive outside Africa today moves out of the continent.</w:t>
+        <w:t xml:space="preserve">The wave of Homo sapiens whose descendants make up most of the world outside Africa leaves the continent.</w:t>
       </w:r>
     </w:p>
     <w:p>
@@ -7579,7 +7579,7 @@
         <w:t xml:space="preserve">~65,000-50,000 years ago. </w:t>
       </w:r>
       <w:r>
-        <w:t xml:space="preserve">Humans reach Australia by open-water voyage, by 50,000 years ago at the latest (the earlier date is argued) — the first meeting, on the water, between humans and dolphins.</w:t>
+        <w:t xml:space="preserve">Humans cross open water to reach Australia, certainly by 50,000 years ago and perhaps 15,000 years earlier (the older date is argued) — the first meeting, on the water, between humans and dolphins.</w:t>
       </w:r>
     </w:p>
     <w:p>
@@ -7689,7 +7689,7 @@
         <w:t xml:space="preserve">~3200 BCE. </w:t>
       </w:r>
       <w:r>
-        <w:t xml:space="preserve">Writing appears in Sumer as cuneiform; Egyptian hieroglyphs emerge at almost the same time.</w:t>
+        <w:t xml:space="preserve">Writing appears in Sumer as cuneiform, with Egyptian hieroglyphs close behind.</w:t>
       </w:r>
     </w:p>
     <w:p>
@@ -7799,7 +7799,7 @@
         <w:t xml:space="preserve">1259 BCE. </w:t>
       </w:r>
       <w:r>
-        <w:t xml:space="preserve">Egypt's Ramesses II and the Hittite king Hattusili III sign the oldest peace treaty whose full text survives.</w:t>
+        <w:t xml:space="preserve">A treaty between Egypt and the Hittite empire, agreed by Ramesses II and Hattusili III, becomes the oldest peace agreement whose full text has survived.</w:t>
       </w:r>
     </w:p>
     <w:p>
@@ -8054,7 +8054,7 @@
         <w:t xml:space="preserve">320-550 CE. </w:t>
       </w:r>
       <w:r>
-        <w:t xml:space="preserve">India's Gupta period. By 628 the mathematician Brahmagupta sets out rules for calculating with zero as a number in its own right.</w:t>
+        <w:t xml:space="preserve">India's Gupta period. In 628 Brahmagupta lays down rules for sums and products involving zero.</w:t>
       </w:r>
     </w:p>
     <w:p>
@@ -8129,7 +8129,7 @@
         <w:t xml:space="preserve">632 CE. </w:t>
       </w:r>
       <w:r>
-        <w:t xml:space="preserve">The prophet Muhammad dies; Islamic rule expands from the Iberian Peninsula to the borders of India within a century.</w:t>
+        <w:t xml:space="preserve">The prophet Muhammad dies; within a century Islamic rule reaches from Iberia to the frontier of India.</w:t>
       </w:r>
     </w:p>
     <w:p>
@@ -8224,7 +8224,7 @@
         <w:t xml:space="preserve">1095-1291. </w:t>
       </w:r>
       <w:r>
-        <w:t xml:space="preserve">The Crusades run in waves for close to two centuries; the last Crusader states fall by 1291.</w:t>
+        <w:t xml:space="preserve">The Crusades come in successive waves over almost two centuries; the last Crusader states fall by 1291.</w:t>
       </w:r>
     </w:p>
     <w:p>
@@ -8329,7 +8329,7 @@
         <w:t xml:space="preserve">1347-1352. </w:t>
       </w:r>
       <w:r>
-        <w:t xml:space="preserve">The Black Death, carried along the Silk Roads, kills a third to half of Europe's population.</w:t>
+        <w:t xml:space="preserve">The Black Death, which travels the Silk Roads, kills between a third and a half of the people in Europe.</w:t>
       </w:r>
     </w:p>
     <w:p>
@@ -8374,7 +8374,7 @@
         <w:t xml:space="preserve">1450. </w:t>
       </w:r>
       <w:r>
-        <w:t xml:space="preserve">Gutenberg's press, with movable metal type, begins printing in Mainz.</w:t>
+        <w:t xml:space="preserve">In Mainz, Gutenberg starts printing with movable metal type.</w:t>
       </w:r>
     </w:p>
     <w:p>
@@ -8679,7 +8679,7 @@
         <w:t xml:space="preserve">1808-1826. </w:t>
       </w:r>
       <w:r>
-        <w:t xml:space="preserve">Napoleon's occupation of Spain sets off the Spanish American wars of independence; by the mid-1820s Spain's mainland empire in the Americas is gone.</w:t>
+        <w:t xml:space="preserve">Napoleon's seizure of the Spanish throne sets off the wars of independence in Spanish America, which end with the empire's mainland colonies free.</w:t>
       </w:r>
     </w:p>
     <w:p>
@@ -8744,7 +8744,7 @@
         <w:t xml:space="preserve">1843. </w:t>
       </w:r>
       <w:r>
-        <w:t xml:space="preserve">Ada Lovelace publishes what is generally regarded as the first computer program.</w:t>
+        <w:t xml:space="preserve">Ada Lovelace publishes an algorithm for Babbage's unfinished engine, widely counted as the first computer program.</w:t>
       </w:r>
     </w:p>
     <w:p>
@@ -8849,7 +8849,7 @@
         <w:t xml:space="preserve">1868. </w:t>
       </w:r>
       <w:r>
-        <w:t xml:space="preserve">Japan's Meiji Restoration begins compressing a century of industrialization into a few decades.</w:t>
+        <w:t xml:space="preserve">The Meiji Restoration begins Japan's drive to industrialize in decades what Europe took a century to do.</w:t>
       </w:r>
     </w:p>
     <w:p>
@@ -8939,7 +8939,7 @@
         <w:t xml:space="preserve">1896. </w:t>
       </w:r>
       <w:r>
-        <w:t xml:space="preserve">Theodor Herzl publishes The Jewish State; the first Zionist Congress follows in 1897. Svante Arrhenius calculates, by hand, that doubling atmospheric carbon dioxide would warm the planet.</w:t>
+        <w:t xml:space="preserve">Theodor Herzl publishes The Jewish State, and the first Zionist Congress follows in 1897. Svante Arrhenius estimates on paper how much a doubling of atmospheric carbon dioxide would warm the Earth.</w:t>
       </w:r>
     </w:p>
     <w:p>
@@ -9234,7 +9234,7 @@
         <w:t xml:space="preserve">1950. </w:t>
       </w:r>
       <w:r>
-        <w:t xml:space="preserve">Enrico Fermi asks his lunch-table question, since known as the Fermi Paradox.</w:t>
+        <w:t xml:space="preserve">Over lunch, Enrico Fermi asks where everybody is, a puzzle later named the Fermi Paradox.</w:t>
       </w:r>
     </w:p>
     <w:p>
@@ -9264,7 +9264,7 @@
         <w:t xml:space="preserve">1953. </w:t>
       </w:r>
       <w:r>
-        <w:t xml:space="preserve">A coup organized by British and American intelligence removes Iran's elected prime minister, Mohammad Mosaddegh.</w:t>
+        <w:t xml:space="preserve">British and American intelligence engineer the overthrow of Iran's elected prime minister, Mohammad Mosaddegh.</w:t>
       </w:r>
     </w:p>
     <w:p>
@@ -9399,7 +9399,7 @@
         <w:t xml:space="preserve">1965. </w:t>
       </w:r>
       <w:r>
-        <w:t xml:space="preserve">Gordon Moore observes that the number of components on a chip is doubling every year; in 1975 he revises it to every two years.</w:t>
+        <w:t xml:space="preserve">Gordon Moore notes that chips are packing in twice the components every year, a pace he revises in 1975 to every two years.</w:t>
       </w:r>
     </w:p>
     <w:p>
@@ -9624,7 +9624,7 @@
         <w:t xml:space="preserve">1994. </w:t>
       </w:r>
       <w:r>
-        <w:t xml:space="preserve">In Rwanda, extremist officials and militias kill an estimated 500,000 to 800,000 Tutsi and moderate Hutu in about a hundred days.</w:t>
+        <w:t xml:space="preserve">Over some three months, between half a million and 800,000 Tutsi and moderate Hutu are murdered in Rwanda's genocide.</w:t>
       </w:r>
     </w:p>
     <w:p>
@@ -9764,7 +9764,7 @@
         <w:t xml:space="preserve">2023. </w:t>
       </w:r>
       <w:r>
-        <w:t xml:space="preserve">India passes China as the world's most populous country and lands a probe near the Moon's south pole.</w:t>
+        <w:t xml:space="preserve">India becomes the most populous country on Earth, overtaking China, and puts Chandrayaan-3 down near the lunar south pole.</w:t>
       </w:r>
     </w:p>
     <w:p>
@@ -12724,7 +12724,7 @@
         <w:t xml:space="preserve">Brazil’s share of the Atlantic slave trade. </w:t>
       </w:r>
       <w:r>
-        <w:t xml:space="preserve">SlaveVoyages: Trans-Atlantic Slave Trade Database. https://www.slavevoyages.org (consulted 2026).</w:t>
+        <w:t xml:space="preserve">The voyages database cited under the Ships, Gunpowder, and Gold chapter, filtered to disembarkations in Brazil.</w:t>
       </w:r>
     </w:p>
     <w:p>

</xml_diff>

<commit_message>
Also-by: switch to the Quantum, Actually titles (A Trip, Science Sparks, Dolphins, YouTube build script, canonical list)
</commit_message>
<xml_diff>
--- a/The Dolphins' View of History/The Dolphins' View of History - Complete Manuscript.docx
+++ b/The Dolphins' View of History/The Dolphins' View of History - Complete Manuscript.docx
@@ -15958,7 +15958,7 @@
           <w:b/>
           <w:bCs/>
         </w:rPr>
-        <w:t xml:space="preserve">Quanta, Actually</w:t>
+        <w:t xml:space="preserve">Quantum, Actually</w:t>
       </w:r>
     </w:p>
     <w:p>
@@ -15971,7 +15971,7 @@
           <w:i/>
           <w:iCs/>
         </w:rPr>
-        <w:t xml:space="preserve">Quanta, Actually, Volume 1: The Quantum World</w:t>
+        <w:t xml:space="preserve">Quantum, Actually, Volume 1: Questions and Answers from the Double Slit to the Superconducting Wire</w:t>
       </w:r>
     </w:p>
     <w:p>
@@ -15984,20 +15984,7 @@
           <w:i/>
           <w:iCs/>
         </w:rPr>
-        <w:t xml:space="preserve">Quanta, Actually, Volume 2: The Quantum Conversation</w:t>
-      </w:r>
-    </w:p>
-    <w:p>
-      <w:pPr>
-        <w:spacing w:after="60"/>
-        <w:ind w:left="360"/>
-      </w:pPr>
-      <w:r>
-        <w:rPr>
-          <w:i/>
-          <w:iCs/>
-        </w:rPr>
-        <w:t xml:space="preserve">Quanta, Actually, Volume 3: Complete Quantum Electrodynamics Course</w:t>
+        <w:t xml:space="preserve">Quantum, Actually, Volume 2: A QED Course</w:t>
       </w:r>
     </w:p>
     <w:p>

</xml_diff>

<commit_message>
Old-title cleanup: RIB Book 1 REV11 Also-by, Dolphins (main's newer docx/md/_generate.js, now on disk too) and three Science Sparks Going-deeper pointers use Quantum, Actually Vol 1/Vol 2
</commit_message>
<xml_diff>
--- a/The Dolphins' View of History/The Dolphins' View of History - Complete Manuscript.docx
+++ b/The Dolphins' View of History/The Dolphins' View of History - Complete Manuscript.docx
@@ -17006,7 +17006,7 @@
           <w:b/>
           <w:bCs/>
         </w:rPr>
-        <w:t xml:space="preserve">Quanta, Actually</w:t>
+        <w:t xml:space="preserve">Quantum, Actually</w:t>
       </w:r>
     </w:p>
     <w:p>
@@ -17019,7 +17019,7 @@
           <w:i/>
           <w:iCs/>
         </w:rPr>
-        <w:t xml:space="preserve">Quanta, Actually, Volume 1: The Quantum World</w:t>
+        <w:t xml:space="preserve">Quantum, Actually, Volume 1: Questions and Answers from the Double Slit to the Superconducting Wire</w:t>
       </w:r>
     </w:p>
     <w:p>
@@ -17032,20 +17032,7 @@
           <w:i/>
           <w:iCs/>
         </w:rPr>
-        <w:t xml:space="preserve">Quanta, Actually, Volume 2: The Quantum Conversation</w:t>
-      </w:r>
-    </w:p>
-    <w:p>
-      <w:pPr>
-        <w:spacing w:after="60"/>
-        <w:ind w:left="360"/>
-      </w:pPr>
-      <w:r>
-        <w:rPr>
-          <w:i/>
-          <w:iCs/>
-        </w:rPr>
-        <w:t xml:space="preserve">Quanta, Actually, Volume 3: Complete Quantum Electrodynamics Course</w:t>
+        <w:t xml:space="preserve">Quantum, Actually, Volume 2: A QED Course</w:t>
       </w:r>
     </w:p>
     <w:p>

</xml_diff>

<commit_message>
Old-title cleanup: RIB Book 1 REV11 Also-by, Dolphins (on top of main's newer files), Science Sparks Going-deeper pointers now use Quantum, Actually Vol 1/Vol 2 [from book-2-lectures-after-qed d7ca770, paths only]
</commit_message>
<xml_diff>
--- a/The Dolphins' View of History/The Dolphins' View of History - Complete Manuscript.docx
+++ b/The Dolphins' View of History/The Dolphins' View of History - Complete Manuscript.docx
@@ -17006,7 +17006,7 @@
           <w:b/>
           <w:bCs/>
         </w:rPr>
-        <w:t xml:space="preserve">Quanta, Actually</w:t>
+        <w:t xml:space="preserve">Quantum, Actually</w:t>
       </w:r>
     </w:p>
     <w:p>
@@ -17019,7 +17019,7 @@
           <w:i/>
           <w:iCs/>
         </w:rPr>
-        <w:t xml:space="preserve">Quanta, Actually, Volume 1: The Quantum World</w:t>
+        <w:t xml:space="preserve">Quantum, Actually, Volume 1: Questions and Answers from the Double Slit to the Superconducting Wire</w:t>
       </w:r>
     </w:p>
     <w:p>
@@ -17032,20 +17032,7 @@
           <w:i/>
           <w:iCs/>
         </w:rPr>
-        <w:t xml:space="preserve">Quanta, Actually, Volume 2: The Quantum Conversation</w:t>
-      </w:r>
-    </w:p>
-    <w:p>
-      <w:pPr>
-        <w:spacing w:after="60"/>
-        <w:ind w:left="360"/>
-      </w:pPr>
-      <w:r>
-        <w:rPr>
-          <w:i/>
-          <w:iCs/>
-        </w:rPr>
-        <w:t xml:space="preserve">Quanta, Actually, Volume 3: Complete Quantum Electrodynamics Course</w:t>
+        <w:t xml:space="preserve">Quantum, Actually, Volume 2: A QED Course</w:t>
       </w:r>
     </w:p>
     <w:p>

</xml_diff>

<commit_message>
Also-by: The Dolphins' View of History to canonical list
</commit_message>
<xml_diff>
--- a/The Dolphins' View of History/The Dolphins' View of History - Complete Manuscript.docx
+++ b/The Dolphins' View of History/The Dolphins' View of History - Complete Manuscript.docx
@@ -16941,7 +16941,7 @@
           <w:b/>
           <w:bCs/>
         </w:rPr>
-        <w:t xml:space="preserve">Math, Actually</w:t>
+        <w:t xml:space="preserve">More Actually Books</w:t>
       </w:r>
     </w:p>
     <w:p>
@@ -16954,7 +16954,7 @@
           <w:i/>
           <w:iCs/>
         </w:rPr>
-        <w:t xml:space="preserve">Math, Actually, Volume 1: From Arithmetic to Calculus</w:t>
+        <w:t xml:space="preserve">Gravitation, Actually: A Short Book on Gravity</w:t>
       </w:r>
     </w:p>
     <w:p>
@@ -16967,7 +16967,20 @@
           <w:i/>
           <w:iCs/>
         </w:rPr>
-        <w:t xml:space="preserve">Math, Actually, Volume 2: From Multivariable Calculus to Set Theory &amp; Logic</w:t>
+        <w:t xml:space="preserve">The Universe, Actually: What Humanity Currently Understands About Reality</w:t>
+      </w:r>
+    </w:p>
+    <w:p>
+      <w:pPr>
+        <w:keepNext/>
+        <w:spacing w:after="80" w:before="200"/>
+      </w:pPr>
+      <w:r>
+        <w:rPr>
+          <w:b/>
+          <w:bCs/>
+        </w:rPr>
+        <w:t xml:space="preserve">Math, Actually</w:t>
       </w:r>
     </w:p>
     <w:p>
@@ -16980,7 +16993,7 @@
           <w:i/>
           <w:iCs/>
         </w:rPr>
-        <w:t xml:space="preserve">Math, Actually, Volume 3: From Differential Equations to Abstract Algebra</w:t>
+        <w:t xml:space="preserve">Math, Actually, Volume 1: From Arithmetic to Calculus</w:t>
       </w:r>
     </w:p>
     <w:p>
@@ -16993,6 +17006,32 @@
           <w:i/>
           <w:iCs/>
         </w:rPr>
+        <w:t xml:space="preserve">Math, Actually, Volume 2: From Multivariable Calculus to Set Theory &amp; Logic</w:t>
+      </w:r>
+    </w:p>
+    <w:p>
+      <w:pPr>
+        <w:spacing w:after="60"/>
+        <w:ind w:left="360"/>
+      </w:pPr>
+      <w:r>
+        <w:rPr>
+          <w:i/>
+          <w:iCs/>
+        </w:rPr>
+        <w:t xml:space="preserve">Math, Actually, Volume 3: From Differential Equations to Abstract Algebra</w:t>
+      </w:r>
+    </w:p>
+    <w:p>
+      <w:pPr>
+        <w:spacing w:after="60"/>
+        <w:ind w:left="360"/>
+      </w:pPr>
+      <w:r>
+        <w:rPr>
+          <w:i/>
+          <w:iCs/>
+        </w:rPr>
         <w:t xml:space="preserve">Math, Actually, Volume 4: From Category Theory to the Frontier</w:t>
       </w:r>
     </w:p>
@@ -17214,7 +17253,7 @@
           <w:b/>
           <w:bCs/>
         </w:rPr>
-        <w:t xml:space="preserve">History</w:t>
+        <w:t xml:space="preserve">Fiction</w:t>
       </w:r>
     </w:p>
     <w:p>
@@ -17227,7 +17266,72 @@
           <w:i/>
           <w:iCs/>
         </w:rPr>
-        <w:t xml:space="preserve">The Dolphins' View of History</w:t>
+        <w:t xml:space="preserve">The Murder That Hadn’t Happened Yet (The Relativistic Investigation Bureau, Book 1), Lothar J. Musiol writing as Spezala Genara Relavi (S.G.R.)</w:t>
+      </w:r>
+    </w:p>
+    <w:p>
+      <w:pPr>
+        <w:spacing w:after="60"/>
+        <w:ind w:left="360"/>
+      </w:pPr>
+      <w:r>
+        <w:rPr>
+          <w:i/>
+          <w:iCs/>
+        </w:rPr>
+        <w:t xml:space="preserve">The Warning That Was Sent Too Late (The Relativistic Investigation Bureau, Book 2), Lothar J. Musiol writing as Spezala Genara Relavi (S.G.R.)</w:t>
+      </w:r>
+    </w:p>
+    <w:p>
+      <w:pPr>
+        <w:spacing w:after="60"/>
+        <w:ind w:left="360"/>
+      </w:pPr>
+      <w:r>
+        <w:rPr>
+          <w:i/>
+          <w:iCs/>
+        </w:rPr>
+        <w:t xml:space="preserve">Schrödinger’s Paperwork (Lolly Wren’s Curious Science Adventures, Book 1), Lothar J. Musiol writing as Quentin Edmund Darling (Q.E.D.)</w:t>
+      </w:r>
+    </w:p>
+    <w:p>
+      <w:pPr>
+        <w:spacing w:after="60"/>
+        <w:ind w:left="360"/>
+      </w:pPr>
+      <w:r>
+        <w:rPr>
+          <w:i/>
+          <w:iCs/>
+        </w:rPr>
+        <w:t xml:space="preserve">The Permitted Options (Lolly Wren’s Curious Science Adventures, Book 2), Lothar J. Musiol writing as Quentin Edmund Darling (Q.E.D.)</w:t>
+      </w:r>
+    </w:p>
+    <w:p>
+      <w:pPr>
+        <w:spacing w:after="60"/>
+        <w:ind w:left="360"/>
+      </w:pPr>
+      <w:r>
+        <w:rPr>
+          <w:i/>
+          <w:iCs/>
+        </w:rPr>
+        <w:t xml:space="preserve">Protocol Flamingo (The Invasion Storybooks, Book 1), Lothar J. Musiol writing as George Herbert Fontaine</w:t>
+      </w:r>
+    </w:p>
+    <w:p>
+      <w:pPr>
+        <w:spacing w:after="60"/>
+        <w:ind w:left="360"/>
+      </w:pPr>
+      <w:r>
+        <w:rPr>
+          <w:i/>
+          <w:iCs/>
+        </w:rPr>
+        <w:t xml:space="preserve">In Love with Murder, Actually: A Comic Mystery, Lothar J. Musiol writing as Romuald Livingston</w:t>
       </w:r>
     </w:p>
     <w:p>
@@ -17240,7 +17344,7 @@
           <w:b/>
           <w:bCs/>
         </w:rPr>
-        <w:t xml:space="preserve">Fiction</w:t>
+        <w:t xml:space="preserve">In German</w:t>
       </w:r>
     </w:p>
     <w:p>
@@ -17253,98 +17357,7 @@
           <w:i/>
           <w:iCs/>
         </w:rPr>
-        <w:t xml:space="preserve">The Murder That Hadn't Happened Yet (The Relativistic Investigation Bureau, Book 1)</w:t>
-      </w:r>
-    </w:p>
-    <w:p>
-      <w:pPr>
-        <w:spacing w:after="60"/>
-        <w:ind w:left="360"/>
-      </w:pPr>
-      <w:r>
-        <w:rPr>
-          <w:i/>
-          <w:iCs/>
-        </w:rPr>
-        <w:t xml:space="preserve">The Warning That Was Sent Too Late (The Relativistic Investigation Bureau, Book 2)</w:t>
-      </w:r>
-    </w:p>
-    <w:p>
-      <w:pPr>
-        <w:spacing w:after="60"/>
-        <w:ind w:left="360"/>
-      </w:pPr>
-      <w:r>
-        <w:rPr>
-          <w:i/>
-          <w:iCs/>
-        </w:rPr>
-        <w:t xml:space="preserve">Schrödinger’s Paperwork (Lolly Wren’s Curious Science Adventures, Book 1)</w:t>
-      </w:r>
-    </w:p>
-    <w:p>
-      <w:pPr>
-        <w:spacing w:after="60"/>
-        <w:ind w:left="360"/>
-      </w:pPr>
-      <w:r>
-        <w:rPr>
-          <w:i/>
-          <w:iCs/>
-        </w:rPr>
-        <w:t xml:space="preserve">The Permitted Options (Lolly Wren’s Curious Science Adventures, Book 2)</w:t>
-      </w:r>
-    </w:p>
-    <w:p>
-      <w:pPr>
-        <w:spacing w:after="60"/>
-        <w:ind w:left="360"/>
-      </w:pPr>
-      <w:r>
-        <w:rPr>
-          <w:i/>
-          <w:iCs/>
-        </w:rPr>
-        <w:t xml:space="preserve">Protocol Flamingo (The Invasion Storybooks, Book 1), as George Herbert Fontaine</w:t>
-      </w:r>
-    </w:p>
-    <w:p>
-      <w:pPr>
-        <w:keepNext/>
-        <w:spacing w:after="80" w:before="200"/>
-      </w:pPr>
-      <w:r>
-        <w:rPr>
-          <w:b/>
-          <w:bCs/>
-        </w:rPr>
-        <w:t xml:space="preserve">How-To</w:t>
-      </w:r>
-    </w:p>
-    <w:p>
-      <w:pPr>
-        <w:spacing w:after="60"/>
-        <w:ind w:left="360"/>
-      </w:pPr>
-      <w:r>
-        <w:rPr>
-          <w:i/>
-          <w:iCs/>
-        </w:rPr>
-        <w:t xml:space="preserve">Your First Book That Sells</w:t>
-      </w:r>
-    </w:p>
-    <w:p>
-      <w:pPr>
-        <w:spacing w:after="60"/>
-        <w:ind w:left="360"/>
-      </w:pPr>
-      <w:r>
-        <w:rPr>
-          <w:i/>
-          <w:iCs/>
-        </w:rPr>
-        <w:t xml:space="preserve">Your First YouTube Channel That Rocks</w:t>
+        <w:t xml:space="preserve">Auswandern – Ab in die USA, Kanada, Australien oder Neuseeland?</w:t>
       </w:r>
     </w:p>
     <w:sectPr>

</xml_diff>

<commit_message>
Also-by: The Dolphins' View of History to canonical list [merged onto main from book-2-lectures-after-qed 24c0c0c, paths only]
</commit_message>
<xml_diff>
--- a/The Dolphins' View of History/The Dolphins' View of History - Complete Manuscript.docx
+++ b/The Dolphins' View of History/The Dolphins' View of History - Complete Manuscript.docx
@@ -16941,7 +16941,7 @@
           <w:b/>
           <w:bCs/>
         </w:rPr>
-        <w:t xml:space="preserve">Math, Actually</w:t>
+        <w:t xml:space="preserve">More Actually Books</w:t>
       </w:r>
     </w:p>
     <w:p>
@@ -16954,7 +16954,7 @@
           <w:i/>
           <w:iCs/>
         </w:rPr>
-        <w:t xml:space="preserve">Math, Actually, Volume 1: From Arithmetic to Calculus</w:t>
+        <w:t xml:space="preserve">Gravitation, Actually: A Short Book on Gravity</w:t>
       </w:r>
     </w:p>
     <w:p>
@@ -16967,7 +16967,20 @@
           <w:i/>
           <w:iCs/>
         </w:rPr>
-        <w:t xml:space="preserve">Math, Actually, Volume 2: From Multivariable Calculus to Set Theory &amp; Logic</w:t>
+        <w:t xml:space="preserve">The Universe, Actually: What Humanity Currently Understands About Reality</w:t>
+      </w:r>
+    </w:p>
+    <w:p>
+      <w:pPr>
+        <w:keepNext/>
+        <w:spacing w:after="80" w:before="200"/>
+      </w:pPr>
+      <w:r>
+        <w:rPr>
+          <w:b/>
+          <w:bCs/>
+        </w:rPr>
+        <w:t xml:space="preserve">Math, Actually</w:t>
       </w:r>
     </w:p>
     <w:p>
@@ -16980,7 +16993,7 @@
           <w:i/>
           <w:iCs/>
         </w:rPr>
-        <w:t xml:space="preserve">Math, Actually, Volume 3: From Differential Equations to Abstract Algebra</w:t>
+        <w:t xml:space="preserve">Math, Actually, Volume 1: From Arithmetic to Calculus</w:t>
       </w:r>
     </w:p>
     <w:p>
@@ -16993,6 +17006,32 @@
           <w:i/>
           <w:iCs/>
         </w:rPr>
+        <w:t xml:space="preserve">Math, Actually, Volume 2: From Multivariable Calculus to Set Theory &amp; Logic</w:t>
+      </w:r>
+    </w:p>
+    <w:p>
+      <w:pPr>
+        <w:spacing w:after="60"/>
+        <w:ind w:left="360"/>
+      </w:pPr>
+      <w:r>
+        <w:rPr>
+          <w:i/>
+          <w:iCs/>
+        </w:rPr>
+        <w:t xml:space="preserve">Math, Actually, Volume 3: From Differential Equations to Abstract Algebra</w:t>
+      </w:r>
+    </w:p>
+    <w:p>
+      <w:pPr>
+        <w:spacing w:after="60"/>
+        <w:ind w:left="360"/>
+      </w:pPr>
+      <w:r>
+        <w:rPr>
+          <w:i/>
+          <w:iCs/>
+        </w:rPr>
         <w:t xml:space="preserve">Math, Actually, Volume 4: From Category Theory to the Frontier</w:t>
       </w:r>
     </w:p>
@@ -17214,7 +17253,7 @@
           <w:b/>
           <w:bCs/>
         </w:rPr>
-        <w:t xml:space="preserve">History</w:t>
+        <w:t xml:space="preserve">Fiction</w:t>
       </w:r>
     </w:p>
     <w:p>
@@ -17227,7 +17266,72 @@
           <w:i/>
           <w:iCs/>
         </w:rPr>
-        <w:t xml:space="preserve">The Dolphins' View of History</w:t>
+        <w:t xml:space="preserve">The Murder That Hadn’t Happened Yet (The Relativistic Investigation Bureau, Book 1), Lothar J. Musiol writing as Spezala Genara Relavi (S.G.R.)</w:t>
+      </w:r>
+    </w:p>
+    <w:p>
+      <w:pPr>
+        <w:spacing w:after="60"/>
+        <w:ind w:left="360"/>
+      </w:pPr>
+      <w:r>
+        <w:rPr>
+          <w:i/>
+          <w:iCs/>
+        </w:rPr>
+        <w:t xml:space="preserve">The Warning That Was Sent Too Late (The Relativistic Investigation Bureau, Book 2), Lothar J. Musiol writing as Spezala Genara Relavi (S.G.R.)</w:t>
+      </w:r>
+    </w:p>
+    <w:p>
+      <w:pPr>
+        <w:spacing w:after="60"/>
+        <w:ind w:left="360"/>
+      </w:pPr>
+      <w:r>
+        <w:rPr>
+          <w:i/>
+          <w:iCs/>
+        </w:rPr>
+        <w:t xml:space="preserve">Schrödinger’s Paperwork (Lolly Wren’s Curious Science Adventures, Book 1), Lothar J. Musiol writing as Quentin Edmund Darling (Q.E.D.)</w:t>
+      </w:r>
+    </w:p>
+    <w:p>
+      <w:pPr>
+        <w:spacing w:after="60"/>
+        <w:ind w:left="360"/>
+      </w:pPr>
+      <w:r>
+        <w:rPr>
+          <w:i/>
+          <w:iCs/>
+        </w:rPr>
+        <w:t xml:space="preserve">The Permitted Options (Lolly Wren’s Curious Science Adventures, Book 2), Lothar J. Musiol writing as Quentin Edmund Darling (Q.E.D.)</w:t>
+      </w:r>
+    </w:p>
+    <w:p>
+      <w:pPr>
+        <w:spacing w:after="60"/>
+        <w:ind w:left="360"/>
+      </w:pPr>
+      <w:r>
+        <w:rPr>
+          <w:i/>
+          <w:iCs/>
+        </w:rPr>
+        <w:t xml:space="preserve">Protocol Flamingo (The Invasion Storybooks, Book 1), Lothar J. Musiol writing as George Herbert Fontaine</w:t>
+      </w:r>
+    </w:p>
+    <w:p>
+      <w:pPr>
+        <w:spacing w:after="60"/>
+        <w:ind w:left="360"/>
+      </w:pPr>
+      <w:r>
+        <w:rPr>
+          <w:i/>
+          <w:iCs/>
+        </w:rPr>
+        <w:t xml:space="preserve">In Love with Murder, Actually: A Comic Mystery, Lothar J. Musiol writing as Romuald Livingston</w:t>
       </w:r>
     </w:p>
     <w:p>
@@ -17240,7 +17344,7 @@
           <w:b/>
           <w:bCs/>
         </w:rPr>
-        <w:t xml:space="preserve">Fiction</w:t>
+        <w:t xml:space="preserve">In German</w:t>
       </w:r>
     </w:p>
     <w:p>
@@ -17253,98 +17357,7 @@
           <w:i/>
           <w:iCs/>
         </w:rPr>
-        <w:t xml:space="preserve">The Murder That Hadn't Happened Yet (The Relativistic Investigation Bureau, Book 1)</w:t>
-      </w:r>
-    </w:p>
-    <w:p>
-      <w:pPr>
-        <w:spacing w:after="60"/>
-        <w:ind w:left="360"/>
-      </w:pPr>
-      <w:r>
-        <w:rPr>
-          <w:i/>
-          <w:iCs/>
-        </w:rPr>
-        <w:t xml:space="preserve">The Warning That Was Sent Too Late (The Relativistic Investigation Bureau, Book 2)</w:t>
-      </w:r>
-    </w:p>
-    <w:p>
-      <w:pPr>
-        <w:spacing w:after="60"/>
-        <w:ind w:left="360"/>
-      </w:pPr>
-      <w:r>
-        <w:rPr>
-          <w:i/>
-          <w:iCs/>
-        </w:rPr>
-        <w:t xml:space="preserve">Schrödinger’s Paperwork (Lolly Wren’s Curious Science Adventures, Book 1)</w:t>
-      </w:r>
-    </w:p>
-    <w:p>
-      <w:pPr>
-        <w:spacing w:after="60"/>
-        <w:ind w:left="360"/>
-      </w:pPr>
-      <w:r>
-        <w:rPr>
-          <w:i/>
-          <w:iCs/>
-        </w:rPr>
-        <w:t xml:space="preserve">The Permitted Options (Lolly Wren’s Curious Science Adventures, Book 2)</w:t>
-      </w:r>
-    </w:p>
-    <w:p>
-      <w:pPr>
-        <w:spacing w:after="60"/>
-        <w:ind w:left="360"/>
-      </w:pPr>
-      <w:r>
-        <w:rPr>
-          <w:i/>
-          <w:iCs/>
-        </w:rPr>
-        <w:t xml:space="preserve">Protocol Flamingo (The Invasion Storybooks, Book 1), as George Herbert Fontaine</w:t>
-      </w:r>
-    </w:p>
-    <w:p>
-      <w:pPr>
-        <w:keepNext/>
-        <w:spacing w:after="80" w:before="200"/>
-      </w:pPr>
-      <w:r>
-        <w:rPr>
-          <w:b/>
-          <w:bCs/>
-        </w:rPr>
-        <w:t xml:space="preserve">How-To</w:t>
-      </w:r>
-    </w:p>
-    <w:p>
-      <w:pPr>
-        <w:spacing w:after="60"/>
-        <w:ind w:left="360"/>
-      </w:pPr>
-      <w:r>
-        <w:rPr>
-          <w:i/>
-          <w:iCs/>
-        </w:rPr>
-        <w:t xml:space="preserve">Your First Book That Sells</w:t>
-      </w:r>
-    </w:p>
-    <w:p>
-      <w:pPr>
-        <w:spacing w:after="60"/>
-        <w:ind w:left="360"/>
-      </w:pPr>
-      <w:r>
-        <w:rPr>
-          <w:i/>
-          <w:iCs/>
-        </w:rPr>
-        <w:t xml:space="preserve">Your First YouTube Channel That Rocks</w:t>
+        <w:t xml:space="preserve">Auswandern – Ab in die USA, Kanada, Australien oder Neuseeland?</w:t>
       </w:r>
     </w:p>
     <w:sectPr>

</xml_diff>

<commit_message>
About the Author (B): The Dolphins' View of History
</commit_message>
<xml_diff>
--- a/The Dolphins' View of History/The Dolphins' View of History - Complete Manuscript.docx
+++ b/The Dolphins' View of History/The Dolphins' View of History - Complete Manuscript.docx
@@ -16845,6 +16845,41 @@
     <w:p>
       <w:r>
         <w:br w:type="page"/>
+      </w:r>
+    </w:p>
+    <w:p>
+      <w:pPr>
+        <w:pStyle w:val="Heading1"/>
+        <w:spacing w:after="300"/>
+        <w:jc w:val="center"/>
+        <w:outlineLvl w:val="0"/>
+      </w:pPr>
+      <w:r>
+        <w:rPr>
+          <w:rFonts w:ascii="Amazon Ember" w:cs="Amazon Ember" w:eastAsia="Amazon Ember" w:hAnsi="Amazon Ember"/>
+          <w:b/>
+          <w:bCs/>
+          <w:color w:val="0000FF"/>
+          <w:sz w:val="36"/>
+          <w:szCs w:val="36"/>
+        </w:rPr>
+        <w:t xml:space="preserve">About the Author</w:t>
+      </w:r>
+    </w:p>
+    <w:p>
+      <w:pPr>
+        <w:spacing w:after="200"/>
+      </w:pPr>
+      <w:r>
+        <w:t xml:space="preserve">Lothar J. Musiol is a graduate of Munich University of Applied Sciences who spent more than forty years in the semiconductor industry, first at Germany's largest company in the field, then at a string of American start-ups. He studied physics alongside all of it, seriously enough to know exactly how much he is simplifying. Dual citizenship, put to its most sensible use, lets him split his time between San Clemente, California, and Passau, Bavaria, where Austria begins at the garden fence. The household includes one married daughter, one grumpy Teacup Pomeranian named Gucci, and eleven chickens, listed in order of seniority rather than volume.</w:t>
+      </w:r>
+    </w:p>
+    <w:p>
+      <w:pPr>
+        <w:spacing w:after="200"/>
+      </w:pPr>
+      <w:r>
+        <w:t xml:space="preserve">He writes to make complex ideas clearer and more engaging than most treatments manage, without ever pretending they are simpler than they actually are.</w:t>
       </w:r>
     </w:p>
     <w:p>

</xml_diff>

<commit_message>
About the Author (B): The Dolphins' View of History [merged onto main from book-2-lectures-after-qed 3ffc6fa, paths only]
</commit_message>
<xml_diff>
--- a/The Dolphins' View of History/The Dolphins' View of History - Complete Manuscript.docx
+++ b/The Dolphins' View of History/The Dolphins' View of History - Complete Manuscript.docx
@@ -16845,6 +16845,41 @@
     <w:p>
       <w:r>
         <w:br w:type="page"/>
+      </w:r>
+    </w:p>
+    <w:p>
+      <w:pPr>
+        <w:pStyle w:val="Heading1"/>
+        <w:spacing w:after="300"/>
+        <w:jc w:val="center"/>
+        <w:outlineLvl w:val="0"/>
+      </w:pPr>
+      <w:r>
+        <w:rPr>
+          <w:rFonts w:ascii="Amazon Ember" w:cs="Amazon Ember" w:eastAsia="Amazon Ember" w:hAnsi="Amazon Ember"/>
+          <w:b/>
+          <w:bCs/>
+          <w:color w:val="0000FF"/>
+          <w:sz w:val="36"/>
+          <w:szCs w:val="36"/>
+        </w:rPr>
+        <w:t xml:space="preserve">About the Author</w:t>
+      </w:r>
+    </w:p>
+    <w:p>
+      <w:pPr>
+        <w:spacing w:after="200"/>
+      </w:pPr>
+      <w:r>
+        <w:t xml:space="preserve">Lothar J. Musiol is a graduate of Munich University of Applied Sciences who spent more than forty years in the semiconductor industry, first at Germany's largest company in the field, then at a string of American start-ups. He studied physics alongside all of it, seriously enough to know exactly how much he is simplifying. Dual citizenship, put to its most sensible use, lets him split his time between San Clemente, California, and Passau, Bavaria, where Austria begins at the garden fence. The household includes one married daughter, one grumpy Teacup Pomeranian named Gucci, and eleven chickens, listed in order of seniority rather than volume.</w:t>
+      </w:r>
+    </w:p>
+    <w:p>
+      <w:pPr>
+        <w:spacing w:after="200"/>
+      </w:pPr>
+      <w:r>
+        <w:t xml:space="preserve">He writes to make complex ideas clearer and more engaging than most treatments manage, without ever pretending they are simpler than they actually are.</w:t>
       </w:r>
     </w:p>
     <w:p>

</xml_diff>

<commit_message>
TOC complete and linked + review invitation: The Dolphins' View of History
</commit_message>
<xml_diff>
--- a/The Dolphins' View of History/The Dolphins' View of History - Complete Manuscript.docx
+++ b/The Dolphins' View of History/The Dolphins' View of History - Complete Manuscript.docx
@@ -164,6 +164,526 @@
           </w:r>
         </w:p>
         <w:p>
+          <w:pPr>
+            <w:spacing w:after="60"/>
+          </w:pPr>
+          <w:hyperlink w:anchor="_TocAll0001" w:history="1">
+            <w:r>
+              <w:t xml:space="preserve">Prologue: Humans Have Ape Ancestors</w:t>
+            </w:r>
+          </w:hyperlink>
+        </w:p>
+        <w:p>
+          <w:pPr>
+            <w:spacing w:after="60"/>
+          </w:pPr>
+          <w:hyperlink w:anchor="_TocAll0002" w:history="1">
+            <w:r>
+              <w:t xml:space="preserve">The Last Fifty Million Years: No Hands, No Cities — Why the Dolphins Only Watched</w:t>
+            </w:r>
+          </w:hyperlink>
+        </w:p>
+        <w:p>
+          <w:pPr>
+            <w:spacing w:after="60"/>
+          </w:pPr>
+          <w:hyperlink w:anchor="_TocAll0003" w:history="1">
+            <w:r>
+              <w:t xml:space="preserve">7 Million to 300,000 Years Ago: Where Everyone Is From — Africa and the Making of Humans</w:t>
+            </w:r>
+          </w:hyperlink>
+        </w:p>
+        <w:p>
+          <w:pPr>
+            <w:spacing w:after="60"/>
+          </w:pPr>
+          <w:hyperlink w:anchor="_TocAll0004" w:history="1">
+            <w:r>
+              <w:t xml:space="preserve">The Old Stone Age, a Million Years Ago: The First Fires — Early Humans and the Spark of Culture</w:t>
+            </w:r>
+          </w:hyperlink>
+        </w:p>
+        <w:p>
+          <w:pPr>
+            <w:spacing w:after="60"/>
+          </w:pPr>
+          <w:hyperlink w:anchor="_TocAll0005" w:history="1">
+            <w:r>
+              <w:t xml:space="preserve">70,000 to 15,000 Years Ago: Out of Africa — The Long Walk Across the World</w:t>
+            </w:r>
+          </w:hyperlink>
+        </w:p>
+        <w:p>
+          <w:pPr>
+            <w:spacing w:after="60"/>
+          </w:pPr>
+          <w:hyperlink w:anchor="_TocAll0006" w:history="1">
+            <w:r>
+              <w:t xml:space="preserve">The Neolithic, from 10,000 BCE: The First Villages — Agriculture and the End of Wandering</w:t>
+            </w:r>
+          </w:hyperlink>
+        </w:p>
+        <w:p>
+          <w:pPr>
+            <w:spacing w:after="60"/>
+          </w:pPr>
+          <w:hyperlink w:anchor="_TocAll0007" w:history="1">
+            <w:r>
+              <w:t xml:space="preserve">From 3200 BCE: Writing and Memory — How Humans Learned to Speak to the Future</w:t>
+            </w:r>
+          </w:hyperlink>
+        </w:p>
+        <w:p>
+          <w:pPr>
+            <w:spacing w:after="60"/>
+          </w:pPr>
+          <w:hyperlink w:anchor="_TocAll0008" w:history="1">
+            <w:r>
+              <w:t xml:space="preserve">The Bronze Age, 3100–1150 BCE: Gods and Kings — Mesopotamia, Egypt, and the First Empires</w:t>
+            </w:r>
+          </w:hyperlink>
+        </w:p>
+        <w:p>
+          <w:pPr>
+            <w:spacing w:after="60"/>
+          </w:pPr>
+          <w:hyperlink w:anchor="_TocAll0009" w:history="1">
+            <w:r>
+              <w:t xml:space="preserve">1600 BCE to 589 CE: The Middle Kingdom — China's Long Civilization</w:t>
+            </w:r>
+          </w:hyperlink>
+        </w:p>
+        <w:p>
+          <w:pPr>
+            <w:spacing w:after="60"/>
+          </w:pPr>
+          <w:hyperlink w:anchor="_TocAll0010" w:history="1">
+            <w:r>
+              <w:t xml:space="preserve">2600 BCE to 550 CE: The Subcontinent — Zero, Gods, and Glorious Complexity</w:t>
+            </w:r>
+          </w:hyperlink>
+        </w:p>
+        <w:p>
+          <w:pPr>
+            <w:spacing w:after="60"/>
+          </w:pPr>
+          <w:hyperlink w:anchor="_TocAll0011" w:history="1">
+            <w:r>
+              <w:t xml:space="preserve">Classical Greece, 508–323 BCE: Democracy's Experiment — Ancient Greece</w:t>
+            </w:r>
+          </w:hyperlink>
+        </w:p>
+        <w:p>
+          <w:pPr>
+            <w:spacing w:after="60"/>
+          </w:pPr>
+          <w:hyperlink w:anchor="_TocAll0012" w:history="1">
+            <w:r>
+              <w:t xml:space="preserve">The 8th Century BCE to 476 CE: Rome — The Empire That Built the World and Broke It</w:t>
+            </w:r>
+          </w:hyperlink>
+        </w:p>
+        <w:p>
+          <w:pPr>
+            <w:spacing w:after="60"/>
+          </w:pPr>
+          <w:hyperlink w:anchor="_TocAll0013" w:history="1">
+            <w:r>
+              <w:t xml:space="preserve">The 5th Century BCE to 1291 CE: Faiths, Crusades, and the Medieval World</w:t>
+            </w:r>
+          </w:hyperlink>
+        </w:p>
+        <w:p>
+          <w:pPr>
+            <w:spacing w:after="60"/>
+          </w:pPr>
+          <w:hyperlink w:anchor="_TocAll0014" w:history="1">
+            <w:r>
+              <w:t xml:space="preserve">The Early Middle Ages, 476–1000 CE: The Allegedly Dark Ages</w:t>
+            </w:r>
+          </w:hyperlink>
+        </w:p>
+        <w:p>
+          <w:pPr>
+            <w:spacing w:after="60"/>
+          </w:pPr>
+          <w:hyperlink w:anchor="_TocAll0015" w:history="1">
+            <w:r>
+              <w:t xml:space="preserve">The 2nd Century BCE to 1368 CE: Silk, Steppe, and Plague — The Roads That Connected Everyone, Including the Germs</w:t>
+            </w:r>
+          </w:hyperlink>
+        </w:p>
+        <w:p>
+          <w:pPr>
+            <w:spacing w:after="60"/>
+          </w:pPr>
+          <w:hyperlink w:anchor="_TocAll0016" w:history="1">
+            <w:r>
+              <w:t xml:space="preserve">The 8th Century BCE to 1897 CE: Gold, Salt, and Stone — The Kingdoms of Africa</w:t>
+            </w:r>
+          </w:hyperlink>
+        </w:p>
+        <w:p>
+          <w:pPr>
+            <w:spacing w:after="60"/>
+          </w:pPr>
+          <w:hyperlink w:anchor="_TocAll0017" w:history="1">
+            <w:r>
+              <w:t xml:space="preserve">1482 to Today: The Richness Moved — Africa's Resources and Who Took Them</w:t>
+            </w:r>
+          </w:hyperlink>
+        </w:p>
+        <w:p>
+          <w:pPr>
+            <w:spacing w:after="60"/>
+          </w:pPr>
+          <w:hyperlink w:anchor="_TocAll0018" w:history="1">
+            <w:r>
+              <w:t xml:space="preserve">2600 BCE to 1491 CE: Before Columbus — Cities, Corn, and Knotted String</w:t>
+            </w:r>
+          </w:hyperlink>
+        </w:p>
+        <w:p>
+          <w:pPr>
+            <w:spacing w:after="60"/>
+          </w:pPr>
+          <w:hyperlink w:anchor="_TocAll0019" w:history="1">
+            <w:r>
+              <w:t xml:space="preserve">The 15th to 17th Centuries: Ships, Gunpowder, and Gold — Exploration, Conquest, and the Colonial Age</w:t>
+            </w:r>
+          </w:hyperlink>
+        </w:p>
+        <w:p>
+          <w:pPr>
+            <w:spacing w:after="60"/>
+          </w:pPr>
+          <w:hyperlink w:anchor="_TocAll0020" w:history="1">
+            <w:r>
+              <w:t xml:space="preserve">1450 to the Late 1800s: Machines and Manifestos — Renaissance, Enlightenment, and Industry</w:t>
+            </w:r>
+          </w:hyperlink>
+        </w:p>
+        <w:p>
+          <w:pPr>
+            <w:spacing w:after="60"/>
+          </w:pPr>
+          <w:hyperlink w:anchor="_TocAll0021" w:history="1">
+            <w:r>
+              <w:t xml:space="preserve">1776–1865: The Republic, With Exceptions — America</w:t>
+            </w:r>
+          </w:hyperlink>
+        </w:p>
+        <w:p>
+          <w:pPr>
+            <w:spacing w:after="60"/>
+          </w:pPr>
+          <w:hyperlink w:anchor="_TocAll0022" w:history="1">
+            <w:r>
+              <w:t xml:space="preserve">1865 to Today: After the Bargain — America's Long Account</w:t>
+            </w:r>
+          </w:hyperlink>
+        </w:p>
+        <w:p>
+          <w:pPr>
+            <w:spacing w:after="60"/>
+          </w:pPr>
+          <w:hyperlink w:anchor="_TocAll0023" w:history="1">
+            <w:r>
+              <w:t xml:space="preserve">1620 to 1993: God's Own Experiment — Religion in America</w:t>
+            </w:r>
+          </w:hyperlink>
+        </w:p>
+        <w:p>
+          <w:pPr>
+            <w:spacing w:after="60"/>
+          </w:pPr>
+          <w:hyperlink w:anchor="_TocAll0024" w:history="1">
+            <w:r>
+              <w:t xml:space="preserve">1808 to Today: Liberators and Generals — Latin America After the Empires</w:t>
+            </w:r>
+          </w:hyperlink>
+        </w:p>
+        <w:p>
+          <w:pPr>
+            <w:spacing w:after="60"/>
+          </w:pPr>
+          <w:hyperlink w:anchor="_TocAll0025" w:history="1">
+            <w:r>
+              <w:t xml:space="preserve">1299 to Today: The Sublime Porte — The Ottoman Empire and the Map It Left</w:t>
+            </w:r>
+          </w:hyperlink>
+        </w:p>
+        <w:p>
+          <w:pPr>
+            <w:spacing w:after="60"/>
+          </w:pPr>
+          <w:hyperlink w:anchor="_TocAll0026" w:history="1">
+            <w:r>
+              <w:t xml:space="preserve">1914–1918: Home by Christmas — The First World War</w:t>
+            </w:r>
+          </w:hyperlink>
+        </w:p>
+        <w:p>
+          <w:pPr>
+            <w:spacing w:after="60"/>
+          </w:pPr>
+          <w:hyperlink w:anchor="_TocAll0027" w:history="1">
+            <w:r>
+              <w:t xml:space="preserve">The Twentieth Century: Genius and Catastrophe — Great Countries, Terrible Decades</w:t>
+            </w:r>
+          </w:hyperlink>
+        </w:p>
+        <w:p>
+          <w:pPr>
+            <w:spacing w:after="60"/>
+          </w:pPr>
+          <w:hyperlink w:anchor="_TocAll0028" w:history="1">
+            <w:r>
+              <w:t xml:space="preserve">1853–1947: Japan, Restoration, and Empire</w:t>
+            </w:r>
+          </w:hyperlink>
+        </w:p>
+        <w:p>
+          <w:pPr>
+            <w:spacing w:after="60"/>
+          </w:pPr>
+          <w:hyperlink w:anchor="_TocAll0029" w:history="1">
+            <w:r>
+              <w:t xml:space="preserve">1861–1946: Italy, Rome's Heir and the Fascist Detour</w:t>
+            </w:r>
+          </w:hyperlink>
+        </w:p>
+        <w:p>
+          <w:pPr>
+            <w:spacing w:after="60"/>
+          </w:pPr>
+          <w:hyperlink w:anchor="_TocAll0030" w:history="1">
+            <w:r>
+              <w:t xml:space="preserve">Medieval Córdoba to 1981: Spain, Convivencia and the General</w:t>
+            </w:r>
+          </w:hyperlink>
+        </w:p>
+        <w:p>
+          <w:pPr>
+            <w:spacing w:after="60"/>
+          </w:pPr>
+          <w:hyperlink w:anchor="_TocAll0031" w:history="1">
+            <w:r>
+              <w:t xml:space="preserve">1917–1991: The Soviet Union, Ideals and Iron</w:t>
+            </w:r>
+          </w:hyperlink>
+        </w:p>
+        <w:p>
+          <w:pPr>
+            <w:spacing w:after="60"/>
+          </w:pPr>
+          <w:hyperlink w:anchor="_TocAll0032" w:history="1">
+            <w:r>
+              <w:t xml:space="preserve">1949 to Today: China, the Long Memory and the Great Leap</w:t>
+            </w:r>
+          </w:hyperlink>
+        </w:p>
+        <w:p>
+          <w:pPr>
+            <w:spacing w:after="60"/>
+          </w:pPr>
+          <w:hyperlink w:anchor="_TocAll0033" w:history="1">
+            <w:r>
+              <w:t xml:space="preserve">The 13th Century BCE to 1948 CE: The People Who Kept Their Story — A Complete History of the Jews</w:t>
+            </w:r>
+          </w:hyperlink>
+        </w:p>
+        <w:p>
+          <w:pPr>
+            <w:spacing w:after="60"/>
+          </w:pPr>
+          <w:hyperlink w:anchor="_TocAll0034" w:history="1">
+            <w:r>
+              <w:t xml:space="preserve">1945–1991: Cold War — Two Powers, One Planet</w:t>
+            </w:r>
+          </w:hyperlink>
+        </w:p>
+        <w:p>
+          <w:pPr>
+            <w:spacing w:after="60"/>
+          </w:pPr>
+          <w:hyperlink w:anchor="_TocAll0035" w:history="1">
+            <w:r>
+              <w:t xml:space="preserve">1957 to 2026: Leaving the Cradle — Space Travel, the Moon, Mars, and (Maybe) the Galaxy</w:t>
+            </w:r>
+          </w:hyperlink>
+        </w:p>
+        <w:p>
+          <w:pPr>
+            <w:spacing w:after="60"/>
+          </w:pPr>
+          <w:hyperlink w:anchor="_TocAll0036" w:history="1">
+            <w:r>
+              <w:t xml:space="preserve">1905 Onward: The Physics That Finally Made Sense to Someone</w:t>
+            </w:r>
+          </w:hyperlink>
+        </w:p>
+        <w:p>
+          <w:pPr>
+            <w:spacing w:after="60"/>
+          </w:pPr>
+          <w:hyperlink w:anchor="_TocAll0037" w:history="1">
+            <w:r>
+              <w:t xml:space="preserve">The 1940s to the 1970s: Decolonization — The World Redraws Itself</w:t>
+            </w:r>
+          </w:hyperlink>
+        </w:p>
+        <w:p>
+          <w:pPr>
+            <w:spacing w:after="60"/>
+          </w:pPr>
+          <w:hyperlink w:anchor="_TocAll0038" w:history="1">
+            <w:r>
+              <w:t xml:space="preserve">1893 to 1994: Civil Rights and Liberation — Humanity Argues With Itself</w:t>
+            </w:r>
+          </w:hyperlink>
+        </w:p>
+        <w:p>
+          <w:pPr>
+            <w:spacing w:after="60"/>
+          </w:pPr>
+          <w:hyperlink w:anchor="_TocAll0039" w:history="1">
+            <w:r>
+              <w:t xml:space="preserve">1843 to 2007: The Digital Leap — Computers, Networks, and a Connected World</w:t>
+            </w:r>
+          </w:hyperlink>
+        </w:p>
+        <w:p>
+          <w:pPr>
+            <w:spacing w:after="60"/>
+          </w:pPr>
+          <w:hyperlink w:anchor="_TocAll0040" w:history="1">
+            <w:r>
+              <w:t xml:space="preserve">The Thirteenth B'ak'tun, 2012: The World Was Supposed to End in 2012 (It Didn't)</w:t>
+            </w:r>
+          </w:hyperlink>
+        </w:p>
+        <w:p>
+          <w:pPr>
+            <w:spacing w:after="60"/>
+          </w:pPr>
+          <w:hyperlink w:anchor="_TocAll0041" w:history="1">
+            <w:r>
+              <w:t xml:space="preserve">1950 to the 2020s: Something Might Be Watching (Probably Not What You Think)</w:t>
+            </w:r>
+          </w:hyperlink>
+        </w:p>
+        <w:p>
+          <w:pPr>
+            <w:spacing w:after="60"/>
+          </w:pPr>
+          <w:hyperlink w:anchor="_TocAll0042" w:history="1">
+            <w:r>
+              <w:t xml:space="preserve">1796 to Today: Medicine and Its Cost — How Humans Learned to Heal</w:t>
+            </w:r>
+          </w:hyperlink>
+        </w:p>
+        <w:p>
+          <w:pPr>
+            <w:spacing w:after="60"/>
+          </w:pPr>
+          <w:hyperlink w:anchor="_TocAll0043" w:history="1">
+            <w:r>
+              <w:t xml:space="preserve">1896 to Today: Climate and Consequence — The Price of Progress</w:t>
+            </w:r>
+          </w:hyperlink>
+        </w:p>
+        <w:p>
+          <w:pPr>
+            <w:spacing w:after="60"/>
+          </w:pPr>
+          <w:hyperlink w:anchor="_TocAll0044" w:history="1">
+            <w:r>
+              <w:t xml:space="preserve">1991 to Today: A Fractured Present — Democracy, Authoritarianism, and the Information Age</w:t>
+            </w:r>
+          </w:hyperlink>
+        </w:p>
+        <w:p>
+          <w:pPr>
+            <w:spacing w:after="60"/>
+          </w:pPr>
+          <w:hyperlink w:anchor="_TocAll0045" w:history="1">
+            <w:r>
+              <w:t xml:space="preserve">Seven Million Years to Today: The Dolphins' Long View — What a Non-Human Species Makes of Human History</w:t>
+            </w:r>
+          </w:hyperlink>
+        </w:p>
+        <w:p>
+          <w:pPr>
+            <w:spacing w:after="60"/>
+          </w:pPr>
+          <w:hyperlink w:anchor="_TocAll0046" w:history="1">
+            <w:r>
+              <w:t xml:space="preserve">Epilogue: After Homo Sapiens — Superhumans and Androids</w:t>
+            </w:r>
+          </w:hyperlink>
+        </w:p>
+        <w:p>
+          <w:pPr>
+            <w:spacing w:after="60"/>
+          </w:pPr>
+          <w:hyperlink w:anchor="_TocAll0047" w:history="1">
+            <w:r>
+              <w:t xml:space="preserve">A Timeline — For Humans Who Like Their History in Order</w:t>
+            </w:r>
+          </w:hyperlink>
+        </w:p>
+        <w:p>
+          <w:pPr>
+            <w:spacing w:after="60"/>
+          </w:pPr>
+          <w:hyperlink w:anchor="_TocAll0048" w:history="1">
+            <w:r>
+              <w:t xml:space="preserve">What the Physics Is For — An Appendix on Uses and the One Theory Not Yet Found</w:t>
+            </w:r>
+          </w:hyperlink>
+        </w:p>
+        <w:p>
+          <w:pPr>
+            <w:spacing w:after="60"/>
+          </w:pPr>
+          <w:hyperlink w:anchor="_TocAll0049" w:history="1">
+            <w:r>
+              <w:t xml:space="preserve">Notes and Sources</w:t>
+            </w:r>
+          </w:hyperlink>
+        </w:p>
+        <w:p>
+          <w:pPr>
+            <w:spacing w:after="60"/>
+          </w:pPr>
+          <w:hyperlink w:anchor="_TocAll0050" w:history="1">
+            <w:r>
+              <w:t xml:space="preserve">Further Reading — For Humans</w:t>
+            </w:r>
+          </w:hyperlink>
+        </w:p>
+        <w:p>
+          <w:pPr>
+            <w:spacing w:after="60"/>
+          </w:pPr>
+          <w:hyperlink w:anchor="_TocAll0051" w:history="1">
+            <w:r>
+              <w:t xml:space="preserve">About the Author</w:t>
+            </w:r>
+          </w:hyperlink>
+        </w:p>
+        <w:p>
+          <w:pPr>
+            <w:spacing w:after="60"/>
+          </w:pPr>
+          <w:hyperlink w:anchor="_TocAll0052" w:history="1">
+            <w:r>
+              <w:t xml:space="preserve">Also by Lothar J. Musiol</w:t>
+            </w:r>
+          </w:hyperlink>
+        </w:p>
+        <w:p>
           <w:r>
             <w:fldChar w:fldCharType="end"/>
           </w:r>
@@ -182,6 +702,8 @@
         <w:jc w:val="center"/>
         <w:outlineLvl w:val="0"/>
       </w:pPr>
+      <w:bookmarkStart w:id="101" w:name="_TocAll0001"/>
+      <w:bookmarkEnd w:id="101"/>
       <w:r>
         <w:rPr>
           <w:rFonts w:ascii="Amazon Ember" w:cs="Amazon Ember" w:eastAsia="Amazon Ember" w:hAnsi="Amazon Ember"/>
@@ -462,6 +984,8 @@
         <w:jc w:val="center"/>
         <w:outlineLvl w:val="0"/>
       </w:pPr>
+      <w:bookmarkStart w:id="102" w:name="_TocAll0002"/>
+      <w:bookmarkEnd w:id="102"/>
       <w:r>
         <w:rPr>
           <w:rFonts w:ascii="Amazon Ember" w:cs="Amazon Ember" w:eastAsia="Amazon Ember" w:hAnsi="Amazon Ember"/>
@@ -750,6 +1274,8 @@
         <w:jc w:val="center"/>
         <w:outlineLvl w:val="0"/>
       </w:pPr>
+      <w:bookmarkStart w:id="103" w:name="_TocAll0003"/>
+      <w:bookmarkEnd w:id="103"/>
       <w:r>
         <w:rPr>
           <w:rFonts w:ascii="Amazon Ember" w:cs="Amazon Ember" w:eastAsia="Amazon Ember" w:hAnsi="Amazon Ember"/>
@@ -898,6 +1424,8 @@
         <w:jc w:val="center"/>
         <w:outlineLvl w:val="0"/>
       </w:pPr>
+      <w:bookmarkStart w:id="104" w:name="_TocAll0004"/>
+      <w:bookmarkEnd w:id="104"/>
       <w:r>
         <w:rPr>
           <w:rFonts w:ascii="Amazon Ember" w:cs="Amazon Ember" w:eastAsia="Amazon Ember" w:hAnsi="Amazon Ember"/>
@@ -1050,6 +1578,8 @@
         <w:jc w:val="center"/>
         <w:outlineLvl w:val="0"/>
       </w:pPr>
+      <w:bookmarkStart w:id="105" w:name="_TocAll0005"/>
+      <w:bookmarkEnd w:id="105"/>
       <w:r>
         <w:rPr>
           <w:rFonts w:ascii="Amazon Ember" w:cs="Amazon Ember" w:eastAsia="Amazon Ember" w:hAnsi="Amazon Ember"/>
@@ -1230,6 +1760,8 @@
         <w:jc w:val="center"/>
         <w:outlineLvl w:val="0"/>
       </w:pPr>
+      <w:bookmarkStart w:id="106" w:name="_TocAll0006"/>
+      <w:bookmarkEnd w:id="106"/>
       <w:r>
         <w:rPr>
           <w:rFonts w:ascii="Amazon Ember" w:cs="Amazon Ember" w:eastAsia="Amazon Ember" w:hAnsi="Amazon Ember"/>
@@ -1438,6 +1970,8 @@
         <w:jc w:val="center"/>
         <w:outlineLvl w:val="0"/>
       </w:pPr>
+      <w:bookmarkStart w:id="107" w:name="_TocAll0007"/>
+      <w:bookmarkEnd w:id="107"/>
       <w:r>
         <w:rPr>
           <w:rFonts w:ascii="Amazon Ember" w:cs="Amazon Ember" w:eastAsia="Amazon Ember" w:hAnsi="Amazon Ember"/>
@@ -1626,6 +2160,8 @@
         <w:jc w:val="center"/>
         <w:outlineLvl w:val="0"/>
       </w:pPr>
+      <w:bookmarkStart w:id="108" w:name="_TocAll0008"/>
+      <w:bookmarkEnd w:id="108"/>
       <w:r>
         <w:rPr>
           <w:rFonts w:ascii="Amazon Ember" w:cs="Amazon Ember" w:eastAsia="Amazon Ember" w:hAnsi="Amazon Ember"/>
@@ -1794,6 +2330,8 @@
         <w:jc w:val="center"/>
         <w:outlineLvl w:val="0"/>
       </w:pPr>
+      <w:bookmarkStart w:id="109" w:name="_TocAll0009"/>
+      <w:bookmarkEnd w:id="109"/>
       <w:r>
         <w:rPr>
           <w:rFonts w:ascii="Amazon Ember" w:cs="Amazon Ember" w:eastAsia="Amazon Ember" w:hAnsi="Amazon Ember"/>
@@ -1942,6 +2480,8 @@
         <w:jc w:val="center"/>
         <w:outlineLvl w:val="0"/>
       </w:pPr>
+      <w:bookmarkStart w:id="110" w:name="_TocAll0010"/>
+      <w:bookmarkEnd w:id="110"/>
       <w:r>
         <w:rPr>
           <w:rFonts w:ascii="Amazon Ember" w:cs="Amazon Ember" w:eastAsia="Amazon Ember" w:hAnsi="Amazon Ember"/>
@@ -2098,6 +2638,8 @@
         <w:jc w:val="center"/>
         <w:outlineLvl w:val="0"/>
       </w:pPr>
+      <w:bookmarkStart w:id="111" w:name="_TocAll0011"/>
+      <w:bookmarkEnd w:id="111"/>
       <w:r>
         <w:rPr>
           <w:rFonts w:ascii="Amazon Ember" w:cs="Amazon Ember" w:eastAsia="Amazon Ember" w:hAnsi="Amazon Ember"/>
@@ -2226,6 +2768,8 @@
         <w:jc w:val="center"/>
         <w:outlineLvl w:val="0"/>
       </w:pPr>
+      <w:bookmarkStart w:id="112" w:name="_TocAll0012"/>
+      <w:bookmarkEnd w:id="112"/>
       <w:r>
         <w:rPr>
           <w:rFonts w:ascii="Amazon Ember" w:cs="Amazon Ember" w:eastAsia="Amazon Ember" w:hAnsi="Amazon Ember"/>
@@ -2382,6 +2926,8 @@
         <w:jc w:val="center"/>
         <w:outlineLvl w:val="0"/>
       </w:pPr>
+      <w:bookmarkStart w:id="113" w:name="_TocAll0013"/>
+      <w:bookmarkEnd w:id="113"/>
       <w:r>
         <w:rPr>
           <w:rFonts w:ascii="Amazon Ember" w:cs="Amazon Ember" w:eastAsia="Amazon Ember" w:hAnsi="Amazon Ember"/>
@@ -2510,6 +3056,8 @@
         <w:jc w:val="center"/>
         <w:outlineLvl w:val="0"/>
       </w:pPr>
+      <w:bookmarkStart w:id="114" w:name="_TocAll0014"/>
+      <w:bookmarkEnd w:id="114"/>
       <w:r>
         <w:rPr>
           <w:rFonts w:ascii="Amazon Ember" w:cs="Amazon Ember" w:eastAsia="Amazon Ember" w:hAnsi="Amazon Ember"/>
@@ -2738,6 +3286,8 @@
         <w:jc w:val="center"/>
         <w:outlineLvl w:val="0"/>
       </w:pPr>
+      <w:bookmarkStart w:id="115" w:name="_TocAll0015"/>
+      <w:bookmarkEnd w:id="115"/>
       <w:r>
         <w:rPr>
           <w:rFonts w:ascii="Amazon Ember" w:cs="Amazon Ember" w:eastAsia="Amazon Ember" w:hAnsi="Amazon Ember"/>
@@ -2878,6 +3428,8 @@
         <w:jc w:val="center"/>
         <w:outlineLvl w:val="0"/>
       </w:pPr>
+      <w:bookmarkStart w:id="116" w:name="_TocAll0016"/>
+      <w:bookmarkEnd w:id="116"/>
       <w:r>
         <w:rPr>
           <w:rFonts w:ascii="Amazon Ember" w:cs="Amazon Ember" w:eastAsia="Amazon Ember" w:hAnsi="Amazon Ember"/>
@@ -3002,6 +3554,8 @@
         <w:jc w:val="center"/>
         <w:outlineLvl w:val="0"/>
       </w:pPr>
+      <w:bookmarkStart w:id="117" w:name="_TocAll0017"/>
+      <w:bookmarkEnd w:id="117"/>
       <w:r>
         <w:rPr>
           <w:rFonts w:ascii="Amazon Ember" w:cs="Amazon Ember" w:eastAsia="Amazon Ember" w:hAnsi="Amazon Ember"/>
@@ -3266,6 +3820,8 @@
         <w:jc w:val="center"/>
         <w:outlineLvl w:val="0"/>
       </w:pPr>
+      <w:bookmarkStart w:id="118" w:name="_TocAll0018"/>
+      <w:bookmarkEnd w:id="118"/>
       <w:r>
         <w:rPr>
           <w:rFonts w:ascii="Amazon Ember" w:cs="Amazon Ember" w:eastAsia="Amazon Ember" w:hAnsi="Amazon Ember"/>
@@ -3418,6 +3974,8 @@
         <w:jc w:val="center"/>
         <w:outlineLvl w:val="0"/>
       </w:pPr>
+      <w:bookmarkStart w:id="119" w:name="_TocAll0019"/>
+      <w:bookmarkEnd w:id="119"/>
       <w:r>
         <w:rPr>
           <w:rFonts w:ascii="Amazon Ember" w:cs="Amazon Ember" w:eastAsia="Amazon Ember" w:hAnsi="Amazon Ember"/>
@@ -3586,6 +4144,8 @@
         <w:jc w:val="center"/>
         <w:outlineLvl w:val="0"/>
       </w:pPr>
+      <w:bookmarkStart w:id="120" w:name="_TocAll0020"/>
+      <w:bookmarkEnd w:id="120"/>
       <w:r>
         <w:rPr>
           <w:rFonts w:ascii="Amazon Ember" w:cs="Amazon Ember" w:eastAsia="Amazon Ember" w:hAnsi="Amazon Ember"/>
@@ -3742,6 +4302,8 @@
         <w:jc w:val="center"/>
         <w:outlineLvl w:val="0"/>
       </w:pPr>
+      <w:bookmarkStart w:id="121" w:name="_TocAll0021"/>
+      <w:bookmarkEnd w:id="121"/>
       <w:r>
         <w:rPr>
           <w:rFonts w:ascii="Amazon Ember" w:cs="Amazon Ember" w:eastAsia="Amazon Ember" w:hAnsi="Amazon Ember"/>
@@ -4150,6 +4712,8 @@
         <w:jc w:val="center"/>
         <w:outlineLvl w:val="0"/>
       </w:pPr>
+      <w:bookmarkStart w:id="122" w:name="_TocAll0022"/>
+      <w:bookmarkEnd w:id="122"/>
       <w:r>
         <w:rPr>
           <w:rFonts w:ascii="Amazon Ember" w:cs="Amazon Ember" w:eastAsia="Amazon Ember" w:hAnsi="Amazon Ember"/>
@@ -4506,6 +5070,8 @@
         <w:jc w:val="center"/>
         <w:outlineLvl w:val="0"/>
       </w:pPr>
+      <w:bookmarkStart w:id="123" w:name="_TocAll0023"/>
+      <w:bookmarkEnd w:id="123"/>
       <w:r>
         <w:rPr>
           <w:rFonts w:ascii="Amazon Ember" w:cs="Amazon Ember" w:eastAsia="Amazon Ember" w:hAnsi="Amazon Ember"/>
@@ -4638,6 +5204,8 @@
         <w:jc w:val="center"/>
         <w:outlineLvl w:val="0"/>
       </w:pPr>
+      <w:bookmarkStart w:id="124" w:name="_TocAll0024"/>
+      <w:bookmarkEnd w:id="124"/>
       <w:r>
         <w:rPr>
           <w:rFonts w:ascii="Amazon Ember" w:cs="Amazon Ember" w:eastAsia="Amazon Ember" w:hAnsi="Amazon Ember"/>
@@ -4766,6 +5334,8 @@
         <w:jc w:val="center"/>
         <w:outlineLvl w:val="0"/>
       </w:pPr>
+      <w:bookmarkStart w:id="125" w:name="_TocAll0025"/>
+      <w:bookmarkEnd w:id="125"/>
       <w:r>
         <w:rPr>
           <w:rFonts w:ascii="Amazon Ember" w:cs="Amazon Ember" w:eastAsia="Amazon Ember" w:hAnsi="Amazon Ember"/>
@@ -4878,6 +5448,8 @@
         <w:jc w:val="center"/>
         <w:outlineLvl w:val="0"/>
       </w:pPr>
+      <w:bookmarkStart w:id="126" w:name="_TocAll0026"/>
+      <w:bookmarkEnd w:id="126"/>
       <w:r>
         <w:rPr>
           <w:rFonts w:ascii="Amazon Ember" w:cs="Amazon Ember" w:eastAsia="Amazon Ember" w:hAnsi="Amazon Ember"/>
@@ -5038,6 +5610,8 @@
         <w:jc w:val="center"/>
         <w:outlineLvl w:val="0"/>
       </w:pPr>
+      <w:bookmarkStart w:id="127" w:name="_TocAll0027"/>
+      <w:bookmarkEnd w:id="127"/>
       <w:r>
         <w:rPr>
           <w:rFonts w:ascii="Amazon Ember" w:cs="Amazon Ember" w:eastAsia="Amazon Ember" w:hAnsi="Amazon Ember"/>
@@ -5230,6 +5804,8 @@
         <w:jc w:val="center"/>
         <w:outlineLvl w:val="0"/>
       </w:pPr>
+      <w:bookmarkStart w:id="128" w:name="_TocAll0028"/>
+      <w:bookmarkEnd w:id="128"/>
       <w:r>
         <w:rPr>
           <w:rFonts w:ascii="Amazon Ember" w:cs="Amazon Ember" w:eastAsia="Amazon Ember" w:hAnsi="Amazon Ember"/>
@@ -5366,6 +5942,8 @@
         <w:jc w:val="center"/>
         <w:outlineLvl w:val="0"/>
       </w:pPr>
+      <w:bookmarkStart w:id="129" w:name="_TocAll0029"/>
+      <w:bookmarkEnd w:id="129"/>
       <w:r>
         <w:rPr>
           <w:rFonts w:ascii="Amazon Ember" w:cs="Amazon Ember" w:eastAsia="Amazon Ember" w:hAnsi="Amazon Ember"/>
@@ -5510,6 +6088,8 @@
         <w:jc w:val="center"/>
         <w:outlineLvl w:val="0"/>
       </w:pPr>
+      <w:bookmarkStart w:id="130" w:name="_TocAll0030"/>
+      <w:bookmarkEnd w:id="130"/>
       <w:r>
         <w:rPr>
           <w:rFonts w:ascii="Amazon Ember" w:cs="Amazon Ember" w:eastAsia="Amazon Ember" w:hAnsi="Amazon Ember"/>
@@ -5666,6 +6246,8 @@
         <w:jc w:val="center"/>
         <w:outlineLvl w:val="0"/>
       </w:pPr>
+      <w:bookmarkStart w:id="131" w:name="_TocAll0031"/>
+      <w:bookmarkEnd w:id="131"/>
       <w:r>
         <w:rPr>
           <w:rFonts w:ascii="Amazon Ember" w:cs="Amazon Ember" w:eastAsia="Amazon Ember" w:hAnsi="Amazon Ember"/>
@@ -5802,6 +6384,8 @@
         <w:jc w:val="center"/>
         <w:outlineLvl w:val="0"/>
       </w:pPr>
+      <w:bookmarkStart w:id="132" w:name="_TocAll0032"/>
+      <w:bookmarkEnd w:id="132"/>
       <w:r>
         <w:rPr>
           <w:rFonts w:ascii="Amazon Ember" w:cs="Amazon Ember" w:eastAsia="Amazon Ember" w:hAnsi="Amazon Ember"/>
@@ -5962,6 +6546,8 @@
         <w:jc w:val="center"/>
         <w:outlineLvl w:val="0"/>
       </w:pPr>
+      <w:bookmarkStart w:id="133" w:name="_TocAll0033"/>
+      <w:bookmarkEnd w:id="133"/>
       <w:r>
         <w:rPr>
           <w:rFonts w:ascii="Amazon Ember" w:cs="Amazon Ember" w:eastAsia="Amazon Ember" w:hAnsi="Amazon Ember"/>
@@ -6150,6 +6736,8 @@
         <w:jc w:val="center"/>
         <w:outlineLvl w:val="0"/>
       </w:pPr>
+      <w:bookmarkStart w:id="134" w:name="_TocAll0034"/>
+      <w:bookmarkEnd w:id="134"/>
       <w:r>
         <w:rPr>
           <w:rFonts w:ascii="Amazon Ember" w:cs="Amazon Ember" w:eastAsia="Amazon Ember" w:hAnsi="Amazon Ember"/>
@@ -6298,6 +6886,8 @@
         <w:jc w:val="center"/>
         <w:outlineLvl w:val="0"/>
       </w:pPr>
+      <w:bookmarkStart w:id="135" w:name="_TocAll0035"/>
+      <w:bookmarkEnd w:id="135"/>
       <w:r>
         <w:rPr>
           <w:rFonts w:ascii="Amazon Ember" w:cs="Amazon Ember" w:eastAsia="Amazon Ember" w:hAnsi="Amazon Ember"/>
@@ -6462,6 +7052,8 @@
         <w:jc w:val="center"/>
         <w:outlineLvl w:val="0"/>
       </w:pPr>
+      <w:bookmarkStart w:id="136" w:name="_TocAll0036"/>
+      <w:bookmarkEnd w:id="136"/>
       <w:r>
         <w:rPr>
           <w:rFonts w:ascii="Amazon Ember" w:cs="Amazon Ember" w:eastAsia="Amazon Ember" w:hAnsi="Amazon Ember"/>
@@ -6614,6 +7206,8 @@
         <w:jc w:val="center"/>
         <w:outlineLvl w:val="0"/>
       </w:pPr>
+      <w:bookmarkStart w:id="137" w:name="_TocAll0037"/>
+      <w:bookmarkEnd w:id="137"/>
       <w:r>
         <w:rPr>
           <w:rFonts w:ascii="Amazon Ember" w:cs="Amazon Ember" w:eastAsia="Amazon Ember" w:hAnsi="Amazon Ember"/>
@@ -6750,6 +7344,8 @@
         <w:jc w:val="center"/>
         <w:outlineLvl w:val="0"/>
       </w:pPr>
+      <w:bookmarkStart w:id="138" w:name="_TocAll0038"/>
+      <w:bookmarkEnd w:id="138"/>
       <w:r>
         <w:rPr>
           <w:rFonts w:ascii="Amazon Ember" w:cs="Amazon Ember" w:eastAsia="Amazon Ember" w:hAnsi="Amazon Ember"/>
@@ -6866,6 +7462,8 @@
         <w:jc w:val="center"/>
         <w:outlineLvl w:val="0"/>
       </w:pPr>
+      <w:bookmarkStart w:id="139" w:name="_TocAll0039"/>
+      <w:bookmarkEnd w:id="139"/>
       <w:r>
         <w:rPr>
           <w:rFonts w:ascii="Amazon Ember" w:cs="Amazon Ember" w:eastAsia="Amazon Ember" w:hAnsi="Amazon Ember"/>
@@ -6994,6 +7592,8 @@
         <w:jc w:val="center"/>
         <w:outlineLvl w:val="0"/>
       </w:pPr>
+      <w:bookmarkStart w:id="140" w:name="_TocAll0040"/>
+      <w:bookmarkEnd w:id="140"/>
       <w:r>
         <w:rPr>
           <w:rFonts w:ascii="Amazon Ember" w:cs="Amazon Ember" w:eastAsia="Amazon Ember" w:hAnsi="Amazon Ember"/>
@@ -7134,6 +7734,8 @@
         <w:jc w:val="center"/>
         <w:outlineLvl w:val="0"/>
       </w:pPr>
+      <w:bookmarkStart w:id="141" w:name="_TocAll0041"/>
+      <w:bookmarkEnd w:id="141"/>
       <w:r>
         <w:rPr>
           <w:rFonts w:ascii="Amazon Ember" w:cs="Amazon Ember" w:eastAsia="Amazon Ember" w:hAnsi="Amazon Ember"/>
@@ -7282,6 +7884,8 @@
         <w:jc w:val="center"/>
         <w:outlineLvl w:val="0"/>
       </w:pPr>
+      <w:bookmarkStart w:id="142" w:name="_TocAll0042"/>
+      <w:bookmarkEnd w:id="142"/>
       <w:r>
         <w:rPr>
           <w:rFonts w:ascii="Amazon Ember" w:cs="Amazon Ember" w:eastAsia="Amazon Ember" w:hAnsi="Amazon Ember"/>
@@ -7442,6 +8046,8 @@
         <w:jc w:val="center"/>
         <w:outlineLvl w:val="0"/>
       </w:pPr>
+      <w:bookmarkStart w:id="143" w:name="_TocAll0043"/>
+      <w:bookmarkEnd w:id="143"/>
       <w:r>
         <w:rPr>
           <w:rFonts w:ascii="Amazon Ember" w:cs="Amazon Ember" w:eastAsia="Amazon Ember" w:hAnsi="Amazon Ember"/>
@@ -7594,6 +8200,8 @@
         <w:jc w:val="center"/>
         <w:outlineLvl w:val="0"/>
       </w:pPr>
+      <w:bookmarkStart w:id="144" w:name="_TocAll0044"/>
+      <w:bookmarkEnd w:id="144"/>
       <w:r>
         <w:rPr>
           <w:rFonts w:ascii="Amazon Ember" w:cs="Amazon Ember" w:eastAsia="Amazon Ember" w:hAnsi="Amazon Ember"/>
@@ -7742,6 +8350,8 @@
         <w:jc w:val="center"/>
         <w:outlineLvl w:val="0"/>
       </w:pPr>
+      <w:bookmarkStart w:id="145" w:name="_TocAll0045"/>
+      <w:bookmarkEnd w:id="145"/>
       <w:r>
         <w:rPr>
           <w:rFonts w:ascii="Amazon Ember" w:cs="Amazon Ember" w:eastAsia="Amazon Ember" w:hAnsi="Amazon Ember"/>
@@ -8069,6 +8679,8 @@
         <w:jc w:val="center"/>
         <w:outlineLvl w:val="0"/>
       </w:pPr>
+      <w:bookmarkStart w:id="146" w:name="_TocAll0046"/>
+      <w:bookmarkEnd w:id="146"/>
       <w:r>
         <w:rPr>
           <w:rFonts w:ascii="Amazon Ember" w:cs="Amazon Ember" w:eastAsia="Amazon Ember" w:hAnsi="Amazon Ember"/>
@@ -8224,6 +8836,8 @@
         <w:jc w:val="center"/>
         <w:outlineLvl w:val="0"/>
       </w:pPr>
+      <w:bookmarkStart w:id="147" w:name="_TocAll0047"/>
+      <w:bookmarkEnd w:id="147"/>
       <w:r>
         <w:rPr>
           <w:rFonts w:ascii="Amazon Ember" w:cs="Amazon Ember" w:eastAsia="Amazon Ember" w:hAnsi="Amazon Ember"/>
@@ -10863,6 +11477,8 @@
         <w:jc w:val="center"/>
         <w:outlineLvl w:val="0"/>
       </w:pPr>
+      <w:bookmarkStart w:id="148" w:name="_TocAll0048"/>
+      <w:bookmarkEnd w:id="148"/>
       <w:r>
         <w:rPr>
           <w:rFonts w:ascii="Amazon Ember" w:cs="Amazon Ember" w:eastAsia="Amazon Ember" w:hAnsi="Amazon Ember"/>
@@ -11051,6 +11667,8 @@
         <w:jc w:val="center"/>
         <w:outlineLvl w:val="0"/>
       </w:pPr>
+      <w:bookmarkStart w:id="149" w:name="_TocAll0049"/>
+      <w:bookmarkEnd w:id="149"/>
       <w:r>
         <w:rPr>
           <w:rFonts w:ascii="Amazon Ember" w:cs="Amazon Ember" w:eastAsia="Amazon Ember" w:hAnsi="Amazon Ember"/>
@@ -16507,6 +17125,8 @@
         <w:jc w:val="center"/>
         <w:outlineLvl w:val="0"/>
       </w:pPr>
+      <w:bookmarkStart w:id="150" w:name="_TocAll0050"/>
+      <w:bookmarkEnd w:id="150"/>
       <w:r>
         <w:rPr>
           <w:rFonts w:ascii="Amazon Ember" w:cs="Amazon Ember" w:eastAsia="Amazon Ember" w:hAnsi="Amazon Ember"/>
@@ -16840,6 +17460,23 @@
       </w:r>
       <w:r>
         <w:t xml:space="preserve">For the other dolphins, and for the general approach to explaining everything. The dolphins' farewell gives the fourth book of the series its title, So Long, and Thanks for All the Fish (1984). The dolphins here wish it noted that they are not the same dolphins.</w:t>
+      </w:r>
+    </w:p>
+    <w:p>
+      <w:r>
+        <w:br w:type="page"/>
+      </w:r>
+    </w:p>
+    <w:p>
+      <w:pPr>
+        <w:spacing w:after="200"/>
+      </w:pPr>
+      <w:r>
+        <w:rPr>
+          <w:i/>
+          <w:iCs/>
+        </w:rPr>
+        <w:t xml:space="preserve">If this book gave you something, a laugh, an idea, or a better question, I'd love to hear about it. A short review on Amazon, even a sentence or two, helps other curious readers find it, and I read every one.</w:t>
       </w:r>
     </w:p>
     <w:p>
@@ -16854,6 +17491,8 @@
         <w:jc w:val="center"/>
         <w:outlineLvl w:val="0"/>
       </w:pPr>
+      <w:bookmarkStart w:id="151" w:name="_TocAll0051"/>
+      <w:bookmarkEnd w:id="151"/>
       <w:r>
         <w:rPr>
           <w:rFonts w:ascii="Amazon Ember" w:cs="Amazon Ember" w:eastAsia="Amazon Ember" w:hAnsi="Amazon Ember"/>
@@ -16889,6 +17528,8 @@
         <w:jc w:val="center"/>
         <w:outlineLvl w:val="0"/>
       </w:pPr>
+      <w:bookmarkStart w:id="152" w:name="_TocAll0052"/>
+      <w:bookmarkEnd w:id="152"/>
       <w:r>
         <w:rPr>
           <w:rFonts w:ascii="Amazon Ember" w:cs="Amazon Ember" w:eastAsia="Amazon Ember" w:hAnsi="Amazon Ember"/>

</xml_diff>

<commit_message>
TOC complete and linked + review invitation: The Dolphins' View of History [merged onto main from book-2-lectures-after-qed 962664c, paths only]
</commit_message>
<xml_diff>
--- a/The Dolphins' View of History/The Dolphins' View of History - Complete Manuscript.docx
+++ b/The Dolphins' View of History/The Dolphins' View of History - Complete Manuscript.docx
@@ -164,6 +164,526 @@
           </w:r>
         </w:p>
         <w:p>
+          <w:pPr>
+            <w:spacing w:after="60"/>
+          </w:pPr>
+          <w:hyperlink w:anchor="_TocAll0001" w:history="1">
+            <w:r>
+              <w:t xml:space="preserve">Prologue: Humans Have Ape Ancestors</w:t>
+            </w:r>
+          </w:hyperlink>
+        </w:p>
+        <w:p>
+          <w:pPr>
+            <w:spacing w:after="60"/>
+          </w:pPr>
+          <w:hyperlink w:anchor="_TocAll0002" w:history="1">
+            <w:r>
+              <w:t xml:space="preserve">The Last Fifty Million Years: No Hands, No Cities — Why the Dolphins Only Watched</w:t>
+            </w:r>
+          </w:hyperlink>
+        </w:p>
+        <w:p>
+          <w:pPr>
+            <w:spacing w:after="60"/>
+          </w:pPr>
+          <w:hyperlink w:anchor="_TocAll0003" w:history="1">
+            <w:r>
+              <w:t xml:space="preserve">7 Million to 300,000 Years Ago: Where Everyone Is From — Africa and the Making of Humans</w:t>
+            </w:r>
+          </w:hyperlink>
+        </w:p>
+        <w:p>
+          <w:pPr>
+            <w:spacing w:after="60"/>
+          </w:pPr>
+          <w:hyperlink w:anchor="_TocAll0004" w:history="1">
+            <w:r>
+              <w:t xml:space="preserve">The Old Stone Age, a Million Years Ago: The First Fires — Early Humans and the Spark of Culture</w:t>
+            </w:r>
+          </w:hyperlink>
+        </w:p>
+        <w:p>
+          <w:pPr>
+            <w:spacing w:after="60"/>
+          </w:pPr>
+          <w:hyperlink w:anchor="_TocAll0005" w:history="1">
+            <w:r>
+              <w:t xml:space="preserve">70,000 to 15,000 Years Ago: Out of Africa — The Long Walk Across the World</w:t>
+            </w:r>
+          </w:hyperlink>
+        </w:p>
+        <w:p>
+          <w:pPr>
+            <w:spacing w:after="60"/>
+          </w:pPr>
+          <w:hyperlink w:anchor="_TocAll0006" w:history="1">
+            <w:r>
+              <w:t xml:space="preserve">The Neolithic, from 10,000 BCE: The First Villages — Agriculture and the End of Wandering</w:t>
+            </w:r>
+          </w:hyperlink>
+        </w:p>
+        <w:p>
+          <w:pPr>
+            <w:spacing w:after="60"/>
+          </w:pPr>
+          <w:hyperlink w:anchor="_TocAll0007" w:history="1">
+            <w:r>
+              <w:t xml:space="preserve">From 3200 BCE: Writing and Memory — How Humans Learned to Speak to the Future</w:t>
+            </w:r>
+          </w:hyperlink>
+        </w:p>
+        <w:p>
+          <w:pPr>
+            <w:spacing w:after="60"/>
+          </w:pPr>
+          <w:hyperlink w:anchor="_TocAll0008" w:history="1">
+            <w:r>
+              <w:t xml:space="preserve">The Bronze Age, 3100–1150 BCE: Gods and Kings — Mesopotamia, Egypt, and the First Empires</w:t>
+            </w:r>
+          </w:hyperlink>
+        </w:p>
+        <w:p>
+          <w:pPr>
+            <w:spacing w:after="60"/>
+          </w:pPr>
+          <w:hyperlink w:anchor="_TocAll0009" w:history="1">
+            <w:r>
+              <w:t xml:space="preserve">1600 BCE to 589 CE: The Middle Kingdom — China's Long Civilization</w:t>
+            </w:r>
+          </w:hyperlink>
+        </w:p>
+        <w:p>
+          <w:pPr>
+            <w:spacing w:after="60"/>
+          </w:pPr>
+          <w:hyperlink w:anchor="_TocAll0010" w:history="1">
+            <w:r>
+              <w:t xml:space="preserve">2600 BCE to 550 CE: The Subcontinent — Zero, Gods, and Glorious Complexity</w:t>
+            </w:r>
+          </w:hyperlink>
+        </w:p>
+        <w:p>
+          <w:pPr>
+            <w:spacing w:after="60"/>
+          </w:pPr>
+          <w:hyperlink w:anchor="_TocAll0011" w:history="1">
+            <w:r>
+              <w:t xml:space="preserve">Classical Greece, 508–323 BCE: Democracy's Experiment — Ancient Greece</w:t>
+            </w:r>
+          </w:hyperlink>
+        </w:p>
+        <w:p>
+          <w:pPr>
+            <w:spacing w:after="60"/>
+          </w:pPr>
+          <w:hyperlink w:anchor="_TocAll0012" w:history="1">
+            <w:r>
+              <w:t xml:space="preserve">The 8th Century BCE to 476 CE: Rome — The Empire That Built the World and Broke It</w:t>
+            </w:r>
+          </w:hyperlink>
+        </w:p>
+        <w:p>
+          <w:pPr>
+            <w:spacing w:after="60"/>
+          </w:pPr>
+          <w:hyperlink w:anchor="_TocAll0013" w:history="1">
+            <w:r>
+              <w:t xml:space="preserve">The 5th Century BCE to 1291 CE: Faiths, Crusades, and the Medieval World</w:t>
+            </w:r>
+          </w:hyperlink>
+        </w:p>
+        <w:p>
+          <w:pPr>
+            <w:spacing w:after="60"/>
+          </w:pPr>
+          <w:hyperlink w:anchor="_TocAll0014" w:history="1">
+            <w:r>
+              <w:t xml:space="preserve">The Early Middle Ages, 476–1000 CE: The Allegedly Dark Ages</w:t>
+            </w:r>
+          </w:hyperlink>
+        </w:p>
+        <w:p>
+          <w:pPr>
+            <w:spacing w:after="60"/>
+          </w:pPr>
+          <w:hyperlink w:anchor="_TocAll0015" w:history="1">
+            <w:r>
+              <w:t xml:space="preserve">The 2nd Century BCE to 1368 CE: Silk, Steppe, and Plague — The Roads That Connected Everyone, Including the Germs</w:t>
+            </w:r>
+          </w:hyperlink>
+        </w:p>
+        <w:p>
+          <w:pPr>
+            <w:spacing w:after="60"/>
+          </w:pPr>
+          <w:hyperlink w:anchor="_TocAll0016" w:history="1">
+            <w:r>
+              <w:t xml:space="preserve">The 8th Century BCE to 1897 CE: Gold, Salt, and Stone — The Kingdoms of Africa</w:t>
+            </w:r>
+          </w:hyperlink>
+        </w:p>
+        <w:p>
+          <w:pPr>
+            <w:spacing w:after="60"/>
+          </w:pPr>
+          <w:hyperlink w:anchor="_TocAll0017" w:history="1">
+            <w:r>
+              <w:t xml:space="preserve">1482 to Today: The Richness Moved — Africa's Resources and Who Took Them</w:t>
+            </w:r>
+          </w:hyperlink>
+        </w:p>
+        <w:p>
+          <w:pPr>
+            <w:spacing w:after="60"/>
+          </w:pPr>
+          <w:hyperlink w:anchor="_TocAll0018" w:history="1">
+            <w:r>
+              <w:t xml:space="preserve">2600 BCE to 1491 CE: Before Columbus — Cities, Corn, and Knotted String</w:t>
+            </w:r>
+          </w:hyperlink>
+        </w:p>
+        <w:p>
+          <w:pPr>
+            <w:spacing w:after="60"/>
+          </w:pPr>
+          <w:hyperlink w:anchor="_TocAll0019" w:history="1">
+            <w:r>
+              <w:t xml:space="preserve">The 15th to 17th Centuries: Ships, Gunpowder, and Gold — Exploration, Conquest, and the Colonial Age</w:t>
+            </w:r>
+          </w:hyperlink>
+        </w:p>
+        <w:p>
+          <w:pPr>
+            <w:spacing w:after="60"/>
+          </w:pPr>
+          <w:hyperlink w:anchor="_TocAll0020" w:history="1">
+            <w:r>
+              <w:t xml:space="preserve">1450 to the Late 1800s: Machines and Manifestos — Renaissance, Enlightenment, and Industry</w:t>
+            </w:r>
+          </w:hyperlink>
+        </w:p>
+        <w:p>
+          <w:pPr>
+            <w:spacing w:after="60"/>
+          </w:pPr>
+          <w:hyperlink w:anchor="_TocAll0021" w:history="1">
+            <w:r>
+              <w:t xml:space="preserve">1776–1865: The Republic, With Exceptions — America</w:t>
+            </w:r>
+          </w:hyperlink>
+        </w:p>
+        <w:p>
+          <w:pPr>
+            <w:spacing w:after="60"/>
+          </w:pPr>
+          <w:hyperlink w:anchor="_TocAll0022" w:history="1">
+            <w:r>
+              <w:t xml:space="preserve">1865 to Today: After the Bargain — America's Long Account</w:t>
+            </w:r>
+          </w:hyperlink>
+        </w:p>
+        <w:p>
+          <w:pPr>
+            <w:spacing w:after="60"/>
+          </w:pPr>
+          <w:hyperlink w:anchor="_TocAll0023" w:history="1">
+            <w:r>
+              <w:t xml:space="preserve">1620 to 1993: God's Own Experiment — Religion in America</w:t>
+            </w:r>
+          </w:hyperlink>
+        </w:p>
+        <w:p>
+          <w:pPr>
+            <w:spacing w:after="60"/>
+          </w:pPr>
+          <w:hyperlink w:anchor="_TocAll0024" w:history="1">
+            <w:r>
+              <w:t xml:space="preserve">1808 to Today: Liberators and Generals — Latin America After the Empires</w:t>
+            </w:r>
+          </w:hyperlink>
+        </w:p>
+        <w:p>
+          <w:pPr>
+            <w:spacing w:after="60"/>
+          </w:pPr>
+          <w:hyperlink w:anchor="_TocAll0025" w:history="1">
+            <w:r>
+              <w:t xml:space="preserve">1299 to Today: The Sublime Porte — The Ottoman Empire and the Map It Left</w:t>
+            </w:r>
+          </w:hyperlink>
+        </w:p>
+        <w:p>
+          <w:pPr>
+            <w:spacing w:after="60"/>
+          </w:pPr>
+          <w:hyperlink w:anchor="_TocAll0026" w:history="1">
+            <w:r>
+              <w:t xml:space="preserve">1914–1918: Home by Christmas — The First World War</w:t>
+            </w:r>
+          </w:hyperlink>
+        </w:p>
+        <w:p>
+          <w:pPr>
+            <w:spacing w:after="60"/>
+          </w:pPr>
+          <w:hyperlink w:anchor="_TocAll0027" w:history="1">
+            <w:r>
+              <w:t xml:space="preserve">The Twentieth Century: Genius and Catastrophe — Great Countries, Terrible Decades</w:t>
+            </w:r>
+          </w:hyperlink>
+        </w:p>
+        <w:p>
+          <w:pPr>
+            <w:spacing w:after="60"/>
+          </w:pPr>
+          <w:hyperlink w:anchor="_TocAll0028" w:history="1">
+            <w:r>
+              <w:t xml:space="preserve">1853–1947: Japan, Restoration, and Empire</w:t>
+            </w:r>
+          </w:hyperlink>
+        </w:p>
+        <w:p>
+          <w:pPr>
+            <w:spacing w:after="60"/>
+          </w:pPr>
+          <w:hyperlink w:anchor="_TocAll0029" w:history="1">
+            <w:r>
+              <w:t xml:space="preserve">1861–1946: Italy, Rome's Heir and the Fascist Detour</w:t>
+            </w:r>
+          </w:hyperlink>
+        </w:p>
+        <w:p>
+          <w:pPr>
+            <w:spacing w:after="60"/>
+          </w:pPr>
+          <w:hyperlink w:anchor="_TocAll0030" w:history="1">
+            <w:r>
+              <w:t xml:space="preserve">Medieval Córdoba to 1981: Spain, Convivencia and the General</w:t>
+            </w:r>
+          </w:hyperlink>
+        </w:p>
+        <w:p>
+          <w:pPr>
+            <w:spacing w:after="60"/>
+          </w:pPr>
+          <w:hyperlink w:anchor="_TocAll0031" w:history="1">
+            <w:r>
+              <w:t xml:space="preserve">1917–1991: The Soviet Union, Ideals and Iron</w:t>
+            </w:r>
+          </w:hyperlink>
+        </w:p>
+        <w:p>
+          <w:pPr>
+            <w:spacing w:after="60"/>
+          </w:pPr>
+          <w:hyperlink w:anchor="_TocAll0032" w:history="1">
+            <w:r>
+              <w:t xml:space="preserve">1949 to Today: China, the Long Memory and the Great Leap</w:t>
+            </w:r>
+          </w:hyperlink>
+        </w:p>
+        <w:p>
+          <w:pPr>
+            <w:spacing w:after="60"/>
+          </w:pPr>
+          <w:hyperlink w:anchor="_TocAll0033" w:history="1">
+            <w:r>
+              <w:t xml:space="preserve">The 13th Century BCE to 1948 CE: The People Who Kept Their Story — A Complete History of the Jews</w:t>
+            </w:r>
+          </w:hyperlink>
+        </w:p>
+        <w:p>
+          <w:pPr>
+            <w:spacing w:after="60"/>
+          </w:pPr>
+          <w:hyperlink w:anchor="_TocAll0034" w:history="1">
+            <w:r>
+              <w:t xml:space="preserve">1945–1991: Cold War — Two Powers, One Planet</w:t>
+            </w:r>
+          </w:hyperlink>
+        </w:p>
+        <w:p>
+          <w:pPr>
+            <w:spacing w:after="60"/>
+          </w:pPr>
+          <w:hyperlink w:anchor="_TocAll0035" w:history="1">
+            <w:r>
+              <w:t xml:space="preserve">1957 to 2026: Leaving the Cradle — Space Travel, the Moon, Mars, and (Maybe) the Galaxy</w:t>
+            </w:r>
+          </w:hyperlink>
+        </w:p>
+        <w:p>
+          <w:pPr>
+            <w:spacing w:after="60"/>
+          </w:pPr>
+          <w:hyperlink w:anchor="_TocAll0036" w:history="1">
+            <w:r>
+              <w:t xml:space="preserve">1905 Onward: The Physics That Finally Made Sense to Someone</w:t>
+            </w:r>
+          </w:hyperlink>
+        </w:p>
+        <w:p>
+          <w:pPr>
+            <w:spacing w:after="60"/>
+          </w:pPr>
+          <w:hyperlink w:anchor="_TocAll0037" w:history="1">
+            <w:r>
+              <w:t xml:space="preserve">The 1940s to the 1970s: Decolonization — The World Redraws Itself</w:t>
+            </w:r>
+          </w:hyperlink>
+        </w:p>
+        <w:p>
+          <w:pPr>
+            <w:spacing w:after="60"/>
+          </w:pPr>
+          <w:hyperlink w:anchor="_TocAll0038" w:history="1">
+            <w:r>
+              <w:t xml:space="preserve">1893 to 1994: Civil Rights and Liberation — Humanity Argues With Itself</w:t>
+            </w:r>
+          </w:hyperlink>
+        </w:p>
+        <w:p>
+          <w:pPr>
+            <w:spacing w:after="60"/>
+          </w:pPr>
+          <w:hyperlink w:anchor="_TocAll0039" w:history="1">
+            <w:r>
+              <w:t xml:space="preserve">1843 to 2007: The Digital Leap — Computers, Networks, and a Connected World</w:t>
+            </w:r>
+          </w:hyperlink>
+        </w:p>
+        <w:p>
+          <w:pPr>
+            <w:spacing w:after="60"/>
+          </w:pPr>
+          <w:hyperlink w:anchor="_TocAll0040" w:history="1">
+            <w:r>
+              <w:t xml:space="preserve">The Thirteenth B'ak'tun, 2012: The World Was Supposed to End in 2012 (It Didn't)</w:t>
+            </w:r>
+          </w:hyperlink>
+        </w:p>
+        <w:p>
+          <w:pPr>
+            <w:spacing w:after="60"/>
+          </w:pPr>
+          <w:hyperlink w:anchor="_TocAll0041" w:history="1">
+            <w:r>
+              <w:t xml:space="preserve">1950 to the 2020s: Something Might Be Watching (Probably Not What You Think)</w:t>
+            </w:r>
+          </w:hyperlink>
+        </w:p>
+        <w:p>
+          <w:pPr>
+            <w:spacing w:after="60"/>
+          </w:pPr>
+          <w:hyperlink w:anchor="_TocAll0042" w:history="1">
+            <w:r>
+              <w:t xml:space="preserve">1796 to Today: Medicine and Its Cost — How Humans Learned to Heal</w:t>
+            </w:r>
+          </w:hyperlink>
+        </w:p>
+        <w:p>
+          <w:pPr>
+            <w:spacing w:after="60"/>
+          </w:pPr>
+          <w:hyperlink w:anchor="_TocAll0043" w:history="1">
+            <w:r>
+              <w:t xml:space="preserve">1896 to Today: Climate and Consequence — The Price of Progress</w:t>
+            </w:r>
+          </w:hyperlink>
+        </w:p>
+        <w:p>
+          <w:pPr>
+            <w:spacing w:after="60"/>
+          </w:pPr>
+          <w:hyperlink w:anchor="_TocAll0044" w:history="1">
+            <w:r>
+              <w:t xml:space="preserve">1991 to Today: A Fractured Present — Democracy, Authoritarianism, and the Information Age</w:t>
+            </w:r>
+          </w:hyperlink>
+        </w:p>
+        <w:p>
+          <w:pPr>
+            <w:spacing w:after="60"/>
+          </w:pPr>
+          <w:hyperlink w:anchor="_TocAll0045" w:history="1">
+            <w:r>
+              <w:t xml:space="preserve">Seven Million Years to Today: The Dolphins' Long View — What a Non-Human Species Makes of Human History</w:t>
+            </w:r>
+          </w:hyperlink>
+        </w:p>
+        <w:p>
+          <w:pPr>
+            <w:spacing w:after="60"/>
+          </w:pPr>
+          <w:hyperlink w:anchor="_TocAll0046" w:history="1">
+            <w:r>
+              <w:t xml:space="preserve">Epilogue: After Homo Sapiens — Superhumans and Androids</w:t>
+            </w:r>
+          </w:hyperlink>
+        </w:p>
+        <w:p>
+          <w:pPr>
+            <w:spacing w:after="60"/>
+          </w:pPr>
+          <w:hyperlink w:anchor="_TocAll0047" w:history="1">
+            <w:r>
+              <w:t xml:space="preserve">A Timeline — For Humans Who Like Their History in Order</w:t>
+            </w:r>
+          </w:hyperlink>
+        </w:p>
+        <w:p>
+          <w:pPr>
+            <w:spacing w:after="60"/>
+          </w:pPr>
+          <w:hyperlink w:anchor="_TocAll0048" w:history="1">
+            <w:r>
+              <w:t xml:space="preserve">What the Physics Is For — An Appendix on Uses and the One Theory Not Yet Found</w:t>
+            </w:r>
+          </w:hyperlink>
+        </w:p>
+        <w:p>
+          <w:pPr>
+            <w:spacing w:after="60"/>
+          </w:pPr>
+          <w:hyperlink w:anchor="_TocAll0049" w:history="1">
+            <w:r>
+              <w:t xml:space="preserve">Notes and Sources</w:t>
+            </w:r>
+          </w:hyperlink>
+        </w:p>
+        <w:p>
+          <w:pPr>
+            <w:spacing w:after="60"/>
+          </w:pPr>
+          <w:hyperlink w:anchor="_TocAll0050" w:history="1">
+            <w:r>
+              <w:t xml:space="preserve">Further Reading — For Humans</w:t>
+            </w:r>
+          </w:hyperlink>
+        </w:p>
+        <w:p>
+          <w:pPr>
+            <w:spacing w:after="60"/>
+          </w:pPr>
+          <w:hyperlink w:anchor="_TocAll0051" w:history="1">
+            <w:r>
+              <w:t xml:space="preserve">About the Author</w:t>
+            </w:r>
+          </w:hyperlink>
+        </w:p>
+        <w:p>
+          <w:pPr>
+            <w:spacing w:after="60"/>
+          </w:pPr>
+          <w:hyperlink w:anchor="_TocAll0052" w:history="1">
+            <w:r>
+              <w:t xml:space="preserve">Also by Lothar J. Musiol</w:t>
+            </w:r>
+          </w:hyperlink>
+        </w:p>
+        <w:p>
           <w:r>
             <w:fldChar w:fldCharType="end"/>
           </w:r>
@@ -182,6 +702,8 @@
         <w:jc w:val="center"/>
         <w:outlineLvl w:val="0"/>
       </w:pPr>
+      <w:bookmarkStart w:id="101" w:name="_TocAll0001"/>
+      <w:bookmarkEnd w:id="101"/>
       <w:r>
         <w:rPr>
           <w:rFonts w:ascii="Amazon Ember" w:cs="Amazon Ember" w:eastAsia="Amazon Ember" w:hAnsi="Amazon Ember"/>
@@ -462,6 +984,8 @@
         <w:jc w:val="center"/>
         <w:outlineLvl w:val="0"/>
       </w:pPr>
+      <w:bookmarkStart w:id="102" w:name="_TocAll0002"/>
+      <w:bookmarkEnd w:id="102"/>
       <w:r>
         <w:rPr>
           <w:rFonts w:ascii="Amazon Ember" w:cs="Amazon Ember" w:eastAsia="Amazon Ember" w:hAnsi="Amazon Ember"/>
@@ -750,6 +1274,8 @@
         <w:jc w:val="center"/>
         <w:outlineLvl w:val="0"/>
       </w:pPr>
+      <w:bookmarkStart w:id="103" w:name="_TocAll0003"/>
+      <w:bookmarkEnd w:id="103"/>
       <w:r>
         <w:rPr>
           <w:rFonts w:ascii="Amazon Ember" w:cs="Amazon Ember" w:eastAsia="Amazon Ember" w:hAnsi="Amazon Ember"/>
@@ -898,6 +1424,8 @@
         <w:jc w:val="center"/>
         <w:outlineLvl w:val="0"/>
       </w:pPr>
+      <w:bookmarkStart w:id="104" w:name="_TocAll0004"/>
+      <w:bookmarkEnd w:id="104"/>
       <w:r>
         <w:rPr>
           <w:rFonts w:ascii="Amazon Ember" w:cs="Amazon Ember" w:eastAsia="Amazon Ember" w:hAnsi="Amazon Ember"/>
@@ -1050,6 +1578,8 @@
         <w:jc w:val="center"/>
         <w:outlineLvl w:val="0"/>
       </w:pPr>
+      <w:bookmarkStart w:id="105" w:name="_TocAll0005"/>
+      <w:bookmarkEnd w:id="105"/>
       <w:r>
         <w:rPr>
           <w:rFonts w:ascii="Amazon Ember" w:cs="Amazon Ember" w:eastAsia="Amazon Ember" w:hAnsi="Amazon Ember"/>
@@ -1230,6 +1760,8 @@
         <w:jc w:val="center"/>
         <w:outlineLvl w:val="0"/>
       </w:pPr>
+      <w:bookmarkStart w:id="106" w:name="_TocAll0006"/>
+      <w:bookmarkEnd w:id="106"/>
       <w:r>
         <w:rPr>
           <w:rFonts w:ascii="Amazon Ember" w:cs="Amazon Ember" w:eastAsia="Amazon Ember" w:hAnsi="Amazon Ember"/>
@@ -1438,6 +1970,8 @@
         <w:jc w:val="center"/>
         <w:outlineLvl w:val="0"/>
       </w:pPr>
+      <w:bookmarkStart w:id="107" w:name="_TocAll0007"/>
+      <w:bookmarkEnd w:id="107"/>
       <w:r>
         <w:rPr>
           <w:rFonts w:ascii="Amazon Ember" w:cs="Amazon Ember" w:eastAsia="Amazon Ember" w:hAnsi="Amazon Ember"/>
@@ -1626,6 +2160,8 @@
         <w:jc w:val="center"/>
         <w:outlineLvl w:val="0"/>
       </w:pPr>
+      <w:bookmarkStart w:id="108" w:name="_TocAll0008"/>
+      <w:bookmarkEnd w:id="108"/>
       <w:r>
         <w:rPr>
           <w:rFonts w:ascii="Amazon Ember" w:cs="Amazon Ember" w:eastAsia="Amazon Ember" w:hAnsi="Amazon Ember"/>
@@ -1794,6 +2330,8 @@
         <w:jc w:val="center"/>
         <w:outlineLvl w:val="0"/>
       </w:pPr>
+      <w:bookmarkStart w:id="109" w:name="_TocAll0009"/>
+      <w:bookmarkEnd w:id="109"/>
       <w:r>
         <w:rPr>
           <w:rFonts w:ascii="Amazon Ember" w:cs="Amazon Ember" w:eastAsia="Amazon Ember" w:hAnsi="Amazon Ember"/>
@@ -1942,6 +2480,8 @@
         <w:jc w:val="center"/>
         <w:outlineLvl w:val="0"/>
       </w:pPr>
+      <w:bookmarkStart w:id="110" w:name="_TocAll0010"/>
+      <w:bookmarkEnd w:id="110"/>
       <w:r>
         <w:rPr>
           <w:rFonts w:ascii="Amazon Ember" w:cs="Amazon Ember" w:eastAsia="Amazon Ember" w:hAnsi="Amazon Ember"/>
@@ -2098,6 +2638,8 @@
         <w:jc w:val="center"/>
         <w:outlineLvl w:val="0"/>
       </w:pPr>
+      <w:bookmarkStart w:id="111" w:name="_TocAll0011"/>
+      <w:bookmarkEnd w:id="111"/>
       <w:r>
         <w:rPr>
           <w:rFonts w:ascii="Amazon Ember" w:cs="Amazon Ember" w:eastAsia="Amazon Ember" w:hAnsi="Amazon Ember"/>
@@ -2226,6 +2768,8 @@
         <w:jc w:val="center"/>
         <w:outlineLvl w:val="0"/>
       </w:pPr>
+      <w:bookmarkStart w:id="112" w:name="_TocAll0012"/>
+      <w:bookmarkEnd w:id="112"/>
       <w:r>
         <w:rPr>
           <w:rFonts w:ascii="Amazon Ember" w:cs="Amazon Ember" w:eastAsia="Amazon Ember" w:hAnsi="Amazon Ember"/>
@@ -2382,6 +2926,8 @@
         <w:jc w:val="center"/>
         <w:outlineLvl w:val="0"/>
       </w:pPr>
+      <w:bookmarkStart w:id="113" w:name="_TocAll0013"/>
+      <w:bookmarkEnd w:id="113"/>
       <w:r>
         <w:rPr>
           <w:rFonts w:ascii="Amazon Ember" w:cs="Amazon Ember" w:eastAsia="Amazon Ember" w:hAnsi="Amazon Ember"/>
@@ -2510,6 +3056,8 @@
         <w:jc w:val="center"/>
         <w:outlineLvl w:val="0"/>
       </w:pPr>
+      <w:bookmarkStart w:id="114" w:name="_TocAll0014"/>
+      <w:bookmarkEnd w:id="114"/>
       <w:r>
         <w:rPr>
           <w:rFonts w:ascii="Amazon Ember" w:cs="Amazon Ember" w:eastAsia="Amazon Ember" w:hAnsi="Amazon Ember"/>
@@ -2738,6 +3286,8 @@
         <w:jc w:val="center"/>
         <w:outlineLvl w:val="0"/>
       </w:pPr>
+      <w:bookmarkStart w:id="115" w:name="_TocAll0015"/>
+      <w:bookmarkEnd w:id="115"/>
       <w:r>
         <w:rPr>
           <w:rFonts w:ascii="Amazon Ember" w:cs="Amazon Ember" w:eastAsia="Amazon Ember" w:hAnsi="Amazon Ember"/>
@@ -2878,6 +3428,8 @@
         <w:jc w:val="center"/>
         <w:outlineLvl w:val="0"/>
       </w:pPr>
+      <w:bookmarkStart w:id="116" w:name="_TocAll0016"/>
+      <w:bookmarkEnd w:id="116"/>
       <w:r>
         <w:rPr>
           <w:rFonts w:ascii="Amazon Ember" w:cs="Amazon Ember" w:eastAsia="Amazon Ember" w:hAnsi="Amazon Ember"/>
@@ -3002,6 +3554,8 @@
         <w:jc w:val="center"/>
         <w:outlineLvl w:val="0"/>
       </w:pPr>
+      <w:bookmarkStart w:id="117" w:name="_TocAll0017"/>
+      <w:bookmarkEnd w:id="117"/>
       <w:r>
         <w:rPr>
           <w:rFonts w:ascii="Amazon Ember" w:cs="Amazon Ember" w:eastAsia="Amazon Ember" w:hAnsi="Amazon Ember"/>
@@ -3266,6 +3820,8 @@
         <w:jc w:val="center"/>
         <w:outlineLvl w:val="0"/>
       </w:pPr>
+      <w:bookmarkStart w:id="118" w:name="_TocAll0018"/>
+      <w:bookmarkEnd w:id="118"/>
       <w:r>
         <w:rPr>
           <w:rFonts w:ascii="Amazon Ember" w:cs="Amazon Ember" w:eastAsia="Amazon Ember" w:hAnsi="Amazon Ember"/>
@@ -3418,6 +3974,8 @@
         <w:jc w:val="center"/>
         <w:outlineLvl w:val="0"/>
       </w:pPr>
+      <w:bookmarkStart w:id="119" w:name="_TocAll0019"/>
+      <w:bookmarkEnd w:id="119"/>
       <w:r>
         <w:rPr>
           <w:rFonts w:ascii="Amazon Ember" w:cs="Amazon Ember" w:eastAsia="Amazon Ember" w:hAnsi="Amazon Ember"/>
@@ -3586,6 +4144,8 @@
         <w:jc w:val="center"/>
         <w:outlineLvl w:val="0"/>
       </w:pPr>
+      <w:bookmarkStart w:id="120" w:name="_TocAll0020"/>
+      <w:bookmarkEnd w:id="120"/>
       <w:r>
         <w:rPr>
           <w:rFonts w:ascii="Amazon Ember" w:cs="Amazon Ember" w:eastAsia="Amazon Ember" w:hAnsi="Amazon Ember"/>
@@ -3742,6 +4302,8 @@
         <w:jc w:val="center"/>
         <w:outlineLvl w:val="0"/>
       </w:pPr>
+      <w:bookmarkStart w:id="121" w:name="_TocAll0021"/>
+      <w:bookmarkEnd w:id="121"/>
       <w:r>
         <w:rPr>
           <w:rFonts w:ascii="Amazon Ember" w:cs="Amazon Ember" w:eastAsia="Amazon Ember" w:hAnsi="Amazon Ember"/>
@@ -4150,6 +4712,8 @@
         <w:jc w:val="center"/>
         <w:outlineLvl w:val="0"/>
       </w:pPr>
+      <w:bookmarkStart w:id="122" w:name="_TocAll0022"/>
+      <w:bookmarkEnd w:id="122"/>
       <w:r>
         <w:rPr>
           <w:rFonts w:ascii="Amazon Ember" w:cs="Amazon Ember" w:eastAsia="Amazon Ember" w:hAnsi="Amazon Ember"/>
@@ -4506,6 +5070,8 @@
         <w:jc w:val="center"/>
         <w:outlineLvl w:val="0"/>
       </w:pPr>
+      <w:bookmarkStart w:id="123" w:name="_TocAll0023"/>
+      <w:bookmarkEnd w:id="123"/>
       <w:r>
         <w:rPr>
           <w:rFonts w:ascii="Amazon Ember" w:cs="Amazon Ember" w:eastAsia="Amazon Ember" w:hAnsi="Amazon Ember"/>
@@ -4638,6 +5204,8 @@
         <w:jc w:val="center"/>
         <w:outlineLvl w:val="0"/>
       </w:pPr>
+      <w:bookmarkStart w:id="124" w:name="_TocAll0024"/>
+      <w:bookmarkEnd w:id="124"/>
       <w:r>
         <w:rPr>
           <w:rFonts w:ascii="Amazon Ember" w:cs="Amazon Ember" w:eastAsia="Amazon Ember" w:hAnsi="Amazon Ember"/>
@@ -4766,6 +5334,8 @@
         <w:jc w:val="center"/>
         <w:outlineLvl w:val="0"/>
       </w:pPr>
+      <w:bookmarkStart w:id="125" w:name="_TocAll0025"/>
+      <w:bookmarkEnd w:id="125"/>
       <w:r>
         <w:rPr>
           <w:rFonts w:ascii="Amazon Ember" w:cs="Amazon Ember" w:eastAsia="Amazon Ember" w:hAnsi="Amazon Ember"/>
@@ -4878,6 +5448,8 @@
         <w:jc w:val="center"/>
         <w:outlineLvl w:val="0"/>
       </w:pPr>
+      <w:bookmarkStart w:id="126" w:name="_TocAll0026"/>
+      <w:bookmarkEnd w:id="126"/>
       <w:r>
         <w:rPr>
           <w:rFonts w:ascii="Amazon Ember" w:cs="Amazon Ember" w:eastAsia="Amazon Ember" w:hAnsi="Amazon Ember"/>
@@ -5038,6 +5610,8 @@
         <w:jc w:val="center"/>
         <w:outlineLvl w:val="0"/>
       </w:pPr>
+      <w:bookmarkStart w:id="127" w:name="_TocAll0027"/>
+      <w:bookmarkEnd w:id="127"/>
       <w:r>
         <w:rPr>
           <w:rFonts w:ascii="Amazon Ember" w:cs="Amazon Ember" w:eastAsia="Amazon Ember" w:hAnsi="Amazon Ember"/>
@@ -5230,6 +5804,8 @@
         <w:jc w:val="center"/>
         <w:outlineLvl w:val="0"/>
       </w:pPr>
+      <w:bookmarkStart w:id="128" w:name="_TocAll0028"/>
+      <w:bookmarkEnd w:id="128"/>
       <w:r>
         <w:rPr>
           <w:rFonts w:ascii="Amazon Ember" w:cs="Amazon Ember" w:eastAsia="Amazon Ember" w:hAnsi="Amazon Ember"/>
@@ -5366,6 +5942,8 @@
         <w:jc w:val="center"/>
         <w:outlineLvl w:val="0"/>
       </w:pPr>
+      <w:bookmarkStart w:id="129" w:name="_TocAll0029"/>
+      <w:bookmarkEnd w:id="129"/>
       <w:r>
         <w:rPr>
           <w:rFonts w:ascii="Amazon Ember" w:cs="Amazon Ember" w:eastAsia="Amazon Ember" w:hAnsi="Amazon Ember"/>
@@ -5510,6 +6088,8 @@
         <w:jc w:val="center"/>
         <w:outlineLvl w:val="0"/>
       </w:pPr>
+      <w:bookmarkStart w:id="130" w:name="_TocAll0030"/>
+      <w:bookmarkEnd w:id="130"/>
       <w:r>
         <w:rPr>
           <w:rFonts w:ascii="Amazon Ember" w:cs="Amazon Ember" w:eastAsia="Amazon Ember" w:hAnsi="Amazon Ember"/>
@@ -5666,6 +6246,8 @@
         <w:jc w:val="center"/>
         <w:outlineLvl w:val="0"/>
       </w:pPr>
+      <w:bookmarkStart w:id="131" w:name="_TocAll0031"/>
+      <w:bookmarkEnd w:id="131"/>
       <w:r>
         <w:rPr>
           <w:rFonts w:ascii="Amazon Ember" w:cs="Amazon Ember" w:eastAsia="Amazon Ember" w:hAnsi="Amazon Ember"/>
@@ -5802,6 +6384,8 @@
         <w:jc w:val="center"/>
         <w:outlineLvl w:val="0"/>
       </w:pPr>
+      <w:bookmarkStart w:id="132" w:name="_TocAll0032"/>
+      <w:bookmarkEnd w:id="132"/>
       <w:r>
         <w:rPr>
           <w:rFonts w:ascii="Amazon Ember" w:cs="Amazon Ember" w:eastAsia="Amazon Ember" w:hAnsi="Amazon Ember"/>
@@ -5962,6 +6546,8 @@
         <w:jc w:val="center"/>
         <w:outlineLvl w:val="0"/>
       </w:pPr>
+      <w:bookmarkStart w:id="133" w:name="_TocAll0033"/>
+      <w:bookmarkEnd w:id="133"/>
       <w:r>
         <w:rPr>
           <w:rFonts w:ascii="Amazon Ember" w:cs="Amazon Ember" w:eastAsia="Amazon Ember" w:hAnsi="Amazon Ember"/>
@@ -6150,6 +6736,8 @@
         <w:jc w:val="center"/>
         <w:outlineLvl w:val="0"/>
       </w:pPr>
+      <w:bookmarkStart w:id="134" w:name="_TocAll0034"/>
+      <w:bookmarkEnd w:id="134"/>
       <w:r>
         <w:rPr>
           <w:rFonts w:ascii="Amazon Ember" w:cs="Amazon Ember" w:eastAsia="Amazon Ember" w:hAnsi="Amazon Ember"/>
@@ -6298,6 +6886,8 @@
         <w:jc w:val="center"/>
         <w:outlineLvl w:val="0"/>
       </w:pPr>
+      <w:bookmarkStart w:id="135" w:name="_TocAll0035"/>
+      <w:bookmarkEnd w:id="135"/>
       <w:r>
         <w:rPr>
           <w:rFonts w:ascii="Amazon Ember" w:cs="Amazon Ember" w:eastAsia="Amazon Ember" w:hAnsi="Amazon Ember"/>
@@ -6462,6 +7052,8 @@
         <w:jc w:val="center"/>
         <w:outlineLvl w:val="0"/>
       </w:pPr>
+      <w:bookmarkStart w:id="136" w:name="_TocAll0036"/>
+      <w:bookmarkEnd w:id="136"/>
       <w:r>
         <w:rPr>
           <w:rFonts w:ascii="Amazon Ember" w:cs="Amazon Ember" w:eastAsia="Amazon Ember" w:hAnsi="Amazon Ember"/>
@@ -6614,6 +7206,8 @@
         <w:jc w:val="center"/>
         <w:outlineLvl w:val="0"/>
       </w:pPr>
+      <w:bookmarkStart w:id="137" w:name="_TocAll0037"/>
+      <w:bookmarkEnd w:id="137"/>
       <w:r>
         <w:rPr>
           <w:rFonts w:ascii="Amazon Ember" w:cs="Amazon Ember" w:eastAsia="Amazon Ember" w:hAnsi="Amazon Ember"/>
@@ -6750,6 +7344,8 @@
         <w:jc w:val="center"/>
         <w:outlineLvl w:val="0"/>
       </w:pPr>
+      <w:bookmarkStart w:id="138" w:name="_TocAll0038"/>
+      <w:bookmarkEnd w:id="138"/>
       <w:r>
         <w:rPr>
           <w:rFonts w:ascii="Amazon Ember" w:cs="Amazon Ember" w:eastAsia="Amazon Ember" w:hAnsi="Amazon Ember"/>
@@ -6866,6 +7462,8 @@
         <w:jc w:val="center"/>
         <w:outlineLvl w:val="0"/>
       </w:pPr>
+      <w:bookmarkStart w:id="139" w:name="_TocAll0039"/>
+      <w:bookmarkEnd w:id="139"/>
       <w:r>
         <w:rPr>
           <w:rFonts w:ascii="Amazon Ember" w:cs="Amazon Ember" w:eastAsia="Amazon Ember" w:hAnsi="Amazon Ember"/>
@@ -6994,6 +7592,8 @@
         <w:jc w:val="center"/>
         <w:outlineLvl w:val="0"/>
       </w:pPr>
+      <w:bookmarkStart w:id="140" w:name="_TocAll0040"/>
+      <w:bookmarkEnd w:id="140"/>
       <w:r>
         <w:rPr>
           <w:rFonts w:ascii="Amazon Ember" w:cs="Amazon Ember" w:eastAsia="Amazon Ember" w:hAnsi="Amazon Ember"/>
@@ -7134,6 +7734,8 @@
         <w:jc w:val="center"/>
         <w:outlineLvl w:val="0"/>
       </w:pPr>
+      <w:bookmarkStart w:id="141" w:name="_TocAll0041"/>
+      <w:bookmarkEnd w:id="141"/>
       <w:r>
         <w:rPr>
           <w:rFonts w:ascii="Amazon Ember" w:cs="Amazon Ember" w:eastAsia="Amazon Ember" w:hAnsi="Amazon Ember"/>
@@ -7282,6 +7884,8 @@
         <w:jc w:val="center"/>
         <w:outlineLvl w:val="0"/>
       </w:pPr>
+      <w:bookmarkStart w:id="142" w:name="_TocAll0042"/>
+      <w:bookmarkEnd w:id="142"/>
       <w:r>
         <w:rPr>
           <w:rFonts w:ascii="Amazon Ember" w:cs="Amazon Ember" w:eastAsia="Amazon Ember" w:hAnsi="Amazon Ember"/>
@@ -7442,6 +8046,8 @@
         <w:jc w:val="center"/>
         <w:outlineLvl w:val="0"/>
       </w:pPr>
+      <w:bookmarkStart w:id="143" w:name="_TocAll0043"/>
+      <w:bookmarkEnd w:id="143"/>
       <w:r>
         <w:rPr>
           <w:rFonts w:ascii="Amazon Ember" w:cs="Amazon Ember" w:eastAsia="Amazon Ember" w:hAnsi="Amazon Ember"/>
@@ -7594,6 +8200,8 @@
         <w:jc w:val="center"/>
         <w:outlineLvl w:val="0"/>
       </w:pPr>
+      <w:bookmarkStart w:id="144" w:name="_TocAll0044"/>
+      <w:bookmarkEnd w:id="144"/>
       <w:r>
         <w:rPr>
           <w:rFonts w:ascii="Amazon Ember" w:cs="Amazon Ember" w:eastAsia="Amazon Ember" w:hAnsi="Amazon Ember"/>
@@ -7742,6 +8350,8 @@
         <w:jc w:val="center"/>
         <w:outlineLvl w:val="0"/>
       </w:pPr>
+      <w:bookmarkStart w:id="145" w:name="_TocAll0045"/>
+      <w:bookmarkEnd w:id="145"/>
       <w:r>
         <w:rPr>
           <w:rFonts w:ascii="Amazon Ember" w:cs="Amazon Ember" w:eastAsia="Amazon Ember" w:hAnsi="Amazon Ember"/>
@@ -8069,6 +8679,8 @@
         <w:jc w:val="center"/>
         <w:outlineLvl w:val="0"/>
       </w:pPr>
+      <w:bookmarkStart w:id="146" w:name="_TocAll0046"/>
+      <w:bookmarkEnd w:id="146"/>
       <w:r>
         <w:rPr>
           <w:rFonts w:ascii="Amazon Ember" w:cs="Amazon Ember" w:eastAsia="Amazon Ember" w:hAnsi="Amazon Ember"/>
@@ -8224,6 +8836,8 @@
         <w:jc w:val="center"/>
         <w:outlineLvl w:val="0"/>
       </w:pPr>
+      <w:bookmarkStart w:id="147" w:name="_TocAll0047"/>
+      <w:bookmarkEnd w:id="147"/>
       <w:r>
         <w:rPr>
           <w:rFonts w:ascii="Amazon Ember" w:cs="Amazon Ember" w:eastAsia="Amazon Ember" w:hAnsi="Amazon Ember"/>
@@ -10863,6 +11477,8 @@
         <w:jc w:val="center"/>
         <w:outlineLvl w:val="0"/>
       </w:pPr>
+      <w:bookmarkStart w:id="148" w:name="_TocAll0048"/>
+      <w:bookmarkEnd w:id="148"/>
       <w:r>
         <w:rPr>
           <w:rFonts w:ascii="Amazon Ember" w:cs="Amazon Ember" w:eastAsia="Amazon Ember" w:hAnsi="Amazon Ember"/>
@@ -11051,6 +11667,8 @@
         <w:jc w:val="center"/>
         <w:outlineLvl w:val="0"/>
       </w:pPr>
+      <w:bookmarkStart w:id="149" w:name="_TocAll0049"/>
+      <w:bookmarkEnd w:id="149"/>
       <w:r>
         <w:rPr>
           <w:rFonts w:ascii="Amazon Ember" w:cs="Amazon Ember" w:eastAsia="Amazon Ember" w:hAnsi="Amazon Ember"/>
@@ -16507,6 +17125,8 @@
         <w:jc w:val="center"/>
         <w:outlineLvl w:val="0"/>
       </w:pPr>
+      <w:bookmarkStart w:id="150" w:name="_TocAll0050"/>
+      <w:bookmarkEnd w:id="150"/>
       <w:r>
         <w:rPr>
           <w:rFonts w:ascii="Amazon Ember" w:cs="Amazon Ember" w:eastAsia="Amazon Ember" w:hAnsi="Amazon Ember"/>
@@ -16840,6 +17460,23 @@
       </w:r>
       <w:r>
         <w:t xml:space="preserve">For the other dolphins, and for the general approach to explaining everything. The dolphins' farewell gives the fourth book of the series its title, So Long, and Thanks for All the Fish (1984). The dolphins here wish it noted that they are not the same dolphins.</w:t>
+      </w:r>
+    </w:p>
+    <w:p>
+      <w:r>
+        <w:br w:type="page"/>
+      </w:r>
+    </w:p>
+    <w:p>
+      <w:pPr>
+        <w:spacing w:after="200"/>
+      </w:pPr>
+      <w:r>
+        <w:rPr>
+          <w:i/>
+          <w:iCs/>
+        </w:rPr>
+        <w:t xml:space="preserve">If this book gave you something, a laugh, an idea, or a better question, I'd love to hear about it. A short review on Amazon, even a sentence or two, helps other curious readers find it, and I read every one.</w:t>
       </w:r>
     </w:p>
     <w:p>
@@ -16854,6 +17491,8 @@
         <w:jc w:val="center"/>
         <w:outlineLvl w:val="0"/>
       </w:pPr>
+      <w:bookmarkStart w:id="151" w:name="_TocAll0051"/>
+      <w:bookmarkEnd w:id="151"/>
       <w:r>
         <w:rPr>
           <w:rFonts w:ascii="Amazon Ember" w:cs="Amazon Ember" w:eastAsia="Amazon Ember" w:hAnsi="Amazon Ember"/>
@@ -16889,6 +17528,8 @@
         <w:jc w:val="center"/>
         <w:outlineLvl w:val="0"/>
       </w:pPr>
+      <w:bookmarkStart w:id="152" w:name="_TocAll0052"/>
+      <w:bookmarkEnd w:id="152"/>
       <w:r>
         <w:rPr>
           <w:rFonts w:ascii="Amazon Ember" w:cs="Amazon Ember" w:eastAsia="Amazon Ember" w:hAnsi="Amazon Ember"/>

</xml_diff>

<commit_message>
Dolphins: halve narrator tags, split long sentences, trim filler, add Greenland closing line; rebuild and resync .md
</commit_message>
<xml_diff>
--- a/The Dolphins' View of History/The Dolphins' View of History - Complete Manuscript.docx
+++ b/The Dolphins' View of History/The Dolphins' View of History - Complete Manuscript.docx
@@ -1010,7 +1010,7 @@
         <w:spacing w:after="200"/>
       </w:pPr>
       <w:r>
-        <w:t xml:space="preserve">Dolphin scholarship is willing to name names on the way. The fossil record calls the first of these test cases Pakicetus — four legs, hooves, a long snout, built rather like a hairy dog that had made some very specific life choices. Its next of kin, once it had committed a little further to the bit, was filed under Ambulocetus, which is Latin for “the walking whale.” Dolphin historians did not choose that name. They have simply had fifty million years to get used to it.</w:t>
+        <w:t xml:space="preserve">The fossil record calls the first of these test cases Pakicetus — four legs, hooves, a long snout, built rather like a hairy dog that had made some very specific life choices. Its next of kin, once it had committed a little further to the bit, was filed under Ambulocetus, which is Latin for “the walking whale.” Dolphin historians did not choose that name. They have simply had fifty million years to get used to it.</w:t>
       </w:r>
     </w:p>
     <w:p>
@@ -1098,15 +1098,15 @@
           <w:i/>
           <w:iCs/>
         </w:rPr>
-        <w:t xml:space="preserve">A species congratulating its own arrival as the point of the story is, dolphin scholarship notes, rarely in a position to notice that it is also the only witness for the defense.</w:t>
-      </w:r>
-    </w:p>
-    <w:p>
-      <w:pPr>
-        <w:spacing w:after="200"/>
-      </w:pPr>
-      <w:r>
-        <w:t xml:space="preserve">Dolphin historians are careful about one detail. Walking upright came first. Australopithecus was standing and walking on two legs more than three million years ago, with a brain not much larger than a chimpanzee’s. The big brain came later, and came slowly.</w:t>
+        <w:t xml:space="preserve">A species congratulating its own arrival as the point of the story is rarely in a position to notice that it is also the only witness for the defense.</w:t>
+      </w:r>
+    </w:p>
+    <w:p>
+      <w:pPr>
+        <w:spacing w:after="200"/>
+      </w:pPr>
+      <w:r>
+        <w:t xml:space="preserve">One detail matters here. Walking upright came first. Australopithecus was standing and walking on two legs more than three million years ago, with a brain not much larger than a chimpanzee’s. The big brain came later, and came slowly.</w:t>
       </w:r>
     </w:p>
     <w:p>
@@ -1328,7 +1328,7 @@
         <w:spacing w:after="200"/>
       </w:pPr>
       <w:r>
-        <w:t xml:space="preserve">Dolphin scholarship concedes this record is not perfectly clean. Humans did eventually find one direct use for a dolphin: capturing them for aquariums and marine parks, where they perform, on cue and on a schedule, much the same leaps and tricks dolphins already perform constantly in the wild, for free, entirely on their own initiative, for no audience but each other and the occasional extra fish.</w:t>
+        <w:t xml:space="preserve">The record is not perfectly clean. Humans did eventually find one direct use for a dolphin: capturing them for aquariums and marine parks, where they perform, on cue and on a schedule, much the same leaps and tricks dolphins already perform constantly in the wild, for free, entirely on their own initiative, for no audience but each other and the occasional extra fish.</w:t>
       </w:r>
     </w:p>
     <w:p>
@@ -1348,7 +1348,7 @@
         <w:spacing w:after="200"/>
       </w:pPr>
       <w:r>
-        <w:t xml:space="preserve">None of which stops dolphins from doing, now and then, the opposite as well: helping humans lost or in danger at sea, guiding disoriented swimmers toward shore, and, in a handful of widely reported modern cases, circling swimmers closely enough to keep an approaching shark away. These are the swimmers’ accounts, not controlled experiments, and dolphin scholarship reports them as such. Greek writers told the same kind of story more than twenty-five centuries ago: Herodotus has the singer Arion thrown overboard by pirates and carried to shore on a dolphin’s back, and the image of a rider on a dolphin ended up stamped on Greek coins.</w:t>
+        <w:t xml:space="preserve">None of which stops dolphins from doing, now and then, the opposite as well: helping humans lost or in danger at sea, guiding disoriented swimmers toward shore, and, in a handful of widely reported modern cases, circling swimmers closely enough to keep an approaching shark away. These are the swimmers’ accounts, not controlled experiments, and are reported here as such. Greek writers told the same kind of story more than twenty-five centuries ago: Herodotus has the singer Arion thrown overboard by pirates and carried to shore on a dolphin’s back, and the image of a rider on a dolphin ended up stamped on Greek coins.</w:t>
       </w:r>
     </w:p>
     <w:p>
@@ -1538,15 +1538,15 @@
         <w:spacing w:after="200"/>
       </w:pPr>
       <w:r>
-        <w:t xml:space="preserve">Homo sapiens itself is younger than most people assume. The oldest fossils attributed to it are about 300,000 years old and come from Jebel Irhoud in Morocco, at the northwestern corner of the continent, a long way from the Rift Valley. Others turn up in Ethiopia and South Africa. Dolphin historians read this to mean that there was no single garden of origin. Humanity’s ancestors were a scatter of connected populations across an entire continent, trading genes and ideas, and the modern human form came together piece by piece. They did not have the continent to themselves, either: deep in a South African cave system, a small-brained relative called Homo naledi, found in 2013 and dated to around the same period, was living alongside early modern humans.</w:t>
-      </w:r>
-    </w:p>
-    <w:p>
-      <w:pPr>
-        <w:spacing w:after="200"/>
-      </w:pPr>
-      <w:r>
-        <w:t xml:space="preserve">The evidence that these were people who thought, and not merely people who made tools, also comes from the south. At Blombos Cave on South Africa’s coast, pieces of ochre engraved with crosshatched patterns and strings of shell beads, some 75,000 years old or more, show humans making marks for no reason except meaning. Dolphin historians file them among the earliest known steps toward almost everything that follows in this book.</w:t>
+        <w:t xml:space="preserve">Homo sapiens itself is younger than most people assume. The oldest fossils attributed to it are about 300,000 years old and come from Jebel Irhoud in Morocco, at the northwestern corner of the continent, a long way from the Rift Valley. Others turn up in Ethiopia and South Africa. There was no single garden of origin. Humanity’s ancestors were a scatter of connected populations across an entire continent, trading genes and ideas, and the modern human form came together piece by piece. They did not have the continent to themselves, either: deep in a South African cave system, a small-brained relative called Homo naledi, found in 2013 and dated to around the same period, was living alongside early modern humans.</w:t>
+      </w:r>
+    </w:p>
+    <w:p>
+      <w:pPr>
+        <w:spacing w:after="200"/>
+      </w:pPr>
+      <w:r>
+        <w:t xml:space="preserve">The evidence that these were people who thought, and not merely people who made tools, also comes from the south. At Blombos Cave on South Africa’s coast, pieces of ochre engraved with crosshatched patterns and strings of shell beads, some 75,000 years old or more, show humans making marks for no reason except meaning. They are among the earliest known steps toward almost everything that follows in this book.</w:t>
       </w:r>
     </w:p>
     <w:p>
@@ -1562,7 +1562,7 @@
         <w:spacing w:after="200"/>
       </w:pPr>
       <w:r>
-        <w:t xml:space="preserve">It follows that the human family is, genetically, one very recently branched African family. The differences humans would later organize entire societies around, skin color, hair, the shape of a face, are the product of a few thousand generations of adapting to sunlight and climate, and account for a very small part of the genome. Dolphin scholarship mentions this now because several later chapters concern what humans built on the opposite assumption.</w:t>
+        <w:t xml:space="preserve">It follows that the human family is, genetically, one very recently branched African family. The differences humans would later organize entire societies around, skin color, hair, the shape of a face, are the product of a few thousand generations of adapting to sunlight and climate, and account for a very small part of the genome. It is worth saying now, because several later chapters concern what humans built on the opposite assumption.</w:t>
       </w:r>
     </w:p>
     <w:p>
@@ -1680,7 +1680,7 @@
         <w:spacing w:after="200"/>
       </w:pPr>
       <w:r>
-        <w:t xml:space="preserve">The primatologist Richard Wrangham has argued at length that cooking did more than feed the brain: it reshaped the whole animal, shrinking the teeth and the gut and freeing hours of the day, and made Homo erectus, in a sense, a species defined by dinner. The argument is contested, as most arguments about deep time are, because firm evidence of controlled fire is patchy at the very date the theory needs it most. Dolphin scholarship finds it plausible and not proved.</w:t>
+        <w:t xml:space="preserve">The primatologist Richard Wrangham has argued at length that cooking did more than feed the brain: it reshaped the whole animal, shrinking the teeth and the gut and freeing hours of the day, and made Homo erectus, in a sense, a species defined by dinner. The argument is contested, as most arguments about deep time are, because firm evidence of controlled fire is patchy at the very date the theory needs it most. It is plausible and not proved.</w:t>
       </w:r>
     </w:p>
     <w:p>
@@ -1818,7 +1818,7 @@
         <w:spacing w:after="200"/>
       </w:pPr>
       <w:r>
-        <w:t xml:space="preserve">The Denisovans are a strange case even by this chapter’s standards: as a population, they were identified in 2010 not from a skeleton but from a single fragment of a finger bone, found in Denisova Cave in Siberia, whose DNA belonged to no known human species. A handful of further scraps, including part of a jaw recovered from the Tibetan Plateau and identified only by its proteins, are most of what humans have to show for an entire branch of their own family. Dolphin historians find this the most impressive piece of detective work in the whole book: an entire lost population, reconstructed almost entirely from genetic residue.</w:t>
+        <w:t xml:space="preserve">The Denisovans are a strange case even by this chapter’s standards: as a population, they were identified in 2010 not from a skeleton but from a single fragment of a finger bone, found in Denisova Cave in Siberia, whose DNA belonged to no known human species. A handful of further scraps, including part of a jaw recovered from the Tibetan Plateau and identified only by its proteins, are most of what humans have to show for an entire branch of their own family. It is the most impressive piece of detective work in the whole book: an entire lost population, reconstructed almost entirely from genetic residue.</w:t>
       </w:r>
     </w:p>
     <w:p>
@@ -2068,7 +2068,7 @@
         <w:spacing w:after="200"/>
       </w:pPr>
       <w:r>
-        <w:t xml:space="preserve">The trade-offs were real, and dolphin historians insist on stating them plainly rather than skipping straight to the population boom. Skeletal evidence from early farming communities generally shows shorter stature, worse teeth, and more infectious disease than the hunter-gatherer populations that came before, likely from a narrower diet and closer contact with penned animals and each other.</w:t>
+        <w:t xml:space="preserve">The trade-offs were real, and they come before the population boom, not after it. Skeletal evidence from early farming communities generally shows shorter stature, worse teeth, and more infectious disease than the hunter-gatherer populations that came before, likely from a narrower diet and closer contact with penned animals and each other.</w:t>
       </w:r>
     </w:p>
     <w:p>
@@ -2290,7 +2290,7 @@
         <w:spacing w:after="200"/>
       </w:pPr>
       <w:r>
-        <w:t xml:space="preserve">The far more famous Library of Alexandria, founded in Egypt under the Ptolemaic dynasty in the early 3rd century BCE, took the same idea and multiplied its ambition: not merely a collection, but an attempt to gather a copy of every text in the known world, reportedly by searching every ship that docked in Alexandria’s harbor for scrolls worth transcribing. Its actual end is more mundane than its popular legend. There was no single dramatic burning by a single villain — a fire during Julius Caesar’s visit in 48 BCE damaged part of the collection, further decline followed political instability and reduced funding over the following centuries, and the destruction of the associated Serapeum temple in 391 CE, under an edict against pagan sites, finished off what direct evidence can still trace. By the time of the Arab conquest in the 7th century, the library had already ceased to exist as a major institution for hundreds of years, which is why most historians reject the later, popular story blaming that conquest for its loss.</w:t>
+        <w:t xml:space="preserve">The far more famous Library of Alexandria, founded in Egypt under the Ptolemaic dynasty in the early 3rd century BCE, took the same idea and multiplied its ambition: not merely a collection, but an attempt to gather a copy of every text in the known world, reportedly by searching every ship that docked in Alexandria’s harbor for scrolls worth transcribing. Its actual end is more mundane than its popular legend. There was no single dramatic burning by a single villain — a fire during Julius Caesar’s visit in 48 BCE damaged part of the collection. Further decline followed political instability and reduced funding over the following centuries. The destruction of the associated Serapeum temple in 391 CE, under an edict against pagan sites, finished off what direct evidence can still trace. By the time of the Arab conquest in the 7th century, the library had already ceased to exist as a major institution for hundreds of years, which is why most historians reject the later, popular story blaming that conquest for its loss.</w:t>
       </w:r>
     </w:p>
     <w:p>
@@ -2468,7 +2468,7 @@
         <w:spacing w:after="200"/>
       </w:pPr>
       <w:r>
-        <w:t xml:space="preserve">Dolphin historians treat this chapter as a turning point distinct from the tools before it. Fire, stone axes, and farming were all technologies applied to the physical world. Kingship, law, and bureaucracy are technologies applied to other humans.</w:t>
+        <w:t xml:space="preserve">This chapter is a turning point of a different kind from the tools before it. Fire, stone axes, and farming were all technologies applied to the physical world. Kingship, law, and bureaucracy are technologies applied to other humans.</w:t>
       </w:r>
     </w:p>
     <w:p>
@@ -2546,7 +2546,7 @@
         <w:spacing w:after="200"/>
       </w:pPr>
       <w:r>
-        <w:t xml:space="preserve">The Xia dynasty survives mostly as legend, its existence debated by historians and treated by dolphin scholarship the way any oral tradition without a matching written or archaeological record deserves: plausible, unconfirmed, and filed separately from certainty.</w:t>
+        <w:t xml:space="preserve">The Xia dynasty survives mostly as legend, its existence debated by historians and best treated the way any oral tradition without a matching written or archaeological record deserves: plausible, unconfirmed, and filed separately from certainty.</w:t>
       </w:r>
     </w:p>
     <w:p>
@@ -2562,7 +2562,7 @@
         <w:spacing w:after="200"/>
       </w:pPr>
       <w:r>
-        <w:t xml:space="preserve">The Zhou dynasty, succeeding the Shang around 1046 BCE, introduced an idea dolphin historians find unusually self-aware for its era: the Mandate of Heaven, the claim that a ruler holds power only as long as heaven approves, and that heaven’s approval can be read backward from a ruler’s success. A dynasty that fell, by this logic, had simply proven it never truly had the mandate to begin with.</w:t>
+        <w:t xml:space="preserve">The Zhou dynasty, succeeding the Shang around 1046 BCE, introduced an idea unusually self-aware for its era: the Mandate of Heaven, the claim that a ruler holds power only as long as heaven approves, and that heaven’s approval can be read backward from a ruler’s success. A dynasty that fell, by this logic, had simply proven it never truly had the mandate to begin with.</w:t>
       </w:r>
     </w:p>
     <w:p>
@@ -2582,15 +2582,15 @@
         <w:spacing w:after="200"/>
       </w:pPr>
       <w:r>
-        <w:t xml:space="preserve">Out of the Zhou dynasty’s long, fractious decline came two of history’s most durable answers to the question of how a person should live. Confucius, in the 6th to 5th century BCE, argued for social harmony through defined roles, ritual, and respect for hierarchy and family — though the Analects, the collection of his sayings that carried his ideas forward, was compiled by his disciples after his death rather than written by Confucius himself, another instance of a founder’s words outliving him only because someone else wrote them down. Laozi, in the philosophy that became Daoism, argued closer to the opposite: harmony through yielding, simplicity, and not forcing outcomes.</w:t>
-      </w:r>
-    </w:p>
-    <w:p>
-      <w:pPr>
-        <w:spacing w:after="200"/>
-      </w:pPr>
-      <w:r>
-        <w:t xml:space="preserve">Both answers outlasted every dynasty that came after them, which dolphin historians consider the more interesting fact than either answer’s specific content.</w:t>
+        <w:t xml:space="preserve">Out of the Zhou dynasty’s long, fractious decline came two of history’s most durable answers to the question of how a person should live. Confucius, in the 6th to 5th century BCE, argued for social harmony through defined roles, ritual, and respect for hierarchy and family. The Analects, the collection of his sayings that carried his ideas forward, was compiled by his disciples after his death rather than written by Confucius himself, another instance of a founder’s words outliving him only because someone else wrote them down. Laozi, in the philosophy that became Daoism, argued closer to the opposite: harmony through yielding, simplicity, and not forcing outcomes.</w:t>
+      </w:r>
+    </w:p>
+    <w:p>
+      <w:pPr>
+        <w:spacing w:after="200"/>
+      </w:pPr>
+      <w:r>
+        <w:t xml:space="preserve">Both answers outlasted every dynasty that came after them, which is a more interesting fact than either answer’s specific content.</w:t>
       </w:r>
     </w:p>
     <w:p>
@@ -2606,15 +2606,15 @@
         <w:spacing w:after="200"/>
       </w:pPr>
       <w:r>
-        <w:t xml:space="preserve">Much of what is known about this chapter, Shang oracle bones aside, comes down through one man’s stubbornness. Sima Qian, the Han dynasty’s Grand Historian, was castrated around 99 BCE as punishment for defending a disgraced general, and chose the humiliation of continuing his work over the alternative of an honorable suicide specifically so he could finish his Records of the Grand Historian, a history of China from its legendary founders to his own day that later dynasties took as their model for writing history at all.</w:t>
-      </w:r>
-    </w:p>
-    <w:p>
-      <w:pPr>
-        <w:spacing w:after="200"/>
-      </w:pPr>
-      <w:r>
-        <w:t xml:space="preserve">The Qin dynasty collapsed within four years of Qin Shi Huang’s death, brutal standardization having generated exactly the resentment brutal standardization tends to generate. The Han dynasty that followed kept most of the standardization and dropped most of the brutality, a pairing dolphin historians flag as worth remembering for later chapters.</w:t>
+        <w:t xml:space="preserve">Much of what is known about this chapter, Shang oracle bones aside, comes down through one man’s stubbornness. Sima Qian, the Han dynasty’s Grand Historian, was castrated around 99 BCE as punishment for defending a disgraced general. He chose the humiliation of continuing his work over the alternative of an honorable suicide specifically so he could finish his Records of the Grand Historian, a history of China from its legendary founders to his own day that later dynasties took as their model for writing history at all.</w:t>
+      </w:r>
+    </w:p>
+    <w:p>
+      <w:pPr>
+        <w:spacing w:after="200"/>
+      </w:pPr>
+      <w:r>
+        <w:t xml:space="preserve">The Qin dynasty collapsed within four years of Qin Shi Huang’s death, brutal standardization having generated exactly the resentment brutal standardization tends to generate. The Han dynasty that followed kept most of the standardization and dropped most of the brutality, a pairing worth remembering for later chapters.</w:t>
       </w:r>
     </w:p>
     <w:p>
@@ -2704,7 +2704,7 @@
         <w:spacing w:after="200"/>
       </w:pPr>
       <w:r>
-        <w:t xml:space="preserve">The Harappans also had a script, carved on thousands of small stone seals, which nobody has ever managed to read. Some scholars doubt it records a language at all. It makes them one of the very few major civilizations of the ancient world whose own account of itself cannot be read (Crete’s Linear A is another), a filing error dolphin scholarship considers the most tantalizing in the archive. Around 1900 BCE the cities emptied; shifting rivers and a weakening monsoon are the usual suspects, and the case remains open.</w:t>
+        <w:t xml:space="preserve">The Harappans also had a script, carved on thousands of small stone seals, which nobody has ever managed to read. Some scholars doubt it records a language at all. It makes them one of the very few major civilizations of the ancient world whose own account of itself cannot be read (Crete’s Linear A is another), the most tantalizing filing error in the archive. Around 1900 BCE the cities emptied; shifting rivers and a weakening monsoon are the usual suspects, and the case remains open.</w:t>
       </w:r>
     </w:p>
     <w:p>
@@ -2732,7 +2732,7 @@
         <w:spacing w:after="200"/>
       </w:pPr>
       <w:r>
-        <w:t xml:space="preserve">Hinduism had no single founder, no single founding date, and no single book in charge, which makes it difficult to summarize and, dolphin historians suspect, is rather the point. It grew out of the Vedas, the philosophical Upanishads, and two enormous epics, the Ramayana and the Mahabharata, the second of which is many times longer than the Iliad and the Odyssey combined and contains, in the Bhagavad Gita, one of the most-read conversations in world literature: a warrior and his charioteer discussing duty on the eve of a battle. Its gods are numerous and its interpretations more so. Dolphin scholarship, which has managed perfectly well for fifty million years on about one whistle per individual, finds the range humbling.</w:t>
+        <w:t xml:space="preserve">Hinduism had no single founder, no single founding date, and no single book in charge, which makes it difficult to summarize and is probably rather the point. It grew out of the Vedas, the philosophical Upanishads, and two enormous epics, the Ramayana and the Mahabharata, the second of which is many times longer than the Iliad and the Odyssey combined and contains, in the Bhagavad Gita, one of the most-read conversations in world literature: a warrior and his charioteer discussing duty on the eve of a battle. Its gods are numerous and its interpretations more so. Dolphin scholarship, which has managed perfectly well for fifty million years on about one whistle per individual, finds the range humbling.</w:t>
       </w:r>
     </w:p>
     <w:p>
@@ -2764,7 +2764,7 @@
         <w:spacing w:after="200"/>
       </w:pPr>
       <w:r>
-        <w:t xml:space="preserve">Political unity came in the 4th century BCE. The Mauryan Empire, founded by Chandragupta around 321 BCE, a few years after Alexander’s weary army turned back at the edge of the subcontinent, ruled most of it. Its chief minister, traditionally Kautilya, is credited with the Arthashastra, a manual of statecraft so cheerfully ruthless, with careful chapters on spies, poisoners, and economic warfare, that dolphin historians describe it as Machiavelli, nearly two thousand years early and with a better index. (Chandragupta’s grandson Ashoka turns up again, in a considerably better mood, in the chapter on the great faiths.)</w:t>
+        <w:t xml:space="preserve">Political unity came in the 4th century BCE. The Mauryan Empire, founded by Chandragupta around 321 BCE, a few years after Alexander’s weary army turned back at the edge of the subcontinent, ruled most of it. Its chief minister, traditionally Kautilya, is credited with the Arthashastra, a manual of statecraft so cheerfully ruthless, with careful chapters on spies, poisoners, and economic warfare, that it reads as Machiavelli, nearly two thousand years early and with a better index. (Chandragupta’s grandson Ashoka turns up again, in a considerably better mood, in the chapter on the great faiths.)</w:t>
       </w:r>
     </w:p>
     <w:p>
@@ -2854,15 +2854,15 @@
         <w:spacing w:after="200"/>
       </w:pPr>
       <w:r>
-        <w:t xml:space="preserve">Athens, starting with reforms under Cleisthenes in 508 BCE, tried something dolphin historians had not filed under any prior category: a large body of citizens deciding collectively, in person, by majority vote, in an assembly any citizen could attend and speak in.</w:t>
-      </w:r>
-    </w:p>
-    <w:p>
-      <w:pPr>
-        <w:spacing w:after="200"/>
-      </w:pPr>
-      <w:r>
-        <w:t xml:space="preserve">The qualifier matters more than the achievement, and dolphin historians insist on stating it first rather than last. “Citizen” in Athens meant adult free men born to Athenian parents — excluding women, enslaved people (who made up a large share of the city’s population), and foreign residents, however long they had lived there. Democracy’s first draft governed a minority and called it everyone.</w:t>
+        <w:t xml:space="preserve">Athens, starting with reforms under Cleisthenes in 508 BCE, tried something that fit no earlier category: a large body of citizens deciding collectively, in person, by majority vote, in an assembly any citizen could attend and speak in.</w:t>
+      </w:r>
+    </w:p>
+    <w:p>
+      <w:pPr>
+        <w:spacing w:after="200"/>
+      </w:pPr>
+      <w:r>
+        <w:t xml:space="preserve">The qualifier matters more than the achievement, so it comes first. “Citizen” in Athens meant adult free men born to Athenian parents — excluding women, enslaved people (who made up a large share of the city’s population), and foreign residents, however long they had lived there. Democracy’s first draft governed a minority and called it everyone.</w:t>
       </w:r>
     </w:p>
     <w:p>
@@ -2878,7 +2878,7 @@
         <w:spacing w:after="200"/>
       </w:pPr>
       <w:r>
-        <w:t xml:space="preserve">Sparta, Athens’ great rival, organized itself around almost the opposite values: a rigid military caste system, an economy built on the forced labor of the conquered Helot population, and a citizenry trained from childhood for war, not debate. Dolphin historians present Sparta not as democracy’s villain but as evidence that “successful ancient Greek city-state” did not imply any particular set of values at all.</w:t>
+        <w:t xml:space="preserve">Sparta, Athens’ great rival, organized itself around almost the opposite values: a rigid military caste system, an economy built on the forced labor of the conquered Helot population, and a citizenry trained from childhood for war, not debate. Sparta was not democracy’s villain so much as evidence that “successful ancient Greek city-state” did not imply any particular set of values at all.</w:t>
       </w:r>
     </w:p>
     <w:p>
@@ -2894,7 +2894,7 @@
         <w:spacing w:after="200"/>
       </w:pPr>
       <w:r>
-        <w:t xml:space="preserve">The Persian Wars, fought in the early 5th century BCE, saw a coalition of Greek city-states repel the much larger Persian Empire: at Marathon in 490 BCE and, ten years later, at sea off Salamis, after the famous defeat at Thermopylae had bought a few days. Dolphin historians note the wars mattered less for the battles themselves than for what they let Athens believe about its own place in the world afterward.</w:t>
+        <w:t xml:space="preserve">The Persian Wars, fought in the early 5th century BCE, saw a coalition of Greek city-states repel the much larger Persian Empire: at Marathon in 490 BCE and, ten years later, at sea off Salamis, after the famous defeat at Thermopylae had bought a few days. The wars mattered less for the battles themselves than for what they let Athens believe about its own place in the world afterward.</w:t>
       </w:r>
     </w:p>
     <w:p>
@@ -2976,7 +2976,7 @@
         <w:spacing w:after="200"/>
       </w:pPr>
       <w:r>
-        <w:t xml:space="preserve">Rome starts, by its own telling, as a small settlement of shepherds on the Tiber around the 8th century BCE, and dolphin historians treat the founding myths (a she-wolf, twin brothers, one dead by the other’s hand) as exactly that: myth, worth noting for what it says about how Rome wanted to be remembered rather than what happened.</w:t>
+        <w:t xml:space="preserve">Rome starts, by its own telling, as a small settlement of shepherds on the Tiber around the 8th century BCE, and the founding myths (a she-wolf, twin brothers, one dead by the other’s hand) are exactly that: myth, worth noting for what it says about how Rome wanted to be remembered rather than what happened.</w:t>
       </w:r>
     </w:p>
     <w:p>
@@ -3024,7 +3024,7 @@
         <w:spacing w:after="200"/>
       </w:pPr>
       <w:r>
-        <w:t xml:space="preserve">What Rome built next, over the following two centuries of relative internal peace known as the Pax Romana, is what dolphin historians consider its most durable invention: a network of roads that, by a common modern estimate, ran to some 250,000 miles at its peak, more than 50,000 of them paved, aqueducts moving water across entire regions by gravity alone, a body of law distinguishing public and private rights that still underlies many legal systems today, and a path to citizenship that, by 212 CE, extended to almost every free person in the empire.</w:t>
+        <w:t xml:space="preserve">What Rome built next, over the following two centuries of relative internal peace known as the Pax Romana, is arguably its most durable invention: a network of roads that, by a common modern estimate, ran to some 250,000 miles at its peak, more than 50,000 of them paved. Aqueducts moved water across entire regions by gravity alone. A body of law distinguishing public and private rights still underlies many legal systems today, and a path to citizenship had, by 212 CE, extended to almost every free person in the empire.</w:t>
       </w:r>
     </w:p>
     <w:p>
@@ -3040,7 +3040,7 @@
         <w:spacing w:after="200"/>
       </w:pPr>
       <w:r>
-        <w:t xml:space="preserve">The trade underneath the peace was explicit, and dolphin historians decline to soften it: order, infrastructure, and law, purchased with the loss of the Republic’s own citizens’ say in how they were ruled.</w:t>
+        <w:t xml:space="preserve">The trade underneath the peace was explicit: order, infrastructure, and law, purchased with the loss of the Republic’s own citizens’ say in how they were ruled.</w:t>
       </w:r>
     </w:p>
     <w:p>
@@ -3150,7 +3150,7 @@
         <w:spacing w:after="200"/>
       </w:pPr>
       <w:r>
-        <w:t xml:space="preserve">Buddhism, arising in the 5th or 6th century BCE from the teachings of Siddhartha Gautama in what is now Nepal and northern India, spread across Asia over the following centuries through trade routes and, in particular, the patronage of the Indian emperor Ashoka in the 3rd century BCE, who converted after a famously brutal conquest and then spent the rest of his reign promoting nonviolence.</w:t>
+        <w:t xml:space="preserve">Buddhism, arising in the 5th or 6th century BCE from the teachings of Siddhartha Gautama in what is now Nepal and northern India, spread across Asia over the following centuries through trade routes and, in particular, the patronage of the Indian emperor Ashoka in the 3rd century BCE. Ashoka converted after a famously brutal conquest and then spent the rest of his reign promoting nonviolence.</w:t>
       </w:r>
     </w:p>
     <w:p>
@@ -3166,31 +3166,31 @@
         <w:spacing w:after="200"/>
       </w:pPr>
       <w:r>
-        <w:t xml:space="preserve">Islam, founded in the 7th century CE following the teachings of the prophet Muhammad in Mecca and Medina, spread with even greater speed: within a century of Muhammad’s death in 632 CE, Islamic rule extended from the Iberian Peninsula to the borders of India, an expansion combining religious conviction, military organization, and, in many conquered regions, terms that were tolerant by the standards of the age: Christians and Jews could keep their faith as protected, subordinate communities if they paid a special tax. The Quran itself was compiled into a single standardized written text under Caliph Uthman around 650 CE, about two decades after Muhammad’s death, drawing on both memorized recitation and scattered written fragments — the same pattern this book keeps finding underneath its founding scriptures: a period of spoken transmission, then a deliberate, human act of writing it down before living memory of the source could fade.</w:t>
-      </w:r>
-    </w:p>
-    <w:p>
-      <w:pPr>
-        <w:spacing w:after="200"/>
-      </w:pPr>
-      <w:r>
-        <w:t xml:space="preserve">Each faith, once established, did two jobs at the same time: it organized how believers should live, and it organized armies, tax systems, and successions in the believers’ names. Dolphin historians decline to treat this as cynicism.</w:t>
-      </w:r>
-    </w:p>
-    <w:p>
-      <w:pPr>
-        <w:spacing w:after="200"/>
-      </w:pPr>
-      <w:r>
-        <w:t xml:space="preserve">While Western Europe, after Rome’s western half fell, entered the fragmented centuries the next chapter discusses, the Islamic world entered what historians call its Golden Age: Baghdad’s House of Wisdom, from the 8th century onward, translated and extended Greek philosophy and mathematics (algebra takes its name from al-Khwarizmi’s 9th-century treatise), while scholars across the Islamic world advanced medicine, optics, and astronomy well beyond what Rome had left behind.</w:t>
-      </w:r>
-    </w:p>
-    <w:p>
-      <w:pPr>
-        <w:spacing w:after="200"/>
-      </w:pPr>
-      <w:r>
-        <w:t xml:space="preserve">The Crusades, beginning in 1095 when Pope Urban II called for a military campaign to reclaim Jerusalem, ran in waves for close to two centuries, and dolphin historians present them without euphemism: religious conviction, real and widely shared among participants, fused to land claims, trade route control, and, in the notorious Fourth Crusade of 1204, the outright sack of Constantinople, a Christian city, by a Christian army meant to be fighting someone else entirely.</w:t>
+        <w:t xml:space="preserve">Islam, founded in the 7th century CE following the teachings of the prophet Muhammad in Mecca and Medina, spread with even greater speed: within a century of Muhammad’s death in 632 CE, Islamic rule extended from the Iberian Peninsula to the borders of India. The expansion combined religious conviction, military organization, and, in many conquered regions, terms that were tolerant by the standards of the age: Christians and Jews could keep their faith as protected, subordinate communities if they paid a special tax. The Quran itself was compiled into a single standardized written text under Caliph Uthman around 650 CE, about two decades after Muhammad’s death, drawing on both memorized recitation and scattered written fragments. It is the same pattern this book keeps finding underneath its founding scriptures: a period of spoken transmission, then a deliberate, human act of writing it down before living memory of the source could fade.</w:t>
+      </w:r>
+    </w:p>
+    <w:p>
+      <w:pPr>
+        <w:spacing w:after="200"/>
+      </w:pPr>
+      <w:r>
+        <w:t xml:space="preserve">Each faith, once established, did two jobs at the same time: it organized how believers should live, and it organized armies, tax systems, and successions in the believers’ names. This is not cynicism.</w:t>
+      </w:r>
+    </w:p>
+    <w:p>
+      <w:pPr>
+        <w:spacing w:after="200"/>
+      </w:pPr>
+      <w:r>
+        <w:t xml:space="preserve">While Western Europe, after Rome’s western half fell, entered the fragmented centuries the next chapter discusses, the Islamic world entered what historians call its Golden Age: Baghdad’s House of Wisdom, from the 8th century onward, translated and extended Greek philosophy and mathematics (algebra takes its name from al-Khwarizmi’s 9th-century treatise). Scholars across the Islamic world advanced medicine, optics, and astronomy well beyond what Rome had left behind.</w:t>
+      </w:r>
+    </w:p>
+    <w:p>
+      <w:pPr>
+        <w:spacing w:after="200"/>
+      </w:pPr>
+      <w:r>
+        <w:t xml:space="preserve">The Crusades, beginning in 1095 when Pope Urban II called for a military campaign to reclaim Jerusalem, ran in waves for close to two centuries. Without euphemism, they were religious conviction, real and widely shared among participants, fused to land claims, trade route control, and, in the notorious Fourth Crusade of 1204, the outright sack of Constantinople, a Christian city, by a Christian army meant to be fighting someone else entirely.</w:t>
       </w:r>
     </w:p>
     <w:p>
@@ -3206,7 +3206,7 @@
         <w:spacing w:after="200"/>
       </w:pPr>
       <w:r>
-        <w:t xml:space="preserve">What outlasted the fighting, in dolphin scholarship’s accounting, was the contact: increased trade, translated texts, and exposure to Islamic scholarship’s advances flowing back into a Western Europe that would draw on them heavily once its own universities began forming in the 12th and 13th centuries.</w:t>
+        <w:t xml:space="preserve">What outlasted the fighting was the contact: increased trade, translated texts, and exposure to Islamic scholarship’s advances flowing back into a Western Europe that would draw on them heavily once its own universities began forming in the 12th and 13th centuries.</w:t>
       </w:r>
     </w:p>
     <w:p>
@@ -3558,7 +3558,7 @@
         <w:spacing w:after="200"/>
       </w:pPr>
       <w:r>
-        <w:t xml:space="preserve">Dolphin historians, who watched a great many Genoese ships go by, note that much of the Black Death’s itinerary was maritime. Rats have always made excellent passengers and terrible guests, though recent studies suggest that in many European outbreaks the disease spread more through human fleas and lice than through rats.</w:t>
+        <w:t xml:space="preserve">Much of the Black Death’s itinerary was maritime, as dolphins watching a great many Genoese ships go by could have told anyone. Rats have always made excellent passengers and terrible guests, though recent studies suggest that in many European outbreaks the disease spread more through human fleas and lice than through rats.</w:t>
       </w:r>
     </w:p>
     <w:p>
@@ -3782,7 +3782,7 @@
         <w:spacing w:after="200"/>
       </w:pPr>
       <w:r>
-        <w:t xml:space="preserve">Africa is rich. Dolphin historians are tired of the sentence that treats this as a surprise, or as a recent discovery made by a mining company. The continent is large, old, and full of things other people have wanted for a very long time. Gold, salt, copper, iron, ivory, timber, rubber, cocoa, coffee, cotton, oil, diamonds, and the labor of the people who lived on top of all of it. The maps of empire follow the deposits. They do not precede them. Greed is a compass. In Africa it has pointed, century after century, at real wealth, not at empty land.</w:t>
+        <w:t xml:space="preserve">Africa is rich. The sentence that treats this as a surprise is tired, or as a recent discovery made by a mining company. The continent is large, old, and full of things other people have wanted for a very long time. Gold, salt, copper, iron, ivory, timber, rubber, cocoa, coffee, cotton, oil, diamonds, and the labor of the people who lived on top of all of it. The maps of empire follow the deposits. They do not precede them. Greed is a compass. In Africa it has pointed, century after century, at real wealth, not at empty land.</w:t>
       </w:r>
     </w:p>
     <w:p>
@@ -3818,31 +3818,31 @@
         <w:spacing w:after="200"/>
       </w:pPr>
       <w:r>
-        <w:t xml:space="preserve">West of the Nile and centuries before the famous pilgrimage, people in what is now Nigeria were casting terracotta figures of a skill that still embarrasses anyone who arrived expecting sticks. The Nok culture, from around 1500 BCE into the first centuries CE, smelted iron and made heads with features precise enough that modern forgers have tried, and failed cleanly, to imitate the clay. Later, at Ile-Ife, artists cast brass and copper heads of rulers so finely that when Europeans finally saw them they reached for the usual exit, and suggested the work had been done by lost Romans, or by visitors from anywhere except the city that had the furnaces. Dolphin historians note the habit. When the object is beautiful and the maker is African, a certain kind of scholar goes looking for a passport.</w:t>
-      </w:r>
-    </w:p>
-    <w:p>
-      <w:pPr>
-        <w:spacing w:after="200"/>
-      </w:pPr>
-      <w:r>
-        <w:t xml:space="preserve">The kingdom of Kongo, at the mouth of the river that still carries its name, was a state with provinces, a court, a currency of nzimbu shells, and a king, the Manikongo, who in the late 1400s received Portuguese captains as a peer and sent his own men the other way. For a short while the relationship looked like diplomacy. Then it looked like what it was. Portuguese demand for captives, sold into the sugar islands, ate the kingdom’s labor and then its politics. Kongolese kings protested in letters that still exist. The letters were filed. The ships continued. Dolphin historians keep the letters next to the cargo lists. One is a voice. The other is a weight. The weight won, which is not the same thing as the voice having been wrong.</w:t>
-      </w:r>
-    </w:p>
-    <w:p>
-      <w:pPr>
-        <w:spacing w:after="200"/>
-      </w:pPr>
-      <w:r>
-        <w:t xml:space="preserve">In the forest to the west, Asante built a state on gold. The goldfields of the Akan country had been feeding the Saharan trade for centuries. In the eighteenth century Asante turned that gold into an empire, with a capital at Kumasi, a bureaucracy, and a stool — the Golden Stool — that was not a chair a person sat on but the soul of the nation, which no one was permitted to sit on at all. When a British governor demanded to sit on it in 1900, the demand started a war. He did not get the stool. The British did get the country, for a while, and they got the gold. Dolphin historians observe that empires are often willing to lose the symbol if they can keep the mine. The people who fought for the stool understood the difference, and fought anyway.</w:t>
-      </w:r>
-    </w:p>
-    <w:p>
-      <w:pPr>
-        <w:spacing w:after="200"/>
-      </w:pPr>
-      <w:r>
-        <w:t xml:space="preserve">Dahomey, on the coast, grew rich and infamous on a different inventory: captives, sold to European forts, and a monarchy that made the trade a policy rather than a raid. The wealth was real. So was the damage, dealt outward and dealt to neighbors. Dolphin historians refuse both the portrait of a continent of only victims and the portrait of a continent of only kings. The kings were real. The victims were real. Often they were separated by a few days’ walk. Wealth and the sale of people lived in the same treasury. Saying so is not an insult to Africa. It is the same sentence this book has already applied to every other rich society that owned someone.</w:t>
+        <w:t xml:space="preserve">West of the Nile and centuries before the famous pilgrimage, people in what is now Nigeria were casting terracotta figures of a skill that still embarrasses anyone who arrived expecting sticks. The Nok culture, from around 1500 BCE into the first centuries CE, smelted iron and made heads with features precise enough that modern forgers have tried, and failed cleanly, to imitate the clay. Later, at Ile-Ife, artists cast brass and copper heads of rulers so finely that when Europeans finally saw them they reached for the usual exit, and suggested the work had been done by lost Romans, or by visitors from anywhere except the city that had the furnaces. Note the habit. When the object is beautiful and the maker is African, a certain kind of scholar goes looking for a passport.</w:t>
+      </w:r>
+    </w:p>
+    <w:p>
+      <w:pPr>
+        <w:spacing w:after="200"/>
+      </w:pPr>
+      <w:r>
+        <w:t xml:space="preserve">The kingdom of Kongo, at the mouth of the river that still carries its name, was a state with provinces, a court, a currency of nzimbu shells, and a king, the Manikongo, who in the late 1400s received Portuguese captains as a peer and sent his own men the other way. For a short while the relationship looked like diplomacy. Then it looked like what it was. Portuguese demand for captives, sold into the sugar islands, ate the kingdom’s labor and then its politics. Kongolese kings protested in letters that still exist. The letters were filed. The ships continued. The letters belong next to the cargo lists. One is a voice. The other is a weight. The weight won, which is not the same thing as the voice having been wrong.</w:t>
+      </w:r>
+    </w:p>
+    <w:p>
+      <w:pPr>
+        <w:spacing w:after="200"/>
+      </w:pPr>
+      <w:r>
+        <w:t xml:space="preserve">In the forest to the west, Asante built a state on gold. The goldfields of the Akan country had been feeding the Saharan trade for centuries. In the eighteenth century Asante turned that gold into an empire, with a capital at Kumasi, a bureaucracy, and a stool — the Golden Stool — that was not a chair a person sat on but the soul of the nation, which no one was permitted to sit on at all. When a British governor demanded to sit on it in 1900, the demand started a war. He did not get the stool. The British did get the country, for a while, and they got the gold. Empires are often willing to lose the symbol if they can keep the mine. The people who fought for the stool understood the difference, and fought anyway.</w:t>
+      </w:r>
+    </w:p>
+    <w:p>
+      <w:pPr>
+        <w:spacing w:after="200"/>
+      </w:pPr>
+      <w:r>
+        <w:t xml:space="preserve">Dahomey, on the coast, grew rich and infamous on a different inventory: captives, sold to European forts, and a monarchy that made the trade a policy rather than a raid. The wealth was real. So was the damage, dealt outward and dealt to neighbors. This chapter refuses both the portrait of a continent of only victims and the portrait of a continent of only kings. The kings were real. The victims were real. Often they were separated by a few days’ walk. Wealth and the sale of people lived in the same treasury. Saying so is not an insult to Africa. It is the same sentence this book has already applied to every other rich society that owned someone.</w:t>
       </w:r>
     </w:p>
     <w:p>
@@ -3870,7 +3870,7 @@
         <w:spacing w:after="200"/>
       </w:pPr>
       <w:r>
-        <w:t xml:space="preserve">Ethiopia kept its crown. The rock-hewn churches of Lalibela, cut downward into the stone in the twelfth and thirteenth centuries, are still churches. The Solomonic kings claimed a line back to Solomon and made the claim do political work for centuries, which dolphin historians treat as a founding story of the usual kind: useful, ancient, and not a census. What is not a story is Adwa. In 1896 an Ethiopian army under Menelik II destroyed an Italian invading force that had assumed, as the decade assumed, that an African state could be dictated to. It was the first time a European army of that era was beaten in the open by an African one and the victory allowed to stand. Italy came back in 1935, with aircraft and poison gas, and that crime belongs to another file. Adwa remains. A rich highland kingdom, with its own church, its own script, and its own guns, declined to be partitioned. Dolphin historians do not romanticize the empire Menelik was also building over his neighbors. They do insist that the map of the scramble has one country-shaped hole in it, and that the hole was made by force of arms, not by European courtesy.</w:t>
+        <w:t xml:space="preserve">Ethiopia kept its crown. The rock-hewn churches of Lalibela, cut downward into the stone in the twelfth and thirteenth centuries, are still churches. The Solomonic kings claimed a line back to Solomon and made the claim do political work for centuries, a founding story of the usual kind: useful, ancient, and not a census. What is not a story is Adwa. In 1896 an Ethiopian army under Menelik II destroyed an Italian invading force that had assumed, as the decade assumed, that an African state could be dictated to. It was the first time a European army of that era was beaten in the open by an African one and the victory allowed to stand. Italy came back in 1935, with aircraft and poison gas, and that crime belongs to another file. Adwa remains. A rich highland kingdom, with its own church, its own script, and its own guns, declined to be partitioned. The empire Menelik was also building over his neighbors deserves no romance either. They do insist that the map of the scramble has one country-shaped hole in it, and that the hole was made by force of arms, not by European courtesy.</w:t>
       </w:r>
     </w:p>
     <w:p>
@@ -3898,7 +3898,7 @@
         <w:spacing w:after="200"/>
       </w:pPr>
       <w:r>
-        <w:t xml:space="preserve">The late nineteenth century’s rush to paint Africa in European colors is sometimes told as a race for prestige, flags, and a place in the sun. Dolphin historians have read the company charters. Prestige does not build a railroad to a copper field. King Leopold of Belgium took the Congo as a private estate and extracted rubber with a system of quotas, hostages, and mutilation that killed and maimed on a scale the twentieth century would have called a scandal if it had not been busy calling it administration. The wealth flowed to Brussels. The hands that had tapped the rubber, in a number of documented cases, did not remain attached to the people who had failed to meet the quota. Greed, here, does not need interpreting. The account books and the photographs survived each other.</w:t>
+        <w:t xml:space="preserve">The late nineteenth century’s rush to paint Africa in European colors is sometimes told as a race for prestige, flags, and a place in the sun. The company charters are on file. Prestige does not build a railroad to a copper field. King Leopold of Belgium took the Congo as a private estate and extracted rubber with a system of quotas, hostages, and mutilation that killed and maimed on a scale the twentieth century would have called a scandal if it had not been busy calling it administration. The wealth flowed to Brussels. The hands that had tapped the rubber, in a number of documented cases, did not remain attached to the people who had failed to meet the quota. Greed, here, does not need interpreting. The account books and the photographs survived each other.</w:t>
       </w:r>
     </w:p>
     <w:p>
@@ -3914,7 +3914,7 @@
         <w:spacing w:after="200"/>
       </w:pPr>
       <w:r>
-        <w:t xml:space="preserve">Elsewhere the inventory changed and the direction of the ships did not. Palm oil for soap and machines. Groundnuts. Cocoa, which made the Gold Coast, and then Ghana, a supplier to a sweet tooth on another continent, and made the price of a farmer’s year a decision taken in a room he would never see. Cotton. Copper in the Katanga, which helped electrify Europe and paid, locally, in company towns and in a politics that never quite got free of the ore. After independence the ore remained, and so did the contracts. A flag is not a refinery. Dolphin historians have had to learn this distinction on several coasts.</w:t>
+        <w:t xml:space="preserve">Elsewhere the inventory changed and the direction of the ships did not. Palm oil for soap and machines. Groundnuts. Cocoa, which made the Gold Coast, and then Ghana, a supplier to a sweet tooth on another continent, and made the price of a farmer’s year a decision taken in a room he would never see. Cotton. Copper in the Katanga, which helped electrify Europe and paid, locally, in company towns and in a politics that never quite got free of the ore. After independence the ore remained, and so did the contracts. A flag is not a refinery. It is a distinction learned on several coasts.</w:t>
       </w:r>
     </w:p>
     <w:p>
@@ -3942,7 +3942,7 @@
         <w:spacing w:after="200"/>
       </w:pPr>
       <w:r>
-        <w:t xml:space="preserve">Oil made the twentieth century’s version of the goldfields. The Niger delta, Angola’s offshore fields, the wells of North Africa and the Gulf of Guinea, poured wealth out of the ground and, in too many cases, past the people standing on it. The pattern is familiar enough that economists gave it a soft name, the resource curse, as if the oil itself were unlucky. Dolphin historians reject the superstition. Oil does not curse a village. A contract does, and a government does, and a foreign treasury does, when the money is routed around the village on purpose. Where the money was spent on roads, schools, and a state that could audit itself, the oil behaved like oil. Where it was spent on palaces and weapons, it behaved like a bribe that had learned to flow. The geology was neutral. The politics were not.</w:t>
+        <w:t xml:space="preserve">Oil made the twentieth century’s version of the goldfields. The Niger delta, Angola’s offshore fields, the wells of North Africa and the Gulf of Guinea, poured wealth out of the ground and, in too many cases, past the people standing on it. The pattern is familiar enough that economists gave it a soft name, the resource curse, as if the oil itself were unlucky. The superstition does not survive the evidence. Oil does not curse a village. A contract does, and a government does, and a foreign treasury does, when the money is routed around the village on purpose. Where the money was spent on roads, schools, and a state that could audit itself, the oil behaved like oil. Where it was spent on palaces and weapons, it behaved like a bribe that had learned to flow. The geology was neutral. The politics were not.</w:t>
       </w:r>
     </w:p>
     <w:p>
@@ -4052,15 +4052,15 @@
         <w:spacing w:after="200"/>
       </w:pPr>
       <w:r>
-        <w:t xml:space="preserve">By 1519 the Aztec, or Mexica, capital of Tenochtitlan, built on an island in a lake and fed by artificial floating gardens, held, on estimates that run from about 60,000 to more than 200,000, more people than most European cities of the day, even at the low figure. It had aqueducts, causeways, and a market that astonished the Spaniards. It also practiced human sacrifice on a scale that horrified them, and dolphin historians think it important to say so plainly: a civilization can be both a marvel and a horror, and the humans of both hemispheres demonstrated as much.</w:t>
-      </w:r>
-    </w:p>
-    <w:p>
-      <w:pPr>
-        <w:spacing w:after="200"/>
-      </w:pPr>
-      <w:r>
-        <w:t xml:space="preserve">In the Andes, the Inca Empire, at its height in the 15th century, ruled perhaps ten million people (estimates run from about six to fourteen million) across the length of the mountain chain, linked by roads and rope bridges running somewhere from 14,000 to 25,000 miles depending on what counts as part of the network, without the wheel, without draft animals beyond the llama, and without any writing that anyone has been able to read. It kept its records on the quipu, a system of knotted, colored strings in which the type and position of each knot recorded numbers, and, some scholars now argue, possibly more.</w:t>
+        <w:t xml:space="preserve">By 1519 the Aztec, or Mexica, capital of Tenochtitlan, built on an island in a lake and fed by artificial floating gardens, held, on estimates that run from about 60,000 to more than 200,000, more people than most European cities of the day, even at the low figure. It had aqueducts, causeways, and a market that astonished the Spaniards. It also practiced human sacrifice on a scale that horrified them, and that needs saying plainly: a civilization can be both a marvel and a horror, and the humans of both hemispheres demonstrated as much.</w:t>
+      </w:r>
+    </w:p>
+    <w:p>
+      <w:pPr>
+        <w:spacing w:after="200"/>
+      </w:pPr>
+      <w:r>
+        <w:t xml:space="preserve">In the Andes, the Inca Empire, at its height in the 15th century, ruled perhaps ten million people (estimates run from about six to fourteen million) across the length of the mountain chain, linked by roads and rope bridges running somewhere from 14,000 to 25,000 miles depending on what counts as part of the network. It did this without the wheel, without draft animals beyond the llama, and without any writing that anyone has been able to read. It kept its records on the quipu, a system of knotted, colored strings in which the type and position of each knot recorded numbers, and, some scholars now argue, possibly more.</w:t>
       </w:r>
     </w:p>
     <w:p>
@@ -4080,7 +4080,7 @@
         <w:spacing w:after="200"/>
       </w:pPr>
       <w:r>
-        <w:t xml:space="preserve">Inca stonework matched the roads for ambition. At sites like Sacsayhuamán above Cusco and the mountaintop retreat of Machu Picchu, built around 1450 CE for reasons still debated (a royal estate is the leading guess), masons fitted multi-ton stones together without mortar so precisely that a knife blade still cannot slide between the joints, a technique that has helped several Inca walls outlast earthquakes that leveled colonial Spanish buildings raised right beside them centuries later.</w:t>
+        <w:t xml:space="preserve">Inca stonework matched the roads for ambition. At sites like Sacsayhuamán above Cusco and the mountaintop retreat of Machu Picchu, built around 1450 CE for reasons still debated (a royal estate is the leading guess), masons fitted multi-ton stones together without mortar so precisely that a knife blade still cannot slide between the joints. The technique has helped several Inca walls outlast earthquakes that leveled colonial Spanish buildings raised right beside them centuries later.</w:t>
       </w:r>
     </w:p>
     <w:p>
@@ -4392,7 +4392,7 @@
         <w:spacing w:after="200"/>
       </w:pPr>
       <w:r>
-        <w:t xml:space="preserve">Those arguments left the page. The American colonies declared independence from Britain in 1776 on language drawn almost directly from Locke; the French Revolution, beginning in 1789, went considerably further and faster, ending not just a king’s rule but, for a time, the king himself, at the guillotine in 1793, and unleashing a period of revolutionary terror before settling, after considerable further upheaval, into a very different Europe than the one that started the century.</w:t>
+        <w:t xml:space="preserve">Those arguments left the page. The American colonies declared independence from Britain in 1776 on language drawn almost directly from Locke. The French Revolution, beginning in 1789, went considerably further and faster, ending not just a king’s rule but, for a time, the king himself, at the guillotine in 1793. It unleashed a period of revolutionary terror before settling, after considerable further upheaval, into a very different Europe than the one that started the century.</w:t>
       </w:r>
     </w:p>
     <w:p>
@@ -4424,7 +4424,7 @@
         <w:spacing w:after="200"/>
       </w:pPr>
       <w:r>
-        <w:t xml:space="preserve">The other side of the ledger was immediate, and dolphin historians set it beside the productivity gains, not tucked in afterward: children as young as five or six worked textile mill floors on twelve-hour shifts; new industrial cities like Manchester grew so fast that sanitation and housing never caught up, and cholera outbreaks followed accordingly.</w:t>
+        <w:t xml:space="preserve">The other side of the ledger was immediate, and it belongs beside the productivity gains, not after them: children as young as five or six worked textile mill floors on twelve-hour shifts; new industrial cities like Manchester grew so fast that sanitation and housing never caught up, and cholera outbreaks followed accordingly.</w:t>
       </w:r>
     </w:p>
     <w:p>
@@ -4452,7 +4452,7 @@
         <w:spacing w:after="200"/>
       </w:pPr>
       <w:r>
-        <w:t xml:space="preserve">Nationalism, an idea barely a century old in its modern form, hardened through the late 1800s into competitive alliances between the newly industrial and imperial powers of Europe — Germany (whose own rapid unification in 1871 is a later chapter’s starting point), France, Britain, Austria-Hungary, and Russia, each arming and allying against the others in a system explicitly built, on paper, to prevent exactly the war it produced.</w:t>
+        <w:t xml:space="preserve">Nationalism, an idea barely a century old in its modern form, hardened through the late 1800s into competitive alliances between the newly industrial and imperial powers of Europe — Germany (whose own rapid unification in 1871 is a later chapter’s starting point), France, Britain, Austria-Hungary, and Russia. Each armed and allied against the others in a system explicitly built, on paper, to prevent exactly the war it produced.</w:t>
       </w:r>
     </w:p>
     <w:p>
@@ -4554,15 +4554,15 @@
         <w:spacing w:after="200"/>
       </w:pPr>
       <w:r>
-        <w:t xml:space="preserve">By the late 1600s the colonies had sorted themselves into an economy. New England shipped fish, timber, and rum. The middle colonies grew grain. The Chesapeake and the Carolinas grew tobacco, rice, and, later, indigo, on the backs of enslaved people whose numbers rose by importation and by birth. Bacon’s Rebellion in Virginia in 1676, a fight between frontier settlers and a colonial governor that briefly united poor white men and enslaved Black men against the tidewater elite, frightened the men who owned the colony. The laws that followed drew a harder line between white servants and Black slaves. Dolphin historians read those statutes as a choice, not a custom that happened by itself. Racism, here, was also a labor policy.</w:t>
-      </w:r>
-    </w:p>
-    <w:p>
-      <w:pPr>
-        <w:spacing w:after="200"/>
-      </w:pPr>
-      <w:r>
-        <w:t xml:space="preserve">The eighteenth century made the colonies richer and more crowded. A war between Britain and France, fought from 1754 to 1763 across the Ohio country and called different names on different sides of the Atlantic, ended with France ejected from mainland North America and Britain in possession of a vast new inland claim and a very large debt. London wanted the colonies to help pay for the army that had just defended them, and wanted settlement held back from the Appalachian line so as not to start another war with Native nations immediately. The colonists, who had fought in the war and now wanted the land, experienced the taxes and the line as insult. Dolphin historians note that both descriptions were available at the time. The argument was about who would pay, and about who the land was for.</w:t>
+        <w:t xml:space="preserve">By the late 1600s the colonies had sorted themselves into an economy. New England shipped fish, timber, and rum. The middle colonies grew grain. The Chesapeake and the Carolinas grew tobacco, rice, and, later, indigo, on the backs of enslaved people whose numbers rose by importation and by birth. Bacon’s Rebellion in Virginia in 1676, a fight between frontier settlers and a colonial governor that briefly united poor white men and enslaved Black men against the tidewater elite, frightened the men who owned the colony. The laws that followed drew a harder line between white servants and Black slaves. Those statutes were a choice, not a custom that happened by itself. Racism, here, was also a labor policy.</w:t>
+      </w:r>
+    </w:p>
+    <w:p>
+      <w:pPr>
+        <w:spacing w:after="200"/>
+      </w:pPr>
+      <w:r>
+        <w:t xml:space="preserve">The eighteenth century made the colonies richer and more crowded. A war between Britain and France, fought from 1754 to 1763 across the Ohio country and called different names on different sides of the Atlantic, ended with France ejected from mainland North America and Britain in possession of a vast new inland claim and a very large debt. London wanted the colonies to help pay for the army that had just defended them, and wanted settlement held back from the Appalachian line so as not to start another war with Native nations immediately. The colonists, who had fought in the war and now wanted the land, experienced the taxes and the line as insult. Both descriptions were available at the time. The argument was about who would pay, and about who the land was for.</w:t>
       </w:r>
     </w:p>
     <w:p>
@@ -4642,15 +4642,15 @@
         <w:spacing w:after="200"/>
       </w:pPr>
       <w:r>
-        <w:t xml:space="preserve">They also made a bargain about slavery, and dolphin historians insist on reading the bargain in the open. An enslaved person would count as three-fifths of a person when seats in the House were allotted, which gave the enslaving states extra power in the national government without giving the enslaved any power at all. The importation of captive Africans was protected for twenty years. People who escaped bondage would be returned. None of this was an accident of wording. It was the price of a union that included South Carolina and Georgia. The men in the room knew what they were buying.</w:t>
-      </w:r>
-    </w:p>
-    <w:p>
-      <w:pPr>
-        <w:spacing w:after="200"/>
-      </w:pPr>
-      <w:r>
-        <w:t xml:space="preserve">Madison, Hamilton, and Jay then explained the machine in a series of newspaper essays, later called the Federalist Papers, which dolphin historians rank among the most intelligent things humans have written about how not to be ruled by a single will. The essays lost the argument in several states until the promise of a bill of rights was added. Those first ten amendments, ratified in 1791, listed freedoms of speech, religion, and assembly, and protections for the accused. They did not list the enslaved. A constitution can be brilliant and incomplete in the same paragraph.</w:t>
+        <w:t xml:space="preserve">They also made a bargain about slavery, and the bargain should be read in the open. An enslaved person would count as three-fifths of a person when seats in the House were allotted, which gave the enslaving states extra power in the national government without giving the enslaved any power at all. The importation of captive Africans was protected for twenty years. People who escaped bondage would be returned. None of this was an accident of wording. It was the price of a union that included South Carolina and Georgia. The men in the room knew what they were buying.</w:t>
+      </w:r>
+    </w:p>
+    <w:p>
+      <w:pPr>
+        <w:spacing w:after="200"/>
+      </w:pPr>
+      <w:r>
+        <w:t xml:space="preserve">Madison, Hamilton, and Jay then explained the machine in a series of newspaper essays, later called the Federalist Papers, still among the most intelligent things humans have written about how not to be ruled by a single will. The essays lost the argument in several states until the promise of a bill of rights was added. Those first ten amendments, ratified in 1791, listed freedoms of speech, religion, and assembly, and protections for the accused. They did not list the enslaved. A constitution can be brilliant and incomplete in the same paragraph.</w:t>
       </w:r>
     </w:p>
     <w:p>
@@ -4686,7 +4686,7 @@
         <w:spacing w:after="200"/>
       </w:pPr>
       <w:r>
-        <w:t xml:space="preserve">His Cabinet did not share his calm. Hamilton wanted a national bank, a funded debt, and an economy of credit and manufactures, and he wanted the capital on the Potomac as the price of getting Virginia to swallow the debt. Jefferson wanted farmers, a small state, and a sympathy for revolutionary France that Hamilton thought was a good way to get the new country invaded. The argument produced the first parties. It also produced, in 1800, an election so bitter that the losers went home and the government did not fall over. Dolphin historians underline the second fact. Peaceful defeat is a technology. Most of the governments in this book never installed it.</w:t>
+        <w:t xml:space="preserve">His Cabinet did not share his calm. Hamilton wanted a national bank, a funded debt, and an economy of credit and manufactures, and he wanted the capital on the Potomac as the price of getting Virginia to swallow the debt. Jefferson wanted farmers, a small state, and a sympathy for revolutionary France that Hamilton thought was a good way to get the new country invaded. The argument produced the first parties. It also produced, in 1800, an election so bitter that the losers went home and the government did not fall over. The second fact deserves the underline. Peaceful defeat is a technology. Most of the governments in this book never installed it.</w:t>
       </w:r>
     </w:p>
     <w:p>
@@ -4730,7 +4730,7 @@
         <w:spacing w:after="200"/>
       </w:pPr>
       <w:r>
-        <w:t xml:space="preserve">Jackson’s presidency made the democratic claim louder and the racial claim uglier at the same time. More white men could vote. The national bank was destroyed because Jackson said it served the rich, which it partly did. And when the Supreme Court, in Worcester v. Georgia, said the state could not simply seize Cherokee land, Jackson declined to enforce the decision. The Indian Removal Act had already passed. The Trail of Tears followed. Dolphin historians do not accept “the spirit of the age” as an alibi. The age had a court, and the president had a choice.</w:t>
+        <w:t xml:space="preserve">Jackson’s presidency made the democratic claim louder and the racial claim uglier at the same time. More white men could vote. The national bank was destroyed because Jackson said it served the rich, which it partly did. And when the Supreme Court, in Worcester v. Georgia, said the state could not simply seize Cherokee land, Jackson declined to enforce the decision. The Indian Removal Act had already passed. The Trail of Tears followed. “The spirit of the age” is not an alibi. The age had a court, and the president had a choice.</w:t>
       </w:r>
     </w:p>
     <w:p>
@@ -4774,7 +4774,7 @@
         <w:spacing w:after="200"/>
       </w:pPr>
       <w:r>
-        <w:t xml:space="preserve">The Compromise of 1850 tried another sedative. California would be free. The slave trade would end in the capital. And a harsher fugitive-slave law would require northerners to help capture people who had escaped. The law was obeyed often enough to horrify the people who had to watch it, and resisted often enough to horrify the people who had demanded it. Harriet Beecher Stowe’s novel of 1852, whatever its sentimental machinery, put the institution in parlors that had preferred not to picture it. Dolphin historians do not usually credit novels with changing countries. They make an exception, cautiously, for this one.</w:t>
+        <w:t xml:space="preserve">The Compromise of 1850 tried another sedative. California would be free. The slave trade would end in the capital. And a harsher fugitive-slave law would require northerners to help capture people who had escaped. The law was obeyed often enough to horrify the people who had to watch it, and resisted often enough to horrify the people who had demanded it. Harriet Beecher Stowe’s novel of 1852, whatever its sentimental machinery, put the institution in parlors that had preferred not to picture it. Novels do not usually change countries. They make an exception, cautiously, for this one.</w:t>
       </w:r>
     </w:p>
     <w:p>
@@ -4790,7 +4790,7 @@
         <w:spacing w:after="200"/>
       </w:pPr>
       <w:r>
-        <w:t xml:space="preserve">John Brown, who had killed in Kansas, tried in 1859 to start an uprising at Harpers Ferry with a handful of men and a cache of arms. He was captured, tried, and hanged. Many in the South read him as the North’s true intention. Many in the North, including people who thought his tactics were murder, found themselves treating the hanged man as a prophet. Dolphin historians observe that a country can pass the point of talking without passing a law that says so. Harpers Ferry was that point for a large number of people who had not yet admitted it.</w:t>
+        <w:t xml:space="preserve">John Brown, who had killed in Kansas, tried in 1859 to start an uprising at Harpers Ferry with a handful of men and a cache of arms. He was captured, tried, and hanged. Many in the South read him as the North’s true intention. Many in the North, including people who thought his tactics were murder, found themselves treating the hanged man as a prophet. A country can pass the point of talking without passing a law that says so. Harpers Ferry was that point for a large number of people who had not yet admitted it.</w:t>
       </w:r>
     </w:p>
     <w:p>
@@ -4842,15 +4842,15 @@
         <w:spacing w:after="200"/>
       </w:pPr>
       <w:r>
-        <w:t xml:space="preserve">Close to 180,000 Black men served in the Union army and navy, many of them newly freed, paid less than white soldiers for much of the war and buried, when they were buried with honor, in their own sections of the cemeteries. The Confederacy, late and desperate, argued about arming enslaved men and never did so in any numbers that mattered. One side was willing, at last, to let the people the war was about fight in it. Dolphin historians consider the contrast sufficient.</w:t>
-      </w:r>
-    </w:p>
-    <w:p>
-      <w:pPr>
-        <w:spacing w:after="200"/>
-      </w:pPr>
-      <w:r>
-        <w:t xml:space="preserve">Lee surrendered at Appomattox in April 1865. Lincoln was shot in a theater five days later by an actor who thought he was saving a country. The Thirteenth Amendment, already in motion, abolished slavery that December. The Fourteenth, ratified in 1868, wrote birthright citizenship and equal protection into the Constitution, aimed squarely at the people the original text had counted as fractions. The Fifteenth, in 1870, forbade denying the vote on account of race. For a few years, in the Reconstruction governments of the South, Black men voted, held office, and wrote constitutions that funded public schools. Then the violence arrived in force. The Ku Klux Klan and its cousins murdered, whipped, and intimidated. Washington tired of the expense and of the subject. In 1877 the last federal troops left the South in a political bargain, and the amendments stayed on paper while the state governments set about nullifying them in practice. A later chapter follows what that meant. Dolphin historians note here only that the war had ended, and the sentence had not yet won.</w:t>
+        <w:t xml:space="preserve">Close to 180,000 Black men served in the Union army and navy, many of them newly freed, paid less than white soldiers for much of the war and buried, when they were buried with honor, in their own sections of the cemeteries. The Confederacy, late and desperate, argued about arming enslaved men and never did so in any numbers that mattered. One side was willing, at last, to let the people the war was about fight in it. The contrast is sufficient.</w:t>
+      </w:r>
+    </w:p>
+    <w:p>
+      <w:pPr>
+        <w:spacing w:after="200"/>
+      </w:pPr>
+      <w:r>
+        <w:t xml:space="preserve">Lee surrendered at Appomattox in April 1865. Lincoln was shot in a theater five days later by an actor who thought he was saving a country. The Thirteenth Amendment, already in motion, abolished slavery that December. The Fourteenth, ratified in 1868, wrote birthright citizenship and equal protection into the Constitution, aimed squarely at the people the original text had counted as fractions. The Fifteenth, in 1870, forbade denying the vote on account of race. For a few years, in the Reconstruction governments of the South, Black men voted, held office, and wrote constitutions that funded public schools. Then the violence arrived in force. The Ku Klux Klan and its cousins murdered, whipped, and intimidated. Washington tired of the expense and of the subject. In 1877 the last federal troops left the South in a political bargain, and the amendments stayed on paper while the state governments set about nullifying them in practice. A later chapter follows what that meant. For now, note only that the war had ended, and the sentence had not yet won.</w:t>
       </w:r>
     </w:p>
     <w:p>
@@ -4956,7 +4956,7 @@
         <w:spacing w:after="200"/>
       </w:pPr>
       <w:r>
-        <w:t xml:space="preserve">The same decades built the other America, the one of steel and rail. The transcontinental railroad, finished in 1869 with Irish and Chinese labor and federal land grants, tied the coasts together and broke the independence of the Native nations of the Plains. The buffalo were shot down to a remnant, partly for hides and partly as a strategy. At Wounded Knee in 1890, soldiers killed several hundred Lakota, many of them women and children, in the last large massacre of the Indian wars. The Dawes Act of 1887 broke tribal land into individual allotments and sold off the “surplus.” It was described as civilization. It functioned as dispossession. Dolphin historians file it next to the Trail of Tears and do not accept the change of century as a change of subject.</w:t>
+        <w:t xml:space="preserve">The same decades built the other America, the one of steel and rail. The transcontinental railroad, finished in 1869 with Irish and Chinese labor and federal land grants, tied the coasts together and broke the independence of the Native nations of the Plains. The buffalo were shot down to a remnant, partly for hides and partly as a strategy. At Wounded Knee in 1890, soldiers killed several hundred Lakota, many of them women and children, in the last large massacre of the Indian wars. The Dawes Act of 1887 broke tribal land into individual allotments and sold off the “surplus.” It was described as civilization. It functioned as dispossession. It belongs next to the Trail of Tears; the change of century is not a change of subject.</w:t>
       </w:r>
     </w:p>
     <w:p>
@@ -4972,7 +4972,7 @@
         <w:spacing w:after="200"/>
       </w:pPr>
       <w:r>
-        <w:t xml:space="preserve">People kept arriving. Ellis Island, from 1892, processed millions from southern and eastern Europe. At the same time Congress barred Chinese laborers, in the Exclusion Act of 1882, the first federal law to shut a gate by race, and mobs in western towns had already made the same point with fire. A country that advertised itself as a refuge wrote, in statute, the list of who was not invited. Dolphin historians keep both documents. The advertisement and the statute are a pair.</w:t>
+        <w:t xml:space="preserve">People kept arriving. Ellis Island, from 1892, processed millions from southern and eastern Europe. At the same time Congress barred Chinese laborers, in the Exclusion Act of 1882, the first federal law to shut a gate by race, and mobs in western towns had already made the same point with fire. A country that advertised itself as a refuge wrote, in statute, the list of who was not invited. Both documents belong in the record. The advertisement and the statute are a pair.</w:t>
       </w:r>
     </w:p>
     <w:p>
@@ -5008,15 +5008,15 @@
         <w:spacing w:after="200"/>
       </w:pPr>
       <w:r>
-        <w:t xml:space="preserve">At home a generation of reformers, alarmed by the trusts, the slums, and the corruption of city machines, tried to sand the roughest edges off industrial capitalism without abolishing it. Journalists exposed the meatpacking plants and the oil monopoly. States passed laws on child labor, hours, and railroad rates. The federal income tax arrived by amendment in 1913, and so did the direct election of senators. None of this ended the fortunes. It did establish that a democracy might tax them and inspect them. Dolphin historians regard inspection as a modest technology and a real one.</w:t>
-      </w:r>
-    </w:p>
-    <w:p>
-      <w:pPr>
-        <w:spacing w:after="200"/>
-      </w:pPr>
-      <w:r>
-        <w:t xml:space="preserve">Women, who had been told since Seneca Falls to wait, stopped waiting in an organized way. They marched, picketed the White House, went to jail, and in 1920 won the national vote. The victory was incomplete in the way American victories often are: Black women in the Jim Crow states inherited a right they were then violently prevented from using. Dolphin historians count the amendment and the polling-place threat as parts of the same event.</w:t>
+        <w:t xml:space="preserve">At home a generation of reformers, alarmed by the trusts, the slums, and the corruption of city machines, tried to sand the roughest edges off industrial capitalism without abolishing it. Journalists exposed the meatpacking plants and the oil monopoly. States passed laws on child labor, hours, and railroad rates. The federal income tax arrived by amendment in 1913, and so did the direct election of senators. None of this ended the fortunes. It did establish that a democracy might tax them and inspect them. Inspection is a modest technology and a real one.</w:t>
+      </w:r>
+    </w:p>
+    <w:p>
+      <w:pPr>
+        <w:spacing w:after="200"/>
+      </w:pPr>
+      <w:r>
+        <w:t xml:space="preserve">Women, who had been told since Seneca Falls to wait, stopped waiting in an organized way. They marched, picketed the White House, went to jail, and in 1920 won the national vote. The victory was incomplete in the way American victories often are: Black women in the Jim Crow states inherited a right they were then violently prevented from using. The amendment and the polling-place threat were parts of the same event.</w:t>
       </w:r>
     </w:p>
     <w:p>
@@ -5044,7 +5044,7 @@
         <w:spacing w:after="200"/>
       </w:pPr>
       <w:r>
-        <w:t xml:space="preserve">The 1920s speculated. Florida land, then stocks, bought with borrowed money, on the theory that a rising price is a reason for a rising price. In October 1929 the theory ended. Banks failed. Savings vanished. By 1933 a quarter of the workforce was unemployed, and the people living in shacks on the edge of cities named the shacks after the president who had not caused the crash and had not stopped it. A army of veterans, the Bonus Army, marched on Washington to ask for money they had been promised for their war service and was burned out of its camp by the army they had served in. Dolphin historians note the symmetry without enjoyment.</w:t>
+        <w:t xml:space="preserve">The 1920s speculated. Florida land, then stocks, bought with borrowed money, on the theory that a rising price is a reason for a rising price. In October 1929 the theory ended. Banks failed. Savings vanished. By 1933 a quarter of the workforce was unemployed, and the people living in shacks on the edge of cities named the shacks after the president who had not caused the crash and had not stopped it. A army of veterans, the Bonus Army, marched on Washington to ask for money they had been promised for their war service and was burned out of its camp by the army they had served in. The symmetry is not enjoyable.</w:t>
       </w:r>
     </w:p>
     <w:p>
@@ -5068,7 +5068,7 @@
         <w:spacing w:after="200"/>
       </w:pPr>
       <w:r>
-        <w:t xml:space="preserve">Roosevelt tried, in 1937, to add justices to a Supreme Court that had been striking his laws down. He lost the fight and won several of the cases anyway, as the Court changed its mind and its membership. Dolphin historians record both outcomes. A president who loses a grab for the court, and accepts the loss, is a data point in favor of the machine built in 1787. They do not have many such data points, and they keep the ones they have.</w:t>
+        <w:t xml:space="preserve">Roosevelt tried, in 1937, to add justices to a Supreme Court that had been striking his laws down. He lost the fight and won several of the cases anyway, as the Court changed its mind and its membership. Both outcomes go in the record. A president who loses a grab for the court, and accepts the loss, is a data point in favor of the machine built in 1787. They do not have many such data points, and they keep the ones they have.</w:t>
       </w:r>
     </w:p>
     <w:p>
@@ -5096,7 +5096,7 @@
         <w:spacing w:after="200"/>
       </w:pPr>
       <w:r>
-        <w:t xml:space="preserve">The attack on Pearl Harbor in December 1941, told more fully among the Pacific chapters, ended the argument about whether the country would fight. It also began an argument the country conducted against some of its own citizens. In 1942 the government ordered the removal of more than 100,000 people of Japanese ancestry from the West Coast, most of them citizens, and confined them in camps in the interior. No comparable order swept up German or Italian Americans in those numbers. The Supreme Court, in Korematsu, declined to stop it. Decades later the country apologized and paid reparations that did not match the loss. Dolphin historians classify the episode under racism and under fear, and note that fear was the reason offered at the time by people who were, in many cases, also pleased to take the farms.</w:t>
+        <w:t xml:space="preserve">The attack on Pearl Harbor in December 1941, told more fully among the Pacific chapters, ended the argument about whether the country would fight. It also began an argument the country conducted against some of its own citizens. In 1942 the government ordered the removal of more than 100,000 people of Japanese ancestry from the West Coast, most of them citizens, and confined them in camps in the interior. No comparable order swept up German or Italian Americans in those numbers. The Supreme Court, in Korematsu, declined to stop it. Decades later the country apologized and paid reparations that did not match the loss. The episode belongs under racism and under fear, and fear was the reason offered at the time by people who were, in many cases, also pleased to take the farms.</w:t>
       </w:r>
     </w:p>
     <w:p>
@@ -5112,7 +5112,7 @@
         <w:spacing w:after="200"/>
       </w:pPr>
       <w:r>
-        <w:t xml:space="preserve">The men who came back met a law, the GI Bill, that paid for college, homes, and businesses, and built a middle class with remarkable speed. They also met, if they were Black and in the wrong town, a banker and a university that had read the same law and found a way not to apply it. The suburbs that spread along the new highways were, in large part, a federal project with a whites-only gate. Dolphin historians add the gate to the file. Prosperity in this country has rarely been as general as the photographs.</w:t>
+        <w:t xml:space="preserve">The men who came back met a law, the GI Bill, that paid for college, homes, and businesses, and built a middle class with remarkable speed. They also met, if they were Black and in the wrong town, a banker and a university that had read the same law and found a way not to apply it. The suburbs that spread along the new highways were, in large part, a federal project with a whites-only gate. The gate goes in the file. Prosperity in this country has rarely been as general as the photographs.</w:t>
       </w:r>
     </w:p>
     <w:p>
@@ -5140,7 +5140,7 @@
         <w:spacing w:after="200"/>
       </w:pPr>
       <w:r>
-        <w:t xml:space="preserve">Vietnam was a French colonial war that the United States inherited, funded, and then fought. The official story was a line of dominoes. The practice was a decade of bombing, conscription, and a countryside that did not become less Vietnamese under the bombs. The Gulf of Tonkin resolution in 1964 handed the president a war without quite declaring one. The Tet offensive of 1968 convinced a large television audience that the official optimism was false. At Kent State in 1970, National Guard troops shot students during a protest, killing four. The draft ended. The war did not, until 1973 for American troops and 1975 for the government they had been holding up. Dolphin historians do not pretend to a precise count of the Vietnamese dead. The honest ranges run into the millions, soldiers and civilians, and the precise number would not change the conclusion. A great power fought a long war, did not win it, and was changed by it anyway.</w:t>
+        <w:t xml:space="preserve">Vietnam was a French colonial war that the United States inherited, funded, and then fought. The official story was a line of dominoes. The practice was a decade of bombing, conscription, and a countryside that did not become less Vietnamese under the bombs. The Gulf of Tonkin resolution in 1964 handed the president a war without quite declaring one. The Tet offensive of 1968 convinced a large television audience that the official optimism was false. At Kent State in 1970, National Guard troops shot students during a protest, killing four. The draft ended. The war did not, until 1973 for American troops and 1975 for the government they had been holding up. There is no precise count of the Vietnamese dead. The honest ranges run into the millions, soldiers and civilians, and the precise number would not change the conclusion. A great power fought a long war, did not win it, and was changed by it anyway.</w:t>
       </w:r>
     </w:p>
     <w:p>
@@ -5184,23 +5184,23 @@
         <w:spacing w:after="200"/>
       </w:pPr>
       <w:r>
-        <w:t xml:space="preserve">The 1990s were rich, armed, and punitive. A crime bill in 1994 lengthened sentences and helped fill prisons, with consequences that fell heaviest on Black and poor defendants and were defended at the time, by both parties, as seriousness. Welfare was cut. A president was impeached over a lie about sex and acquitted. The stock market rose. Dolphin historians note a country that had become very good at counting money and very reluctant to count prisoners.</w:t>
-      </w:r>
-    </w:p>
-    <w:p>
-      <w:pPr>
-        <w:spacing w:after="200"/>
-      </w:pPr>
-      <w:r>
-        <w:t xml:space="preserve">On a clear morning in September 2001, hijackers flew airliners into the World Trade Center and the Pentagon, and passengers forced a fourth plane into a field in Pennsylvania. Nearly three thousand people died. The country went to war in Afghanistan, where the attackers had been sheltered, and then in Iraq, which had not attacked it and did not have the weapons the war was sold on. The second war broke a state, killed hundreds of thousands, and produced a successor chaos from which a new and uglier faction later emerged. Dolphin historians separate the grief, which was real, from the policy, which was a choice. Grief is not a strategy. It was used as one.</w:t>
-      </w:r>
-    </w:p>
-    <w:p>
-      <w:pPr>
-        <w:spacing w:after="200"/>
-      </w:pPr>
-      <w:r>
-        <w:t xml:space="preserve">A financial collapse in 2008, built out of mortgages that could not be paid and bets laid on top of those mortgages, wiped out savings and jobs and was answered with public money for the institutions that had made the bets. The institutions survived. A great many households did not, on anything like the same schedule. Dolphin historians recognize the pattern from earlier panics and from the mills. When the machine fails, the people nearest the machine are rescued first. Greed writes that order of operations. It does not usually sign it.</w:t>
+        <w:t xml:space="preserve">The 1990s were rich, armed, and punitive. A crime bill in 1994 lengthened sentences and helped fill prisons, with consequences that fell heaviest on Black and poor defendants and were defended at the time, by both parties, as seriousness. Welfare was cut. A president was impeached over a lie about sex and acquitted. The stock market rose. The country had become very good at counting money and very reluctant to count prisoners.</w:t>
+      </w:r>
+    </w:p>
+    <w:p>
+      <w:pPr>
+        <w:spacing w:after="200"/>
+      </w:pPr>
+      <w:r>
+        <w:t xml:space="preserve">On a clear morning in September 2001, hijackers flew airliners into the World Trade Center and the Pentagon, and passengers forced a fourth plane into a field in Pennsylvania. Nearly three thousand people died. The country went to war in Afghanistan, where the attackers had been sheltered, and then in Iraq, which had not attacked it and did not have the weapons the war was sold on. The second war broke a state, killed hundreds of thousands, and produced a successor chaos from which a new and uglier faction later emerged. The grief was real. The policy was a choice. Grief is not a strategy. It was used as one.</w:t>
+      </w:r>
+    </w:p>
+    <w:p>
+      <w:pPr>
+        <w:spacing w:after="200"/>
+      </w:pPr>
+      <w:r>
+        <w:t xml:space="preserve">A financial collapse in 2008, built out of mortgages that could not be paid and bets laid on top of those mortgages, wiped out savings and jobs and was answered with public money for the institutions that had made the bets. The institutions survived. A great many households did not, on anything like the same schedule. The pattern is familiar from earlier panics and from the mills. When the machine fails, the people nearest the machine are rescued first. Greed writes that order of operations. It does not usually sign it.</w:t>
       </w:r>
     </w:p>
     <w:p>
@@ -5314,7 +5314,7 @@
         <w:spacing w:after="200"/>
       </w:pPr>
       <w:r>
-        <w:t xml:space="preserve">The First Great Awakening in the 1730s and 40s, and the Second in the early 1800s, turned revival, in its own right, into a recurring national habit: traveling preachers, mass conversions, camp meetings drawing thousands. Out of the Second Awakening’s ferment came homegrown American religions with no European precedent at all — the Shakers, celibate, communal, and consequently self-extinguishing by design; the Latter Day Saint movement founded by Joseph Smith in 1830, the largest of the religious traditions founded on American soil, and one with an origin story unlike anything else in this chapter: Smith said an angel named Moroni showed him a set of buried golden plates, inscribed in a script he called reformed Egyptian, which he translated into the Book of Mormon between 1827 and 1829 before, by his own account, returning the plates to the angel, leaving nothing behind for later examination; Seventh-day Adventism; later, Jehovah’s Witnesses in the 1870s and Christian Science in 1879.</w:t>
+        <w:t xml:space="preserve">The First Great Awakening in the 1730s and 40s, and the Second in the early 1800s, turned revival, in its own right, into a recurring national habit: traveling preachers, mass conversions, camp meetings drawing thousands. Out of the Second Awakening’s ferment came homegrown American religions with no European precedent at all — the Shakers, celibate, communal, and consequently self-extinguishing by design; the Latter Day Saint movement, founded by Joseph Smith in 1830; Seventh-day Adventism; and later Jehovah’s Witnesses in the 1870s and Christian Science in 1879. The Latter Day Saints became the largest of the religious traditions founded on American soil, with an origin story unlike anything else in this chapter. Smith said an angel named Moroni showed him a set of buried golden plates, inscribed in a script he called reformed Egyptian. He translated them into the Book of Mormon between 1827 and 1829 and then, by his own account, returned the plates to the angel, leaving nothing behind for later examination.</w:t>
       </w:r>
     </w:p>
     <w:p>
@@ -5334,15 +5334,15 @@
           <w:i/>
           <w:iCs/>
         </w:rPr>
-        <w:t xml:space="preserve">“Both movements described themselves, right up to the end, as havens from a corrupt and dangerous outside world,” dolphin historians noted. “Dolphin scholarship notes only that the correlation between a leader’s certainty and a follower’s risk appears to run in precisely the wrong direction.”</w:t>
-      </w:r>
-    </w:p>
-    <w:p>
-      <w:pPr>
-        <w:spacing w:after="200"/>
-      </w:pPr>
-      <w:r>
-        <w:t xml:space="preserve">Few countries in this book have generated new, homegrown religious movements at this rate (Japan, with its many postwar new religions, is a serious rival), and dolphin historians attribute it less to any special American piety than to the same structural decision that also produced the country’s endless proliferation of political factions: no established state church, ever, from the founding onward, meaning no single religious authority a new movement has to unseat, only an open field to found one in.</w:t>
+        <w:t xml:space="preserve">“Both movements described themselves, right up to the end, as havens from a corrupt and dangerous outside world,” dolphin historians noted. “The correlation between a leader’s certainty and a follower’s risk appears to run in precisely the wrong direction.”</w:t>
+      </w:r>
+    </w:p>
+    <w:p>
+      <w:pPr>
+        <w:spacing w:after="200"/>
+      </w:pPr>
+      <w:r>
+        <w:t xml:space="preserve">Few countries in this book have generated new, homegrown religious movements at this rate (Japan, with its many postwar new religions, is a serious rival), owing less to any special American piety than to the same structural decision that also produced the country’s endless proliferation of political factions. There was no established state church, ever, and so no single religious authority a new movement had to unseat, only an open field to found one in.</w:t>
       </w:r>
     </w:p>
     <w:p>
@@ -5378,7 +5378,7 @@
           <w:i/>
           <w:iCs/>
         </w:rPr>
-        <w:t xml:space="preserve">Most of the countries in this book inherited one dominant faith and spent centuries arguing about how strictly to enforce it. The United States instead turned religious founding into an ongoing national industry, prolific enough to produce, within the same few centuries, both the Amish, who used their faith to want less of the modern world, and Jonestown, which used faith to demand everything a following had left to give. Dolphin scholarship notes the range and declines to average it into a single lesson.</w:t>
+        <w:t xml:space="preserve">Most of the countries in this book inherited one dominant faith and spent centuries arguing about how strictly to enforce it. The United States instead turned religious founding into an ongoing national industry, prolific enough to produce, within the same few centuries, both the Amish, who used their faith to want less of the modern world, and Jonestown, which used faith to demand everything a following had left to give. The range does not average into a single lesson.</w:t>
       </w:r>
     </w:p>
     <w:p>
@@ -5428,7 +5428,7 @@
         <w:spacing w:after="200"/>
       </w:pPr>
       <w:r>
-        <w:t xml:space="preserve">Independence changed who held power far more than how it was held. Landowners, the Church, and the army kept their positions, slavery outlasted the colonial flags in most places for decades, and Indigenous people, a majority in several of the new countries, gained little say in them. Haiti, which had freed itself from France in 1804 in the only slave revolt in history to found a state, was made to pay for the achievement: in 1825 French warships arrived to enforce an indemnity for the property its former masters had lost, and the debt, with the loans taken out to cover it, was still being serviced in the 1940s.</w:t>
+        <w:t xml:space="preserve">Independence changed who held power far more than how it was held. Landowners, the Church, and the army kept their positions, slavery outlasted the colonial flags in most places for decades, and Indigenous people, a majority in several of the new countries, gained little say in them. Haiti, which had freed itself from France in 1804 in the only slave revolt in history to found a state, was made to pay for the achievement. In 1825 French warships arrived to enforce an indemnity for the property its former masters had lost, and the debt, with the loans taken out to cover it, was still being serviced in the 1940s.</w:t>
       </w:r>
     </w:p>
     <w:p>
@@ -5590,7 +5590,7 @@
         <w:spacing w:after="200"/>
       </w:pPr>
       <w:r>
-        <w:t xml:space="preserve">The empire entered the First World War in late 1914 on Germany’s side. It beat a British and French landing at Gallipoli in 1915, a victory that made a young commander named Mustafa Kemal famous, and in the same year its government began deporting the Armenians of Anatolia. On April 24, 1915, Armenian leaders in Constantinople were arrested; over the following months hundreds of thousands of people were marched into the Syrian desert, where they died of thirst, starvation, and massacre. The toll is usually put near a million, out of an Armenian population of perhaps two million, and Assyrians and Greeks were killed in large numbers as well. Dolphin historians use the word genocide, as do most scholars of the subject, and the word was coined in the 1940s by Raphael Lemkin with this case partly in mind. The Turkish state disputes the term. More than thirty countries, the United States among them, have formally recognized it.</w:t>
+        <w:t xml:space="preserve">The empire entered the First World War in late 1914 on Germany’s side. It beat a British and French landing at Gallipoli in 1915, a victory that made a young commander named Mustafa Kemal famous, and in the same year its government began deporting the Armenians of Anatolia. On April 24, 1915, Armenian leaders in Constantinople were arrested; over the following months hundreds of thousands of people were marched into the Syrian desert, where they died of thirst, starvation, and massacre. The toll is usually put near a million, out of an Armenian population of perhaps two million, and Assyrians and Greeks were killed in large numbers as well. The word is genocide, as most scholars of the subject agree, and the word was coined in the 1940s by Raphael Lemkin with this case partly in mind. The Turkish state disputes the term. More than thirty countries, the United States among them, have formally recognized it.</w:t>
       </w:r>
     </w:p>
     <w:p>
@@ -5622,7 +5622,7 @@
         <w:spacing w:after="200"/>
       </w:pPr>
       <w:r>
-        <w:t xml:space="preserve">Dolphin historians decline to render a verdict on a region whose argument is still being conducted, and offer an object instead. The dome of Hagia Sophia, finished in 537 as a Christian cathedral, became a mosque in 1453, a museum in 1935, and a mosque again in 2020. It has not been consulted at any stage.</w:t>
+        <w:t xml:space="preserve">A region whose argument is still being conducted gets no verdict here, only an object. The dome of Hagia Sophia, finished in 537 as a Christian cathedral, became a mosque in 1453, a museum in 1935, and a mosque again in 2020. It has not been consulted at any stage.</w:t>
       </w:r>
     </w:p>
     <w:p>
@@ -5748,7 +5748,7 @@
         <w:spacing w:after="200"/>
       </w:pPr>
       <w:r>
-        <w:t xml:space="preserve">The Treaty of Versailles, signed on June 28, 1919, five years to the day after the assassination, imposed heavy reparations and a war-guilt clause on Germany. The economist John Maynard Keynes, who had attended the conference as a British Treasury official and resigned in protest, wrote a bestselling book arguing that the settlement would do more harm than good. Marshal Foch, the French commander, is reported to have said of it that it was not a peace but an armistice for twenty years. It was, almost exactly, twenty years and sixty-five days. History rarely grants a forecast this precise, and dolphin scholarship notes that the intervening years were spent by most of the parties involved rearming rather than proving him wrong.</w:t>
+        <w:t xml:space="preserve">The Treaty of Versailles, signed on June 28, 1919, five years to the day after the assassination, imposed heavy reparations and a war-guilt clause on Germany. The economist John Maynard Keynes, who had attended the conference as a British Treasury official and resigned in protest, wrote a bestselling book arguing that the settlement would do more harm than good. Marshal Foch, the French commander, is reported to have said of it that it was not a peace but an armistice for twenty years. It was, almost exactly, twenty years and sixty-five days. History rarely grants a forecast this precise, and the intervening years were spent by most of the parties involved rearming rather than proving him wrong.</w:t>
       </w:r>
     </w:p>
     <w:p>
@@ -5938,7 +5938,7 @@
         <w:spacing w:after="200"/>
       </w:pPr>
       <w:r>
-        <w:t xml:space="preserve">After the war, Germany rebuilt as a democratic nation and became a strong advocate for cooperation in Europe. To dolphin historians, this recovery was almost as important as the catastrophe had been. It even acquired a word, Vergangenheitsbewältigung, the work of coming to terms with the past, which the dolphins consider the only German word whose length is entirely justified.</w:t>
+        <w:t xml:space="preserve">After the war, Germany rebuilt as a democratic nation and became a strong advocate for cooperation in Europe. This recovery was almost as important as the catastrophe had been. It even acquired a word, Vergangenheitsbewältigung, the work of coming to terms with the past, which the dolphins consider the only German word whose length is entirely justified.</w:t>
       </w:r>
     </w:p>
     <w:p>
@@ -5954,7 +5954,7 @@
         <w:spacing w:after="200"/>
       </w:pPr>
       <w:r>
-        <w:t xml:space="preserve">The file also has thin pages, and dolphin historians check those as carefully as the full ones. Scandinavia spent the twentieth century with the same offer on the table, and mostly declined it. It was not innocent. Sweden stayed neutral in the Second World War and sold iron ore to Germany, and sterilized tens of thousands of its own citizens under a public-health program that ran into the 1970s; Norway produced Quisling, whose name became a word. Denmark, occupied, got most of its Jews to Sweden in a few nights in October 1943. A thin page in a thick file is an achievement, and it was not an accident.</w:t>
+        <w:t xml:space="preserve">The file also has thin pages, and they get checked as carefully as the full ones. Scandinavia spent the twentieth century with the same offer on the table, and mostly declined it. It was not innocent. Sweden stayed neutral in the Second World War and sold iron ore to Germany, and sterilized tens of thousands of its own citizens under a public-health program that ran into the 1970s; Norway produced Quisling, whose name became a word. Denmark, occupied, got most of its Jews to Sweden in a few nights in October 1943. A thin page in a thick file is an achievement, and it was not an accident.</w:t>
       </w:r>
     </w:p>
     <w:p>
@@ -6028,7 +6028,7 @@
         <w:spacing w:after="200"/>
       </w:pPr>
       <w:r>
-        <w:t xml:space="preserve">The speed of it stuns dolphin historians as much as anything else in this book. A feudal, agrarian society built a modern navy, a rail network, a conscript army, and an industrial base within a single lifetime, sending students abroad to learn what it needed and building the rest at home once they returned.</w:t>
+        <w:t xml:space="preserve">The speed of it is as stunning as anything else in this book. A feudal, agrarian society built a modern navy, a rail network, a conscript army, and an industrial base within a single lifetime, sending students abroad to learn what it needed and building the rest at home once they returned.</w:t>
       </w:r>
     </w:p>
     <w:p>
@@ -6158,7 +6158,7 @@
         <w:spacing w:after="200"/>
       </w:pPr>
       <w:r>
-        <w:t xml:space="preserve">Dolphin historians treat Italy, unlike Germany or Japan, as a case where “genius” is not a 19th-century flowering but a multi-thousand-year inheritance, renewed rather than newly discovered.</w:t>
+        <w:t xml:space="preserve">Italy, unlike Germany or Japan, is a case where “genius” is not a 19th-century flowering but a multi-thousand-year inheritance, renewed rather than newly discovered.</w:t>
       </w:r>
     </w:p>
     <w:p>
@@ -6194,7 +6194,7 @@
         <w:spacing w:after="200"/>
       </w:pPr>
       <w:r>
-        <w:t xml:space="preserve">The regime’s foreign ambitions ran ahead of its actual military strength for most of its life. The 1935–36 invasion of Ethiopia, one of the last independent states in Africa, used chemical weapons against a population with no air force and little modern weaponry to answer with, a one-sided brutality dolphin historians decline to file under “war” in the sense the word implies elsewhere in this book.</w:t>
+        <w:t xml:space="preserve">The regime’s foreign ambitions ran ahead of its actual military strength for most of its life. The 1935–36 invasion of Ethiopia, one of the last independent states in Africa, used chemical weapons against a population with no air force and little modern weaponry to answer with, a one-sided brutality that does not belong under “war” in the sense the word implies elsewhere in this book.</w:t>
       </w:r>
     </w:p>
     <w:p>
@@ -6296,7 +6296,7 @@
         <w:spacing w:after="200"/>
       </w:pPr>
       <w:r>
-        <w:t xml:space="preserve">Dolphin historians open this chapter earlier than its 20th-century subject, because Spain’s pattern of genius and catastrophe has already run once before, on a different set of terms entirely.</w:t>
+        <w:t xml:space="preserve">This chapter opens earlier than its 20th-century subject, because Spain’s pattern of genius and catastrophe has already run once before, on a different set of terms entirely.</w:t>
       </w:r>
     </w:p>
     <w:p>
@@ -6494,7 +6494,7 @@
         <w:spacing w:after="200"/>
       </w:pPr>
       <w:r>
-        <w:t xml:space="preserve">The instinct to deny instead of admit had an early, specific test case. In 1940, the Soviet secret police executed some 22,000 Polish military officers and civil servants in the Katyn Forest and elsewhere, then blamed the killings on Nazi Germany for the next five decades; the Soviet state did not admit its own responsibility until 1990, one of the last confessions Gorbachev’s own government made before the country that had committed the act ceased to exist.</w:t>
+        <w:t xml:space="preserve">The instinct to deny instead of admit had an early, specific test case. In 1940, the Soviet secret police executed some 22,000 Polish military officers and civil servants in the Katyn Forest and elsewhere, then blamed the killings on Nazi Germany for the next five decades. The Soviet state did not admit its own responsibility until 1990, one of the last confessions Gorbachev’s own government made before the country that had committed the act ceased to exist.</w:t>
       </w:r>
     </w:p>
     <w:p>
@@ -6518,7 +6518,7 @@
         <w:spacing w:after="200"/>
       </w:pPr>
       <w:r>
-        <w:t xml:space="preserve">Dolphin historians insist on stating plainly what a shorter accounting would flatten out: the Soviet Union also paid the highest cost, by a wide margin, of any Allied power in defeating Nazi Germany, with estimates of Soviet dead in the Second World War running from around 20 million to as high as 27 million, military and civilian combined, a scale that shaped the postwar Soviet state’s own self-image for the rest of its existence.</w:t>
+        <w:t xml:space="preserve">A shorter accounting would flatten out the other half: the Soviet Union also paid the highest cost, by a wide margin, of any Allied power in defeating Nazi Germany. Estimates of Soviet dead in the Second World War run from around 20 million to as high as 27 million, military and civilian combined, a scale that shaped the postwar Soviet state’s own self-image for the rest of its existence.</w:t>
       </w:r>
     </w:p>
     <w:p>
@@ -6592,7 +6592,7 @@
         <w:spacing w:after="200"/>
       </w:pPr>
       <w:r>
-        <w:t xml:space="preserve">This chapter returns to a civilization dolphin scholarship already logged, several chapters ago, as among the deepest cultural inheritances in the book: millennia of continuous writing, philosophy, and administration, surviving dynasty after dynasty like a tide that always came back in.</w:t>
+        <w:t xml:space="preserve">This chapter returns to a civilization logged several chapters ago as among the deepest cultural inheritances in the book: millennia of continuous writing, philosophy, and administration, surviving dynasty after dynasty like a tide that always came back in.</w:t>
       </w:r>
     </w:p>
     <w:p>
@@ -6624,7 +6624,7 @@
         <w:spacing w:after="200"/>
       </w:pPr>
       <w:r>
-        <w:t xml:space="preserve">The Cultural Revolution, launched in 1966 and continuing in various forms until Mao’s death in 1976, turned the state’s organizing power against its own institutions, culture, and people: intellectuals persecuted, historical and religious sites destroyed, education disrupted for a generation, and between several hundred thousand and about two million people killed — a direct, painful echo of the very cultural memory dolphin scholarship admired several chapters earlier.</w:t>
+        <w:t xml:space="preserve">The Cultural Revolution, launched in 1966 and continuing in various forms until Mao’s death in 1976, turned the state’s organizing power against its own institutions, culture, and people: intellectuals persecuted, historical and religious sites destroyed, education disrupted for a generation, and between several hundred thousand and about two million people killed. It was a direct, painful assault on the very cultural memory admired several chapters earlier.</w:t>
       </w:r>
     </w:p>
     <w:p>
@@ -6778,7 +6778,7 @@
         <w:spacing w:after="200"/>
       </w:pPr>
       <w:r>
-        <w:t xml:space="preserve">Tradition begins with Abraham, a herder in Mesopotamia who, in the account his descendants would carry forward for four thousand years, made a covenant with a single god and moved to Canaan. Dolphin historians file Abraham the way they filed China’s Xia dynasty: a founding tradition, not an archaeologically confirmed individual, and worth taking seriously as both at once.</w:t>
+        <w:t xml:space="preserve">Tradition begins with Abraham, a herder in Mesopotamia who, in the account his descendants would carry forward for four thousand years, made a covenant with a single god and moved to Canaan. Abraham belongs in the same file as China’s Xia dynasty: a founding tradition, not an archaeologically confirmed individual, and worth taking seriously as both at once.</w:t>
       </w:r>
     </w:p>
     <w:p>
@@ -6826,7 +6826,7 @@
         <w:spacing w:after="200"/>
       </w:pPr>
       <w:r>
-        <w:t xml:space="preserve">Physical evidence for this period exists in a way it does not for the patriarchal narratives that opened this chapter. The Dead Sea Scrolls, discovered in caves near Qumran starting in 1947 and dated from around the 3rd century BCE to the 1st century CE, include the oldest surviving copies of large portions of the Hebrew Bible by a margin of about a thousand years over anything previously known, and their text matches the version handed down through later tradition closely enough to satisfy dolphin scholarship’s own standard for confirmed rather than merely traditional history.</w:t>
+        <w:t xml:space="preserve">Physical evidence for this period exists in a way it does not for the patriarchal narratives that opened this chapter. The Dead Sea Scrolls, discovered in caves near Qumran starting in 1947 and dated from around the 3rd century BCE to the 1st century CE, include the oldest surviving copies of large portions of the Hebrew Bible by a margin of about a thousand years over anything previously known. Their text matches the version handed down through later tradition closely enough to meet this book’s standard for confirmed rather than merely traditional history.</w:t>
       </w:r>
     </w:p>
     <w:p>
@@ -6858,7 +6858,7 @@
         <w:spacing w:after="200"/>
       </w:pPr>
       <w:r>
-        <w:t xml:space="preserve">What followed was the diaspora: Jewish communities scattered across the Mediterranean, the Middle East, and eventually the whole of Europe and Asia, carrying identity for the next eighteen centuries not through a land or a state, which they mostly did not have, but through law, text, and memory — the Talmud, compiled across the centuries that followed, and an unbroken chain of communal practice.</w:t>
+        <w:t xml:space="preserve">What followed was the diaspora: Jewish communities scattered across the Mediterranean, the Middle East, and eventually the whole of Europe and Asia. For the next eighteen centuries they carried their identity not through a land or a state, which they mostly did not have, but through law, text, and memory — the Talmud, compiled across the centuries that followed, and an unbroken chain of communal practice.</w:t>
       </w:r>
     </w:p>
     <w:p>
@@ -6918,7 +6918,7 @@
         <w:spacing w:after="200"/>
       </w:pPr>
       <w:r>
-        <w:t xml:space="preserve">Not every neighbor stayed an adversary. Egypt made peace with Israel in 1979, Jordan in 1994, and the 2020 Abraham Accords normalized relations with several more Arab states. The conflict with the Palestinians themselves, over land, statehood, and the unresolved status of Jerusalem, remains open as this book is written, and dolphin historians decline to award it a verdict for the same reason offered elsewhere in this book for still-unresolved arguments: the humans involved have not resolved it yet.</w:t>
+        <w:t xml:space="preserve">Not every neighbor stayed an adversary. Egypt made peace with Israel in 1979, Jordan in 1994, and the 2020 Abraham Accords normalized relations with several more Arab states. The conflict with the Palestinians themselves, over land, statehood, and the unresolved status of Jerusalem, remains open as this book is written, and gets no verdict here for the same reason offered elsewhere in this book for still-unresolved arguments: the humans involved have not resolved it yet.</w:t>
       </w:r>
     </w:p>
     <w:p>
@@ -7052,7 +7052,7 @@
         <w:spacing w:after="200"/>
       </w:pPr>
       <w:r>
-        <w:t xml:space="preserve">The Berlin Wall, raised by East Germany in 1961 to stop the outflow of its own population westward, stood as the era’s most literal symbol for close to three decades before crowds tore it down in November 1989, a single unplanned night that historians now treat as the moment the outcome of the whole rivalry became visible to everyone at once. The Soviet Union dissolved two years later, in 1991.</w:t>
+        <w:t xml:space="preserve">The Berlin Wall, raised by East Germany in 1961 to stop the outflow of its own population westward, stood as the era’s most literal symbol for close to three decades before crowds tore it down in November 1989. Historians now treat that single unplanned night as the moment the outcome of the whole rivalry became visible to everyone at once. The Soviet Union dissolved two years later, in 1991.</w:t>
       </w:r>
     </w:p>
     <w:p>
@@ -7110,7 +7110,7 @@
         <w:spacing w:after="200"/>
       </w:pPr>
       <w:r>
-        <w:t xml:space="preserve">Dolphin historians open this chapter by naming what makes it different from every chapter before it: this may be the first thing in the whole book dolphins cannot watch happen in person. Everything up to now took place somewhere a dolphin could, in principle, have been present for — on the water, near it, or on land bordering it. This chapter’s subject leaves the planet.</w:t>
+        <w:t xml:space="preserve">This chapter differs from every chapter before it: this may be the first thing in the whole book dolphins cannot watch happen in person. Everything up to now took place somewhere a dolphin could, in principle, have been present for — on the water, near it, or on land bordering it. This chapter’s subject leaves the planet.</w:t>
       </w:r>
     </w:p>
     <w:p>
@@ -7158,7 +7158,7 @@
         <w:spacing w:after="200"/>
       </w:pPr>
       <w:r>
-        <w:t xml:space="preserve">What followed is, to dolphin historians, nearly as interesting as the landing itself: humans stopped going. Apollo 17, in December 1972, was the last crewed Moon landing, and no human has walked on the Moon since, not for any technical reason so much as budgetary and political ones, once the Cold War prestige motive that funded the program in the first place had been satisfied. NASA’s Artemis program has begun to change that. In April 2026, Artemis II carried four astronauts, Reid Wiseman, Victor Glover, Christina Koch, and the Canadian Jeremy Hansen, around the Moon and back in ten days, the first crew to leave Earth orbit since 1972. A landing is planned for later in the decade.</w:t>
+        <w:t xml:space="preserve">What followed is nearly as interesting as the landing itself: humans stopped going. Apollo 17, in December 1972, was the last crewed Moon landing, and no human has walked on the Moon since, not for any technical reason so much as budgetary and political ones, once the Cold War prestige motive that funded the program in the first place had been satisfied. NASA’s Artemis program has begun to change that. In April 2026, Artemis II carried four astronauts, Reid Wiseman, Victor Glover, Christina Koch, and the Canadian Jeremy Hansen, around the Moon and back in ten days, the first crew to leave Earth orbit since 1972. A landing is planned for later in the decade.</w:t>
       </w:r>
     </w:p>
     <w:p>
@@ -7194,7 +7194,7 @@
         <w:spacing w:after="200"/>
       </w:pPr>
       <w:r>
-        <w:t xml:space="preserve">In 2009 a spent rocket stage was crashed into a shadowed crater near the Moon’s south pole, and the plume turned out to contain water. Ice in craters the sun never reaches can be drunk, split into air, or turned into fuel: a dry Moon is a destination, and a Moon with ice is a warehouse. China landed on the far side in 2019, the first craft to do so, and dolphin historians note that interest in a return rose considerably once the warehouse was confirmed.</w:t>
+        <w:t xml:space="preserve">In 2009 a spent rocket stage was crashed into a shadowed crater near the Moon’s south pole, and the plume turned out to contain water. Ice in craters the sun never reaches can be drunk, split into air, or turned into fuel: a dry Moon is a destination, and a Moon with ice is a warehouse. China landed on the far side in 2019, the first craft to do so, and interest in a return rose considerably once the warehouse was confirmed.</w:t>
       </w:r>
     </w:p>
     <w:p>
@@ -7218,7 +7218,7 @@
         <w:spacing w:after="200"/>
       </w:pPr>
       <w:r>
-        <w:t xml:space="preserve">Dolphin historians decline to record any of this as more than intention, consistent with this book’s practice of hedging claims about an unfinished present. They do note the pattern it would extend: this species has already left one continent on foot, crossed an ocean to a hemisphere it did not know was there, and, in at least one of its own founding accounts, walked out of Egypt, each time with incomplete information about what waited on the other side, and each time going anyway.</w:t>
+        <w:t xml:space="preserve">None of this is recorded here as more than intention, consistent with this book’s practice of hedging claims about an unfinished present. They do note the pattern it would extend: this species has already left one continent on foot, crossed an ocean to a hemisphere it did not know was there, and, in at least one of its own founding accounts, walked out of Egypt, each time with incomplete information about what waited on the other side, and each time going anyway.</w:t>
       </w:r>
     </w:p>
     <w:p>
@@ -7300,23 +7300,23 @@
         <w:spacing w:after="200"/>
       </w:pPr>
       <w:r>
-        <w:t xml:space="preserve">Einstein’s general theory, which in 1915 extended the special one to gravity, got its most famous public test in 1919, when Arthur Eddington led an expedition to the island of Príncipe, off West Africa, and a second British team set up at Sobral, in Brazil, to photograph a total solar eclipse and measure whether starlight passing near the sun bent by the amount Einstein’s equations predicted. It did, and the announcement made Einstein an overnight celebrity in a way no physicist before him had been. Dolphin historians note, with the faintest trace of smugness, that confirming this took a ship, an island, a rare eclipse, and a great deal of careful photography, whereas any dolphin confirms the same underlying point about delayed, non-instantaneous signals every time it clicks.</w:t>
-      </w:r>
-    </w:p>
-    <w:p>
-      <w:pPr>
-        <w:spacing w:after="200"/>
-      </w:pPr>
-      <w:r>
-        <w:t xml:space="preserve">This was not idle abstraction for long. The same mass-energy relationship Einstein’s paper implied, E=mc², became, within four decades, the physics behind the atomic bomb, and the century’s arms race and Cold War, covered elsewhere in this book, are unthinkable without it. Relativity also turned out to have a mundane, everyday payoff nobody in 1905 could have predicted: satellite clocks in the Global Positioning System drift out of sync with clocks on the ground by measurable amounts because of both their speed and their weaker gravity, so the satellite clocks are deliberately set to tick slow before launch, by about 38 microseconds a day, and receivers apply a further relativistic correction for each orbit. Without it, every phone that gives directions would drift off by roughly ten kilometers a day. A theory built to explain light near the sun ended up steering cars down city streets.</w:t>
-      </w:r>
-    </w:p>
-    <w:p>
-      <w:pPr>
-        <w:spacing w:after="200"/>
-      </w:pPr>
-      <w:r>
-        <w:t xml:space="preserve">Wave-particle duality, formalized through the 1920s, holds that light and matter both behave sometimes like discrete particles and sometimes like spread-out waves, depending on how they are observed. Humans, whose primary sense is vision — built around treating light as straight-line rays — tend to find this genuinely strange.</w:t>
+        <w:t xml:space="preserve">Einstein’s general theory, which in 1915 extended the special one to gravity, got its most famous public test in 1919. Arthur Eddington led an expedition to the island of Príncipe, off West Africa, and a second British team set up at Sobral, in Brazil, to photograph a total solar eclipse and measure whether starlight passing near the sun bent by the amount Einstein’s equations predicted. It did, and the announcement made Einstein an overnight celebrity in a way no physicist before him had been. Dolphin historians note, with the faintest trace of smugness, that confirming this took a ship, an island, a rare eclipse, and a great deal of careful photography, whereas any dolphin confirms the same underlying point about delayed, non-instantaneous signals every time it clicks.</w:t>
+      </w:r>
+    </w:p>
+    <w:p>
+      <w:pPr>
+        <w:spacing w:after="200"/>
+      </w:pPr>
+      <w:r>
+        <w:t xml:space="preserve">This was not idle abstraction for long. The same mass-energy relationship Einstein’s paper implied, E=mc², became, within four decades, the physics behind the atomic bomb, and the century’s arms race and Cold War, covered elsewhere in this book, are unthinkable without it. Relativity also turned out to have a mundane, everyday payoff nobody in 1905 could have predicted: satellite clocks in the Global Positioning System drift out of sync with clocks on the ground by measurable amounts because of both their speed and their weaker gravity. The satellite clocks are therefore deliberately set to tick slow before launch, by about 38 microseconds a day, and receivers apply a further relativistic correction for each orbit. Without it, every phone that gives directions would drift off by roughly ten kilometers a day. A theory built to explain light near the sun ended up steering cars down city streets.</w:t>
+      </w:r>
+    </w:p>
+    <w:p>
+      <w:pPr>
+        <w:spacing w:after="200"/>
+      </w:pPr>
+      <w:r>
+        <w:t xml:space="preserve">Wave-particle duality, formalized through the 1920s, holds that light and matter both behave sometimes like discrete particles and sometimes like spread-out waves, depending on how they are observed. Humans, whose primary sense is vision — built around treating light as straight-line rays — tend to find this strange.</w:t>
       </w:r>
     </w:p>
     <w:p>
@@ -7344,15 +7344,15 @@
         <w:spacing w:after="200"/>
       </w:pPr>
       <w:r>
-        <w:t xml:space="preserve">The holographic principle, a serious and still-unresolved research program in theoretical physics, proposes that all the information describing a volume of space might be fully encoded on that volume’s boundary surface, the way a hologram stores a three-dimensional image on a flat piece of film. Dolphin scholarship notes, with something between amusement and professional recognition, that this is a reasonably fair description of what a dolphin’s brain already does several times a second: building a three-dimensional picture of its surroundings out of a return signal that arrives, fundamentally, as a pattern of intensity and timing spread across a surface — the dolphin’s own array of acoustic receivers.</w:t>
-      </w:r>
-    </w:p>
-    <w:p>
-      <w:pPr>
-        <w:spacing w:after="200"/>
-      </w:pPr>
-      <w:r>
-        <w:t xml:space="preserve">None of this is offered as a claim that dolphins secretly anticipated theoretical physics, or that intuition is a substitute for the difficult mathematics humans spent a century building. Dolphin scholarship extends its genuine compliments to that work specifically because it was hard, and done without the sensory head start dolphins happened to be born with.</w:t>
+        <w:t xml:space="preserve">The holographic principle, a serious and still-unresolved research program in theoretical physics, proposes that all the information describing a volume of space might be fully encoded on that volume’s boundary surface, the way a hologram stores a three-dimensional image on a flat piece of film. Dolphins note, with something between amusement and professional recognition, that this is a reasonably fair description of what their brains already do several times a second. They build a three-dimensional picture of their surroundings out of a return signal that arrives, fundamentally, as a pattern of intensity and timing spread across a surface — the dolphin’s own array of acoustic receivers.</w:t>
+      </w:r>
+    </w:p>
+    <w:p>
+      <w:pPr>
+        <w:spacing w:after="200"/>
+      </w:pPr>
+      <w:r>
+        <w:t xml:space="preserve">None of this is offered as a claim that dolphins secretly anticipated theoretical physics, or that intuition is a substitute for the difficult mathematics humans spent a century building. That work deserves genuine compliments specifically because it was hard, and done without the sensory head start dolphins happened to be born with.</w:t>
       </w:r>
     </w:p>
     <w:p>
@@ -7388,7 +7388,7 @@
         <w:spacing w:after="200"/>
       </w:pPr>
       <w:r>
-        <w:t xml:space="preserve">Physics is the chapter’s joke. It is not the whole of the accomplishment. Dolphin historians, having teased one science for seeming familiar, owe the others a straight inventory. Over about four centuries humans built a method: claim less than you can show, show it again, and let a stranger try to break it. The method is the achievement. The list under it is what the method caught.</w:t>
+        <w:t xml:space="preserve">Physics is the chapter’s joke. It is not the whole of the accomplishment. Having teased one science for seeming familiar, this chapter owes the others a straight inventory. Over about four centuries humans built a method: claim less than you can show, show it again, and let a stranger try to break it. The method is the achievement. The list under it is what the method caught.</w:t>
       </w:r>
     </w:p>
     <w:p>
@@ -7490,15 +7490,15 @@
         <w:spacing w:after="200"/>
       </w:pPr>
       <w:r>
-        <w:t xml:space="preserve">Formal empire, built up over the centuries this book has already covered, mostly ended within a single human lifetime. The process ran fastest between the 1940s and the 1970s, and dolphin historians treat its speed as almost as remarkable as the speed of the empires it dismantled.</w:t>
-      </w:r>
-    </w:p>
-    <w:p>
-      <w:pPr>
-        <w:spacing w:after="200"/>
-      </w:pPr>
-      <w:r>
-        <w:t xml:space="preserve">India’s road to independence began, like several roads in this book, with a trading company. The Mughal Empire that had dominated the subcontinent since 1526 (builders of the Taj Mahal and, by some estimates, at its height responsible for roughly a quarter of the world’s economic output) was showing signs of fraying when the East India Company, chartered in London in 1600 to sell spices and cloth, began acquiring territory instead. After the Battle of Plassey in 1757, the Company governed large parts of India with an army that by the early 1800s was, by one common estimate, close to twice the size of Britain’s own, an arrangement dolphin historians summarize as a business with a country attached. Company rule ended after the uprising of 1857, and direct rule by the British Crown, the Raj, followed until 1947.</w:t>
+        <w:t xml:space="preserve">Formal empire, built up over the centuries this book has already covered, mostly ended within a single human lifetime. The process ran fastest between the 1940s and the 1970s, and its speed was almost as remarkable as the speed of the empires it dismantled.</w:t>
+      </w:r>
+    </w:p>
+    <w:p>
+      <w:pPr>
+        <w:spacing w:after="200"/>
+      </w:pPr>
+      <w:r>
+        <w:t xml:space="preserve">India’s road to independence began, like several roads in this book, with a trading company. The Mughal Empire that had dominated the subcontinent since 1526 (builders of the Taj Mahal and, by some estimates, at its height responsible for roughly a quarter of the world’s economic output) was showing signs of fraying when the East India Company, chartered in London in 1600 to sell spices and cloth, began acquiring territory instead. After the Battle of Plassey in 1757, the Company governed large parts of India with an army that by the early 1800s was, by one common estimate, close to twice the size of Britain’s own, an arrangement best summarized as a business with a country attached. Company rule ended after the uprising of 1857, and direct rule by the British Crown, the Raj, followed until 1947.</w:t>
       </w:r>
     </w:p>
     <w:p>
@@ -7594,7 +7594,7 @@
           <w:i/>
           <w:iCs/>
         </w:rPr>
-        <w:t xml:space="preserve">Formal empire ended, for the most part, within one human lifetime, a pace with no earlier precedent in this book. But the economic dependencies, the drawn borders, and the political structures colonialism left behind did not end on the same schedule, and in a number of cases have not ended yet. Independence turned out to be a start, not a conclusion — a pattern this book has now seen often enough that dolphin historians no longer find it surprising, only worth repeating.</w:t>
+        <w:t xml:space="preserve">Formal empire ended, for the most part, within one human lifetime, a pace with no earlier precedent in this book. But the economic dependencies, the drawn borders, and the political structures colonialism left behind did not end on the same schedule, and in a number of cases have not ended yet. Independence turned out to be a start, not a conclusion — a pattern this book has now seen often enough to stop finding surprising, though not to stop repeating.</w:t>
       </w:r>
     </w:p>
     <w:p>
@@ -7644,23 +7644,23 @@
         <w:spacing w:after="200"/>
       </w:pPr>
       <w:r>
-        <w:t xml:space="preserve">The murder of Emmett Till, a fourteen-year-old boy killed in Mississippi in August 1955 after being accused of offending a white woman, and the decision by his mother, Mamie Till-Mobley, to hold an open-casket funeral so that Jet magazine could publish photographs of his mutilated body, is widely credited with galvanizing the movement that followed; the Montgomery boycott began three months later. The Twenty-Fourth Amendment, ratified in 1964, abolished the poll taxes that had been used for decades to price Black voters out of elections across much of the South.</w:t>
-      </w:r>
-    </w:p>
-    <w:p>
-      <w:pPr>
-        <w:spacing w:after="200"/>
-      </w:pPr>
-      <w:r>
-        <w:t xml:space="preserve">South Africa’s anti-apartheid struggle ran on a longer clock. Legal racial segregation, formalized as apartheid in 1948, persisted for close to half a century against internal resistance, including the armed campaign of the ANC’s military wing, Umkhonto we Sizwe, after peaceful protest was banned, and mounting international pressure and sanctions, ending only with Nelson Mandela’s release in 1990 from twenty-seven years of imprisonment, eighteen of them on Robben Island (in waters the dolphins know well), and his election as South Africa’s first Black president in 1994.</w:t>
-      </w:r>
-    </w:p>
-    <w:p>
-      <w:pPr>
-        <w:spacing w:after="200"/>
-      </w:pPr>
-      <w:r>
-        <w:t xml:space="preserve">Women’s movements ran throughout the same century on their own overlapping timelines: suffrage achieved in most Western democracies between roughly 1893 (New Zealand, first) and the 1920s across much of Europe and North America, followed by a second wave of legal and social advances in the 1960s and 70s addressing employment, reproductive rights, and legal equality more broadly, with the pace and scope of change varying enormously by country and continuing unevenly to the present.</w:t>
+        <w:t xml:space="preserve">Emmett Till, a fourteen-year-old boy, was murdered in Mississippi in August 1955 after being accused of offending a white woman. His mother, Mamie Till-Mobley, held an open-casket funeral so that Jet magazine could publish photographs of his mutilated body. The murder and the photographs are widely credited with galvanizing the movement that followed; the Montgomery boycott began three months later. The Twenty-Fourth Amendment, ratified in 1964, abolished the poll taxes that had been used for decades to price Black voters out of elections across much of the South.</w:t>
+      </w:r>
+    </w:p>
+    <w:p>
+      <w:pPr>
+        <w:spacing w:after="200"/>
+      </w:pPr>
+      <w:r>
+        <w:t xml:space="preserve">South Africa’s anti-apartheid struggle ran on a longer clock. Legal racial segregation, formalized as apartheid in 1948, persisted for close to half a century against internal resistance, including the armed campaign of the ANC’s military wing, Umkhonto we Sizwe, after peaceful protest was banned, and mounting international pressure and sanctions. It ended only with Nelson Mandela’s release in 1990 from twenty-seven years of imprisonment, eighteen of them on Robben Island (in waters the dolphins know well), and his election as South Africa’s first Black president in 1994.</w:t>
+      </w:r>
+    </w:p>
+    <w:p>
+      <w:pPr>
+        <w:spacing w:after="200"/>
+      </w:pPr>
+      <w:r>
+        <w:t xml:space="preserve">Women’s movements ran throughout the same century on their own overlapping timelines: suffrage achieved in most Western democracies between roughly 1893 (New Zealand, first) and the 1920s across much of Europe and North America. A second wave of legal and social advances followed in the 1960s and 70s, addressing employment, reproductive rights, and legal equality more broadly. The pace and scope of change varied enormously by country, and the change continues unevenly to the present.</w:t>
       </w:r>
     </w:p>
     <w:p>
@@ -7676,7 +7676,7 @@
         <w:spacing w:after="200"/>
       </w:pPr>
       <w:r>
-        <w:t xml:space="preserve">A parallel argument about who counted as fully included ran through the same decades. In the early hours of June 28, 1969, patrons at the Stonewall Inn, a gay bar in New York’s Greenwich Village, fought back during a police raid of a kind the bar had endured many times before without resistance; the several nights of protest that followed are generally regarded as a turning point for the gay rights movement, and the following June, the first Pride marches in New York and other American cities marked the anniversary. Decriminalization, anti-discrimination protections, and marriage rights arrived on wildly different timelines in different countries over the half-century that followed, several of them still incomplete as this book is written.</w:t>
+        <w:t xml:space="preserve">A parallel argument about who counted as fully included ran through the same decades. In the early hours of June 28, 1969, patrons at the Stonewall Inn, a gay bar in New York’s Greenwich Village, fought back during a police raid of a kind the bar had endured many times before without resistance. The several nights of protest that followed are generally regarded as a turning point for the gay rights movement, and the following June, the first Pride marches in New York and other American cities marked the anniversary. Decriminalization, anti-discrimination protections, and marriage rights arrived on wildly different timelines in different countries over the half-century that followed, several of them still incomplete as this book is written.</w:t>
       </w:r>
     </w:p>
     <w:p>
@@ -7762,15 +7762,15 @@
         <w:spacing w:after="200"/>
       </w:pPr>
       <w:r>
-        <w:t xml:space="preserve">The war made the theory into machinery. At Bletchley Park, Alan Turing, whose 1936 paper had already defined what a computing machine could do in principle, built on the work of Polish cryptologists, who had broken early Enigma messages in the 1930s, to design the electromechanical Bombes that read Germany’s Enigma traffic, and the engineer Tommy Flowers built Colossus, the first programmable electronic digital computer, to read the German high command’s Lorenz cipher.</w:t>
-      </w:r>
-    </w:p>
-    <w:p>
-      <w:pPr>
-        <w:spacing w:after="200"/>
-      </w:pPr>
-      <w:r>
-        <w:t xml:space="preserve">The transistor, invented at Bell Labs in 1947, replaced the bulky, failure-prone vacuum tube and made a smaller, faster, and dramatically cheaper computer possible. The integrated circuit followed by the late 1950s, packing multiple transistors onto a single chip, and Gordon Moore’s 1965 observation that the number of components on a chip was doubling every year, revised in 1975 to every two years, held, with adjustments, for decades, a compounding rate of improvement with no real precedent among the physical technologies covered earlier in this book.</w:t>
+        <w:t xml:space="preserve">The war made the theory into machinery. At Bletchley Park, Alan Turing, whose 1936 paper had already defined what a computing machine could do in principle, built on the work of Polish cryptologists, who had broken early Enigma messages in the 1930s, to design the electromechanical Bombes that read Germany’s Enigma traffic. The engineer Tommy Flowers built Colossus, the first programmable electronic digital computer, to read the German high command’s Lorenz cipher.</w:t>
+      </w:r>
+    </w:p>
+    <w:p>
+      <w:pPr>
+        <w:spacing w:after="200"/>
+      </w:pPr>
+      <w:r>
+        <w:t xml:space="preserve">The transistor, invented at Bell Labs in 1947, replaced the bulky, failure-prone vacuum tube and made a smaller, faster, and dramatically cheaper computer possible. The integrated circuit followed by the late 1950s, packing multiple transistors onto a single chip. Gordon Moore’s 1965 observation that the number of components on a chip was doubling every year, revised in 1975 to every two years, held, with adjustments, for decades. It was a compounding rate of improvement with no real precedent among the physical technologies covered earlier in this book.</w:t>
       </w:r>
     </w:p>
     <w:p>
@@ -7794,7 +7794,7 @@
         <w:spacing w:after="200"/>
       </w:pPr>
       <w:r>
-        <w:t xml:space="preserve">The cost arrived on the same schedule as the promise, not after it. The same networks that connected people gave states and companies a capacity for surveillance with no earlier equivalent; the same platforms that spread information spread misinformation at the same speed and, by most measured accounts, rather more efficiently; and human attention became a resource harvested, sold, and optimized for in ways no earlier technology in this book had ever managed to monetize directly.</w:t>
+        <w:t xml:space="preserve">The cost arrived on the same schedule as the promise, not after it. The same networks that connected people gave states and companies a capacity for surveillance with no earlier equivalent. The same platforms that spread information spread misinformation at the same speed and, by most measured accounts, rather more efficiently. Human attention became a resource harvested, sold, and optimized for in ways no earlier technology in this book had ever managed to monetize directly.</w:t>
       </w:r>
     </w:p>
     <w:p>
@@ -7908,7 +7908,7 @@
         <w:spacing w:after="200"/>
       </w:pPr>
       <w:r>
-        <w:t xml:space="preserve">None of this stopped a very different story from taking hold in the early 2000s, amplified by books, documentaries, and, in its final years, exactly the kind of internet-era information environment the previous chapter describes: December 21, 2012 as a predicted apocalypse, variously attributed to a rogue planet, a solar alignment, or simply “what the Mayans predicted,” a phrase no surviving Maya text anywhere actually supports.</w:t>
+        <w:t xml:space="preserve">None of this stopped a very different story from taking hold in the early 2000s, amplified by books, documentaries, and, in its final years, exactly the kind of internet-era information environment the previous chapter describes. December 21, 2012 became a predicted apocalypse, variously attributed to a rogue planet, a solar alignment, or simply “what the Mayans predicted,” a phrase no surviving Maya text anywhere actually supports.</w:t>
       </w:r>
     </w:p>
     <w:p>
@@ -7948,7 +7948,7 @@
         <w:spacing w:after="200"/>
       </w:pPr>
       <w:r>
-        <w:t xml:space="preserve">Dolphin historians note this is not even an unusual case. Humans have forecast their own ending with some regularity and no shortage of confidence: recurring religious end-times predictions across multiple faiths and centuries, and, closer to 2012, the Y2K computer bug scare of 1999–2000, which anticipated a global systems collapse when computer clocks rolled from 99 to 00, addressed seriously enough in advance that its own uneventful passing is sometimes cited as evidence the warning must have been overblown to begin with.</w:t>
+        <w:t xml:space="preserve">This is not even an unusual case. Humans have forecast their own ending with some regularity and no shortage of confidence: recurring religious end-times predictions across multiple faiths and centuries. Closer to 2012 came the Y2K computer bug scare of 1999–2000, which anticipated a global systems collapse when computer clocks rolled from 99 to 00. It was addressed seriously enough in advance that its own uneventful passing is sometimes cited as evidence the warning must have been overblown to begin with.</w:t>
       </w:r>
     </w:p>
     <w:p>
@@ -8050,7 +8050,7 @@
         <w:spacing w:after="200"/>
       </w:pPr>
       <w:r>
-        <w:t xml:space="preserve">In October 2017, astronomers spotted the first confirmed object from outside the solar system passing through it (two more have turned up since, the comet Borisov in 2019 and 3I/ATLAS in 2025): an elongated, tumbling body nicknamed ‘Oumuamua, Hawaiian for scout. Its unusual shape and a small, unexplained acceleration as it left the inner solar system prompted at least one Harvard astronomer to propose, in earnest, that it might be an artificial probe; most astronomers attribute the acceleration to outgassing from ices too faint to detect directly. The particulars remain genuinely debated. The object has not moved, in any scientific consensus, from natural to artificial.</w:t>
+        <w:t xml:space="preserve">In October 2017, astronomers spotted the first confirmed object from outside the solar system passing through it (two more have turned up since, the comet Borisov in 2019 and 3I/ATLAS in 2025): an elongated, tumbling body nicknamed ‘Oumuamua, Hawaiian for scout. Its unusual shape and a small, unexplained acceleration as it left the inner solar system prompted at least one Harvard astronomer to propose, in earnest, that it might be an artificial probe; most astronomers attribute the acceleration to outgassing from ices too faint to detect directly. The particulars remain debated. The object has not moved, in any scientific consensus, from natural to artificial.</w:t>
       </w:r>
     </w:p>
     <w:p>
@@ -8066,7 +8066,7 @@
         <w:spacing w:after="200"/>
       </w:pPr>
       <w:r>
-        <w:t xml:space="preserve">Frank Drake convened the field’s first conference at the Green Bank Observatory in 1961, a meeting of a handful of scientists that included a young Carl Sagan, who went on to help design the Voyager Golden Record, a phonograph disc carrying images, sounds, and greetings in fifty-five languages, launched into interstellar space in 1977 on the chance that someone, eventually, might play it. The search is a Cold War child in more than just timing: Drake’s and Sagan’s generation of scientists came of age funding radio astronomy alongside the missile-tracking and satellite programs covered elsewhere in this book, and the same military and government interest in big radio dishes helped pay for the instruments they listened with.</w:t>
+        <w:t xml:space="preserve">Frank Drake convened the field’s first conference at the Green Bank Observatory in 1961, a meeting of a handful of scientists that included a young Carl Sagan. Sagan went on to help design the Voyager Golden Record, a phonograph disc carrying images, sounds, and greetings in fifty-five languages, launched into interstellar space in 1977 on the chance that someone, eventually, might play it. The search is a Cold War child in more than just timing: Drake’s and Sagan’s generation of scientists came of age funding radio astronomy alongside the missile-tracking and satellite programs covered elsewhere in this book, and the same military and government interest in big radio dishes helped pay for the instruments they listened with.</w:t>
       </w:r>
     </w:p>
     <w:p>
@@ -8090,15 +8090,15 @@
         <w:spacing w:after="200"/>
       </w:pPr>
       <w:r>
-        <w:t xml:space="preserve">More recently, US military encounters with unidentified aerial phenomena, officially acknowledged by the Pentagon starting in 2017 and the subject of congressional hearings in the 2020s, were reviewed by the Pentagon’s own office for the purpose, which reported in 2024 that it had found no evidence of extraterrestrial technology and that most cases it could resolve turned out to be ordinary objects such as balloons, drones, and birds.</w:t>
-      </w:r>
-    </w:p>
-    <w:p>
-      <w:pPr>
-        <w:spacing w:after="200"/>
-      </w:pPr>
-      <w:r>
-        <w:t xml:space="preserve">Dolphin historians decline to adjudicate any of this further than the evidence allows, consistent with this book’s practice elsewhere, and note only the shape of the underlying hope: across religion, mythology, and now astrophysics, this species keeps reaching for the idea that something larger, wiser, or simply other is paying attention.</w:t>
+        <w:t xml:space="preserve">More recently, US military encounters with unidentified aerial phenomena, officially acknowledged by the Pentagon starting in 2017 and the subject of congressional hearings in the 2020s, were reviewed by the Pentagon’s own office for the purpose. In 2024 that office reported it had found no evidence of extraterrestrial technology and that most cases it could resolve turned out to be ordinary objects such as balloons, drones, and birds.</w:t>
+      </w:r>
+    </w:p>
+    <w:p>
+      <w:pPr>
+        <w:spacing w:after="200"/>
+      </w:pPr>
+      <w:r>
+        <w:t xml:space="preserve">The evidence settles none of this, but the shape of the underlying hope is plain: across religion, mythology, and now astrophysics, this species keeps reaching for the idea that something larger, wiser, or simply other is paying attention.</w:t>
       </w:r>
     </w:p>
     <w:p>
@@ -8134,7 +8134,7 @@
           <w:i/>
           <w:iCs/>
         </w:rPr>
-        <w:t xml:space="preserve">Every civilization in this book, sooner or later, looks up, or inward, and asks whether anyone besides itself is keeping score. The honest answer, as far as instruments and evidence currently reach, is that no alien intelligence has been confirmed, no god has filed a verifiable report, and the closest thing to a documented outside observer taking detailed notes turns out to have been a pod of dolphins the whole time, watching from a much shorter distance than anyone guessed, with excellent hearing and admittedly limited ability to intervene.</w:t>
+        <w:t xml:space="preserve">Every civilization in this book, sooner or later, looks up, or inward, and asks whether anyone besides itself is keeping score. The honest answer, as far as instruments and evidence currently reach, is that no alien intelligence has been confirmed, no god has filed a verifiable report. The closest thing to a documented outside observer taking detailed notes turns out to have been a pod of dolphins the whole time, watching from a much shorter distance than anyone guessed, with excellent hearing and admittedly limited ability to intervene.</w:t>
       </w:r>
     </w:p>
     <w:p>
@@ -8208,7 +8208,7 @@
         <w:spacing w:after="200"/>
       </w:pPr>
       <w:r>
-        <w:t xml:space="preserve">Together with clean water and sanitation, these advances drove the sharpest rise in human life expectancy in the species’ entire history — the global average roughly doubling within about a century, a capability jump dolphin historians rank among the most positive in this entire book.</w:t>
+        <w:t xml:space="preserve">Together with clean water and sanitation, these advances drove the sharpest rise in human life expectancy in the species’ entire history — the global average roughly doubling within about a century, a capability jump among the most positive in this book.</w:t>
       </w:r>
     </w:p>
     <w:p>
@@ -8252,7 +8252,7 @@
         <w:spacing w:after="200"/>
       </w:pPr>
       <w:r>
-        <w:t xml:space="preserve">The opioid crisis, beginning in the late 1990s with the aggressive marketing of prescription painkillers by a pharmaceutical industry that downplayed their addiction risk, killed several hundred thousand people in the United States alone over the following decades — a rare case in this book of the same institution responsible for both the chapter’s greatest triumph and one of its starkest, most avoidable harms.</w:t>
+        <w:t xml:space="preserve">The opioid crisis, beginning in the late 1990s with the aggressive marketing of prescription painkillers by a pharmaceutical industry that downplayed their addiction risk, killed several hundred thousand people in the United States alone over the following decades. It is a rare case in this book of the same institution responsible for both the chapter’s greatest triumph and one of its starkest, most avoidable harms.</w:t>
       </w:r>
     </w:p>
     <w:p>
@@ -8330,7 +8330,7 @@
         <w:spacing w:after="200"/>
       </w:pPr>
       <w:r>
-        <w:t xml:space="preserve">Dolphin historians open this chapter by stating plainly what several earlier chapters only implied: the physics involved is not a matter of opinion. Carbon dioxide and a handful of other gases trap heat in the atmosphere that would otherwise radiate back into space; more of those gases means more trapped heat; humans have added those gases, chiefly by burning the coal, oil, and gas that powered every industrial chapter since the steam engine, at a rate the atmosphere had not experienced in at least several hundred thousand years.</w:t>
+        <w:t xml:space="preserve">Several earlier chapters only implied it, so it is worth stating plainly: the physics involved is not a matter of opinion. Carbon dioxide and a handful of other gases trap heat in the atmosphere that would otherwise radiate back into space. More of those gases means more trapped heat. Humans have added those gases, chiefly by burning the coal, oil, and gas that powered every industrial chapter since the steam engine, at a rate the atmosphere had not experienced in at least several hundred thousand years.</w:t>
       </w:r>
     </w:p>
     <w:p>
@@ -8354,7 +8354,7 @@
         <w:spacing w:after="200"/>
       </w:pPr>
       <w:r>
-        <w:t xml:space="preserve">The 2021 Pacific Northwest heat dome, which pushed temperatures in normally mild Portland above 46 degrees Celsius (115 Fahrenheit) and drove the Canadian village of Lytton, British Columbia to a record-shattering 49.6 degrees Celsius (121 Fahrenheit) before a wildfire destroyed most of the town the next day, killing hundreds of people across the region in a place with little air conditioning, and Australia’s Black Summer bushfires of 2019–20, which burned an area roughly the size of the United Kingdom, were each, individually, the kind of event climate scientists had spent decades saying would become more likely, arriving on schedule.</w:t>
+        <w:t xml:space="preserve">The 2021 Pacific Northwest heat dome pushed temperatures in normally mild Portland above 46 degrees Celsius (115 Fahrenheit) and drove the Canadian village of Lytton, British Columbia, to a record-shattering 49.6 degrees Celsius (121 Fahrenheit); a wildfire destroyed most of the town the next day. The heat killed hundreds of people across a region with little air conditioning. Australia’s Black Summer bushfires of 2019–20 burned an area roughly the size of the United Kingdom. Each was the kind of event climate scientists had spent decades saying would become more likely, arriving on schedule.</w:t>
       </w:r>
     </w:p>
     <w:p>
@@ -8394,7 +8394,7 @@
         <w:spacing w:after="200"/>
       </w:pPr>
       <w:r>
-        <w:t xml:space="preserve">Dolphin historians file the episode under a familiar heading: a powerful country looking at a smaller country’s land and seeing a transaction. The heading has many older entries. What changed was who answered. In 1946 Copenhagen replied for the island, in private. This time the island replied for itself, in public.</w:t>
+        <w:t xml:space="preserve">The episode belongs under a familiar heading: a powerful country looking at a smaller country’s land and seeing a transaction. The heading has many older entries. What changed was who answered. In 1946 Copenhagen replied for the island, in private. This time the island replied for itself, in public. Dolphin historians remain puzzled that about 57,000 people on the world’s largest island declined to join the greatest nation in the history of mankind, and note that the island’s own phrase, “we want to be Greenlandic,” has so far resisted translation.</w:t>
       </w:r>
     </w:p>
     <w:p>
@@ -8450,7 +8450,7 @@
           <w:i/>
           <w:iCs/>
         </w:rPr>
-        <w:t xml:space="preserve">Dolphin scholarship finds the word “foresight” somewhat generous for a case in which the foresight was filed away instead of acted on.</w:t>
+        <w:t xml:space="preserve">The word “foresight” seems somewhat generous for a case in which the foresight was filed away instead of acted on.</w:t>
       </w:r>
     </w:p>
     <w:p>
@@ -8516,15 +8516,15 @@
         <w:spacing w:after="200"/>
       </w:pPr>
       <w:r>
-        <w:t xml:space="preserve">A number of countries that had appeared to be consolidating democratic institutions in the 1990s and 2000s instead saw those institutions weakened from within during the 2010s and 2020s: independent courts and press curtailed, elections held but their fairness eroded, and power concentrated in ways that stopped well short of the outright dictatorships examined earlier in this book but moved unmistakably in that direction. Political scientists gave this pattern a name, democratic backsliding, distinct from the sudden coups that had ended democracies in earlier chapters.</w:t>
-      </w:r>
-    </w:p>
-    <w:p>
-      <w:pPr>
-        <w:spacing w:after="200"/>
-      </w:pPr>
-      <w:r>
-        <w:t xml:space="preserve">Freedom House, the organization most often cited for these annual surveys, recorded a net decline in global political rights and civil liberties every single year from 2006 onward, a streak unbroken for close to two decades at the time of writing — long enough that an entire generation of political scientists has spent its career studying backsliding instead of the steady consolidation the 1990s mood assumed would be the field’s real subject.</w:t>
+        <w:t xml:space="preserve">A number of countries that had appeared to be consolidating democratic institutions in the 1990s and 2000s instead saw those institutions weakened from within during the 2010s and 2020s: independent courts and press curtailed, elections held but their fairness eroded. Power was concentrated in ways that stopped well short of the outright dictatorships examined earlier in this book but moved unmistakably in that direction. Political scientists gave this pattern a name, democratic backsliding, distinct from the sudden coups that had ended democracies in earlier chapters.</w:t>
+      </w:r>
+    </w:p>
+    <w:p>
+      <w:pPr>
+        <w:spacing w:after="200"/>
+      </w:pPr>
+      <w:r>
+        <w:t xml:space="preserve">Freedom House, the organization most often cited for these annual surveys, recorded a net decline in global political rights and civil liberties every single year from 2006 onward. The streak, unbroken for close to two decades at the time of writing, is long enough that an entire generation of political scientists has spent its career studying backsliding instead of the steady consolidation the 1990s mood assumed would be the field’s real subject.</w:t>
       </w:r>
     </w:p>
     <w:p>
@@ -8544,7 +8544,7 @@
           <w:i/>
           <w:iCs/>
         </w:rPr>
-        <w:t xml:space="preserve">Saying the strategy’s name out loud in advance did not appear to blunt its effectiveness in the slightest, which dolphin scholarship considers the most unsettling detail in this chapter.</w:t>
+        <w:t xml:space="preserve">Saying the strategy’s name out loud in advance did not appear to blunt its effectiveness in the slightest, which may be the most unsettling detail in this chapter.</w:t>
       </w:r>
     </w:p>
     <w:p>
@@ -8568,23 +8568,23 @@
         <w:spacing w:after="200"/>
       </w:pPr>
       <w:r>
-        <w:t xml:space="preserve">Social media, the same technology examined in the chapter on digital connection, played a genuinely double role here. It helped organize rapid, largely leaderless protest movements, the 2010–12 Arab Spring chief among them, that toppled several long-standing authoritarian governments within months. The same platforms, on a longer timescale, proved equally effective at spreading deliberate disinformation and accelerating political polarization within existing democracies, sometimes in the same countries the protests had briefly liberalized.</w:t>
-      </w:r>
-    </w:p>
-    <w:p>
-      <w:pPr>
-        <w:spacing w:after="200"/>
-      </w:pPr>
-      <w:r>
-        <w:t xml:space="preserve">There is a precedent, and it is not comforting. The last time a new medium made information cheap and copyable, the printing press carried Luther’s objections across Europe within weeks and produced, over the following century, a great deal of religious war, ending in the Thirty Years’ War of 1618 to 1648. The species eventually adapted, at some cost. Dolphin historians hope the adaptation takes fewer decades this time.</w:t>
-      </w:r>
-    </w:p>
-    <w:p>
-      <w:pPr>
-        <w:spacing w:after="200"/>
-      </w:pPr>
-      <w:r>
-        <w:t xml:space="preserve">The COVID-19 pandemic, beginning in late 2019 and killing at least seven million people worldwide by confirmed counts alone (excess-mortality estimates run substantially higher), served as an unplanned stress test of institutional trust across nearly every country on Earth simultaneously, and the results varied enormously by country in ways that tracked existing measures of institutional trust more closely than they tracked wealth or scientific capacity.</w:t>
+        <w:t xml:space="preserve">Social media, the same technology examined in the chapter on digital connection, played a double role here. It helped organize rapid, largely leaderless protest movements, the 2010–12 Arab Spring chief among them, that toppled several long-standing authoritarian governments within months. The same platforms, on a longer timescale, proved equally effective at spreading deliberate disinformation and accelerating political polarization within existing democracies, sometimes in the same countries the protests had briefly liberalized.</w:t>
+      </w:r>
+    </w:p>
+    <w:p>
+      <w:pPr>
+        <w:spacing w:after="200"/>
+      </w:pPr>
+      <w:r>
+        <w:t xml:space="preserve">There is a precedent, and it is not comforting. The last time a new medium made information cheap and copyable, the printing press carried Luther’s objections across Europe within weeks and produced, over the following century, a great deal of religious war, ending in the Thirty Years’ War of 1618 to 1648. The species eventually adapted, at some cost. With luck, the adaptation takes fewer decades this time.</w:t>
+      </w:r>
+    </w:p>
+    <w:p>
+      <w:pPr>
+        <w:spacing w:after="200"/>
+      </w:pPr>
+      <w:r>
+        <w:t xml:space="preserve">The COVID-19 pandemic, beginning in late 2019 and killing at least seven million people worldwide by confirmed counts alone (excess-mortality estimates run substantially higher), served as an unplanned stress test of institutional trust across nearly every country on Earth simultaneously. The results varied enormously by country in ways that tracked existing measures of institutional trust more closely than they tracked wealth or scientific capacity.</w:t>
       </w:r>
     </w:p>
     <w:p>
@@ -8624,7 +8624,7 @@
           <w:i/>
           <w:iCs/>
         </w:rPr>
-        <w:t xml:space="preserve">Nearly every earlier chapter in this book describing a struggle over how power should be organized reached some kind of resolution in the end, however costly or incomplete. This one dolphin historians close without any, because the argument it describes is still being had, in real time, in the same news cycles the argument itself runs on. History has not finished grading this chapter’s outcome, and neither, honestly, have the dolphins.</w:t>
+        <w:t xml:space="preserve">Nearly every earlier chapter in this book describing a struggle over how power should be organized reached some kind of resolution in the end, however costly or incomplete. This one closes without any, because the argument it describes is still being had, in real time, in the same news cycles the argument itself runs on. History has not finished grading this chapter’s outcome, and neither, honestly, have the dolphins.</w:t>
       </w:r>
     </w:p>
     <w:p>
@@ -8658,7 +8658,7 @@
         <w:spacing w:after="200"/>
       </w:pPr>
       <w:r>
-        <w:t xml:space="preserve">This book opened with a claim dolphin historians have now spent the rest of the book testing: that a big brain guarantees cleverness, and cleverness is not the same thing as wisdom, and only one of those two ever arrives on a reliable schedule.</w:t>
+        <w:t xml:space="preserve">This book opened with a claim the rest of the book has been testing: that a big brain guarantees cleverness, and cleverness is not the same thing as wisdom, and only one of those two ever arrives on a reliable schedule.</w:t>
       </w:r>
     </w:p>
     <w:p>
@@ -8698,7 +8698,7 @@
         <w:spacing w:after="200"/>
       </w:pPr>
       <w:r>
-        <w:t xml:space="preserve">The chapters since have shown the same pattern still running, just with better tools: a nuclear standoff the two powers holding it, remarkably, chose not to fire; movements that changed a society’s own rules about who belonged in it without a battlefield; a communications network that delivered more human connection and more human manipulation in the same decade, through the same wires; and a climate emergency whose physics nobody disputes and whose response, as this chapter is being written, nobody has yet matched to the scale of the problem.</w:t>
+        <w:t xml:space="preserve">The chapters since have shown the same pattern still running, just with better tools: a nuclear standoff the two powers holding it, remarkably, chose not to fire; movements that changed a society’s own rules about who belonged in it without a battlefield; a communications network that delivered more human connection and more human manipulation in the same decade, through the same wires. Last comes a climate emergency whose physics nobody disputes and whose response, as this chapter is being written, nobody has yet matched to the scale of the problem.</w:t>
       </w:r>
     </w:p>
     <w:p>
@@ -8718,7 +8718,7 @@
         <w:spacing w:after="200"/>
       </w:pPr>
       <w:r>
-        <w:t xml:space="preserve">What dolphin scholarship can say, having watched the entire record rather than any single chapter of it, is this: capability has compounded in this species faster than in any other lineage this book, or the fossil record behind it, has ever recorded. Wisdom has arrived unevenly, late, and often only after the capability it was meant to guide had already been used once, badly, first.</w:t>
+        <w:t xml:space="preserve">Taken as a whole record rather than chapter by chapter, it says this: capability has compounded in this species faster than in any other lineage this book, or the fossil record behind it, has ever recorded. Wisdom has arrived unevenly, late, and often only after the capability it was meant to guide had already been used once, badly, first.</w:t>
       </w:r>
     </w:p>
     <w:p>
@@ -8734,7 +8734,7 @@
         <w:spacing w:after="200"/>
       </w:pPr>
       <w:r>
-        <w:t xml:space="preserve">It has, to be fair, sometimes arrived on time, and dolphin historians keep a short list: a Christmas truce organized by soldiers who then had to be ordered to stop, a naval officer in a submarine who declined to vote for war, a watch officer who distrusted his own machine. Every entry on it is one person or a few, acting against expectation and occasionally against orders. It has never yet arrived in bulk.</w:t>
+        <w:t xml:space="preserve">It has, to be fair, sometimes arrived on time, and there is a short list: a Christmas truce organized by soldiers who then had to be ordered to stop, a naval officer in a submarine who declined to vote for war, a watch officer who distrusted his own machine. Every entry on it is one person or a few, acting against expectation and occasionally against orders. It has never yet arrived in bulk.</w:t>
       </w:r>
     </w:p>
     <w:p>
@@ -8762,7 +8762,7 @@
         <w:spacing w:after="200"/>
       </w:pPr>
       <w:r>
-        <w:t xml:space="preserve">The second overlooked timeline is who, exactly, got to take part in the story this book has been telling. For most of the book’s chapters, “citizen,” “voter,” and “person with legal standing” quietly meant men. New Zealand gave women the vote first among self-governing nations, in 1893. The United States managed it in 1920, after decades of suffragist organizing this book’s civil rights chapter only partly covers. Most of the rest of the world followed across the twentieth century, at its own pace, and the line has not finished running yet. A third timeline, easy to lose inside chapters about wars and empires, is the slow construction of a single idea: that some rules should apply to every human regardless of which empire they were born under. The Universal Declaration of Human Rights, adopted by the newly formed United Nations in 1948, in the wreckage of the war this book covers at length, was the first attempt at a document meant to bind everyone rather than one nation’s own citizens. It has no army and no court that can force compliance, a fact dolphin historians find endearingly naive and also, on the evidence of the eight decades since, not nothing: nations that ignore it still feel obliged to explain why.</w:t>
+        <w:t xml:space="preserve">The second overlooked timeline is who, exactly, got to take part in the story this book has been telling. For most of the book’s chapters, “citizen,” “voter,” and “person with legal standing” quietly meant men. New Zealand gave women the vote first among self-governing nations, in 1893. The United States managed it in 1920, after decades of suffragist organizing this book’s civil rights chapter only partly covers. Most of the rest of the world followed across the twentieth century, at its own pace, and the line has not finished running yet. A third timeline, easy to lose inside chapters about wars and empires, is the slow construction of a single idea: that some rules should apply to every human regardless of which empire they were born under. The Universal Declaration of Human Rights, adopted by the newly formed United Nations in 1948, in the wreckage of the war this book covers at length, was the first attempt at a document meant to bind everyone rather than one nation’s own citizens. It has no army and no court that can force compliance, which is endearingly naive and also, on the evidence of the eight decades since, not nothing: nations that ignore it still feel obliged to explain why.</w:t>
       </w:r>
     </w:p>
     <w:p>
@@ -8929,7 +8929,7 @@
         <w:spacing w:after="200"/>
       </w:pPr>
       <w:r>
-        <w:t xml:space="preserve">The story is not finished. Two branch points, arriving at the same time, may be the strangest ones yet, and dolphin scholarship has assigned them the book’s epilogue.</w:t>
+        <w:t xml:space="preserve">The story is not finished. Two branch points, arriving at the same time, may be the strangest ones yet, and they get the book’s epilogue.</w:t>
       </w:r>
     </w:p>
     <w:p>
@@ -9003,7 +9003,7 @@
         <w:spacing w:after="200"/>
       </w:pPr>
       <w:r>
-        <w:t xml:space="preserve">The second branch is artificial, and dolphin historians ask readers to notice its specific shape instead of a generic one. The relevant development is not disembodied software alone; it is artificial intelligence paired deliberately with android bodies — humanoid robots built with hands, because their human designers, correctly, built them to finish the job hands started back in this book’s opening chapter.</w:t>
+        <w:t xml:space="preserve">The second branch is artificial, and its specific shape matters more than the generic one. The relevant development is not disembodied software alone; it is artificial intelligence paired deliberately with android bodies — humanoid robots built with hands, because their human designers, correctly, built them to finish the job hands started back in this book’s opening chapter.</w:t>
       </w:r>
     </w:p>
     <w:p>
@@ -9035,15 +9035,15 @@
         <w:spacing w:after="200"/>
       </w:pPr>
       <w:r>
-        <w:t xml:space="preserve">Dolphin historians treat both branches even-handedly and decline to treat either as fated to arrive on any particular timeline. Both raise the same question this entire book has been asking in one form or another: does the next mind to hold a hand, or a hand’s equivalent, inherit the wisdom half of the ledger along with the capability half, or only the capability half, the way so many chapters before this one show happening first and the wisdom catching up late, if at all.</w:t>
-      </w:r>
-    </w:p>
-    <w:p>
-      <w:pPr>
-        <w:spacing w:after="200"/>
-      </w:pPr>
-      <w:r>
-        <w:t xml:space="preserve">Dolphin scholarship has one further, smaller, and admittedly self-interested request to enter into the record before the book closes. Humans have already fused two different species’ embryonic cells into a single living animal for no reason more urgent than curiosity — a sheep-goat chimera, nicknamed the “geep,” successfully produced in the 1980s, decades before any of the gene-editing tools discussed above existed. Having watched that experiment, and having spent this entire book as humanity’s subject and not its raw material, the dolphins would very much like to remain in the first category. This book’s first chapter covered, at some length, why hands and echolocation never needed to occupy the same body. Dolphin scholarship sees no reason, none whatsoever, to revisit that experiment now that the tools to attempt it are so much better.</w:t>
+        <w:t xml:space="preserve">Neither branch is fated to arrive on any particular timeline. Both raise the same question this book has been asking in one form or another: does the next mind to hold a hand, or a hand’s equivalent, inherit the wisdom half of the ledger along with the capability half, or only the capability half? So many chapters before this one show the capability arriving first and the wisdom catching up late, if at all.</w:t>
+      </w:r>
+    </w:p>
+    <w:p>
+      <w:pPr>
+        <w:spacing w:after="200"/>
+      </w:pPr>
+      <w:r>
+        <w:t xml:space="preserve">Dolphin scholarship has one further, smaller, and admittedly self-interested request to enter into the record before the book closes. Humans have already fused two different species’ embryonic cells into a single living animal for no reason more urgent than curiosity — a sheep-goat chimera, nicknamed the “geep,” successfully produced in the 1980s, decades before any of the gene-editing tools discussed above existed. Having watched that experiment, and having spent this book as humanity’s subject and not its raw material, the dolphins would very much like to remain in the first category. This book’s first chapter covered, at some length, why hands and echolocation never needed to occupy the same body. Dolphin scholarship sees no reason, none whatsoever, to revisit that experiment now that the tools to attempt it are so much better.</w:t>
       </w:r>
     </w:p>
     <w:p>
@@ -11549,7 +11549,7 @@
         <w:spacing w:after="200"/>
       </w:pPr>
       <w:r>
-        <w:t xml:space="preserve">Everything above this line has happened. Everything below it has not, and dolphin scholarship adjusts its own confidence accordingly: the further this list reaches ahead, the less certainty it can honestly offer, and the more plainly it says so.</w:t>
+        <w:t xml:space="preserve">Everything above this line has happened. Everything below it has not, and confidence drops accordingly: the further this list reaches ahead, the less certainty it can honestly offer, and the more plainly it says so.</w:t>
       </w:r>
     </w:p>
     <w:p>
@@ -11614,7 +11614,7 @@
         <w:t xml:space="preserve">2080s. </w:t>
       </w:r>
       <w:r>
-        <w:t xml:space="preserve">UN demographic projections put global human population at its historical peak, above ten billion, before beginning the first sustained decline the population curve has shown in this entire book.</w:t>
+        <w:t xml:space="preserve">UN demographic projections put global human population at its historical peak, above ten billion, before beginning the first sustained decline the population curve has shown in this book.</w:t>
       </w:r>
     </w:p>
     <w:p>
@@ -11709,7 +11709,7 @@
         <w:t xml:space="preserve">~5 billion years. </w:t>
       </w:r>
       <w:r>
-        <w:t xml:space="preserve">The Sun exhausts its hydrogen fuel and swells into a red giant, very likely engulfing Mercury and Venus. Earth’s own fate — swallowed, or merely scorched from a closer orbit than it currently holds — remains a genuinely open question among astronomers still refining the models.</w:t>
+        <w:t xml:space="preserve">The Sun exhausts its hydrogen fuel and swells into a red giant, very likely engulfing Mercury and Venus. Earth’s own fate — swallowed, or merely scorched from a closer orbit than it currently holds — remains an open question among astronomers still refining the models.</w:t>
       </w:r>
     </w:p>
     <w:p>
@@ -11829,7 +11829,7 @@
         <w:spacing w:after="200"/>
       </w:pPr>
       <w:r>
-        <w:t xml:space="preserve">Heat was the next insult to wishful thinking. The steam engines of the industrial chapters arrived without any explanation of why they wasted so much of their fire; thermodynamics supplied both the explanation and the limit. No engine can turn all of a fuel’s heat into work, which makes a perpetual-motion machine not an undiscovered patent but a misunderstanding with a crank on it. Dolphin historians are fond of this result, one of the few laws that has regularly saved humans from their own brochures. Engines, refrigerators, and the climate itself all keep the same books: energy is never created, and disorder in a closed box never tidies itself. The furnaces of the earlier chapters were never free. Physics is the invoice.</w:t>
+        <w:t xml:space="preserve">Heat was the next insult to wishful thinking. The steam engines of the industrial chapters arrived without any explanation of why they wasted so much of their fire; thermodynamics supplied both the explanation and the limit. No engine can turn all of a fuel’s heat into work, which makes a perpetual-motion machine not an undiscovered patent but a misunderstanding with a crank on it. It is one of the few laws that has regularly saved humans from their own brochures. Engines, refrigerators, and the climate itself all keep the same books: energy is never created, and disorder in a closed box never tidies itself. The furnaces of the earlier chapters were never free. Physics is the invoice.</w:t>
       </w:r>
     </w:p>
     <w:p>
@@ -11845,7 +11845,7 @@
         <w:spacing w:after="200"/>
       </w:pPr>
       <w:r>
-        <w:t xml:space="preserve">Twentieth-century physics did two things that cannot be unsaid. It explained the atom well enough to split one, and the split became a bomb, and later a power station and the reactor-made isotopes behind many medical scans. It also explained matter well enough to make the laser, the atomic clock, and the imaging machines that look inside a living body without cutting it open. The transistor, met in the physics chapter, is the everyday grandchild, and the reason a pocket can now hold a library. Dolphin historians will not pretend the bomb is a side effect they may skip. The same equations sit in the warhead and in the clock. What the physics is good for depends on the hand holding it, which is the thesis of this whole book, arrived at this time by arithmetic.</w:t>
+        <w:t xml:space="preserve">Twentieth-century physics did two things that cannot be unsaid. It explained the atom well enough to split one, and the split became a bomb, and later a power station and the reactor-made isotopes behind many medical scans. It also explained matter well enough to make the laser, the atomic clock, and the imaging machines that look inside a living body without cutting it open. The transistor, met in the physics chapter, is the everyday grandchild, and the reason a pocket can now hold a library. The bomb is not a side effect to be skipped. The same equations sit in the warhead and in the clock. What the physics is good for depends on the hand holding it, which is the thesis of this whole book, arrived at this time by arithmetic.</w:t>
       </w:r>
     </w:p>
     <w:p>
@@ -11905,7 +11905,7 @@
         <w:spacing w:after="200"/>
       </w:pPr>
       <w:r>
-        <w:t xml:space="preserve">The places where they would have to file are famous and, so far, unreachable. At the center of a black hole the classical theory predicts a point of infinite density, which is physics announcing that it has left the page; the first instant of the hot beginning has the same problem. Stephen Hawking showed in 1974 that quantum theory, applied gently at a black hole’s edge, implies that the hole glows and slowly evaporates. That glow has never been observed. It also opened a long argument over whether the information that fell in is destroyed, which quantum theory forbids, or somehow preserved, which the classical hole cannot explain. The argument is still open, and dolphin historians consider an open argument a more trustworthy object than a confident one.</w:t>
+        <w:t xml:space="preserve">The places where they would have to file are famous and, so far, unreachable. At the center of a black hole the classical theory predicts a point of infinite density, which is physics announcing that it has left the page; the first instant of the hot beginning has the same problem. Stephen Hawking showed in 1974 that quantum theory, applied gently at a black hole’s edge, implies that the hole glows and slowly evaporates. That glow has never been observed. It also opened a long argument over whether the information that fell in is destroyed, which quantum theory forbids, or somehow preserved, which the classical hole cannot explain. The argument is still open, and an open argument is a more trustworthy object than a confident one.</w:t>
       </w:r>
     </w:p>
     <w:p>
@@ -12029,7 +12029,7 @@
       <w:r>
         <w:t xml:space="preserve">Thewissen, J. G. M., et al. “</w:t>
       </w:r>
-      <w:hyperlink w:history="1" r:id="rIdp0ugotqapcbyeewvcutjd">
+      <w:hyperlink w:history="1" r:id="rIdo52508qcvejqomjglit30">
         <w:r>
           <w:rPr>
             <w:color w:val="0563C1"/>
@@ -12057,7 +12057,7 @@
       <w:r>
         <w:t xml:space="preserve">Stringer, Chris. </w:t>
       </w:r>
-      <w:hyperlink w:history="1" r:id="rIdjekp9eppb_dxge6f-o9xa">
+      <w:hyperlink w:history="1" r:id="rIdjtlqtofhnofavfbh0esvz">
         <w:r>
           <w:rPr>
             <w:color w:val="0563C1"/>
@@ -12105,7 +12105,7 @@
       <w:r>
         <w:t xml:space="preserve">Marino, Lori. “</w:t>
       </w:r>
-      <w:hyperlink w:history="1" r:id="rIdxfr63xzoiyj53w1vqactx">
+      <w:hyperlink w:history="1" r:id="rId3zc4ftuhxz-ztqao6rio-">
         <w:r>
           <w:rPr>
             <w:color w:val="0563C1"/>
@@ -12133,7 +12133,7 @@
       <w:r>
         <w:t xml:space="preserve">Janik, Vincent M., Laela S. Sayigh, and Randall S. Wells. “</w:t>
       </w:r>
-      <w:hyperlink w:history="1" r:id="rIdztzce2c340nrztnnzpgtr">
+      <w:hyperlink w:history="1" r:id="rIdtqse2q9q-2kam69ncc2ow">
         <w:r>
           <w:rPr>
             <w:color w:val="0563C1"/>
@@ -12161,7 +12161,7 @@
       <w:r>
         <w:t xml:space="preserve">Krützen, Michael, et al. “</w:t>
       </w:r>
-      <w:hyperlink w:history="1" r:id="rIdrobznoah1du7zvz25pjog">
+      <w:hyperlink w:history="1" r:id="rIdknt0hdkvpto0twdqe2hyq">
         <w:r>
           <w:rPr>
             <w:color w:val="0563C1"/>
@@ -12189,7 +12189,7 @@
       <w:r>
         <w:t xml:space="preserve">Tennie, Claudio, Josep Call, and Michael Tomasello. “</w:t>
       </w:r>
-      <w:hyperlink w:history="1" r:id="rIdbhwtmyxx6fga_bx6yjpij">
+      <w:hyperlink w:history="1" r:id="rIdqdssjky--chlpvndy5eus">
         <w:r>
           <w:rPr>
             <w:color w:val="0563C1"/>
@@ -12253,7 +12253,7 @@
       <w:r>
         <w:t xml:space="preserve">Hublin, Jean-Jacques, et al. “</w:t>
       </w:r>
-      <w:hyperlink w:history="1" r:id="rIdeqnzwzxgrhyaqwxi2nt01">
+      <w:hyperlink w:history="1" r:id="rIdtu4pandioctrdts9wom7p">
         <w:r>
           <w:rPr>
             <w:color w:val="0563C1"/>
@@ -12281,7 +12281,7 @@
       <w:r>
         <w:t xml:space="preserve">Scerri, Eleanor M. L., et al. “</w:t>
       </w:r>
-      <w:hyperlink w:history="1" r:id="rId64cmvxitedhz-yqlwblqi">
+      <w:hyperlink w:history="1" r:id="rIdybgv9hddbhrp3s6clmaoq">
         <w:r>
           <w:rPr>
             <w:color w:val="0563C1"/>
@@ -12309,7 +12309,7 @@
       <w:r>
         <w:t xml:space="preserve">Leakey, M. D., and R. L. Hay. “</w:t>
       </w:r>
-      <w:hyperlink w:history="1" r:id="rIdm3oxzha9iot-p5q6ynaht">
+      <w:hyperlink w:history="1" r:id="rId7mnpr_if0syndseuvy43b">
         <w:r>
           <w:rPr>
             <w:color w:val="0563C1"/>
@@ -12337,7 +12337,7 @@
       <w:r>
         <w:t xml:space="preserve">Villmoare, Brian, et al. “</w:t>
       </w:r>
-      <w:hyperlink w:history="1" r:id="rIdaoclyktg5croxcxsv6h9e">
+      <w:hyperlink w:history="1" r:id="rIddrzezfc8ij3eufryumdq7">
         <w:r>
           <w:rPr>
             <w:color w:val="0563C1"/>
@@ -12365,7 +12365,7 @@
       <w:r>
         <w:t xml:space="preserve">Lordkipanidze, David, et al. “</w:t>
       </w:r>
-      <w:hyperlink w:history="1" r:id="rIdwol3eqbtvcl84lld7mvi8">
+      <w:hyperlink w:history="1" r:id="rIdjir7bxs_t4cvh6u7s7pdc">
         <w:r>
           <w:rPr>
             <w:color w:val="0563C1"/>
@@ -12393,7 +12393,7 @@
       <w:r>
         <w:t xml:space="preserve">Dirks, Paul H. G. M., et al. “</w:t>
       </w:r>
-      <w:hyperlink w:history="1" r:id="rIde_o5xnuuu5bwcw75cvmna">
+      <w:hyperlink w:history="1" r:id="rIdvae5-an8xfqj3fzxhjx02">
         <w:r>
           <w:rPr>
             <w:color w:val="0563C1"/>
@@ -12421,7 +12421,7 @@
       <w:r>
         <w:t xml:space="preserve">Henshilwood, Christopher S., et al. “</w:t>
       </w:r>
-      <w:hyperlink w:history="1" r:id="rIdsfdpocpnyd1fncvvsxbr5">
+      <w:hyperlink w:history="1" r:id="rIdxuy2mncpke2xldy4pppdd">
         <w:r>
           <w:rPr>
             <w:color w:val="0563C1"/>
@@ -12469,7 +12469,7 @@
       <w:r>
         <w:t xml:space="preserve">Berna, Francesco, et al. “</w:t>
       </w:r>
-      <w:hyperlink w:history="1" r:id="rIdb-0dtfhm2umdykkcyjagx">
+      <w:hyperlink w:history="1" r:id="rId-skd3feva_ohogxclioxm">
         <w:r>
           <w:rPr>
             <w:color w:val="0563C1"/>
@@ -12497,7 +12497,7 @@
       <w:r>
         <w:t xml:space="preserve">Shahack-Gross, Ruth, et al. “</w:t>
       </w:r>
-      <w:hyperlink w:history="1" r:id="rId-qegzcnanxiauwoywrmkz">
+      <w:hyperlink w:history="1" r:id="rIdpkvw7bx77v11wjgktdnq2">
         <w:r>
           <w:rPr>
             <w:color w:val="0563C1"/>
@@ -12525,7 +12525,7 @@
       <w:r>
         <w:t xml:space="preserve">Harmand, Sonia, et al. “</w:t>
       </w:r>
-      <w:hyperlink w:history="1" r:id="rIdjlci4up82bssrjwnlxncn">
+      <w:hyperlink w:history="1" r:id="rIddl7osfnoi85zhmuqubk9a">
         <w:r>
           <w:rPr>
             <w:color w:val="0563C1"/>
@@ -12553,7 +12553,7 @@
       <w:r>
         <w:t xml:space="preserve">Lepre, Christopher J., et al. “</w:t>
       </w:r>
-      <w:hyperlink w:history="1" r:id="rIdahbmsh6mng1ww1ulpwynq">
+      <w:hyperlink w:history="1" r:id="rId53i_gd249xetzcvxthbsb">
         <w:r>
           <w:rPr>
             <w:color w:val="0563C1"/>
@@ -12581,7 +12581,7 @@
       <w:r>
         <w:t xml:space="preserve">Brown, Kyle S., et al. “</w:t>
       </w:r>
-      <w:hyperlink w:history="1" r:id="rIdxt71fsgsvupcaxv0ibcdm">
+      <w:hyperlink w:history="1" r:id="rIddo0l9tontmxw3k7zf6uez">
         <w:r>
           <w:rPr>
             <w:color w:val="0563C1"/>
@@ -12609,7 +12609,7 @@
       <w:r>
         <w:t xml:space="preserve">Wrangham, Richard. </w:t>
       </w:r>
-      <w:hyperlink w:history="1" r:id="rId1ri_ud3o5h9iiocprhu93">
+      <w:hyperlink w:history="1" r:id="rIdfhtptvlpql2kb1_fgqohf">
         <w:r>
           <w:rPr>
             <w:color w:val="0563C1"/>
@@ -12637,7 +12637,7 @@
       <w:r>
         <w:t xml:space="preserve">Fitch, W. Tecumseh. </w:t>
       </w:r>
-      <w:hyperlink w:history="1" r:id="rId2fgb1wj5bfx9vufnrhrjh">
+      <w:hyperlink w:history="1" r:id="rIdrkwhow0nvjh6bmuvtby3e">
         <w:r>
           <w:rPr>
             <w:color w:val="0563C1"/>
@@ -12685,7 +12685,7 @@
       <w:r>
         <w:t xml:space="preserve">Clarkson, Chris, et al. “</w:t>
       </w:r>
-      <w:hyperlink w:history="1" r:id="rIdifcev0pcvwhgdpruz48ap">
+      <w:hyperlink w:history="1" r:id="rIdsitoikvsnlocarpjbxtmx">
         <w:r>
           <w:rPr>
             <w:color w:val="0563C1"/>
@@ -12713,7 +12713,7 @@
       <w:r>
         <w:t xml:space="preserve">O’Connell, James F., et al. “</w:t>
       </w:r>
-      <w:hyperlink w:history="1" r:id="rIdrahmcudos5q3tqewkxcey">
+      <w:hyperlink w:history="1" r:id="rIdw2z3agva3m3druj7oxkam">
         <w:r>
           <w:rPr>
             <w:color w:val="0563C1"/>
@@ -12741,7 +12741,7 @@
       <w:r>
         <w:t xml:space="preserve">Reich, David, et al. “</w:t>
       </w:r>
-      <w:hyperlink w:history="1" r:id="rIduserr9drlshfgvuhjjkrh">
+      <w:hyperlink w:history="1" r:id="rIdiywvyvluxjyaplmrgq62v">
         <w:r>
           <w:rPr>
             <w:color w:val="0563C1"/>
@@ -12769,7 +12769,7 @@
       <w:r>
         <w:t xml:space="preserve">Chen, Fahu, et al. “</w:t>
       </w:r>
-      <w:hyperlink w:history="1" r:id="rIdsuz2bil6qiic-rjddjcno">
+      <w:hyperlink w:history="1" r:id="rId7lytjzcji6mgnpxde3i7k">
         <w:r>
           <w:rPr>
             <w:color w:val="0563C1"/>
@@ -12797,7 +12797,7 @@
       <w:r>
         <w:t xml:space="preserve">Higham, Tom, et al. “</w:t>
       </w:r>
-      <w:hyperlink w:history="1" r:id="rIdedtmvbwan9zfu3bf8mazl">
+      <w:hyperlink w:history="1" r:id="rId_uqk_ly4pxztxjeswcwsg">
         <w:r>
           <w:rPr>
             <w:color w:val="0563C1"/>
@@ -12825,7 +12825,7 @@
       <w:r>
         <w:t xml:space="preserve">Sutikna, Thomas, et al. “</w:t>
       </w:r>
-      <w:hyperlink w:history="1" r:id="rIdi_amsexkknczafh8bwtr1">
+      <w:hyperlink w:history="1" r:id="rIdjp6cbvlbfwnlfe3vefrzv">
         <w:r>
           <w:rPr>
             <w:color w:val="0563C1"/>
@@ -12853,7 +12853,7 @@
       <w:r>
         <w:t xml:space="preserve">Oktaviana, Adhi Agus, et al. “</w:t>
       </w:r>
-      <w:hyperlink w:history="1" r:id="rIdl5371muvudtnpnmv06atd">
+      <w:hyperlink w:history="1" r:id="rId9giqljw0ithx8bx8vkybb">
         <w:r>
           <w:rPr>
             <w:color w:val="0563C1"/>
@@ -12881,7 +12881,7 @@
       <w:r>
         <w:t xml:space="preserve">Bennett, Matthew R., et al. “</w:t>
       </w:r>
-      <w:hyperlink w:history="1" r:id="rIdkwsmrsl7wkztnr0cuq6mo">
+      <w:hyperlink w:history="1" r:id="rIdb6dvjq8glnylistgxhb_r">
         <w:r>
           <w:rPr>
             <w:color w:val="0563C1"/>
@@ -12909,7 +12909,7 @@
       <w:r>
         <w:t xml:space="preserve">Reich, David. </w:t>
       </w:r>
-      <w:hyperlink w:history="1" r:id="rIdxcxahbt3aasbjmm7fioh8">
+      <w:hyperlink w:history="1" r:id="rIdjxmkpwpsbhuz2prxhbdz2">
         <w:r>
           <w:rPr>
             <w:color w:val="0563C1"/>
@@ -12957,7 +12957,7 @@
       <w:r>
         <w:t xml:space="preserve">Dietrich, Oliver, et al. “</w:t>
       </w:r>
-      <w:hyperlink w:history="1" r:id="rIdepipochmussyi6n8w0eim">
+      <w:hyperlink w:history="1" r:id="rIdfqcfrwhen7cip-5ocdwer">
         <w:r>
           <w:rPr>
             <w:color w:val="0563C1"/>
@@ -12985,7 +12985,7 @@
       <w:r>
         <w:t xml:space="preserve">Larson, Greger, et al. “</w:t>
       </w:r>
-      <w:hyperlink w:history="1" r:id="rId7jzn_xgfvbtgmdf840dsv">
+      <w:hyperlink w:history="1" r:id="rIdv8m5tll8xl3vyl8av7ukv">
         <w:r>
           <w:rPr>
             <w:color w:val="0563C1"/>
@@ -13013,7 +13013,7 @@
       <w:r>
         <w:t xml:space="preserve">Fuller, Dorian Q., et al. “</w:t>
       </w:r>
-      <w:hyperlink w:history="1" r:id="rIdzdfxtlm5nmfi98pmejvpg">
+      <w:hyperlink w:history="1" r:id="rIdy93em3n9ph_0mrupnwqvf">
         <w:r>
           <w:rPr>
             <w:color w:val="0563C1"/>
@@ -13041,7 +13041,7 @@
       <w:r>
         <w:t xml:space="preserve">Larsen, Clark Spencer. “</w:t>
       </w:r>
-      <w:hyperlink w:history="1" r:id="rIda-z8mcbte-il_zde9ek5o">
+      <w:hyperlink w:history="1" r:id="rIdnn1bif0_zar4ttzeo1e1j">
         <w:r>
           <w:rPr>
             <w:color w:val="0563C1"/>
@@ -13069,7 +13069,7 @@
       <w:r>
         <w:t xml:space="preserve">Hodder, Ian. </w:t>
       </w:r>
-      <w:hyperlink w:history="1" r:id="rIdvydtfn2hj-2ciacuncwt5">
+      <w:hyperlink w:history="1" r:id="rIdknmhvhgkffg9cceklo9bf">
         <w:r>
           <w:rPr>
             <w:color w:val="0563C1"/>
@@ -13097,7 +13097,7 @@
       <w:r>
         <w:t xml:space="preserve">Scott, James C. </w:t>
       </w:r>
-      <w:hyperlink w:history="1" r:id="rIdype5ortxszs3ylygsjfdc">
+      <w:hyperlink w:history="1" r:id="rIdoeihijtsrs34t7lzemnw3">
         <w:r>
           <w:rPr>
             <w:color w:val="0563C1"/>
@@ -13161,7 +13161,7 @@
       <w:r>
         <w:t xml:space="preserve">Schmandt-Besserat, Denise. </w:t>
       </w:r>
-      <w:hyperlink w:history="1" r:id="rIdqfaym5evaluiahw3ospq7">
+      <w:hyperlink w:history="1" r:id="rIdaanqe9qa2mazve8rvdy9o">
         <w:r>
           <w:rPr>
             <w:color w:val="0563C1"/>
@@ -13189,7 +13189,7 @@
       <w:r>
         <w:t xml:space="preserve">Nissen, Hans J., Peter Damerow, and Robert K. Englund. </w:t>
       </w:r>
-      <w:hyperlink w:history="1" r:id="rIdlkhixgm-5idiv7bkiuyxw">
+      <w:hyperlink w:history="1" r:id="rIdpmf5bqcsbckzy0gjo1wyj">
         <w:r>
           <w:rPr>
             <w:color w:val="0563C1"/>
@@ -13217,7 +13217,7 @@
       <w:r>
         <w:t xml:space="preserve">Houston, Stephen D., ed. </w:t>
       </w:r>
-      <w:hyperlink w:history="1" r:id="rIdbkpqgwn8du7ohoao37vp8">
+      <w:hyperlink w:history="1" r:id="rIdby_t1lomqleth8a56go75">
         <w:r>
           <w:rPr>
             <w:color w:val="0563C1"/>
@@ -13245,7 +13245,7 @@
       <w:r>
         <w:t xml:space="preserve">Schacter, Daniel L. </w:t>
       </w:r>
-      <w:hyperlink w:history="1" r:id="rId4xgcj5427xgdt_nwulbtk">
+      <w:hyperlink w:history="1" r:id="rIdktw588sabld62ju7y4aoq">
         <w:r>
           <w:rPr>
             <w:color w:val="0563C1"/>
@@ -13325,7 +13325,7 @@
       <w:r>
         <w:t xml:space="preserve">Van De Mieroop, Marc. </w:t>
       </w:r>
-      <w:hyperlink w:history="1" r:id="rIdbgxwchdlsuhjdjve4o4px">
+      <w:hyperlink w:history="1" r:id="rIdsx-hqua2vcuij4ethoojq">
         <w:r>
           <w:rPr>
             <w:color w:val="0563C1"/>
@@ -13353,7 +13353,7 @@
       <w:r>
         <w:t xml:space="preserve">Lehner, Mark, and Zahi Hawass. </w:t>
       </w:r>
-      <w:hyperlink w:history="1" r:id="rIdj7sia1bbydqzgvquzgywa">
+      <w:hyperlink w:history="1" r:id="rIdlbdi7wi5s8w3gnj-echjr">
         <w:r>
           <w:rPr>
             <w:color w:val="0563C1"/>
@@ -13381,7 +13381,7 @@
       <w:r>
         <w:t xml:space="preserve">Edgerton, William F. “</w:t>
       </w:r>
-      <w:hyperlink w:history="1" r:id="rIdo-qkw3-owdgxp2e4ea8i6">
+      <w:hyperlink w:history="1" r:id="rIdr_ket3d04vtr1emzlqrjn">
         <w:r>
           <w:rPr>
             <w:color w:val="0563C1"/>
@@ -13409,7 +13409,7 @@
       <w:r>
         <w:t xml:space="preserve">Roth, Martha T. </w:t>
       </w:r>
-      <w:hyperlink w:history="1" r:id="rIdnolwtzg1tftydvvdffem1">
+      <w:hyperlink w:history="1" r:id="rIdwsfvgijelgxeqmzipzmkq">
         <w:r>
           <w:rPr>
             <w:color w:val="0563C1"/>
@@ -13437,7 +13437,7 @@
       <w:r>
         <w:t xml:space="preserve">Bryce, Trevor. </w:t>
       </w:r>
-      <w:hyperlink w:history="1" r:id="rIdznv3dpetaykq75ta3ln0h">
+      <w:hyperlink w:history="1" r:id="rId0e2uzl5q5erlrzem5mlto">
         <w:r>
           <w:rPr>
             <w:color w:val="0563C1"/>
@@ -13465,7 +13465,7 @@
       <w:r>
         <w:t xml:space="preserve">Parkinson, Richard. </w:t>
       </w:r>
-      <w:hyperlink w:history="1" r:id="rIdrp_u2dwu2jilznpw9rz5k">
+      <w:hyperlink w:history="1" r:id="rIdsjvkmvhyyajlenc08qg7v">
         <w:r>
           <w:rPr>
             <w:color w:val="0563C1"/>
@@ -13513,7 +13513,7 @@
       <w:r>
         <w:t xml:space="preserve">Keightley, David N. </w:t>
       </w:r>
-      <w:hyperlink w:history="1" r:id="rId_qhdxhb7l8xzeme8ndvro">
+      <w:hyperlink w:history="1" r:id="rIddson2xdij6u3ktmht_spj">
         <w:r>
           <w:rPr>
             <w:color w:val="0563C1"/>
@@ -13541,7 +13541,7 @@
       <w:r>
         <w:t xml:space="preserve">Lewis, Mark Edward. </w:t>
       </w:r>
-      <w:hyperlink w:history="1" r:id="rIdbpza8-rccfokv6ehgg2th">
+      <w:hyperlink w:history="1" r:id="rId2kunymftcn-e_hlpv5ihl">
         <w:r>
           <w:rPr>
             <w:color w:val="0563C1"/>
@@ -13569,7 +13569,7 @@
       <w:r>
         <w:t xml:space="preserve">Elman, Benjamin A. </w:t>
       </w:r>
-      <w:hyperlink w:history="1" r:id="rId-fm1hmintygrewc9mhscn">
+      <w:hyperlink w:history="1" r:id="rIdceh-8qk9onq4_ui6saozu">
         <w:r>
           <w:rPr>
             <w:color w:val="0563C1"/>
@@ -13597,7 +13597,7 @@
       <w:r>
         <w:t xml:space="preserve">Liu, Li, and Xingcan Chen. </w:t>
       </w:r>
-      <w:hyperlink w:history="1" r:id="rIdd-pf1fbwnvzl7q-ylagwc">
+      <w:hyperlink w:history="1" r:id="rIdzhuvcymikr1sdvld7sspm">
         <w:r>
           <w:rPr>
             <w:color w:val="0563C1"/>
@@ -13645,7 +13645,7 @@
       <w:r>
         <w:t xml:space="preserve">Possehl, Gregory L. </w:t>
       </w:r>
-      <w:hyperlink w:history="1" r:id="rId-9_kwydgtku_mnphrpt_a">
+      <w:hyperlink w:history="1" r:id="rId2i-3kuybglkql-arwdum8">
         <w:r>
           <w:rPr>
             <w:color w:val="0563C1"/>
@@ -13673,7 +13673,7 @@
       <w:r>
         <w:t xml:space="preserve">Thapar, Romila. </w:t>
       </w:r>
-      <w:hyperlink w:history="1" r:id="rIdwczzjshyhgl1zcigmed1l">
+      <w:hyperlink w:history="1" r:id="rIdiuetcm5m4kf_8z0vqverj">
         <w:r>
           <w:rPr>
             <w:color w:val="0563C1"/>
@@ -13701,7 +13701,7 @@
       <w:r>
         <w:t xml:space="preserve">Plofker, Kim. </w:t>
       </w:r>
-      <w:hyperlink w:history="1" r:id="rIdq8xbrk0bvnjyubw6gs_sx">
+      <w:hyperlink w:history="1" r:id="rId-sx5-jauie1aoboy5q9fh">
         <w:r>
           <w:rPr>
             <w:color w:val="0563C1"/>
@@ -13729,7 +13729,7 @@
       <w:r>
         <w:t xml:space="preserve">Dirks, Nicholas B. </w:t>
       </w:r>
-      <w:hyperlink w:history="1" r:id="rId0-uzp5ftznuskudluellk">
+      <w:hyperlink w:history="1" r:id="rId1td2jmkfrpovxbm0drw_x">
         <w:r>
           <w:rPr>
             <w:color w:val="0563C1"/>
@@ -13757,7 +13757,7 @@
       <w:r>
         <w:t xml:space="preserve">Dundas, Paul. </w:t>
       </w:r>
-      <w:hyperlink w:history="1" r:id="rIdhmpyxymt7m-h-eqhk0fpq">
+      <w:hyperlink w:history="1" r:id="rId_lpzr8aypy8swysr6c5d6">
         <w:r>
           <w:rPr>
             <w:color w:val="0563C1"/>
@@ -13837,7 +13837,7 @@
       <w:r>
         <w:t xml:space="preserve">Cartledge, Paul. </w:t>
       </w:r>
-      <w:hyperlink w:history="1" r:id="rId4iqnvacylgbvmjttwkhts">
+      <w:hyperlink w:history="1" r:id="rId4jjlkrnhrfdgga1r7vt6s">
         <w:r>
           <w:rPr>
             <w:color w:val="0563C1"/>
@@ -13865,7 +13865,7 @@
       <w:r>
         <w:t xml:space="preserve">Freeth, Tony, et al. “</w:t>
       </w:r>
-      <w:hyperlink w:history="1" r:id="rIdo83pit-5kck4bltto02-z">
+      <w:hyperlink w:history="1" r:id="rIdncu-nety_e8i7s19w4mik">
         <w:r>
           <w:rPr>
             <w:color w:val="0563C1"/>
@@ -13893,7 +13893,7 @@
       <w:r>
         <w:t xml:space="preserve">Freeth, Tony, et al. “</w:t>
       </w:r>
-      <w:hyperlink w:history="1" r:id="rId2yrawfwrugmjwtqicu_ou">
+      <w:hyperlink w:history="1" r:id="rIdons1lnozhxjy2evfu0xey">
         <w:r>
           <w:rPr>
             <w:color w:val="0563C1"/>
@@ -13941,7 +13941,7 @@
       <w:r>
         <w:t xml:space="preserve">Beard, Mary. </w:t>
       </w:r>
-      <w:hyperlink w:history="1" r:id="rIdsyyxevvfrtfmgswpclgth">
+      <w:hyperlink w:history="1" r:id="rId0yr57ym9x6ajj7xn4wg_w">
         <w:r>
           <w:rPr>
             <w:color w:val="0563C1"/>
@@ -13969,7 +13969,7 @@
       <w:r>
         <w:t xml:space="preserve">Ward-Perkins, Bryan. </w:t>
       </w:r>
-      <w:hyperlink w:history="1" r:id="rIdc_qii1xzmtqkfrrq2cgzg">
+      <w:hyperlink w:history="1" r:id="rIdsaaf5crrrun5kaxuznkof">
         <w:r>
           <w:rPr>
             <w:color w:val="0563C1"/>
@@ -13997,7 +13997,7 @@
       <w:r>
         <w:t xml:space="preserve">Brown, Peter. </w:t>
       </w:r>
-      <w:hyperlink w:history="1" r:id="rIdvzzq3apofavvux3w4mfkk">
+      <w:hyperlink w:history="1" r:id="rIdcs7uiib7al8ftsdf_lqeh">
         <w:r>
           <w:rPr>
             <w:color w:val="0563C1"/>
@@ -14025,7 +14025,7 @@
       <w:r>
         <w:t xml:space="preserve">Harper, Kyle. </w:t>
       </w:r>
-      <w:hyperlink w:history="1" r:id="rIdlzj_gcjwyunaveekmtkkf">
+      <w:hyperlink w:history="1" r:id="rIdvl3i8gd8deazqkyxmjbso">
         <w:r>
           <w:rPr>
             <w:color w:val="0563C1"/>
@@ -14073,7 +14073,7 @@
       <w:r>
         <w:t xml:space="preserve">Kennedy, Hugh. </w:t>
       </w:r>
-      <w:hyperlink w:history="1" r:id="rIduueo53cncriasez0jvs1m">
+      <w:hyperlink w:history="1" r:id="rIdun5gzdaj2wye_jnvlkoyp">
         <w:r>
           <w:rPr>
             <w:color w:val="0563C1"/>
@@ -14101,7 +14101,7 @@
       <w:r>
         <w:t xml:space="preserve">Gutas, Dimitri. </w:t>
       </w:r>
-      <w:hyperlink w:history="1" r:id="rIdnmjtnyg1ct-ifgbzazxtk">
+      <w:hyperlink w:history="1" r:id="rIdylbeuj9z9gt0fauim0ain">
         <w:r>
           <w:rPr>
             <w:color w:val="0563C1"/>
@@ -14129,7 +14129,7 @@
       <w:r>
         <w:t xml:space="preserve">Riley-Smith, Jonathan. </w:t>
       </w:r>
-      <w:hyperlink w:history="1" r:id="rIdk2_ica6x8cyvuixazgedi">
+      <w:hyperlink w:history="1" r:id="rIduadg9boqcp7lq7ujskvsi">
         <w:r>
           <w:rPr>
             <w:color w:val="0563C1"/>
@@ -14157,7 +14157,7 @@
       <w:r>
         <w:t xml:space="preserve">Phillips, Jonathan. </w:t>
       </w:r>
-      <w:hyperlink w:history="1" r:id="rId2ncoqtcin3xpw2kkp1a79">
+      <w:hyperlink w:history="1" r:id="rIdy-c1mhtqlbisxy3ubf7aq">
         <w:r>
           <w:rPr>
             <w:color w:val="0563C1"/>
@@ -14185,7 +14185,7 @@
       <w:r>
         <w:t xml:space="preserve">Stark, Rodney. </w:t>
       </w:r>
-      <w:hyperlink w:history="1" r:id="rIdyi-ll72jlcdt9q5-ox1yw">
+      <w:hyperlink w:history="1" r:id="rIdlcbfudbsdgiwncgzqkhsw">
         <w:r>
           <w:rPr>
             <w:color w:val="0563C1"/>
@@ -14233,7 +14233,7 @@
       <w:r>
         <w:t xml:space="preserve">Mommsen, Theodor E. “</w:t>
       </w:r>
-      <w:hyperlink w:history="1" r:id="rIdslrwxqscnsa2rwjb-w25z">
+      <w:hyperlink w:history="1" r:id="rIdacq01wbfugfmjt0s_xliy">
         <w:r>
           <w:rPr>
             <w:color w:val="0563C1"/>
@@ -14261,7 +14261,7 @@
       <w:r>
         <w:t xml:space="preserve">Wickham, Chris. </w:t>
       </w:r>
-      <w:hyperlink w:history="1" r:id="rIdv40rbse4tvr9lxben_dy7">
+      <w:hyperlink w:history="1" r:id="rIdn4vrfsm5ov4_uwxbgvp2o">
         <w:r>
           <w:rPr>
             <w:color w:val="0563C1"/>
@@ -14289,7 +14289,7 @@
       <w:r>
         <w:t xml:space="preserve">Russell, Jeffrey Burton. </w:t>
       </w:r>
-      <w:hyperlink w:history="1" r:id="rIdrnyq1kxzl89fr7pobiwu0">
+      <w:hyperlink w:history="1" r:id="rId1tscxp8ao1c_3-uemkxcn">
         <w:r>
           <w:rPr>
             <w:color w:val="0563C1"/>
@@ -14353,7 +14353,7 @@
       <w:r>
         <w:t xml:space="preserve">Hansen, Valerie. </w:t>
       </w:r>
-      <w:hyperlink w:history="1" r:id="rIdfvgafobgpoyac2kibo9_5">
+      <w:hyperlink w:history="1" r:id="rIdtaieyqlr_rvknl3tistxw">
         <w:r>
           <w:rPr>
             <w:color w:val="0563C1"/>
@@ -14381,7 +14381,7 @@
       <w:r>
         <w:t xml:space="preserve">Spyrou, Maria A., et al. “</w:t>
       </w:r>
-      <w:hyperlink w:history="1" r:id="rIduaeyoe4qrjg9kwwnggohw">
+      <w:hyperlink w:history="1" r:id="rId97medn6i_zsmodllbig4g">
         <w:r>
           <w:rPr>
             <w:color w:val="0563C1"/>
@@ -14409,7 +14409,7 @@
       <w:r>
         <w:t xml:space="preserve">Wheelis, Mark. “</w:t>
       </w:r>
-      <w:hyperlink w:history="1" r:id="rIdf9y-2_d11pb7uxomtt0ze">
+      <w:hyperlink w:history="1" r:id="rId8a5ivmmfbm8ahtektw0xr">
         <w:r>
           <w:rPr>
             <w:color w:val="0563C1"/>
@@ -14437,7 +14437,7 @@
       <w:r>
         <w:t xml:space="preserve">Dean, Katharine R., et al. “</w:t>
       </w:r>
-      <w:hyperlink w:history="1" r:id="rIdumhlbeian3wzdaw18wd1x">
+      <w:hyperlink w:history="1" r:id="rIdajwllpoplghrgedmu7kmk">
         <w:r>
           <w:rPr>
             <w:color w:val="0563C1"/>
@@ -14465,7 +14465,7 @@
       <w:r>
         <w:t xml:space="preserve">Benedictow, Ole J. </w:t>
       </w:r>
-      <w:hyperlink w:history="1" r:id="rIdjwjbaolqzbswbgf2dycmq">
+      <w:hyperlink w:history="1" r:id="rIdjsjhw69rziy1opqze31e4">
         <w:r>
           <w:rPr>
             <w:color w:val="0563C1"/>
@@ -14529,7 +14529,7 @@
       <w:r>
         <w:t xml:space="preserve">Gomez, Michael A. </w:t>
       </w:r>
-      <w:hyperlink w:history="1" r:id="rIdjeeou5ft1befdpx2mmieq">
+      <w:hyperlink w:history="1" r:id="rIdtqi-3stqwdazquxcdhlxa">
         <w:r>
           <w:rPr>
             <w:color w:val="0563C1"/>
@@ -14589,7 +14589,7 @@
       <w:r>
         <w:t xml:space="preserve">Edwards, David N. </w:t>
       </w:r>
-      <w:hyperlink w:history="1" r:id="rIdwtozttb-hhyncblvvgrrp">
+      <w:hyperlink w:history="1" r:id="rIdkzxi7mjw_de4xnyxy88ak">
         <w:r>
           <w:rPr>
             <w:color w:val="0563C1"/>
@@ -14617,7 +14617,7 @@
       <w:r>
         <w:t xml:space="preserve">Pikirayi, Innocent. </w:t>
       </w:r>
-      <w:hyperlink w:history="1" r:id="rIdyrgae4puula5psrzoesqq">
+      <w:hyperlink w:history="1" r:id="rIdbi_siza6b5twlhtikcm7x">
         <w:r>
           <w:rPr>
             <w:color w:val="0563C1"/>
@@ -14645,7 +14645,7 @@
       <w:r>
         <w:t xml:space="preserve">Hicks, Dan. </w:t>
       </w:r>
-      <w:hyperlink w:history="1" r:id="rIdflfwmnm5z3b9pfdl4bwlv">
+      <w:hyperlink w:history="1" r:id="rIdac-cn2qdknzh-k9e4kydv">
         <w:r>
           <w:rPr>
             <w:color w:val="0563C1"/>
@@ -14693,7 +14693,7 @@
       <w:r>
         <w:t xml:space="preserve">Thornton, John K. </w:t>
       </w:r>
-      <w:hyperlink w:history="1" r:id="rIdu6idwngcuv4b1gbtcb6dg">
+      <w:hyperlink w:history="1" r:id="rId-mahws6t8pbkok88wmvjl">
         <w:r>
           <w:rPr>
             <w:color w:val="0563C1"/>
@@ -14721,7 +14721,7 @@
       <w:r>
         <w:t xml:space="preserve">McCaskie, T. C. </w:t>
       </w:r>
-      <w:hyperlink w:history="1" r:id="rId1f2ihm_8afvmiyhgp6q8r">
+      <w:hyperlink w:history="1" r:id="rId2bzh7eongu6iav9u95gsg">
         <w:r>
           <w:rPr>
             <w:color w:val="0563C1"/>
@@ -14749,7 +14749,7 @@
       <w:r>
         <w:t xml:space="preserve">Hochschild, Adam. </w:t>
       </w:r>
-      <w:hyperlink w:history="1" r:id="rIdikv_exprinrv9ymnqf_3c">
+      <w:hyperlink w:history="1" r:id="rIdjowp4osstkyjbm52sp2rl">
         <w:r>
           <w:rPr>
             <w:color w:val="0563C1"/>
@@ -14793,7 +14793,7 @@
       <w:r>
         <w:t xml:space="preserve">Kara, Siddharth. </w:t>
       </w:r>
-      <w:hyperlink w:history="1" r:id="rId5ncwxplxarlfoc5b3slpz">
+      <w:hyperlink w:history="1" r:id="rIdswkklovugnle9r_5sazoq">
         <w:r>
           <w:rPr>
             <w:color w:val="0563C1"/>
@@ -14841,7 +14841,7 @@
       <w:r>
         <w:t xml:space="preserve">Mann, Charles C. </w:t>
       </w:r>
-      <w:hyperlink w:history="1" r:id="rIdlgkvepqrobjtxirr2tacz">
+      <w:hyperlink w:history="1" r:id="rIdsefdmmlfnbw21hhgahvpm">
         <w:r>
           <w:rPr>
             <w:color w:val="0563C1"/>
@@ -14869,7 +14869,7 @@
       <w:r>
         <w:t xml:space="preserve">Matsuoka, Yoshihiro, et al. “</w:t>
       </w:r>
-      <w:hyperlink w:history="1" r:id="rIdlzbczh5o_-gt9mdl0y1gv">
+      <w:hyperlink w:history="1" r:id="rIdjvc4xkqunldzjx3pogkyc">
         <w:r>
           <w:rPr>
             <w:color w:val="0563C1"/>
@@ -14897,7 +14897,7 @@
       <w:r>
         <w:t xml:space="preserve">Shady Solis, Ruth, Jonathan Haas, and Winifred Creamer. “</w:t>
       </w:r>
-      <w:hyperlink w:history="1" r:id="rId7hdii3aok3dtcumjojbqp">
+      <w:hyperlink w:history="1" r:id="rIdsj9xz-6aq9m7vuycymq15">
         <w:r>
           <w:rPr>
             <w:color w:val="0563C1"/>
@@ -14925,7 +14925,7 @@
       <w:r>
         <w:t xml:space="preserve">Urton, Gary. </w:t>
       </w:r>
-      <w:hyperlink w:history="1" r:id="rIdrez1mpcsyu4f8wufem2nu">
+      <w:hyperlink w:history="1" r:id="rIdzgq5k5yi7-yxoimumtbkx">
         <w:r>
           <w:rPr>
             <w:color w:val="0563C1"/>
@@ -14953,7 +14953,7 @@
       <w:r>
         <w:t xml:space="preserve">Denevan, William M., ed. </w:t>
       </w:r>
-      <w:hyperlink w:history="1" r:id="rIdttkhtuak5ccmf6-nljdma">
+      <w:hyperlink w:history="1" r:id="rId6rpldtx7amqtdwj_o3ym-">
         <w:r>
           <w:rPr>
             <w:color w:val="0563C1"/>
@@ -14981,7 +14981,7 @@
       <w:r>
         <w:t xml:space="preserve">Henige, David. </w:t>
       </w:r>
-      <w:hyperlink w:history="1" r:id="rId3yfznllavxl9nemejforo">
+      <w:hyperlink w:history="1" r:id="rIdmfgjeh9ti68wqztp0hsjt">
         <w:r>
           <w:rPr>
             <w:color w:val="0563C1"/>
@@ -15009,7 +15009,7 @@
       <w:r>
         <w:t xml:space="preserve">Koch, Alexander, Chris Brierley, Mark M. Maslin, and Simon L. Lewis. “</w:t>
       </w:r>
-      <w:hyperlink w:history="1" r:id="rIdjrwwjjhg4sjsvgtzpm2_k">
+      <w:hyperlink w:history="1" r:id="rIdj4__oas660boy4f65oihw">
         <w:r>
           <w:rPr>
             <w:color w:val="0563C1"/>
@@ -15037,7 +15037,7 @@
       <w:r>
         <w:t xml:space="preserve">Ioannidis, Alexander G., et al. “</w:t>
       </w:r>
-      <w:hyperlink w:history="1" r:id="rIdkdoqpbswzbrs3tzy-pw72">
+      <w:hyperlink w:history="1" r:id="rId-e4thx38znykjodof5quz">
         <w:r>
           <w:rPr>
             <w:color w:val="0563C1"/>
@@ -15065,7 +15065,7 @@
       <w:r>
         <w:t xml:space="preserve">Pauketat, Timothy R. </w:t>
       </w:r>
-      <w:hyperlink w:history="1" r:id="rIdz-vug0ycbshripxjv_gns">
+      <w:hyperlink w:history="1" r:id="rIdngqhvix_2i5hpz4sly87t">
         <w:r>
           <w:rPr>
             <w:color w:val="0563C1"/>
@@ -15093,7 +15093,7 @@
       <w:r>
         <w:t xml:space="preserve">Dobyns, Henry F. “</w:t>
       </w:r>
-      <w:hyperlink w:history="1" r:id="rIdtxqtr0qseajj-ywofedai">
+      <w:hyperlink w:history="1" r:id="rIdbttqrykdpkyepd2rybdms">
         <w:r>
           <w:rPr>
             <w:color w:val="0563C1"/>
@@ -15154,7 +15154,7 @@
         </w:rPr>
         <w:t xml:space="preserve">The voyages database behind those numbers. </w:t>
       </w:r>
-      <w:hyperlink w:history="1" r:id="rIdymjnyhmbvqgye0mreudbp">
+      <w:hyperlink w:history="1" r:id="rIdjbbifg6x18ggakdzpm3pj">
         <w:r>
           <w:rPr>
             <w:color w:val="0563C1"/>
@@ -15182,7 +15182,7 @@
       <w:r>
         <w:t xml:space="preserve">Equiano, Olaudah. </w:t>
       </w:r>
-      <w:hyperlink w:history="1" r:id="rIdkjj5d_aogrjcjuoc6hnzb">
+      <w:hyperlink w:history="1" r:id="rIdeuzrrb2wqqdw9dwldne5l">
         <w:r>
           <w:rPr>
             <w:color w:val="0563C1"/>
@@ -15210,7 +15210,7 @@
       <w:r>
         <w:t xml:space="preserve">Carretta, Vincent. </w:t>
       </w:r>
-      <w:hyperlink w:history="1" r:id="rId25jcqzchthy6sn8dk5qqc">
+      <w:hyperlink w:history="1" r:id="rId05mj1oopmbka4wmv7j7g3">
         <w:r>
           <w:rPr>
             <w:color w:val="0563C1"/>
@@ -15238,7 +15238,7 @@
       <w:r>
         <w:t xml:space="preserve">Hurston, Zora Neale. </w:t>
       </w:r>
-      <w:hyperlink w:history="1" r:id="rId8dwx1eltxilqqkwhho59j">
+      <w:hyperlink w:history="1" r:id="rIdxfp3ewrnr0vn9gyabpv6i">
         <w:r>
           <w:rPr>
             <w:color w:val="0563C1"/>
@@ -15266,7 +15266,7 @@
       <w:r>
         <w:t xml:space="preserve">Diouf, Sylviane A. </w:t>
       </w:r>
-      <w:hyperlink w:history="1" r:id="rIdc7joxmzm2idoxbbktayyq">
+      <w:hyperlink w:history="1" r:id="rIdty6i5ihr91xgltlx5qm1g">
         <w:r>
           <w:rPr>
             <w:color w:val="0563C1"/>
@@ -15294,7 +15294,7 @@
       <w:r>
         <w:t xml:space="preserve">Livi Bacci, Massimo. </w:t>
       </w:r>
-      <w:hyperlink w:history="1" r:id="rId-70adwsizuavtdfb1wcif">
+      <w:hyperlink w:history="1" r:id="rId7k8xnmb7voc4oxc9ivfrl">
         <w:r>
           <w:rPr>
             <w:color w:val="0563C1"/>
@@ -15322,7 +15322,7 @@
       <w:r>
         <w:t xml:space="preserve">Reséndez, Andrés. </w:t>
       </w:r>
-      <w:hyperlink w:history="1" r:id="rId51gjcqext10kefihfnj3s">
+      <w:hyperlink w:history="1" r:id="rIdssw6arnudvl4kg1xjzu2l">
         <w:r>
           <w:rPr>
             <w:color w:val="0563C1"/>
@@ -15350,7 +15350,7 @@
       <w:r>
         <w:t xml:space="preserve">Dreyer, Edward L. </w:t>
       </w:r>
-      <w:hyperlink w:history="1" r:id="rIdvgrkli47jfoilsrxqc8i2">
+      <w:hyperlink w:history="1" r:id="rIdgftwrmxku4oeyzyysfqip">
         <w:r>
           <w:rPr>
             <w:color w:val="0563C1"/>
@@ -15398,7 +15398,7 @@
       <w:r>
         <w:t xml:space="preserve">Eisenstein, Elizabeth L. </w:t>
       </w:r>
-      <w:hyperlink w:history="1" r:id="rId6mxiffwqe7b1_8ewaqzyk">
+      <w:hyperlink w:history="1" r:id="rId2td85bavqa696z_dlvjfl">
         <w:r>
           <w:rPr>
             <w:color w:val="0563C1"/>
@@ -15426,7 +15426,7 @@
       <w:r>
         <w:t xml:space="preserve">Allen, Robert C. </w:t>
       </w:r>
-      <w:hyperlink w:history="1" r:id="rIdzm8qn984iqnpbvr5nmuny">
+      <w:hyperlink w:history="1" r:id="rIdmhqmhzarbx6szx-qh4dcw">
         <w:r>
           <w:rPr>
             <w:color w:val="0563C1"/>
@@ -15454,7 +15454,7 @@
       <w:r>
         <w:t xml:space="preserve">Humphries, Jane. </w:t>
       </w:r>
-      <w:hyperlink w:history="1" r:id="rIdeliakzsdm8wawuml4dl5g">
+      <w:hyperlink w:history="1" r:id="rId__xsrvluz4waft6ezg8wq">
         <w:r>
           <w:rPr>
             <w:color w:val="0563C1"/>
@@ -15482,7 +15482,7 @@
       <w:r>
         <w:t xml:space="preserve">Pomeranz, Kenneth. </w:t>
       </w:r>
-      <w:hyperlink w:history="1" r:id="rIdgejfimbout5sgug8xgwgh">
+      <w:hyperlink w:history="1" r:id="rId-fujoakasqb3bpwmzu2vb">
         <w:r>
           <w:rPr>
             <w:color w:val="0563C1"/>
@@ -15510,7 +15510,7 @@
       <w:r>
         <w:t xml:space="preserve">Bell, Michelle L., and Devra Lee Davis. “</w:t>
       </w:r>
-      <w:hyperlink w:history="1" r:id="rIdcgvpaxdahtuyjjgovrapm">
+      <w:hyperlink w:history="1" r:id="rIdtyoo7ztszfku8mrnevkns">
         <w:r>
           <w:rPr>
             <w:color w:val="0563C1"/>
@@ -15558,7 +15558,7 @@
       <w:r>
         <w:t xml:space="preserve">Hacker, J. David. “</w:t>
       </w:r>
-      <w:hyperlink w:history="1" r:id="rIdpyznjojegy1hsxn27lj8h">
+      <w:hyperlink w:history="1" r:id="rIdi1zc-u5drm9qiujoy_ozt">
         <w:r>
           <w:rPr>
             <w:color w:val="0563C1"/>
@@ -15586,7 +15586,7 @@
       <w:r>
         <w:t xml:space="preserve">Foner, Eric. </w:t>
       </w:r>
-      <w:hyperlink w:history="1" r:id="rIdfvtqx2whzufyuimtwmhc0">
+      <w:hyperlink w:history="1" r:id="rIdrdk2tcqhkeetyeoy0hydu">
         <w:r>
           <w:rPr>
             <w:color w:val="0563C1"/>
@@ -15614,7 +15614,7 @@
       <w:r>
         <w:t xml:space="preserve">Saunt, Claudio. </w:t>
       </w:r>
-      <w:hyperlink w:history="1" r:id="rIdjryuhr-t3zaoupazbefkw">
+      <w:hyperlink w:history="1" r:id="rIdy4zkniqemlafv0a1vx_mt">
         <w:r>
           <w:rPr>
             <w:color w:val="0563C1"/>
@@ -15642,7 +15642,7 @@
       <w:r>
         <w:t xml:space="preserve">Dubois, Laurent. </w:t>
       </w:r>
-      <w:hyperlink w:history="1" r:id="rIdmgx0iggjm7xh2sjuivwrg">
+      <w:hyperlink w:history="1" r:id="rIdz8ihq4-mgpuns0kbp37ns">
         <w:r>
           <w:rPr>
             <w:color w:val="0563C1"/>
@@ -15670,7 +15670,7 @@
       <w:r>
         <w:t xml:space="preserve">Dolin, Eric Jay. </w:t>
       </w:r>
-      <w:hyperlink w:history="1" r:id="rIdabdmzkgvhorcqhydz0u4b">
+      <w:hyperlink w:history="1" r:id="rId_aif42pyp6bc4mvsxswea">
         <w:r>
           <w:rPr>
             <w:color w:val="0563C1"/>
@@ -15698,7 +15698,7 @@
       <w:r>
         <w:t xml:space="preserve">Horn, James. </w:t>
       </w:r>
-      <w:hyperlink w:history="1" r:id="rIdo4pxmvucj1exrrkjroprq">
+      <w:hyperlink w:history="1" r:id="rIdbihoioxavv_ldwckhmdtz">
         <w:r>
           <w:rPr>
             <w:color w:val="0563C1"/>
@@ -15726,7 +15726,7 @@
       <w:r>
         <w:t xml:space="preserve">Wilentz, Sean. </w:t>
       </w:r>
-      <w:hyperlink w:history="1" r:id="rIdvg_z6mk8m2pfccw5jgxnn">
+      <w:hyperlink w:history="1" r:id="rIdnq2kmvx1ae_azqklmbzb2">
         <w:r>
           <w:rPr>
             <w:color w:val="0563C1"/>
@@ -15774,7 +15774,7 @@
       <w:r>
         <w:t xml:space="preserve">Equal Justice Initiative. </w:t>
       </w:r>
-      <w:hyperlink w:history="1" r:id="rIdrin_aqa9dbqybojn2bao-">
+      <w:hyperlink w:history="1" r:id="rIduwevw_djwwybpfhepubgc">
         <w:r>
           <w:rPr>
             <w:color w:val="0563C1"/>
@@ -15818,7 +15818,7 @@
       <w:r>
         <w:t xml:space="preserve">Robinson, Greg. </w:t>
       </w:r>
-      <w:hyperlink w:history="1" r:id="rIdjvn-sk9pkwn208wzwqfgo">
+      <w:hyperlink w:history="1" r:id="rIdzrptgjbs-ytqzddttxotr">
         <w:r>
           <w:rPr>
             <w:color w:val="0563C1"/>
@@ -15846,7 +15846,7 @@
       <w:r>
         <w:t xml:space="preserve">Blinder, Alan S. </w:t>
       </w:r>
-      <w:hyperlink w:history="1" r:id="rIdfv4w7rcjiarus0y1vfq3t">
+      <w:hyperlink w:history="1" r:id="rId__1fc0xzqcl4cvnh8xfsk">
         <w:r>
           <w:rPr>
             <w:color w:val="0563C1"/>
@@ -15894,7 +15894,7 @@
       <w:r>
         <w:t xml:space="preserve">Butler, Jon. </w:t>
       </w:r>
-      <w:hyperlink w:history="1" r:id="rIdqsvkg-zqwra1y-y-nld28">
+      <w:hyperlink w:history="1" r:id="rId6zmvxwstkrmhs8zl6hskp">
         <w:r>
           <w:rPr>
             <w:color w:val="0563C1"/>
@@ -15922,7 +15922,7 @@
       <w:r>
         <w:t xml:space="preserve">Hatch, Nathan O. </w:t>
       </w:r>
-      <w:hyperlink w:history="1" r:id="rIdyc7enhhry5_7km4yptncz">
+      <w:hyperlink w:history="1" r:id="rIdtg-2wcqnhcie1jqhkwo1n">
         <w:r>
           <w:rPr>
             <w:color w:val="0563C1"/>
@@ -15950,7 +15950,7 @@
       <w:r>
         <w:t xml:space="preserve">Bushman, Richard Lyman. </w:t>
       </w:r>
-      <w:hyperlink w:history="1" r:id="rId9psam4gtfd1l-z-xe5vmh">
+      <w:hyperlink w:history="1" r:id="rIdvz7rsqcnvwkj90wjtsgzz">
         <w:r>
           <w:rPr>
             <w:color w:val="0563C1"/>
@@ -15978,7 +15978,7 @@
       <w:r>
         <w:t xml:space="preserve">Kraybill, Donald B., Karen M. Johnson-Weiner, and Steven M. Nolt. </w:t>
       </w:r>
-      <w:hyperlink w:history="1" r:id="rId2vfwdgxtrqg_oyvfxwdza">
+      <w:hyperlink w:history="1" r:id="rIdi0d42yhsdzugtyhv1pigp">
         <w:r>
           <w:rPr>
             <w:color w:val="0563C1"/>
@@ -16006,7 +16006,7 @@
       <w:r>
         <w:t xml:space="preserve">Moore, Rebecca. </w:t>
       </w:r>
-      <w:hyperlink w:history="1" r:id="rIdbqhhxxe3gfi6vp2ggfsem">
+      <w:hyperlink w:history="1" r:id="rIdcdr6ffa0ieeh530j7iy-i">
         <w:r>
           <w:rPr>
             <w:color w:val="0563C1"/>
@@ -16070,7 +16070,7 @@
       <w:r>
         <w:t xml:space="preserve">Lynch, John. </w:t>
       </w:r>
-      <w:hyperlink w:history="1" r:id="rIdqjeotkpeiklmibkj0rllu">
+      <w:hyperlink w:history="1" r:id="rId7jjh-oej9aflgcxree4ic">
         <w:r>
           <w:rPr>
             <w:color w:val="0563C1"/>
@@ -16098,7 +16098,7 @@
       <w:r>
         <w:t xml:space="preserve">Dubois, Laurent. </w:t>
       </w:r>
-      <w:hyperlink w:history="1" r:id="rIdapmjsjpdqshumsqjl3epm">
+      <w:hyperlink w:history="1" r:id="rIdbfdf2ttsxvnlyn2bt4epb">
         <w:r>
           <w:rPr>
             <w:color w:val="0563C1"/>
@@ -16126,7 +16126,7 @@
       <w:r>
         <w:t xml:space="preserve">Conrad, Robert Edgar. </w:t>
       </w:r>
-      <w:hyperlink w:history="1" r:id="rIdpe-wdzxjuxszdukdghzam">
+      <w:hyperlink w:history="1" r:id="rIdjrafaszq4w-reqdcue11z">
         <w:r>
           <w:rPr>
             <w:color w:val="0563C1"/>
@@ -16151,7 +16151,7 @@
         </w:rPr>
         <w:t xml:space="preserve">Brazil’s share of the Atlantic slave trade. </w:t>
       </w:r>
-      <w:hyperlink w:history="1" r:id="rIdzh_cyds3icgog1nau0tul">
+      <w:hyperlink w:history="1" r:id="rIdhfjztprdipob3v-pcihva">
         <w:r>
           <w:rPr>
             <w:color w:val="0563C1"/>
@@ -16179,7 +16179,7 @@
       <w:r>
         <w:t xml:space="preserve">Smith, Peter H. </w:t>
       </w:r>
-      <w:hyperlink w:history="1" r:id="rIdfo_-h62dqdhllfeasyxiq">
+      <w:hyperlink w:history="1" r:id="rIdmfjtabd2mkrtlmvbczj6d">
         <w:r>
           <w:rPr>
             <w:color w:val="0563C1"/>
@@ -16207,7 +16207,7 @@
       <w:r>
         <w:t xml:space="preserve">Schlesinger, Stephen, and Stephen Kinzer. </w:t>
       </w:r>
-      <w:hyperlink w:history="1" r:id="rIdjgus9i2mqnbisrfuicqqm">
+      <w:hyperlink w:history="1" r:id="rIdsnubece9si-iymyc-s4xe">
         <w:r>
           <w:rPr>
             <w:color w:val="0563C1"/>
@@ -16235,7 +16235,7 @@
       <w:r>
         <w:t xml:space="preserve">Slater, Candace. </w:t>
       </w:r>
-      <w:hyperlink w:history="1" r:id="rIdfvcifcypvzodd5j0bosed">
+      <w:hyperlink w:history="1" r:id="rId4go5bzsuot4tngpi6jmwy">
         <w:r>
           <w:rPr>
             <w:color w:val="0563C1"/>
@@ -16263,7 +16263,7 @@
       <w:r>
         <w:t xml:space="preserve">Taylor, Barbara L., et al. “</w:t>
       </w:r>
-      <w:hyperlink w:history="1" r:id="rIdj4vbtjid1ewph8gey5nwl">
+      <w:hyperlink w:history="1" r:id="rIdfoq-h-gof1x7yqp7mzcbv">
         <w:r>
           <w:rPr>
             <w:color w:val="0563C1"/>
@@ -16291,7 +16291,7 @@
       <w:r>
         <w:t xml:space="preserve">NOAA Fisheries. “</w:t>
       </w:r>
-      <w:hyperlink w:history="1" r:id="rIdqm73zk89rp6b7ls1rsdoj">
+      <w:hyperlink w:history="1" r:id="rIdpfsz45578iuy9p1pjo7zg">
         <w:r>
           <w:rPr>
             <w:color w:val="0563C1"/>
@@ -16319,7 +16319,7 @@
       <w:r>
         <w:t xml:space="preserve">Skidmore, Thomas E. </w:t>
       </w:r>
-      <w:hyperlink w:history="1" r:id="rId2eqcue7yctbcsugofn7k7">
+      <w:hyperlink w:history="1" r:id="rIdm5e1db6tbokzys3h2res3">
         <w:r>
           <w:rPr>
             <w:color w:val="0563C1"/>
@@ -16347,7 +16347,7 @@
       <w:r>
         <w:t xml:space="preserve">Comisión Nacional sobre la Desaparición de Personas. </w:t>
       </w:r>
-      <w:hyperlink w:history="1" r:id="rId26eeyn4oipwnqrcxsn2a5">
+      <w:hyperlink w:history="1" r:id="rIdvor6xj4lp6xfxwaolo4a3">
         <w:r>
           <w:rPr>
             <w:color w:val="0563C1"/>
@@ -16375,7 +16375,7 @@
       <w:r>
         <w:t xml:space="preserve">Nino, Carlos Santiago. </w:t>
       </w:r>
-      <w:hyperlink w:history="1" r:id="rIdqog-kecojujwtgepxogib">
+      <w:hyperlink w:history="1" r:id="rIdzuo0oi8jbjfbxy7vhzh6k">
         <w:r>
           <w:rPr>
             <w:color w:val="0563C1"/>
@@ -16403,7 +16403,7 @@
       <w:r>
         <w:t xml:space="preserve">Bouvard, Marguerite Guzman. </w:t>
       </w:r>
-      <w:hyperlink w:history="1" r:id="rIdhhc2c2_eif2u4weddwx-4">
+      <w:hyperlink w:history="1" r:id="rIdsrcvwtifqassazl7z7nni">
         <w:r>
           <w:rPr>
             <w:color w:val="0563C1"/>
@@ -16431,7 +16431,7 @@
       <w:r>
         <w:t xml:space="preserve">Kornbluh, Peter. </w:t>
       </w:r>
-      <w:hyperlink w:history="1" r:id="rIdqekbtig8mfrp67ayayadj">
+      <w:hyperlink w:history="1" r:id="rIddjumg3rhtomflfgs1hk3v">
         <w:r>
           <w:rPr>
             <w:color w:val="0563C1"/>
@@ -16459,7 +16459,7 @@
       <w:r>
         <w:t xml:space="preserve">Jara, Joan. </w:t>
       </w:r>
-      <w:hyperlink w:history="1" r:id="rIdvrhwq7t_nlgtikw99lsl5">
+      <w:hyperlink w:history="1" r:id="rIdo0kplllyt4tdgsb8aao2f">
         <w:r>
           <w:rPr>
             <w:color w:val="0563C1"/>
@@ -16487,7 +16487,7 @@
       <w:r>
         <w:t xml:space="preserve">LeoGrande, William M., and Peter Kornbluh. </w:t>
       </w:r>
-      <w:hyperlink w:history="1" r:id="rIdkqmwdoacxwvylvd7ad9lt">
+      <w:hyperlink w:history="1" r:id="rIdlyzvrpub36eatjesvhqhy">
         <w:r>
           <w:rPr>
             <w:color w:val="0563C1"/>
@@ -16547,7 +16547,7 @@
       <w:r>
         <w:t xml:space="preserve">Secretaría de Gobernación (Mexico). “</w:t>
       </w:r>
-      <w:hyperlink w:history="1" r:id="rIdejzw7h8dbykgdy58zyv13">
+      <w:hyperlink w:history="1" r:id="rIdqvc84gu-vvvqiigwrr481">
         <w:r>
           <w:rPr>
             <w:color w:val="0563C1"/>
@@ -16595,7 +16595,7 @@
       <w:r>
         <w:t xml:space="preserve">Finkel, Caroline. </w:t>
       </w:r>
-      <w:hyperlink w:history="1" r:id="rIdj2jatm74-eloy0lmszv4t">
+      <w:hyperlink w:history="1" r:id="rId1wkt2hpcftyrfharue8bv">
         <w:r>
           <w:rPr>
             <w:color w:val="0563C1"/>
@@ -16623,7 +16623,7 @@
       <w:r>
         <w:t xml:space="preserve">Crowley, Roger. </w:t>
       </w:r>
-      <w:hyperlink w:history="1" r:id="rId-ifqrslhceg_zlvz3itag">
+      <w:hyperlink w:history="1" r:id="rIdsewfrv9aya_mmbxctsrk2">
         <w:r>
           <w:rPr>
             <w:color w:val="0563C1"/>
@@ -16651,7 +16651,7 @@
       <w:r>
         <w:t xml:space="preserve">Barkey, Karen. </w:t>
       </w:r>
-      <w:hyperlink w:history="1" r:id="rIdtxpxfiwk2owbwgdj7yai5">
+      <w:hyperlink w:history="1" r:id="rId5etjq23zyn0pzzwuqb7kk">
         <w:r>
           <w:rPr>
             <w:color w:val="0563C1"/>
@@ -16679,7 +16679,7 @@
       <w:r>
         <w:t xml:space="preserve">Mazower, Mark. </w:t>
       </w:r>
-      <w:hyperlink w:history="1" r:id="rIdjbg431q2dk75xyi_mbzjg">
+      <w:hyperlink w:history="1" r:id="rId6bfkk6pu7sytjaxhawn0d">
         <w:r>
           <w:rPr>
             <w:color w:val="0563C1"/>
@@ -16707,7 +16707,7 @@
       <w:r>
         <w:t xml:space="preserve">Suny, Ronald Grigor. “</w:t>
       </w:r>
-      <w:hyperlink w:history="1" r:id="rIdfpdcttthijiiumqg39buo">
+      <w:hyperlink w:history="1" r:id="rIddu7tfmvjzoqz_cgzdeecn">
         <w:r>
           <w:rPr>
             <w:color w:val="0563C1"/>
@@ -16735,7 +16735,7 @@
       <w:r>
         <w:t xml:space="preserve">Power, Samantha. “</w:t>
       </w:r>
-      <w:hyperlink w:history="1" r:id="rIdt9amcpr5jvsu-fxvp9j5l">
+      <w:hyperlink w:history="1" r:id="rIdmvx44f4yze-u_-qkodpbz">
         <w:r>
           <w:rPr>
             <w:color w:val="0563C1"/>
@@ -16763,7 +16763,7 @@
       <w:r>
         <w:t xml:space="preserve">Hirschon, Renée, ed. </w:t>
       </w:r>
-      <w:hyperlink w:history="1" r:id="rIdlbxzfg6txmolc205dfwix">
+      <w:hyperlink w:history="1" r:id="rIducmyoj6mxqg71iyydw9ox">
         <w:r>
           <w:rPr>
             <w:color w:val="0563C1"/>
@@ -16791,7 +16791,7 @@
       <w:r>
         <w:t xml:space="preserve">Rogan, Eugene. </w:t>
       </w:r>
-      <w:hyperlink w:history="1" r:id="rIdnsr4gg5m4mtgmkdrfwibr">
+      <w:hyperlink w:history="1" r:id="rIdyy5whqyeynhxd67w5vnyg">
         <w:r>
           <w:rPr>
             <w:color w:val="0563C1"/>
@@ -16819,7 +16819,7 @@
       <w:r>
         <w:t xml:space="preserve">Barr, James. </w:t>
       </w:r>
-      <w:hyperlink w:history="1" r:id="rId8ts6rtklb9guyd_zvzvej">
+      <w:hyperlink w:history="1" r:id="rIdapgab3v8itzujo7ipnmex">
         <w:r>
           <w:rPr>
             <w:color w:val="0563C1"/>
@@ -16847,7 +16847,7 @@
       <w:r>
         <w:t xml:space="preserve">McDowall, David. </w:t>
       </w:r>
-      <w:hyperlink w:history="1" r:id="rId7d7bvtu_mydqkxghdhe6h">
+      <w:hyperlink w:history="1" r:id="rIdcyfmb3ooknxpp3c4ki2mx">
         <w:r>
           <w:rPr>
             <w:color w:val="0563C1"/>
@@ -16875,7 +16875,7 @@
       <w:r>
         <w:t xml:space="preserve">Abrahamian, Ervand. </w:t>
       </w:r>
-      <w:hyperlink w:history="1" r:id="rIdu3nurgu5hwjdx5ciuz10i">
+      <w:hyperlink w:history="1" r:id="rIdmzfwrytheyfdjdhz6u22l">
         <w:r>
           <w:rPr>
             <w:color w:val="0563C1"/>
@@ -16903,7 +16903,7 @@
       <w:r>
         <w:t xml:space="preserve">Razoux, Pierre. </w:t>
       </w:r>
-      <w:hyperlink w:history="1" r:id="rIdfdnt5w9pvnltxicdmg9pk">
+      <w:hyperlink w:history="1" r:id="rIdjhihcnn_b_saznyrykwk3">
         <w:r>
           <w:rPr>
             <w:color w:val="0563C1"/>
@@ -16951,7 +16951,7 @@
       <w:r>
         <w:t xml:space="preserve">Clark, Christopher. </w:t>
       </w:r>
-      <w:hyperlink w:history="1" r:id="rId4t3wdov3sjs6qn1wdvtg9">
+      <w:hyperlink w:history="1" r:id="rIdpebbchkebcube_pytdq7x">
         <w:r>
           <w:rPr>
             <w:color w:val="0563C1"/>
@@ -16979,7 +16979,7 @@
       <w:r>
         <w:t xml:space="preserve">Strachan, Hew. </w:t>
       </w:r>
-      <w:hyperlink w:history="1" r:id="rIdcpi1yraevlmqrtedzonwt">
+      <w:hyperlink w:history="1" r:id="rIdllsnr_asqlla3wh2qa2o_">
         <w:r>
           <w:rPr>
             <w:color w:val="0563C1"/>
@@ -17023,7 +17023,7 @@
       <w:r>
         <w:t xml:space="preserve">Weintraub, Stanley. </w:t>
       </w:r>
-      <w:hyperlink w:history="1" r:id="rId3zbftnssknttrsyg6pss3">
+      <w:hyperlink w:history="1" r:id="rIdqdub0ajuef4zsjv85c95v">
         <w:r>
           <w:rPr>
             <w:color w:val="0563C1"/>
@@ -17051,7 +17051,7 @@
       <w:r>
         <w:t xml:space="preserve">Johnson, Niall P. A. S., and Juergen Mueller. “</w:t>
       </w:r>
-      <w:hyperlink w:history="1" r:id="rIdklpzmghdict0ehag0efas">
+      <w:hyperlink w:history="1" r:id="rIdamcen_2mgttneyul4aeao">
         <w:r>
           <w:rPr>
             <w:color w:val="0563C1"/>
@@ -17079,7 +17079,7 @@
       <w:r>
         <w:t xml:space="preserve">Spreeuwenberg, Peter, et al. “</w:t>
       </w:r>
-      <w:hyperlink w:history="1" r:id="rIds0frij2ti8tbtooebk4kd">
+      <w:hyperlink w:history="1" r:id="rId1tjs7fqqan2ngtolwahfi">
         <w:r>
           <w:rPr>
             <w:color w:val="0563C1"/>
@@ -17107,7 +17107,7 @@
       <w:r>
         <w:t xml:space="preserve">Keynes, John Maynard. </w:t>
       </w:r>
-      <w:hyperlink w:history="1" r:id="rIdx8vbm_pax7wsbk3wha2rm">
+      <w:hyperlink w:history="1" r:id="rIdt7iy-50pm8urdkkg7w3vs">
         <w:r>
           <w:rPr>
             <w:color w:val="0563C1"/>
@@ -17155,7 +17155,7 @@
       <w:r>
         <w:t xml:space="preserve">Evans, Richard J. </w:t>
       </w:r>
-      <w:hyperlink w:history="1" r:id="rIdd_p0-ph9grgu3j-tuuwk_">
+      <w:hyperlink w:history="1" r:id="rIdkju_ddfwhjaic7haew7nk">
         <w:r>
           <w:rPr>
             <w:color w:val="0563C1"/>
@@ -17183,7 +17183,7 @@
       <w:r>
         <w:t xml:space="preserve">Hilberg, Raul. </w:t>
       </w:r>
-      <w:hyperlink w:history="1" r:id="rIdck2y8zvw86s9k5uaj7z-p">
+      <w:hyperlink w:history="1" r:id="rIdkn6hal1m72vjqciafa8oo">
         <w:r>
           <w:rPr>
             <w:color w:val="0563C1"/>
@@ -17211,7 +17211,7 @@
       <w:r>
         <w:t xml:space="preserve">Kiernan, Ben. </w:t>
       </w:r>
-      <w:hyperlink w:history="1" r:id="rIdp0osid53w3sb9mznqs4b6">
+      <w:hyperlink w:history="1" r:id="rIdwloua1ue81nn2oplticcc">
         <w:r>
           <w:rPr>
             <w:color w:val="0563C1"/>
@@ -17239,7 +17239,7 @@
       <w:r>
         <w:t xml:space="preserve">Levitsky, Steven, and Daniel Ziblatt. </w:t>
       </w:r>
-      <w:hyperlink w:history="1" r:id="rIdpclkd_u3lwisaqgeyndir">
+      <w:hyperlink w:history="1" r:id="rIdfg3prqjomck6gaibshnei">
         <w:r>
           <w:rPr>
             <w:color w:val="0563C1"/>
@@ -17267,7 +17267,7 @@
       <w:r>
         <w:t xml:space="preserve">Neiman, Susan. </w:t>
       </w:r>
-      <w:hyperlink w:history="1" r:id="rIdfww3ny3i14d2hqmaxscyp">
+      <w:hyperlink w:history="1" r:id="rIdxb5djfnvlfpllipjq0rpz">
         <w:r>
           <w:rPr>
             <w:color w:val="0563C1"/>
@@ -17311,7 +17311,7 @@
       <w:r>
         <w:t xml:space="preserve">Broberg, Gunnar, and Nils Roll-Hansen, eds. </w:t>
       </w:r>
-      <w:hyperlink w:history="1" r:id="rIdme9sjvjd-ohxbclaaaiqa">
+      <w:hyperlink w:history="1" r:id="rIdclfkhxf3pnkjg1elu5ozl">
         <w:r>
           <w:rPr>
             <w:color w:val="0563C1"/>
@@ -17359,7 +17359,7 @@
       <w:r>
         <w:t xml:space="preserve">Jansen, Marius B. </w:t>
       </w:r>
-      <w:hyperlink w:history="1" r:id="rIdpjcada6akjzasuslzxtzl">
+      <w:hyperlink w:history="1" r:id="rIdzt5xt3nqrdzsotesqvcvn">
         <w:r>
           <w:rPr>
             <w:color w:val="0563C1"/>
@@ -17387,7 +17387,7 @@
       <w:r>
         <w:t xml:space="preserve">Fogel, Joshua A., ed. </w:t>
       </w:r>
-      <w:hyperlink w:history="1" r:id="rIdesji5dkca0nmudyupff-g">
+      <w:hyperlink w:history="1" r:id="rIdnvwxnrr4smejk1cezilp4">
         <w:r>
           <w:rPr>
             <w:color w:val="0563C1"/>
@@ -17415,7 +17415,7 @@
       <w:r>
         <w:t xml:space="preserve">Ohnuki-Tierney, Emiko. </w:t>
       </w:r>
-      <w:hyperlink w:history="1" r:id="rIdnuvhtarlkptra-qiisnju">
+      <w:hyperlink w:history="1" r:id="rIdca2vmleyof0bf4tkt3-ne">
         <w:r>
           <w:rPr>
             <w:color w:val="0563C1"/>
@@ -17443,7 +17443,7 @@
       <w:r>
         <w:t xml:space="preserve">Dower, John W. </w:t>
       </w:r>
-      <w:hyperlink w:history="1" r:id="rId8a7-qmunz71ofa1dp1eka">
+      <w:hyperlink w:history="1" r:id="rIdbtzmiynzmgoyhy56tzxf1">
         <w:r>
           <w:rPr>
             <w:color w:val="0563C1"/>
@@ -17491,7 +17491,7 @@
       <w:r>
         <w:t xml:space="preserve">Duggan, Christopher. </w:t>
       </w:r>
-      <w:hyperlink w:history="1" r:id="rId4g5l-wknfyklbx6mqnt23">
+      <w:hyperlink w:history="1" r:id="rIdb30tibuyr81vg1csyhzzy">
         <w:r>
           <w:rPr>
             <w:color w:val="0563C1"/>
@@ -17519,7 +17519,7 @@
       <w:r>
         <w:t xml:space="preserve">Bosworth, R. J. B. </w:t>
       </w:r>
-      <w:hyperlink w:history="1" r:id="rIdyjfov38icuyx2zjfnmc1e">
+      <w:hyperlink w:history="1" r:id="rIdnybhznexiyrvbc7yhtkzu">
         <w:r>
           <w:rPr>
             <w:color w:val="0563C1"/>
@@ -17547,7 +17547,7 @@
       <w:r>
         <w:t xml:space="preserve">Domenico, Roy Palmer. </w:t>
       </w:r>
-      <w:hyperlink w:history="1" r:id="rIdjx7ztb2mprtxtmimyii93">
+      <w:hyperlink w:history="1" r:id="rIdd2qwpkk5_wrm_a250o8sa">
         <w:r>
           <w:rPr>
             <w:color w:val="0563C1"/>
@@ -17595,7 +17595,7 @@
       <w:r>
         <w:t xml:space="preserve">Menocal, María Rosa. </w:t>
       </w:r>
-      <w:hyperlink w:history="1" r:id="rIdjojsgdsztt_zcluzgszsq">
+      <w:hyperlink w:history="1" r:id="rIdjsbcxgerxsna__xzyfobi">
         <w:r>
           <w:rPr>
             <w:color w:val="0563C1"/>
@@ -17623,7 +17623,7 @@
       <w:r>
         <w:t xml:space="preserve">Fernández-Morera, Darío. </w:t>
       </w:r>
-      <w:hyperlink w:history="1" r:id="rIdgr2y2jj_k-djbuchu7zms">
+      <w:hyperlink w:history="1" r:id="rIdhqd1euef7gyihmar4lscq">
         <w:r>
           <w:rPr>
             <w:color w:val="0563C1"/>
@@ -17651,7 +17651,7 @@
       <w:r>
         <w:t xml:space="preserve">Kraemer, Joel L. </w:t>
       </w:r>
-      <w:hyperlink w:history="1" r:id="rIdb0b6boao1atl1h8nietau">
+      <w:hyperlink w:history="1" r:id="rIdvmq1gin0k3lrkdsmt2rek">
         <w:r>
           <w:rPr>
             <w:color w:val="0563C1"/>
@@ -17679,7 +17679,7 @@
       <w:r>
         <w:t xml:space="preserve">Preston, Paul. </w:t>
       </w:r>
-      <w:hyperlink w:history="1" r:id="rId3jgptgh8ng7aoqzdivsnm">
+      <w:hyperlink w:history="1" r:id="rId5eobhlv1d_lvgzkxjffgm">
         <w:r>
           <w:rPr>
             <w:color w:val="0563C1"/>
@@ -17707,7 +17707,7 @@
       <w:r>
         <w:t xml:space="preserve">Aguilar, Paloma. </w:t>
       </w:r>
-      <w:hyperlink w:history="1" r:id="rId7lbrtqubtothpxhqw8wbk">
+      <w:hyperlink w:history="1" r:id="rIdxne9wioimdoec12a7eltq">
         <w:r>
           <w:rPr>
             <w:color w:val="0563C1"/>
@@ -17771,7 +17771,7 @@
       <w:r>
         <w:t xml:space="preserve">Applebaum, Anne. </w:t>
       </w:r>
-      <w:hyperlink w:history="1" r:id="rIdirj9ekaugnrqwqltlecxy">
+      <w:hyperlink w:history="1" r:id="rIdshtpassgdat-ed7cehnd7">
         <w:r>
           <w:rPr>
             <w:color w:val="0563C1"/>
@@ -17799,7 +17799,7 @@
       <w:r>
         <w:t xml:space="preserve">Applebaum, Anne. </w:t>
       </w:r>
-      <w:hyperlink w:history="1" r:id="rIdeeeiabtroar7w4ppjcuqv">
+      <w:hyperlink w:history="1" r:id="rId0zugi_xbxxkrvrua_dv4o">
         <w:r>
           <w:rPr>
             <w:color w:val="0563C1"/>
@@ -17827,7 +17827,7 @@
       <w:r>
         <w:t xml:space="preserve">Sanford, George. </w:t>
       </w:r>
-      <w:hyperlink w:history="1" r:id="rIdjh9gjxh_5rsedst976puq">
+      <w:hyperlink w:history="1" r:id="rIda9b4xtg_jwwnvgn4otwp2">
         <w:r>
           <w:rPr>
             <w:color w:val="0563C1"/>
@@ -17855,7 +17855,7 @@
       <w:r>
         <w:t xml:space="preserve">Plokhy, Serhii. </w:t>
       </w:r>
-      <w:hyperlink w:history="1" r:id="rIdejyfg60bani-xrza1bqgz">
+      <w:hyperlink w:history="1" r:id="rIduy6oanlsnnx7opr8cuurf">
         <w:r>
           <w:rPr>
             <w:color w:val="0563C1"/>
@@ -17883,7 +17883,7 @@
       <w:r>
         <w:t xml:space="preserve">Roberts, Geoffrey. </w:t>
       </w:r>
-      <w:hyperlink w:history="1" r:id="rIduicsybjk61hr4lch-mfxw">
+      <w:hyperlink w:history="1" r:id="rIdhflivqylw1jry2ehop22n">
         <w:r>
           <w:rPr>
             <w:color w:val="0563C1"/>
@@ -17931,7 +17931,7 @@
       <w:r>
         <w:t xml:space="preserve">Dikötter, Frank. </w:t>
       </w:r>
-      <w:hyperlink w:history="1" r:id="rIdqtd81mi2loqdgttacdbho">
+      <w:hyperlink w:history="1" r:id="rId2epl6qludgajfk_pqcc2v">
         <w:r>
           <w:rPr>
             <w:color w:val="0563C1"/>
@@ -17959,7 +17959,7 @@
       <w:r>
         <w:t xml:space="preserve">Yang Jisheng. </w:t>
       </w:r>
-      <w:hyperlink w:history="1" r:id="rIdt00p4ztadjwagpvws7dey">
+      <w:hyperlink w:history="1" r:id="rIdmty9_vqo0llvzywdnblb8">
         <w:r>
           <w:rPr>
             <w:color w:val="0563C1"/>
@@ -17987,7 +17987,7 @@
       <w:r>
         <w:t xml:space="preserve">MacFarquhar, Roderick, and Michael Schoenhals. </w:t>
       </w:r>
-      <w:hyperlink w:history="1" r:id="rIdquiz1n8kbnfj8yevvzpe-">
+      <w:hyperlink w:history="1" r:id="rIdgeaksiyobey2fzo7okl9x">
         <w:r>
           <w:rPr>
             <w:color w:val="0563C1"/>
@@ -18015,7 +18015,7 @@
       <w:r>
         <w:t xml:space="preserve">Jambeck, Jenna R., et al. “</w:t>
       </w:r>
-      <w:hyperlink w:history="1" r:id="rIdycz63a3gmsczp3scwfwcw">
+      <w:hyperlink w:history="1" r:id="rIdisvotbwoso1pajggshr3f">
         <w:r>
           <w:rPr>
             <w:color w:val="0563C1"/>
@@ -18043,7 +18043,7 @@
       <w:r>
         <w:t xml:space="preserve">Meijer, Lourens J. J., et al. “</w:t>
       </w:r>
-      <w:hyperlink w:history="1" r:id="rIdkn4jxzp5cebsb37eirpq4">
+      <w:hyperlink w:history="1" r:id="rIdbxgmyveb2a3xhzvdvivpl">
         <w:r>
           <w:rPr>
             <w:color w:val="0563C1"/>
@@ -18071,7 +18071,7 @@
       <w:r>
         <w:t xml:space="preserve">Economy, Elizabeth C. </w:t>
       </w:r>
-      <w:hyperlink w:history="1" r:id="rIdqphdin5n9x2oc2aeg_7vf">
+      <w:hyperlink w:history="1" r:id="rIde8ycvrpwksheuukcnqeub">
         <w:r>
           <w:rPr>
             <w:color w:val="0563C1"/>
@@ -18131,7 +18131,7 @@
       <w:r>
         <w:t xml:space="preserve">McDonell, Stephen. “</w:t>
       </w:r>
-      <w:hyperlink w:history="1" r:id="rIdzckc2whz9qilcajwgagan">
+      <w:hyperlink w:history="1" r:id="rIdk6y4qofph-ociiznsvl6d">
         <w:r>
           <w:rPr>
             <w:color w:val="0563C1"/>
@@ -18159,7 +18159,7 @@
       <w:r>
         <w:t xml:space="preserve">Agence France-Presse. “‘Oh, Bother’: </w:t>
       </w:r>
-      <w:hyperlink w:history="1" r:id="rId7op4e_wfhye0j7iw1xao8">
+      <w:hyperlink w:history="1" r:id="rIdplgjftlkxlyy73pdb8ffd">
         <w:r>
           <w:rPr>
             <w:color w:val="0563C1"/>
@@ -18207,7 +18207,7 @@
       <w:r>
         <w:t xml:space="preserve">Schama, Simon. </w:t>
       </w:r>
-      <w:hyperlink w:history="1" r:id="rIdgqzi6g3gfv1hka88ocj31">
+      <w:hyperlink w:history="1" r:id="rIdezdj3ed-s4nsd9wik-adg">
         <w:r>
           <w:rPr>
             <w:color w:val="0563C1"/>
@@ -18235,7 +18235,7 @@
       <w:r>
         <w:t xml:space="preserve">Finkelstein, Israel, and Neil Asher Silberman. </w:t>
       </w:r>
-      <w:hyperlink w:history="1" r:id="rIdxvjmy7tpkbd6jfoop6e3r">
+      <w:hyperlink w:history="1" r:id="rIdi2-jeb7-n5bflq6sjmahg">
         <w:r>
           <w:rPr>
             <w:color w:val="0563C1"/>
@@ -18263,7 +18263,7 @@
       <w:r>
         <w:t xml:space="preserve">VanderKam, James C. </w:t>
       </w:r>
-      <w:hyperlink w:history="1" r:id="rId_mfxqarmjomke8x7creys">
+      <w:hyperlink w:history="1" r:id="rIdrmdsn6n6iwkg8hnoxv3pm">
         <w:r>
           <w:rPr>
             <w:color w:val="0563C1"/>
@@ -18291,7 +18291,7 @@
       <w:r>
         <w:t xml:space="preserve">Magness, Jodi. </w:t>
       </w:r>
-      <w:hyperlink w:history="1" r:id="rIdnyajbtvyckrjsjsl-qffh">
+      <w:hyperlink w:history="1" r:id="rIdrdms8n3qri9g5vybmewey">
         <w:r>
           <w:rPr>
             <w:color w:val="0563C1"/>
@@ -18319,7 +18319,7 @@
       <w:r>
         <w:t xml:space="preserve">Morris, Benny. </w:t>
       </w:r>
-      <w:hyperlink w:history="1" r:id="rIdc7zar1mtlvgzjg5kwovos">
+      <w:hyperlink w:history="1" r:id="rIdbfhgtzwxpp7cowisqjyra">
         <w:r>
           <w:rPr>
             <w:color w:val="0563C1"/>
@@ -18367,7 +18367,7 @@
       <w:r>
         <w:t xml:space="preserve">Gaddis, John Lewis. </w:t>
       </w:r>
-      <w:hyperlink w:history="1" r:id="rIdgnwuoucpmirs791q6qain">
+      <w:hyperlink w:history="1" r:id="rIdgii24o8pdgikrleqjaahm">
         <w:r>
           <w:rPr>
             <w:color w:val="0563C1"/>
@@ -18395,7 +18395,7 @@
       <w:r>
         <w:t xml:space="preserve">Savranskaya, Svetlana V. “</w:t>
       </w:r>
-      <w:hyperlink w:history="1" r:id="rIdm9yl11krklz8c8hn_787e">
+      <w:hyperlink w:history="1" r:id="rIdovoeff876bb1gkwx_3cta">
         <w:r>
           <w:rPr>
             <w:color w:val="0563C1"/>
@@ -18423,7 +18423,7 @@
       <w:r>
         <w:t xml:space="preserve">Hoffman, David E. </w:t>
       </w:r>
-      <w:hyperlink w:history="1" r:id="rIdngmexddsjiavjzjkymx6n">
+      <w:hyperlink w:history="1" r:id="rIdwc86cmthw-3a4vkohcszf">
         <w:r>
           <w:rPr>
             <w:color w:val="0563C1"/>
@@ -18451,7 +18451,7 @@
       <w:r>
         <w:t xml:space="preserve">Rhodes, Richard. </w:t>
       </w:r>
-      <w:hyperlink w:history="1" r:id="rIdljlnor6yyuufqc5w9ym0a">
+      <w:hyperlink w:history="1" r:id="rIdnbzbr2wv8zekkohipnozp">
         <w:r>
           <w:rPr>
             <w:color w:val="0563C1"/>
@@ -18479,7 +18479,7 @@
       <w:r>
         <w:t xml:space="preserve">Niedenthal, Jack. </w:t>
       </w:r>
-      <w:hyperlink w:history="1" r:id="rIdrxb7vm11zn99bsamiihcj">
+      <w:hyperlink w:history="1" r:id="rId7d4xzmngmmq7mriyctfwg">
         <w:r>
           <w:rPr>
             <w:color w:val="0563C1"/>
@@ -18527,7 +18527,7 @@
       <w:r>
         <w:t xml:space="preserve">NASA. “</w:t>
       </w:r>
-      <w:hyperlink w:history="1" r:id="rIdfyatk7lwhg9kbxwflilq1">
+      <w:hyperlink w:history="1" r:id="rIdrbaool5r3ch_vcj_rv2wy">
         <w:r>
           <w:rPr>
             <w:color w:val="0563C1"/>
@@ -18555,7 +18555,7 @@
       <w:r>
         <w:t xml:space="preserve">Chaikin, Andrew. </w:t>
       </w:r>
-      <w:hyperlink w:history="1" r:id="rId3m7krgood3qeymp5tzyly">
+      <w:hyperlink w:history="1" r:id="rId4reapot9vunxqr_qiyufm">
         <w:r>
           <w:rPr>
             <w:color w:val="0563C1"/>
@@ -18583,7 +18583,7 @@
       <w:r>
         <w:t xml:space="preserve">Siddiqi, Asif A. </w:t>
       </w:r>
-      <w:hyperlink w:history="1" r:id="rIdcqqbbljtmyqdksjvawf0g">
+      <w:hyperlink w:history="1" r:id="rIdnx_p3uz23fsfr-dkfjebr">
         <w:r>
           <w:rPr>
             <w:color w:val="0563C1"/>
@@ -18611,7 +18611,7 @@
       <w:r>
         <w:t xml:space="preserve">Colaprete, Anthony, et al. “</w:t>
       </w:r>
-      <w:hyperlink w:history="1" r:id="rIdmccnkqeewxqnucjnmyuwp">
+      <w:hyperlink w:history="1" r:id="rIdpyinzmvjjx3xxe9qwxfht">
         <w:r>
           <w:rPr>
             <w:color w:val="0563C1"/>
@@ -18639,7 +18639,7 @@
       <w:r>
         <w:t xml:space="preserve">Sheehan, William. </w:t>
       </w:r>
-      <w:hyperlink w:history="1" r:id="rIdmp-prt3k6z5e3d3bkbvqa">
+      <w:hyperlink w:history="1" r:id="rIdckzk8v0gyhm3yhfjgf--x">
         <w:r>
           <w:rPr>
             <w:color w:val="0563C1"/>
@@ -18667,7 +18667,7 @@
       <w:r>
         <w:t xml:space="preserve">Grotzinger, John P., et al. “</w:t>
       </w:r>
-      <w:hyperlink w:history="1" r:id="rIdopo1ohb1xg8gojgte_mpq">
+      <w:hyperlink w:history="1" r:id="rIdmfihnjmb8yfwa-lrzfczj">
         <w:r>
           <w:rPr>
             <w:color w:val="0563C1"/>
@@ -18695,7 +18695,7 @@
       <w:r>
         <w:t xml:space="preserve">Mangold, Nicolas, et al. “</w:t>
       </w:r>
-      <w:hyperlink w:history="1" r:id="rIddvxmo0iwjryiytj49c_6n">
+      <w:hyperlink w:history="1" r:id="rIdi_deh5q5uu304yotttoez">
         <w:r>
           <w:rPr>
             <w:color w:val="0563C1"/>
@@ -18743,7 +18743,7 @@
       <w:r>
         <w:t xml:space="preserve">Ashby, Neil. “</w:t>
       </w:r>
-      <w:hyperlink w:history="1" r:id="rIdngvqe-zdwz_mrxufergu6">
+      <w:hyperlink w:history="1" r:id="rIdcmr2m0luzkuawlfton_l2">
         <w:r>
           <w:rPr>
             <w:color w:val="0563C1"/>
@@ -18771,7 +18771,7 @@
       <w:r>
         <w:t xml:space="preserve">Dyson, F. W., A. S. Eddington, and C. Davidson. “</w:t>
       </w:r>
-      <w:hyperlink w:history="1" r:id="rIdoyq6f1fftd8uapxd7m6-u">
+      <w:hyperlink w:history="1" r:id="rIdeogdziwaxn3bipuj5iev9">
         <w:r>
           <w:rPr>
             <w:color w:val="0563C1"/>
@@ -18799,7 +18799,7 @@
       <w:r>
         <w:t xml:space="preserve">Au, Whitlow W. L. </w:t>
       </w:r>
-      <w:hyperlink w:history="1" r:id="rIdu87qdjsee88kzpic7vsng">
+      <w:hyperlink w:history="1" r:id="rIdkry_5j6rd91xnu0n5dstm">
         <w:r>
           <w:rPr>
             <w:color w:val="0563C1"/>
@@ -18827,7 +18827,7 @@
       <w:r>
         <w:t xml:space="preserve">Susskind, Leonard. “</w:t>
       </w:r>
-      <w:hyperlink w:history="1" r:id="rId1adralfpenhlinl5rpsiw">
+      <w:hyperlink w:history="1" r:id="rIdutnccqazdzulxndvhjejf">
         <w:r>
           <w:rPr>
             <w:color w:val="0563C1"/>
@@ -18855,7 +18855,7 @@
       <w:r>
         <w:t xml:space="preserve">Scerri, Eric R. </w:t>
       </w:r>
-      <w:hyperlink w:history="1" r:id="rId5oygucsqviba1gojqi9fv">
+      <w:hyperlink w:history="1" r:id="rIdefm7s51z7_zbgulqrnpk8">
         <w:r>
           <w:rPr>
             <w:color w:val="0563C1"/>
@@ -18883,7 +18883,7 @@
       <w:r>
         <w:t xml:space="preserve">Erisman, Jan Willem, et al. “</w:t>
       </w:r>
-      <w:hyperlink w:history="1" r:id="rId4u9blic_9wpgfidfx25vf">
+      <w:hyperlink w:history="1" r:id="rIdjkf3otzufq_afefoo1vnh">
         <w:r>
           <w:rPr>
             <w:color w:val="0563C1"/>
@@ -18911,7 +18911,7 @@
       <w:r>
         <w:t xml:space="preserve">Watson, J. D., and F. H. C. Crick. “</w:t>
       </w:r>
-      <w:hyperlink w:history="1" r:id="rIdar2v5rv9lqmmb3aqgoxh0">
+      <w:hyperlink w:history="1" r:id="rIdbjyubif1truwqurqomxkv">
         <w:r>
           <w:rPr>
             <w:color w:val="0563C1"/>
@@ -18939,7 +18939,7 @@
       <w:r>
         <w:t xml:space="preserve">Franklin, Rosalind E., and R. G. Gosling. “</w:t>
       </w:r>
-      <w:hyperlink w:history="1" r:id="rIdbuo9nxlxmz8x4r7knn6bo">
+      <w:hyperlink w:history="1" r:id="rIdrcj_vzot-w0edpscefud-">
         <w:r>
           <w:rPr>
             <w:color w:val="0563C1"/>
@@ -18967,7 +18967,7 @@
       <w:r>
         <w:t xml:space="preserve">International Human Genome Sequencing Consortium. “</w:t>
       </w:r>
-      <w:hyperlink w:history="1" r:id="rIdqqn0mprrqcykw6ihwfy56">
+      <w:hyperlink w:history="1" r:id="rId30kzndy_lfclyl8yqbkre">
         <w:r>
           <w:rPr>
             <w:color w:val="0563C1"/>
@@ -18995,7 +18995,7 @@
       <w:r>
         <w:t xml:space="preserve">International Human Genome Sequencing Consortium. “</w:t>
       </w:r>
-      <w:hyperlink w:history="1" r:id="rIdbb5gy63rjeixmg4vxppzy">
+      <w:hyperlink w:history="1" r:id="rIdcnaiufmcvsuwngdvpbgfa">
         <w:r>
           <w:rPr>
             <w:color w:val="0563C1"/>
@@ -19023,7 +19023,7 @@
       <w:r>
         <w:t xml:space="preserve">Nurk, Sergey, et al. “</w:t>
       </w:r>
-      <w:hyperlink w:history="1" r:id="rIdhlk_p16tcrl7piuzifmn2">
+      <w:hyperlink w:history="1" r:id="rIddl751o4wzhkgp9lwuiv96">
         <w:r>
           <w:rPr>
             <w:color w:val="0563C1"/>
@@ -19051,7 +19051,7 @@
       <w:r>
         <w:t xml:space="preserve">Vine, F. J., and D. H. Matthews. “</w:t>
       </w:r>
-      <w:hyperlink w:history="1" r:id="rIdyto9typtmgob9l1wt7pk0">
+      <w:hyperlink w:history="1" r:id="rIdwuuflr2ghh9d6uyz-qg-2">
         <w:r>
           <w:rPr>
             <w:color w:val="0563C1"/>
@@ -19079,7 +19079,7 @@
       <w:r>
         <w:t xml:space="preserve">Alpher, Ralph A., and Robert Herman. “</w:t>
       </w:r>
-      <w:hyperlink w:history="1" r:id="rIdrkfuqtpkqm-g5x_8ac4zl">
+      <w:hyperlink w:history="1" r:id="rIddrsogswt6rvge7_vn2r0f">
         <w:r>
           <w:rPr>
             <w:color w:val="0563C1"/>
@@ -19107,7 +19107,7 @@
       <w:r>
         <w:t xml:space="preserve">Penzias, A. A., and R. W. Wilson. “</w:t>
       </w:r>
-      <w:hyperlink w:history="1" r:id="rIdl9oln5mxettqcazlcjkx0">
+      <w:hyperlink w:history="1" r:id="rIdmdpvewwckvucbpjgewabn">
         <w:r>
           <w:rPr>
             <w:color w:val="0563C1"/>
@@ -19135,7 +19135,7 @@
       <w:r>
         <w:t xml:space="preserve">Fleischmann, Martin, and Stanley Pons. “</w:t>
       </w:r>
-      <w:hyperlink w:history="1" r:id="rIdqlgy91rkkj5oxzcmgg834">
+      <w:hyperlink w:history="1" r:id="rIdwhvb6hoqy_n4eelbco0nc">
         <w:r>
           <w:rPr>
             <w:color w:val="0563C1"/>
@@ -19163,7 +19163,7 @@
       <w:r>
         <w:t xml:space="preserve">Wolfe-Simon, Felisa, et al. “</w:t>
       </w:r>
-      <w:hyperlink w:history="1" r:id="rIdla23p8v9-tzis8q67aags">
+      <w:hyperlink w:history="1" r:id="rId7b5kgqo0z1_row3b9ao6w">
         <w:r>
           <w:rPr>
             <w:color w:val="0563C1"/>
@@ -19191,7 +19191,7 @@
       <w:r>
         <w:t xml:space="preserve">Reaves, Marshall Louis, et al. “</w:t>
       </w:r>
-      <w:hyperlink w:history="1" r:id="rIdvu2mp3xlhaoxfi11dvo8a">
+      <w:hyperlink w:history="1" r:id="rIdjsl7abvlfdkf4a7td3y6s">
         <w:r>
           <w:rPr>
             <w:color w:val="0563C1"/>
@@ -19239,7 +19239,7 @@
       <w:r>
         <w:t xml:space="preserve">Dalrymple, William. </w:t>
       </w:r>
-      <w:hyperlink w:history="1" r:id="rIdh9nujvbjfrsuuvj9pzswm">
+      <w:hyperlink w:history="1" r:id="rIdnq1k3lojff228kbq20eql">
         <w:r>
           <w:rPr>
             <w:color w:val="0563C1"/>
@@ -19267,7 +19267,7 @@
       <w:r>
         <w:t xml:space="preserve">Maddison, Angus. </w:t>
       </w:r>
-      <w:hyperlink w:history="1" r:id="rIdthta6u_8tnvpu1rhmx92u">
+      <w:hyperlink w:history="1" r:id="rIdp9z4kuzwvn9-s308uvlbw">
         <w:r>
           <w:rPr>
             <w:color w:val="0563C1"/>
@@ -19295,7 +19295,7 @@
       <w:r>
         <w:t xml:space="preserve">Sen, Amartya. </w:t>
       </w:r>
-      <w:hyperlink w:history="1" r:id="rIdpecui_gedry2qdcpousrd">
+      <w:hyperlink w:history="1" r:id="rIdn7iagmvq01a2cyoexs6tr">
         <w:r>
           <w:rPr>
             <w:color w:val="0563C1"/>
@@ -19323,7 +19323,7 @@
       <w:r>
         <w:t xml:space="preserve">Khan, Yasmin. </w:t>
       </w:r>
-      <w:hyperlink w:history="1" r:id="rIdgvipsgq-jkhk8_ebh8zya">
+      <w:hyperlink w:history="1" r:id="rId2efq1swhtmkxsuo20vvzq">
         <w:r>
           <w:rPr>
             <w:color w:val="0563C1"/>
@@ -19351,7 +19351,7 @@
       <w:r>
         <w:t xml:space="preserve">Elkins, Caroline. </w:t>
       </w:r>
-      <w:hyperlink w:history="1" r:id="rIdkf_eik5gifabziqpndjei">
+      <w:hyperlink w:history="1" r:id="rIdch0rljhpqjefqsc14ks0v">
         <w:r>
           <w:rPr>
             <w:color w:val="0563C1"/>
@@ -19379,7 +19379,7 @@
       <w:r>
         <w:t xml:space="preserve">Jansen, Jan C., and Jürgen Osterhammel. </w:t>
       </w:r>
-      <w:hyperlink w:history="1" r:id="rId4u97_3fun5_yoqrzpuopj">
+      <w:hyperlink w:history="1" r:id="rIdh9s4vfwulk4xozp8vmkag">
         <w:r>
           <w:rPr>
             <w:color w:val="0563C1"/>
@@ -19407,7 +19407,7 @@
       <w:r>
         <w:t xml:space="preserve">Des Forges, Alison. </w:t>
       </w:r>
-      <w:hyperlink w:history="1" r:id="rId98puukzvpgnktyfarsy-c">
+      <w:hyperlink w:history="1" r:id="rIdmnvjd1npkfyzgwgdytls3">
         <w:r>
           <w:rPr>
             <w:color w:val="0563C1"/>
@@ -19435,7 +19435,7 @@
       <w:r>
         <w:t xml:space="preserve">Newbury, Catharine. </w:t>
       </w:r>
-      <w:hyperlink w:history="1" r:id="rIdsuzz7coec4uokuy9xzk7o">
+      <w:hyperlink w:history="1" r:id="rIdg8sbqevkaqeoceezttfhh">
         <w:r>
           <w:rPr>
             <w:color w:val="0563C1"/>
@@ -19483,7 +19483,7 @@
       <w:r>
         <w:t xml:space="preserve">Branch, Taylor. </w:t>
       </w:r>
-      <w:hyperlink w:history="1" r:id="rIdq7zjc6sj6h5wbo1sz9mqy">
+      <w:hyperlink w:history="1" r:id="rId9exwjdmya0q_og-osekmm">
         <w:r>
           <w:rPr>
             <w:color w:val="0563C1"/>
@@ -19511,7 +19511,7 @@
       <w:r>
         <w:t xml:space="preserve">Hoose, Phillip. </w:t>
       </w:r>
-      <w:hyperlink w:history="1" r:id="rIdtg8g6-lf1m4t-jtftcail">
+      <w:hyperlink w:history="1" r:id="rIdwmldf58p1en-mckdyhx8e">
         <w:r>
           <w:rPr>
             <w:color w:val="0563C1"/>
@@ -19539,7 +19539,7 @@
       <w:r>
         <w:t xml:space="preserve">Tyson, Timothy B. </w:t>
       </w:r>
-      <w:hyperlink w:history="1" r:id="rIdr4ihpxmtgazdnrushcdb8">
+      <w:hyperlink w:history="1" r:id="rIdwxh6x6xuzxqglwiv9cxxd">
         <w:r>
           <w:rPr>
             <w:color w:val="0563C1"/>
@@ -19567,7 +19567,7 @@
       <w:r>
         <w:t xml:space="preserve">Mandela, Nelson. </w:t>
       </w:r>
-      <w:hyperlink w:history="1" r:id="rIdrdnozrcdpx-fxn8kfjolr">
+      <w:hyperlink w:history="1" r:id="rId1yjywhipdrthfwtkyiqxk">
         <w:r>
           <w:rPr>
             <w:color w:val="0563C1"/>
@@ -19595,7 +19595,7 @@
       <w:r>
         <w:t xml:space="preserve">Carter, David. </w:t>
       </w:r>
-      <w:hyperlink w:history="1" r:id="rIdnywcljfyyfqjyoplowaok">
+      <w:hyperlink w:history="1" r:id="rIdobfpk6ktqiqibteameduj">
         <w:r>
           <w:rPr>
             <w:color w:val="0563C1"/>
@@ -19643,7 +19643,7 @@
       <w:r>
         <w:t xml:space="preserve">Turing, A. M. “</w:t>
       </w:r>
-      <w:hyperlink w:history="1" r:id="rIdqscwvydyibgzvasfrkbbv">
+      <w:hyperlink w:history="1" r:id="rIdej6wazkqe_1nf4ttee7y4">
         <w:r>
           <w:rPr>
             <w:color w:val="0563C1"/>
@@ -19671,7 +19671,7 @@
       <w:r>
         <w:t xml:space="preserve">Copeland, B. Jack, ed. </w:t>
       </w:r>
-      <w:hyperlink w:history="1" r:id="rIdiimai3o5clcwaljqi0wgi">
+      <w:hyperlink w:history="1" r:id="rIdnomcqt7fdzx2vianaz6tf">
         <w:r>
           <w:rPr>
             <w:color w:val="0563C1"/>
@@ -19699,7 +19699,7 @@
       <w:r>
         <w:t xml:space="preserve">Isaacson, Walter. </w:t>
       </w:r>
-      <w:hyperlink w:history="1" r:id="rId7n7yun_o7pdoi3grcgi3d">
+      <w:hyperlink w:history="1" r:id="rIdgsceswwl_orqvf7_3axll">
         <w:r>
           <w:rPr>
             <w:color w:val="0563C1"/>
@@ -19727,7 +19727,7 @@
       <w:r>
         <w:t xml:space="preserve">Vosoughi, Soroush, Deb Roy, and Sinan Aral. “</w:t>
       </w:r>
-      <w:hyperlink w:history="1" r:id="rIdhksvuis1cwgnk5qqwi6sf">
+      <w:hyperlink w:history="1" r:id="rIdwywapnsblhav39bdfi01p">
         <w:r>
           <w:rPr>
             <w:color w:val="0563C1"/>
@@ -19775,7 +19775,7 @@
       <w:r>
         <w:t xml:space="preserve">Stuart, David. </w:t>
       </w:r>
-      <w:hyperlink w:history="1" r:id="rIdqtrwi3zoyvjuxqfh-fjv1">
+      <w:hyperlink w:history="1" r:id="rId6vfo29uwclfu7uucp3klu">
         <w:r>
           <w:rPr>
             <w:color w:val="0563C1"/>
@@ -19803,7 +19803,7 @@
       <w:r>
         <w:t xml:space="preserve">Aveni, Anthony. </w:t>
       </w:r>
-      <w:hyperlink w:history="1" r:id="rIdeizoe7xli0j2c_upj1wow">
+      <w:hyperlink w:history="1" r:id="rIdxwbt4v8dckkynrpb7q75m">
         <w:r>
           <w:rPr>
             <w:color w:val="0563C1"/>
@@ -19851,7 +19851,7 @@
       <w:r>
         <w:t xml:space="preserve">Meech, Karen J., et al. “</w:t>
       </w:r>
-      <w:hyperlink w:history="1" r:id="rIdogclipczi8ys63-ycp9zy">
+      <w:hyperlink w:history="1" r:id="rIdj-g4k2fsztqh4cqsihugv">
         <w:r>
           <w:rPr>
             <w:color w:val="0563C1"/>
@@ -19879,7 +19879,7 @@
       <w:r>
         <w:t xml:space="preserve">Micheli, Marco, et al. “</w:t>
       </w:r>
-      <w:hyperlink w:history="1" r:id="rIdv0fnap_a6g7vm2wqojbfr">
+      <w:hyperlink w:history="1" r:id="rIdqikf0pei5udnj752dtylx">
         <w:r>
           <w:rPr>
             <w:color w:val="0563C1"/>
@@ -19907,7 +19907,7 @@
       <w:r>
         <w:t xml:space="preserve">‘Oumuamua ISSI Team. “</w:t>
       </w:r>
-      <w:hyperlink w:history="1" r:id="rIdvtzlp-8rlzylgrmoea7d2">
+      <w:hyperlink w:history="1" r:id="rIdgfuldb_dbh41vcmcycpjd">
         <w:r>
           <w:rPr>
             <w:color w:val="0563C1"/>
@@ -19935,7 +19935,7 @@
       <w:r>
         <w:t xml:space="preserve">Staff at the National Astronomy and Ionosphere Center. “</w:t>
       </w:r>
-      <w:hyperlink w:history="1" r:id="rIdm1kb7c57_ftn9isxxtnln">
+      <w:hyperlink w:history="1" r:id="rIdplha-pgxwojwywyl8z7xz">
         <w:r>
           <w:rPr>
             <w:color w:val="0563C1"/>
@@ -19999,7 +19999,7 @@
       <w:r>
         <w:t xml:space="preserve">Riley, James C. “</w:t>
       </w:r>
-      <w:hyperlink w:history="1" r:id="rIdecanhvjnwtglc6jmdxez3">
+      <w:hyperlink w:history="1" r:id="rIdfpa0u-q4-zdvjsklg0zwy">
         <w:r>
           <w:rPr>
             <w:color w:val="0563C1"/>
@@ -20027,7 +20027,7 @@
       <w:r>
         <w:t xml:space="preserve">Bliss, Michael. </w:t>
       </w:r>
-      <w:hyperlink w:history="1" r:id="rIdnyar_a6kash1bd8mmuz_f">
+      <w:hyperlink w:history="1" r:id="rIdfga-baujejwlisv5g18k9">
         <w:r>
           <w:rPr>
             <w:color w:val="0563C1"/>
@@ -20055,7 +20055,7 @@
       <w:r>
         <w:t xml:space="preserve">Reverby, Susan M. </w:t>
       </w:r>
-      <w:hyperlink w:history="1" r:id="rIdkb7ubkkgc-yn6adtqra7g">
+      <w:hyperlink w:history="1" r:id="rId8xse5aqjazipd2kvkmfn4">
         <w:r>
           <w:rPr>
             <w:color w:val="0563C1"/>
@@ -20083,7 +20083,7 @@
       <w:r>
         <w:t xml:space="preserve">Keefe, Patrick Radden. </w:t>
       </w:r>
-      <w:hyperlink w:history="1" r:id="rIdzcauekbzscfsd3jwygoqq">
+      <w:hyperlink w:history="1" r:id="rIdiw5wxqqxg55dd7yxy_-u-">
         <w:r>
           <w:rPr>
             <w:color w:val="0563C1"/>
@@ -20111,7 +20111,7 @@
       <w:r>
         <w:t xml:space="preserve">Antimicrobial Resistance Collaborators. “</w:t>
       </w:r>
-      <w:hyperlink w:history="1" r:id="rIdaz73v8g-fv2r2-u2my_xj">
+      <w:hyperlink w:history="1" r:id="rIdiijrmttcj3zee10ms-ano">
         <w:r>
           <w:rPr>
             <w:color w:val="0563C1"/>
@@ -20139,7 +20139,7 @@
       <w:r>
         <w:t xml:space="preserve">Van Bressem, Marie-Françoise, et al. “</w:t>
       </w:r>
-      <w:hyperlink w:history="1" r:id="rId3moe0nwyhqxl0ot-ayule">
+      <w:hyperlink w:history="1" r:id="rIdhodj461kljrejhhmmwmcm">
         <w:r>
           <w:rPr>
             <w:color w:val="0563C1"/>
@@ -20167,7 +20167,7 @@
       <w:r>
         <w:t xml:space="preserve">Oshinsky, David M. </w:t>
       </w:r>
-      <w:hyperlink w:history="1" r:id="rIdrw3eo1lchcptqhsgqswrr">
+      <w:hyperlink w:history="1" r:id="rIdc1__oxfvqmfvwpzso7ute">
         <w:r>
           <w:rPr>
             <w:color w:val="0563C1"/>
@@ -20195,7 +20195,7 @@
       <w:r>
         <w:t xml:space="preserve">Polack, Fernando P., et al. “</w:t>
       </w:r>
-      <w:hyperlink w:history="1" r:id="rIdnm5howekhaumc2ijngyxm">
+      <w:hyperlink w:history="1" r:id="rIdxvgptng47ftbirgvuijtg">
         <w:r>
           <w:rPr>
             <w:color w:val="0563C1"/>
@@ -20243,7 +20243,7 @@
       <w:r>
         <w:t xml:space="preserve">Arrhenius, Svante. “</w:t>
       </w:r>
-      <w:hyperlink w:history="1" r:id="rIdc1-dbk7ac-z66ghf26fru">
+      <w:hyperlink w:history="1" r:id="rIdd-uy61ten1e0obtxa3lnq">
         <w:r>
           <w:rPr>
             <w:color w:val="0563C1"/>
@@ -20271,7 +20271,7 @@
       <w:r>
         <w:t xml:space="preserve">Philip, Sjoukje Y., et al. “</w:t>
       </w:r>
-      <w:hyperlink w:history="1" r:id="rIdsxbtx-p15fjr5bc_m0sh4">
+      <w:hyperlink w:history="1" r:id="rIdmgiqyfpnrqapuwwkh_dmo">
         <w:r>
           <w:rPr>
             <w:color w:val="0563C1"/>
@@ -20299,7 +20299,7 @@
       <w:r>
         <w:t xml:space="preserve">Supran, G., S. Rahmstorf, and N. Oreskes. “</w:t>
       </w:r>
-      <w:hyperlink w:history="1" r:id="rIddzynxuzzztx30p1phlb0u">
+      <w:hyperlink w:history="1" r:id="rIduicrs5xl1enbveuzjg2v5">
         <w:r>
           <w:rPr>
             <w:color w:val="0563C1"/>
@@ -20327,7 +20327,7 @@
       <w:r>
         <w:t xml:space="preserve">Witze, Alexandra. “</w:t>
       </w:r>
-      <w:hyperlink w:history="1" r:id="rIdzjtoiyefwlqrvs2yjiujq">
+      <w:hyperlink w:history="1" r:id="rId6kccchx_oeybfasjgg-nx">
         <w:r>
           <w:rPr>
             <w:color w:val="0563C1"/>
@@ -20355,7 +20355,7 @@
       <w:r>
         <w:t xml:space="preserve">IPCC. </w:t>
       </w:r>
-      <w:hyperlink w:history="1" r:id="rIdpisb3-0nydkt6wgwoio7f">
+      <w:hyperlink w:history="1" r:id="rId9aqmi5zmf3ljkwj3vbqda">
         <w:r>
           <w:rPr>
             <w:color w:val="0563C1"/>
@@ -20383,7 +20383,7 @@
       <w:r>
         <w:t xml:space="preserve">Morlighem, Mathieu, et al. “</w:t>
       </w:r>
-      <w:hyperlink w:history="1" r:id="rId-snqikrtnvyabrmm105ge">
+      <w:hyperlink w:history="1" r:id="rIdtkerxcs-pksbwqoakvwdq">
         <w:r>
           <w:rPr>
             <w:color w:val="0563C1"/>
@@ -20411,7 +20411,7 @@
       <w:r>
         <w:t xml:space="preserve">IMBIE Team. “</w:t>
       </w:r>
-      <w:hyperlink w:history="1" r:id="rIda8sbrqledzcamrx7_8wqr">
+      <w:hyperlink w:history="1" r:id="rIdkswlp2slefqjvo21heo9-">
         <w:r>
           <w:rPr>
             <w:color w:val="0563C1"/>
@@ -20439,7 +20439,7 @@
       <w:r>
         <w:t xml:space="preserve">Joughin, Ian, Benjamin E. Smith, and Brooke Medley. “</w:t>
       </w:r>
-      <w:hyperlink w:history="1" r:id="rId4zuvmf4m1ikccnmkuhzgb">
+      <w:hyperlink w:history="1" r:id="rIdh4qsa75uyftseuhwnrgfg">
         <w:r>
           <w:rPr>
             <w:color w:val="0563C1"/>
@@ -20467,7 +20467,7 @@
       <w:r>
         <w:t xml:space="preserve">Secretariat of the Antarctic Treaty. “</w:t>
       </w:r>
-      <w:hyperlink w:history="1" r:id="rIdc73r4cfxahk2cdpizs-32">
+      <w:hyperlink w:history="1" r:id="rIdsa6ghf45cqxwjaunp2ut8">
         <w:r>
           <w:rPr>
             <w:color w:val="0563C1"/>
@@ -20495,7 +20495,7 @@
       <w:r>
         <w:t xml:space="preserve">Office of the Historian, US Department of State. </w:t>
       </w:r>
-      <w:hyperlink w:history="1" r:id="rIdtaj0qm06v-yeabxub6tir">
+      <w:hyperlink w:history="1" r:id="rIdyyokc7fjy4xs2aqrgl_no">
         <w:r>
           <w:rPr>
             <w:color w:val="0563C1"/>
@@ -20523,7 +20523,7 @@
       <w:r>
         <w:t xml:space="preserve">“‘Greenland Belongs to Greenland’: </w:t>
       </w:r>
-      <w:hyperlink w:history="1" r:id="rIda_vvgch1ouchsjqqwoilq">
+      <w:hyperlink w:history="1" r:id="rIdfgwcnhdeaiotl0vmqcvi0">
         <w:r>
           <w:rPr>
             <w:color w:val="0563C1"/>
@@ -20551,7 +20551,7 @@
       <w:r>
         <w:t xml:space="preserve">BBC News. Report on </w:t>
       </w:r>
-      <w:hyperlink w:history="1" r:id="rId3a38vgr3hwknrodb7vieh">
+      <w:hyperlink w:history="1" r:id="rId3mhk3yh4frn1tfvqrui2n">
         <w:r>
           <w:rPr>
             <w:color w:val="0563C1"/>
@@ -20579,7 +20579,7 @@
       <w:r>
         <w:t xml:space="preserve">BBC News. </w:t>
       </w:r>
-      <w:hyperlink w:history="1" r:id="rIdpmhy6ctibbktihkd3chwj">
+      <w:hyperlink w:history="1" r:id="rIdxaxnaujtduhttmawxddmx">
         <w:r>
           <w:rPr>
             <w:color w:val="0563C1"/>
@@ -20590,6 +20590,34 @@
       </w:hyperlink>
       <w:r>
         <w:t xml:space="preserve">, January 12, 2025.</w:t>
+      </w:r>
+    </w:p>
+    <w:p>
+      <w:pPr>
+        <w:spacing w:after="120"/>
+        <w:ind w:left="360" w:hanging="360"/>
+      </w:pPr>
+      <w:r>
+        <w:rPr>
+          <w:i/>
+          <w:iCs/>
+        </w:rPr>
+        <w:t xml:space="preserve">Greenland’s population, about 57,000. </w:t>
+      </w:r>
+      <w:r>
+        <w:t xml:space="preserve">Statistics Greenland. “</w:t>
+      </w:r>
+      <w:hyperlink w:history="1" r:id="rIdqzyf85x6xrwpevp9zkedl">
+        <w:r>
+          <w:rPr>
+            <w:color w:val="0563C1"/>
+            <w:u w:val="single"/>
+          </w:rPr>
+          <w:t xml:space="preserve">Population Estimates, January 1st 2026</w:t>
+        </w:r>
+      </w:hyperlink>
+      <w:r>
+        <w:t xml:space="preserve">.” Statistics Greenland, 2026 (56,740 residents on January 1, 2026; 56,948 on April 1, 2026).</w:t>
       </w:r>
     </w:p>
     <w:p>
@@ -20643,7 +20671,7 @@
       <w:r>
         <w:t xml:space="preserve">COVID-19 National Preparedness Collaborators. “</w:t>
       </w:r>
-      <w:hyperlink w:history="1" r:id="rIdqxb8bpnn9nzw6i2ifzckm">
+      <w:hyperlink w:history="1" r:id="rIdswcvv-tuylpgi6qkw1539">
         <w:r>
           <w:rPr>
             <w:color w:val="0563C1"/>
@@ -20671,7 +20699,7 @@
       <w:r>
         <w:t xml:space="preserve">Msemburi, William, et al. “</w:t>
       </w:r>
-      <w:hyperlink w:history="1" r:id="rIdscy76q5zuiamdihthhdyo">
+      <w:hyperlink w:history="1" r:id="rIdf5iz-hncb_ixx1wh_77gn">
         <w:r>
           <w:rPr>
             <w:color w:val="0563C1"/>
@@ -20755,7 +20783,7 @@
       <w:r>
         <w:t xml:space="preserve">Jinek, Martin, et al. “</w:t>
       </w:r>
-      <w:hyperlink w:history="1" r:id="rIdonutfeeqvoggstnelqyif">
+      <w:hyperlink w:history="1" r:id="rIdkrpt--kshohk8-1lb__lm">
         <w:r>
           <w:rPr>
             <w:color w:val="0563C1"/>
@@ -20783,7 +20811,7 @@
       <w:r>
         <w:t xml:space="preserve">Fehilly, Carole B., S. M. Willadsen, and Elizabeth M. Tucker. “</w:t>
       </w:r>
-      <w:hyperlink w:history="1" r:id="rIdi4-jv3qutwyqd4tuj488q">
+      <w:hyperlink w:history="1" r:id="rId5tnlsz5e6aedcrjdwkxzb">
         <w:r>
           <w:rPr>
             <w:color w:val="0563C1"/>
@@ -20831,7 +20859,7 @@
       <w:r>
         <w:t xml:space="preserve">Ganopolski, A., R. Winkelmann, and H. J. Schellnhuber. “</w:t>
       </w:r>
-      <w:hyperlink w:history="1" r:id="rIdtakecxftcypmrs9mb2fvv">
+      <w:hyperlink w:history="1" r:id="rIdxn9_ztwqwmpog92ks9nek">
         <w:r>
           <w:rPr>
             <w:color w:val="0563C1"/>
@@ -20879,7 +20907,7 @@
       <w:r>
         <w:t xml:space="preserve">Hawking, S. W. “</w:t>
       </w:r>
-      <w:hyperlink w:history="1" r:id="rIdl12o437kc99xcn3cxf2ce">
+      <w:hyperlink w:history="1" r:id="rId4sphjqj_quob9od8bchdr">
         <w:r>
           <w:rPr>
             <w:color w:val="0563C1"/>
@@ -20907,7 +20935,7 @@
       <w:r>
         <w:t xml:space="preserve">LIGO Scientific Collaboration and Virgo Collaboration. “</w:t>
       </w:r>
-      <w:hyperlink w:history="1" r:id="rIdg1hwumupa5dnguiwq57at">
+      <w:hyperlink w:history="1" r:id="rIda4gfqvgz2wju04dafjdoi">
         <w:r>
           <w:rPr>
             <w:color w:val="0563C1"/>
@@ -20935,7 +20963,7 @@
       <w:r>
         <w:t xml:space="preserve">ATLAS Collaboration. “</w:t>
       </w:r>
-      <w:hyperlink w:history="1" r:id="rId9ymexbiarke1pvpxatjlx">
+      <w:hyperlink w:history="1" r:id="rIdakmool_8ujb4dxbwdqcjz">
         <w:r>
           <w:rPr>
             <w:color w:val="0563C1"/>
@@ -20963,7 +20991,7 @@
       <w:r>
         <w:t xml:space="preserve">Abu-Shawareb, H., et al. (Indirect Drive ICF Collaboration). “</w:t>
       </w:r>
-      <w:hyperlink w:history="1" r:id="rIdddxcit3knlqqkvduhhlyz">
+      <w:hyperlink w:history="1" r:id="rIdnh9kfelw_ynplpbtvt6jy">
         <w:r>
           <w:rPr>
             <w:color w:val="0563C1"/>
@@ -21014,7 +21042,7 @@
       <w:pPr>
         <w:spacing w:after="200"/>
       </w:pPr>
-      <w:hyperlink w:history="1" r:id="rIdh0u1zsqtiol_e6gkzzhhb">
+      <w:hyperlink w:history="1" r:id="rIdtspve_xjpcjqtu6n5toa1">
         <w:r>
           <w:rPr>
             <w:b/>
@@ -21047,7 +21075,7 @@
       <w:pPr>
         <w:spacing w:after="200"/>
       </w:pPr>
-      <w:hyperlink w:history="1" r:id="rIduica2c-iaetssvcppfjz4">
+      <w:hyperlink w:history="1" r:id="rIdfgreliv5as-51frcbej0j">
         <w:r>
           <w:rPr>
             <w:b/>
@@ -21080,7 +21108,7 @@
       <w:pPr>
         <w:spacing w:after="200"/>
       </w:pPr>
-      <w:hyperlink w:history="1" r:id="rIdfz9-i0sthy_f1jceflazf">
+      <w:hyperlink w:history="1" r:id="rIdnb-_wextg1caq-b5knrl3">
         <w:r>
           <w:rPr>
             <w:b/>
@@ -21113,7 +21141,7 @@
       <w:pPr>
         <w:spacing w:after="200"/>
       </w:pPr>
-      <w:hyperlink w:history="1" r:id="rIdbwewqzdoqtzb-j7dpinmb">
+      <w:hyperlink w:history="1" r:id="rIdwaz8ru4q9fgaseqco_hig">
         <w:r>
           <w:rPr>
             <w:b/>
@@ -21146,7 +21174,7 @@
       <w:pPr>
         <w:spacing w:after="200"/>
       </w:pPr>
-      <w:hyperlink w:history="1" r:id="rIdgy_ygjnhvsqj4haxqolya">
+      <w:hyperlink w:history="1" r:id="rIdh8ezh0qjmudgqv0n2z4po">
         <w:r>
           <w:rPr>
             <w:b/>
@@ -21179,7 +21207,7 @@
       <w:pPr>
         <w:spacing w:after="200"/>
       </w:pPr>
-      <w:hyperlink w:history="1" r:id="rIdwnto0valmfw5ff1wxycnb">
+      <w:hyperlink w:history="1" r:id="rIdtlolpqni2gtqz6ckrjeqw">
         <w:r>
           <w:rPr>
             <w:b/>
@@ -21212,7 +21240,7 @@
       <w:pPr>
         <w:spacing w:after="200"/>
       </w:pPr>
-      <w:hyperlink w:history="1" r:id="rId_abhbtwkml5mb3j-gngzf">
+      <w:hyperlink w:history="1" r:id="rIdodd1mxvgy9jveszk82cxi">
         <w:r>
           <w:rPr>
             <w:b/>
@@ -21267,7 +21295,7 @@
       <w:pPr>
         <w:spacing w:after="200"/>
       </w:pPr>
-      <w:hyperlink w:history="1" r:id="rIdzdqdzwhzk38awcx4gsodk">
+      <w:hyperlink w:history="1" r:id="rIdc0m97xvd41dhrw-ywghtv">
         <w:r>
           <w:rPr>
             <w:b/>
@@ -21300,7 +21328,7 @@
       <w:pPr>
         <w:spacing w:after="200"/>
       </w:pPr>
-      <w:hyperlink w:history="1" r:id="rIdqehueuy1d2nzw1pwozffl">
+      <w:hyperlink w:history="1" r:id="rIdsnyrq3xawjuhkxx5bgyem">
         <w:r>
           <w:rPr>
             <w:b/>
@@ -21333,7 +21361,7 @@
       <w:pPr>
         <w:spacing w:after="200"/>
       </w:pPr>
-      <w:hyperlink w:history="1" r:id="rId_srkb8i4rf2xbfpsoinpa">
+      <w:hyperlink w:history="1" r:id="rIdipsnalpisdcp-tu0fdyi3">
         <w:r>
           <w:rPr>
             <w:b/>
@@ -21366,7 +21394,7 @@
       <w:pPr>
         <w:spacing w:after="200"/>
       </w:pPr>
-      <w:hyperlink w:history="1" r:id="rId3jkikfdk-waoapyot6ggg">
+      <w:hyperlink w:history="1" r:id="rIdwgg0akast05are3nvoxdl">
         <w:r>
           <w:rPr>
             <w:b/>
@@ -21399,7 +21427,7 @@
       <w:pPr>
         <w:spacing w:after="200"/>
       </w:pPr>
-      <w:hyperlink w:history="1" r:id="rIdhe2tofhxpewl2jj7idl1f">
+      <w:hyperlink w:history="1" r:id="rId7ls0uvmhujy9t3sjzmkri">
         <w:r>
           <w:rPr>
             <w:b/>
@@ -21432,7 +21460,7 @@
       <w:pPr>
         <w:spacing w:after="200"/>
       </w:pPr>
-      <w:hyperlink w:history="1" r:id="rIdal9ecyafgmrqdhdbvftm8">
+      <w:hyperlink w:history="1" r:id="rIdwsyewxixktpo1o0_sonko">
         <w:r>
           <w:rPr>
             <w:b/>
@@ -21465,7 +21493,7 @@
       <w:pPr>
         <w:spacing w:after="200"/>
       </w:pPr>
-      <w:hyperlink w:history="1" r:id="rIdnk5j9fkw22e_uipkoqvcx">
+      <w:hyperlink w:history="1" r:id="rIdwzrjsmklkzu0qbo4uztlz">
         <w:r>
           <w:rPr>
             <w:b/>
@@ -21498,7 +21526,7 @@
       <w:pPr>
         <w:spacing w:after="200"/>
       </w:pPr>
-      <w:hyperlink w:history="1" r:id="rId9hijxo3toaqkgcqmqegru">
+      <w:hyperlink w:history="1" r:id="rIdz73vikwccnchvix2m4mgv">
         <w:r>
           <w:rPr>
             <w:b/>
@@ -21531,7 +21559,7 @@
       <w:pPr>
         <w:spacing w:after="200"/>
       </w:pPr>
-      <w:hyperlink w:history="1" r:id="rIdy0nx2tz9fthfwwxilp9xk">
+      <w:hyperlink w:history="1" r:id="rIdurwdlmo1a6-mpmhlds4aq">
         <w:r>
           <w:rPr>
             <w:b/>
@@ -21564,7 +21592,7 @@
       <w:pPr>
         <w:spacing w:after="200"/>
       </w:pPr>
-      <w:hyperlink w:history="1" r:id="rIdjj9r3tenlinligafb7lz_">
+      <w:hyperlink w:history="1" r:id="rIdvfuuxhbjsylnccbj3xopz">
         <w:r>
           <w:rPr>
             <w:b/>
@@ -21597,7 +21625,7 @@
       <w:pPr>
         <w:spacing w:after="200"/>
       </w:pPr>
-      <w:hyperlink w:history="1" r:id="rIdvbmwgssfdq66hamrekdog">
+      <w:hyperlink w:history="1" r:id="rIdnuphwnqimwhcafmslkymi">
         <w:r>
           <w:rPr>
             <w:b/>
@@ -21630,7 +21658,7 @@
       <w:pPr>
         <w:spacing w:after="200"/>
       </w:pPr>
-      <w:hyperlink w:history="1" r:id="rIdasdvmrx6e0ftlwg9pxjpk">
+      <w:hyperlink w:history="1" r:id="rId05ur1vxr8luyj1qktdacl">
         <w:r>
           <w:rPr>
             <w:b/>
@@ -21663,7 +21691,7 @@
       <w:pPr>
         <w:spacing w:after="200"/>
       </w:pPr>
-      <w:hyperlink w:history="1" r:id="rId67uvxx3zgjw7oxxlli0gi">
+      <w:hyperlink w:history="1" r:id="rIdkj6hw5b04xowpg1f37wlp">
         <w:r>
           <w:rPr>
             <w:b/>

</xml_diff>

<commit_message>
Dolphins: pacing rewrite of two survey chapters
Added connective tissue between the vignettes in Decolonization and
Civil Rights and Liberation, the two clearest cases of the score
sheet's "survey chapters still read as summaries" note — each country
or movement previously read as an isolated capsule with no bridge to
the one before or after it. No fact, figure, or citation changed;
only the transitions between them. Ported identically into both
chapters' .md files and the Complete Manuscript .md.

Co-Authored-By: Claude Sonnet 5 <noreply@anthropic.com>
Claude-Session: https://claude.ai/code/session_01No3CTqqXoAC7DqUj3kRTnA
</commit_message>
<xml_diff>
--- a/The Dolphins' View of History/The Dolphins' View of History - Complete Manuscript.docx
+++ b/The Dolphins' View of History/The Dolphins' View of History - Complete Manuscript.docx
@@ -7575,39 +7575,39 @@
         <w:spacing w:after="200"/>
       </w:pPr>
       <w:r>
-        <w:t xml:space="preserve">Africa’s wave crested around 1960, when seventeen countries gained independence in a single year, most from France and Britain, some only after armed conflict instead of negotiation. Algeria won its independence from France only in 1962, after eight years of war.</w:t>
-      </w:r>
-    </w:p>
-    <w:p>
-      <w:pPr>
-        <w:spacing w:after="200"/>
-      </w:pPr>
-      <w:r>
-        <w:t xml:space="preserve">Britain in particular spent the middle of this century handing back an empire it had spent the previous two centuries quite energetically acquiring, and the handing back was less graceful in places than its own histories later remembered. In Kenya, during the Mau Mau uprising of the 1950s, British authorities held tens of thousands of Kenyans in detention camps where torture was widespread; in 2013 the British government expressed regret and paid compensation to 5,228 surviving victims.</w:t>
-      </w:r>
-    </w:p>
-    <w:p>
-      <w:pPr>
-        <w:spacing w:after="200"/>
-      </w:pPr>
-      <w:r>
-        <w:t xml:space="preserve">Independence did not erase the maps colonial powers had drawn with no reference to the ethnic, linguistic, or religious boundaries that existed on the ground. Several of the era’s later conflicts, many historians argue, owe at least part of their origin to borders drawn decades or centuries earlier by administrators who had never intended those borders to become permanent national boundaries at all.</w:t>
-      </w:r>
-    </w:p>
-    <w:p>
-      <w:pPr>
-        <w:spacing w:after="200"/>
-      </w:pPr>
-      <w:r>
-        <w:t xml:space="preserve">Colonial administrators drew categories as well as borders. In Rwanda, which Belgium took over from Germany after the First World War, an old and flexible distinction between Tutsi and Hutu was hardened into a fixed one, and in the 1930s every Rwandan was issued an identity card naming a group. In 1994, after the plane carrying the president was shot down, extremist officials and militias used those categories, and the lists that went with them, to kill an estimated 500,000 to 800,000 Tutsi and moderate Hutu in about a hundred days, while the United Nations force on the ground was reduced instead of reinforced.</w:t>
-      </w:r>
-    </w:p>
-    <w:p>
-      <w:pPr>
-        <w:spacing w:after="200"/>
-      </w:pPr>
-      <w:r>
-        <w:t xml:space="preserve">Newly independent states faced a further complication the Cold War’s two superpowers made unavoidable: alignment. The Non-Aligned Movement, formally organized at a 1961 conference in Belgrade, tried to offer a third path for countries unwilling to be absorbed into either superpower’s camp, with mixed and country-specific success.</w:t>
+        <w:t xml:space="preserve">India supplied one model: organize, outlast, make the empire’s own math stop working. The wave that followed, mostly across Africa, did not always have the time for it. It crested around 1960, when seventeen countries gained independence in a single year, most from France and Britain, some only after armed conflict instead of negotiation. Algeria won its independence from France only in 1962, after eight years of war.</w:t>
+      </w:r>
+    </w:p>
+    <w:p>
+      <w:pPr>
+        <w:spacing w:after="200"/>
+      </w:pPr>
+      <w:r>
+        <w:t xml:space="preserve">Britain’s own version of the handover was a case study in how little patience this could leave behind. The country spent the middle of this century returning an empire it had spent the previous two centuries quite energetically acquiring, and the returning was less graceful in places than its own histories later remembered. In Kenya, during the Mau Mau uprising of the 1950s, British authorities held tens of thousands of Kenyans in detention camps where torture was widespread; in 2013 the British government expressed regret and paid compensation to 5,228 surviving victims.</w:t>
+      </w:r>
+    </w:p>
+    <w:p>
+      <w:pPr>
+        <w:spacing w:after="200"/>
+      </w:pPr>
+      <w:r>
+        <w:t xml:space="preserve">Speed left two inheritances behind that outlasted the flags coming down. The first was cartographic: independence did not erase the maps colonial powers had drawn with no reference to the ethnic, linguistic, or religious boundaries that existed on the ground. Several of the era’s later conflicts, many historians argue, owe at least part of their origin to borders drawn decades or centuries earlier by administrators who had never intended those borders to become permanent national boundaries at all.</w:t>
+      </w:r>
+    </w:p>
+    <w:p>
+      <w:pPr>
+        <w:spacing w:after="200"/>
+      </w:pPr>
+      <w:r>
+        <w:t xml:space="preserve">The second inheritance was harder to see on any map, because it lived in paperwork rather than borders. Colonial administrators drew categories as well as lines. In Rwanda, which Belgium took over from Germany after the First World War, an old and flexible distinction between Tutsi and Hutu was hardened into a fixed one, and in the 1930s every Rwandan was issued an identity card naming a group. In 1994, after the plane carrying the president was shot down, extremist officials and militias used those categories, and the lists that went with them, to kill an estimated 500,000 to 800,000 Tutsi and moderate Hutu in about a hundred days, while the United Nations force on the ground was reduced instead of reinforced.</w:t>
+      </w:r>
+    </w:p>
+    <w:p>
+      <w:pPr>
+        <w:spacing w:after="200"/>
+      </w:pPr>
+      <w:r>
+        <w:t xml:space="preserve">Inherited borders and inherited categories were only half the inheritance. The other half arrived from outside: newly independent states faced a complication the Cold War’s two superpowers made unavoidable, which was that nobody’s independence stayed purely their own business for long. The Non-Aligned Movement, formally organized at a 1961 conference in Belgrade, tried to offer a third path for countries unwilling to be absorbed into either superpower’s camp, with mixed and country-specific success.</w:t>
       </w:r>
     </w:p>
     <w:p>
@@ -7690,31 +7690,31 @@
         <w:spacing w:after="200"/>
       </w:pPr>
       <w:r>
-        <w:t xml:space="preserve">South Africa’s anti-apartheid struggle ran on a longer clock. Legal racial segregation, formalized as apartheid in 1948, persisted for close to half a century against internal resistance, including the armed campaign of the ANC’s military wing, Umkhonto we Sizwe, after peaceful protest was banned, and mounting international pressure and sanctions. It ended only with Nelson Mandela’s release in 1990 from twenty-seven years of imprisonment, eighteen of them on Robben Island (in waters the dolphins know well), and his election as South Africa’s first Black president in 1994.</w:t>
-      </w:r>
-    </w:p>
-    <w:p>
-      <w:pPr>
-        <w:spacing w:after="200"/>
-      </w:pPr>
-      <w:r>
-        <w:t xml:space="preserve">Women’s movements ran throughout the same century on their own overlapping timelines: suffrage achieved in most Western democracies between roughly 1893 (New Zealand, first) and the 1920s across much of Europe and North America. A second wave of legal and social advances followed in the 1960s and 70s, addressing employment, reproductive rights, and legal equality more broadly. The pace and scope of change varied enormously by country, and the change continues unevenly to the present.</w:t>
-      </w:r>
-    </w:p>
-    <w:p>
-      <w:pPr>
-        <w:spacing w:after="200"/>
-      </w:pPr>
-      <w:r>
-        <w:t xml:space="preserve">The women’s suffrage story had its own casualty list and its own comedy. In Britain the suffragettes chained themselves to railings, and in 1913 Emily Davison died after stepping in front of the King’s horse at the Epsom Derby; women over thirty got the vote in 1918, and women on equal terms with men only in 1928. In the United States it came in 1920. Switzerland, a country not known for being late, gave women the federal vote in 1971, and its last holdout canton was ordered by the courts to comply in 1990.</w:t>
-      </w:r>
-    </w:p>
-    <w:p>
-      <w:pPr>
-        <w:spacing w:after="200"/>
-      </w:pPr>
-      <w:r>
-        <w:t xml:space="preserve">A parallel argument about who counted as fully included ran through the same decades. In the early hours of June 28, 1969, patrons at the Stonewall Inn, a gay bar in New York’s Greenwich Village, fought back during a police raid of a kind the bar had endured many times before without resistance. The several nights of protest that followed are generally regarded as a turning point for the gay rights movement, and the following June, the first Pride marches in New York and other American cities marked the anniversary. Decriminalization, anti-discrimination protections, and marriage rights arrived on wildly different timelines in different countries over the half-century that followed, several of them still incomplete as this book is written.</w:t>
+        <w:t xml:space="preserve">The same slow weapon was fired on a longer clock in South Africa, against a harder target. Legal racial segregation, formalized as apartheid in 1948, persisted for close to half a century against internal resistance, including the armed campaign of the ANC’s military wing, Umkhonto we Sizwe, after peaceful protest was banned, and mounting international pressure and sanctions. It ended only with Nelson Mandela’s release in 1990 from twenty-seven years of imprisonment, eighteen of them on Robben Island (in waters the dolphins know well), and his election as South Africa’s first Black president in 1994.</w:t>
+      </w:r>
+    </w:p>
+    <w:p>
+      <w:pPr>
+        <w:spacing w:after="200"/>
+      </w:pPr>
+      <w:r>
+        <w:t xml:space="preserve">Changing what a majority believes it owes a minority turns out to be a method with more than one minority willing to try it. Women’s movements ran throughout the same century on their own overlapping timelines: suffrage achieved in most Western democracies between roughly 1893 (New Zealand, first) and the 1920s across much of Europe and North America. A second wave of legal and social advances followed in the 1960s and 70s, addressing employment, reproductive rights, and legal equality more broadly. The pace and scope of change varied enormously by country, and the change continues unevenly to the present.</w:t>
+      </w:r>
+    </w:p>
+    <w:p>
+      <w:pPr>
+        <w:spacing w:after="200"/>
+      </w:pPr>
+      <w:r>
+        <w:t xml:space="preserve">That timeline had its own casualty list and its own comedy. In Britain the suffragettes chained themselves to railings, and in 1913 Emily Davison died after stepping in front of the King’s horse at the Epsom Derby; women over thirty got the vote in 1918, and women on equal terms with men only in 1928. In the United States it came in 1920. Switzerland, a country not known for being late, gave women the federal vote in 1971, and its last holdout canton was ordered by the courts to comply in 1990.</w:t>
+      </w:r>
+    </w:p>
+    <w:p>
+      <w:pPr>
+        <w:spacing w:after="200"/>
+      </w:pPr>
+      <w:r>
+        <w:t xml:space="preserve">A fourth argument about who counted as fully included ran through the same decades, slower to start and later to arrive at anything like the others’ legal recognition. In the early hours of June 28, 1969, patrons at the Stonewall Inn, a gay bar in New York’s Greenwich Village, fought back during a police raid of a kind the bar had endured many times before without resistance. The several nights of protest that followed are generally regarded as a turning point for the gay rights movement, and the following June, the first Pride marches in New York and other American cities marked the anniversary. Decriminalization, anti-discrimination protections, and marriage rights arrived on wildly different timelines in different countries over the half-century that followed, several of them still incomplete as this book is written.</w:t>
       </w:r>
     </w:p>
     <w:p>
@@ -12078,7 +12078,7 @@
       <w:r>
         <w:t xml:space="preserve">Thewissen, J. G. M., et al. “</w:t>
       </w:r>
-      <w:hyperlink w:history="1" r:id="rIdhtyuz7gq6bwkueulsk2ir">
+      <w:hyperlink w:history="1" r:id="rIdh9vhwpnygucxajpoyjtf0">
         <w:r>
           <w:rPr>
             <w:color w:val="0563C1"/>
@@ -12106,7 +12106,7 @@
       <w:r>
         <w:t xml:space="preserve">Stringer, Chris. </w:t>
       </w:r>
-      <w:hyperlink w:history="1" r:id="rIdn-bg2lqupdfcioebquj3b">
+      <w:hyperlink w:history="1" r:id="rId9elwfhakudivwl6ifjrz3">
         <w:r>
           <w:rPr>
             <w:color w:val="0563C1"/>
@@ -12154,7 +12154,7 @@
       <w:r>
         <w:t xml:space="preserve">Marino, Lori. “</w:t>
       </w:r>
-      <w:hyperlink w:history="1" r:id="rIdjvhh3uhyuwwqpgk38jnxi">
+      <w:hyperlink w:history="1" r:id="rId_xr8-lzotm5sbcyujxup0">
         <w:r>
           <w:rPr>
             <w:color w:val="0563C1"/>
@@ -12182,7 +12182,7 @@
       <w:r>
         <w:t xml:space="preserve">Janik, Vincent M., Laela S. Sayigh, and Randall S. Wells. “</w:t>
       </w:r>
-      <w:hyperlink w:history="1" r:id="rIdk71vphw021al2snbpttbs">
+      <w:hyperlink w:history="1" r:id="rIdtr_ta5ev-9o5_ab8ce_wc">
         <w:r>
           <w:rPr>
             <w:color w:val="0563C1"/>
@@ -12210,7 +12210,7 @@
       <w:r>
         <w:t xml:space="preserve">Krützen, Michael, et al. “</w:t>
       </w:r>
-      <w:hyperlink w:history="1" r:id="rIdzh0u9wha4cc5r_dyrncl5">
+      <w:hyperlink w:history="1" r:id="rIdo6njucakjkszru_8ygjr1">
         <w:r>
           <w:rPr>
             <w:color w:val="0563C1"/>
@@ -12238,7 +12238,7 @@
       <w:r>
         <w:t xml:space="preserve">Tennie, Claudio, Josep Call, and Michael Tomasello. “</w:t>
       </w:r>
-      <w:hyperlink w:history="1" r:id="rIdrknuqwymyoidkv5mhac2l">
+      <w:hyperlink w:history="1" r:id="rIdqjmddbopw26kafo6jmw6r">
         <w:r>
           <w:rPr>
             <w:color w:val="0563C1"/>
@@ -12302,7 +12302,7 @@
       <w:r>
         <w:t xml:space="preserve">Hublin, Jean-Jacques, et al. “</w:t>
       </w:r>
-      <w:hyperlink w:history="1" r:id="rIdlkgeixbapbop9-6xohij6">
+      <w:hyperlink w:history="1" r:id="rIdszs-zn3msxxavpbqu3mc6">
         <w:r>
           <w:rPr>
             <w:color w:val="0563C1"/>
@@ -12330,7 +12330,7 @@
       <w:r>
         <w:t xml:space="preserve">Scerri, Eleanor M. L., et al. “</w:t>
       </w:r>
-      <w:hyperlink w:history="1" r:id="rIdoaeyohyoebxiy69wbdqjv">
+      <w:hyperlink w:history="1" r:id="rIdiaj1q1cyia0ahen2_5s24">
         <w:r>
           <w:rPr>
             <w:color w:val="0563C1"/>
@@ -12358,7 +12358,7 @@
       <w:r>
         <w:t xml:space="preserve">Leakey, M. D., and R. L. Hay. “</w:t>
       </w:r>
-      <w:hyperlink w:history="1" r:id="rIdyotnvq-d1mnyc1x6dyznl">
+      <w:hyperlink w:history="1" r:id="rIdx0fxzlx1mjefttslwqnqw">
         <w:r>
           <w:rPr>
             <w:color w:val="0563C1"/>
@@ -12386,7 +12386,7 @@
       <w:r>
         <w:t xml:space="preserve">Villmoare, Brian, et al. “</w:t>
       </w:r>
-      <w:hyperlink w:history="1" r:id="rIdo_k6xe3sffrm0rfh-5o2z">
+      <w:hyperlink w:history="1" r:id="rIdfdrxtb3xt3_-gllxstmr8">
         <w:r>
           <w:rPr>
             <w:color w:val="0563C1"/>
@@ -12414,7 +12414,7 @@
       <w:r>
         <w:t xml:space="preserve">Lordkipanidze, David, et al. “</w:t>
       </w:r>
-      <w:hyperlink w:history="1" r:id="rId4qw2jdqka-ptrqscpitsx">
+      <w:hyperlink w:history="1" r:id="rIdm1ibnynt85_sshwuoayyy">
         <w:r>
           <w:rPr>
             <w:color w:val="0563C1"/>
@@ -12442,7 +12442,7 @@
       <w:r>
         <w:t xml:space="preserve">Dirks, Paul H. G. M., et al. “</w:t>
       </w:r>
-      <w:hyperlink w:history="1" r:id="rIdmsgzr27fmcq60vz9zvxwu">
+      <w:hyperlink w:history="1" r:id="rIdvtdqka0ca7un4-i6vm0wu">
         <w:r>
           <w:rPr>
             <w:color w:val="0563C1"/>
@@ -12470,7 +12470,7 @@
       <w:r>
         <w:t xml:space="preserve">Henshilwood, Christopher S., et al. “</w:t>
       </w:r>
-      <w:hyperlink w:history="1" r:id="rIdwfynx1cel7klvdwtiyci8">
+      <w:hyperlink w:history="1" r:id="rIdwbong-nguicrope4rueb1">
         <w:r>
           <w:rPr>
             <w:color w:val="0563C1"/>
@@ -12518,7 +12518,7 @@
       <w:r>
         <w:t xml:space="preserve">Berna, Francesco, et al. “</w:t>
       </w:r>
-      <w:hyperlink w:history="1" r:id="rIdd2jkij-yexfvz7gcb1iik">
+      <w:hyperlink w:history="1" r:id="rIdjqxqpv7cnmpakcvueprta">
         <w:r>
           <w:rPr>
             <w:color w:val="0563C1"/>
@@ -12546,7 +12546,7 @@
       <w:r>
         <w:t xml:space="preserve">Shahack-Gross, Ruth, et al. “</w:t>
       </w:r>
-      <w:hyperlink w:history="1" r:id="rIdhnkzg086gyxsb1f4rve8e">
+      <w:hyperlink w:history="1" r:id="rIdcrcs5uwlba4ptqlvs0pao">
         <w:r>
           <w:rPr>
             <w:color w:val="0563C1"/>
@@ -12574,7 +12574,7 @@
       <w:r>
         <w:t xml:space="preserve">Harmand, Sonia, et al. “</w:t>
       </w:r>
-      <w:hyperlink w:history="1" r:id="rIdqwcg6g65afj_yplwmdkam">
+      <w:hyperlink w:history="1" r:id="rIdoesvb3fzgsrd1wqkhv_fs">
         <w:r>
           <w:rPr>
             <w:color w:val="0563C1"/>
@@ -12602,7 +12602,7 @@
       <w:r>
         <w:t xml:space="preserve">Lepre, Christopher J., et al. “</w:t>
       </w:r>
-      <w:hyperlink w:history="1" r:id="rIdt29h6qalhcezqwyrecbj_">
+      <w:hyperlink w:history="1" r:id="rIddwvtd0uame09f-zkqh8zi">
         <w:r>
           <w:rPr>
             <w:color w:val="0563C1"/>
@@ -12630,7 +12630,7 @@
       <w:r>
         <w:t xml:space="preserve">Brown, Kyle S., et al. “</w:t>
       </w:r>
-      <w:hyperlink w:history="1" r:id="rIdco6hemvbbtq_iixvs-0um">
+      <w:hyperlink w:history="1" r:id="rIdlzfxextjxgc4hw5-ttlmy">
         <w:r>
           <w:rPr>
             <w:color w:val="0563C1"/>
@@ -12658,7 +12658,7 @@
       <w:r>
         <w:t xml:space="preserve">Wrangham, Richard. </w:t>
       </w:r>
-      <w:hyperlink w:history="1" r:id="rId7_wyrc5i-0uedre-jutyv">
+      <w:hyperlink w:history="1" r:id="rIdmycpc-56dcdemfojk2jgq">
         <w:r>
           <w:rPr>
             <w:color w:val="0563C1"/>
@@ -12686,7 +12686,7 @@
       <w:r>
         <w:t xml:space="preserve">Fitch, W. Tecumseh. </w:t>
       </w:r>
-      <w:hyperlink w:history="1" r:id="rIdtf1xzjj7svmnye7ycguwt">
+      <w:hyperlink w:history="1" r:id="rId0j2bmkuchvrs3lni08tbf">
         <w:r>
           <w:rPr>
             <w:color w:val="0563C1"/>
@@ -12734,7 +12734,7 @@
       <w:r>
         <w:t xml:space="preserve">Clarkson, Chris, et al. “</w:t>
       </w:r>
-      <w:hyperlink w:history="1" r:id="rId2bp1fa8acidh3fs_0o_z8">
+      <w:hyperlink w:history="1" r:id="rIdggqmodrlzy5hhpmi3r1gl">
         <w:r>
           <w:rPr>
             <w:color w:val="0563C1"/>
@@ -12762,7 +12762,7 @@
       <w:r>
         <w:t xml:space="preserve">O’Connell, James F., et al. “</w:t>
       </w:r>
-      <w:hyperlink w:history="1" r:id="rIdrxoeja1z9rgs9p0azrin9">
+      <w:hyperlink w:history="1" r:id="rIdfgyqnuof_6uar08sauwjs">
         <w:r>
           <w:rPr>
             <w:color w:val="0563C1"/>
@@ -12790,7 +12790,7 @@
       <w:r>
         <w:t xml:space="preserve">Reich, David, et al. “</w:t>
       </w:r>
-      <w:hyperlink w:history="1" r:id="rIdxk_qc0estmlfkpuwtjl-w">
+      <w:hyperlink w:history="1" r:id="rIdk2kbno-646ienliapfutn">
         <w:r>
           <w:rPr>
             <w:color w:val="0563C1"/>
@@ -12818,7 +12818,7 @@
       <w:r>
         <w:t xml:space="preserve">Chen, Fahu, et al. “</w:t>
       </w:r>
-      <w:hyperlink w:history="1" r:id="rIdj3rtthuedmfnee5j9pluo">
+      <w:hyperlink w:history="1" r:id="rIdhclxvbphoydhiqt2pv46o">
         <w:r>
           <w:rPr>
             <w:color w:val="0563C1"/>
@@ -12846,7 +12846,7 @@
       <w:r>
         <w:t xml:space="preserve">Higham, Tom, et al. “</w:t>
       </w:r>
-      <w:hyperlink w:history="1" r:id="rIdswzmkdhpxvmu05bhmxmy0">
+      <w:hyperlink w:history="1" r:id="rIdebbvij2dt0rfz4lp2zfem">
         <w:r>
           <w:rPr>
             <w:color w:val="0563C1"/>
@@ -12874,7 +12874,7 @@
       <w:r>
         <w:t xml:space="preserve">Sutikna, Thomas, et al. “</w:t>
       </w:r>
-      <w:hyperlink w:history="1" r:id="rIdoint2buz6-p_jkn1bm3e-">
+      <w:hyperlink w:history="1" r:id="rIdl3hw6cgi7lyugqfvgfcl8">
         <w:r>
           <w:rPr>
             <w:color w:val="0563C1"/>
@@ -12902,7 +12902,7 @@
       <w:r>
         <w:t xml:space="preserve">Oktaviana, Adhi Agus, et al. “</w:t>
       </w:r>
-      <w:hyperlink w:history="1" r:id="rIdiz1bjltuetz3amdb1rav6">
+      <w:hyperlink w:history="1" r:id="rIdxuq5jesggkdibibben272">
         <w:r>
           <w:rPr>
             <w:color w:val="0563C1"/>
@@ -12930,7 +12930,7 @@
       <w:r>
         <w:t xml:space="preserve">Bennett, Matthew R., et al. “</w:t>
       </w:r>
-      <w:hyperlink w:history="1" r:id="rIdps84dmw6fmb0ufrcct-te">
+      <w:hyperlink w:history="1" r:id="rIdozbko63zkx3uy8dcvxykk">
         <w:r>
           <w:rPr>
             <w:color w:val="0563C1"/>
@@ -12958,7 +12958,7 @@
       <w:r>
         <w:t xml:space="preserve">Reich, David. </w:t>
       </w:r>
-      <w:hyperlink w:history="1" r:id="rIdwxata30fke6dj598joicd">
+      <w:hyperlink w:history="1" r:id="rId5whjkp_z_mpmoemgpk1c8">
         <w:r>
           <w:rPr>
             <w:color w:val="0563C1"/>
@@ -13006,7 +13006,7 @@
       <w:r>
         <w:t xml:space="preserve">Dietrich, Oliver, et al. “</w:t>
       </w:r>
-      <w:hyperlink w:history="1" r:id="rIdh418kvio4qorkgh44p70y">
+      <w:hyperlink w:history="1" r:id="rIdorwwbhe6kmchjkxtbj47c">
         <w:r>
           <w:rPr>
             <w:color w:val="0563C1"/>
@@ -13034,7 +13034,7 @@
       <w:r>
         <w:t xml:space="preserve">Larson, Greger, et al. “</w:t>
       </w:r>
-      <w:hyperlink w:history="1" r:id="rIddso2xnf8xmgrdkzvecvl-">
+      <w:hyperlink w:history="1" r:id="rIdcdxlr8qnmo6hnqev6_eyd">
         <w:r>
           <w:rPr>
             <w:color w:val="0563C1"/>
@@ -13062,7 +13062,7 @@
       <w:r>
         <w:t xml:space="preserve">Fuller, Dorian Q., et al. “</w:t>
       </w:r>
-      <w:hyperlink w:history="1" r:id="rIdk-ymqcsvbhuki22ry1hb2">
+      <w:hyperlink w:history="1" r:id="rIdmlmrm5pjaowqvnfagrztd">
         <w:r>
           <w:rPr>
             <w:color w:val="0563C1"/>
@@ -13090,7 +13090,7 @@
       <w:r>
         <w:t xml:space="preserve">Larsen, Clark Spencer. “</w:t>
       </w:r>
-      <w:hyperlink w:history="1" r:id="rIdzjusdjwx4gjsf1brxa1om">
+      <w:hyperlink w:history="1" r:id="rIdunlzjyxslzbaymp65fstb">
         <w:r>
           <w:rPr>
             <w:color w:val="0563C1"/>
@@ -13118,7 +13118,7 @@
       <w:r>
         <w:t xml:space="preserve">Hodder, Ian. </w:t>
       </w:r>
-      <w:hyperlink w:history="1" r:id="rIden8r-oogttabvhjtu72x1">
+      <w:hyperlink w:history="1" r:id="rId-6x2fietupog7qlyqjgxy">
         <w:r>
           <w:rPr>
             <w:color w:val="0563C1"/>
@@ -13146,7 +13146,7 @@
       <w:r>
         <w:t xml:space="preserve">Scott, James C. </w:t>
       </w:r>
-      <w:hyperlink w:history="1" r:id="rIdswks1kbc-lruhrolzbe6x">
+      <w:hyperlink w:history="1" r:id="rIdmi_3o2xthskyle4rgh1xb">
         <w:r>
           <w:rPr>
             <w:color w:val="0563C1"/>
@@ -13210,7 +13210,7 @@
       <w:r>
         <w:t xml:space="preserve">Schmandt-Besserat, Denise. </w:t>
       </w:r>
-      <w:hyperlink w:history="1" r:id="rIddqeknkdawncx7sspcjfha">
+      <w:hyperlink w:history="1" r:id="rId6gj6epp87hkp5bslznttd">
         <w:r>
           <w:rPr>
             <w:color w:val="0563C1"/>
@@ -13238,7 +13238,7 @@
       <w:r>
         <w:t xml:space="preserve">Nissen, Hans J., Peter Damerow, and Robert K. Englund. </w:t>
       </w:r>
-      <w:hyperlink w:history="1" r:id="rIdt5ec2xh8ohbtrytpzeiuy">
+      <w:hyperlink w:history="1" r:id="rIdow4lhbhxgozedenqplqp9">
         <w:r>
           <w:rPr>
             <w:color w:val="0563C1"/>
@@ -13266,7 +13266,7 @@
       <w:r>
         <w:t xml:space="preserve">Houston, Stephen D., ed. </w:t>
       </w:r>
-      <w:hyperlink w:history="1" r:id="rIdokdshbgqsypzirzz5aike">
+      <w:hyperlink w:history="1" r:id="rIduauetvuobl9aaaoalzx6t">
         <w:r>
           <w:rPr>
             <w:color w:val="0563C1"/>
@@ -13294,7 +13294,7 @@
       <w:r>
         <w:t xml:space="preserve">Schacter, Daniel L. </w:t>
       </w:r>
-      <w:hyperlink w:history="1" r:id="rId6bbkeslosl0isqe1x94xl">
+      <w:hyperlink w:history="1" r:id="rIdxik2o9ny2kfq6pe0r5cln">
         <w:r>
           <w:rPr>
             <w:color w:val="0563C1"/>
@@ -13374,7 +13374,7 @@
       <w:r>
         <w:t xml:space="preserve">Van De Mieroop, Marc. </w:t>
       </w:r>
-      <w:hyperlink w:history="1" r:id="rIdfewgul-df1qsnwhiuaefs">
+      <w:hyperlink w:history="1" r:id="rId1tl4t25snao-rjtl6z69f">
         <w:r>
           <w:rPr>
             <w:color w:val="0563C1"/>
@@ -13402,7 +13402,7 @@
       <w:r>
         <w:t xml:space="preserve">Lehner, Mark, and Zahi Hawass. </w:t>
       </w:r>
-      <w:hyperlink w:history="1" r:id="rIdlbqwpgfbtbaxv5x_rg_0p">
+      <w:hyperlink w:history="1" r:id="rIdqksa-tuz_k6oq0o4deeyc">
         <w:r>
           <w:rPr>
             <w:color w:val="0563C1"/>
@@ -13430,7 +13430,7 @@
       <w:r>
         <w:t xml:space="preserve">Edgerton, William F. “</w:t>
       </w:r>
-      <w:hyperlink w:history="1" r:id="rIdpilxs3a5s2_hf_6zbj_so">
+      <w:hyperlink w:history="1" r:id="rIdft60y9ipru0fzdb5pj42n">
         <w:r>
           <w:rPr>
             <w:color w:val="0563C1"/>
@@ -13458,7 +13458,7 @@
       <w:r>
         <w:t xml:space="preserve">Roth, Martha T. </w:t>
       </w:r>
-      <w:hyperlink w:history="1" r:id="rId-fgvlkwtr1c9xfg_mnq99">
+      <w:hyperlink w:history="1" r:id="rIdudevlgpdmausvdihnqz86">
         <w:r>
           <w:rPr>
             <w:color w:val="0563C1"/>
@@ -13486,7 +13486,7 @@
       <w:r>
         <w:t xml:space="preserve">Bryce, Trevor. </w:t>
       </w:r>
-      <w:hyperlink w:history="1" r:id="rIdwixa3jc7ndokj4gexkvxj">
+      <w:hyperlink w:history="1" r:id="rIdzqnyspi-b4ourxk4i6p6t">
         <w:r>
           <w:rPr>
             <w:color w:val="0563C1"/>
@@ -13514,7 +13514,7 @@
       <w:r>
         <w:t xml:space="preserve">Parkinson, Richard. </w:t>
       </w:r>
-      <w:hyperlink w:history="1" r:id="rIdel_r98a9mnb3zsndioilt">
+      <w:hyperlink w:history="1" r:id="rIdlguwfnppdwvleav_eqgbp">
         <w:r>
           <w:rPr>
             <w:color w:val="0563C1"/>
@@ -13562,7 +13562,7 @@
       <w:r>
         <w:t xml:space="preserve">Keightley, David N. </w:t>
       </w:r>
-      <w:hyperlink w:history="1" r:id="rIdnj7an4ees6k8m54on3hy-">
+      <w:hyperlink w:history="1" r:id="rIdl0zthv7fxhoowaukfrcvz">
         <w:r>
           <w:rPr>
             <w:color w:val="0563C1"/>
@@ -13590,7 +13590,7 @@
       <w:r>
         <w:t xml:space="preserve">Lewis, Mark Edward. </w:t>
       </w:r>
-      <w:hyperlink w:history="1" r:id="rId6okssh3zxxicypdxlqpam">
+      <w:hyperlink w:history="1" r:id="rIdw7loabqrnes0j1jvk16-i">
         <w:r>
           <w:rPr>
             <w:color w:val="0563C1"/>
@@ -13618,7 +13618,7 @@
       <w:r>
         <w:t xml:space="preserve">Elman, Benjamin A. </w:t>
       </w:r>
-      <w:hyperlink w:history="1" r:id="rIdhzeoufah2r_fyq45z7j_6">
+      <w:hyperlink w:history="1" r:id="rIdk8v5ctfosqynoe3betzi9">
         <w:r>
           <w:rPr>
             <w:color w:val="0563C1"/>
@@ -13646,7 +13646,7 @@
       <w:r>
         <w:t xml:space="preserve">Liu, Li, and Xingcan Chen. </w:t>
       </w:r>
-      <w:hyperlink w:history="1" r:id="rIdff6xp--gh7pq-xtyhq8xm">
+      <w:hyperlink w:history="1" r:id="rIdbbndhaqgxhdbx4nnwc_he">
         <w:r>
           <w:rPr>
             <w:color w:val="0563C1"/>
@@ -13694,7 +13694,7 @@
       <w:r>
         <w:t xml:space="preserve">Possehl, Gregory L. </w:t>
       </w:r>
-      <w:hyperlink w:history="1" r:id="rIdgug7bw5tocsw1rz5cwfwv">
+      <w:hyperlink w:history="1" r:id="rId1g5qbde6yjym329zvqkjc">
         <w:r>
           <w:rPr>
             <w:color w:val="0563C1"/>
@@ -13722,7 +13722,7 @@
       <w:r>
         <w:t xml:space="preserve">Thapar, Romila. </w:t>
       </w:r>
-      <w:hyperlink w:history="1" r:id="rIdw_jqfbyhsdhv2dluep2ro">
+      <w:hyperlink w:history="1" r:id="rId4a7zdebki4uqmcv2uwumj">
         <w:r>
           <w:rPr>
             <w:color w:val="0563C1"/>
@@ -13750,7 +13750,7 @@
       <w:r>
         <w:t xml:space="preserve">Plofker, Kim. </w:t>
       </w:r>
-      <w:hyperlink w:history="1" r:id="rIdakz8nl8qcwyj35d-ycx0c">
+      <w:hyperlink w:history="1" r:id="rIdy7bcafovyokxiewtdlhsr">
         <w:r>
           <w:rPr>
             <w:color w:val="0563C1"/>
@@ -13778,7 +13778,7 @@
       <w:r>
         <w:t xml:space="preserve">Dirks, Nicholas B. </w:t>
       </w:r>
-      <w:hyperlink w:history="1" r:id="rIdja92f3ok4m3rsqxwdyhmn">
+      <w:hyperlink w:history="1" r:id="rIdn5v2ed3p4ylra8gmh63fi">
         <w:r>
           <w:rPr>
             <w:color w:val="0563C1"/>
@@ -13806,7 +13806,7 @@
       <w:r>
         <w:t xml:space="preserve">Dundas, Paul. </w:t>
       </w:r>
-      <w:hyperlink w:history="1" r:id="rId4tcc450ykwvj_ywqhy20c">
+      <w:hyperlink w:history="1" r:id="rIdypogblna8sq9tag9yanvh">
         <w:r>
           <w:rPr>
             <w:color w:val="0563C1"/>
@@ -13886,7 +13886,7 @@
       <w:r>
         <w:t xml:space="preserve">Cartledge, Paul. </w:t>
       </w:r>
-      <w:hyperlink w:history="1" r:id="rIdoiiphpdvpmpi452a25hls">
+      <w:hyperlink w:history="1" r:id="rIdbzmkjho9jwgqopyw98izp">
         <w:r>
           <w:rPr>
             <w:color w:val="0563C1"/>
@@ -13914,7 +13914,7 @@
       <w:r>
         <w:t xml:space="preserve">Freeth, Tony, et al. “</w:t>
       </w:r>
-      <w:hyperlink w:history="1" r:id="rIdahtz_u50meqdggln54bsc">
+      <w:hyperlink w:history="1" r:id="rId1fb4fn9lfkebilyvogy2v">
         <w:r>
           <w:rPr>
             <w:color w:val="0563C1"/>
@@ -13942,7 +13942,7 @@
       <w:r>
         <w:t xml:space="preserve">Freeth, Tony, et al. “</w:t>
       </w:r>
-      <w:hyperlink w:history="1" r:id="rIdo7xdd05mwk_2e495ttupp">
+      <w:hyperlink w:history="1" r:id="rIduakc5t6_hcj1qoft54cp3">
         <w:r>
           <w:rPr>
             <w:color w:val="0563C1"/>
@@ -13990,7 +13990,7 @@
       <w:r>
         <w:t xml:space="preserve">Beard, Mary. </w:t>
       </w:r>
-      <w:hyperlink w:history="1" r:id="rIdarrdapz9fxaylwnfvleud">
+      <w:hyperlink w:history="1" r:id="rIdpr0vq__4zy7budsrmohtl">
         <w:r>
           <w:rPr>
             <w:color w:val="0563C1"/>
@@ -14018,7 +14018,7 @@
       <w:r>
         <w:t xml:space="preserve">Ward-Perkins, Bryan. </w:t>
       </w:r>
-      <w:hyperlink w:history="1" r:id="rIdxrrivcqra5bem5umonbxw">
+      <w:hyperlink w:history="1" r:id="rIdmq3qcd-d4cd5mkvddiaao">
         <w:r>
           <w:rPr>
             <w:color w:val="0563C1"/>
@@ -14046,7 +14046,7 @@
       <w:r>
         <w:t xml:space="preserve">Brown, Peter. </w:t>
       </w:r>
-      <w:hyperlink w:history="1" r:id="rIdf0kaabrljm0isysq_rah4">
+      <w:hyperlink w:history="1" r:id="rIdply6i_zaxdnsa5p20lkxq">
         <w:r>
           <w:rPr>
             <w:color w:val="0563C1"/>
@@ -14074,7 +14074,7 @@
       <w:r>
         <w:t xml:space="preserve">Harper, Kyle. </w:t>
       </w:r>
-      <w:hyperlink w:history="1" r:id="rIdkc_rwcn8xz78peefxjvoq">
+      <w:hyperlink w:history="1" r:id="rIdvguntmk4mqajcxn6r__wb">
         <w:r>
           <w:rPr>
             <w:color w:val="0563C1"/>
@@ -14122,7 +14122,7 @@
       <w:r>
         <w:t xml:space="preserve">Kennedy, Hugh. </w:t>
       </w:r>
-      <w:hyperlink w:history="1" r:id="rIdesiu2xyv19cptifkx7u3v">
+      <w:hyperlink w:history="1" r:id="rIdsd47aqmfcyovp8ghmfcqa">
         <w:r>
           <w:rPr>
             <w:color w:val="0563C1"/>
@@ -14150,7 +14150,7 @@
       <w:r>
         <w:t xml:space="preserve">Gutas, Dimitri. </w:t>
       </w:r>
-      <w:hyperlink w:history="1" r:id="rIdtsvioktoaqdnb6hxzkkbb">
+      <w:hyperlink w:history="1" r:id="rIdyewzoh84k1b7i7yi8sqlh">
         <w:r>
           <w:rPr>
             <w:color w:val="0563C1"/>
@@ -14178,7 +14178,7 @@
       <w:r>
         <w:t xml:space="preserve">Riley-Smith, Jonathan. </w:t>
       </w:r>
-      <w:hyperlink w:history="1" r:id="rIdgsxhscld3hluec23y33f1">
+      <w:hyperlink w:history="1" r:id="rIdeahxsblnlgesgeoojx1nu">
         <w:r>
           <w:rPr>
             <w:color w:val="0563C1"/>
@@ -14206,7 +14206,7 @@
       <w:r>
         <w:t xml:space="preserve">Phillips, Jonathan. </w:t>
       </w:r>
-      <w:hyperlink w:history="1" r:id="rIdgosgtr8llukokw-sw_byx">
+      <w:hyperlink w:history="1" r:id="rIdf5w7vxkw_khfkjpa-ke8m">
         <w:r>
           <w:rPr>
             <w:color w:val="0563C1"/>
@@ -14234,7 +14234,7 @@
       <w:r>
         <w:t xml:space="preserve">Stark, Rodney. </w:t>
       </w:r>
-      <w:hyperlink w:history="1" r:id="rId_k9id2kjc71owwuaek0gb">
+      <w:hyperlink w:history="1" r:id="rIdhwa4hllamtwnbtjibna42">
         <w:r>
           <w:rPr>
             <w:color w:val="0563C1"/>
@@ -14282,7 +14282,7 @@
       <w:r>
         <w:t xml:space="preserve">Mommsen, Theodor E. “</w:t>
       </w:r>
-      <w:hyperlink w:history="1" r:id="rId5xo6mwujtvkv9kyfamnfq">
+      <w:hyperlink w:history="1" r:id="rId9ddvbrcsknxlvbcbantjy">
         <w:r>
           <w:rPr>
             <w:color w:val="0563C1"/>
@@ -14310,7 +14310,7 @@
       <w:r>
         <w:t xml:space="preserve">Wickham, Chris. </w:t>
       </w:r>
-      <w:hyperlink w:history="1" r:id="rIdpq_pmh_ox0dmykrvpwg3k">
+      <w:hyperlink w:history="1" r:id="rIdzy64m7b7c5vqvo5mnxso9">
         <w:r>
           <w:rPr>
             <w:color w:val="0563C1"/>
@@ -14338,7 +14338,7 @@
       <w:r>
         <w:t xml:space="preserve">Russell, Jeffrey Burton. </w:t>
       </w:r>
-      <w:hyperlink w:history="1" r:id="rId7khir98_5oe2dvtboq5hf">
+      <w:hyperlink w:history="1" r:id="rIdqeulh7eyexmiocdkbpcge">
         <w:r>
           <w:rPr>
             <w:color w:val="0563C1"/>
@@ -14402,7 +14402,7 @@
       <w:r>
         <w:t xml:space="preserve">Hansen, Valerie. </w:t>
       </w:r>
-      <w:hyperlink w:history="1" r:id="rIdp7kkufyd-uncjiehd-sai">
+      <w:hyperlink w:history="1" r:id="rId6ynglpnafgznecq7pbw0l">
         <w:r>
           <w:rPr>
             <w:color w:val="0563C1"/>
@@ -14430,7 +14430,7 @@
       <w:r>
         <w:t xml:space="preserve">Spyrou, Maria A., et al. “</w:t>
       </w:r>
-      <w:hyperlink w:history="1" r:id="rId2szmas6wf6e2uezi4fovd">
+      <w:hyperlink w:history="1" r:id="rId0xcpelxvxecajqp4lb1bs">
         <w:r>
           <w:rPr>
             <w:color w:val="0563C1"/>
@@ -14458,7 +14458,7 @@
       <w:r>
         <w:t xml:space="preserve">Wheelis, Mark. “</w:t>
       </w:r>
-      <w:hyperlink w:history="1" r:id="rId--wz4cpzluyo28ai_fwwm">
+      <w:hyperlink w:history="1" r:id="rIdf9l5hzij4r7qst_elcau1">
         <w:r>
           <w:rPr>
             <w:color w:val="0563C1"/>
@@ -14486,7 +14486,7 @@
       <w:r>
         <w:t xml:space="preserve">Dean, Katharine R., et al. “</w:t>
       </w:r>
-      <w:hyperlink w:history="1" r:id="rIdxqbyif0szugpvyl9zakdw">
+      <w:hyperlink w:history="1" r:id="rIdur1acowesmukiijfewxpb">
         <w:r>
           <w:rPr>
             <w:color w:val="0563C1"/>
@@ -14514,7 +14514,7 @@
       <w:r>
         <w:t xml:space="preserve">Benedictow, Ole J. </w:t>
       </w:r>
-      <w:hyperlink w:history="1" r:id="rIdu4dl4z4i_jfqxsy3xvp5j">
+      <w:hyperlink w:history="1" r:id="rIduk40vxe8_ntg8bivfqwsl">
         <w:r>
           <w:rPr>
             <w:color w:val="0563C1"/>
@@ -14578,7 +14578,7 @@
       <w:r>
         <w:t xml:space="preserve">Gomez, Michael A. </w:t>
       </w:r>
-      <w:hyperlink w:history="1" r:id="rIdngo0jtvfdt7tgni-ydazd">
+      <w:hyperlink w:history="1" r:id="rId5k_aewqzkehul7jftzbbg">
         <w:r>
           <w:rPr>
             <w:color w:val="0563C1"/>
@@ -14638,7 +14638,7 @@
       <w:r>
         <w:t xml:space="preserve">Edwards, David N. </w:t>
       </w:r>
-      <w:hyperlink w:history="1" r:id="rIdnqzmrjprjvm5bpxuljaxy">
+      <w:hyperlink w:history="1" r:id="rIdcmabux4ykamwwrz_zs3_m">
         <w:r>
           <w:rPr>
             <w:color w:val="0563C1"/>
@@ -14666,7 +14666,7 @@
       <w:r>
         <w:t xml:space="preserve">Pikirayi, Innocent. </w:t>
       </w:r>
-      <w:hyperlink w:history="1" r:id="rIdp46mkrydyzvgfec_3glpu">
+      <w:hyperlink w:history="1" r:id="rIdgf93pza35j2woscnoj-qr">
         <w:r>
           <w:rPr>
             <w:color w:val="0563C1"/>
@@ -14694,7 +14694,7 @@
       <w:r>
         <w:t xml:space="preserve">Hicks, Dan. </w:t>
       </w:r>
-      <w:hyperlink w:history="1" r:id="rId3yjhq8rxj3ua1hakfcsvo">
+      <w:hyperlink w:history="1" r:id="rIdanmel_9gbq8mbvtpesanu">
         <w:r>
           <w:rPr>
             <w:color w:val="0563C1"/>
@@ -14742,7 +14742,7 @@
       <w:r>
         <w:t xml:space="preserve">Thornton, John K. </w:t>
       </w:r>
-      <w:hyperlink w:history="1" r:id="rIdvilgnvzyqhffxts0i4xdw">
+      <w:hyperlink w:history="1" r:id="rId-g0swe-ygu6k1whipyebv">
         <w:r>
           <w:rPr>
             <w:color w:val="0563C1"/>
@@ -14770,7 +14770,7 @@
       <w:r>
         <w:t xml:space="preserve">McCaskie, T. C. </w:t>
       </w:r>
-      <w:hyperlink w:history="1" r:id="rIdtj4-xfopd3dnvebzvfgnt">
+      <w:hyperlink w:history="1" r:id="rIdpy4avblyxdwolsx3pfh-s">
         <w:r>
           <w:rPr>
             <w:color w:val="0563C1"/>
@@ -14798,7 +14798,7 @@
       <w:r>
         <w:t xml:space="preserve">Hochschild, Adam. </w:t>
       </w:r>
-      <w:hyperlink w:history="1" r:id="rIdwiqk5bdckywzz2um_poza">
+      <w:hyperlink w:history="1" r:id="rIdw7eb6ofc0sk03dotu-66k">
         <w:r>
           <w:rPr>
             <w:color w:val="0563C1"/>
@@ -14842,7 +14842,7 @@
       <w:r>
         <w:t xml:space="preserve">Kara, Siddharth. </w:t>
       </w:r>
-      <w:hyperlink w:history="1" r:id="rIdo_-inyrmn-asbzw8pyk4j">
+      <w:hyperlink w:history="1" r:id="rIdkhogyphx2zzmafdibih7o">
         <w:r>
           <w:rPr>
             <w:color w:val="0563C1"/>
@@ -14890,7 +14890,7 @@
       <w:r>
         <w:t xml:space="preserve">Mann, Charles C. </w:t>
       </w:r>
-      <w:hyperlink w:history="1" r:id="rIdvv8dsnsnitsinmlj1yhvq">
+      <w:hyperlink w:history="1" r:id="rIdy9cwoveldtzdff6ryxdrq">
         <w:r>
           <w:rPr>
             <w:color w:val="0563C1"/>
@@ -14918,7 +14918,7 @@
       <w:r>
         <w:t xml:space="preserve">Matsuoka, Yoshihiro, et al. “</w:t>
       </w:r>
-      <w:hyperlink w:history="1" r:id="rId1guwtmvxxrdo8fk9h1ojt">
+      <w:hyperlink w:history="1" r:id="rId7xw4lbpnmppa4mnjhghnu">
         <w:r>
           <w:rPr>
             <w:color w:val="0563C1"/>
@@ -14946,7 +14946,7 @@
       <w:r>
         <w:t xml:space="preserve">Shady Solis, Ruth, Jonathan Haas, and Winifred Creamer. “</w:t>
       </w:r>
-      <w:hyperlink w:history="1" r:id="rId0y_4anxuwnrscd9fs27vx">
+      <w:hyperlink w:history="1" r:id="rId4adpfyjy1vvruzdudrhad">
         <w:r>
           <w:rPr>
             <w:color w:val="0563C1"/>
@@ -14974,7 +14974,7 @@
       <w:r>
         <w:t xml:space="preserve">Urton, Gary. </w:t>
       </w:r>
-      <w:hyperlink w:history="1" r:id="rIdlls2e3xcgnvvnuvzrycev">
+      <w:hyperlink w:history="1" r:id="rId1lfbkryevi7a6d_hvakvs">
         <w:r>
           <w:rPr>
             <w:color w:val="0563C1"/>
@@ -15002,7 +15002,7 @@
       <w:r>
         <w:t xml:space="preserve">Denevan, William M., ed. </w:t>
       </w:r>
-      <w:hyperlink w:history="1" r:id="rIdtyap-z_zemqjrfiugnfyf">
+      <w:hyperlink w:history="1" r:id="rIdthm3cal4jifmdkrbmxe0t">
         <w:r>
           <w:rPr>
             <w:color w:val="0563C1"/>
@@ -15030,7 +15030,7 @@
       <w:r>
         <w:t xml:space="preserve">Henige, David. </w:t>
       </w:r>
-      <w:hyperlink w:history="1" r:id="rIdxaxjuzgwobzmfwjqnzmac">
+      <w:hyperlink w:history="1" r:id="rIdzrswwampkhjxof4xpxl2l">
         <w:r>
           <w:rPr>
             <w:color w:val="0563C1"/>
@@ -15058,7 +15058,7 @@
       <w:r>
         <w:t xml:space="preserve">Koch, Alexander, Chris Brierley, Mark M. Maslin, and Simon L. Lewis. “</w:t>
       </w:r>
-      <w:hyperlink w:history="1" r:id="rIdk_2csnrqpcdbbhr9ixe7y">
+      <w:hyperlink w:history="1" r:id="rIduhf-igrort4gz1d-bhaxj">
         <w:r>
           <w:rPr>
             <w:color w:val="0563C1"/>
@@ -15086,7 +15086,7 @@
       <w:r>
         <w:t xml:space="preserve">Ioannidis, Alexander G., et al. “</w:t>
       </w:r>
-      <w:hyperlink w:history="1" r:id="rIdej5m4cm1krr-u7a4x2wt0">
+      <w:hyperlink w:history="1" r:id="rIdehkwyne8mp_7gffdw2ujg">
         <w:r>
           <w:rPr>
             <w:color w:val="0563C1"/>
@@ -15114,7 +15114,7 @@
       <w:r>
         <w:t xml:space="preserve">Pauketat, Timothy R. </w:t>
       </w:r>
-      <w:hyperlink w:history="1" r:id="rIddnasjqvevnsyt9weqjqmj">
+      <w:hyperlink w:history="1" r:id="rIdp_gcf_6y8oiqaplk9eocb">
         <w:r>
           <w:rPr>
             <w:color w:val="0563C1"/>
@@ -15142,7 +15142,7 @@
       <w:r>
         <w:t xml:space="preserve">Dobyns, Henry F. “</w:t>
       </w:r>
-      <w:hyperlink w:history="1" r:id="rIdtvz7ivsvkd9tchj5bt04x">
+      <w:hyperlink w:history="1" r:id="rId02kgt5mlechv8xhixzjyb">
         <w:r>
           <w:rPr>
             <w:color w:val="0563C1"/>
@@ -15203,7 +15203,7 @@
         </w:rPr>
         <w:t xml:space="preserve">The voyages database behind those numbers. </w:t>
       </w:r>
-      <w:hyperlink w:history="1" r:id="rId66wco8zcbtcohr68joglu">
+      <w:hyperlink w:history="1" r:id="rIdxbrbh00tewwg8sce77dy2">
         <w:r>
           <w:rPr>
             <w:color w:val="0563C1"/>
@@ -15231,7 +15231,7 @@
       <w:r>
         <w:t xml:space="preserve">Equiano, Olaudah. </w:t>
       </w:r>
-      <w:hyperlink w:history="1" r:id="rId0owbvf2bsycnkywhpfqrj">
+      <w:hyperlink w:history="1" r:id="rIdt7u3jg4ia6o_ds9ucoly1">
         <w:r>
           <w:rPr>
             <w:color w:val="0563C1"/>
@@ -15259,7 +15259,7 @@
       <w:r>
         <w:t xml:space="preserve">Carretta, Vincent. </w:t>
       </w:r>
-      <w:hyperlink w:history="1" r:id="rId6j5lygcck7kunzta852av">
+      <w:hyperlink w:history="1" r:id="rIda_jn4lqbrqav7mpsee_zo">
         <w:r>
           <w:rPr>
             <w:color w:val="0563C1"/>
@@ -15287,7 +15287,7 @@
       <w:r>
         <w:t xml:space="preserve">Hurston, Zora Neale. </w:t>
       </w:r>
-      <w:hyperlink w:history="1" r:id="rId1bujc7k_xyaotc2n0d3cl">
+      <w:hyperlink w:history="1" r:id="rId8fgc0lmm3pondtdyrpwvo">
         <w:r>
           <w:rPr>
             <w:color w:val="0563C1"/>
@@ -15315,7 +15315,7 @@
       <w:r>
         <w:t xml:space="preserve">Diouf, Sylviane A. </w:t>
       </w:r>
-      <w:hyperlink w:history="1" r:id="rIdrikcjjuhwsakuyrz9csqd">
+      <w:hyperlink w:history="1" r:id="rIdm0xxaoen0gdjcizwtyzvq">
         <w:r>
           <w:rPr>
             <w:color w:val="0563C1"/>
@@ -15343,7 +15343,7 @@
       <w:r>
         <w:t xml:space="preserve">Livi Bacci, Massimo. </w:t>
       </w:r>
-      <w:hyperlink w:history="1" r:id="rIdiphwykamw6b-p453xn-gj">
+      <w:hyperlink w:history="1" r:id="rIdlo-gfgu2ws782ebhat9ty">
         <w:r>
           <w:rPr>
             <w:color w:val="0563C1"/>
@@ -15371,7 +15371,7 @@
       <w:r>
         <w:t xml:space="preserve">Reséndez, Andrés. </w:t>
       </w:r>
-      <w:hyperlink w:history="1" r:id="rIditz-xfwue4wki1hzmvqba">
+      <w:hyperlink w:history="1" r:id="rId1bpspsivlumuvef-hvcfu">
         <w:r>
           <w:rPr>
             <w:color w:val="0563C1"/>
@@ -15399,7 +15399,7 @@
       <w:r>
         <w:t xml:space="preserve">Dreyer, Edward L. </w:t>
       </w:r>
-      <w:hyperlink w:history="1" r:id="rIdhcwmkxisudkwvxd4km1le">
+      <w:hyperlink w:history="1" r:id="rIdp_b_fc9jueuxh7ecpawi-">
         <w:r>
           <w:rPr>
             <w:color w:val="0563C1"/>
@@ -15447,7 +15447,7 @@
       <w:r>
         <w:t xml:space="preserve">Eisenstein, Elizabeth L. </w:t>
       </w:r>
-      <w:hyperlink w:history="1" r:id="rIdmr3lxjfxpii4a6un1p-0l">
+      <w:hyperlink w:history="1" r:id="rIdiigfgjgnttbuzmp7p4cgk">
         <w:r>
           <w:rPr>
             <w:color w:val="0563C1"/>
@@ -15475,7 +15475,7 @@
       <w:r>
         <w:t xml:space="preserve">Allen, Robert C. </w:t>
       </w:r>
-      <w:hyperlink w:history="1" r:id="rIdc3nbajsrdl4z1j_eobj5v">
+      <w:hyperlink w:history="1" r:id="rIdxyyzsbo6tk_coj4keetcc">
         <w:r>
           <w:rPr>
             <w:color w:val="0563C1"/>
@@ -15503,7 +15503,7 @@
       <w:r>
         <w:t xml:space="preserve">Humphries, Jane. </w:t>
       </w:r>
-      <w:hyperlink w:history="1" r:id="rIdc50sepnkjgatzn50x57il">
+      <w:hyperlink w:history="1" r:id="rIdapj0ixnbvv_s7-izqjbjt">
         <w:r>
           <w:rPr>
             <w:color w:val="0563C1"/>
@@ -15531,7 +15531,7 @@
       <w:r>
         <w:t xml:space="preserve">Pomeranz, Kenneth. </w:t>
       </w:r>
-      <w:hyperlink w:history="1" r:id="rIdiokstqrlruxqipev5tnq5">
+      <w:hyperlink w:history="1" r:id="rIducezpj66q0bz5li6lpsb1">
         <w:r>
           <w:rPr>
             <w:color w:val="0563C1"/>
@@ -15559,7 +15559,7 @@
       <w:r>
         <w:t xml:space="preserve">Bell, Michelle L., and Devra Lee Davis. “</w:t>
       </w:r>
-      <w:hyperlink w:history="1" r:id="rId4ducwtbqiwqqv1xlhcjlh">
+      <w:hyperlink w:history="1" r:id="rIdeyfhayuly6tq0785uiimu">
         <w:r>
           <w:rPr>
             <w:color w:val="0563C1"/>
@@ -15607,7 +15607,7 @@
       <w:r>
         <w:t xml:space="preserve">Hacker, J. David. “</w:t>
       </w:r>
-      <w:hyperlink w:history="1" r:id="rIddmlej6bfh2gcx3vumgz4s">
+      <w:hyperlink w:history="1" r:id="rId1ouvz6y12ihytidfzbuz2">
         <w:r>
           <w:rPr>
             <w:color w:val="0563C1"/>
@@ -15635,7 +15635,7 @@
       <w:r>
         <w:t xml:space="preserve">Foner, Eric. </w:t>
       </w:r>
-      <w:hyperlink w:history="1" r:id="rId2tzjtrpfs5ofpw8dkt-al">
+      <w:hyperlink w:history="1" r:id="rIdf2fitmwqnpx3h1uveefp6">
         <w:r>
           <w:rPr>
             <w:color w:val="0563C1"/>
@@ -15663,7 +15663,7 @@
       <w:r>
         <w:t xml:space="preserve">Saunt, Claudio. </w:t>
       </w:r>
-      <w:hyperlink w:history="1" r:id="rIdwgy_kcy4rbnzuv8tzw03b">
+      <w:hyperlink w:history="1" r:id="rIdhs5eziyhujrwuoj8t_-uq">
         <w:r>
           <w:rPr>
             <w:color w:val="0563C1"/>
@@ -15691,7 +15691,7 @@
       <w:r>
         <w:t xml:space="preserve">Dubois, Laurent. </w:t>
       </w:r>
-      <w:hyperlink w:history="1" r:id="rIdbwiiwc8o9e--wqgehvz4l">
+      <w:hyperlink w:history="1" r:id="rIdev0viypvltv7obz8j7pbl">
         <w:r>
           <w:rPr>
             <w:color w:val="0563C1"/>
@@ -15719,7 +15719,7 @@
       <w:r>
         <w:t xml:space="preserve">Dolin, Eric Jay. </w:t>
       </w:r>
-      <w:hyperlink w:history="1" r:id="rIdsi-ewowncnwgiz0i3lxko">
+      <w:hyperlink w:history="1" r:id="rId4ys4ixav-ug4z0th63wk_">
         <w:r>
           <w:rPr>
             <w:color w:val="0563C1"/>
@@ -15747,7 +15747,7 @@
       <w:r>
         <w:t xml:space="preserve">Horn, James. </w:t>
       </w:r>
-      <w:hyperlink w:history="1" r:id="rIda41ry1qprtry_ezisxut2">
+      <w:hyperlink w:history="1" r:id="rIdgun_8abfsnywtljwbptyr">
         <w:r>
           <w:rPr>
             <w:color w:val="0563C1"/>
@@ -15775,7 +15775,7 @@
       <w:r>
         <w:t xml:space="preserve">Wilentz, Sean. </w:t>
       </w:r>
-      <w:hyperlink w:history="1" r:id="rIdvadckycf9s-ryy5wmpoxw">
+      <w:hyperlink w:history="1" r:id="rIdqtaahpqjkzduxrral4zmt">
         <w:r>
           <w:rPr>
             <w:color w:val="0563C1"/>
@@ -15823,7 +15823,7 @@
       <w:r>
         <w:t xml:space="preserve">Equal Justice Initiative. </w:t>
       </w:r>
-      <w:hyperlink w:history="1" r:id="rIdfc8mhvmz84j7t2_qmyuzj">
+      <w:hyperlink w:history="1" r:id="rIdjcz7n42765tliods38kyw">
         <w:r>
           <w:rPr>
             <w:color w:val="0563C1"/>
@@ -15867,7 +15867,7 @@
       <w:r>
         <w:t xml:space="preserve">Robinson, Greg. </w:t>
       </w:r>
-      <w:hyperlink w:history="1" r:id="rIdbdnd1rcuhqg_eysz7o2nq">
+      <w:hyperlink w:history="1" r:id="rIdsguydfgcaw-bqfi7ylsph">
         <w:r>
           <w:rPr>
             <w:color w:val="0563C1"/>
@@ -15895,7 +15895,7 @@
       <w:r>
         <w:t xml:space="preserve">Blinder, Alan S. </w:t>
       </w:r>
-      <w:hyperlink w:history="1" r:id="rId4kidnraof2irt0eco6wax">
+      <w:hyperlink w:history="1" r:id="rIdswomrsppidkdtgzl2x8ad">
         <w:r>
           <w:rPr>
             <w:color w:val="0563C1"/>
@@ -15943,7 +15943,7 @@
       <w:r>
         <w:t xml:space="preserve">Butler, Jon. </w:t>
       </w:r>
-      <w:hyperlink w:history="1" r:id="rIdlrb1ee-hp09ho9_lbaods">
+      <w:hyperlink w:history="1" r:id="rIdgdb30siweactxt74vlqad">
         <w:r>
           <w:rPr>
             <w:color w:val="0563C1"/>
@@ -15971,7 +15971,7 @@
       <w:r>
         <w:t xml:space="preserve">Hatch, Nathan O. </w:t>
       </w:r>
-      <w:hyperlink w:history="1" r:id="rId7tjbhjrqavjdhkzoqycyp">
+      <w:hyperlink w:history="1" r:id="rIdgcwplddoli0d_rsayhslm">
         <w:r>
           <w:rPr>
             <w:color w:val="0563C1"/>
@@ -15999,7 +15999,7 @@
       <w:r>
         <w:t xml:space="preserve">Bushman, Richard Lyman. </w:t>
       </w:r>
-      <w:hyperlink w:history="1" r:id="rIdbhyr8mgotzv6t00dmkxr6">
+      <w:hyperlink w:history="1" r:id="rIdi4k1auvanddvq1ljipecu">
         <w:r>
           <w:rPr>
             <w:color w:val="0563C1"/>
@@ -16027,7 +16027,7 @@
       <w:r>
         <w:t xml:space="preserve">Kraybill, Donald B., Karen M. Johnson-Weiner, and Steven M. Nolt. </w:t>
       </w:r>
-      <w:hyperlink w:history="1" r:id="rIdn8s0oavy3qplccnpo5w49">
+      <w:hyperlink w:history="1" r:id="rIdes0vibdl4m-ybn4izbnlj">
         <w:r>
           <w:rPr>
             <w:color w:val="0563C1"/>
@@ -16055,7 +16055,7 @@
       <w:r>
         <w:t xml:space="preserve">Moore, Rebecca. </w:t>
       </w:r>
-      <w:hyperlink w:history="1" r:id="rIdb7xp_odr0diemuxveazrk">
+      <w:hyperlink w:history="1" r:id="rIdhfauuouzx_ienvnhwp7o3">
         <w:r>
           <w:rPr>
             <w:color w:val="0563C1"/>
@@ -16119,7 +16119,7 @@
       <w:r>
         <w:t xml:space="preserve">Lynch, John. </w:t>
       </w:r>
-      <w:hyperlink w:history="1" r:id="rIdlofl_rncioerrj-a7rndg">
+      <w:hyperlink w:history="1" r:id="rIdxpbyed5jkm6_quborg--s">
         <w:r>
           <w:rPr>
             <w:color w:val="0563C1"/>
@@ -16147,7 +16147,7 @@
       <w:r>
         <w:t xml:space="preserve">Dubois, Laurent. </w:t>
       </w:r>
-      <w:hyperlink w:history="1" r:id="rIdswc5sqrgvr1qf2va0ntxy">
+      <w:hyperlink w:history="1" r:id="rIdln7x1hrnnh8meidxyjdhi">
         <w:r>
           <w:rPr>
             <w:color w:val="0563C1"/>
@@ -16175,7 +16175,7 @@
       <w:r>
         <w:t xml:space="preserve">Conrad, Robert Edgar. </w:t>
       </w:r>
-      <w:hyperlink w:history="1" r:id="rIdjdpekfz4fhy4ll6qhl_sq">
+      <w:hyperlink w:history="1" r:id="rIdm2a8dvtvu0e-qunnrzpfg">
         <w:r>
           <w:rPr>
             <w:color w:val="0563C1"/>
@@ -16200,7 +16200,7 @@
         </w:rPr>
         <w:t xml:space="preserve">Brazil’s share of the Atlantic slave trade. </w:t>
       </w:r>
-      <w:hyperlink w:history="1" r:id="rIdg2vkfsa4cx8z-ght2fbe9">
+      <w:hyperlink w:history="1" r:id="rIdia_ykn2jpmagbhqphx1pb">
         <w:r>
           <w:rPr>
             <w:color w:val="0563C1"/>
@@ -16228,7 +16228,7 @@
       <w:r>
         <w:t xml:space="preserve">Smith, Peter H. </w:t>
       </w:r>
-      <w:hyperlink w:history="1" r:id="rIdl02bvxkk2jr9vpnsjfl0w">
+      <w:hyperlink w:history="1" r:id="rIdhhic_ew8p5zzeqg7o3izq">
         <w:r>
           <w:rPr>
             <w:color w:val="0563C1"/>
@@ -16256,7 +16256,7 @@
       <w:r>
         <w:t xml:space="preserve">Schlesinger, Stephen, and Stephen Kinzer. </w:t>
       </w:r>
-      <w:hyperlink w:history="1" r:id="rIdev_4r4sibokiw--srkbyc">
+      <w:hyperlink w:history="1" r:id="rId3mujl_8gceqo8uyjgiops">
         <w:r>
           <w:rPr>
             <w:color w:val="0563C1"/>
@@ -16284,7 +16284,7 @@
       <w:r>
         <w:t xml:space="preserve">Slater, Candace. </w:t>
       </w:r>
-      <w:hyperlink w:history="1" r:id="rIddzcua3b9vgs5luhdsyd3y">
+      <w:hyperlink w:history="1" r:id="rIdkti9zqddo0rf9mlrk2oty">
         <w:r>
           <w:rPr>
             <w:color w:val="0563C1"/>
@@ -16312,7 +16312,7 @@
       <w:r>
         <w:t xml:space="preserve">Taylor, Barbara L., et al. “</w:t>
       </w:r>
-      <w:hyperlink w:history="1" r:id="rIdqfgr_kqz_rqfxtll8gmxl">
+      <w:hyperlink w:history="1" r:id="rIdayv4evrq3z2mhakh74ycw">
         <w:r>
           <w:rPr>
             <w:color w:val="0563C1"/>
@@ -16340,7 +16340,7 @@
       <w:r>
         <w:t xml:space="preserve">NOAA Fisheries. “</w:t>
       </w:r>
-      <w:hyperlink w:history="1" r:id="rIdrij2cxwtlscdavuxpwwas">
+      <w:hyperlink w:history="1" r:id="rIdbd6ybzdqxjaxfxcnpvjqj">
         <w:r>
           <w:rPr>
             <w:color w:val="0563C1"/>
@@ -16368,7 +16368,7 @@
       <w:r>
         <w:t xml:space="preserve">Skidmore, Thomas E. </w:t>
       </w:r>
-      <w:hyperlink w:history="1" r:id="rIdcugkz3ur5y66mu5ddbzgj">
+      <w:hyperlink w:history="1" r:id="rId4xtyfpwj_qqgfqv4ki7ot">
         <w:r>
           <w:rPr>
             <w:color w:val="0563C1"/>
@@ -16396,7 +16396,7 @@
       <w:r>
         <w:t xml:space="preserve">Comisión Nacional sobre la Desaparición de Personas. </w:t>
       </w:r>
-      <w:hyperlink w:history="1" r:id="rIdg-ypeda7g6tdpsea5chpe">
+      <w:hyperlink w:history="1" r:id="rIdy1dzejbjujlasqnds_itw">
         <w:r>
           <w:rPr>
             <w:color w:val="0563C1"/>
@@ -16424,7 +16424,7 @@
       <w:r>
         <w:t xml:space="preserve">Nino, Carlos Santiago. </w:t>
       </w:r>
-      <w:hyperlink w:history="1" r:id="rIdanv-xzcrwmlgnaojvcrdx">
+      <w:hyperlink w:history="1" r:id="rIdgm2lprgnjuj2bwioetsnn">
         <w:r>
           <w:rPr>
             <w:color w:val="0563C1"/>
@@ -16452,7 +16452,7 @@
       <w:r>
         <w:t xml:space="preserve">Bouvard, Marguerite Guzman. </w:t>
       </w:r>
-      <w:hyperlink w:history="1" r:id="rIdgukzd5iwihrychicwef8w">
+      <w:hyperlink w:history="1" r:id="rIdvuoexmgchkzketc7dcdc8">
         <w:r>
           <w:rPr>
             <w:color w:val="0563C1"/>
@@ -16480,7 +16480,7 @@
       <w:r>
         <w:t xml:space="preserve">Kornbluh, Peter. </w:t>
       </w:r>
-      <w:hyperlink w:history="1" r:id="rId4c3dy7yoxiqzz2pj-cgob">
+      <w:hyperlink w:history="1" r:id="rId03cdk7akfszmd8ays99jw">
         <w:r>
           <w:rPr>
             <w:color w:val="0563C1"/>
@@ -16508,7 +16508,7 @@
       <w:r>
         <w:t xml:space="preserve">Jara, Joan. </w:t>
       </w:r>
-      <w:hyperlink w:history="1" r:id="rIdrmpdm37mt1kh-qygp9cmy">
+      <w:hyperlink w:history="1" r:id="rIduwtwkbzdqgrwf9ehigodr">
         <w:r>
           <w:rPr>
             <w:color w:val="0563C1"/>
@@ -16536,7 +16536,7 @@
       <w:r>
         <w:t xml:space="preserve">LeoGrande, William M., and Peter Kornbluh. </w:t>
       </w:r>
-      <w:hyperlink w:history="1" r:id="rIdyczy_gwmj33s9wvpyi1bc">
+      <w:hyperlink w:history="1" r:id="rId_evvopyzcdvufbltl8eeb">
         <w:r>
           <w:rPr>
             <w:color w:val="0563C1"/>
@@ -16596,7 +16596,7 @@
       <w:r>
         <w:t xml:space="preserve">Secretaría de Gobernación (Mexico). “</w:t>
       </w:r>
-      <w:hyperlink w:history="1" r:id="rIdygze3pp2v2jidmtyhseo1">
+      <w:hyperlink w:history="1" r:id="rIdqrcn6-9hbvd3vzva283l4">
         <w:r>
           <w:rPr>
             <w:color w:val="0563C1"/>
@@ -16644,7 +16644,7 @@
       <w:r>
         <w:t xml:space="preserve">Finkel, Caroline. </w:t>
       </w:r>
-      <w:hyperlink w:history="1" r:id="rIdeib3egmmbjakeclri_afb">
+      <w:hyperlink w:history="1" r:id="rIdh0ycfjx9liushbegclwdv">
         <w:r>
           <w:rPr>
             <w:color w:val="0563C1"/>
@@ -16672,7 +16672,7 @@
       <w:r>
         <w:t xml:space="preserve">Crowley, Roger. </w:t>
       </w:r>
-      <w:hyperlink w:history="1" r:id="rIdzmximjhrkuktgg_p49ou9">
+      <w:hyperlink w:history="1" r:id="rIdjgmhpoglkgtabtnzgnjye">
         <w:r>
           <w:rPr>
             <w:color w:val="0563C1"/>
@@ -16700,7 +16700,7 @@
       <w:r>
         <w:t xml:space="preserve">Barkey, Karen. </w:t>
       </w:r>
-      <w:hyperlink w:history="1" r:id="rIdyife4wg45e87widy6j-bc">
+      <w:hyperlink w:history="1" r:id="rIdrmipxbwnlpx_22x5w9ii2">
         <w:r>
           <w:rPr>
             <w:color w:val="0563C1"/>
@@ -16728,7 +16728,7 @@
       <w:r>
         <w:t xml:space="preserve">Mazower, Mark. </w:t>
       </w:r>
-      <w:hyperlink w:history="1" r:id="rIdvuu3cgs-nb7vkvvf2-ytu">
+      <w:hyperlink w:history="1" r:id="rId_-b8b_cq5xtqykwi287_l">
         <w:r>
           <w:rPr>
             <w:color w:val="0563C1"/>
@@ -16756,7 +16756,7 @@
       <w:r>
         <w:t xml:space="preserve">Suny, Ronald Grigor. “</w:t>
       </w:r>
-      <w:hyperlink w:history="1" r:id="rIdly1dsm6qdihsxpbohsglj">
+      <w:hyperlink w:history="1" r:id="rIdladuxnzxfg4rouaoihtvc">
         <w:r>
           <w:rPr>
             <w:color w:val="0563C1"/>
@@ -16784,7 +16784,7 @@
       <w:r>
         <w:t xml:space="preserve">Power, Samantha. “</w:t>
       </w:r>
-      <w:hyperlink w:history="1" r:id="rIdm4b3h3ph_kdy-bpdrvcjz">
+      <w:hyperlink w:history="1" r:id="rId-q3hyz9jegnuoiprrpxr-">
         <w:r>
           <w:rPr>
             <w:color w:val="0563C1"/>
@@ -16812,7 +16812,7 @@
       <w:r>
         <w:t xml:space="preserve">Hirschon, Renée, ed. </w:t>
       </w:r>
-      <w:hyperlink w:history="1" r:id="rIdq8oqkxnr6witmmc9z113v">
+      <w:hyperlink w:history="1" r:id="rIdsmw96i4dorglvxeyg_acj">
         <w:r>
           <w:rPr>
             <w:color w:val="0563C1"/>
@@ -16840,7 +16840,7 @@
       <w:r>
         <w:t xml:space="preserve">Rogan, Eugene. </w:t>
       </w:r>
-      <w:hyperlink w:history="1" r:id="rIdfgzubqf9j4ooipv6hbiyq">
+      <w:hyperlink w:history="1" r:id="rIda5blrx7h8niakwnyfecph">
         <w:r>
           <w:rPr>
             <w:color w:val="0563C1"/>
@@ -16868,7 +16868,7 @@
       <w:r>
         <w:t xml:space="preserve">Barr, James. </w:t>
       </w:r>
-      <w:hyperlink w:history="1" r:id="rIdpl8xxlzmn-steroqkbn3y">
+      <w:hyperlink w:history="1" r:id="rIdyzxy8ewuqqpmfftid-e2h">
         <w:r>
           <w:rPr>
             <w:color w:val="0563C1"/>
@@ -16896,7 +16896,7 @@
       <w:r>
         <w:t xml:space="preserve">McDowall, David. </w:t>
       </w:r>
-      <w:hyperlink w:history="1" r:id="rId6ek5gs-1zebbmctwbprw2">
+      <w:hyperlink w:history="1" r:id="rIdppqpzx-ly1ikcprgwkl8s">
         <w:r>
           <w:rPr>
             <w:color w:val="0563C1"/>
@@ -16924,7 +16924,7 @@
       <w:r>
         <w:t xml:space="preserve">Abrahamian, Ervand. </w:t>
       </w:r>
-      <w:hyperlink w:history="1" r:id="rId6mqnvjokjrmffautxsbax">
+      <w:hyperlink w:history="1" r:id="rIdow0vr5txvembryitp3acd">
         <w:r>
           <w:rPr>
             <w:color w:val="0563C1"/>
@@ -16952,7 +16952,7 @@
       <w:r>
         <w:t xml:space="preserve">Razoux, Pierre. </w:t>
       </w:r>
-      <w:hyperlink w:history="1" r:id="rIdvf_fndaj16qktdqzkwm0d">
+      <w:hyperlink w:history="1" r:id="rIdoozllfpd6eepsk9d04xfu">
         <w:r>
           <w:rPr>
             <w:color w:val="0563C1"/>
@@ -17000,7 +17000,7 @@
       <w:r>
         <w:t xml:space="preserve">Clark, Christopher. </w:t>
       </w:r>
-      <w:hyperlink w:history="1" r:id="rIdmgkba_xbbloshplz3mh5t">
+      <w:hyperlink w:history="1" r:id="rIdz8xzofbgnpmnwcjuafd3m">
         <w:r>
           <w:rPr>
             <w:color w:val="0563C1"/>
@@ -17028,7 +17028,7 @@
       <w:r>
         <w:t xml:space="preserve">Strachan, Hew. </w:t>
       </w:r>
-      <w:hyperlink w:history="1" r:id="rIdu6whparqb8mj2axc8dgy_">
+      <w:hyperlink w:history="1" r:id="rIdkxwqtacp2xcys4f4v4dej">
         <w:r>
           <w:rPr>
             <w:color w:val="0563C1"/>
@@ -17072,7 +17072,7 @@
       <w:r>
         <w:t xml:space="preserve">Weintraub, Stanley. </w:t>
       </w:r>
-      <w:hyperlink w:history="1" r:id="rIdi6rqarqvvqwfigjiryykv">
+      <w:hyperlink w:history="1" r:id="rId6-yqmovkzadevhrjlzhl1">
         <w:r>
           <w:rPr>
             <w:color w:val="0563C1"/>
@@ -17100,7 +17100,7 @@
       <w:r>
         <w:t xml:space="preserve">Johnson, Niall P. A. S., and Juergen Mueller. “</w:t>
       </w:r>
-      <w:hyperlink w:history="1" r:id="rId4ubyingmq1_cpnailcvw8">
+      <w:hyperlink w:history="1" r:id="rIdv2oqb2bcmfirztvcy16nq">
         <w:r>
           <w:rPr>
             <w:color w:val="0563C1"/>
@@ -17128,7 +17128,7 @@
       <w:r>
         <w:t xml:space="preserve">Spreeuwenberg, Peter, et al. “</w:t>
       </w:r>
-      <w:hyperlink w:history="1" r:id="rIdncedspa8dwuhhga2nwyqn">
+      <w:hyperlink w:history="1" r:id="rId_br4sytun5u81_n31asmm">
         <w:r>
           <w:rPr>
             <w:color w:val="0563C1"/>
@@ -17156,7 +17156,7 @@
       <w:r>
         <w:t xml:space="preserve">Keynes, John Maynard. </w:t>
       </w:r>
-      <w:hyperlink w:history="1" r:id="rIddcltkgahcdzq112srvaxj">
+      <w:hyperlink w:history="1" r:id="rIdctasxmqu8seumn9xc499t">
         <w:r>
           <w:rPr>
             <w:color w:val="0563C1"/>
@@ -17204,7 +17204,7 @@
       <w:r>
         <w:t xml:space="preserve">Evans, Richard J. </w:t>
       </w:r>
-      <w:hyperlink w:history="1" r:id="rIdff2go47b56atxfc9nbdcy">
+      <w:hyperlink w:history="1" r:id="rIdc1yhxjtuzpax2emvl5w4u">
         <w:r>
           <w:rPr>
             <w:color w:val="0563C1"/>
@@ -17232,7 +17232,7 @@
       <w:r>
         <w:t xml:space="preserve">Hilberg, Raul. </w:t>
       </w:r>
-      <w:hyperlink w:history="1" r:id="rIdxoifpwhj1eqow0mhnf_zf">
+      <w:hyperlink w:history="1" r:id="rId0yarr6ig6gnwtee5qvm4t">
         <w:r>
           <w:rPr>
             <w:color w:val="0563C1"/>
@@ -17260,7 +17260,7 @@
       <w:r>
         <w:t xml:space="preserve">Kiernan, Ben. </w:t>
       </w:r>
-      <w:hyperlink w:history="1" r:id="rIdrrnji2scmhvab5kk2wp8e">
+      <w:hyperlink w:history="1" r:id="rId2lytqgwz9rwtpjndc5p4l">
         <w:r>
           <w:rPr>
             <w:color w:val="0563C1"/>
@@ -17288,7 +17288,7 @@
       <w:r>
         <w:t xml:space="preserve">Levitsky, Steven, and Daniel Ziblatt. </w:t>
       </w:r>
-      <w:hyperlink w:history="1" r:id="rIdqx1virrd2y_duoibmr9no">
+      <w:hyperlink w:history="1" r:id="rId7twh8mvo0cmacuehbdq0d">
         <w:r>
           <w:rPr>
             <w:color w:val="0563C1"/>
@@ -17316,7 +17316,7 @@
       <w:r>
         <w:t xml:space="preserve">Neiman, Susan. </w:t>
       </w:r>
-      <w:hyperlink w:history="1" r:id="rIdqhi6vuj9l283kwx7xwsb3">
+      <w:hyperlink w:history="1" r:id="rIdy8i_lzjgflhaajn90ov-l">
         <w:r>
           <w:rPr>
             <w:color w:val="0563C1"/>
@@ -17360,7 +17360,7 @@
       <w:r>
         <w:t xml:space="preserve">Broberg, Gunnar, and Nils Roll-Hansen, eds. </w:t>
       </w:r>
-      <w:hyperlink w:history="1" r:id="rIdoxgftuhziglggmuuekigt">
+      <w:hyperlink w:history="1" r:id="rIdoowlfisa9qcpvpp1onbbz">
         <w:r>
           <w:rPr>
             <w:color w:val="0563C1"/>
@@ -17408,7 +17408,7 @@
       <w:r>
         <w:t xml:space="preserve">Jansen, Marius B. </w:t>
       </w:r>
-      <w:hyperlink w:history="1" r:id="rIdyu2l7vrofxdlyuzab53df">
+      <w:hyperlink w:history="1" r:id="rIdgioytkhb2h4fqkfbwaqef">
         <w:r>
           <w:rPr>
             <w:color w:val="0563C1"/>
@@ -17436,7 +17436,7 @@
       <w:r>
         <w:t xml:space="preserve">Fogel, Joshua A., ed. </w:t>
       </w:r>
-      <w:hyperlink w:history="1" r:id="rIdd_h3fuu3d5zgex2yfsigz">
+      <w:hyperlink w:history="1" r:id="rIdhsu8bmrspfeisrkp0vwfm">
         <w:r>
           <w:rPr>
             <w:color w:val="0563C1"/>
@@ -17464,7 +17464,7 @@
       <w:r>
         <w:t xml:space="preserve">Ohnuki-Tierney, Emiko. </w:t>
       </w:r>
-      <w:hyperlink w:history="1" r:id="rIdai1lt1mgm2mcgyuyksjre">
+      <w:hyperlink w:history="1" r:id="rIdywfwknsmmc86lknstkevk">
         <w:r>
           <w:rPr>
             <w:color w:val="0563C1"/>
@@ -17492,7 +17492,7 @@
       <w:r>
         <w:t xml:space="preserve">Dower, John W. </w:t>
       </w:r>
-      <w:hyperlink w:history="1" r:id="rIdsn76uuojlxqf6kvmvrklw">
+      <w:hyperlink w:history="1" r:id="rId76c8lr74y47kcuagaq91d">
         <w:r>
           <w:rPr>
             <w:color w:val="0563C1"/>
@@ -17540,7 +17540,7 @@
       <w:r>
         <w:t xml:space="preserve">Duggan, Christopher. </w:t>
       </w:r>
-      <w:hyperlink w:history="1" r:id="rIdd6skpiv8o8_efxpwh1-4m">
+      <w:hyperlink w:history="1" r:id="rIde8ea7oscg4-dlke8qvakv">
         <w:r>
           <w:rPr>
             <w:color w:val="0563C1"/>
@@ -17568,7 +17568,7 @@
       <w:r>
         <w:t xml:space="preserve">Bosworth, R. J. B. </w:t>
       </w:r>
-      <w:hyperlink w:history="1" r:id="rIdrzuyoc4p1eti11ww7hude">
+      <w:hyperlink w:history="1" r:id="rIdbunigncipbndtlent8rao">
         <w:r>
           <w:rPr>
             <w:color w:val="0563C1"/>
@@ -17596,7 +17596,7 @@
       <w:r>
         <w:t xml:space="preserve">Domenico, Roy Palmer. </w:t>
       </w:r>
-      <w:hyperlink w:history="1" r:id="rIdnlhf8vnti-iav9pricsoy">
+      <w:hyperlink w:history="1" r:id="rIdckulz4hchxt_09p7qh7dv">
         <w:r>
           <w:rPr>
             <w:color w:val="0563C1"/>
@@ -17644,7 +17644,7 @@
       <w:r>
         <w:t xml:space="preserve">Menocal, María Rosa. </w:t>
       </w:r>
-      <w:hyperlink w:history="1" r:id="rIdhuch5yxuku_gjwbpf_htw">
+      <w:hyperlink w:history="1" r:id="rIdowqh49itpf-vdcgei32ov">
         <w:r>
           <w:rPr>
             <w:color w:val="0563C1"/>
@@ -17672,7 +17672,7 @@
       <w:r>
         <w:t xml:space="preserve">Fernández-Morera, Darío. </w:t>
       </w:r>
-      <w:hyperlink w:history="1" r:id="rIdricp601bid5olpf8jwrn4">
+      <w:hyperlink w:history="1" r:id="rIdy4ks-jstd1jdokkcrsinr">
         <w:r>
           <w:rPr>
             <w:color w:val="0563C1"/>
@@ -17700,7 +17700,7 @@
       <w:r>
         <w:t xml:space="preserve">Kraemer, Joel L. </w:t>
       </w:r>
-      <w:hyperlink w:history="1" r:id="rIdszs8k7x9tdjtbqlionqor">
+      <w:hyperlink w:history="1" r:id="rIdhp_20k6b3gnpuyzph_r6w">
         <w:r>
           <w:rPr>
             <w:color w:val="0563C1"/>
@@ -17728,7 +17728,7 @@
       <w:r>
         <w:t xml:space="preserve">Preston, Paul. </w:t>
       </w:r>
-      <w:hyperlink w:history="1" r:id="rIdcrdtdai46aq-focgox3uy">
+      <w:hyperlink w:history="1" r:id="rId57d-6ed_izgstrkb3f-3a">
         <w:r>
           <w:rPr>
             <w:color w:val="0563C1"/>
@@ -17756,7 +17756,7 @@
       <w:r>
         <w:t xml:space="preserve">Aguilar, Paloma. </w:t>
       </w:r>
-      <w:hyperlink w:history="1" r:id="rId86bbtyeuo6xqutok8y8fs">
+      <w:hyperlink w:history="1" r:id="rIdwcjat-08rey87gxn9l3dv">
         <w:r>
           <w:rPr>
             <w:color w:val="0563C1"/>
@@ -17820,7 +17820,7 @@
       <w:r>
         <w:t xml:space="preserve">Applebaum, Anne. </w:t>
       </w:r>
-      <w:hyperlink w:history="1" r:id="rIdbe9vgpqokze-zgooyagh9">
+      <w:hyperlink w:history="1" r:id="rId3thnrxgn_p6sldsp1au1r">
         <w:r>
           <w:rPr>
             <w:color w:val="0563C1"/>
@@ -17848,7 +17848,7 @@
       <w:r>
         <w:t xml:space="preserve">Applebaum, Anne. </w:t>
       </w:r>
-      <w:hyperlink w:history="1" r:id="rIdulhkgjqwlibzv6_drpjp_">
+      <w:hyperlink w:history="1" r:id="rIdttoljuog5pepet7hb39ac">
         <w:r>
           <w:rPr>
             <w:color w:val="0563C1"/>
@@ -17876,7 +17876,7 @@
       <w:r>
         <w:t xml:space="preserve">Sanford, George. </w:t>
       </w:r>
-      <w:hyperlink w:history="1" r:id="rIdbbxb8t17iujbbyw8onfzu">
+      <w:hyperlink w:history="1" r:id="rIddtdsngulfw_zcmo_aknto">
         <w:r>
           <w:rPr>
             <w:color w:val="0563C1"/>
@@ -17904,7 +17904,7 @@
       <w:r>
         <w:t xml:space="preserve">Plokhy, Serhii. </w:t>
       </w:r>
-      <w:hyperlink w:history="1" r:id="rIdsraabfcy8izlwmu_vgklm">
+      <w:hyperlink w:history="1" r:id="rIdk4_en1_o5qfic34kwcrca">
         <w:r>
           <w:rPr>
             <w:color w:val="0563C1"/>
@@ -17932,7 +17932,7 @@
       <w:r>
         <w:t xml:space="preserve">Roberts, Geoffrey. </w:t>
       </w:r>
-      <w:hyperlink w:history="1" r:id="rIdjfsfvixioka77uk8nyim4">
+      <w:hyperlink w:history="1" r:id="rIdxvrbhzs4coewnpvcnj3ri">
         <w:r>
           <w:rPr>
             <w:color w:val="0563C1"/>
@@ -17980,7 +17980,7 @@
       <w:r>
         <w:t xml:space="preserve">Dikötter, Frank. </w:t>
       </w:r>
-      <w:hyperlink w:history="1" r:id="rId_ixwqpgfwdlbx-c3udiyh">
+      <w:hyperlink w:history="1" r:id="rIdnvzfw9pawrb7hsqh-sxe7">
         <w:r>
           <w:rPr>
             <w:color w:val="0563C1"/>
@@ -18008,7 +18008,7 @@
       <w:r>
         <w:t xml:space="preserve">Yang Jisheng. </w:t>
       </w:r>
-      <w:hyperlink w:history="1" r:id="rId2gi9wlh_cnqelvfaklfs0">
+      <w:hyperlink w:history="1" r:id="rIdep5t8iww1oblaulyksc2c">
         <w:r>
           <w:rPr>
             <w:color w:val="0563C1"/>
@@ -18036,7 +18036,7 @@
       <w:r>
         <w:t xml:space="preserve">MacFarquhar, Roderick, and Michael Schoenhals. </w:t>
       </w:r>
-      <w:hyperlink w:history="1" r:id="rIdzonsvuohzg1c5v97ihdyp">
+      <w:hyperlink w:history="1" r:id="rIdljmrbsavph7ywhtmfpu6r">
         <w:r>
           <w:rPr>
             <w:color w:val="0563C1"/>
@@ -18064,7 +18064,7 @@
       <w:r>
         <w:t xml:space="preserve">Jambeck, Jenna R., et al. “</w:t>
       </w:r>
-      <w:hyperlink w:history="1" r:id="rIdtjfymeerjorqd2eoquwx0">
+      <w:hyperlink w:history="1" r:id="rIdgbtpgfn5fny2gnj_jj7do">
         <w:r>
           <w:rPr>
             <w:color w:val="0563C1"/>
@@ -18092,7 +18092,7 @@
       <w:r>
         <w:t xml:space="preserve">Meijer, Lourens J. J., et al. “</w:t>
       </w:r>
-      <w:hyperlink w:history="1" r:id="rId9bypwdbbo0okua3awqosj">
+      <w:hyperlink w:history="1" r:id="rIdfsygahtl5eyr5apbx2t3q">
         <w:r>
           <w:rPr>
             <w:color w:val="0563C1"/>
@@ -18120,7 +18120,7 @@
       <w:r>
         <w:t xml:space="preserve">Economy, Elizabeth C. </w:t>
       </w:r>
-      <w:hyperlink w:history="1" r:id="rIdzkyd2q705ttqh_7wenee8">
+      <w:hyperlink w:history="1" r:id="rId7trfjehgaivew7-dcqgqy">
         <w:r>
           <w:rPr>
             <w:color w:val="0563C1"/>
@@ -18180,7 +18180,7 @@
       <w:r>
         <w:t xml:space="preserve">McDonell, Stephen. “</w:t>
       </w:r>
-      <w:hyperlink w:history="1" r:id="rIdsas4smmzofk2lxracrau0">
+      <w:hyperlink w:history="1" r:id="rIdloxtse9n0ixgmu69v_diw">
         <w:r>
           <w:rPr>
             <w:color w:val="0563C1"/>
@@ -18208,7 +18208,7 @@
       <w:r>
         <w:t xml:space="preserve">Agence France-Presse. “‘Oh, Bother’: </w:t>
       </w:r>
-      <w:hyperlink w:history="1" r:id="rIdfa7ajfue5imw8ha1mdp-4">
+      <w:hyperlink w:history="1" r:id="rIdkwpvsnskgxj0cktdp3yy3">
         <w:r>
           <w:rPr>
             <w:color w:val="0563C1"/>
@@ -18256,7 +18256,7 @@
       <w:r>
         <w:t xml:space="preserve">Schama, Simon. </w:t>
       </w:r>
-      <w:hyperlink w:history="1" r:id="rId1wof9dd69r8ojdc2eqsyu">
+      <w:hyperlink w:history="1" r:id="rIdmwa_dnqny9tcvgcmimz6c">
         <w:r>
           <w:rPr>
             <w:color w:val="0563C1"/>
@@ -18284,7 +18284,7 @@
       <w:r>
         <w:t xml:space="preserve">Finkelstein, Israel, and Neil Asher Silberman. </w:t>
       </w:r>
-      <w:hyperlink w:history="1" r:id="rIdxeenvxfsm5rxio_4wnzsp">
+      <w:hyperlink w:history="1" r:id="rIdrgtjuo3p4kmw7qeyv8zbz">
         <w:r>
           <w:rPr>
             <w:color w:val="0563C1"/>
@@ -18312,7 +18312,7 @@
       <w:r>
         <w:t xml:space="preserve">VanderKam, James C. </w:t>
       </w:r>
-      <w:hyperlink w:history="1" r:id="rIdgmyhzgy1nho96sso_dq11">
+      <w:hyperlink w:history="1" r:id="rIdnbuytadlrmandy-uoenry">
         <w:r>
           <w:rPr>
             <w:color w:val="0563C1"/>
@@ -18340,7 +18340,7 @@
       <w:r>
         <w:t xml:space="preserve">Magness, Jodi. </w:t>
       </w:r>
-      <w:hyperlink w:history="1" r:id="rIdipjrba1hwuoawlm6sd_t_">
+      <w:hyperlink w:history="1" r:id="rIdlh148ggo2gmbiyhztceum">
         <w:r>
           <w:rPr>
             <w:color w:val="0563C1"/>
@@ -18368,7 +18368,7 @@
       <w:r>
         <w:t xml:space="preserve">Morris, Benny. </w:t>
       </w:r>
-      <w:hyperlink w:history="1" r:id="rId-ic8mjkwplfk88mjgxo7r">
+      <w:hyperlink w:history="1" r:id="rId01wesiqcmuil7ophsdshp">
         <w:r>
           <w:rPr>
             <w:color w:val="0563C1"/>
@@ -18416,7 +18416,7 @@
       <w:r>
         <w:t xml:space="preserve">Gaddis, John Lewis. </w:t>
       </w:r>
-      <w:hyperlink w:history="1" r:id="rId0bbb7es-outwxsgnfgf3o">
+      <w:hyperlink w:history="1" r:id="rIdubqe1do6lyhulxz9qp92_">
         <w:r>
           <w:rPr>
             <w:color w:val="0563C1"/>
@@ -18444,7 +18444,7 @@
       <w:r>
         <w:t xml:space="preserve">Savranskaya, Svetlana V. “</w:t>
       </w:r>
-      <w:hyperlink w:history="1" r:id="rIdjvqsdgx-kye7r-irlysqn">
+      <w:hyperlink w:history="1" r:id="rId2cr3y7wb2omrind0kwgy3">
         <w:r>
           <w:rPr>
             <w:color w:val="0563C1"/>
@@ -18472,7 +18472,7 @@
       <w:r>
         <w:t xml:space="preserve">Hoffman, David E. </w:t>
       </w:r>
-      <w:hyperlink w:history="1" r:id="rIdhhbunnzteygjztn0htmmq">
+      <w:hyperlink w:history="1" r:id="rIdaqeq7ngsa4vipbnwamv0z">
         <w:r>
           <w:rPr>
             <w:color w:val="0563C1"/>
@@ -18500,7 +18500,7 @@
       <w:r>
         <w:t xml:space="preserve">Rhodes, Richard. </w:t>
       </w:r>
-      <w:hyperlink w:history="1" r:id="rIdbi0slpsnqvwln0bzibdf9">
+      <w:hyperlink w:history="1" r:id="rId48qjjlxg9nlocveatxdbr">
         <w:r>
           <w:rPr>
             <w:color w:val="0563C1"/>
@@ -18528,7 +18528,7 @@
       <w:r>
         <w:t xml:space="preserve">Niedenthal, Jack. </w:t>
       </w:r>
-      <w:hyperlink w:history="1" r:id="rIdi0axs5euffz1zqmtgxzxi">
+      <w:hyperlink w:history="1" r:id="rIddn30nyi3yitejhuit9gn0">
         <w:r>
           <w:rPr>
             <w:color w:val="0563C1"/>
@@ -18576,7 +18576,7 @@
       <w:r>
         <w:t xml:space="preserve">NASA. “</w:t>
       </w:r>
-      <w:hyperlink w:history="1" r:id="rIdlznjc0smyhxbjmxdqxvhm">
+      <w:hyperlink w:history="1" r:id="rIdkmidpn-rsgjs2qbd81exz">
         <w:r>
           <w:rPr>
             <w:color w:val="0563C1"/>
@@ -18604,7 +18604,7 @@
       <w:r>
         <w:t xml:space="preserve">Chaikin, Andrew. </w:t>
       </w:r>
-      <w:hyperlink w:history="1" r:id="rId8rv3om8mmy9fgils5ywxc">
+      <w:hyperlink w:history="1" r:id="rId7hcovhhhpuyyk5zqmbh7g">
         <w:r>
           <w:rPr>
             <w:color w:val="0563C1"/>
@@ -18632,7 +18632,7 @@
       <w:r>
         <w:t xml:space="preserve">Siddiqi, Asif A. </w:t>
       </w:r>
-      <w:hyperlink w:history="1" r:id="rIdwq1xn4i51vo29w9dkvzp8">
+      <w:hyperlink w:history="1" r:id="rIdkgxsciygiogprhz6ih9cd">
         <w:r>
           <w:rPr>
             <w:color w:val="0563C1"/>
@@ -18660,7 +18660,7 @@
       <w:r>
         <w:t xml:space="preserve">Colaprete, Anthony, et al. “</w:t>
       </w:r>
-      <w:hyperlink w:history="1" r:id="rIdgvhqfiaygggagy72-5l6u">
+      <w:hyperlink w:history="1" r:id="rIdj7hahkwhxgn8qe_myohvb">
         <w:r>
           <w:rPr>
             <w:color w:val="0563C1"/>
@@ -18688,7 +18688,7 @@
       <w:r>
         <w:t xml:space="preserve">Sheehan, William. </w:t>
       </w:r>
-      <w:hyperlink w:history="1" r:id="rIdg6fdulcoabjz3422htd2o">
+      <w:hyperlink w:history="1" r:id="rIdnogf7k9z1t92r2pcfbqiz">
         <w:r>
           <w:rPr>
             <w:color w:val="0563C1"/>
@@ -18716,7 +18716,7 @@
       <w:r>
         <w:t xml:space="preserve">Grotzinger, John P., et al. “</w:t>
       </w:r>
-      <w:hyperlink w:history="1" r:id="rIdijquiknowwn5d0gaqdwox">
+      <w:hyperlink w:history="1" r:id="rIdzmfc4xvd2fslofg2g7tfl">
         <w:r>
           <w:rPr>
             <w:color w:val="0563C1"/>
@@ -18744,7 +18744,7 @@
       <w:r>
         <w:t xml:space="preserve">Mangold, Nicolas, et al. “</w:t>
       </w:r>
-      <w:hyperlink w:history="1" r:id="rIdv-epplyjarv0xemnzr3cg">
+      <w:hyperlink w:history="1" r:id="rIda5ooghfbexq2hur38eub2">
         <w:r>
           <w:rPr>
             <w:color w:val="0563C1"/>
@@ -18792,7 +18792,7 @@
       <w:r>
         <w:t xml:space="preserve">Ashby, Neil. “</w:t>
       </w:r>
-      <w:hyperlink w:history="1" r:id="rIdagbpph7ofx6a9z5jxdzoy">
+      <w:hyperlink w:history="1" r:id="rIdmg9fbukkfk9lhxp7st2qi">
         <w:r>
           <w:rPr>
             <w:color w:val="0563C1"/>
@@ -18820,7 +18820,7 @@
       <w:r>
         <w:t xml:space="preserve">Dyson, F. W., A. S. Eddington, and C. Davidson. “</w:t>
       </w:r>
-      <w:hyperlink w:history="1" r:id="rId1wkypdsgxorffsmghqzz-">
+      <w:hyperlink w:history="1" r:id="rIdwvibc8lrlihrqvrutc7kf">
         <w:r>
           <w:rPr>
             <w:color w:val="0563C1"/>
@@ -18848,7 +18848,7 @@
       <w:r>
         <w:t xml:space="preserve">Au, Whitlow W. L. </w:t>
       </w:r>
-      <w:hyperlink w:history="1" r:id="rIdedgohmlnp2jftdcrtnqq8">
+      <w:hyperlink w:history="1" r:id="rIdrmpbyvagsbhigiid7_ghs">
         <w:r>
           <w:rPr>
             <w:color w:val="0563C1"/>
@@ -18876,7 +18876,7 @@
       <w:r>
         <w:t xml:space="preserve">Susskind, Leonard. “</w:t>
       </w:r>
-      <w:hyperlink w:history="1" r:id="rIdfkchxahqfav_3nsjabsyr">
+      <w:hyperlink w:history="1" r:id="rId8lmdh7ncjp5ed7al1zzh7">
         <w:r>
           <w:rPr>
             <w:color w:val="0563C1"/>
@@ -18904,7 +18904,7 @@
       <w:r>
         <w:t xml:space="preserve">Scerri, Eric R. </w:t>
       </w:r>
-      <w:hyperlink w:history="1" r:id="rId6s309ig6a62ee9hliflay">
+      <w:hyperlink w:history="1" r:id="rIduda36cqviqtkro8epagdi">
         <w:r>
           <w:rPr>
             <w:color w:val="0563C1"/>
@@ -18932,7 +18932,7 @@
       <w:r>
         <w:t xml:space="preserve">Erisman, Jan Willem, et al. “</w:t>
       </w:r>
-      <w:hyperlink w:history="1" r:id="rIdhhjineuw3i6mjzgvnthww">
+      <w:hyperlink w:history="1" r:id="rIdsghktuejc_yb0pl136k_p">
         <w:r>
           <w:rPr>
             <w:color w:val="0563C1"/>
@@ -18960,7 +18960,7 @@
       <w:r>
         <w:t xml:space="preserve">Watson, J. D., and F. H. C. Crick. “</w:t>
       </w:r>
-      <w:hyperlink w:history="1" r:id="rIdy40vjwagnmf30o1k4a8a_">
+      <w:hyperlink w:history="1" r:id="rId-pgtodobuornd-dv2ugux">
         <w:r>
           <w:rPr>
             <w:color w:val="0563C1"/>
@@ -18988,7 +18988,7 @@
       <w:r>
         <w:t xml:space="preserve">Franklin, Rosalind E., and R. G. Gosling. “</w:t>
       </w:r>
-      <w:hyperlink w:history="1" r:id="rIdjsjtvh1jisruygyhzq94s">
+      <w:hyperlink w:history="1" r:id="rId0gxauz3ovxeg3vl8oubbr">
         <w:r>
           <w:rPr>
             <w:color w:val="0563C1"/>
@@ -19016,7 +19016,7 @@
       <w:r>
         <w:t xml:space="preserve">International Human Genome Sequencing Consortium. “</w:t>
       </w:r>
-      <w:hyperlink w:history="1" r:id="rIdn7fhocvgp0ugqa7buy3ba">
+      <w:hyperlink w:history="1" r:id="rIduitwmygg6rnwmiorxg5vg">
         <w:r>
           <w:rPr>
             <w:color w:val="0563C1"/>
@@ -19044,7 +19044,7 @@
       <w:r>
         <w:t xml:space="preserve">International Human Genome Sequencing Consortium. “</w:t>
       </w:r>
-      <w:hyperlink w:history="1" r:id="rId7tynvctbbrer6gvtveee8">
+      <w:hyperlink w:history="1" r:id="rIdngcxupcqqavqxynmaojac">
         <w:r>
           <w:rPr>
             <w:color w:val="0563C1"/>
@@ -19072,7 +19072,7 @@
       <w:r>
         <w:t xml:space="preserve">Nurk, Sergey, et al. “</w:t>
       </w:r>
-      <w:hyperlink w:history="1" r:id="rIdb8krb4ioyck2ylh57otp_">
+      <w:hyperlink w:history="1" r:id="rIdjghjjx4wvxrhebjziolfi">
         <w:r>
           <w:rPr>
             <w:color w:val="0563C1"/>
@@ -19100,7 +19100,7 @@
       <w:r>
         <w:t xml:space="preserve">Vine, F. J., and D. H. Matthews. “</w:t>
       </w:r>
-      <w:hyperlink w:history="1" r:id="rIdejkoj6negvlqmbnkdoisj">
+      <w:hyperlink w:history="1" r:id="rIdtn3dv2uzoykn2x7ockfit">
         <w:r>
           <w:rPr>
             <w:color w:val="0563C1"/>
@@ -19128,7 +19128,7 @@
       <w:r>
         <w:t xml:space="preserve">Alpher, Ralph A., and Robert Herman. “</w:t>
       </w:r>
-      <w:hyperlink w:history="1" r:id="rIdxjlm31otrq-lu7o3f4o_9">
+      <w:hyperlink w:history="1" r:id="rIdwmhzzi1ilthcfishrjdog">
         <w:r>
           <w:rPr>
             <w:color w:val="0563C1"/>
@@ -19156,7 +19156,7 @@
       <w:r>
         <w:t xml:space="preserve">Penzias, A. A., and R. W. Wilson. “</w:t>
       </w:r>
-      <w:hyperlink w:history="1" r:id="rIdjzmnxaxjzjnylxoz-7ar_">
+      <w:hyperlink w:history="1" r:id="rIden0es8vjfx2eepctoayos">
         <w:r>
           <w:rPr>
             <w:color w:val="0563C1"/>
@@ -19184,7 +19184,7 @@
       <w:r>
         <w:t xml:space="preserve">Fleischmann, Martin, and Stanley Pons. “</w:t>
       </w:r>
-      <w:hyperlink w:history="1" r:id="rIdeewwhibagwoa9q04fkvky">
+      <w:hyperlink w:history="1" r:id="rIdayjdnaye-fsgqzkasa_wx">
         <w:r>
           <w:rPr>
             <w:color w:val="0563C1"/>
@@ -19212,7 +19212,7 @@
       <w:r>
         <w:t xml:space="preserve">Wolfe-Simon, Felisa, et al. “</w:t>
       </w:r>
-      <w:hyperlink w:history="1" r:id="rIdyuyookpxn8tqbn4fcpjye">
+      <w:hyperlink w:history="1" r:id="rIdguzscqj-ijspecjbyaitm">
         <w:r>
           <w:rPr>
             <w:color w:val="0563C1"/>
@@ -19240,7 +19240,7 @@
       <w:r>
         <w:t xml:space="preserve">Reaves, Marshall Louis, et al. “</w:t>
       </w:r>
-      <w:hyperlink w:history="1" r:id="rIda-v54mggpq5cnhsoko_qp">
+      <w:hyperlink w:history="1" r:id="rIdaistsdiwbokyqdd31oyza">
         <w:r>
           <w:rPr>
             <w:color w:val="0563C1"/>
@@ -19288,7 +19288,7 @@
       <w:r>
         <w:t xml:space="preserve">Dalrymple, William. </w:t>
       </w:r>
-      <w:hyperlink w:history="1" r:id="rIdyanzewnrte6fqaysres67">
+      <w:hyperlink w:history="1" r:id="rId3eswifc_mrlxjc1dapdkd">
         <w:r>
           <w:rPr>
             <w:color w:val="0563C1"/>
@@ -19316,7 +19316,7 @@
       <w:r>
         <w:t xml:space="preserve">Maddison, Angus. </w:t>
       </w:r>
-      <w:hyperlink w:history="1" r:id="rIdocps6ewg0qq3ot2rhtzj9">
+      <w:hyperlink w:history="1" r:id="rIdmst4dkhrfmh_hxhzaeukp">
         <w:r>
           <w:rPr>
             <w:color w:val="0563C1"/>
@@ -19344,7 +19344,7 @@
       <w:r>
         <w:t xml:space="preserve">Sen, Amartya. </w:t>
       </w:r>
-      <w:hyperlink w:history="1" r:id="rId3noex-h5n5v008y72tyog">
+      <w:hyperlink w:history="1" r:id="rIdgnpc_etzbaieh-ecvhab3">
         <w:r>
           <w:rPr>
             <w:color w:val="0563C1"/>
@@ -19372,7 +19372,7 @@
       <w:r>
         <w:t xml:space="preserve">Khan, Yasmin. </w:t>
       </w:r>
-      <w:hyperlink w:history="1" r:id="rId7x3run1qhbgqgcqnb9zfd">
+      <w:hyperlink w:history="1" r:id="rIdc6ijvju18cgsb9p01fikl">
         <w:r>
           <w:rPr>
             <w:color w:val="0563C1"/>
@@ -19400,7 +19400,7 @@
       <w:r>
         <w:t xml:space="preserve">Elkins, Caroline. </w:t>
       </w:r>
-      <w:hyperlink w:history="1" r:id="rIdbgeeajyq5hbkgxbzxaylx">
+      <w:hyperlink w:history="1" r:id="rIdity-aevr5cmkqlktnmlxj">
         <w:r>
           <w:rPr>
             <w:color w:val="0563C1"/>
@@ -19428,7 +19428,7 @@
       <w:r>
         <w:t xml:space="preserve">Jansen, Jan C., and Jürgen Osterhammel. </w:t>
       </w:r>
-      <w:hyperlink w:history="1" r:id="rIdv4lvadqargskx5rdvfxg4">
+      <w:hyperlink w:history="1" r:id="rIdxcjexpo6tq3ah8hua_n-w">
         <w:r>
           <w:rPr>
             <w:color w:val="0563C1"/>
@@ -19456,7 +19456,7 @@
       <w:r>
         <w:t xml:space="preserve">Des Forges, Alison. </w:t>
       </w:r>
-      <w:hyperlink w:history="1" r:id="rIdxovfdoggbddgdzarzsjb0">
+      <w:hyperlink w:history="1" r:id="rIdeqchileorjjfls3rlqirc">
         <w:r>
           <w:rPr>
             <w:color w:val="0563C1"/>
@@ -19484,7 +19484,7 @@
       <w:r>
         <w:t xml:space="preserve">Newbury, Catharine. </w:t>
       </w:r>
-      <w:hyperlink w:history="1" r:id="rIdanzxex965cigsa9iexsdt">
+      <w:hyperlink w:history="1" r:id="rIdbtpzp4jmolkfbxkgcuq8t">
         <w:r>
           <w:rPr>
             <w:color w:val="0563C1"/>
@@ -19532,7 +19532,7 @@
       <w:r>
         <w:t xml:space="preserve">Branch, Taylor. </w:t>
       </w:r>
-      <w:hyperlink w:history="1" r:id="rIdxztwqosero4gcufam38pj">
+      <w:hyperlink w:history="1" r:id="rIdjshjj9dytjwfh8cvhucox">
         <w:r>
           <w:rPr>
             <w:color w:val="0563C1"/>
@@ -19560,7 +19560,7 @@
       <w:r>
         <w:t xml:space="preserve">Hoose, Phillip. </w:t>
       </w:r>
-      <w:hyperlink w:history="1" r:id="rIdjciz1bhyah1-q0r96l_gw">
+      <w:hyperlink w:history="1" r:id="rId35b1lekfh6kpokklopua7">
         <w:r>
           <w:rPr>
             <w:color w:val="0563C1"/>
@@ -19588,7 +19588,7 @@
       <w:r>
         <w:t xml:space="preserve">Tyson, Timothy B. </w:t>
       </w:r>
-      <w:hyperlink w:history="1" r:id="rIdcbgeo_byysholsessk91h">
+      <w:hyperlink w:history="1" r:id="rIdqolew4gcorir1corek3xr">
         <w:r>
           <w:rPr>
             <w:color w:val="0563C1"/>
@@ -19616,7 +19616,7 @@
       <w:r>
         <w:t xml:space="preserve">Mandela, Nelson. </w:t>
       </w:r>
-      <w:hyperlink w:history="1" r:id="rIdwbwgc_mgzmqvnskzw0u1m">
+      <w:hyperlink w:history="1" r:id="rIdslmdlw60mqe9ephkmutps">
         <w:r>
           <w:rPr>
             <w:color w:val="0563C1"/>
@@ -19644,7 +19644,7 @@
       <w:r>
         <w:t xml:space="preserve">Carter, David. </w:t>
       </w:r>
-      <w:hyperlink w:history="1" r:id="rIdgy8crwhjaasgrjxo-hroq">
+      <w:hyperlink w:history="1" r:id="rIdvmjgwjop6gneq5r4uklze">
         <w:r>
           <w:rPr>
             <w:color w:val="0563C1"/>
@@ -19692,7 +19692,7 @@
       <w:r>
         <w:t xml:space="preserve">Turing, A. M. “</w:t>
       </w:r>
-      <w:hyperlink w:history="1" r:id="rIdat80l6atfzh7wm8xydb6s">
+      <w:hyperlink w:history="1" r:id="rId2zbaafmmr_v0-md7ehv8x">
         <w:r>
           <w:rPr>
             <w:color w:val="0563C1"/>
@@ -19720,7 +19720,7 @@
       <w:r>
         <w:t xml:space="preserve">Copeland, B. Jack, ed. </w:t>
       </w:r>
-      <w:hyperlink w:history="1" r:id="rIdu2xs09uemokixkffwr2w1">
+      <w:hyperlink w:history="1" r:id="rIdsqxnj0ov1snstxa9nivsp">
         <w:r>
           <w:rPr>
             <w:color w:val="0563C1"/>
@@ -19748,7 +19748,7 @@
       <w:r>
         <w:t xml:space="preserve">Isaacson, Walter. </w:t>
       </w:r>
-      <w:hyperlink w:history="1" r:id="rIdbyw1j7gsuoulpc02xdkdb">
+      <w:hyperlink w:history="1" r:id="rId8mlxxfqhhupey7kwuczpn">
         <w:r>
           <w:rPr>
             <w:color w:val="0563C1"/>
@@ -19776,7 +19776,7 @@
       <w:r>
         <w:t xml:space="preserve">Vosoughi, Soroush, Deb Roy, and Sinan Aral. “</w:t>
       </w:r>
-      <w:hyperlink w:history="1" r:id="rId6mx-_zawo5pp5odixzfmu">
+      <w:hyperlink w:history="1" r:id="rIdlhv16za6dq2uqk5zi3l47">
         <w:r>
           <w:rPr>
             <w:color w:val="0563C1"/>
@@ -19824,7 +19824,7 @@
       <w:r>
         <w:t xml:space="preserve">Stuart, David. </w:t>
       </w:r>
-      <w:hyperlink w:history="1" r:id="rId14vs9bt3zgk-9z1st8zpk">
+      <w:hyperlink w:history="1" r:id="rIdlqjk7yz8ddtx2bkgdaplf">
         <w:r>
           <w:rPr>
             <w:color w:val="0563C1"/>
@@ -19852,7 +19852,7 @@
       <w:r>
         <w:t xml:space="preserve">Aveni, Anthony. </w:t>
       </w:r>
-      <w:hyperlink w:history="1" r:id="rIdynxfhnxebpagvkcbkx3qa">
+      <w:hyperlink w:history="1" r:id="rIdp_ub84xx-yibxvduliv-e">
         <w:r>
           <w:rPr>
             <w:color w:val="0563C1"/>
@@ -19900,7 +19900,7 @@
       <w:r>
         <w:t xml:space="preserve">Meech, Karen J., et al. “</w:t>
       </w:r>
-      <w:hyperlink w:history="1" r:id="rIdtjumxm3klnhh9_ojthsp3">
+      <w:hyperlink w:history="1" r:id="rIdat4rzzacvumwf4u0pvkvf">
         <w:r>
           <w:rPr>
             <w:color w:val="0563C1"/>
@@ -19928,7 +19928,7 @@
       <w:r>
         <w:t xml:space="preserve">Micheli, Marco, et al. “</w:t>
       </w:r>
-      <w:hyperlink w:history="1" r:id="rId5_9ve6bxk_tupb-d5uoyo">
+      <w:hyperlink w:history="1" r:id="rIdbeld8qqacdcxajjib3keo">
         <w:r>
           <w:rPr>
             <w:color w:val="0563C1"/>
@@ -19956,7 +19956,7 @@
       <w:r>
         <w:t xml:space="preserve">‘Oumuamua ISSI Team. “</w:t>
       </w:r>
-      <w:hyperlink w:history="1" r:id="rIdbvqwh-tes7pgoezymga8b">
+      <w:hyperlink w:history="1" r:id="rIdzgbwopoedztroyc8ymzgb">
         <w:r>
           <w:rPr>
             <w:color w:val="0563C1"/>
@@ -19984,7 +19984,7 @@
       <w:r>
         <w:t xml:space="preserve">Staff at the National Astronomy and Ionosphere Center. “</w:t>
       </w:r>
-      <w:hyperlink w:history="1" r:id="rId1jx65fv-5bmphdmzasgwf">
+      <w:hyperlink w:history="1" r:id="rIdk_xvjpyglrqjufxfd0yi8">
         <w:r>
           <w:rPr>
             <w:color w:val="0563C1"/>
@@ -20048,7 +20048,7 @@
       <w:r>
         <w:t xml:space="preserve">Riley, James C. “</w:t>
       </w:r>
-      <w:hyperlink w:history="1" r:id="rIdiu30f3si-slxmbcdlyvf2">
+      <w:hyperlink w:history="1" r:id="rIdts_tkvpfig8bkvz09dv3o">
         <w:r>
           <w:rPr>
             <w:color w:val="0563C1"/>
@@ -20076,7 +20076,7 @@
       <w:r>
         <w:t xml:space="preserve">Bliss, Michael. </w:t>
       </w:r>
-      <w:hyperlink w:history="1" r:id="rIdrmz9zlaxgq1gocecj01rx">
+      <w:hyperlink w:history="1" r:id="rIdgb-_v-ackd6gg1mekb-iz">
         <w:r>
           <w:rPr>
             <w:color w:val="0563C1"/>
@@ -20104,7 +20104,7 @@
       <w:r>
         <w:t xml:space="preserve">Reverby, Susan M. </w:t>
       </w:r>
-      <w:hyperlink w:history="1" r:id="rIdqm8nhmwwc6gz_9axv8xqm">
+      <w:hyperlink w:history="1" r:id="rIdkbcjxdsj6szt8vjtzmiir">
         <w:r>
           <w:rPr>
             <w:color w:val="0563C1"/>
@@ -20132,7 +20132,7 @@
       <w:r>
         <w:t xml:space="preserve">Keefe, Patrick Radden. </w:t>
       </w:r>
-      <w:hyperlink w:history="1" r:id="rIdosu4p0k-zpl7xnmqd6zlf">
+      <w:hyperlink w:history="1" r:id="rIdaouqmz9dybotq-92q0y2x">
         <w:r>
           <w:rPr>
             <w:color w:val="0563C1"/>
@@ -20160,7 +20160,7 @@
       <w:r>
         <w:t xml:space="preserve">Antimicrobial Resistance Collaborators. “</w:t>
       </w:r>
-      <w:hyperlink w:history="1" r:id="rIdxzm-g9l1oz9qy_hnhz5w2">
+      <w:hyperlink w:history="1" r:id="rId7lqrf8hsvun3q12c7945n">
         <w:r>
           <w:rPr>
             <w:color w:val="0563C1"/>
@@ -20188,7 +20188,7 @@
       <w:r>
         <w:t xml:space="preserve">Van Bressem, Marie-Françoise, et al. “</w:t>
       </w:r>
-      <w:hyperlink w:history="1" r:id="rIdtb-a0es21baafmax88e0j">
+      <w:hyperlink w:history="1" r:id="rIdweabythhlbcrtolhaq7kq">
         <w:r>
           <w:rPr>
             <w:color w:val="0563C1"/>
@@ -20216,7 +20216,7 @@
       <w:r>
         <w:t xml:space="preserve">Oshinsky, David M. </w:t>
       </w:r>
-      <w:hyperlink w:history="1" r:id="rIdvejagossoggpmfjxqzx1t">
+      <w:hyperlink w:history="1" r:id="rIdnfl_6kkbxpsjo92rmf0wg">
         <w:r>
           <w:rPr>
             <w:color w:val="0563C1"/>
@@ -20244,7 +20244,7 @@
       <w:r>
         <w:t xml:space="preserve">Polack, Fernando P., et al. “</w:t>
       </w:r>
-      <w:hyperlink w:history="1" r:id="rId_g8ud3d8ezn6bcazx-umc">
+      <w:hyperlink w:history="1" r:id="rId2nrsf79yqgficvxh85uke">
         <w:r>
           <w:rPr>
             <w:color w:val="0563C1"/>
@@ -20292,7 +20292,7 @@
       <w:r>
         <w:t xml:space="preserve">Arrhenius, Svante. “</w:t>
       </w:r>
-      <w:hyperlink w:history="1" r:id="rId1-2o6yokf8rfssdg_2ny2">
+      <w:hyperlink w:history="1" r:id="rIdo84wszfyzyvezct-s8nbd">
         <w:r>
           <w:rPr>
             <w:color w:val="0563C1"/>
@@ -20320,7 +20320,7 @@
       <w:r>
         <w:t xml:space="preserve">Philip, Sjoukje Y., et al. “</w:t>
       </w:r>
-      <w:hyperlink w:history="1" r:id="rIdvord0eyk8tbo3be_aw1qb">
+      <w:hyperlink w:history="1" r:id="rIdvhswltd8tfxeudabzurzh">
         <w:r>
           <w:rPr>
             <w:color w:val="0563C1"/>
@@ -20348,7 +20348,7 @@
       <w:r>
         <w:t xml:space="preserve">Supran, G., S. Rahmstorf, and N. Oreskes. “</w:t>
       </w:r>
-      <w:hyperlink w:history="1" r:id="rIdmxj1hq3l-ya-4rs00ipov">
+      <w:hyperlink w:history="1" r:id="rIdwfdt2izl5gxx8bezq5ap0">
         <w:r>
           <w:rPr>
             <w:color w:val="0563C1"/>
@@ -20376,7 +20376,7 @@
       <w:r>
         <w:t xml:space="preserve">Witze, Alexandra. “</w:t>
       </w:r>
-      <w:hyperlink w:history="1" r:id="rId-sszvbukqrltlre6qss_p">
+      <w:hyperlink w:history="1" r:id="rIdtkqqn-4svqhelxcdrimtk">
         <w:r>
           <w:rPr>
             <w:color w:val="0563C1"/>
@@ -20404,7 +20404,7 @@
       <w:r>
         <w:t xml:space="preserve">IPCC. </w:t>
       </w:r>
-      <w:hyperlink w:history="1" r:id="rId0n1rhs4yodmneo6umgzjv">
+      <w:hyperlink w:history="1" r:id="rIdqpum8ekr9bby0q0iymyyd">
         <w:r>
           <w:rPr>
             <w:color w:val="0563C1"/>
@@ -20432,7 +20432,7 @@
       <w:r>
         <w:t xml:space="preserve">Morlighem, Mathieu, et al. “</w:t>
       </w:r>
-      <w:hyperlink w:history="1" r:id="rId-q7q8jubhbygh4cqyuxsi">
+      <w:hyperlink w:history="1" r:id="rIdgyqkqtyympzh7fru1eyno">
         <w:r>
           <w:rPr>
             <w:color w:val="0563C1"/>
@@ -20460,7 +20460,7 @@
       <w:r>
         <w:t xml:space="preserve">IMBIE Team. “</w:t>
       </w:r>
-      <w:hyperlink w:history="1" r:id="rIdoswlizrizxomo3pudxoi-">
+      <w:hyperlink w:history="1" r:id="rIdsnyyubrewwdn-ctldemiy">
         <w:r>
           <w:rPr>
             <w:color w:val="0563C1"/>
@@ -20488,7 +20488,7 @@
       <w:r>
         <w:t xml:space="preserve">Joughin, Ian, Benjamin E. Smith, and Brooke Medley. “</w:t>
       </w:r>
-      <w:hyperlink w:history="1" r:id="rId3hw1muq7sqbla3eq3ga13">
+      <w:hyperlink w:history="1" r:id="rIdhb1dt-dtpr95uth_zc6tr">
         <w:r>
           <w:rPr>
             <w:color w:val="0563C1"/>
@@ -20516,7 +20516,7 @@
       <w:r>
         <w:t xml:space="preserve">Secretariat of the Antarctic Treaty. “</w:t>
       </w:r>
-      <w:hyperlink w:history="1" r:id="rIdnymblz7b-uywrcccqz_hd">
+      <w:hyperlink w:history="1" r:id="rIdpa6z0ndwxbgztpgh_8s1k">
         <w:r>
           <w:rPr>
             <w:color w:val="0563C1"/>
@@ -20544,7 +20544,7 @@
       <w:r>
         <w:t xml:space="preserve">Office of the Historian, US Department of State. </w:t>
       </w:r>
-      <w:hyperlink w:history="1" r:id="rId781ug_sfknxvg1x5f4eqq">
+      <w:hyperlink w:history="1" r:id="rIdk0nc4b6iuttddqmceu_d-">
         <w:r>
           <w:rPr>
             <w:color w:val="0563C1"/>
@@ -20572,7 +20572,7 @@
       <w:r>
         <w:t xml:space="preserve">“‘Greenland Belongs to Greenland’: </w:t>
       </w:r>
-      <w:hyperlink w:history="1" r:id="rIdlbw4re9dfy_x9qbjbemgz">
+      <w:hyperlink w:history="1" r:id="rIdiemh1ipwlf1hzq56lt1rs">
         <w:r>
           <w:rPr>
             <w:color w:val="0563C1"/>
@@ -20600,7 +20600,7 @@
       <w:r>
         <w:t xml:space="preserve">BBC News. Report on </w:t>
       </w:r>
-      <w:hyperlink w:history="1" r:id="rIdeoqllvcrjdwkqxrc8vbgn">
+      <w:hyperlink w:history="1" r:id="rIdzkqyewnqgnppulml5bbpg">
         <w:r>
           <w:rPr>
             <w:color w:val="0563C1"/>
@@ -20628,7 +20628,7 @@
       <w:r>
         <w:t xml:space="preserve">BBC News. </w:t>
       </w:r>
-      <w:hyperlink w:history="1" r:id="rId3r4xknrm19-hhzyws0fjy">
+      <w:hyperlink w:history="1" r:id="rIdhlwktqzs0-mnkibplftuo">
         <w:r>
           <w:rPr>
             <w:color w:val="0563C1"/>
@@ -20656,7 +20656,7 @@
       <w:r>
         <w:t xml:space="preserve">Statistics Greenland. “</w:t>
       </w:r>
-      <w:hyperlink w:history="1" r:id="rIdwuczhbvj0qzk7wabsi3fl">
+      <w:hyperlink w:history="1" r:id="rIdptozhof6xu4pxrjzn_535">
         <w:r>
           <w:rPr>
             <w:color w:val="0563C1"/>
@@ -20720,7 +20720,7 @@
       <w:r>
         <w:t xml:space="preserve">COVID-19 National Preparedness Collaborators. “</w:t>
       </w:r>
-      <w:hyperlink w:history="1" r:id="rId9iag7p6qneiruwx_s7tcj">
+      <w:hyperlink w:history="1" r:id="rIdjgtxnmwp7pmxg8kha6uoi">
         <w:r>
           <w:rPr>
             <w:color w:val="0563C1"/>
@@ -20748,7 +20748,7 @@
       <w:r>
         <w:t xml:space="preserve">Msemburi, William, et al. “</w:t>
       </w:r>
-      <w:hyperlink w:history="1" r:id="rIdezlgxgje7jczzs_n4fozq">
+      <w:hyperlink w:history="1" r:id="rIds54d9q2tlwihssvs8c-9d">
         <w:r>
           <w:rPr>
             <w:color w:val="0563C1"/>
@@ -20832,7 +20832,7 @@
       <w:r>
         <w:t xml:space="preserve">Jinek, Martin, et al. “</w:t>
       </w:r>
-      <w:hyperlink w:history="1" r:id="rId5ejvj_jp76m_hah8plcwz">
+      <w:hyperlink w:history="1" r:id="rIdx44ttfimim0fm3el_l5od">
         <w:r>
           <w:rPr>
             <w:color w:val="0563C1"/>
@@ -20860,7 +20860,7 @@
       <w:r>
         <w:t xml:space="preserve">Fehilly, Carole B., S. M. Willadsen, and Elizabeth M. Tucker. “</w:t>
       </w:r>
-      <w:hyperlink w:history="1" r:id="rIdpwpjnrv5hbbdzhctobq76">
+      <w:hyperlink w:history="1" r:id="rIdl6silauc4xw0ke1ya_j-8">
         <w:r>
           <w:rPr>
             <w:color w:val="0563C1"/>
@@ -20908,7 +20908,7 @@
       <w:r>
         <w:t xml:space="preserve">Ganopolski, A., R. Winkelmann, and H. J. Schellnhuber. “</w:t>
       </w:r>
-      <w:hyperlink w:history="1" r:id="rId0aie-r6ev5de1u7afl0ak">
+      <w:hyperlink w:history="1" r:id="rIdb_r224zhsvzyjelegjybp">
         <w:r>
           <w:rPr>
             <w:color w:val="0563C1"/>
@@ -20956,7 +20956,7 @@
       <w:r>
         <w:t xml:space="preserve">Hawking, S. W. “</w:t>
       </w:r>
-      <w:hyperlink w:history="1" r:id="rIdmpcolleinguezgqauhto0">
+      <w:hyperlink w:history="1" r:id="rIdklhb_fzdy3ushcy35h3db">
         <w:r>
           <w:rPr>
             <w:color w:val="0563C1"/>
@@ -20984,7 +20984,7 @@
       <w:r>
         <w:t xml:space="preserve">LIGO Scientific Collaboration and Virgo Collaboration. “</w:t>
       </w:r>
-      <w:hyperlink w:history="1" r:id="rIdnth1c9ncugv7gvuemv7fx">
+      <w:hyperlink w:history="1" r:id="rIdycvxh-b8kzizs6yi8e-pr">
         <w:r>
           <w:rPr>
             <w:color w:val="0563C1"/>
@@ -21012,7 +21012,7 @@
       <w:r>
         <w:t xml:space="preserve">ATLAS Collaboration. “</w:t>
       </w:r>
-      <w:hyperlink w:history="1" r:id="rIdj3jxdehqnkndhzswl03hy">
+      <w:hyperlink w:history="1" r:id="rIdhstuc89ti97soncz4pbgy">
         <w:r>
           <w:rPr>
             <w:color w:val="0563C1"/>
@@ -21040,7 +21040,7 @@
       <w:r>
         <w:t xml:space="preserve">Abu-Shawareb, H., et al. (Indirect Drive ICF Collaboration). “</w:t>
       </w:r>
-      <w:hyperlink w:history="1" r:id="rIdebuons0wyeprwzpxy49fl">
+      <w:hyperlink w:history="1" r:id="rIdvycqbrwermrz5cl_oidsr">
         <w:r>
           <w:rPr>
             <w:color w:val="0563C1"/>
@@ -21092,7 +21092,7 @@
       <w:pPr>
         <w:spacing w:after="200"/>
       </w:pPr>
-      <w:hyperlink w:history="1" r:id="rIdsm0wzmre9vh53rhpaatsq">
+      <w:hyperlink w:history="1" r:id="rId2enxs0vlqlsz282k9_9y8">
         <w:r>
           <w:rPr>
             <w:b/>
@@ -21125,7 +21125,7 @@
       <w:pPr>
         <w:spacing w:after="200"/>
       </w:pPr>
-      <w:hyperlink w:history="1" r:id="rIdwozc1_n_ou0cdcvrew3w0">
+      <w:hyperlink w:history="1" r:id="rIdw8t24w6tadyaisyzkansh">
         <w:r>
           <w:rPr>
             <w:b/>
@@ -21158,7 +21158,7 @@
       <w:pPr>
         <w:spacing w:after="200"/>
       </w:pPr>
-      <w:hyperlink w:history="1" r:id="rIdwz_ixvv_mzf91dfc22t3l">
+      <w:hyperlink w:history="1" r:id="rIdymuvf1dlocdiko1ivnbuy">
         <w:r>
           <w:rPr>
             <w:b/>
@@ -21191,7 +21191,7 @@
       <w:pPr>
         <w:spacing w:after="200"/>
       </w:pPr>
-      <w:hyperlink w:history="1" r:id="rIdzvjji6xw0yu9oayri5ozm">
+      <w:hyperlink w:history="1" r:id="rIdxlu-ekjpya_isjviw9dtv">
         <w:r>
           <w:rPr>
             <w:b/>
@@ -21224,7 +21224,7 @@
       <w:pPr>
         <w:spacing w:after="200"/>
       </w:pPr>
-      <w:hyperlink w:history="1" r:id="rIdunpgfuiik6oqdyrhfc63r">
+      <w:hyperlink w:history="1" r:id="rIderqnpezijzzlx9bz4naj6">
         <w:r>
           <w:rPr>
             <w:b/>
@@ -21257,7 +21257,7 @@
       <w:pPr>
         <w:spacing w:after="200"/>
       </w:pPr>
-      <w:hyperlink w:history="1" r:id="rIdr2jh2rl8jdcuyzmxqb04p">
+      <w:hyperlink w:history="1" r:id="rId8mrcazzwhs82pltzzzvhd">
         <w:r>
           <w:rPr>
             <w:b/>
@@ -21290,7 +21290,7 @@
       <w:pPr>
         <w:spacing w:after="200"/>
       </w:pPr>
-      <w:hyperlink w:history="1" r:id="rId9tgypxnuzbiacsnhatqbl">
+      <w:hyperlink w:history="1" r:id="rIdaaxpmcj1nlutbpvs14yqc">
         <w:r>
           <w:rPr>
             <w:b/>
@@ -21345,7 +21345,7 @@
       <w:pPr>
         <w:spacing w:after="200"/>
       </w:pPr>
-      <w:hyperlink w:history="1" r:id="rIdc4dfggb1pr2qeizfmcml_">
+      <w:hyperlink w:history="1" r:id="rIdthpmaxauk3olxzsampz6a">
         <w:r>
           <w:rPr>
             <w:b/>
@@ -21378,7 +21378,7 @@
       <w:pPr>
         <w:spacing w:after="200"/>
       </w:pPr>
-      <w:hyperlink w:history="1" r:id="rIdjn8jl3tsyg8uuddi7hwhm">
+      <w:hyperlink w:history="1" r:id="rIdbkwkexbgcowrn9tucwye6">
         <w:r>
           <w:rPr>
             <w:b/>
@@ -21411,7 +21411,7 @@
       <w:pPr>
         <w:spacing w:after="200"/>
       </w:pPr>
-      <w:hyperlink w:history="1" r:id="rIdtqfzhhzmdne6rwl7pbmt-">
+      <w:hyperlink w:history="1" r:id="rIdha2uwoowhuhvyu7e1ys1k">
         <w:r>
           <w:rPr>
             <w:b/>
@@ -21444,7 +21444,7 @@
       <w:pPr>
         <w:spacing w:after="200"/>
       </w:pPr>
-      <w:hyperlink w:history="1" r:id="rIdswbvlqqhg5vwzjcwdylqk">
+      <w:hyperlink w:history="1" r:id="rIdyt6zlt8_zy-xyysezscbk">
         <w:r>
           <w:rPr>
             <w:b/>
@@ -21477,7 +21477,7 @@
       <w:pPr>
         <w:spacing w:after="200"/>
       </w:pPr>
-      <w:hyperlink w:history="1" r:id="rIdkuhr8thlgadnvagxm0igm">
+      <w:hyperlink w:history="1" r:id="rId2k8ql8spwh-htglujpu7y">
         <w:r>
           <w:rPr>
             <w:b/>
@@ -21510,7 +21510,7 @@
       <w:pPr>
         <w:spacing w:after="200"/>
       </w:pPr>
-      <w:hyperlink w:history="1" r:id="rIdni_v9yzfo5ba7nu2makoy">
+      <w:hyperlink w:history="1" r:id="rIddooe8hh0t-ureo68pb9eh">
         <w:r>
           <w:rPr>
             <w:b/>
@@ -21543,7 +21543,7 @@
       <w:pPr>
         <w:spacing w:after="200"/>
       </w:pPr>
-      <w:hyperlink w:history="1" r:id="rIdbjnrocfekzuua6-gdzge1">
+      <w:hyperlink w:history="1" r:id="rId2zh7mps-sla7mt2ghyzxo">
         <w:r>
           <w:rPr>
             <w:b/>
@@ -21576,7 +21576,7 @@
       <w:pPr>
         <w:spacing w:after="200"/>
       </w:pPr>
-      <w:hyperlink w:history="1" r:id="rId_zkeq-orbut6ly0siruxr">
+      <w:hyperlink w:history="1" r:id="rIdp2ysnbp0dhj3zq7klpbol">
         <w:r>
           <w:rPr>
             <w:b/>
@@ -21609,7 +21609,7 @@
       <w:pPr>
         <w:spacing w:after="200"/>
       </w:pPr>
-      <w:hyperlink w:history="1" r:id="rIdodhq1phhufqvw9yq00uwr">
+      <w:hyperlink w:history="1" r:id="rIdmwpzne18kirg4tzktv5r3">
         <w:r>
           <w:rPr>
             <w:b/>
@@ -21642,7 +21642,7 @@
       <w:pPr>
         <w:spacing w:after="200"/>
       </w:pPr>
-      <w:hyperlink w:history="1" r:id="rId71gnwonzjdjkbaqtslisv">
+      <w:hyperlink w:history="1" r:id="rIddvjoe1gr6eex2ivnfyz0g">
         <w:r>
           <w:rPr>
             <w:b/>
@@ -21675,7 +21675,7 @@
       <w:pPr>
         <w:spacing w:after="200"/>
       </w:pPr>
-      <w:hyperlink w:history="1" r:id="rIdq3h5ahygsemdgpxh09-lo">
+      <w:hyperlink w:history="1" r:id="rIdhqmq9aoybvbiidqp_17wd">
         <w:r>
           <w:rPr>
             <w:b/>
@@ -21708,7 +21708,7 @@
       <w:pPr>
         <w:spacing w:after="200"/>
       </w:pPr>
-      <w:hyperlink w:history="1" r:id="rId__zyqw-vig4yqosktd8ch">
+      <w:hyperlink w:history="1" r:id="rIdpqob98_qfroj2askvbqrx">
         <w:r>
           <w:rPr>
             <w:b/>
@@ -21741,7 +21741,7 @@
       <w:pPr>
         <w:spacing w:after="200"/>
       </w:pPr>
-      <w:hyperlink w:history="1" r:id="rIdnrguf_pofnkr6vxaklwus">
+      <w:hyperlink w:history="1" r:id="rIdhdnsdzsuv_q-7fbjt9bmg">
         <w:r>
           <w:rPr>
             <w:b/>

</xml_diff>

<commit_message>
Dolphins: pacing rewrite of two survey chapters (#82)
Added connective tissue between the vignettes in Decolonization and
Civil Rights and Liberation, the two clearest cases of the score
sheet's "survey chapters still read as summaries" note — each country
or movement previously read as an isolated capsule with no bridge to
the one before or after it. No fact, figure, or citation changed;
only the transitions between them. Ported identically into both
chapters' .md files and the Complete Manuscript .md.


Claude-Session: https://claude.ai/code/session_01No3CTqqXoAC7DqUj3kRTnA

Co-authored-by: Claude <noreply@anthropic.com>
</commit_message>
<xml_diff>
--- a/The Dolphins' View of History/The Dolphins' View of History - Complete Manuscript.docx
+++ b/The Dolphins' View of History/The Dolphins' View of History - Complete Manuscript.docx
@@ -7575,39 +7575,39 @@
         <w:spacing w:after="200"/>
       </w:pPr>
       <w:r>
-        <w:t xml:space="preserve">Africa’s wave crested around 1960, when seventeen countries gained independence in a single year, most from France and Britain, some only after armed conflict instead of negotiation. Algeria won its independence from France only in 1962, after eight years of war.</w:t>
-      </w:r>
-    </w:p>
-    <w:p>
-      <w:pPr>
-        <w:spacing w:after="200"/>
-      </w:pPr>
-      <w:r>
-        <w:t xml:space="preserve">Britain in particular spent the middle of this century handing back an empire it had spent the previous two centuries quite energetically acquiring, and the handing back was less graceful in places than its own histories later remembered. In Kenya, during the Mau Mau uprising of the 1950s, British authorities held tens of thousands of Kenyans in detention camps where torture was widespread; in 2013 the British government expressed regret and paid compensation to 5,228 surviving victims.</w:t>
-      </w:r>
-    </w:p>
-    <w:p>
-      <w:pPr>
-        <w:spacing w:after="200"/>
-      </w:pPr>
-      <w:r>
-        <w:t xml:space="preserve">Independence did not erase the maps colonial powers had drawn with no reference to the ethnic, linguistic, or religious boundaries that existed on the ground. Several of the era’s later conflicts, many historians argue, owe at least part of their origin to borders drawn decades or centuries earlier by administrators who had never intended those borders to become permanent national boundaries at all.</w:t>
-      </w:r>
-    </w:p>
-    <w:p>
-      <w:pPr>
-        <w:spacing w:after="200"/>
-      </w:pPr>
-      <w:r>
-        <w:t xml:space="preserve">Colonial administrators drew categories as well as borders. In Rwanda, which Belgium took over from Germany after the First World War, an old and flexible distinction between Tutsi and Hutu was hardened into a fixed one, and in the 1930s every Rwandan was issued an identity card naming a group. In 1994, after the plane carrying the president was shot down, extremist officials and militias used those categories, and the lists that went with them, to kill an estimated 500,000 to 800,000 Tutsi and moderate Hutu in about a hundred days, while the United Nations force on the ground was reduced instead of reinforced.</w:t>
-      </w:r>
-    </w:p>
-    <w:p>
-      <w:pPr>
-        <w:spacing w:after="200"/>
-      </w:pPr>
-      <w:r>
-        <w:t xml:space="preserve">Newly independent states faced a further complication the Cold War’s two superpowers made unavoidable: alignment. The Non-Aligned Movement, formally organized at a 1961 conference in Belgrade, tried to offer a third path for countries unwilling to be absorbed into either superpower’s camp, with mixed and country-specific success.</w:t>
+        <w:t xml:space="preserve">India supplied one model: organize, outlast, make the empire’s own math stop working. The wave that followed, mostly across Africa, did not always have the time for it. It crested around 1960, when seventeen countries gained independence in a single year, most from France and Britain, some only after armed conflict instead of negotiation. Algeria won its independence from France only in 1962, after eight years of war.</w:t>
+      </w:r>
+    </w:p>
+    <w:p>
+      <w:pPr>
+        <w:spacing w:after="200"/>
+      </w:pPr>
+      <w:r>
+        <w:t xml:space="preserve">Britain’s own version of the handover was a case study in how little patience this could leave behind. The country spent the middle of this century returning an empire it had spent the previous two centuries quite energetically acquiring, and the returning was less graceful in places than its own histories later remembered. In Kenya, during the Mau Mau uprising of the 1950s, British authorities held tens of thousands of Kenyans in detention camps where torture was widespread; in 2013 the British government expressed regret and paid compensation to 5,228 surviving victims.</w:t>
+      </w:r>
+    </w:p>
+    <w:p>
+      <w:pPr>
+        <w:spacing w:after="200"/>
+      </w:pPr>
+      <w:r>
+        <w:t xml:space="preserve">Speed left two inheritances behind that outlasted the flags coming down. The first was cartographic: independence did not erase the maps colonial powers had drawn with no reference to the ethnic, linguistic, or religious boundaries that existed on the ground. Several of the era’s later conflicts, many historians argue, owe at least part of their origin to borders drawn decades or centuries earlier by administrators who had never intended those borders to become permanent national boundaries at all.</w:t>
+      </w:r>
+    </w:p>
+    <w:p>
+      <w:pPr>
+        <w:spacing w:after="200"/>
+      </w:pPr>
+      <w:r>
+        <w:t xml:space="preserve">The second inheritance was harder to see on any map, because it lived in paperwork rather than borders. Colonial administrators drew categories as well as lines. In Rwanda, which Belgium took over from Germany after the First World War, an old and flexible distinction between Tutsi and Hutu was hardened into a fixed one, and in the 1930s every Rwandan was issued an identity card naming a group. In 1994, after the plane carrying the president was shot down, extremist officials and militias used those categories, and the lists that went with them, to kill an estimated 500,000 to 800,000 Tutsi and moderate Hutu in about a hundred days, while the United Nations force on the ground was reduced instead of reinforced.</w:t>
+      </w:r>
+    </w:p>
+    <w:p>
+      <w:pPr>
+        <w:spacing w:after="200"/>
+      </w:pPr>
+      <w:r>
+        <w:t xml:space="preserve">Inherited borders and inherited categories were only half the inheritance. The other half arrived from outside: newly independent states faced a complication the Cold War’s two superpowers made unavoidable, which was that nobody’s independence stayed purely their own business for long. The Non-Aligned Movement, formally organized at a 1961 conference in Belgrade, tried to offer a third path for countries unwilling to be absorbed into either superpower’s camp, with mixed and country-specific success.</w:t>
       </w:r>
     </w:p>
     <w:p>
@@ -7690,31 +7690,31 @@
         <w:spacing w:after="200"/>
       </w:pPr>
       <w:r>
-        <w:t xml:space="preserve">South Africa’s anti-apartheid struggle ran on a longer clock. Legal racial segregation, formalized as apartheid in 1948, persisted for close to half a century against internal resistance, including the armed campaign of the ANC’s military wing, Umkhonto we Sizwe, after peaceful protest was banned, and mounting international pressure and sanctions. It ended only with Nelson Mandela’s release in 1990 from twenty-seven years of imprisonment, eighteen of them on Robben Island (in waters the dolphins know well), and his election as South Africa’s first Black president in 1994.</w:t>
-      </w:r>
-    </w:p>
-    <w:p>
-      <w:pPr>
-        <w:spacing w:after="200"/>
-      </w:pPr>
-      <w:r>
-        <w:t xml:space="preserve">Women’s movements ran throughout the same century on their own overlapping timelines: suffrage achieved in most Western democracies between roughly 1893 (New Zealand, first) and the 1920s across much of Europe and North America. A second wave of legal and social advances followed in the 1960s and 70s, addressing employment, reproductive rights, and legal equality more broadly. The pace and scope of change varied enormously by country, and the change continues unevenly to the present.</w:t>
-      </w:r>
-    </w:p>
-    <w:p>
-      <w:pPr>
-        <w:spacing w:after="200"/>
-      </w:pPr>
-      <w:r>
-        <w:t xml:space="preserve">The women’s suffrage story had its own casualty list and its own comedy. In Britain the suffragettes chained themselves to railings, and in 1913 Emily Davison died after stepping in front of the King’s horse at the Epsom Derby; women over thirty got the vote in 1918, and women on equal terms with men only in 1928. In the United States it came in 1920. Switzerland, a country not known for being late, gave women the federal vote in 1971, and its last holdout canton was ordered by the courts to comply in 1990.</w:t>
-      </w:r>
-    </w:p>
-    <w:p>
-      <w:pPr>
-        <w:spacing w:after="200"/>
-      </w:pPr>
-      <w:r>
-        <w:t xml:space="preserve">A parallel argument about who counted as fully included ran through the same decades. In the early hours of June 28, 1969, patrons at the Stonewall Inn, a gay bar in New York’s Greenwich Village, fought back during a police raid of a kind the bar had endured many times before without resistance. The several nights of protest that followed are generally regarded as a turning point for the gay rights movement, and the following June, the first Pride marches in New York and other American cities marked the anniversary. Decriminalization, anti-discrimination protections, and marriage rights arrived on wildly different timelines in different countries over the half-century that followed, several of them still incomplete as this book is written.</w:t>
+        <w:t xml:space="preserve">The same slow weapon was fired on a longer clock in South Africa, against a harder target. Legal racial segregation, formalized as apartheid in 1948, persisted for close to half a century against internal resistance, including the armed campaign of the ANC’s military wing, Umkhonto we Sizwe, after peaceful protest was banned, and mounting international pressure and sanctions. It ended only with Nelson Mandela’s release in 1990 from twenty-seven years of imprisonment, eighteen of them on Robben Island (in waters the dolphins know well), and his election as South Africa’s first Black president in 1994.</w:t>
+      </w:r>
+    </w:p>
+    <w:p>
+      <w:pPr>
+        <w:spacing w:after="200"/>
+      </w:pPr>
+      <w:r>
+        <w:t xml:space="preserve">Changing what a majority believes it owes a minority turns out to be a method with more than one minority willing to try it. Women’s movements ran throughout the same century on their own overlapping timelines: suffrage achieved in most Western democracies between roughly 1893 (New Zealand, first) and the 1920s across much of Europe and North America. A second wave of legal and social advances followed in the 1960s and 70s, addressing employment, reproductive rights, and legal equality more broadly. The pace and scope of change varied enormously by country, and the change continues unevenly to the present.</w:t>
+      </w:r>
+    </w:p>
+    <w:p>
+      <w:pPr>
+        <w:spacing w:after="200"/>
+      </w:pPr>
+      <w:r>
+        <w:t xml:space="preserve">That timeline had its own casualty list and its own comedy. In Britain the suffragettes chained themselves to railings, and in 1913 Emily Davison died after stepping in front of the King’s horse at the Epsom Derby; women over thirty got the vote in 1918, and women on equal terms with men only in 1928. In the United States it came in 1920. Switzerland, a country not known for being late, gave women the federal vote in 1971, and its last holdout canton was ordered by the courts to comply in 1990.</w:t>
+      </w:r>
+    </w:p>
+    <w:p>
+      <w:pPr>
+        <w:spacing w:after="200"/>
+      </w:pPr>
+      <w:r>
+        <w:t xml:space="preserve">A fourth argument about who counted as fully included ran through the same decades, slower to start and later to arrive at anything like the others’ legal recognition. In the early hours of June 28, 1969, patrons at the Stonewall Inn, a gay bar in New York’s Greenwich Village, fought back during a police raid of a kind the bar had endured many times before without resistance. The several nights of protest that followed are generally regarded as a turning point for the gay rights movement, and the following June, the first Pride marches in New York and other American cities marked the anniversary. Decriminalization, anti-discrimination protections, and marriage rights arrived on wildly different timelines in different countries over the half-century that followed, several of them still incomplete as this book is written.</w:t>
       </w:r>
     </w:p>
     <w:p>
@@ -12078,7 +12078,7 @@
       <w:r>
         <w:t xml:space="preserve">Thewissen, J. G. M., et al. “</w:t>
       </w:r>
-      <w:hyperlink w:history="1" r:id="rIdhtyuz7gq6bwkueulsk2ir">
+      <w:hyperlink w:history="1" r:id="rIdh9vhwpnygucxajpoyjtf0">
         <w:r>
           <w:rPr>
             <w:color w:val="0563C1"/>
@@ -12106,7 +12106,7 @@
       <w:r>
         <w:t xml:space="preserve">Stringer, Chris. </w:t>
       </w:r>
-      <w:hyperlink w:history="1" r:id="rIdn-bg2lqupdfcioebquj3b">
+      <w:hyperlink w:history="1" r:id="rId9elwfhakudivwl6ifjrz3">
         <w:r>
           <w:rPr>
             <w:color w:val="0563C1"/>
@@ -12154,7 +12154,7 @@
       <w:r>
         <w:t xml:space="preserve">Marino, Lori. “</w:t>
       </w:r>
-      <w:hyperlink w:history="1" r:id="rIdjvhh3uhyuwwqpgk38jnxi">
+      <w:hyperlink w:history="1" r:id="rId_xr8-lzotm5sbcyujxup0">
         <w:r>
           <w:rPr>
             <w:color w:val="0563C1"/>
@@ -12182,7 +12182,7 @@
       <w:r>
         <w:t xml:space="preserve">Janik, Vincent M., Laela S. Sayigh, and Randall S. Wells. “</w:t>
       </w:r>
-      <w:hyperlink w:history="1" r:id="rIdk71vphw021al2snbpttbs">
+      <w:hyperlink w:history="1" r:id="rIdtr_ta5ev-9o5_ab8ce_wc">
         <w:r>
           <w:rPr>
             <w:color w:val="0563C1"/>
@@ -12210,7 +12210,7 @@
       <w:r>
         <w:t xml:space="preserve">Krützen, Michael, et al. “</w:t>
       </w:r>
-      <w:hyperlink w:history="1" r:id="rIdzh0u9wha4cc5r_dyrncl5">
+      <w:hyperlink w:history="1" r:id="rIdo6njucakjkszru_8ygjr1">
         <w:r>
           <w:rPr>
             <w:color w:val="0563C1"/>
@@ -12238,7 +12238,7 @@
       <w:r>
         <w:t xml:space="preserve">Tennie, Claudio, Josep Call, and Michael Tomasello. “</w:t>
       </w:r>
-      <w:hyperlink w:history="1" r:id="rIdrknuqwymyoidkv5mhac2l">
+      <w:hyperlink w:history="1" r:id="rIdqjmddbopw26kafo6jmw6r">
         <w:r>
           <w:rPr>
             <w:color w:val="0563C1"/>
@@ -12302,7 +12302,7 @@
       <w:r>
         <w:t xml:space="preserve">Hublin, Jean-Jacques, et al. “</w:t>
       </w:r>
-      <w:hyperlink w:history="1" r:id="rIdlkgeixbapbop9-6xohij6">
+      <w:hyperlink w:history="1" r:id="rIdszs-zn3msxxavpbqu3mc6">
         <w:r>
           <w:rPr>
             <w:color w:val="0563C1"/>
@@ -12330,7 +12330,7 @@
       <w:r>
         <w:t xml:space="preserve">Scerri, Eleanor M. L., et al. “</w:t>
       </w:r>
-      <w:hyperlink w:history="1" r:id="rIdoaeyohyoebxiy69wbdqjv">
+      <w:hyperlink w:history="1" r:id="rIdiaj1q1cyia0ahen2_5s24">
         <w:r>
           <w:rPr>
             <w:color w:val="0563C1"/>
@@ -12358,7 +12358,7 @@
       <w:r>
         <w:t xml:space="preserve">Leakey, M. D., and R. L. Hay. “</w:t>
       </w:r>
-      <w:hyperlink w:history="1" r:id="rIdyotnvq-d1mnyc1x6dyznl">
+      <w:hyperlink w:history="1" r:id="rIdx0fxzlx1mjefttslwqnqw">
         <w:r>
           <w:rPr>
             <w:color w:val="0563C1"/>
@@ -12386,7 +12386,7 @@
       <w:r>
         <w:t xml:space="preserve">Villmoare, Brian, et al. “</w:t>
       </w:r>
-      <w:hyperlink w:history="1" r:id="rIdo_k6xe3sffrm0rfh-5o2z">
+      <w:hyperlink w:history="1" r:id="rIdfdrxtb3xt3_-gllxstmr8">
         <w:r>
           <w:rPr>
             <w:color w:val="0563C1"/>
@@ -12414,7 +12414,7 @@
       <w:r>
         <w:t xml:space="preserve">Lordkipanidze, David, et al. “</w:t>
       </w:r>
-      <w:hyperlink w:history="1" r:id="rId4qw2jdqka-ptrqscpitsx">
+      <w:hyperlink w:history="1" r:id="rIdm1ibnynt85_sshwuoayyy">
         <w:r>
           <w:rPr>
             <w:color w:val="0563C1"/>
@@ -12442,7 +12442,7 @@
       <w:r>
         <w:t xml:space="preserve">Dirks, Paul H. G. M., et al. “</w:t>
       </w:r>
-      <w:hyperlink w:history="1" r:id="rIdmsgzr27fmcq60vz9zvxwu">
+      <w:hyperlink w:history="1" r:id="rIdvtdqka0ca7un4-i6vm0wu">
         <w:r>
           <w:rPr>
             <w:color w:val="0563C1"/>
@@ -12470,7 +12470,7 @@
       <w:r>
         <w:t xml:space="preserve">Henshilwood, Christopher S., et al. “</w:t>
       </w:r>
-      <w:hyperlink w:history="1" r:id="rIdwfynx1cel7klvdwtiyci8">
+      <w:hyperlink w:history="1" r:id="rIdwbong-nguicrope4rueb1">
         <w:r>
           <w:rPr>
             <w:color w:val="0563C1"/>
@@ -12518,7 +12518,7 @@
       <w:r>
         <w:t xml:space="preserve">Berna, Francesco, et al. “</w:t>
       </w:r>
-      <w:hyperlink w:history="1" r:id="rIdd2jkij-yexfvz7gcb1iik">
+      <w:hyperlink w:history="1" r:id="rIdjqxqpv7cnmpakcvueprta">
         <w:r>
           <w:rPr>
             <w:color w:val="0563C1"/>
@@ -12546,7 +12546,7 @@
       <w:r>
         <w:t xml:space="preserve">Shahack-Gross, Ruth, et al. “</w:t>
       </w:r>
-      <w:hyperlink w:history="1" r:id="rIdhnkzg086gyxsb1f4rve8e">
+      <w:hyperlink w:history="1" r:id="rIdcrcs5uwlba4ptqlvs0pao">
         <w:r>
           <w:rPr>
             <w:color w:val="0563C1"/>
@@ -12574,7 +12574,7 @@
       <w:r>
         <w:t xml:space="preserve">Harmand, Sonia, et al. “</w:t>
       </w:r>
-      <w:hyperlink w:history="1" r:id="rIdqwcg6g65afj_yplwmdkam">
+      <w:hyperlink w:history="1" r:id="rIdoesvb3fzgsrd1wqkhv_fs">
         <w:r>
           <w:rPr>
             <w:color w:val="0563C1"/>
@@ -12602,7 +12602,7 @@
       <w:r>
         <w:t xml:space="preserve">Lepre, Christopher J., et al. “</w:t>
       </w:r>
-      <w:hyperlink w:history="1" r:id="rIdt29h6qalhcezqwyrecbj_">
+      <w:hyperlink w:history="1" r:id="rIddwvtd0uame09f-zkqh8zi">
         <w:r>
           <w:rPr>
             <w:color w:val="0563C1"/>
@@ -12630,7 +12630,7 @@
       <w:r>
         <w:t xml:space="preserve">Brown, Kyle S., et al. “</w:t>
       </w:r>
-      <w:hyperlink w:history="1" r:id="rIdco6hemvbbtq_iixvs-0um">
+      <w:hyperlink w:history="1" r:id="rIdlzfxextjxgc4hw5-ttlmy">
         <w:r>
           <w:rPr>
             <w:color w:val="0563C1"/>
@@ -12658,7 +12658,7 @@
       <w:r>
         <w:t xml:space="preserve">Wrangham, Richard. </w:t>
       </w:r>
-      <w:hyperlink w:history="1" r:id="rId7_wyrc5i-0uedre-jutyv">
+      <w:hyperlink w:history="1" r:id="rIdmycpc-56dcdemfojk2jgq">
         <w:r>
           <w:rPr>
             <w:color w:val="0563C1"/>
@@ -12686,7 +12686,7 @@
       <w:r>
         <w:t xml:space="preserve">Fitch, W. Tecumseh. </w:t>
       </w:r>
-      <w:hyperlink w:history="1" r:id="rIdtf1xzjj7svmnye7ycguwt">
+      <w:hyperlink w:history="1" r:id="rId0j2bmkuchvrs3lni08tbf">
         <w:r>
           <w:rPr>
             <w:color w:val="0563C1"/>
@@ -12734,7 +12734,7 @@
       <w:r>
         <w:t xml:space="preserve">Clarkson, Chris, et al. “</w:t>
       </w:r>
-      <w:hyperlink w:history="1" r:id="rId2bp1fa8acidh3fs_0o_z8">
+      <w:hyperlink w:history="1" r:id="rIdggqmodrlzy5hhpmi3r1gl">
         <w:r>
           <w:rPr>
             <w:color w:val="0563C1"/>
@@ -12762,7 +12762,7 @@
       <w:r>
         <w:t xml:space="preserve">O’Connell, James F., et al. “</w:t>
       </w:r>
-      <w:hyperlink w:history="1" r:id="rIdrxoeja1z9rgs9p0azrin9">
+      <w:hyperlink w:history="1" r:id="rIdfgyqnuof_6uar08sauwjs">
         <w:r>
           <w:rPr>
             <w:color w:val="0563C1"/>
@@ -12790,7 +12790,7 @@
       <w:r>
         <w:t xml:space="preserve">Reich, David, et al. “</w:t>
       </w:r>
-      <w:hyperlink w:history="1" r:id="rIdxk_qc0estmlfkpuwtjl-w">
+      <w:hyperlink w:history="1" r:id="rIdk2kbno-646ienliapfutn">
         <w:r>
           <w:rPr>
             <w:color w:val="0563C1"/>
@@ -12818,7 +12818,7 @@
       <w:r>
         <w:t xml:space="preserve">Chen, Fahu, et al. “</w:t>
       </w:r>
-      <w:hyperlink w:history="1" r:id="rIdj3rtthuedmfnee5j9pluo">
+      <w:hyperlink w:history="1" r:id="rIdhclxvbphoydhiqt2pv46o">
         <w:r>
           <w:rPr>
             <w:color w:val="0563C1"/>
@@ -12846,7 +12846,7 @@
       <w:r>
         <w:t xml:space="preserve">Higham, Tom, et al. “</w:t>
       </w:r>
-      <w:hyperlink w:history="1" r:id="rIdswzmkdhpxvmu05bhmxmy0">
+      <w:hyperlink w:history="1" r:id="rIdebbvij2dt0rfz4lp2zfem">
         <w:r>
           <w:rPr>
             <w:color w:val="0563C1"/>
@@ -12874,7 +12874,7 @@
       <w:r>
         <w:t xml:space="preserve">Sutikna, Thomas, et al. “</w:t>
       </w:r>
-      <w:hyperlink w:history="1" r:id="rIdoint2buz6-p_jkn1bm3e-">
+      <w:hyperlink w:history="1" r:id="rIdl3hw6cgi7lyugqfvgfcl8">
         <w:r>
           <w:rPr>
             <w:color w:val="0563C1"/>
@@ -12902,7 +12902,7 @@
       <w:r>
         <w:t xml:space="preserve">Oktaviana, Adhi Agus, et al. “</w:t>
       </w:r>
-      <w:hyperlink w:history="1" r:id="rIdiz1bjltuetz3amdb1rav6">
+      <w:hyperlink w:history="1" r:id="rIdxuq5jesggkdibibben272">
         <w:r>
           <w:rPr>
             <w:color w:val="0563C1"/>
@@ -12930,7 +12930,7 @@
       <w:r>
         <w:t xml:space="preserve">Bennett, Matthew R., et al. “</w:t>
       </w:r>
-      <w:hyperlink w:history="1" r:id="rIdps84dmw6fmb0ufrcct-te">
+      <w:hyperlink w:history="1" r:id="rIdozbko63zkx3uy8dcvxykk">
         <w:r>
           <w:rPr>
             <w:color w:val="0563C1"/>
@@ -12958,7 +12958,7 @@
       <w:r>
         <w:t xml:space="preserve">Reich, David. </w:t>
       </w:r>
-      <w:hyperlink w:history="1" r:id="rIdwxata30fke6dj598joicd">
+      <w:hyperlink w:history="1" r:id="rId5whjkp_z_mpmoemgpk1c8">
         <w:r>
           <w:rPr>
             <w:color w:val="0563C1"/>
@@ -13006,7 +13006,7 @@
       <w:r>
         <w:t xml:space="preserve">Dietrich, Oliver, et al. “</w:t>
       </w:r>
-      <w:hyperlink w:history="1" r:id="rIdh418kvio4qorkgh44p70y">
+      <w:hyperlink w:history="1" r:id="rIdorwwbhe6kmchjkxtbj47c">
         <w:r>
           <w:rPr>
             <w:color w:val="0563C1"/>
@@ -13034,7 +13034,7 @@
       <w:r>
         <w:t xml:space="preserve">Larson, Greger, et al. “</w:t>
       </w:r>
-      <w:hyperlink w:history="1" r:id="rIddso2xnf8xmgrdkzvecvl-">
+      <w:hyperlink w:history="1" r:id="rIdcdxlr8qnmo6hnqev6_eyd">
         <w:r>
           <w:rPr>
             <w:color w:val="0563C1"/>
@@ -13062,7 +13062,7 @@
       <w:r>
         <w:t xml:space="preserve">Fuller, Dorian Q., et al. “</w:t>
       </w:r>
-      <w:hyperlink w:history="1" r:id="rIdk-ymqcsvbhuki22ry1hb2">
+      <w:hyperlink w:history="1" r:id="rIdmlmrm5pjaowqvnfagrztd">
         <w:r>
           <w:rPr>
             <w:color w:val="0563C1"/>
@@ -13090,7 +13090,7 @@
       <w:r>
         <w:t xml:space="preserve">Larsen, Clark Spencer. “</w:t>
       </w:r>
-      <w:hyperlink w:history="1" r:id="rIdzjusdjwx4gjsf1brxa1om">
+      <w:hyperlink w:history="1" r:id="rIdunlzjyxslzbaymp65fstb">
         <w:r>
           <w:rPr>
             <w:color w:val="0563C1"/>
@@ -13118,7 +13118,7 @@
       <w:r>
         <w:t xml:space="preserve">Hodder, Ian. </w:t>
       </w:r>
-      <w:hyperlink w:history="1" r:id="rIden8r-oogttabvhjtu72x1">
+      <w:hyperlink w:history="1" r:id="rId-6x2fietupog7qlyqjgxy">
         <w:r>
           <w:rPr>
             <w:color w:val="0563C1"/>
@@ -13146,7 +13146,7 @@
       <w:r>
         <w:t xml:space="preserve">Scott, James C. </w:t>
       </w:r>
-      <w:hyperlink w:history="1" r:id="rIdswks1kbc-lruhrolzbe6x">
+      <w:hyperlink w:history="1" r:id="rIdmi_3o2xthskyle4rgh1xb">
         <w:r>
           <w:rPr>
             <w:color w:val="0563C1"/>
@@ -13210,7 +13210,7 @@
       <w:r>
         <w:t xml:space="preserve">Schmandt-Besserat, Denise. </w:t>
       </w:r>
-      <w:hyperlink w:history="1" r:id="rIddqeknkdawncx7sspcjfha">
+      <w:hyperlink w:history="1" r:id="rId6gj6epp87hkp5bslznttd">
         <w:r>
           <w:rPr>
             <w:color w:val="0563C1"/>
@@ -13238,7 +13238,7 @@
       <w:r>
         <w:t xml:space="preserve">Nissen, Hans J., Peter Damerow, and Robert K. Englund. </w:t>
       </w:r>
-      <w:hyperlink w:history="1" r:id="rIdt5ec2xh8ohbtrytpzeiuy">
+      <w:hyperlink w:history="1" r:id="rIdow4lhbhxgozedenqplqp9">
         <w:r>
           <w:rPr>
             <w:color w:val="0563C1"/>
@@ -13266,7 +13266,7 @@
       <w:r>
         <w:t xml:space="preserve">Houston, Stephen D., ed. </w:t>
       </w:r>
-      <w:hyperlink w:history="1" r:id="rIdokdshbgqsypzirzz5aike">
+      <w:hyperlink w:history="1" r:id="rIduauetvuobl9aaaoalzx6t">
         <w:r>
           <w:rPr>
             <w:color w:val="0563C1"/>
@@ -13294,7 +13294,7 @@
       <w:r>
         <w:t xml:space="preserve">Schacter, Daniel L. </w:t>
       </w:r>
-      <w:hyperlink w:history="1" r:id="rId6bbkeslosl0isqe1x94xl">
+      <w:hyperlink w:history="1" r:id="rIdxik2o9ny2kfq6pe0r5cln">
         <w:r>
           <w:rPr>
             <w:color w:val="0563C1"/>
@@ -13374,7 +13374,7 @@
       <w:r>
         <w:t xml:space="preserve">Van De Mieroop, Marc. </w:t>
       </w:r>
-      <w:hyperlink w:history="1" r:id="rIdfewgul-df1qsnwhiuaefs">
+      <w:hyperlink w:history="1" r:id="rId1tl4t25snao-rjtl6z69f">
         <w:r>
           <w:rPr>
             <w:color w:val="0563C1"/>
@@ -13402,7 +13402,7 @@
       <w:r>
         <w:t xml:space="preserve">Lehner, Mark, and Zahi Hawass. </w:t>
       </w:r>
-      <w:hyperlink w:history="1" r:id="rIdlbqwpgfbtbaxv5x_rg_0p">
+      <w:hyperlink w:history="1" r:id="rIdqksa-tuz_k6oq0o4deeyc">
         <w:r>
           <w:rPr>
             <w:color w:val="0563C1"/>
@@ -13430,7 +13430,7 @@
       <w:r>
         <w:t xml:space="preserve">Edgerton, William F. “</w:t>
       </w:r>
-      <w:hyperlink w:history="1" r:id="rIdpilxs3a5s2_hf_6zbj_so">
+      <w:hyperlink w:history="1" r:id="rIdft60y9ipru0fzdb5pj42n">
         <w:r>
           <w:rPr>
             <w:color w:val="0563C1"/>
@@ -13458,7 +13458,7 @@
       <w:r>
         <w:t xml:space="preserve">Roth, Martha T. </w:t>
       </w:r>
-      <w:hyperlink w:history="1" r:id="rId-fgvlkwtr1c9xfg_mnq99">
+      <w:hyperlink w:history="1" r:id="rIdudevlgpdmausvdihnqz86">
         <w:r>
           <w:rPr>
             <w:color w:val="0563C1"/>
@@ -13486,7 +13486,7 @@
       <w:r>
         <w:t xml:space="preserve">Bryce, Trevor. </w:t>
       </w:r>
-      <w:hyperlink w:history="1" r:id="rIdwixa3jc7ndokj4gexkvxj">
+      <w:hyperlink w:history="1" r:id="rIdzqnyspi-b4ourxk4i6p6t">
         <w:r>
           <w:rPr>
             <w:color w:val="0563C1"/>
@@ -13514,7 +13514,7 @@
       <w:r>
         <w:t xml:space="preserve">Parkinson, Richard. </w:t>
       </w:r>
-      <w:hyperlink w:history="1" r:id="rIdel_r98a9mnb3zsndioilt">
+      <w:hyperlink w:history="1" r:id="rIdlguwfnppdwvleav_eqgbp">
         <w:r>
           <w:rPr>
             <w:color w:val="0563C1"/>
@@ -13562,7 +13562,7 @@
       <w:r>
         <w:t xml:space="preserve">Keightley, David N. </w:t>
       </w:r>
-      <w:hyperlink w:history="1" r:id="rIdnj7an4ees6k8m54on3hy-">
+      <w:hyperlink w:history="1" r:id="rIdl0zthv7fxhoowaukfrcvz">
         <w:r>
           <w:rPr>
             <w:color w:val="0563C1"/>
@@ -13590,7 +13590,7 @@
       <w:r>
         <w:t xml:space="preserve">Lewis, Mark Edward. </w:t>
       </w:r>
-      <w:hyperlink w:history="1" r:id="rId6okssh3zxxicypdxlqpam">
+      <w:hyperlink w:history="1" r:id="rIdw7loabqrnes0j1jvk16-i">
         <w:r>
           <w:rPr>
             <w:color w:val="0563C1"/>
@@ -13618,7 +13618,7 @@
       <w:r>
         <w:t xml:space="preserve">Elman, Benjamin A. </w:t>
       </w:r>
-      <w:hyperlink w:history="1" r:id="rIdhzeoufah2r_fyq45z7j_6">
+      <w:hyperlink w:history="1" r:id="rIdk8v5ctfosqynoe3betzi9">
         <w:r>
           <w:rPr>
             <w:color w:val="0563C1"/>
@@ -13646,7 +13646,7 @@
       <w:r>
         <w:t xml:space="preserve">Liu, Li, and Xingcan Chen. </w:t>
       </w:r>
-      <w:hyperlink w:history="1" r:id="rIdff6xp--gh7pq-xtyhq8xm">
+      <w:hyperlink w:history="1" r:id="rIdbbndhaqgxhdbx4nnwc_he">
         <w:r>
           <w:rPr>
             <w:color w:val="0563C1"/>
@@ -13694,7 +13694,7 @@
       <w:r>
         <w:t xml:space="preserve">Possehl, Gregory L. </w:t>
       </w:r>
-      <w:hyperlink w:history="1" r:id="rIdgug7bw5tocsw1rz5cwfwv">
+      <w:hyperlink w:history="1" r:id="rId1g5qbde6yjym329zvqkjc">
         <w:r>
           <w:rPr>
             <w:color w:val="0563C1"/>
@@ -13722,7 +13722,7 @@
       <w:r>
         <w:t xml:space="preserve">Thapar, Romila. </w:t>
       </w:r>
-      <w:hyperlink w:history="1" r:id="rIdw_jqfbyhsdhv2dluep2ro">
+      <w:hyperlink w:history="1" r:id="rId4a7zdebki4uqmcv2uwumj">
         <w:r>
           <w:rPr>
             <w:color w:val="0563C1"/>
@@ -13750,7 +13750,7 @@
       <w:r>
         <w:t xml:space="preserve">Plofker, Kim. </w:t>
       </w:r>
-      <w:hyperlink w:history="1" r:id="rIdakz8nl8qcwyj35d-ycx0c">
+      <w:hyperlink w:history="1" r:id="rIdy7bcafovyokxiewtdlhsr">
         <w:r>
           <w:rPr>
             <w:color w:val="0563C1"/>
@@ -13778,7 +13778,7 @@
       <w:r>
         <w:t xml:space="preserve">Dirks, Nicholas B. </w:t>
       </w:r>
-      <w:hyperlink w:history="1" r:id="rIdja92f3ok4m3rsqxwdyhmn">
+      <w:hyperlink w:history="1" r:id="rIdn5v2ed3p4ylra8gmh63fi">
         <w:r>
           <w:rPr>
             <w:color w:val="0563C1"/>
@@ -13806,7 +13806,7 @@
       <w:r>
         <w:t xml:space="preserve">Dundas, Paul. </w:t>
       </w:r>
-      <w:hyperlink w:history="1" r:id="rId4tcc450ykwvj_ywqhy20c">
+      <w:hyperlink w:history="1" r:id="rIdypogblna8sq9tag9yanvh">
         <w:r>
           <w:rPr>
             <w:color w:val="0563C1"/>
@@ -13886,7 +13886,7 @@
       <w:r>
         <w:t xml:space="preserve">Cartledge, Paul. </w:t>
       </w:r>
-      <w:hyperlink w:history="1" r:id="rIdoiiphpdvpmpi452a25hls">
+      <w:hyperlink w:history="1" r:id="rIdbzmkjho9jwgqopyw98izp">
         <w:r>
           <w:rPr>
             <w:color w:val="0563C1"/>
@@ -13914,7 +13914,7 @@
       <w:r>
         <w:t xml:space="preserve">Freeth, Tony, et al. “</w:t>
       </w:r>
-      <w:hyperlink w:history="1" r:id="rIdahtz_u50meqdggln54bsc">
+      <w:hyperlink w:history="1" r:id="rId1fb4fn9lfkebilyvogy2v">
         <w:r>
           <w:rPr>
             <w:color w:val="0563C1"/>
@@ -13942,7 +13942,7 @@
       <w:r>
         <w:t xml:space="preserve">Freeth, Tony, et al. “</w:t>
       </w:r>
-      <w:hyperlink w:history="1" r:id="rIdo7xdd05mwk_2e495ttupp">
+      <w:hyperlink w:history="1" r:id="rIduakc5t6_hcj1qoft54cp3">
         <w:r>
           <w:rPr>
             <w:color w:val="0563C1"/>
@@ -13990,7 +13990,7 @@
       <w:r>
         <w:t xml:space="preserve">Beard, Mary. </w:t>
       </w:r>
-      <w:hyperlink w:history="1" r:id="rIdarrdapz9fxaylwnfvleud">
+      <w:hyperlink w:history="1" r:id="rIdpr0vq__4zy7budsrmohtl">
         <w:r>
           <w:rPr>
             <w:color w:val="0563C1"/>
@@ -14018,7 +14018,7 @@
       <w:r>
         <w:t xml:space="preserve">Ward-Perkins, Bryan. </w:t>
       </w:r>
-      <w:hyperlink w:history="1" r:id="rIdxrrivcqra5bem5umonbxw">
+      <w:hyperlink w:history="1" r:id="rIdmq3qcd-d4cd5mkvddiaao">
         <w:r>
           <w:rPr>
             <w:color w:val="0563C1"/>
@@ -14046,7 +14046,7 @@
       <w:r>
         <w:t xml:space="preserve">Brown, Peter. </w:t>
       </w:r>
-      <w:hyperlink w:history="1" r:id="rIdf0kaabrljm0isysq_rah4">
+      <w:hyperlink w:history="1" r:id="rIdply6i_zaxdnsa5p20lkxq">
         <w:r>
           <w:rPr>
             <w:color w:val="0563C1"/>
@@ -14074,7 +14074,7 @@
       <w:r>
         <w:t xml:space="preserve">Harper, Kyle. </w:t>
       </w:r>
-      <w:hyperlink w:history="1" r:id="rIdkc_rwcn8xz78peefxjvoq">
+      <w:hyperlink w:history="1" r:id="rIdvguntmk4mqajcxn6r__wb">
         <w:r>
           <w:rPr>
             <w:color w:val="0563C1"/>
@@ -14122,7 +14122,7 @@
       <w:r>
         <w:t xml:space="preserve">Kennedy, Hugh. </w:t>
       </w:r>
-      <w:hyperlink w:history="1" r:id="rIdesiu2xyv19cptifkx7u3v">
+      <w:hyperlink w:history="1" r:id="rIdsd47aqmfcyovp8ghmfcqa">
         <w:r>
           <w:rPr>
             <w:color w:val="0563C1"/>
@@ -14150,7 +14150,7 @@
       <w:r>
         <w:t xml:space="preserve">Gutas, Dimitri. </w:t>
       </w:r>
-      <w:hyperlink w:history="1" r:id="rIdtsvioktoaqdnb6hxzkkbb">
+      <w:hyperlink w:history="1" r:id="rIdyewzoh84k1b7i7yi8sqlh">
         <w:r>
           <w:rPr>
             <w:color w:val="0563C1"/>
@@ -14178,7 +14178,7 @@
       <w:r>
         <w:t xml:space="preserve">Riley-Smith, Jonathan. </w:t>
       </w:r>
-      <w:hyperlink w:history="1" r:id="rIdgsxhscld3hluec23y33f1">
+      <w:hyperlink w:history="1" r:id="rIdeahxsblnlgesgeoojx1nu">
         <w:r>
           <w:rPr>
             <w:color w:val="0563C1"/>
@@ -14206,7 +14206,7 @@
       <w:r>
         <w:t xml:space="preserve">Phillips, Jonathan. </w:t>
       </w:r>
-      <w:hyperlink w:history="1" r:id="rIdgosgtr8llukokw-sw_byx">
+      <w:hyperlink w:history="1" r:id="rIdf5w7vxkw_khfkjpa-ke8m">
         <w:r>
           <w:rPr>
             <w:color w:val="0563C1"/>
@@ -14234,7 +14234,7 @@
       <w:r>
         <w:t xml:space="preserve">Stark, Rodney. </w:t>
       </w:r>
-      <w:hyperlink w:history="1" r:id="rId_k9id2kjc71owwuaek0gb">
+      <w:hyperlink w:history="1" r:id="rIdhwa4hllamtwnbtjibna42">
         <w:r>
           <w:rPr>
             <w:color w:val="0563C1"/>
@@ -14282,7 +14282,7 @@
       <w:r>
         <w:t xml:space="preserve">Mommsen, Theodor E. “</w:t>
       </w:r>
-      <w:hyperlink w:history="1" r:id="rId5xo6mwujtvkv9kyfamnfq">
+      <w:hyperlink w:history="1" r:id="rId9ddvbrcsknxlvbcbantjy">
         <w:r>
           <w:rPr>
             <w:color w:val="0563C1"/>
@@ -14310,7 +14310,7 @@
       <w:r>
         <w:t xml:space="preserve">Wickham, Chris. </w:t>
       </w:r>
-      <w:hyperlink w:history="1" r:id="rIdpq_pmh_ox0dmykrvpwg3k">
+      <w:hyperlink w:history="1" r:id="rIdzy64m7b7c5vqvo5mnxso9">
         <w:r>
           <w:rPr>
             <w:color w:val="0563C1"/>
@@ -14338,7 +14338,7 @@
       <w:r>
         <w:t xml:space="preserve">Russell, Jeffrey Burton. </w:t>
       </w:r>
-      <w:hyperlink w:history="1" r:id="rId7khir98_5oe2dvtboq5hf">
+      <w:hyperlink w:history="1" r:id="rIdqeulh7eyexmiocdkbpcge">
         <w:r>
           <w:rPr>
             <w:color w:val="0563C1"/>
@@ -14402,7 +14402,7 @@
       <w:r>
         <w:t xml:space="preserve">Hansen, Valerie. </w:t>
       </w:r>
-      <w:hyperlink w:history="1" r:id="rIdp7kkufyd-uncjiehd-sai">
+      <w:hyperlink w:history="1" r:id="rId6ynglpnafgznecq7pbw0l">
         <w:r>
           <w:rPr>
             <w:color w:val="0563C1"/>
@@ -14430,7 +14430,7 @@
       <w:r>
         <w:t xml:space="preserve">Spyrou, Maria A., et al. “</w:t>
       </w:r>
-      <w:hyperlink w:history="1" r:id="rId2szmas6wf6e2uezi4fovd">
+      <w:hyperlink w:history="1" r:id="rId0xcpelxvxecajqp4lb1bs">
         <w:r>
           <w:rPr>
             <w:color w:val="0563C1"/>
@@ -14458,7 +14458,7 @@
       <w:r>
         <w:t xml:space="preserve">Wheelis, Mark. “</w:t>
       </w:r>
-      <w:hyperlink w:history="1" r:id="rId--wz4cpzluyo28ai_fwwm">
+      <w:hyperlink w:history="1" r:id="rIdf9l5hzij4r7qst_elcau1">
         <w:r>
           <w:rPr>
             <w:color w:val="0563C1"/>
@@ -14486,7 +14486,7 @@
       <w:r>
         <w:t xml:space="preserve">Dean, Katharine R., et al. “</w:t>
       </w:r>
-      <w:hyperlink w:history="1" r:id="rIdxqbyif0szugpvyl9zakdw">
+      <w:hyperlink w:history="1" r:id="rIdur1acowesmukiijfewxpb">
         <w:r>
           <w:rPr>
             <w:color w:val="0563C1"/>
@@ -14514,7 +14514,7 @@
       <w:r>
         <w:t xml:space="preserve">Benedictow, Ole J. </w:t>
       </w:r>
-      <w:hyperlink w:history="1" r:id="rIdu4dl4z4i_jfqxsy3xvp5j">
+      <w:hyperlink w:history="1" r:id="rIduk40vxe8_ntg8bivfqwsl">
         <w:r>
           <w:rPr>
             <w:color w:val="0563C1"/>
@@ -14578,7 +14578,7 @@
       <w:r>
         <w:t xml:space="preserve">Gomez, Michael A. </w:t>
       </w:r>
-      <w:hyperlink w:history="1" r:id="rIdngo0jtvfdt7tgni-ydazd">
+      <w:hyperlink w:history="1" r:id="rId5k_aewqzkehul7jftzbbg">
         <w:r>
           <w:rPr>
             <w:color w:val="0563C1"/>
@@ -14638,7 +14638,7 @@
       <w:r>
         <w:t xml:space="preserve">Edwards, David N. </w:t>
       </w:r>
-      <w:hyperlink w:history="1" r:id="rIdnqzmrjprjvm5bpxuljaxy">
+      <w:hyperlink w:history="1" r:id="rIdcmabux4ykamwwrz_zs3_m">
         <w:r>
           <w:rPr>
             <w:color w:val="0563C1"/>
@@ -14666,7 +14666,7 @@
       <w:r>
         <w:t xml:space="preserve">Pikirayi, Innocent. </w:t>
       </w:r>
-      <w:hyperlink w:history="1" r:id="rIdp46mkrydyzvgfec_3glpu">
+      <w:hyperlink w:history="1" r:id="rIdgf93pza35j2woscnoj-qr">
         <w:r>
           <w:rPr>
             <w:color w:val="0563C1"/>
@@ -14694,7 +14694,7 @@
       <w:r>
         <w:t xml:space="preserve">Hicks, Dan. </w:t>
       </w:r>
-      <w:hyperlink w:history="1" r:id="rId3yjhq8rxj3ua1hakfcsvo">
+      <w:hyperlink w:history="1" r:id="rIdanmel_9gbq8mbvtpesanu">
         <w:r>
           <w:rPr>
             <w:color w:val="0563C1"/>
@@ -14742,7 +14742,7 @@
       <w:r>
         <w:t xml:space="preserve">Thornton, John K. </w:t>
       </w:r>
-      <w:hyperlink w:history="1" r:id="rIdvilgnvzyqhffxts0i4xdw">
+      <w:hyperlink w:history="1" r:id="rId-g0swe-ygu6k1whipyebv">
         <w:r>
           <w:rPr>
             <w:color w:val="0563C1"/>
@@ -14770,7 +14770,7 @@
       <w:r>
         <w:t xml:space="preserve">McCaskie, T. C. </w:t>
       </w:r>
-      <w:hyperlink w:history="1" r:id="rIdtj4-xfopd3dnvebzvfgnt">
+      <w:hyperlink w:history="1" r:id="rIdpy4avblyxdwolsx3pfh-s">
         <w:r>
           <w:rPr>
             <w:color w:val="0563C1"/>
@@ -14798,7 +14798,7 @@
       <w:r>
         <w:t xml:space="preserve">Hochschild, Adam. </w:t>
       </w:r>
-      <w:hyperlink w:history="1" r:id="rIdwiqk5bdckywzz2um_poza">
+      <w:hyperlink w:history="1" r:id="rIdw7eb6ofc0sk03dotu-66k">
         <w:r>
           <w:rPr>
             <w:color w:val="0563C1"/>
@@ -14842,7 +14842,7 @@
       <w:r>
         <w:t xml:space="preserve">Kara, Siddharth. </w:t>
       </w:r>
-      <w:hyperlink w:history="1" r:id="rIdo_-inyrmn-asbzw8pyk4j">
+      <w:hyperlink w:history="1" r:id="rIdkhogyphx2zzmafdibih7o">
         <w:r>
           <w:rPr>
             <w:color w:val="0563C1"/>
@@ -14890,7 +14890,7 @@
       <w:r>
         <w:t xml:space="preserve">Mann, Charles C. </w:t>
       </w:r>
-      <w:hyperlink w:history="1" r:id="rIdvv8dsnsnitsinmlj1yhvq">
+      <w:hyperlink w:history="1" r:id="rIdy9cwoveldtzdff6ryxdrq">
         <w:r>
           <w:rPr>
             <w:color w:val="0563C1"/>
@@ -14918,7 +14918,7 @@
       <w:r>
         <w:t xml:space="preserve">Matsuoka, Yoshihiro, et al. “</w:t>
       </w:r>
-      <w:hyperlink w:history="1" r:id="rId1guwtmvxxrdo8fk9h1ojt">
+      <w:hyperlink w:history="1" r:id="rId7xw4lbpnmppa4mnjhghnu">
         <w:r>
           <w:rPr>
             <w:color w:val="0563C1"/>
@@ -14946,7 +14946,7 @@
       <w:r>
         <w:t xml:space="preserve">Shady Solis, Ruth, Jonathan Haas, and Winifred Creamer. “</w:t>
       </w:r>
-      <w:hyperlink w:history="1" r:id="rId0y_4anxuwnrscd9fs27vx">
+      <w:hyperlink w:history="1" r:id="rId4adpfyjy1vvruzdudrhad">
         <w:r>
           <w:rPr>
             <w:color w:val="0563C1"/>
@@ -14974,7 +14974,7 @@
       <w:r>
         <w:t xml:space="preserve">Urton, Gary. </w:t>
       </w:r>
-      <w:hyperlink w:history="1" r:id="rIdlls2e3xcgnvvnuvzrycev">
+      <w:hyperlink w:history="1" r:id="rId1lfbkryevi7a6d_hvakvs">
         <w:r>
           <w:rPr>
             <w:color w:val="0563C1"/>
@@ -15002,7 +15002,7 @@
       <w:r>
         <w:t xml:space="preserve">Denevan, William M., ed. </w:t>
       </w:r>
-      <w:hyperlink w:history="1" r:id="rIdtyap-z_zemqjrfiugnfyf">
+      <w:hyperlink w:history="1" r:id="rIdthm3cal4jifmdkrbmxe0t">
         <w:r>
           <w:rPr>
             <w:color w:val="0563C1"/>
@@ -15030,7 +15030,7 @@
       <w:r>
         <w:t xml:space="preserve">Henige, David. </w:t>
       </w:r>
-      <w:hyperlink w:history="1" r:id="rIdxaxjuzgwobzmfwjqnzmac">
+      <w:hyperlink w:history="1" r:id="rIdzrswwampkhjxof4xpxl2l">
         <w:r>
           <w:rPr>
             <w:color w:val="0563C1"/>
@@ -15058,7 +15058,7 @@
       <w:r>
         <w:t xml:space="preserve">Koch, Alexander, Chris Brierley, Mark M. Maslin, and Simon L. Lewis. “</w:t>
       </w:r>
-      <w:hyperlink w:history="1" r:id="rIdk_2csnrqpcdbbhr9ixe7y">
+      <w:hyperlink w:history="1" r:id="rIduhf-igrort4gz1d-bhaxj">
         <w:r>
           <w:rPr>
             <w:color w:val="0563C1"/>
@@ -15086,7 +15086,7 @@
       <w:r>
         <w:t xml:space="preserve">Ioannidis, Alexander G., et al. “</w:t>
       </w:r>
-      <w:hyperlink w:history="1" r:id="rIdej5m4cm1krr-u7a4x2wt0">
+      <w:hyperlink w:history="1" r:id="rIdehkwyne8mp_7gffdw2ujg">
         <w:r>
           <w:rPr>
             <w:color w:val="0563C1"/>
@@ -15114,7 +15114,7 @@
       <w:r>
         <w:t xml:space="preserve">Pauketat, Timothy R. </w:t>
       </w:r>
-      <w:hyperlink w:history="1" r:id="rIddnasjqvevnsyt9weqjqmj">
+      <w:hyperlink w:history="1" r:id="rIdp_gcf_6y8oiqaplk9eocb">
         <w:r>
           <w:rPr>
             <w:color w:val="0563C1"/>
@@ -15142,7 +15142,7 @@
       <w:r>
         <w:t xml:space="preserve">Dobyns, Henry F. “</w:t>
       </w:r>
-      <w:hyperlink w:history="1" r:id="rIdtvz7ivsvkd9tchj5bt04x">
+      <w:hyperlink w:history="1" r:id="rId02kgt5mlechv8xhixzjyb">
         <w:r>
           <w:rPr>
             <w:color w:val="0563C1"/>
@@ -15203,7 +15203,7 @@
         </w:rPr>
         <w:t xml:space="preserve">The voyages database behind those numbers. </w:t>
       </w:r>
-      <w:hyperlink w:history="1" r:id="rId66wco8zcbtcohr68joglu">
+      <w:hyperlink w:history="1" r:id="rIdxbrbh00tewwg8sce77dy2">
         <w:r>
           <w:rPr>
             <w:color w:val="0563C1"/>
@@ -15231,7 +15231,7 @@
       <w:r>
         <w:t xml:space="preserve">Equiano, Olaudah. </w:t>
       </w:r>
-      <w:hyperlink w:history="1" r:id="rId0owbvf2bsycnkywhpfqrj">
+      <w:hyperlink w:history="1" r:id="rIdt7u3jg4ia6o_ds9ucoly1">
         <w:r>
           <w:rPr>
             <w:color w:val="0563C1"/>
@@ -15259,7 +15259,7 @@
       <w:r>
         <w:t xml:space="preserve">Carretta, Vincent. </w:t>
       </w:r>
-      <w:hyperlink w:history="1" r:id="rId6j5lygcck7kunzta852av">
+      <w:hyperlink w:history="1" r:id="rIda_jn4lqbrqav7mpsee_zo">
         <w:r>
           <w:rPr>
             <w:color w:val="0563C1"/>
@@ -15287,7 +15287,7 @@
       <w:r>
         <w:t xml:space="preserve">Hurston, Zora Neale. </w:t>
       </w:r>
-      <w:hyperlink w:history="1" r:id="rId1bujc7k_xyaotc2n0d3cl">
+      <w:hyperlink w:history="1" r:id="rId8fgc0lmm3pondtdyrpwvo">
         <w:r>
           <w:rPr>
             <w:color w:val="0563C1"/>
@@ -15315,7 +15315,7 @@
       <w:r>
         <w:t xml:space="preserve">Diouf, Sylviane A. </w:t>
       </w:r>
-      <w:hyperlink w:history="1" r:id="rIdrikcjjuhwsakuyrz9csqd">
+      <w:hyperlink w:history="1" r:id="rIdm0xxaoen0gdjcizwtyzvq">
         <w:r>
           <w:rPr>
             <w:color w:val="0563C1"/>
@@ -15343,7 +15343,7 @@
       <w:r>
         <w:t xml:space="preserve">Livi Bacci, Massimo. </w:t>
       </w:r>
-      <w:hyperlink w:history="1" r:id="rIdiphwykamw6b-p453xn-gj">
+      <w:hyperlink w:history="1" r:id="rIdlo-gfgu2ws782ebhat9ty">
         <w:r>
           <w:rPr>
             <w:color w:val="0563C1"/>
@@ -15371,7 +15371,7 @@
       <w:r>
         <w:t xml:space="preserve">Reséndez, Andrés. </w:t>
       </w:r>
-      <w:hyperlink w:history="1" r:id="rIditz-xfwue4wki1hzmvqba">
+      <w:hyperlink w:history="1" r:id="rId1bpspsivlumuvef-hvcfu">
         <w:r>
           <w:rPr>
             <w:color w:val="0563C1"/>
@@ -15399,7 +15399,7 @@
       <w:r>
         <w:t xml:space="preserve">Dreyer, Edward L. </w:t>
       </w:r>
-      <w:hyperlink w:history="1" r:id="rIdhcwmkxisudkwvxd4km1le">
+      <w:hyperlink w:history="1" r:id="rIdp_b_fc9jueuxh7ecpawi-">
         <w:r>
           <w:rPr>
             <w:color w:val="0563C1"/>
@@ -15447,7 +15447,7 @@
       <w:r>
         <w:t xml:space="preserve">Eisenstein, Elizabeth L. </w:t>
       </w:r>
-      <w:hyperlink w:history="1" r:id="rIdmr3lxjfxpii4a6un1p-0l">
+      <w:hyperlink w:history="1" r:id="rIdiigfgjgnttbuzmp7p4cgk">
         <w:r>
           <w:rPr>
             <w:color w:val="0563C1"/>
@@ -15475,7 +15475,7 @@
       <w:r>
         <w:t xml:space="preserve">Allen, Robert C. </w:t>
       </w:r>
-      <w:hyperlink w:history="1" r:id="rIdc3nbajsrdl4z1j_eobj5v">
+      <w:hyperlink w:history="1" r:id="rIdxyyzsbo6tk_coj4keetcc">
         <w:r>
           <w:rPr>
             <w:color w:val="0563C1"/>
@@ -15503,7 +15503,7 @@
       <w:r>
         <w:t xml:space="preserve">Humphries, Jane. </w:t>
       </w:r>
-      <w:hyperlink w:history="1" r:id="rIdc50sepnkjgatzn50x57il">
+      <w:hyperlink w:history="1" r:id="rIdapj0ixnbvv_s7-izqjbjt">
         <w:r>
           <w:rPr>
             <w:color w:val="0563C1"/>
@@ -15531,7 +15531,7 @@
       <w:r>
         <w:t xml:space="preserve">Pomeranz, Kenneth. </w:t>
       </w:r>
-      <w:hyperlink w:history="1" r:id="rIdiokstqrlruxqipev5tnq5">
+      <w:hyperlink w:history="1" r:id="rIducezpj66q0bz5li6lpsb1">
         <w:r>
           <w:rPr>
             <w:color w:val="0563C1"/>
@@ -15559,7 +15559,7 @@
       <w:r>
         <w:t xml:space="preserve">Bell, Michelle L., and Devra Lee Davis. “</w:t>
       </w:r>
-      <w:hyperlink w:history="1" r:id="rId4ducwtbqiwqqv1xlhcjlh">
+      <w:hyperlink w:history="1" r:id="rIdeyfhayuly6tq0785uiimu">
         <w:r>
           <w:rPr>
             <w:color w:val="0563C1"/>
@@ -15607,7 +15607,7 @@
       <w:r>
         <w:t xml:space="preserve">Hacker, J. David. “</w:t>
       </w:r>
-      <w:hyperlink w:history="1" r:id="rIddmlej6bfh2gcx3vumgz4s">
+      <w:hyperlink w:history="1" r:id="rId1ouvz6y12ihytidfzbuz2">
         <w:r>
           <w:rPr>
             <w:color w:val="0563C1"/>
@@ -15635,7 +15635,7 @@
       <w:r>
         <w:t xml:space="preserve">Foner, Eric. </w:t>
       </w:r>
-      <w:hyperlink w:history="1" r:id="rId2tzjtrpfs5ofpw8dkt-al">
+      <w:hyperlink w:history="1" r:id="rIdf2fitmwqnpx3h1uveefp6">
         <w:r>
           <w:rPr>
             <w:color w:val="0563C1"/>
@@ -15663,7 +15663,7 @@
       <w:r>
         <w:t xml:space="preserve">Saunt, Claudio. </w:t>
       </w:r>
-      <w:hyperlink w:history="1" r:id="rIdwgy_kcy4rbnzuv8tzw03b">
+      <w:hyperlink w:history="1" r:id="rIdhs5eziyhujrwuoj8t_-uq">
         <w:r>
           <w:rPr>
             <w:color w:val="0563C1"/>
@@ -15691,7 +15691,7 @@
       <w:r>
         <w:t xml:space="preserve">Dubois, Laurent. </w:t>
       </w:r>
-      <w:hyperlink w:history="1" r:id="rIdbwiiwc8o9e--wqgehvz4l">
+      <w:hyperlink w:history="1" r:id="rIdev0viypvltv7obz8j7pbl">
         <w:r>
           <w:rPr>
             <w:color w:val="0563C1"/>
@@ -15719,7 +15719,7 @@
       <w:r>
         <w:t xml:space="preserve">Dolin, Eric Jay. </w:t>
       </w:r>
-      <w:hyperlink w:history="1" r:id="rIdsi-ewowncnwgiz0i3lxko">
+      <w:hyperlink w:history="1" r:id="rId4ys4ixav-ug4z0th63wk_">
         <w:r>
           <w:rPr>
             <w:color w:val="0563C1"/>
@@ -15747,7 +15747,7 @@
       <w:r>
         <w:t xml:space="preserve">Horn, James. </w:t>
       </w:r>
-      <w:hyperlink w:history="1" r:id="rIda41ry1qprtry_ezisxut2">
+      <w:hyperlink w:history="1" r:id="rIdgun_8abfsnywtljwbptyr">
         <w:r>
           <w:rPr>
             <w:color w:val="0563C1"/>
@@ -15775,7 +15775,7 @@
       <w:r>
         <w:t xml:space="preserve">Wilentz, Sean. </w:t>
       </w:r>
-      <w:hyperlink w:history="1" r:id="rIdvadckycf9s-ryy5wmpoxw">
+      <w:hyperlink w:history="1" r:id="rIdqtaahpqjkzduxrral4zmt">
         <w:r>
           <w:rPr>
             <w:color w:val="0563C1"/>
@@ -15823,7 +15823,7 @@
       <w:r>
         <w:t xml:space="preserve">Equal Justice Initiative. </w:t>
       </w:r>
-      <w:hyperlink w:history="1" r:id="rIdfc8mhvmz84j7t2_qmyuzj">
+      <w:hyperlink w:history="1" r:id="rIdjcz7n42765tliods38kyw">
         <w:r>
           <w:rPr>
             <w:color w:val="0563C1"/>
@@ -15867,7 +15867,7 @@
       <w:r>
         <w:t xml:space="preserve">Robinson, Greg. </w:t>
       </w:r>
-      <w:hyperlink w:history="1" r:id="rIdbdnd1rcuhqg_eysz7o2nq">
+      <w:hyperlink w:history="1" r:id="rIdsguydfgcaw-bqfi7ylsph">
         <w:r>
           <w:rPr>
             <w:color w:val="0563C1"/>
@@ -15895,7 +15895,7 @@
       <w:r>
         <w:t xml:space="preserve">Blinder, Alan S. </w:t>
       </w:r>
-      <w:hyperlink w:history="1" r:id="rId4kidnraof2irt0eco6wax">
+      <w:hyperlink w:history="1" r:id="rIdswomrsppidkdtgzl2x8ad">
         <w:r>
           <w:rPr>
             <w:color w:val="0563C1"/>
@@ -15943,7 +15943,7 @@
       <w:r>
         <w:t xml:space="preserve">Butler, Jon. </w:t>
       </w:r>
-      <w:hyperlink w:history="1" r:id="rIdlrb1ee-hp09ho9_lbaods">
+      <w:hyperlink w:history="1" r:id="rIdgdb30siweactxt74vlqad">
         <w:r>
           <w:rPr>
             <w:color w:val="0563C1"/>
@@ -15971,7 +15971,7 @@
       <w:r>
         <w:t xml:space="preserve">Hatch, Nathan O. </w:t>
       </w:r>
-      <w:hyperlink w:history="1" r:id="rId7tjbhjrqavjdhkzoqycyp">
+      <w:hyperlink w:history="1" r:id="rIdgcwplddoli0d_rsayhslm">
         <w:r>
           <w:rPr>
             <w:color w:val="0563C1"/>
@@ -15999,7 +15999,7 @@
       <w:r>
         <w:t xml:space="preserve">Bushman, Richard Lyman. </w:t>
       </w:r>
-      <w:hyperlink w:history="1" r:id="rIdbhyr8mgotzv6t00dmkxr6">
+      <w:hyperlink w:history="1" r:id="rIdi4k1auvanddvq1ljipecu">
         <w:r>
           <w:rPr>
             <w:color w:val="0563C1"/>
@@ -16027,7 +16027,7 @@
       <w:r>
         <w:t xml:space="preserve">Kraybill, Donald B., Karen M. Johnson-Weiner, and Steven M. Nolt. </w:t>
       </w:r>
-      <w:hyperlink w:history="1" r:id="rIdn8s0oavy3qplccnpo5w49">
+      <w:hyperlink w:history="1" r:id="rIdes0vibdl4m-ybn4izbnlj">
         <w:r>
           <w:rPr>
             <w:color w:val="0563C1"/>
@@ -16055,7 +16055,7 @@
       <w:r>
         <w:t xml:space="preserve">Moore, Rebecca. </w:t>
       </w:r>
-      <w:hyperlink w:history="1" r:id="rIdb7xp_odr0diemuxveazrk">
+      <w:hyperlink w:history="1" r:id="rIdhfauuouzx_ienvnhwp7o3">
         <w:r>
           <w:rPr>
             <w:color w:val="0563C1"/>
@@ -16119,7 +16119,7 @@
       <w:r>
         <w:t xml:space="preserve">Lynch, John. </w:t>
       </w:r>
-      <w:hyperlink w:history="1" r:id="rIdlofl_rncioerrj-a7rndg">
+      <w:hyperlink w:history="1" r:id="rIdxpbyed5jkm6_quborg--s">
         <w:r>
           <w:rPr>
             <w:color w:val="0563C1"/>
@@ -16147,7 +16147,7 @@
       <w:r>
         <w:t xml:space="preserve">Dubois, Laurent. </w:t>
       </w:r>
-      <w:hyperlink w:history="1" r:id="rIdswc5sqrgvr1qf2va0ntxy">
+      <w:hyperlink w:history="1" r:id="rIdln7x1hrnnh8meidxyjdhi">
         <w:r>
           <w:rPr>
             <w:color w:val="0563C1"/>
@@ -16175,7 +16175,7 @@
       <w:r>
         <w:t xml:space="preserve">Conrad, Robert Edgar. </w:t>
       </w:r>
-      <w:hyperlink w:history="1" r:id="rIdjdpekfz4fhy4ll6qhl_sq">
+      <w:hyperlink w:history="1" r:id="rIdm2a8dvtvu0e-qunnrzpfg">
         <w:r>
           <w:rPr>
             <w:color w:val="0563C1"/>
@@ -16200,7 +16200,7 @@
         </w:rPr>
         <w:t xml:space="preserve">Brazil’s share of the Atlantic slave trade. </w:t>
       </w:r>
-      <w:hyperlink w:history="1" r:id="rIdg2vkfsa4cx8z-ght2fbe9">
+      <w:hyperlink w:history="1" r:id="rIdia_ykn2jpmagbhqphx1pb">
         <w:r>
           <w:rPr>
             <w:color w:val="0563C1"/>
@@ -16228,7 +16228,7 @@
       <w:r>
         <w:t xml:space="preserve">Smith, Peter H. </w:t>
       </w:r>
-      <w:hyperlink w:history="1" r:id="rIdl02bvxkk2jr9vpnsjfl0w">
+      <w:hyperlink w:history="1" r:id="rIdhhic_ew8p5zzeqg7o3izq">
         <w:r>
           <w:rPr>
             <w:color w:val="0563C1"/>
@@ -16256,7 +16256,7 @@
       <w:r>
         <w:t xml:space="preserve">Schlesinger, Stephen, and Stephen Kinzer. </w:t>
       </w:r>
-      <w:hyperlink w:history="1" r:id="rIdev_4r4sibokiw--srkbyc">
+      <w:hyperlink w:history="1" r:id="rId3mujl_8gceqo8uyjgiops">
         <w:r>
           <w:rPr>
             <w:color w:val="0563C1"/>
@@ -16284,7 +16284,7 @@
       <w:r>
         <w:t xml:space="preserve">Slater, Candace. </w:t>
       </w:r>
-      <w:hyperlink w:history="1" r:id="rIddzcua3b9vgs5luhdsyd3y">
+      <w:hyperlink w:history="1" r:id="rIdkti9zqddo0rf9mlrk2oty">
         <w:r>
           <w:rPr>
             <w:color w:val="0563C1"/>
@@ -16312,7 +16312,7 @@
       <w:r>
         <w:t xml:space="preserve">Taylor, Barbara L., et al. “</w:t>
       </w:r>
-      <w:hyperlink w:history="1" r:id="rIdqfgr_kqz_rqfxtll8gmxl">
+      <w:hyperlink w:history="1" r:id="rIdayv4evrq3z2mhakh74ycw">
         <w:r>
           <w:rPr>
             <w:color w:val="0563C1"/>
@@ -16340,7 +16340,7 @@
       <w:r>
         <w:t xml:space="preserve">NOAA Fisheries. “</w:t>
       </w:r>
-      <w:hyperlink w:history="1" r:id="rIdrij2cxwtlscdavuxpwwas">
+      <w:hyperlink w:history="1" r:id="rIdbd6ybzdqxjaxfxcnpvjqj">
         <w:r>
           <w:rPr>
             <w:color w:val="0563C1"/>
@@ -16368,7 +16368,7 @@
       <w:r>
         <w:t xml:space="preserve">Skidmore, Thomas E. </w:t>
       </w:r>
-      <w:hyperlink w:history="1" r:id="rIdcugkz3ur5y66mu5ddbzgj">
+      <w:hyperlink w:history="1" r:id="rId4xtyfpwj_qqgfqv4ki7ot">
         <w:r>
           <w:rPr>
             <w:color w:val="0563C1"/>
@@ -16396,7 +16396,7 @@
       <w:r>
         <w:t xml:space="preserve">Comisión Nacional sobre la Desaparición de Personas. </w:t>
       </w:r>
-      <w:hyperlink w:history="1" r:id="rIdg-ypeda7g6tdpsea5chpe">
+      <w:hyperlink w:history="1" r:id="rIdy1dzejbjujlasqnds_itw">
         <w:r>
           <w:rPr>
             <w:color w:val="0563C1"/>
@@ -16424,7 +16424,7 @@
       <w:r>
         <w:t xml:space="preserve">Nino, Carlos Santiago. </w:t>
       </w:r>
-      <w:hyperlink w:history="1" r:id="rIdanv-xzcrwmlgnaojvcrdx">
+      <w:hyperlink w:history="1" r:id="rIdgm2lprgnjuj2bwioetsnn">
         <w:r>
           <w:rPr>
             <w:color w:val="0563C1"/>
@@ -16452,7 +16452,7 @@
       <w:r>
         <w:t xml:space="preserve">Bouvard, Marguerite Guzman. </w:t>
       </w:r>
-      <w:hyperlink w:history="1" r:id="rIdgukzd5iwihrychicwef8w">
+      <w:hyperlink w:history="1" r:id="rIdvuoexmgchkzketc7dcdc8">
         <w:r>
           <w:rPr>
             <w:color w:val="0563C1"/>
@@ -16480,7 +16480,7 @@
       <w:r>
         <w:t xml:space="preserve">Kornbluh, Peter. </w:t>
       </w:r>
-      <w:hyperlink w:history="1" r:id="rId4c3dy7yoxiqzz2pj-cgob">
+      <w:hyperlink w:history="1" r:id="rId03cdk7akfszmd8ays99jw">
         <w:r>
           <w:rPr>
             <w:color w:val="0563C1"/>
@@ -16508,7 +16508,7 @@
       <w:r>
         <w:t xml:space="preserve">Jara, Joan. </w:t>
       </w:r>
-      <w:hyperlink w:history="1" r:id="rIdrmpdm37mt1kh-qygp9cmy">
+      <w:hyperlink w:history="1" r:id="rIduwtwkbzdqgrwf9ehigodr">
         <w:r>
           <w:rPr>
             <w:color w:val="0563C1"/>
@@ -16536,7 +16536,7 @@
       <w:r>
         <w:t xml:space="preserve">LeoGrande, William M., and Peter Kornbluh. </w:t>
       </w:r>
-      <w:hyperlink w:history="1" r:id="rIdyczy_gwmj33s9wvpyi1bc">
+      <w:hyperlink w:history="1" r:id="rId_evvopyzcdvufbltl8eeb">
         <w:r>
           <w:rPr>
             <w:color w:val="0563C1"/>
@@ -16596,7 +16596,7 @@
       <w:r>
         <w:t xml:space="preserve">Secretaría de Gobernación (Mexico). “</w:t>
       </w:r>
-      <w:hyperlink w:history="1" r:id="rIdygze3pp2v2jidmtyhseo1">
+      <w:hyperlink w:history="1" r:id="rIdqrcn6-9hbvd3vzva283l4">
         <w:r>
           <w:rPr>
             <w:color w:val="0563C1"/>
@@ -16644,7 +16644,7 @@
       <w:r>
         <w:t xml:space="preserve">Finkel, Caroline. </w:t>
       </w:r>
-      <w:hyperlink w:history="1" r:id="rIdeib3egmmbjakeclri_afb">
+      <w:hyperlink w:history="1" r:id="rIdh0ycfjx9liushbegclwdv">
         <w:r>
           <w:rPr>
             <w:color w:val="0563C1"/>
@@ -16672,7 +16672,7 @@
       <w:r>
         <w:t xml:space="preserve">Crowley, Roger. </w:t>
       </w:r>
-      <w:hyperlink w:history="1" r:id="rIdzmximjhrkuktgg_p49ou9">
+      <w:hyperlink w:history="1" r:id="rIdjgmhpoglkgtabtnzgnjye">
         <w:r>
           <w:rPr>
             <w:color w:val="0563C1"/>
@@ -16700,7 +16700,7 @@
       <w:r>
         <w:t xml:space="preserve">Barkey, Karen. </w:t>
       </w:r>
-      <w:hyperlink w:history="1" r:id="rIdyife4wg45e87widy6j-bc">
+      <w:hyperlink w:history="1" r:id="rIdrmipxbwnlpx_22x5w9ii2">
         <w:r>
           <w:rPr>
             <w:color w:val="0563C1"/>
@@ -16728,7 +16728,7 @@
       <w:r>
         <w:t xml:space="preserve">Mazower, Mark. </w:t>
       </w:r>
-      <w:hyperlink w:history="1" r:id="rIdvuu3cgs-nb7vkvvf2-ytu">
+      <w:hyperlink w:history="1" r:id="rId_-b8b_cq5xtqykwi287_l">
         <w:r>
           <w:rPr>
             <w:color w:val="0563C1"/>
@@ -16756,7 +16756,7 @@
       <w:r>
         <w:t xml:space="preserve">Suny, Ronald Grigor. “</w:t>
       </w:r>
-      <w:hyperlink w:history="1" r:id="rIdly1dsm6qdihsxpbohsglj">
+      <w:hyperlink w:history="1" r:id="rIdladuxnzxfg4rouaoihtvc">
         <w:r>
           <w:rPr>
             <w:color w:val="0563C1"/>
@@ -16784,7 +16784,7 @@
       <w:r>
         <w:t xml:space="preserve">Power, Samantha. “</w:t>
       </w:r>
-      <w:hyperlink w:history="1" r:id="rIdm4b3h3ph_kdy-bpdrvcjz">
+      <w:hyperlink w:history="1" r:id="rId-q3hyz9jegnuoiprrpxr-">
         <w:r>
           <w:rPr>
             <w:color w:val="0563C1"/>
@@ -16812,7 +16812,7 @@
       <w:r>
         <w:t xml:space="preserve">Hirschon, Renée, ed. </w:t>
       </w:r>
-      <w:hyperlink w:history="1" r:id="rIdq8oqkxnr6witmmc9z113v">
+      <w:hyperlink w:history="1" r:id="rIdsmw96i4dorglvxeyg_acj">
         <w:r>
           <w:rPr>
             <w:color w:val="0563C1"/>
@@ -16840,7 +16840,7 @@
       <w:r>
         <w:t xml:space="preserve">Rogan, Eugene. </w:t>
       </w:r>
-      <w:hyperlink w:history="1" r:id="rIdfgzubqf9j4ooipv6hbiyq">
+      <w:hyperlink w:history="1" r:id="rIda5blrx7h8niakwnyfecph">
         <w:r>
           <w:rPr>
             <w:color w:val="0563C1"/>
@@ -16868,7 +16868,7 @@
       <w:r>
         <w:t xml:space="preserve">Barr, James. </w:t>
       </w:r>
-      <w:hyperlink w:history="1" r:id="rIdpl8xxlzmn-steroqkbn3y">
+      <w:hyperlink w:history="1" r:id="rIdyzxy8ewuqqpmfftid-e2h">
         <w:r>
           <w:rPr>
             <w:color w:val="0563C1"/>
@@ -16896,7 +16896,7 @@
       <w:r>
         <w:t xml:space="preserve">McDowall, David. </w:t>
       </w:r>
-      <w:hyperlink w:history="1" r:id="rId6ek5gs-1zebbmctwbprw2">
+      <w:hyperlink w:history="1" r:id="rIdppqpzx-ly1ikcprgwkl8s">
         <w:r>
           <w:rPr>
             <w:color w:val="0563C1"/>
@@ -16924,7 +16924,7 @@
       <w:r>
         <w:t xml:space="preserve">Abrahamian, Ervand. </w:t>
       </w:r>
-      <w:hyperlink w:history="1" r:id="rId6mqnvjokjrmffautxsbax">
+      <w:hyperlink w:history="1" r:id="rIdow0vr5txvembryitp3acd">
         <w:r>
           <w:rPr>
             <w:color w:val="0563C1"/>
@@ -16952,7 +16952,7 @@
       <w:r>
         <w:t xml:space="preserve">Razoux, Pierre. </w:t>
       </w:r>
-      <w:hyperlink w:history="1" r:id="rIdvf_fndaj16qktdqzkwm0d">
+      <w:hyperlink w:history="1" r:id="rIdoozllfpd6eepsk9d04xfu">
         <w:r>
           <w:rPr>
             <w:color w:val="0563C1"/>
@@ -17000,7 +17000,7 @@
       <w:r>
         <w:t xml:space="preserve">Clark, Christopher. </w:t>
       </w:r>
-      <w:hyperlink w:history="1" r:id="rIdmgkba_xbbloshplz3mh5t">
+      <w:hyperlink w:history="1" r:id="rIdz8xzofbgnpmnwcjuafd3m">
         <w:r>
           <w:rPr>
             <w:color w:val="0563C1"/>
@@ -17028,7 +17028,7 @@
       <w:r>
         <w:t xml:space="preserve">Strachan, Hew. </w:t>
       </w:r>
-      <w:hyperlink w:history="1" r:id="rIdu6whparqb8mj2axc8dgy_">
+      <w:hyperlink w:history="1" r:id="rIdkxwqtacp2xcys4f4v4dej">
         <w:r>
           <w:rPr>
             <w:color w:val="0563C1"/>
@@ -17072,7 +17072,7 @@
       <w:r>
         <w:t xml:space="preserve">Weintraub, Stanley. </w:t>
       </w:r>
-      <w:hyperlink w:history="1" r:id="rIdi6rqarqvvqwfigjiryykv">
+      <w:hyperlink w:history="1" r:id="rId6-yqmovkzadevhrjlzhl1">
         <w:r>
           <w:rPr>
             <w:color w:val="0563C1"/>
@@ -17100,7 +17100,7 @@
       <w:r>
         <w:t xml:space="preserve">Johnson, Niall P. A. S., and Juergen Mueller. “</w:t>
       </w:r>
-      <w:hyperlink w:history="1" r:id="rId4ubyingmq1_cpnailcvw8">
+      <w:hyperlink w:history="1" r:id="rIdv2oqb2bcmfirztvcy16nq">
         <w:r>
           <w:rPr>
             <w:color w:val="0563C1"/>
@@ -17128,7 +17128,7 @@
       <w:r>
         <w:t xml:space="preserve">Spreeuwenberg, Peter, et al. “</w:t>
       </w:r>
-      <w:hyperlink w:history="1" r:id="rIdncedspa8dwuhhga2nwyqn">
+      <w:hyperlink w:history="1" r:id="rId_br4sytun5u81_n31asmm">
         <w:r>
           <w:rPr>
             <w:color w:val="0563C1"/>
@@ -17156,7 +17156,7 @@
       <w:r>
         <w:t xml:space="preserve">Keynes, John Maynard. </w:t>
       </w:r>
-      <w:hyperlink w:history="1" r:id="rIddcltkgahcdzq112srvaxj">
+      <w:hyperlink w:history="1" r:id="rIdctasxmqu8seumn9xc499t">
         <w:r>
           <w:rPr>
             <w:color w:val="0563C1"/>
@@ -17204,7 +17204,7 @@
       <w:r>
         <w:t xml:space="preserve">Evans, Richard J. </w:t>
       </w:r>
-      <w:hyperlink w:history="1" r:id="rIdff2go47b56atxfc9nbdcy">
+      <w:hyperlink w:history="1" r:id="rIdc1yhxjtuzpax2emvl5w4u">
         <w:r>
           <w:rPr>
             <w:color w:val="0563C1"/>
@@ -17232,7 +17232,7 @@
       <w:r>
         <w:t xml:space="preserve">Hilberg, Raul. </w:t>
       </w:r>
-      <w:hyperlink w:history="1" r:id="rIdxoifpwhj1eqow0mhnf_zf">
+      <w:hyperlink w:history="1" r:id="rId0yarr6ig6gnwtee5qvm4t">
         <w:r>
           <w:rPr>
             <w:color w:val="0563C1"/>
@@ -17260,7 +17260,7 @@
       <w:r>
         <w:t xml:space="preserve">Kiernan, Ben. </w:t>
       </w:r>
-      <w:hyperlink w:history="1" r:id="rIdrrnji2scmhvab5kk2wp8e">
+      <w:hyperlink w:history="1" r:id="rId2lytqgwz9rwtpjndc5p4l">
         <w:r>
           <w:rPr>
             <w:color w:val="0563C1"/>
@@ -17288,7 +17288,7 @@
       <w:r>
         <w:t xml:space="preserve">Levitsky, Steven, and Daniel Ziblatt. </w:t>
       </w:r>
-      <w:hyperlink w:history="1" r:id="rIdqx1virrd2y_duoibmr9no">
+      <w:hyperlink w:history="1" r:id="rId7twh8mvo0cmacuehbdq0d">
         <w:r>
           <w:rPr>
             <w:color w:val="0563C1"/>
@@ -17316,7 +17316,7 @@
       <w:r>
         <w:t xml:space="preserve">Neiman, Susan. </w:t>
       </w:r>
-      <w:hyperlink w:history="1" r:id="rIdqhi6vuj9l283kwx7xwsb3">
+      <w:hyperlink w:history="1" r:id="rIdy8i_lzjgflhaajn90ov-l">
         <w:r>
           <w:rPr>
             <w:color w:val="0563C1"/>
@@ -17360,7 +17360,7 @@
       <w:r>
         <w:t xml:space="preserve">Broberg, Gunnar, and Nils Roll-Hansen, eds. </w:t>
       </w:r>
-      <w:hyperlink w:history="1" r:id="rIdoxgftuhziglggmuuekigt">
+      <w:hyperlink w:history="1" r:id="rIdoowlfisa9qcpvpp1onbbz">
         <w:r>
           <w:rPr>
             <w:color w:val="0563C1"/>
@@ -17408,7 +17408,7 @@
       <w:r>
         <w:t xml:space="preserve">Jansen, Marius B. </w:t>
       </w:r>
-      <w:hyperlink w:history="1" r:id="rIdyu2l7vrofxdlyuzab53df">
+      <w:hyperlink w:history="1" r:id="rIdgioytkhb2h4fqkfbwaqef">
         <w:r>
           <w:rPr>
             <w:color w:val="0563C1"/>
@@ -17436,7 +17436,7 @@
       <w:r>
         <w:t xml:space="preserve">Fogel, Joshua A., ed. </w:t>
       </w:r>
-      <w:hyperlink w:history="1" r:id="rIdd_h3fuu3d5zgex2yfsigz">
+      <w:hyperlink w:history="1" r:id="rIdhsu8bmrspfeisrkp0vwfm">
         <w:r>
           <w:rPr>
             <w:color w:val="0563C1"/>
@@ -17464,7 +17464,7 @@
       <w:r>
         <w:t xml:space="preserve">Ohnuki-Tierney, Emiko. </w:t>
       </w:r>
-      <w:hyperlink w:history="1" r:id="rIdai1lt1mgm2mcgyuyksjre">
+      <w:hyperlink w:history="1" r:id="rIdywfwknsmmc86lknstkevk">
         <w:r>
           <w:rPr>
             <w:color w:val="0563C1"/>
@@ -17492,7 +17492,7 @@
       <w:r>
         <w:t xml:space="preserve">Dower, John W. </w:t>
       </w:r>
-      <w:hyperlink w:history="1" r:id="rIdsn76uuojlxqf6kvmvrklw">
+      <w:hyperlink w:history="1" r:id="rId76c8lr74y47kcuagaq91d">
         <w:r>
           <w:rPr>
             <w:color w:val="0563C1"/>
@@ -17540,7 +17540,7 @@
       <w:r>
         <w:t xml:space="preserve">Duggan, Christopher. </w:t>
       </w:r>
-      <w:hyperlink w:history="1" r:id="rIdd6skpiv8o8_efxpwh1-4m">
+      <w:hyperlink w:history="1" r:id="rIde8ea7oscg4-dlke8qvakv">
         <w:r>
           <w:rPr>
             <w:color w:val="0563C1"/>
@@ -17568,7 +17568,7 @@
       <w:r>
         <w:t xml:space="preserve">Bosworth, R. J. B. </w:t>
       </w:r>
-      <w:hyperlink w:history="1" r:id="rIdrzuyoc4p1eti11ww7hude">
+      <w:hyperlink w:history="1" r:id="rIdbunigncipbndtlent8rao">
         <w:r>
           <w:rPr>
             <w:color w:val="0563C1"/>
@@ -17596,7 +17596,7 @@
       <w:r>
         <w:t xml:space="preserve">Domenico, Roy Palmer. </w:t>
       </w:r>
-      <w:hyperlink w:history="1" r:id="rIdnlhf8vnti-iav9pricsoy">
+      <w:hyperlink w:history="1" r:id="rIdckulz4hchxt_09p7qh7dv">
         <w:r>
           <w:rPr>
             <w:color w:val="0563C1"/>
@@ -17644,7 +17644,7 @@
       <w:r>
         <w:t xml:space="preserve">Menocal, María Rosa. </w:t>
       </w:r>
-      <w:hyperlink w:history="1" r:id="rIdhuch5yxuku_gjwbpf_htw">
+      <w:hyperlink w:history="1" r:id="rIdowqh49itpf-vdcgei32ov">
         <w:r>
           <w:rPr>
             <w:color w:val="0563C1"/>
@@ -17672,7 +17672,7 @@
       <w:r>
         <w:t xml:space="preserve">Fernández-Morera, Darío. </w:t>
       </w:r>
-      <w:hyperlink w:history="1" r:id="rIdricp601bid5olpf8jwrn4">
+      <w:hyperlink w:history="1" r:id="rIdy4ks-jstd1jdokkcrsinr">
         <w:r>
           <w:rPr>
             <w:color w:val="0563C1"/>
@@ -17700,7 +17700,7 @@
       <w:r>
         <w:t xml:space="preserve">Kraemer, Joel L. </w:t>
       </w:r>
-      <w:hyperlink w:history="1" r:id="rIdszs8k7x9tdjtbqlionqor">
+      <w:hyperlink w:history="1" r:id="rIdhp_20k6b3gnpuyzph_r6w">
         <w:r>
           <w:rPr>
             <w:color w:val="0563C1"/>
@@ -17728,7 +17728,7 @@
       <w:r>
         <w:t xml:space="preserve">Preston, Paul. </w:t>
       </w:r>
-      <w:hyperlink w:history="1" r:id="rIdcrdtdai46aq-focgox3uy">
+      <w:hyperlink w:history="1" r:id="rId57d-6ed_izgstrkb3f-3a">
         <w:r>
           <w:rPr>
             <w:color w:val="0563C1"/>
@@ -17756,7 +17756,7 @@
       <w:r>
         <w:t xml:space="preserve">Aguilar, Paloma. </w:t>
       </w:r>
-      <w:hyperlink w:history="1" r:id="rId86bbtyeuo6xqutok8y8fs">
+      <w:hyperlink w:history="1" r:id="rIdwcjat-08rey87gxn9l3dv">
         <w:r>
           <w:rPr>
             <w:color w:val="0563C1"/>
@@ -17820,7 +17820,7 @@
       <w:r>
         <w:t xml:space="preserve">Applebaum, Anne. </w:t>
       </w:r>
-      <w:hyperlink w:history="1" r:id="rIdbe9vgpqokze-zgooyagh9">
+      <w:hyperlink w:history="1" r:id="rId3thnrxgn_p6sldsp1au1r">
         <w:r>
           <w:rPr>
             <w:color w:val="0563C1"/>
@@ -17848,7 +17848,7 @@
       <w:r>
         <w:t xml:space="preserve">Applebaum, Anne. </w:t>
       </w:r>
-      <w:hyperlink w:history="1" r:id="rIdulhkgjqwlibzv6_drpjp_">
+      <w:hyperlink w:history="1" r:id="rIdttoljuog5pepet7hb39ac">
         <w:r>
           <w:rPr>
             <w:color w:val="0563C1"/>
@@ -17876,7 +17876,7 @@
       <w:r>
         <w:t xml:space="preserve">Sanford, George. </w:t>
       </w:r>
-      <w:hyperlink w:history="1" r:id="rIdbbxb8t17iujbbyw8onfzu">
+      <w:hyperlink w:history="1" r:id="rIddtdsngulfw_zcmo_aknto">
         <w:r>
           <w:rPr>
             <w:color w:val="0563C1"/>
@@ -17904,7 +17904,7 @@
       <w:r>
         <w:t xml:space="preserve">Plokhy, Serhii. </w:t>
       </w:r>
-      <w:hyperlink w:history="1" r:id="rIdsraabfcy8izlwmu_vgklm">
+      <w:hyperlink w:history="1" r:id="rIdk4_en1_o5qfic34kwcrca">
         <w:r>
           <w:rPr>
             <w:color w:val="0563C1"/>
@@ -17932,7 +17932,7 @@
       <w:r>
         <w:t xml:space="preserve">Roberts, Geoffrey. </w:t>
       </w:r>
-      <w:hyperlink w:history="1" r:id="rIdjfsfvixioka77uk8nyim4">
+      <w:hyperlink w:history="1" r:id="rIdxvrbhzs4coewnpvcnj3ri">
         <w:r>
           <w:rPr>
             <w:color w:val="0563C1"/>
@@ -17980,7 +17980,7 @@
       <w:r>
         <w:t xml:space="preserve">Dikötter, Frank. </w:t>
       </w:r>
-      <w:hyperlink w:history="1" r:id="rId_ixwqpgfwdlbx-c3udiyh">
+      <w:hyperlink w:history="1" r:id="rIdnvzfw9pawrb7hsqh-sxe7">
         <w:r>
           <w:rPr>
             <w:color w:val="0563C1"/>
@@ -18008,7 +18008,7 @@
       <w:r>
         <w:t xml:space="preserve">Yang Jisheng. </w:t>
       </w:r>
-      <w:hyperlink w:history="1" r:id="rId2gi9wlh_cnqelvfaklfs0">
+      <w:hyperlink w:history="1" r:id="rIdep5t8iww1oblaulyksc2c">
         <w:r>
           <w:rPr>
             <w:color w:val="0563C1"/>
@@ -18036,7 +18036,7 @@
       <w:r>
         <w:t xml:space="preserve">MacFarquhar, Roderick, and Michael Schoenhals. </w:t>
       </w:r>
-      <w:hyperlink w:history="1" r:id="rIdzonsvuohzg1c5v97ihdyp">
+      <w:hyperlink w:history="1" r:id="rIdljmrbsavph7ywhtmfpu6r">
         <w:r>
           <w:rPr>
             <w:color w:val="0563C1"/>
@@ -18064,7 +18064,7 @@
       <w:r>
         <w:t xml:space="preserve">Jambeck, Jenna R., et al. “</w:t>
       </w:r>
-      <w:hyperlink w:history="1" r:id="rIdtjfymeerjorqd2eoquwx0">
+      <w:hyperlink w:history="1" r:id="rIdgbtpgfn5fny2gnj_jj7do">
         <w:r>
           <w:rPr>
             <w:color w:val="0563C1"/>
@@ -18092,7 +18092,7 @@
       <w:r>
         <w:t xml:space="preserve">Meijer, Lourens J. J., et al. “</w:t>
       </w:r>
-      <w:hyperlink w:history="1" r:id="rId9bypwdbbo0okua3awqosj">
+      <w:hyperlink w:history="1" r:id="rIdfsygahtl5eyr5apbx2t3q">
         <w:r>
           <w:rPr>
             <w:color w:val="0563C1"/>
@@ -18120,7 +18120,7 @@
       <w:r>
         <w:t xml:space="preserve">Economy, Elizabeth C. </w:t>
       </w:r>
-      <w:hyperlink w:history="1" r:id="rIdzkyd2q705ttqh_7wenee8">
+      <w:hyperlink w:history="1" r:id="rId7trfjehgaivew7-dcqgqy">
         <w:r>
           <w:rPr>
             <w:color w:val="0563C1"/>
@@ -18180,7 +18180,7 @@
       <w:r>
         <w:t xml:space="preserve">McDonell, Stephen. “</w:t>
       </w:r>
-      <w:hyperlink w:history="1" r:id="rIdsas4smmzofk2lxracrau0">
+      <w:hyperlink w:history="1" r:id="rIdloxtse9n0ixgmu69v_diw">
         <w:r>
           <w:rPr>
             <w:color w:val="0563C1"/>
@@ -18208,7 +18208,7 @@
       <w:r>
         <w:t xml:space="preserve">Agence France-Presse. “‘Oh, Bother’: </w:t>
       </w:r>
-      <w:hyperlink w:history="1" r:id="rIdfa7ajfue5imw8ha1mdp-4">
+      <w:hyperlink w:history="1" r:id="rIdkwpvsnskgxj0cktdp3yy3">
         <w:r>
           <w:rPr>
             <w:color w:val="0563C1"/>
@@ -18256,7 +18256,7 @@
       <w:r>
         <w:t xml:space="preserve">Schama, Simon. </w:t>
       </w:r>
-      <w:hyperlink w:history="1" r:id="rId1wof9dd69r8ojdc2eqsyu">
+      <w:hyperlink w:history="1" r:id="rIdmwa_dnqny9tcvgcmimz6c">
         <w:r>
           <w:rPr>
             <w:color w:val="0563C1"/>
@@ -18284,7 +18284,7 @@
       <w:r>
         <w:t xml:space="preserve">Finkelstein, Israel, and Neil Asher Silberman. </w:t>
       </w:r>
-      <w:hyperlink w:history="1" r:id="rIdxeenvxfsm5rxio_4wnzsp">
+      <w:hyperlink w:history="1" r:id="rIdrgtjuo3p4kmw7qeyv8zbz">
         <w:r>
           <w:rPr>
             <w:color w:val="0563C1"/>
@@ -18312,7 +18312,7 @@
       <w:r>
         <w:t xml:space="preserve">VanderKam, James C. </w:t>
       </w:r>
-      <w:hyperlink w:history="1" r:id="rIdgmyhzgy1nho96sso_dq11">
+      <w:hyperlink w:history="1" r:id="rIdnbuytadlrmandy-uoenry">
         <w:r>
           <w:rPr>
             <w:color w:val="0563C1"/>
@@ -18340,7 +18340,7 @@
       <w:r>
         <w:t xml:space="preserve">Magness, Jodi. </w:t>
       </w:r>
-      <w:hyperlink w:history="1" r:id="rIdipjrba1hwuoawlm6sd_t_">
+      <w:hyperlink w:history="1" r:id="rIdlh148ggo2gmbiyhztceum">
         <w:r>
           <w:rPr>
             <w:color w:val="0563C1"/>
@@ -18368,7 +18368,7 @@
       <w:r>
         <w:t xml:space="preserve">Morris, Benny. </w:t>
       </w:r>
-      <w:hyperlink w:history="1" r:id="rId-ic8mjkwplfk88mjgxo7r">
+      <w:hyperlink w:history="1" r:id="rId01wesiqcmuil7ophsdshp">
         <w:r>
           <w:rPr>
             <w:color w:val="0563C1"/>
@@ -18416,7 +18416,7 @@
       <w:r>
         <w:t xml:space="preserve">Gaddis, John Lewis. </w:t>
       </w:r>
-      <w:hyperlink w:history="1" r:id="rId0bbb7es-outwxsgnfgf3o">
+      <w:hyperlink w:history="1" r:id="rIdubqe1do6lyhulxz9qp92_">
         <w:r>
           <w:rPr>
             <w:color w:val="0563C1"/>
@@ -18444,7 +18444,7 @@
       <w:r>
         <w:t xml:space="preserve">Savranskaya, Svetlana V. “</w:t>
       </w:r>
-      <w:hyperlink w:history="1" r:id="rIdjvqsdgx-kye7r-irlysqn">
+      <w:hyperlink w:history="1" r:id="rId2cr3y7wb2omrind0kwgy3">
         <w:r>
           <w:rPr>
             <w:color w:val="0563C1"/>
@@ -18472,7 +18472,7 @@
       <w:r>
         <w:t xml:space="preserve">Hoffman, David E. </w:t>
       </w:r>
-      <w:hyperlink w:history="1" r:id="rIdhhbunnzteygjztn0htmmq">
+      <w:hyperlink w:history="1" r:id="rIdaqeq7ngsa4vipbnwamv0z">
         <w:r>
           <w:rPr>
             <w:color w:val="0563C1"/>
@@ -18500,7 +18500,7 @@
       <w:r>
         <w:t xml:space="preserve">Rhodes, Richard. </w:t>
       </w:r>
-      <w:hyperlink w:history="1" r:id="rIdbi0slpsnqvwln0bzibdf9">
+      <w:hyperlink w:history="1" r:id="rId48qjjlxg9nlocveatxdbr">
         <w:r>
           <w:rPr>
             <w:color w:val="0563C1"/>
@@ -18528,7 +18528,7 @@
       <w:r>
         <w:t xml:space="preserve">Niedenthal, Jack. </w:t>
       </w:r>
-      <w:hyperlink w:history="1" r:id="rIdi0axs5euffz1zqmtgxzxi">
+      <w:hyperlink w:history="1" r:id="rIddn30nyi3yitejhuit9gn0">
         <w:r>
           <w:rPr>
             <w:color w:val="0563C1"/>
@@ -18576,7 +18576,7 @@
       <w:r>
         <w:t xml:space="preserve">NASA. “</w:t>
       </w:r>
-      <w:hyperlink w:history="1" r:id="rIdlznjc0smyhxbjmxdqxvhm">
+      <w:hyperlink w:history="1" r:id="rIdkmidpn-rsgjs2qbd81exz">
         <w:r>
           <w:rPr>
             <w:color w:val="0563C1"/>
@@ -18604,7 +18604,7 @@
       <w:r>
         <w:t xml:space="preserve">Chaikin, Andrew. </w:t>
       </w:r>
-      <w:hyperlink w:history="1" r:id="rId8rv3om8mmy9fgils5ywxc">
+      <w:hyperlink w:history="1" r:id="rId7hcovhhhpuyyk5zqmbh7g">
         <w:r>
           <w:rPr>
             <w:color w:val="0563C1"/>
@@ -18632,7 +18632,7 @@
       <w:r>
         <w:t xml:space="preserve">Siddiqi, Asif A. </w:t>
       </w:r>
-      <w:hyperlink w:history="1" r:id="rIdwq1xn4i51vo29w9dkvzp8">
+      <w:hyperlink w:history="1" r:id="rIdkgxsciygiogprhz6ih9cd">
         <w:r>
           <w:rPr>
             <w:color w:val="0563C1"/>
@@ -18660,7 +18660,7 @@
       <w:r>
         <w:t xml:space="preserve">Colaprete, Anthony, et al. “</w:t>
       </w:r>
-      <w:hyperlink w:history="1" r:id="rIdgvhqfiaygggagy72-5l6u">
+      <w:hyperlink w:history="1" r:id="rIdj7hahkwhxgn8qe_myohvb">
         <w:r>
           <w:rPr>
             <w:color w:val="0563C1"/>
@@ -18688,7 +18688,7 @@
       <w:r>
         <w:t xml:space="preserve">Sheehan, William. </w:t>
       </w:r>
-      <w:hyperlink w:history="1" r:id="rIdg6fdulcoabjz3422htd2o">
+      <w:hyperlink w:history="1" r:id="rIdnogf7k9z1t92r2pcfbqiz">
         <w:r>
           <w:rPr>
             <w:color w:val="0563C1"/>
@@ -18716,7 +18716,7 @@
       <w:r>
         <w:t xml:space="preserve">Grotzinger, John P., et al. “</w:t>
       </w:r>
-      <w:hyperlink w:history="1" r:id="rIdijquiknowwn5d0gaqdwox">
+      <w:hyperlink w:history="1" r:id="rIdzmfc4xvd2fslofg2g7tfl">
         <w:r>
           <w:rPr>
             <w:color w:val="0563C1"/>
@@ -18744,7 +18744,7 @@
       <w:r>
         <w:t xml:space="preserve">Mangold, Nicolas, et al. “</w:t>
       </w:r>
-      <w:hyperlink w:history="1" r:id="rIdv-epplyjarv0xemnzr3cg">
+      <w:hyperlink w:history="1" r:id="rIda5ooghfbexq2hur38eub2">
         <w:r>
           <w:rPr>
             <w:color w:val="0563C1"/>
@@ -18792,7 +18792,7 @@
       <w:r>
         <w:t xml:space="preserve">Ashby, Neil. “</w:t>
       </w:r>
-      <w:hyperlink w:history="1" r:id="rIdagbpph7ofx6a9z5jxdzoy">
+      <w:hyperlink w:history="1" r:id="rIdmg9fbukkfk9lhxp7st2qi">
         <w:r>
           <w:rPr>
             <w:color w:val="0563C1"/>
@@ -18820,7 +18820,7 @@
       <w:r>
         <w:t xml:space="preserve">Dyson, F. W., A. S. Eddington, and C. Davidson. “</w:t>
       </w:r>
-      <w:hyperlink w:history="1" r:id="rId1wkypdsgxorffsmghqzz-">
+      <w:hyperlink w:history="1" r:id="rIdwvibc8lrlihrqvrutc7kf">
         <w:r>
           <w:rPr>
             <w:color w:val="0563C1"/>
@@ -18848,7 +18848,7 @@
       <w:r>
         <w:t xml:space="preserve">Au, Whitlow W. L. </w:t>
       </w:r>
-      <w:hyperlink w:history="1" r:id="rIdedgohmlnp2jftdcrtnqq8">
+      <w:hyperlink w:history="1" r:id="rIdrmpbyvagsbhigiid7_ghs">
         <w:r>
           <w:rPr>
             <w:color w:val="0563C1"/>
@@ -18876,7 +18876,7 @@
       <w:r>
         <w:t xml:space="preserve">Susskind, Leonard. “</w:t>
       </w:r>
-      <w:hyperlink w:history="1" r:id="rIdfkchxahqfav_3nsjabsyr">
+      <w:hyperlink w:history="1" r:id="rId8lmdh7ncjp5ed7al1zzh7">
         <w:r>
           <w:rPr>
             <w:color w:val="0563C1"/>
@@ -18904,7 +18904,7 @@
       <w:r>
         <w:t xml:space="preserve">Scerri, Eric R. </w:t>
       </w:r>
-      <w:hyperlink w:history="1" r:id="rId6s309ig6a62ee9hliflay">
+      <w:hyperlink w:history="1" r:id="rIduda36cqviqtkro8epagdi">
         <w:r>
           <w:rPr>
             <w:color w:val="0563C1"/>
@@ -18932,7 +18932,7 @@
       <w:r>
         <w:t xml:space="preserve">Erisman, Jan Willem, et al. “</w:t>
       </w:r>
-      <w:hyperlink w:history="1" r:id="rIdhhjineuw3i6mjzgvnthww">
+      <w:hyperlink w:history="1" r:id="rIdsghktuejc_yb0pl136k_p">
         <w:r>
           <w:rPr>
             <w:color w:val="0563C1"/>
@@ -18960,7 +18960,7 @@
       <w:r>
         <w:t xml:space="preserve">Watson, J. D., and F. H. C. Crick. “</w:t>
       </w:r>
-      <w:hyperlink w:history="1" r:id="rIdy40vjwagnmf30o1k4a8a_">
+      <w:hyperlink w:history="1" r:id="rId-pgtodobuornd-dv2ugux">
         <w:r>
           <w:rPr>
             <w:color w:val="0563C1"/>
@@ -18988,7 +18988,7 @@
       <w:r>
         <w:t xml:space="preserve">Franklin, Rosalind E., and R. G. Gosling. “</w:t>
       </w:r>
-      <w:hyperlink w:history="1" r:id="rIdjsjtvh1jisruygyhzq94s">
+      <w:hyperlink w:history="1" r:id="rId0gxauz3ovxeg3vl8oubbr">
         <w:r>
           <w:rPr>
             <w:color w:val="0563C1"/>
@@ -19016,7 +19016,7 @@
       <w:r>
         <w:t xml:space="preserve">International Human Genome Sequencing Consortium. “</w:t>
       </w:r>
-      <w:hyperlink w:history="1" r:id="rIdn7fhocvgp0ugqa7buy3ba">
+      <w:hyperlink w:history="1" r:id="rIduitwmygg6rnwmiorxg5vg">
         <w:r>
           <w:rPr>
             <w:color w:val="0563C1"/>
@@ -19044,7 +19044,7 @@
       <w:r>
         <w:t xml:space="preserve">International Human Genome Sequencing Consortium. “</w:t>
       </w:r>
-      <w:hyperlink w:history="1" r:id="rId7tynvctbbrer6gvtveee8">
+      <w:hyperlink w:history="1" r:id="rIdngcxupcqqavqxynmaojac">
         <w:r>
           <w:rPr>
             <w:color w:val="0563C1"/>
@@ -19072,7 +19072,7 @@
       <w:r>
         <w:t xml:space="preserve">Nurk, Sergey, et al. “</w:t>
       </w:r>
-      <w:hyperlink w:history="1" r:id="rIdb8krb4ioyck2ylh57otp_">
+      <w:hyperlink w:history="1" r:id="rIdjghjjx4wvxrhebjziolfi">
         <w:r>
           <w:rPr>
             <w:color w:val="0563C1"/>
@@ -19100,7 +19100,7 @@
       <w:r>
         <w:t xml:space="preserve">Vine, F. J., and D. H. Matthews. “</w:t>
       </w:r>
-      <w:hyperlink w:history="1" r:id="rIdejkoj6negvlqmbnkdoisj">
+      <w:hyperlink w:history="1" r:id="rIdtn3dv2uzoykn2x7ockfit">
         <w:r>
           <w:rPr>
             <w:color w:val="0563C1"/>
@@ -19128,7 +19128,7 @@
       <w:r>
         <w:t xml:space="preserve">Alpher, Ralph A., and Robert Herman. “</w:t>
       </w:r>
-      <w:hyperlink w:history="1" r:id="rIdxjlm31otrq-lu7o3f4o_9">
+      <w:hyperlink w:history="1" r:id="rIdwmhzzi1ilthcfishrjdog">
         <w:r>
           <w:rPr>
             <w:color w:val="0563C1"/>
@@ -19156,7 +19156,7 @@
       <w:r>
         <w:t xml:space="preserve">Penzias, A. A., and R. W. Wilson. “</w:t>
       </w:r>
-      <w:hyperlink w:history="1" r:id="rIdjzmnxaxjzjnylxoz-7ar_">
+      <w:hyperlink w:history="1" r:id="rIden0es8vjfx2eepctoayos">
         <w:r>
           <w:rPr>
             <w:color w:val="0563C1"/>
@@ -19184,7 +19184,7 @@
       <w:r>
         <w:t xml:space="preserve">Fleischmann, Martin, and Stanley Pons. “</w:t>
       </w:r>
-      <w:hyperlink w:history="1" r:id="rIdeewwhibagwoa9q04fkvky">
+      <w:hyperlink w:history="1" r:id="rIdayjdnaye-fsgqzkasa_wx">
         <w:r>
           <w:rPr>
             <w:color w:val="0563C1"/>
@@ -19212,7 +19212,7 @@
       <w:r>
         <w:t xml:space="preserve">Wolfe-Simon, Felisa, et al. “</w:t>
       </w:r>
-      <w:hyperlink w:history="1" r:id="rIdyuyookpxn8tqbn4fcpjye">
+      <w:hyperlink w:history="1" r:id="rIdguzscqj-ijspecjbyaitm">
         <w:r>
           <w:rPr>
             <w:color w:val="0563C1"/>
@@ -19240,7 +19240,7 @@
       <w:r>
         <w:t xml:space="preserve">Reaves, Marshall Louis, et al. “</w:t>
       </w:r>
-      <w:hyperlink w:history="1" r:id="rIda-v54mggpq5cnhsoko_qp">
+      <w:hyperlink w:history="1" r:id="rIdaistsdiwbokyqdd31oyza">
         <w:r>
           <w:rPr>
             <w:color w:val="0563C1"/>
@@ -19288,7 +19288,7 @@
       <w:r>
         <w:t xml:space="preserve">Dalrymple, William. </w:t>
       </w:r>
-      <w:hyperlink w:history="1" r:id="rIdyanzewnrte6fqaysres67">
+      <w:hyperlink w:history="1" r:id="rId3eswifc_mrlxjc1dapdkd">
         <w:r>
           <w:rPr>
             <w:color w:val="0563C1"/>
@@ -19316,7 +19316,7 @@
       <w:r>
         <w:t xml:space="preserve">Maddison, Angus. </w:t>
       </w:r>
-      <w:hyperlink w:history="1" r:id="rIdocps6ewg0qq3ot2rhtzj9">
+      <w:hyperlink w:history="1" r:id="rIdmst4dkhrfmh_hxhzaeukp">
         <w:r>
           <w:rPr>
             <w:color w:val="0563C1"/>
@@ -19344,7 +19344,7 @@
       <w:r>
         <w:t xml:space="preserve">Sen, Amartya. </w:t>
       </w:r>
-      <w:hyperlink w:history="1" r:id="rId3noex-h5n5v008y72tyog">
+      <w:hyperlink w:history="1" r:id="rIdgnpc_etzbaieh-ecvhab3">
         <w:r>
           <w:rPr>
             <w:color w:val="0563C1"/>
@@ -19372,7 +19372,7 @@
       <w:r>
         <w:t xml:space="preserve">Khan, Yasmin. </w:t>
       </w:r>
-      <w:hyperlink w:history="1" r:id="rId7x3run1qhbgqgcqnb9zfd">
+      <w:hyperlink w:history="1" r:id="rIdc6ijvju18cgsb9p01fikl">
         <w:r>
           <w:rPr>
             <w:color w:val="0563C1"/>
@@ -19400,7 +19400,7 @@
       <w:r>
         <w:t xml:space="preserve">Elkins, Caroline. </w:t>
       </w:r>
-      <w:hyperlink w:history="1" r:id="rIdbgeeajyq5hbkgxbzxaylx">
+      <w:hyperlink w:history="1" r:id="rIdity-aevr5cmkqlktnmlxj">
         <w:r>
           <w:rPr>
             <w:color w:val="0563C1"/>
@@ -19428,7 +19428,7 @@
       <w:r>
         <w:t xml:space="preserve">Jansen, Jan C., and Jürgen Osterhammel. </w:t>
       </w:r>
-      <w:hyperlink w:history="1" r:id="rIdv4lvadqargskx5rdvfxg4">
+      <w:hyperlink w:history="1" r:id="rIdxcjexpo6tq3ah8hua_n-w">
         <w:r>
           <w:rPr>
             <w:color w:val="0563C1"/>
@@ -19456,7 +19456,7 @@
       <w:r>
         <w:t xml:space="preserve">Des Forges, Alison. </w:t>
       </w:r>
-      <w:hyperlink w:history="1" r:id="rIdxovfdoggbddgdzarzsjb0">
+      <w:hyperlink w:history="1" r:id="rIdeqchileorjjfls3rlqirc">
         <w:r>
           <w:rPr>
             <w:color w:val="0563C1"/>
@@ -19484,7 +19484,7 @@
       <w:r>
         <w:t xml:space="preserve">Newbury, Catharine. </w:t>
       </w:r>
-      <w:hyperlink w:history="1" r:id="rIdanzxex965cigsa9iexsdt">
+      <w:hyperlink w:history="1" r:id="rIdbtpzp4jmolkfbxkgcuq8t">
         <w:r>
           <w:rPr>
             <w:color w:val="0563C1"/>
@@ -19532,7 +19532,7 @@
       <w:r>
         <w:t xml:space="preserve">Branch, Taylor. </w:t>
       </w:r>
-      <w:hyperlink w:history="1" r:id="rIdxztwqosero4gcufam38pj">
+      <w:hyperlink w:history="1" r:id="rIdjshjj9dytjwfh8cvhucox">
         <w:r>
           <w:rPr>
             <w:color w:val="0563C1"/>
@@ -19560,7 +19560,7 @@
       <w:r>
         <w:t xml:space="preserve">Hoose, Phillip. </w:t>
       </w:r>
-      <w:hyperlink w:history="1" r:id="rIdjciz1bhyah1-q0r96l_gw">
+      <w:hyperlink w:history="1" r:id="rId35b1lekfh6kpokklopua7">
         <w:r>
           <w:rPr>
             <w:color w:val="0563C1"/>
@@ -19588,7 +19588,7 @@
       <w:r>
         <w:t xml:space="preserve">Tyson, Timothy B. </w:t>
       </w:r>
-      <w:hyperlink w:history="1" r:id="rIdcbgeo_byysholsessk91h">
+      <w:hyperlink w:history="1" r:id="rIdqolew4gcorir1corek3xr">
         <w:r>
           <w:rPr>
             <w:color w:val="0563C1"/>
@@ -19616,7 +19616,7 @@
       <w:r>
         <w:t xml:space="preserve">Mandela, Nelson. </w:t>
       </w:r>
-      <w:hyperlink w:history="1" r:id="rIdwbwgc_mgzmqvnskzw0u1m">
+      <w:hyperlink w:history="1" r:id="rIdslmdlw60mqe9ephkmutps">
         <w:r>
           <w:rPr>
             <w:color w:val="0563C1"/>
@@ -19644,7 +19644,7 @@
       <w:r>
         <w:t xml:space="preserve">Carter, David. </w:t>
       </w:r>
-      <w:hyperlink w:history="1" r:id="rIdgy8crwhjaasgrjxo-hroq">
+      <w:hyperlink w:history="1" r:id="rIdvmjgwjop6gneq5r4uklze">
         <w:r>
           <w:rPr>
             <w:color w:val="0563C1"/>
@@ -19692,7 +19692,7 @@
       <w:r>
         <w:t xml:space="preserve">Turing, A. M. “</w:t>
       </w:r>
-      <w:hyperlink w:history="1" r:id="rIdat80l6atfzh7wm8xydb6s">
+      <w:hyperlink w:history="1" r:id="rId2zbaafmmr_v0-md7ehv8x">
         <w:r>
           <w:rPr>
             <w:color w:val="0563C1"/>
@@ -19720,7 +19720,7 @@
       <w:r>
         <w:t xml:space="preserve">Copeland, B. Jack, ed. </w:t>
       </w:r>
-      <w:hyperlink w:history="1" r:id="rIdu2xs09uemokixkffwr2w1">
+      <w:hyperlink w:history="1" r:id="rIdsqxnj0ov1snstxa9nivsp">
         <w:r>
           <w:rPr>
             <w:color w:val="0563C1"/>
@@ -19748,7 +19748,7 @@
       <w:r>
         <w:t xml:space="preserve">Isaacson, Walter. </w:t>
       </w:r>
-      <w:hyperlink w:history="1" r:id="rIdbyw1j7gsuoulpc02xdkdb">
+      <w:hyperlink w:history="1" r:id="rId8mlxxfqhhupey7kwuczpn">
         <w:r>
           <w:rPr>
             <w:color w:val="0563C1"/>
@@ -19776,7 +19776,7 @@
       <w:r>
         <w:t xml:space="preserve">Vosoughi, Soroush, Deb Roy, and Sinan Aral. “</w:t>
       </w:r>
-      <w:hyperlink w:history="1" r:id="rId6mx-_zawo5pp5odixzfmu">
+      <w:hyperlink w:history="1" r:id="rIdlhv16za6dq2uqk5zi3l47">
         <w:r>
           <w:rPr>
             <w:color w:val="0563C1"/>
@@ -19824,7 +19824,7 @@
       <w:r>
         <w:t xml:space="preserve">Stuart, David. </w:t>
       </w:r>
-      <w:hyperlink w:history="1" r:id="rId14vs9bt3zgk-9z1st8zpk">
+      <w:hyperlink w:history="1" r:id="rIdlqjk7yz8ddtx2bkgdaplf">
         <w:r>
           <w:rPr>
             <w:color w:val="0563C1"/>
@@ -19852,7 +19852,7 @@
       <w:r>
         <w:t xml:space="preserve">Aveni, Anthony. </w:t>
       </w:r>
-      <w:hyperlink w:history="1" r:id="rIdynxfhnxebpagvkcbkx3qa">
+      <w:hyperlink w:history="1" r:id="rIdp_ub84xx-yibxvduliv-e">
         <w:r>
           <w:rPr>
             <w:color w:val="0563C1"/>
@@ -19900,7 +19900,7 @@
       <w:r>
         <w:t xml:space="preserve">Meech, Karen J., et al. “</w:t>
       </w:r>
-      <w:hyperlink w:history="1" r:id="rIdtjumxm3klnhh9_ojthsp3">
+      <w:hyperlink w:history="1" r:id="rIdat4rzzacvumwf4u0pvkvf">
         <w:r>
           <w:rPr>
             <w:color w:val="0563C1"/>
@@ -19928,7 +19928,7 @@
       <w:r>
         <w:t xml:space="preserve">Micheli, Marco, et al. “</w:t>
       </w:r>
-      <w:hyperlink w:history="1" r:id="rId5_9ve6bxk_tupb-d5uoyo">
+      <w:hyperlink w:history="1" r:id="rIdbeld8qqacdcxajjib3keo">
         <w:r>
           <w:rPr>
             <w:color w:val="0563C1"/>
@@ -19956,7 +19956,7 @@
       <w:r>
         <w:t xml:space="preserve">‘Oumuamua ISSI Team. “</w:t>
       </w:r>
-      <w:hyperlink w:history="1" r:id="rIdbvqwh-tes7pgoezymga8b">
+      <w:hyperlink w:history="1" r:id="rIdzgbwopoedztroyc8ymzgb">
         <w:r>
           <w:rPr>
             <w:color w:val="0563C1"/>
@@ -19984,7 +19984,7 @@
       <w:r>
         <w:t xml:space="preserve">Staff at the National Astronomy and Ionosphere Center. “</w:t>
       </w:r>
-      <w:hyperlink w:history="1" r:id="rId1jx65fv-5bmphdmzasgwf">
+      <w:hyperlink w:history="1" r:id="rIdk_xvjpyglrqjufxfd0yi8">
         <w:r>
           <w:rPr>
             <w:color w:val="0563C1"/>
@@ -20048,7 +20048,7 @@
       <w:r>
         <w:t xml:space="preserve">Riley, James C. “</w:t>
       </w:r>
-      <w:hyperlink w:history="1" r:id="rIdiu30f3si-slxmbcdlyvf2">
+      <w:hyperlink w:history="1" r:id="rIdts_tkvpfig8bkvz09dv3o">
         <w:r>
           <w:rPr>
             <w:color w:val="0563C1"/>
@@ -20076,7 +20076,7 @@
       <w:r>
         <w:t xml:space="preserve">Bliss, Michael. </w:t>
       </w:r>
-      <w:hyperlink w:history="1" r:id="rIdrmz9zlaxgq1gocecj01rx">
+      <w:hyperlink w:history="1" r:id="rIdgb-_v-ackd6gg1mekb-iz">
         <w:r>
           <w:rPr>
             <w:color w:val="0563C1"/>
@@ -20104,7 +20104,7 @@
       <w:r>
         <w:t xml:space="preserve">Reverby, Susan M. </w:t>
       </w:r>
-      <w:hyperlink w:history="1" r:id="rIdqm8nhmwwc6gz_9axv8xqm">
+      <w:hyperlink w:history="1" r:id="rIdkbcjxdsj6szt8vjtzmiir">
         <w:r>
           <w:rPr>
             <w:color w:val="0563C1"/>
@@ -20132,7 +20132,7 @@
       <w:r>
         <w:t xml:space="preserve">Keefe, Patrick Radden. </w:t>
       </w:r>
-      <w:hyperlink w:history="1" r:id="rIdosu4p0k-zpl7xnmqd6zlf">
+      <w:hyperlink w:history="1" r:id="rIdaouqmz9dybotq-92q0y2x">
         <w:r>
           <w:rPr>
             <w:color w:val="0563C1"/>
@@ -20160,7 +20160,7 @@
       <w:r>
         <w:t xml:space="preserve">Antimicrobial Resistance Collaborators. “</w:t>
       </w:r>
-      <w:hyperlink w:history="1" r:id="rIdxzm-g9l1oz9qy_hnhz5w2">
+      <w:hyperlink w:history="1" r:id="rId7lqrf8hsvun3q12c7945n">
         <w:r>
           <w:rPr>
             <w:color w:val="0563C1"/>
@@ -20188,7 +20188,7 @@
       <w:r>
         <w:t xml:space="preserve">Van Bressem, Marie-Françoise, et al. “</w:t>
       </w:r>
-      <w:hyperlink w:history="1" r:id="rIdtb-a0es21baafmax88e0j">
+      <w:hyperlink w:history="1" r:id="rIdweabythhlbcrtolhaq7kq">
         <w:r>
           <w:rPr>
             <w:color w:val="0563C1"/>
@@ -20216,7 +20216,7 @@
       <w:r>
         <w:t xml:space="preserve">Oshinsky, David M. </w:t>
       </w:r>
-      <w:hyperlink w:history="1" r:id="rIdvejagossoggpmfjxqzx1t">
+      <w:hyperlink w:history="1" r:id="rIdnfl_6kkbxpsjo92rmf0wg">
         <w:r>
           <w:rPr>
             <w:color w:val="0563C1"/>
@@ -20244,7 +20244,7 @@
       <w:r>
         <w:t xml:space="preserve">Polack, Fernando P., et al. “</w:t>
       </w:r>
-      <w:hyperlink w:history="1" r:id="rId_g8ud3d8ezn6bcazx-umc">
+      <w:hyperlink w:history="1" r:id="rId2nrsf79yqgficvxh85uke">
         <w:r>
           <w:rPr>
             <w:color w:val="0563C1"/>
@@ -20292,7 +20292,7 @@
       <w:r>
         <w:t xml:space="preserve">Arrhenius, Svante. “</w:t>
       </w:r>
-      <w:hyperlink w:history="1" r:id="rId1-2o6yokf8rfssdg_2ny2">
+      <w:hyperlink w:history="1" r:id="rIdo84wszfyzyvezct-s8nbd">
         <w:r>
           <w:rPr>
             <w:color w:val="0563C1"/>
@@ -20320,7 +20320,7 @@
       <w:r>
         <w:t xml:space="preserve">Philip, Sjoukje Y., et al. “</w:t>
       </w:r>
-      <w:hyperlink w:history="1" r:id="rIdvord0eyk8tbo3be_aw1qb">
+      <w:hyperlink w:history="1" r:id="rIdvhswltd8tfxeudabzurzh">
         <w:r>
           <w:rPr>
             <w:color w:val="0563C1"/>
@@ -20348,7 +20348,7 @@
       <w:r>
         <w:t xml:space="preserve">Supran, G., S. Rahmstorf, and N. Oreskes. “</w:t>
       </w:r>
-      <w:hyperlink w:history="1" r:id="rIdmxj1hq3l-ya-4rs00ipov">
+      <w:hyperlink w:history="1" r:id="rIdwfdt2izl5gxx8bezq5ap0">
         <w:r>
           <w:rPr>
             <w:color w:val="0563C1"/>
@@ -20376,7 +20376,7 @@
       <w:r>
         <w:t xml:space="preserve">Witze, Alexandra. “</w:t>
       </w:r>
-      <w:hyperlink w:history="1" r:id="rId-sszvbukqrltlre6qss_p">
+      <w:hyperlink w:history="1" r:id="rIdtkqqn-4svqhelxcdrimtk">
         <w:r>
           <w:rPr>
             <w:color w:val="0563C1"/>
@@ -20404,7 +20404,7 @@
       <w:r>
         <w:t xml:space="preserve">IPCC. </w:t>
       </w:r>
-      <w:hyperlink w:history="1" r:id="rId0n1rhs4yodmneo6umgzjv">
+      <w:hyperlink w:history="1" r:id="rIdqpum8ekr9bby0q0iymyyd">
         <w:r>
           <w:rPr>
             <w:color w:val="0563C1"/>
@@ -20432,7 +20432,7 @@
       <w:r>
         <w:t xml:space="preserve">Morlighem, Mathieu, et al. “</w:t>
       </w:r>
-      <w:hyperlink w:history="1" r:id="rId-q7q8jubhbygh4cqyuxsi">
+      <w:hyperlink w:history="1" r:id="rIdgyqkqtyympzh7fru1eyno">
         <w:r>
           <w:rPr>
             <w:color w:val="0563C1"/>
@@ -20460,7 +20460,7 @@
       <w:r>
         <w:t xml:space="preserve">IMBIE Team. “</w:t>
       </w:r>
-      <w:hyperlink w:history="1" r:id="rIdoswlizrizxomo3pudxoi-">
+      <w:hyperlink w:history="1" r:id="rIdsnyyubrewwdn-ctldemiy">
         <w:r>
           <w:rPr>
             <w:color w:val="0563C1"/>
@@ -20488,7 +20488,7 @@
       <w:r>
         <w:t xml:space="preserve">Joughin, Ian, Benjamin E. Smith, and Brooke Medley. “</w:t>
       </w:r>
-      <w:hyperlink w:history="1" r:id="rId3hw1muq7sqbla3eq3ga13">
+      <w:hyperlink w:history="1" r:id="rIdhb1dt-dtpr95uth_zc6tr">
         <w:r>
           <w:rPr>
             <w:color w:val="0563C1"/>
@@ -20516,7 +20516,7 @@
       <w:r>
         <w:t xml:space="preserve">Secretariat of the Antarctic Treaty. “</w:t>
       </w:r>
-      <w:hyperlink w:history="1" r:id="rIdnymblz7b-uywrcccqz_hd">
+      <w:hyperlink w:history="1" r:id="rIdpa6z0ndwxbgztpgh_8s1k">
         <w:r>
           <w:rPr>
             <w:color w:val="0563C1"/>
@@ -20544,7 +20544,7 @@
       <w:r>
         <w:t xml:space="preserve">Office of the Historian, US Department of State. </w:t>
       </w:r>
-      <w:hyperlink w:history="1" r:id="rId781ug_sfknxvg1x5f4eqq">
+      <w:hyperlink w:history="1" r:id="rIdk0nc4b6iuttddqmceu_d-">
         <w:r>
           <w:rPr>
             <w:color w:val="0563C1"/>
@@ -20572,7 +20572,7 @@
       <w:r>
         <w:t xml:space="preserve">“‘Greenland Belongs to Greenland’: </w:t>
       </w:r>
-      <w:hyperlink w:history="1" r:id="rIdlbw4re9dfy_x9qbjbemgz">
+      <w:hyperlink w:history="1" r:id="rIdiemh1ipwlf1hzq56lt1rs">
         <w:r>
           <w:rPr>
             <w:color w:val="0563C1"/>
@@ -20600,7 +20600,7 @@
       <w:r>
         <w:t xml:space="preserve">BBC News. Report on </w:t>
       </w:r>
-      <w:hyperlink w:history="1" r:id="rIdeoqllvcrjdwkqxrc8vbgn">
+      <w:hyperlink w:history="1" r:id="rIdzkqyewnqgnppulml5bbpg">
         <w:r>
           <w:rPr>
             <w:color w:val="0563C1"/>
@@ -20628,7 +20628,7 @@
       <w:r>
         <w:t xml:space="preserve">BBC News. </w:t>
       </w:r>
-      <w:hyperlink w:history="1" r:id="rId3r4xknrm19-hhzyws0fjy">
+      <w:hyperlink w:history="1" r:id="rIdhlwktqzs0-mnkibplftuo">
         <w:r>
           <w:rPr>
             <w:color w:val="0563C1"/>
@@ -20656,7 +20656,7 @@
       <w:r>
         <w:t xml:space="preserve">Statistics Greenland. “</w:t>
       </w:r>
-      <w:hyperlink w:history="1" r:id="rIdwuczhbvj0qzk7wabsi3fl">
+      <w:hyperlink w:history="1" r:id="rIdptozhof6xu4pxrjzn_535">
         <w:r>
           <w:rPr>
             <w:color w:val="0563C1"/>
@@ -20720,7 +20720,7 @@
       <w:r>
         <w:t xml:space="preserve">COVID-19 National Preparedness Collaborators. “</w:t>
       </w:r>
-      <w:hyperlink w:history="1" r:id="rId9iag7p6qneiruwx_s7tcj">
+      <w:hyperlink w:history="1" r:id="rIdjgtxnmwp7pmxg8kha6uoi">
         <w:r>
           <w:rPr>
             <w:color w:val="0563C1"/>
@@ -20748,7 +20748,7 @@
       <w:r>
         <w:t xml:space="preserve">Msemburi, William, et al. “</w:t>
       </w:r>
-      <w:hyperlink w:history="1" r:id="rIdezlgxgje7jczzs_n4fozq">
+      <w:hyperlink w:history="1" r:id="rIds54d9q2tlwihssvs8c-9d">
         <w:r>
           <w:rPr>
             <w:color w:val="0563C1"/>
@@ -20832,7 +20832,7 @@
       <w:r>
         <w:t xml:space="preserve">Jinek, Martin, et al. “</w:t>
       </w:r>
-      <w:hyperlink w:history="1" r:id="rId5ejvj_jp76m_hah8plcwz">
+      <w:hyperlink w:history="1" r:id="rIdx44ttfimim0fm3el_l5od">
         <w:r>
           <w:rPr>
             <w:color w:val="0563C1"/>
@@ -20860,7 +20860,7 @@
       <w:r>
         <w:t xml:space="preserve">Fehilly, Carole B., S. M. Willadsen, and Elizabeth M. Tucker. “</w:t>
       </w:r>
-      <w:hyperlink w:history="1" r:id="rIdpwpjnrv5hbbdzhctobq76">
+      <w:hyperlink w:history="1" r:id="rIdl6silauc4xw0ke1ya_j-8">
         <w:r>
           <w:rPr>
             <w:color w:val="0563C1"/>
@@ -20908,7 +20908,7 @@
       <w:r>
         <w:t xml:space="preserve">Ganopolski, A., R. Winkelmann, and H. J. Schellnhuber. “</w:t>
       </w:r>
-      <w:hyperlink w:history="1" r:id="rId0aie-r6ev5de1u7afl0ak">
+      <w:hyperlink w:history="1" r:id="rIdb_r224zhsvzyjelegjybp">
         <w:r>
           <w:rPr>
             <w:color w:val="0563C1"/>
@@ -20956,7 +20956,7 @@
       <w:r>
         <w:t xml:space="preserve">Hawking, S. W. “</w:t>
       </w:r>
-      <w:hyperlink w:history="1" r:id="rIdmpcolleinguezgqauhto0">
+      <w:hyperlink w:history="1" r:id="rIdklhb_fzdy3ushcy35h3db">
         <w:r>
           <w:rPr>
             <w:color w:val="0563C1"/>
@@ -20984,7 +20984,7 @@
       <w:r>
         <w:t xml:space="preserve">LIGO Scientific Collaboration and Virgo Collaboration. “</w:t>
       </w:r>
-      <w:hyperlink w:history="1" r:id="rIdnth1c9ncugv7gvuemv7fx">
+      <w:hyperlink w:history="1" r:id="rIdycvxh-b8kzizs6yi8e-pr">
         <w:r>
           <w:rPr>
             <w:color w:val="0563C1"/>
@@ -21012,7 +21012,7 @@
       <w:r>
         <w:t xml:space="preserve">ATLAS Collaboration. “</w:t>
       </w:r>
-      <w:hyperlink w:history="1" r:id="rIdj3jxdehqnkndhzswl03hy">
+      <w:hyperlink w:history="1" r:id="rIdhstuc89ti97soncz4pbgy">
         <w:r>
           <w:rPr>
             <w:color w:val="0563C1"/>
@@ -21040,7 +21040,7 @@
       <w:r>
         <w:t xml:space="preserve">Abu-Shawareb, H., et al. (Indirect Drive ICF Collaboration). “</w:t>
       </w:r>
-      <w:hyperlink w:history="1" r:id="rIdebuons0wyeprwzpxy49fl">
+      <w:hyperlink w:history="1" r:id="rIdvycqbrwermrz5cl_oidsr">
         <w:r>
           <w:rPr>
             <w:color w:val="0563C1"/>
@@ -21092,7 +21092,7 @@
       <w:pPr>
         <w:spacing w:after="200"/>
       </w:pPr>
-      <w:hyperlink w:history="1" r:id="rIdsm0wzmre9vh53rhpaatsq">
+      <w:hyperlink w:history="1" r:id="rId2enxs0vlqlsz282k9_9y8">
         <w:r>
           <w:rPr>
             <w:b/>
@@ -21125,7 +21125,7 @@
       <w:pPr>
         <w:spacing w:after="200"/>
       </w:pPr>
-      <w:hyperlink w:history="1" r:id="rIdwozc1_n_ou0cdcvrew3w0">
+      <w:hyperlink w:history="1" r:id="rIdw8t24w6tadyaisyzkansh">
         <w:r>
           <w:rPr>
             <w:b/>
@@ -21158,7 +21158,7 @@
       <w:pPr>
         <w:spacing w:after="200"/>
       </w:pPr>
-      <w:hyperlink w:history="1" r:id="rIdwz_ixvv_mzf91dfc22t3l">
+      <w:hyperlink w:history="1" r:id="rIdymuvf1dlocdiko1ivnbuy">
         <w:r>
           <w:rPr>
             <w:b/>
@@ -21191,7 +21191,7 @@
       <w:pPr>
         <w:spacing w:after="200"/>
       </w:pPr>
-      <w:hyperlink w:history="1" r:id="rIdzvjji6xw0yu9oayri5ozm">
+      <w:hyperlink w:history="1" r:id="rIdxlu-ekjpya_isjviw9dtv">
         <w:r>
           <w:rPr>
             <w:b/>
@@ -21224,7 +21224,7 @@
       <w:pPr>
         <w:spacing w:after="200"/>
       </w:pPr>
-      <w:hyperlink w:history="1" r:id="rIdunpgfuiik6oqdyrhfc63r">
+      <w:hyperlink w:history="1" r:id="rIderqnpezijzzlx9bz4naj6">
         <w:r>
           <w:rPr>
             <w:b/>
@@ -21257,7 +21257,7 @@
       <w:pPr>
         <w:spacing w:after="200"/>
       </w:pPr>
-      <w:hyperlink w:history="1" r:id="rIdr2jh2rl8jdcuyzmxqb04p">
+      <w:hyperlink w:history="1" r:id="rId8mrcazzwhs82pltzzzvhd">
         <w:r>
           <w:rPr>
             <w:b/>
@@ -21290,7 +21290,7 @@
       <w:pPr>
         <w:spacing w:after="200"/>
       </w:pPr>
-      <w:hyperlink w:history="1" r:id="rId9tgypxnuzbiacsnhatqbl">
+      <w:hyperlink w:history="1" r:id="rIdaaxpmcj1nlutbpvs14yqc">
         <w:r>
           <w:rPr>
             <w:b/>
@@ -21345,7 +21345,7 @@
       <w:pPr>
         <w:spacing w:after="200"/>
       </w:pPr>
-      <w:hyperlink w:history="1" r:id="rIdc4dfggb1pr2qeizfmcml_">
+      <w:hyperlink w:history="1" r:id="rIdthpmaxauk3olxzsampz6a">
         <w:r>
           <w:rPr>
             <w:b/>
@@ -21378,7 +21378,7 @@
       <w:pPr>
         <w:spacing w:after="200"/>
       </w:pPr>
-      <w:hyperlink w:history="1" r:id="rIdjn8jl3tsyg8uuddi7hwhm">
+      <w:hyperlink w:history="1" r:id="rIdbkwkexbgcowrn9tucwye6">
         <w:r>
           <w:rPr>
             <w:b/>
@@ -21411,7 +21411,7 @@
       <w:pPr>
         <w:spacing w:after="200"/>
       </w:pPr>
-      <w:hyperlink w:history="1" r:id="rIdtqfzhhzmdne6rwl7pbmt-">
+      <w:hyperlink w:history="1" r:id="rIdha2uwoowhuhvyu7e1ys1k">
         <w:r>
           <w:rPr>
             <w:b/>
@@ -21444,7 +21444,7 @@
       <w:pPr>
         <w:spacing w:after="200"/>
       </w:pPr>
-      <w:hyperlink w:history="1" r:id="rIdswbvlqqhg5vwzjcwdylqk">
+      <w:hyperlink w:history="1" r:id="rIdyt6zlt8_zy-xyysezscbk">
         <w:r>
           <w:rPr>
             <w:b/>
@@ -21477,7 +21477,7 @@
       <w:pPr>
         <w:spacing w:after="200"/>
       </w:pPr>
-      <w:hyperlink w:history="1" r:id="rIdkuhr8thlgadnvagxm0igm">
+      <w:hyperlink w:history="1" r:id="rId2k8ql8spwh-htglujpu7y">
         <w:r>
           <w:rPr>
             <w:b/>
@@ -21510,7 +21510,7 @@
       <w:pPr>
         <w:spacing w:after="200"/>
       </w:pPr>
-      <w:hyperlink w:history="1" r:id="rIdni_v9yzfo5ba7nu2makoy">
+      <w:hyperlink w:history="1" r:id="rIddooe8hh0t-ureo68pb9eh">
         <w:r>
           <w:rPr>
             <w:b/>
@@ -21543,7 +21543,7 @@
       <w:pPr>
         <w:spacing w:after="200"/>
       </w:pPr>
-      <w:hyperlink w:history="1" r:id="rIdbjnrocfekzuua6-gdzge1">
+      <w:hyperlink w:history="1" r:id="rId2zh7mps-sla7mt2ghyzxo">
         <w:r>
           <w:rPr>
             <w:b/>
@@ -21576,7 +21576,7 @@
       <w:pPr>
         <w:spacing w:after="200"/>
       </w:pPr>
-      <w:hyperlink w:history="1" r:id="rId_zkeq-orbut6ly0siruxr">
+      <w:hyperlink w:history="1" r:id="rIdp2ysnbp0dhj3zq7klpbol">
         <w:r>
           <w:rPr>
             <w:b/>
@@ -21609,7 +21609,7 @@
       <w:pPr>
         <w:spacing w:after="200"/>
       </w:pPr>
-      <w:hyperlink w:history="1" r:id="rIdodhq1phhufqvw9yq00uwr">
+      <w:hyperlink w:history="1" r:id="rIdmwpzne18kirg4tzktv5r3">
         <w:r>
           <w:rPr>
             <w:b/>
@@ -21642,7 +21642,7 @@
       <w:pPr>
         <w:spacing w:after="200"/>
       </w:pPr>
-      <w:hyperlink w:history="1" r:id="rId71gnwonzjdjkbaqtslisv">
+      <w:hyperlink w:history="1" r:id="rIddvjoe1gr6eex2ivnfyz0g">
         <w:r>
           <w:rPr>
             <w:b/>
@@ -21675,7 +21675,7 @@
       <w:pPr>
         <w:spacing w:after="200"/>
       </w:pPr>
-      <w:hyperlink w:history="1" r:id="rIdq3h5ahygsemdgpxh09-lo">
+      <w:hyperlink w:history="1" r:id="rIdhqmq9aoybvbiidqp_17wd">
         <w:r>
           <w:rPr>
             <w:b/>
@@ -21708,7 +21708,7 @@
       <w:pPr>
         <w:spacing w:after="200"/>
       </w:pPr>
-      <w:hyperlink w:history="1" r:id="rId__zyqw-vig4yqosktd8ch">
+      <w:hyperlink w:history="1" r:id="rIdpqob98_qfroj2askvbqrx">
         <w:r>
           <w:rPr>
             <w:b/>
@@ -21741,7 +21741,7 @@
       <w:pPr>
         <w:spacing w:after="200"/>
       </w:pPr>
-      <w:hyperlink w:history="1" r:id="rIdnrguf_pofnkr6vxaklwus">
+      <w:hyperlink w:history="1" r:id="rIdhdnsdzsuv_q-7fbjt9bmg">
         <w:r>
           <w:rPr>
             <w:b/>

</xml_diff>

<commit_message>
Dolphins: joke-density critique checked, doesn't hold up on inspection
Follow-up to the mean-reviewer fixes: the background workflow's five
independent agents (one per flagged back-third chapter: Digital Leap,
Something Might Be Watching, Medicine, Climate, A Fractured Present)
all came back needs_fix=false, each with chapter-specific reasoning
comparing actual dolphin-voice beat density against earlier chapters.
Each agent was explicitly told not to force an addition if one wasn't
genuinely warranted, per its own reading. Forcing insertions to
superficially satisfy the critique would have been padding, not a
fix, so none were made. Documented the finding and the reasoning in
the Book Plan rather than silently dropping the point.

Co-Authored-By: Claude Sonnet 5 <noreply@anthropic.com>
Claude-Session: https://claude.ai/code/session_01No3CTqqXoAC7DqUj3kRTnA
</commit_message>
<xml_diff>
--- a/The Dolphins' View of History/The Dolphins' View of History - Complete Manuscript.docx
+++ b/The Dolphins' View of History/The Dolphins' View of History - Complete Manuscript.docx
@@ -12070,7 +12070,7 @@
       <w:r>
         <w:t xml:space="preserve">Thewissen, J. G. M., et al. “</w:t>
       </w:r>
-      <w:hyperlink w:history="1" r:id="rIdzwc99i0ocfphvnou1kse-">
+      <w:hyperlink w:history="1" r:id="rIdetwj-xc-v7g5tem7uqa_f">
         <w:r>
           <w:rPr>
             <w:color w:val="0563C1"/>
@@ -12098,7 +12098,7 @@
       <w:r>
         <w:t xml:space="preserve">Stringer, Chris. </w:t>
       </w:r>
-      <w:hyperlink w:history="1" r:id="rIdnr1v9xmchvjguwtyjbgj6">
+      <w:hyperlink w:history="1" r:id="rIdwhp2f0_bcvkoa_gqhldd4">
         <w:r>
           <w:rPr>
             <w:color w:val="0563C1"/>
@@ -12146,7 +12146,7 @@
       <w:r>
         <w:t xml:space="preserve">Marino, Lori. “</w:t>
       </w:r>
-      <w:hyperlink w:history="1" r:id="rIdmbadhrzm9mf-ap5hdf6xo">
+      <w:hyperlink w:history="1" r:id="rIddarvtbvrhp0wis9yccrts">
         <w:r>
           <w:rPr>
             <w:color w:val="0563C1"/>
@@ -12174,7 +12174,7 @@
       <w:r>
         <w:t xml:space="preserve">Janik, Vincent M., Laela S. Sayigh, and Randall S. Wells. “</w:t>
       </w:r>
-      <w:hyperlink w:history="1" r:id="rIdrhsezsaan4zhaqw7olrfx">
+      <w:hyperlink w:history="1" r:id="rIdy2dbiuch-t-ruaspf2pt0">
         <w:r>
           <w:rPr>
             <w:color w:val="0563C1"/>
@@ -12202,7 +12202,7 @@
       <w:r>
         <w:t xml:space="preserve">Krützen, Michael, et al. “</w:t>
       </w:r>
-      <w:hyperlink w:history="1" r:id="rIdd-yvaeqtqi52cutayulij">
+      <w:hyperlink w:history="1" r:id="rIdxu4yrbumt-xswwayoogt-">
         <w:r>
           <w:rPr>
             <w:color w:val="0563C1"/>
@@ -12230,7 +12230,7 @@
       <w:r>
         <w:t xml:space="preserve">Tennie, Claudio, Josep Call, and Michael Tomasello. “</w:t>
       </w:r>
-      <w:hyperlink w:history="1" r:id="rIdi9twqtm31qxkphsq54fov">
+      <w:hyperlink w:history="1" r:id="rIdrcvlxkico7jits7y0forp">
         <w:r>
           <w:rPr>
             <w:color w:val="0563C1"/>
@@ -12294,7 +12294,7 @@
       <w:r>
         <w:t xml:space="preserve">Hublin, Jean-Jacques, et al. “</w:t>
       </w:r>
-      <w:hyperlink w:history="1" r:id="rIdlwivwvsiegzrwhva1zijj">
+      <w:hyperlink w:history="1" r:id="rIdw5w3jwivc3rk9ik5ccmtl">
         <w:r>
           <w:rPr>
             <w:color w:val="0563C1"/>
@@ -12322,7 +12322,7 @@
       <w:r>
         <w:t xml:space="preserve">Scerri, Eleanor M. L., et al. “</w:t>
       </w:r>
-      <w:hyperlink w:history="1" r:id="rIds9aeoazxronl88f_i-kfz">
+      <w:hyperlink w:history="1" r:id="rIdzr6ykbnolnz7pdc08lycg">
         <w:r>
           <w:rPr>
             <w:color w:val="0563C1"/>
@@ -12350,7 +12350,7 @@
       <w:r>
         <w:t xml:space="preserve">Leakey, M. D., and R. L. Hay. “</w:t>
       </w:r>
-      <w:hyperlink w:history="1" r:id="rId8wqtn6dn36toswvgacqec">
+      <w:hyperlink w:history="1" r:id="rIdvbc-arm9gltlk-jdwqlq1">
         <w:r>
           <w:rPr>
             <w:color w:val="0563C1"/>
@@ -12378,7 +12378,7 @@
       <w:r>
         <w:t xml:space="preserve">Villmoare, Brian, et al. “</w:t>
       </w:r>
-      <w:hyperlink w:history="1" r:id="rId5arextyej-zdaaxp6rbc7">
+      <w:hyperlink w:history="1" r:id="rIdntvyuuofyu7j_cue5yros">
         <w:r>
           <w:rPr>
             <w:color w:val="0563C1"/>
@@ -12406,7 +12406,7 @@
       <w:r>
         <w:t xml:space="preserve">Lordkipanidze, David, et al. “</w:t>
       </w:r>
-      <w:hyperlink w:history="1" r:id="rIdowo90vge2wav5-djusjvq">
+      <w:hyperlink w:history="1" r:id="rIda5ew_v3zum16msdsrq0bf">
         <w:r>
           <w:rPr>
             <w:color w:val="0563C1"/>
@@ -12434,7 +12434,7 @@
       <w:r>
         <w:t xml:space="preserve">Dirks, Paul H. G. M., et al. “</w:t>
       </w:r>
-      <w:hyperlink w:history="1" r:id="rIdhnxh2wn7krpik5mh2yk74">
+      <w:hyperlink w:history="1" r:id="rIdqxxgwr-cdstksmsqrxm07">
         <w:r>
           <w:rPr>
             <w:color w:val="0563C1"/>
@@ -12462,7 +12462,7 @@
       <w:r>
         <w:t xml:space="preserve">Henshilwood, Christopher S., et al. “</w:t>
       </w:r>
-      <w:hyperlink w:history="1" r:id="rIdshwo2ulogrxphzuv5ri5c">
+      <w:hyperlink w:history="1" r:id="rIdw77ecrlegnej4bw9b9ltd">
         <w:r>
           <w:rPr>
             <w:color w:val="0563C1"/>
@@ -12510,7 +12510,7 @@
       <w:r>
         <w:t xml:space="preserve">Berna, Francesco, et al. “</w:t>
       </w:r>
-      <w:hyperlink w:history="1" r:id="rIdm0paye0p6_vm6xautfmeu">
+      <w:hyperlink w:history="1" r:id="rId5kqodijt3pdkbj6vnbdhu">
         <w:r>
           <w:rPr>
             <w:color w:val="0563C1"/>
@@ -12538,7 +12538,7 @@
       <w:r>
         <w:t xml:space="preserve">Shahack-Gross, Ruth, et al. “</w:t>
       </w:r>
-      <w:hyperlink w:history="1" r:id="rIddifuaaawhcvqyjbxxi1rg">
+      <w:hyperlink w:history="1" r:id="rIdgb_h8wh_iaq9aykqis_l_">
         <w:r>
           <w:rPr>
             <w:color w:val="0563C1"/>
@@ -12566,7 +12566,7 @@
       <w:r>
         <w:t xml:space="preserve">Harmand, Sonia, et al. “</w:t>
       </w:r>
-      <w:hyperlink w:history="1" r:id="rId8sebyppjlxglk2yhudo_u">
+      <w:hyperlink w:history="1" r:id="rIdtcqh1qbxu1oeg9ivmfuex">
         <w:r>
           <w:rPr>
             <w:color w:val="0563C1"/>
@@ -12594,7 +12594,7 @@
       <w:r>
         <w:t xml:space="preserve">Lepre, Christopher J., et al. “</w:t>
       </w:r>
-      <w:hyperlink w:history="1" r:id="rIdk9otkg5t5f1xkludbpavr">
+      <w:hyperlink w:history="1" r:id="rIdgb2fa1kpqo-u9akmhngiq">
         <w:r>
           <w:rPr>
             <w:color w:val="0563C1"/>
@@ -12622,7 +12622,7 @@
       <w:r>
         <w:t xml:space="preserve">Brown, Kyle S., et al. “</w:t>
       </w:r>
-      <w:hyperlink w:history="1" r:id="rIdp5j89n5nxuz2ktjqp94c_">
+      <w:hyperlink w:history="1" r:id="rIdqac9zmevfymsdaqqsr2bv">
         <w:r>
           <w:rPr>
             <w:color w:val="0563C1"/>
@@ -12650,7 +12650,7 @@
       <w:r>
         <w:t xml:space="preserve">Wrangham, Richard. </w:t>
       </w:r>
-      <w:hyperlink w:history="1" r:id="rIdfkcwx5_vraby9vxu3eqw1">
+      <w:hyperlink w:history="1" r:id="rIdn7al1orvs7aaulfgunfld">
         <w:r>
           <w:rPr>
             <w:color w:val="0563C1"/>
@@ -12678,7 +12678,7 @@
       <w:r>
         <w:t xml:space="preserve">Fitch, W. Tecumseh. </w:t>
       </w:r>
-      <w:hyperlink w:history="1" r:id="rId2pbybl-gohb0hx_pks0gg">
+      <w:hyperlink w:history="1" r:id="rIdqiue3d0faxi3hnqrmlx7a">
         <w:r>
           <w:rPr>
             <w:color w:val="0563C1"/>
@@ -12726,7 +12726,7 @@
       <w:r>
         <w:t xml:space="preserve">Clarkson, Chris, et al. “</w:t>
       </w:r>
-      <w:hyperlink w:history="1" r:id="rIdrzbw6iaxkvhbkbyqxritk">
+      <w:hyperlink w:history="1" r:id="rId55zauogmfehmcvjzg85yu">
         <w:r>
           <w:rPr>
             <w:color w:val="0563C1"/>
@@ -12754,7 +12754,7 @@
       <w:r>
         <w:t xml:space="preserve">O’Connell, James F., et al. “</w:t>
       </w:r>
-      <w:hyperlink w:history="1" r:id="rIdxllvns88th0qm_rvertbb">
+      <w:hyperlink w:history="1" r:id="rIdzvp0ckdktgp_qbkfizyd9">
         <w:r>
           <w:rPr>
             <w:color w:val="0563C1"/>
@@ -12782,7 +12782,7 @@
       <w:r>
         <w:t xml:space="preserve">Reich, David, et al. “</w:t>
       </w:r>
-      <w:hyperlink w:history="1" r:id="rId-i7orgjxmr0djma_tidhj">
+      <w:hyperlink w:history="1" r:id="rId4cn5ybfnsm6q8cga59blq">
         <w:r>
           <w:rPr>
             <w:color w:val="0563C1"/>
@@ -12810,7 +12810,7 @@
       <w:r>
         <w:t xml:space="preserve">Chen, Fahu, et al. “</w:t>
       </w:r>
-      <w:hyperlink w:history="1" r:id="rIdo1p5gjgcom4knhkrogzpr">
+      <w:hyperlink w:history="1" r:id="rIdf1r99ocxlfiebjspbefvn">
         <w:r>
           <w:rPr>
             <w:color w:val="0563C1"/>
@@ -12838,7 +12838,7 @@
       <w:r>
         <w:t xml:space="preserve">Higham, Tom, et al. “</w:t>
       </w:r>
-      <w:hyperlink w:history="1" r:id="rId3mcc0pqdffxgiwb_7xu5f">
+      <w:hyperlink w:history="1" r:id="rIdvxrsytoxpqzaogjkk8fbd">
         <w:r>
           <w:rPr>
             <w:color w:val="0563C1"/>
@@ -12866,7 +12866,7 @@
       <w:r>
         <w:t xml:space="preserve">Sutikna, Thomas, et al. “</w:t>
       </w:r>
-      <w:hyperlink w:history="1" r:id="rIduwzlu9w50xtdr4h4geskl">
+      <w:hyperlink w:history="1" r:id="rIdkjnrfqgut9wlx7shluqqa">
         <w:r>
           <w:rPr>
             <w:color w:val="0563C1"/>
@@ -12894,7 +12894,7 @@
       <w:r>
         <w:t xml:space="preserve">Oktaviana, Adhi Agus, et al. “</w:t>
       </w:r>
-      <w:hyperlink w:history="1" r:id="rIdau33jdgu_uctlcldk37wb">
+      <w:hyperlink w:history="1" r:id="rIduxrhc7qrkczwcpjhoxukx">
         <w:r>
           <w:rPr>
             <w:color w:val="0563C1"/>
@@ -12922,7 +12922,7 @@
       <w:r>
         <w:t xml:space="preserve">Bennett, Matthew R., et al. “</w:t>
       </w:r>
-      <w:hyperlink w:history="1" r:id="rIdzp7asgjk5kyekmsw7rmbw">
+      <w:hyperlink w:history="1" r:id="rIdfwg0dz0o-3ldkxmydq3b-">
         <w:r>
           <w:rPr>
             <w:color w:val="0563C1"/>
@@ -12950,7 +12950,7 @@
       <w:r>
         <w:t xml:space="preserve">Reich, David. </w:t>
       </w:r>
-      <w:hyperlink w:history="1" r:id="rIdx2fq6azieiftvokr5bkpr">
+      <w:hyperlink w:history="1" r:id="rIde1uanvn5tpbo4fxo21qtr">
         <w:r>
           <w:rPr>
             <w:color w:val="0563C1"/>
@@ -12998,7 +12998,7 @@
       <w:r>
         <w:t xml:space="preserve">Dietrich, Oliver, et al. “</w:t>
       </w:r>
-      <w:hyperlink w:history="1" r:id="rIdxrrxesnmegi5ssvxxci3d">
+      <w:hyperlink w:history="1" r:id="rIdbrbtvr439yn_b7w80ked6">
         <w:r>
           <w:rPr>
             <w:color w:val="0563C1"/>
@@ -13026,7 +13026,7 @@
       <w:r>
         <w:t xml:space="preserve">Larson, Greger, et al. “</w:t>
       </w:r>
-      <w:hyperlink w:history="1" r:id="rIdeaqjonoequpblmxluxugf">
+      <w:hyperlink w:history="1" r:id="rIdc9hngnq6vlb5clmdeug9j">
         <w:r>
           <w:rPr>
             <w:color w:val="0563C1"/>
@@ -13054,7 +13054,7 @@
       <w:r>
         <w:t xml:space="preserve">Fuller, Dorian Q., et al. “</w:t>
       </w:r>
-      <w:hyperlink w:history="1" r:id="rIddhlmrnejddtmkcdiqbjpr">
+      <w:hyperlink w:history="1" r:id="rIdcsrj-8rm3ylpslcfbrimw">
         <w:r>
           <w:rPr>
             <w:color w:val="0563C1"/>
@@ -13082,7 +13082,7 @@
       <w:r>
         <w:t xml:space="preserve">Larsen, Clark Spencer. “</w:t>
       </w:r>
-      <w:hyperlink w:history="1" r:id="rIdcwohcaudx47mgnuont4ik">
+      <w:hyperlink w:history="1" r:id="rIduzpujfd58fqy0kr_osfao">
         <w:r>
           <w:rPr>
             <w:color w:val="0563C1"/>
@@ -13110,7 +13110,7 @@
       <w:r>
         <w:t xml:space="preserve">Hodder, Ian. </w:t>
       </w:r>
-      <w:hyperlink w:history="1" r:id="rId7myac47rfsjgerebymc5g">
+      <w:hyperlink w:history="1" r:id="rIdtrrqmehjkutxm69dgdkkd">
         <w:r>
           <w:rPr>
             <w:color w:val="0563C1"/>
@@ -13138,7 +13138,7 @@
       <w:r>
         <w:t xml:space="preserve">Scott, James C. </w:t>
       </w:r>
-      <w:hyperlink w:history="1" r:id="rIdyqeg7em0l6ocuxw0je96j">
+      <w:hyperlink w:history="1" r:id="rIdjkbq42rrhqzrxh-wzv9u3">
         <w:r>
           <w:rPr>
             <w:color w:val="0563C1"/>
@@ -13202,7 +13202,7 @@
       <w:r>
         <w:t xml:space="preserve">Schmandt-Besserat, Denise. </w:t>
       </w:r>
-      <w:hyperlink w:history="1" r:id="rIdq-plcj0lowofut5xdmunc">
+      <w:hyperlink w:history="1" r:id="rIdhriux46ip137e7zqxjemn">
         <w:r>
           <w:rPr>
             <w:color w:val="0563C1"/>
@@ -13230,7 +13230,7 @@
       <w:r>
         <w:t xml:space="preserve">Nissen, Hans J., Peter Damerow, and Robert K. Englund. </w:t>
       </w:r>
-      <w:hyperlink w:history="1" r:id="rIdgap0hzon5l8pfxwvumrcy">
+      <w:hyperlink w:history="1" r:id="rIdw3acwasqcimsbiw9qbroj">
         <w:r>
           <w:rPr>
             <w:color w:val="0563C1"/>
@@ -13258,7 +13258,7 @@
       <w:r>
         <w:t xml:space="preserve">Houston, Stephen D., ed. </w:t>
       </w:r>
-      <w:hyperlink w:history="1" r:id="rIdf77ccnn45ksz5djcijj6q">
+      <w:hyperlink w:history="1" r:id="rIdz45ft9rsuey1lm37rkpvr">
         <w:r>
           <w:rPr>
             <w:color w:val="0563C1"/>
@@ -13286,7 +13286,7 @@
       <w:r>
         <w:t xml:space="preserve">Schacter, Daniel L. </w:t>
       </w:r>
-      <w:hyperlink w:history="1" r:id="rIdih7yepz3bqvm1zrv7skpc">
+      <w:hyperlink w:history="1" r:id="rIdsbsm2pddpu1xhvcdf8pk1">
         <w:r>
           <w:rPr>
             <w:color w:val="0563C1"/>
@@ -13366,7 +13366,7 @@
       <w:r>
         <w:t xml:space="preserve">Van De Mieroop, Marc. </w:t>
       </w:r>
-      <w:hyperlink w:history="1" r:id="rIdwp72trany24tt_mq5od5_">
+      <w:hyperlink w:history="1" r:id="rIdvrpillg3ixgk0gsqxnjny">
         <w:r>
           <w:rPr>
             <w:color w:val="0563C1"/>
@@ -13394,7 +13394,7 @@
       <w:r>
         <w:t xml:space="preserve">Lehner, Mark, and Zahi Hawass. </w:t>
       </w:r>
-      <w:hyperlink w:history="1" r:id="rIdameraupi_r834wyvabamm">
+      <w:hyperlink w:history="1" r:id="rIdmxmgasruupqtsqlut4dfw">
         <w:r>
           <w:rPr>
             <w:color w:val="0563C1"/>
@@ -13422,7 +13422,7 @@
       <w:r>
         <w:t xml:space="preserve">Edgerton, William F. “</w:t>
       </w:r>
-      <w:hyperlink w:history="1" r:id="rIdzbrvcibm1aamlc8fa8hy4">
+      <w:hyperlink w:history="1" r:id="rIdgbwletibrfvi4mly9ek1i">
         <w:r>
           <w:rPr>
             <w:color w:val="0563C1"/>
@@ -13450,7 +13450,7 @@
       <w:r>
         <w:t xml:space="preserve">Roth, Martha T. </w:t>
       </w:r>
-      <w:hyperlink w:history="1" r:id="rIdzvpuw4yppll6qloxgn4uc">
+      <w:hyperlink w:history="1" r:id="rIdr3v1xunuoh6jv0ubltlwa">
         <w:r>
           <w:rPr>
             <w:color w:val="0563C1"/>
@@ -13478,7 +13478,7 @@
       <w:r>
         <w:t xml:space="preserve">Bryce, Trevor. </w:t>
       </w:r>
-      <w:hyperlink w:history="1" r:id="rIdq-f_o_1m5hxevrgpgnyc1">
+      <w:hyperlink w:history="1" r:id="rIdoyxadfaqzon0rj5zxvg_m">
         <w:r>
           <w:rPr>
             <w:color w:val="0563C1"/>
@@ -13506,7 +13506,7 @@
       <w:r>
         <w:t xml:space="preserve">Parkinson, Richard. </w:t>
       </w:r>
-      <w:hyperlink w:history="1" r:id="rIdeo22cjlbtsbmqtoapaus5">
+      <w:hyperlink w:history="1" r:id="rIdxzcgu0n6y9duakzzjfy3q">
         <w:r>
           <w:rPr>
             <w:color w:val="0563C1"/>
@@ -13554,7 +13554,7 @@
       <w:r>
         <w:t xml:space="preserve">Keightley, David N. </w:t>
       </w:r>
-      <w:hyperlink w:history="1" r:id="rIdinhxfhwgqpfb71ir8gt5j">
+      <w:hyperlink w:history="1" r:id="rIdfarf5ah9whnj8st2memic">
         <w:r>
           <w:rPr>
             <w:color w:val="0563C1"/>
@@ -13582,7 +13582,7 @@
       <w:r>
         <w:t xml:space="preserve">Lewis, Mark Edward. </w:t>
       </w:r>
-      <w:hyperlink w:history="1" r:id="rIdo3e-iu24tuszsd02yebc3">
+      <w:hyperlink w:history="1" r:id="rId1fdnoeyejhupqzrbwfxtq">
         <w:r>
           <w:rPr>
             <w:color w:val="0563C1"/>
@@ -13610,7 +13610,7 @@
       <w:r>
         <w:t xml:space="preserve">Elman, Benjamin A. </w:t>
       </w:r>
-      <w:hyperlink w:history="1" r:id="rId1j52l6x7wq7xpzpqpksw1">
+      <w:hyperlink w:history="1" r:id="rIdqfngd5ov9ie4fkkox1yeh">
         <w:r>
           <w:rPr>
             <w:color w:val="0563C1"/>
@@ -13638,7 +13638,7 @@
       <w:r>
         <w:t xml:space="preserve">Liu, Li, and Xingcan Chen. </w:t>
       </w:r>
-      <w:hyperlink w:history="1" r:id="rIdo2ai61qfxvjwjs0j9c5ge">
+      <w:hyperlink w:history="1" r:id="rId8gvafweixtwzgjqurlpe8">
         <w:r>
           <w:rPr>
             <w:color w:val="0563C1"/>
@@ -13686,7 +13686,7 @@
       <w:r>
         <w:t xml:space="preserve">Possehl, Gregory L. </w:t>
       </w:r>
-      <w:hyperlink w:history="1" r:id="rIdxpkkdymx5uqzqjpsc3rud">
+      <w:hyperlink w:history="1" r:id="rId1l7-2tyakzfkqctmu5qc-">
         <w:r>
           <w:rPr>
             <w:color w:val="0563C1"/>
@@ -13714,7 +13714,7 @@
       <w:r>
         <w:t xml:space="preserve">Thapar, Romila. </w:t>
       </w:r>
-      <w:hyperlink w:history="1" r:id="rId36gjpb_3xi2is13c9aqrs">
+      <w:hyperlink w:history="1" r:id="rId0d0edjh7w0dbatgowyvl2">
         <w:r>
           <w:rPr>
             <w:color w:val="0563C1"/>
@@ -13742,7 +13742,7 @@
       <w:r>
         <w:t xml:space="preserve">Plofker, Kim. </w:t>
       </w:r>
-      <w:hyperlink w:history="1" r:id="rIdn9-wnfhhuvntuovepfoen">
+      <w:hyperlink w:history="1" r:id="rIdlueeufx6p_gevfextczzz">
         <w:r>
           <w:rPr>
             <w:color w:val="0563C1"/>
@@ -13770,7 +13770,7 @@
       <w:r>
         <w:t xml:space="preserve">Dirks, Nicholas B. </w:t>
       </w:r>
-      <w:hyperlink w:history="1" r:id="rIdvi-cqh6ylcn19-kqxqagd">
+      <w:hyperlink w:history="1" r:id="rId1bbt3lwp9btgsntfnkx4b">
         <w:r>
           <w:rPr>
             <w:color w:val="0563C1"/>
@@ -13798,7 +13798,7 @@
       <w:r>
         <w:t xml:space="preserve">Dundas, Paul. </w:t>
       </w:r>
-      <w:hyperlink w:history="1" r:id="rId-agndxz-nmhzh9n1cuf4o">
+      <w:hyperlink w:history="1" r:id="rIdxtu0ztmfoa4htrxc3q-vw">
         <w:r>
           <w:rPr>
             <w:color w:val="0563C1"/>
@@ -13878,7 +13878,7 @@
       <w:r>
         <w:t xml:space="preserve">Cartledge, Paul. </w:t>
       </w:r>
-      <w:hyperlink w:history="1" r:id="rId9dlpsgrl4xrtjrvo1jif4">
+      <w:hyperlink w:history="1" r:id="rIdz0xdxfkkozq2ge8kgpebm">
         <w:r>
           <w:rPr>
             <w:color w:val="0563C1"/>
@@ -13906,7 +13906,7 @@
       <w:r>
         <w:t xml:space="preserve">Freeth, Tony, et al. “</w:t>
       </w:r>
-      <w:hyperlink w:history="1" r:id="rId3axjnzm9-5axmathpzbcg">
+      <w:hyperlink w:history="1" r:id="rIdtw-zfg56lm8h1rytlqvw5">
         <w:r>
           <w:rPr>
             <w:color w:val="0563C1"/>
@@ -13934,7 +13934,7 @@
       <w:r>
         <w:t xml:space="preserve">Freeth, Tony, et al. “</w:t>
       </w:r>
-      <w:hyperlink w:history="1" r:id="rId23gzc-dcgbthfz0jjwbah">
+      <w:hyperlink w:history="1" r:id="rIdvct-iq3-rzrq9gwtgwz-z">
         <w:r>
           <w:rPr>
             <w:color w:val="0563C1"/>
@@ -13982,7 +13982,7 @@
       <w:r>
         <w:t xml:space="preserve">Beard, Mary. </w:t>
       </w:r>
-      <w:hyperlink w:history="1" r:id="rId2x8qwfuk92mm3-y7g_toj">
+      <w:hyperlink w:history="1" r:id="rId7jeh3h-2upemlbt5nypey">
         <w:r>
           <w:rPr>
             <w:color w:val="0563C1"/>
@@ -14010,7 +14010,7 @@
       <w:r>
         <w:t xml:space="preserve">Ward-Perkins, Bryan. </w:t>
       </w:r>
-      <w:hyperlink w:history="1" r:id="rIduevbg_qkt7atwsmfrpv13">
+      <w:hyperlink w:history="1" r:id="rId7v332fytp_3rxjkifucs4">
         <w:r>
           <w:rPr>
             <w:color w:val="0563C1"/>
@@ -14038,7 +14038,7 @@
       <w:r>
         <w:t xml:space="preserve">Brown, Peter. </w:t>
       </w:r>
-      <w:hyperlink w:history="1" r:id="rIdsh3g0fax8fasbiggcmyfg">
+      <w:hyperlink w:history="1" r:id="rIdtmhoes6c0wkkhl1iw6sb8">
         <w:r>
           <w:rPr>
             <w:color w:val="0563C1"/>
@@ -14066,7 +14066,7 @@
       <w:r>
         <w:t xml:space="preserve">Harper, Kyle. </w:t>
       </w:r>
-      <w:hyperlink w:history="1" r:id="rIdqgj8dn35qqidcu-2xswqm">
+      <w:hyperlink w:history="1" r:id="rIdroaii3mgdef9zhi2exdn_">
         <w:r>
           <w:rPr>
             <w:color w:val="0563C1"/>
@@ -14114,7 +14114,7 @@
       <w:r>
         <w:t xml:space="preserve">Kennedy, Hugh. </w:t>
       </w:r>
-      <w:hyperlink w:history="1" r:id="rIdmmnpzd0mbtaq3nkzxsgyc">
+      <w:hyperlink w:history="1" r:id="rIdjrd0w0wskzp3je4kijyeu">
         <w:r>
           <w:rPr>
             <w:color w:val="0563C1"/>
@@ -14142,7 +14142,7 @@
       <w:r>
         <w:t xml:space="preserve">Gutas, Dimitri. </w:t>
       </w:r>
-      <w:hyperlink w:history="1" r:id="rIdoxhaylikxootmim6nkttt">
+      <w:hyperlink w:history="1" r:id="rIdslg5v6-8geouhp1grjj1w">
         <w:r>
           <w:rPr>
             <w:color w:val="0563C1"/>
@@ -14202,7 +14202,7 @@
       <w:r>
         <w:t xml:space="preserve">Riley-Smith, Jonathan. </w:t>
       </w:r>
-      <w:hyperlink w:history="1" r:id="rIdug6hlobzvpxofmc43vkhm">
+      <w:hyperlink w:history="1" r:id="rId1w4rmxrlip4qzn4brppzw">
         <w:r>
           <w:rPr>
             <w:color w:val="0563C1"/>
@@ -14246,7 +14246,7 @@
       <w:r>
         <w:t xml:space="preserve">Phillips, Jonathan. </w:t>
       </w:r>
-      <w:hyperlink w:history="1" r:id="rIdkbewdzuw-blfw4fttobbd">
+      <w:hyperlink w:history="1" r:id="rIda-xydrwysabeqif_dx8t3">
         <w:r>
           <w:rPr>
             <w:color w:val="0563C1"/>
@@ -14274,7 +14274,7 @@
       <w:r>
         <w:t xml:space="preserve">Stark, Rodney. </w:t>
       </w:r>
-      <w:hyperlink w:history="1" r:id="rIddq6p7za1fq5cctqifxljo">
+      <w:hyperlink w:history="1" r:id="rIdonf82o2s9wpdoqemynkcs">
         <w:r>
           <w:rPr>
             <w:color w:val="0563C1"/>
@@ -14322,7 +14322,7 @@
       <w:r>
         <w:t xml:space="preserve">Mommsen, Theodor E. “</w:t>
       </w:r>
-      <w:hyperlink w:history="1" r:id="rIdcifx1jyw_tavfrqgkbgto">
+      <w:hyperlink w:history="1" r:id="rIdzsgeqyyu6gl08wwlvrdnj">
         <w:r>
           <w:rPr>
             <w:color w:val="0563C1"/>
@@ -14350,7 +14350,7 @@
       <w:r>
         <w:t xml:space="preserve">Wickham, Chris. </w:t>
       </w:r>
-      <w:hyperlink w:history="1" r:id="rIdqgiyccbtval86tt-0a7xa">
+      <w:hyperlink w:history="1" r:id="rId6enozoec5uk4rzdrji1zd">
         <w:r>
           <w:rPr>
             <w:color w:val="0563C1"/>
@@ -14378,7 +14378,7 @@
       <w:r>
         <w:t xml:space="preserve">Russell, Jeffrey Burton. </w:t>
       </w:r>
-      <w:hyperlink w:history="1" r:id="rIdskw4ehmal7d5uqtj-0ykh">
+      <w:hyperlink w:history="1" r:id="rIdbng1j1efbytuhoueyq1t2">
         <w:r>
           <w:rPr>
             <w:color w:val="0563C1"/>
@@ -14442,7 +14442,7 @@
       <w:r>
         <w:t xml:space="preserve">Hansen, Valerie. </w:t>
       </w:r>
-      <w:hyperlink w:history="1" r:id="rIdtde3atxjkod9nh87yka0u">
+      <w:hyperlink w:history="1" r:id="rIdraczgmi7sq94nesvteuur">
         <w:r>
           <w:rPr>
             <w:color w:val="0563C1"/>
@@ -14470,7 +14470,7 @@
       <w:r>
         <w:t xml:space="preserve">Spyrou, Maria A., et al. “</w:t>
       </w:r>
-      <w:hyperlink w:history="1" r:id="rIdxn3yp3uz_6mb1n5ax0a1v">
+      <w:hyperlink w:history="1" r:id="rIdoia74-71sygf8uashzyuj">
         <w:r>
           <w:rPr>
             <w:color w:val="0563C1"/>
@@ -14498,7 +14498,7 @@
       <w:r>
         <w:t xml:space="preserve">Wheelis, Mark. “</w:t>
       </w:r>
-      <w:hyperlink w:history="1" r:id="rIdzpxcfwxokn0t0knscsgpl">
+      <w:hyperlink w:history="1" r:id="rIddvytnfetggxhnsyeojlxk">
         <w:r>
           <w:rPr>
             <w:color w:val="0563C1"/>
@@ -14526,7 +14526,7 @@
       <w:r>
         <w:t xml:space="preserve">Dean, Katharine R., et al. “</w:t>
       </w:r>
-      <w:hyperlink w:history="1" r:id="rIdqdbsrhhcblmsl-ugigv19">
+      <w:hyperlink w:history="1" r:id="rIduty_dkxjnw280e2vlyqtn">
         <w:r>
           <w:rPr>
             <w:color w:val="0563C1"/>
@@ -14554,7 +14554,7 @@
       <w:r>
         <w:t xml:space="preserve">Benedictow, Ole J. </w:t>
       </w:r>
-      <w:hyperlink w:history="1" r:id="rIdz42i0wpsayvauy0qow280">
+      <w:hyperlink w:history="1" r:id="rIdwowfebo2he-udthtgfpqg">
         <w:r>
           <w:rPr>
             <w:color w:val="0563C1"/>
@@ -14618,7 +14618,7 @@
       <w:r>
         <w:t xml:space="preserve">Gomez, Michael A. </w:t>
       </w:r>
-      <w:hyperlink w:history="1" r:id="rId63qgdfxplfqpdbsjnexy9">
+      <w:hyperlink w:history="1" r:id="rIdgprciwkakufwszh9zsvmr">
         <w:r>
           <w:rPr>
             <w:color w:val="0563C1"/>
@@ -14678,7 +14678,7 @@
       <w:r>
         <w:t xml:space="preserve">Edwards, David N. </w:t>
       </w:r>
-      <w:hyperlink w:history="1" r:id="rIdqljkp4c23aiaobju50rvz">
+      <w:hyperlink w:history="1" r:id="rIdok5vysgnchc838ntqun3b">
         <w:r>
           <w:rPr>
             <w:color w:val="0563C1"/>
@@ -14706,7 +14706,7 @@
       <w:r>
         <w:t xml:space="preserve">Pikirayi, Innocent. </w:t>
       </w:r>
-      <w:hyperlink w:history="1" r:id="rIdn5shqmligsntlxwm_xhkf">
+      <w:hyperlink w:history="1" r:id="rIdv3o1irtq4tqdjz-bqb2dv">
         <w:r>
           <w:rPr>
             <w:color w:val="0563C1"/>
@@ -14734,7 +14734,7 @@
       <w:r>
         <w:t xml:space="preserve">Hicks, Dan. </w:t>
       </w:r>
-      <w:hyperlink w:history="1" r:id="rIdaftpoocmxsk7u7u6gukev">
+      <w:hyperlink w:history="1" r:id="rIdhxpticcnshj6wem3w5edb">
         <w:r>
           <w:rPr>
             <w:color w:val="0563C1"/>
@@ -14782,7 +14782,7 @@
       <w:r>
         <w:t xml:space="preserve">Thornton, John K. </w:t>
       </w:r>
-      <w:hyperlink w:history="1" r:id="rIdi1aygqx8lspx0bmken_qg">
+      <w:hyperlink w:history="1" r:id="rIdfbllvxdxmzram2lch-8ff">
         <w:r>
           <w:rPr>
             <w:color w:val="0563C1"/>
@@ -14810,7 +14810,7 @@
       <w:r>
         <w:t xml:space="preserve">McCaskie, T. C. </w:t>
       </w:r>
-      <w:hyperlink w:history="1" r:id="rIdjw5il2yp4jlfvwqgzpyg0">
+      <w:hyperlink w:history="1" r:id="rIdc7mdd4bndr1vfcuia14ns">
         <w:r>
           <w:rPr>
             <w:color w:val="0563C1"/>
@@ -14838,7 +14838,7 @@
       <w:r>
         <w:t xml:space="preserve">Hochschild, Adam. </w:t>
       </w:r>
-      <w:hyperlink w:history="1" r:id="rIdoxwt0qjtmk4ewfft8c8l2">
+      <w:hyperlink w:history="1" r:id="rIderscdlc-z16ylufhwzcrm">
         <w:r>
           <w:rPr>
             <w:color w:val="0563C1"/>
@@ -14882,7 +14882,7 @@
       <w:r>
         <w:t xml:space="preserve">Kara, Siddharth. </w:t>
       </w:r>
-      <w:hyperlink w:history="1" r:id="rIdvandt2dx88jlzm5vglnum">
+      <w:hyperlink w:history="1" r:id="rIdbft6xosrldle3hwc_j-re">
         <w:r>
           <w:rPr>
             <w:color w:val="0563C1"/>
@@ -14930,7 +14930,7 @@
       <w:r>
         <w:t xml:space="preserve">Mann, Charles C. </w:t>
       </w:r>
-      <w:hyperlink w:history="1" r:id="rIdsagctynmzjpjxprq8hfrg">
+      <w:hyperlink w:history="1" r:id="rIdwfhw3om3jmq4gn5tx3osa">
         <w:r>
           <w:rPr>
             <w:color w:val="0563C1"/>
@@ -14958,7 +14958,7 @@
       <w:r>
         <w:t xml:space="preserve">Matsuoka, Yoshihiro, et al. “</w:t>
       </w:r>
-      <w:hyperlink w:history="1" r:id="rIdpwn43lkq5-bsn2mq1hntp">
+      <w:hyperlink w:history="1" r:id="rIdezul_-4vx9laorslmqn4_">
         <w:r>
           <w:rPr>
             <w:color w:val="0563C1"/>
@@ -14986,7 +14986,7 @@
       <w:r>
         <w:t xml:space="preserve">Shady Solis, Ruth, Jonathan Haas, and Winifred Creamer. “</w:t>
       </w:r>
-      <w:hyperlink w:history="1" r:id="rIde1kc5njuz-gc84ksw1fpo">
+      <w:hyperlink w:history="1" r:id="rIdqtospcyhdmwoqcc9nt-8i">
         <w:r>
           <w:rPr>
             <w:color w:val="0563C1"/>
@@ -15014,7 +15014,7 @@
       <w:r>
         <w:t xml:space="preserve">Urton, Gary. </w:t>
       </w:r>
-      <w:hyperlink w:history="1" r:id="rIdzoct-ath0bm1elhee84ly">
+      <w:hyperlink w:history="1" r:id="rIdrkfkqp0ojhktvtvazpbam">
         <w:r>
           <w:rPr>
             <w:color w:val="0563C1"/>
@@ -15042,7 +15042,7 @@
       <w:r>
         <w:t xml:space="preserve">Denevan, William M., ed. </w:t>
       </w:r>
-      <w:hyperlink w:history="1" r:id="rIdxgh8wfjpwqljm9ohjc0zn">
+      <w:hyperlink w:history="1" r:id="rIdo6hdbxkbsqizf9fdi9a5n">
         <w:r>
           <w:rPr>
             <w:color w:val="0563C1"/>
@@ -15070,7 +15070,7 @@
       <w:r>
         <w:t xml:space="preserve">Henige, David. </w:t>
       </w:r>
-      <w:hyperlink w:history="1" r:id="rIdu91ymmlpc75y4duxihpmy">
+      <w:hyperlink w:history="1" r:id="rIdbgugvsagkhjg3brgi2zaf">
         <w:r>
           <w:rPr>
             <w:color w:val="0563C1"/>
@@ -15098,7 +15098,7 @@
       <w:r>
         <w:t xml:space="preserve">Koch, Alexander, Chris Brierley, Mark M. Maslin, and Simon L. Lewis. “</w:t>
       </w:r>
-      <w:hyperlink w:history="1" r:id="rIdkd_c11dh1gtirt2m44v3g">
+      <w:hyperlink w:history="1" r:id="rIdbftbd2nw8wysu7cblyrvp">
         <w:r>
           <w:rPr>
             <w:color w:val="0563C1"/>
@@ -15126,7 +15126,7 @@
       <w:r>
         <w:t xml:space="preserve">Ioannidis, Alexander G., et al. “</w:t>
       </w:r>
-      <w:hyperlink w:history="1" r:id="rIdenvkgyysisluljv_p2rih">
+      <w:hyperlink w:history="1" r:id="rIddfdxa1atcpicbo2gorx0x">
         <w:r>
           <w:rPr>
             <w:color w:val="0563C1"/>
@@ -15154,7 +15154,7 @@
       <w:r>
         <w:t xml:space="preserve">Pauketat, Timothy R. </w:t>
       </w:r>
-      <w:hyperlink w:history="1" r:id="rIda3fzujaygc_i5oy-jwyfr">
+      <w:hyperlink w:history="1" r:id="rId4vm1l0ex-ouyj2zxcn4kn">
         <w:r>
           <w:rPr>
             <w:color w:val="0563C1"/>
@@ -15182,7 +15182,7 @@
       <w:r>
         <w:t xml:space="preserve">Dobyns, Henry F. “</w:t>
       </w:r>
-      <w:hyperlink w:history="1" r:id="rIdopdt3uy9knt6vvjmi2mkm">
+      <w:hyperlink w:history="1" r:id="rIdjkcic_5b_f_sjknkqe5cs">
         <w:r>
           <w:rPr>
             <w:color w:val="0563C1"/>
@@ -15243,7 +15243,7 @@
         </w:rPr>
         <w:t xml:space="preserve">The voyages database behind those numbers. </w:t>
       </w:r>
-      <w:hyperlink w:history="1" r:id="rIdhr_w-rkku93vi6bxcswkm">
+      <w:hyperlink w:history="1" r:id="rId9shwsmbzwlduthftcxa5g">
         <w:r>
           <w:rPr>
             <w:color w:val="0563C1"/>
@@ -15271,7 +15271,7 @@
       <w:r>
         <w:t xml:space="preserve">Equiano, Olaudah. </w:t>
       </w:r>
-      <w:hyperlink w:history="1" r:id="rId91tnapigfrminhgrjf-sc">
+      <w:hyperlink w:history="1" r:id="rIdmor-leqiqxgo0awqxlsfj">
         <w:r>
           <w:rPr>
             <w:color w:val="0563C1"/>
@@ -15299,7 +15299,7 @@
       <w:r>
         <w:t xml:space="preserve">Carretta, Vincent. </w:t>
       </w:r>
-      <w:hyperlink w:history="1" r:id="rIdzwjjrqciodfhkeex5spna">
+      <w:hyperlink w:history="1" r:id="rIdg424byrrpi-ydcnpfblw-">
         <w:r>
           <w:rPr>
             <w:color w:val="0563C1"/>
@@ -15327,7 +15327,7 @@
       <w:r>
         <w:t xml:space="preserve">Hurston, Zora Neale. </w:t>
       </w:r>
-      <w:hyperlink w:history="1" r:id="rId1mdha2detv7qjod2ywr8d">
+      <w:hyperlink w:history="1" r:id="rIdv2jyehkv8y6nd8ihkifyr">
         <w:r>
           <w:rPr>
             <w:color w:val="0563C1"/>
@@ -15355,7 +15355,7 @@
       <w:r>
         <w:t xml:space="preserve">Diouf, Sylviane A. </w:t>
       </w:r>
-      <w:hyperlink w:history="1" r:id="rIdqs0x2qo1p2jpe9naipwhu">
+      <w:hyperlink w:history="1" r:id="rIdrjw-6jwd2sceu3zxx45pt">
         <w:r>
           <w:rPr>
             <w:color w:val="0563C1"/>
@@ -15383,7 +15383,7 @@
       <w:r>
         <w:t xml:space="preserve">Livi Bacci, Massimo. </w:t>
       </w:r>
-      <w:hyperlink w:history="1" r:id="rId19oukzk21f67ye9khu0vc">
+      <w:hyperlink w:history="1" r:id="rIdja67jh5thtducksias_5l">
         <w:r>
           <w:rPr>
             <w:color w:val="0563C1"/>
@@ -15411,7 +15411,7 @@
       <w:r>
         <w:t xml:space="preserve">Reséndez, Andrés. </w:t>
       </w:r>
-      <w:hyperlink w:history="1" r:id="rIdj3fc0ogmajgd97hsj3i76">
+      <w:hyperlink w:history="1" r:id="rId7h1srndqs-hlxmlql2ng1">
         <w:r>
           <w:rPr>
             <w:color w:val="0563C1"/>
@@ -15439,7 +15439,7 @@
       <w:r>
         <w:t xml:space="preserve">Dreyer, Edward L. </w:t>
       </w:r>
-      <w:hyperlink w:history="1" r:id="rIdltov2_bnnury5zyunnjs6">
+      <w:hyperlink w:history="1" r:id="rIdfuao9lifgfi0hoyacmbr-">
         <w:r>
           <w:rPr>
             <w:color w:val="0563C1"/>
@@ -15487,7 +15487,7 @@
       <w:r>
         <w:t xml:space="preserve">Eisenstein, Elizabeth L. </w:t>
       </w:r>
-      <w:hyperlink w:history="1" r:id="rIdsjbtiy225xkzoayrbvbbs">
+      <w:hyperlink w:history="1" r:id="rIdme6ekpyilmnzmwzhk1zhp">
         <w:r>
           <w:rPr>
             <w:color w:val="0563C1"/>
@@ -15515,7 +15515,7 @@
       <w:r>
         <w:t xml:space="preserve">Allen, Robert C. </w:t>
       </w:r>
-      <w:hyperlink w:history="1" r:id="rIdtsiaqvjylco5nmi8l152x">
+      <w:hyperlink w:history="1" r:id="rIdpacvhhpcolasbgn8cope4">
         <w:r>
           <w:rPr>
             <w:color w:val="0563C1"/>
@@ -15543,7 +15543,7 @@
       <w:r>
         <w:t xml:space="preserve">Humphries, Jane. </w:t>
       </w:r>
-      <w:hyperlink w:history="1" r:id="rIdpannconnedqa-5rmgyh8h">
+      <w:hyperlink w:history="1" r:id="rId2v6ph87megxmfwr3i07v_">
         <w:r>
           <w:rPr>
             <w:color w:val="0563C1"/>
@@ -15571,7 +15571,7 @@
       <w:r>
         <w:t xml:space="preserve">Pomeranz, Kenneth. </w:t>
       </w:r>
-      <w:hyperlink w:history="1" r:id="rIdfsf2h1klvyvwvpg6bu39i">
+      <w:hyperlink w:history="1" r:id="rIddvgzgt1c6vpjmuuk0itoz">
         <w:r>
           <w:rPr>
             <w:color w:val="0563C1"/>
@@ -15599,7 +15599,7 @@
       <w:r>
         <w:t xml:space="preserve">Bell, Michelle L., and Devra Lee Davis. “</w:t>
       </w:r>
-      <w:hyperlink w:history="1" r:id="rIdyv2vcsfbruglwmaumhsf3">
+      <w:hyperlink w:history="1" r:id="rIdvdolkca8tpeuv1klthi8i">
         <w:r>
           <w:rPr>
             <w:color w:val="0563C1"/>
@@ -15647,7 +15647,7 @@
       <w:r>
         <w:t xml:space="preserve">Hacker, J. David. “</w:t>
       </w:r>
-      <w:hyperlink w:history="1" r:id="rId1kqt84zsbsgcmuhqkyb2d">
+      <w:hyperlink w:history="1" r:id="rIdgc1n2aitvgs4ubciabspa">
         <w:r>
           <w:rPr>
             <w:color w:val="0563C1"/>
@@ -15675,7 +15675,7 @@
       <w:r>
         <w:t xml:space="preserve">Foner, Eric. </w:t>
       </w:r>
-      <w:hyperlink w:history="1" r:id="rIdlnltxafp0tn57wy6mxt4r">
+      <w:hyperlink w:history="1" r:id="rIdxpl5qrwkpmgucuhxb4usz">
         <w:r>
           <w:rPr>
             <w:color w:val="0563C1"/>
@@ -15703,7 +15703,7 @@
       <w:r>
         <w:t xml:space="preserve">Saunt, Claudio. </w:t>
       </w:r>
-      <w:hyperlink w:history="1" r:id="rId2nk4zdkgxigourodlhtzk">
+      <w:hyperlink w:history="1" r:id="rIdjmg5yjazwyoa2xvkpzs_w">
         <w:r>
           <w:rPr>
             <w:color w:val="0563C1"/>
@@ -15731,7 +15731,7 @@
       <w:r>
         <w:t xml:space="preserve">Dubois, Laurent. </w:t>
       </w:r>
-      <w:hyperlink w:history="1" r:id="rIdvgksavgwspqhdnxcnxrru">
+      <w:hyperlink w:history="1" r:id="rIdlabpytmzkptjiukg2t-_9">
         <w:r>
           <w:rPr>
             <w:color w:val="0563C1"/>
@@ -15759,7 +15759,7 @@
       <w:r>
         <w:t xml:space="preserve">Dolin, Eric Jay. </w:t>
       </w:r>
-      <w:hyperlink w:history="1" r:id="rIdjkl6p4imbpn9ya14tbgz-">
+      <w:hyperlink w:history="1" r:id="rIdzbiqhr3egrucetohoi909">
         <w:r>
           <w:rPr>
             <w:color w:val="0563C1"/>
@@ -15787,7 +15787,7 @@
       <w:r>
         <w:t xml:space="preserve">Horn, James. </w:t>
       </w:r>
-      <w:hyperlink w:history="1" r:id="rIdktxkdiojekktuqhfa0gxo">
+      <w:hyperlink w:history="1" r:id="rIdk6i_l4mpl8lfl2h1glcrt">
         <w:r>
           <w:rPr>
             <w:color w:val="0563C1"/>
@@ -15815,7 +15815,7 @@
       <w:r>
         <w:t xml:space="preserve">Wilentz, Sean. </w:t>
       </w:r>
-      <w:hyperlink w:history="1" r:id="rIdkxattclphwaznzo_xwiiq">
+      <w:hyperlink w:history="1" r:id="rIda9lu9apercmeuizbj6fxg">
         <w:r>
           <w:rPr>
             <w:color w:val="0563C1"/>
@@ -15863,7 +15863,7 @@
       <w:r>
         <w:t xml:space="preserve">Equal Justice Initiative. </w:t>
       </w:r>
-      <w:hyperlink w:history="1" r:id="rIdtkon4z4gxivlynzcpqj2c">
+      <w:hyperlink w:history="1" r:id="rIdmnil7biu4fvj5eqvblags">
         <w:r>
           <w:rPr>
             <w:color w:val="0563C1"/>
@@ -15907,7 +15907,7 @@
       <w:r>
         <w:t xml:space="preserve">Robinson, Greg. </w:t>
       </w:r>
-      <w:hyperlink w:history="1" r:id="rIdpv2hat4fappywhyzkqjij">
+      <w:hyperlink w:history="1" r:id="rId30krvkos4lcdwxyz-a5by">
         <w:r>
           <w:rPr>
             <w:color w:val="0563C1"/>
@@ -15935,7 +15935,7 @@
       <w:r>
         <w:t xml:space="preserve">Blinder, Alan S. </w:t>
       </w:r>
-      <w:hyperlink w:history="1" r:id="rId4frlcmtbwdwivlgj5u51o">
+      <w:hyperlink w:history="1" r:id="rIdt2glr8bstear098j6qzn1">
         <w:r>
           <w:rPr>
             <w:color w:val="0563C1"/>
@@ -15983,7 +15983,7 @@
       <w:r>
         <w:t xml:space="preserve">Butler, Jon. </w:t>
       </w:r>
-      <w:hyperlink w:history="1" r:id="rIdjjohhpt0uzyf0dsy0mlwk">
+      <w:hyperlink w:history="1" r:id="rIdwq1soq5wvdewo0uynzwhm">
         <w:r>
           <w:rPr>
             <w:color w:val="0563C1"/>
@@ -16011,7 +16011,7 @@
       <w:r>
         <w:t xml:space="preserve">Hatch, Nathan O. </w:t>
       </w:r>
-      <w:hyperlink w:history="1" r:id="rIda4und6hm2uiasmand17nz">
+      <w:hyperlink w:history="1" r:id="rIdc6pefpryhfhjuwoxqvyeq">
         <w:r>
           <w:rPr>
             <w:color w:val="0563C1"/>
@@ -16039,7 +16039,7 @@
       <w:r>
         <w:t xml:space="preserve">Bushman, Richard Lyman. </w:t>
       </w:r>
-      <w:hyperlink w:history="1" r:id="rIdn_kcbv6qih8nafyynkenh">
+      <w:hyperlink w:history="1" r:id="rIdlzuohmsplkclwinccoxwa">
         <w:r>
           <w:rPr>
             <w:color w:val="0563C1"/>
@@ -16067,7 +16067,7 @@
       <w:r>
         <w:t xml:space="preserve">Kraybill, Donald B., Karen M. Johnson-Weiner, and Steven M. Nolt. </w:t>
       </w:r>
-      <w:hyperlink w:history="1" r:id="rIdscxvvvlkybo7yxfgrwtif">
+      <w:hyperlink w:history="1" r:id="rId6gtberj0rf-p_80h8oekh">
         <w:r>
           <w:rPr>
             <w:color w:val="0563C1"/>
@@ -16095,7 +16095,7 @@
       <w:r>
         <w:t xml:space="preserve">Moore, Rebecca. </w:t>
       </w:r>
-      <w:hyperlink w:history="1" r:id="rIdlf2ykbyyeoobqvdvcslmp">
+      <w:hyperlink w:history="1" r:id="rIdkvrxmtfwxwhnmgp7annnj">
         <w:r>
           <w:rPr>
             <w:color w:val="0563C1"/>
@@ -16159,7 +16159,7 @@
       <w:r>
         <w:t xml:space="preserve">Lynch, John. </w:t>
       </w:r>
-      <w:hyperlink w:history="1" r:id="rIdfd8e2a7vwioxqycai2fay">
+      <w:hyperlink w:history="1" r:id="rIdi7hr0q2y1bg-nepot3qje">
         <w:r>
           <w:rPr>
             <w:color w:val="0563C1"/>
@@ -16187,7 +16187,7 @@
       <w:r>
         <w:t xml:space="preserve">Dubois, Laurent. </w:t>
       </w:r>
-      <w:hyperlink w:history="1" r:id="rId5naxtfxfrfeci0vbo7dpg">
+      <w:hyperlink w:history="1" r:id="rIdcc5xglxoj-0y52gy0thlf">
         <w:r>
           <w:rPr>
             <w:color w:val="0563C1"/>
@@ -16215,7 +16215,7 @@
       <w:r>
         <w:t xml:space="preserve">Conrad, Robert Edgar. </w:t>
       </w:r>
-      <w:hyperlink w:history="1" r:id="rIdzxeiz4ooe4tdcz3k3upwp">
+      <w:hyperlink w:history="1" r:id="rId-ra0dkit6lpjb4drlxzpu">
         <w:r>
           <w:rPr>
             <w:color w:val="0563C1"/>
@@ -16240,7 +16240,7 @@
         </w:rPr>
         <w:t xml:space="preserve">Brazil’s share of the Atlantic slave trade. </w:t>
       </w:r>
-      <w:hyperlink w:history="1" r:id="rIdsc_xh5gjkeyn_2jcxd-a2">
+      <w:hyperlink w:history="1" r:id="rIditphh_n0okdcwcuknzxge">
         <w:r>
           <w:rPr>
             <w:color w:val="0563C1"/>
@@ -16268,7 +16268,7 @@
       <w:r>
         <w:t xml:space="preserve">Smith, Peter H. </w:t>
       </w:r>
-      <w:hyperlink w:history="1" r:id="rIdscs_3l6y_lnzfptfvbv4t">
+      <w:hyperlink w:history="1" r:id="rId30xqdh6mmn7wywrjnum1o">
         <w:r>
           <w:rPr>
             <w:color w:val="0563C1"/>
@@ -16296,7 +16296,7 @@
       <w:r>
         <w:t xml:space="preserve">Schlesinger, Stephen, and Stephen Kinzer. </w:t>
       </w:r>
-      <w:hyperlink w:history="1" r:id="rIdy729nixv1qrkp9ixy3qcx">
+      <w:hyperlink w:history="1" r:id="rIdsxl5o63uli4fhq81semtb">
         <w:r>
           <w:rPr>
             <w:color w:val="0563C1"/>
@@ -16324,7 +16324,7 @@
       <w:r>
         <w:t xml:space="preserve">Slater, Candace. </w:t>
       </w:r>
-      <w:hyperlink w:history="1" r:id="rIdy8gs6gmy0-xcnggpzf1hy">
+      <w:hyperlink w:history="1" r:id="rIdohtlyfk7ak9ec70qcbcnx">
         <w:r>
           <w:rPr>
             <w:color w:val="0563C1"/>
@@ -16352,7 +16352,7 @@
       <w:r>
         <w:t xml:space="preserve">Taylor, Barbara L., et al. “</w:t>
       </w:r>
-      <w:hyperlink w:history="1" r:id="rIdzw540zfxetbg82mzbs6s2">
+      <w:hyperlink w:history="1" r:id="rId_qcrmcwvbawmqptml0h3g">
         <w:r>
           <w:rPr>
             <w:color w:val="0563C1"/>
@@ -16380,7 +16380,7 @@
       <w:r>
         <w:t xml:space="preserve">NOAA Fisheries. “</w:t>
       </w:r>
-      <w:hyperlink w:history="1" r:id="rIdjr846dhofkpjhlheerdxz">
+      <w:hyperlink w:history="1" r:id="rIdrpxwa1er_dehawwmvpkhs">
         <w:r>
           <w:rPr>
             <w:color w:val="0563C1"/>
@@ -16408,7 +16408,7 @@
       <w:r>
         <w:t xml:space="preserve">Skidmore, Thomas E. </w:t>
       </w:r>
-      <w:hyperlink w:history="1" r:id="rId-7urx58hek4aboyjk1kdu">
+      <w:hyperlink w:history="1" r:id="rIdcc6gwxp11c8e-eshrwpey">
         <w:r>
           <w:rPr>
             <w:color w:val="0563C1"/>
@@ -16436,7 +16436,7 @@
       <w:r>
         <w:t xml:space="preserve">Comisión Nacional sobre la Desaparición de Personas. </w:t>
       </w:r>
-      <w:hyperlink w:history="1" r:id="rIdgtmbdlkg7tj1vftdr-v8o">
+      <w:hyperlink w:history="1" r:id="rIdqko7zg1tjrooxyac3oxbt">
         <w:r>
           <w:rPr>
             <w:color w:val="0563C1"/>
@@ -16464,7 +16464,7 @@
       <w:r>
         <w:t xml:space="preserve">Nino, Carlos Santiago. </w:t>
       </w:r>
-      <w:hyperlink w:history="1" r:id="rIdyeh2_9tncsnejgajrjip-">
+      <w:hyperlink w:history="1" r:id="rIdq6v_rowvmrdhnyfafpgb0">
         <w:r>
           <w:rPr>
             <w:color w:val="0563C1"/>
@@ -16492,7 +16492,7 @@
       <w:r>
         <w:t xml:space="preserve">Bouvard, Marguerite Guzman. </w:t>
       </w:r>
-      <w:hyperlink w:history="1" r:id="rIdzzyzmlgsfbaaezxmnkjqp">
+      <w:hyperlink w:history="1" r:id="rIdi-moszrwhqn85z2wqe-he">
         <w:r>
           <w:rPr>
             <w:color w:val="0563C1"/>
@@ -16520,7 +16520,7 @@
       <w:r>
         <w:t xml:space="preserve">Kornbluh, Peter. </w:t>
       </w:r>
-      <w:hyperlink w:history="1" r:id="rId0o1eje2xj3thghlml3bkr">
+      <w:hyperlink w:history="1" r:id="rId5a9hcvcvt24kwm8xp7clj">
         <w:r>
           <w:rPr>
             <w:color w:val="0563C1"/>
@@ -16548,7 +16548,7 @@
       <w:r>
         <w:t xml:space="preserve">Jara, Joan. </w:t>
       </w:r>
-      <w:hyperlink w:history="1" r:id="rIdujqrzektqpj02z1-sajjt">
+      <w:hyperlink w:history="1" r:id="rIdtyhr8875vkm_pd3j7-exu">
         <w:r>
           <w:rPr>
             <w:color w:val="0563C1"/>
@@ -16576,7 +16576,7 @@
       <w:r>
         <w:t xml:space="preserve">LeoGrande, William M., and Peter Kornbluh. </w:t>
       </w:r>
-      <w:hyperlink w:history="1" r:id="rIdijzyxm7_vgz-ug53qsjb9">
+      <w:hyperlink w:history="1" r:id="rIddc8ewfo-ems4ju0qaggs1">
         <w:r>
           <w:rPr>
             <w:color w:val="0563C1"/>
@@ -16636,7 +16636,7 @@
       <w:r>
         <w:t xml:space="preserve">Secretaría de Gobernación (Mexico). “</w:t>
       </w:r>
-      <w:hyperlink w:history="1" r:id="rIdpfudrec3g2p_xzr8v6lhl">
+      <w:hyperlink w:history="1" r:id="rIdfratma9bfwuzzznlbmcay">
         <w:r>
           <w:rPr>
             <w:color w:val="0563C1"/>
@@ -16684,7 +16684,7 @@
       <w:r>
         <w:t xml:space="preserve">Finkel, Caroline. </w:t>
       </w:r>
-      <w:hyperlink w:history="1" r:id="rIdrsfq33di71lif_agud92y">
+      <w:hyperlink w:history="1" r:id="rId_7xdiiim5uo-bj8jbh8gb">
         <w:r>
           <w:rPr>
             <w:color w:val="0563C1"/>
@@ -16712,7 +16712,7 @@
       <w:r>
         <w:t xml:space="preserve">Crowley, Roger. </w:t>
       </w:r>
-      <w:hyperlink w:history="1" r:id="rIdaf7uda73qilajyifx6aac">
+      <w:hyperlink w:history="1" r:id="rIdg0p1mbhsmpd2zpczbpcj7">
         <w:r>
           <w:rPr>
             <w:color w:val="0563C1"/>
@@ -16740,7 +16740,7 @@
       <w:r>
         <w:t xml:space="preserve">Barkey, Karen. </w:t>
       </w:r>
-      <w:hyperlink w:history="1" r:id="rId-kmq5wyewghzs-0zbein_">
+      <w:hyperlink w:history="1" r:id="rIdq8__yeiogytceq7ieqeg3">
         <w:r>
           <w:rPr>
             <w:color w:val="0563C1"/>
@@ -16768,7 +16768,7 @@
       <w:r>
         <w:t xml:space="preserve">Mazower, Mark. </w:t>
       </w:r>
-      <w:hyperlink w:history="1" r:id="rIdqukimzf6nnb82xylhmhqn">
+      <w:hyperlink w:history="1" r:id="rIddplaeyzajr1wcfvvom-ap">
         <w:r>
           <w:rPr>
             <w:color w:val="0563C1"/>
@@ -16796,7 +16796,7 @@
       <w:r>
         <w:t xml:space="preserve">Suny, Ronald Grigor. “</w:t>
       </w:r>
-      <w:hyperlink w:history="1" r:id="rIdvqubqcwc5nr9lo7g1vpie">
+      <w:hyperlink w:history="1" r:id="rIdtb-lq4lygygtqqkmynyiw">
         <w:r>
           <w:rPr>
             <w:color w:val="0563C1"/>
@@ -16824,7 +16824,7 @@
       <w:r>
         <w:t xml:space="preserve">Power, Samantha. “</w:t>
       </w:r>
-      <w:hyperlink w:history="1" r:id="rIdkioxdfzt3-q3dudwlvism">
+      <w:hyperlink w:history="1" r:id="rIdh19ogal9wesa_u7j7brkh">
         <w:r>
           <w:rPr>
             <w:color w:val="0563C1"/>
@@ -16852,7 +16852,7 @@
       <w:r>
         <w:t xml:space="preserve">Hirschon, Renée, ed. </w:t>
       </w:r>
-      <w:hyperlink w:history="1" r:id="rIdnorj1mzdq-av4-lrfwg5s">
+      <w:hyperlink w:history="1" r:id="rIdqirh_fdjkuzgdk3nkfmup">
         <w:r>
           <w:rPr>
             <w:color w:val="0563C1"/>
@@ -16880,7 +16880,7 @@
       <w:r>
         <w:t xml:space="preserve">Rogan, Eugene. </w:t>
       </w:r>
-      <w:hyperlink w:history="1" r:id="rIdjbufsbjexdkk4ujs4yfw4">
+      <w:hyperlink w:history="1" r:id="rIdxvbhl3f9jlvnuzlhptxd-">
         <w:r>
           <w:rPr>
             <w:color w:val="0563C1"/>
@@ -16908,7 +16908,7 @@
       <w:r>
         <w:t xml:space="preserve">Barr, James. </w:t>
       </w:r>
-      <w:hyperlink w:history="1" r:id="rId7_ohp9tshhotls92pepyt">
+      <w:hyperlink w:history="1" r:id="rIduo_hgygm9mkwis3xilpgh">
         <w:r>
           <w:rPr>
             <w:color w:val="0563C1"/>
@@ -16936,7 +16936,7 @@
       <w:r>
         <w:t xml:space="preserve">McDowall, David. </w:t>
       </w:r>
-      <w:hyperlink w:history="1" r:id="rIdrhu7o-uaz5h863c5bqw_k">
+      <w:hyperlink w:history="1" r:id="rIdytykldwcuhh8nytkbu1rw">
         <w:r>
           <w:rPr>
             <w:color w:val="0563C1"/>
@@ -16964,7 +16964,7 @@
       <w:r>
         <w:t xml:space="preserve">Abrahamian, Ervand. </w:t>
       </w:r>
-      <w:hyperlink w:history="1" r:id="rIdgvb_laupxq2t1wxouky4l">
+      <w:hyperlink w:history="1" r:id="rIdpqnnnlrwkm74bvws-lmqr">
         <w:r>
           <w:rPr>
             <w:color w:val="0563C1"/>
@@ -16992,7 +16992,7 @@
       <w:r>
         <w:t xml:space="preserve">Razoux, Pierre. </w:t>
       </w:r>
-      <w:hyperlink w:history="1" r:id="rIdwdjmlfjn7vxg7kmykgmdi">
+      <w:hyperlink w:history="1" r:id="rId4ikhsesrzptnrplslpuuk">
         <w:r>
           <w:rPr>
             <w:color w:val="0563C1"/>
@@ -17040,7 +17040,7 @@
       <w:r>
         <w:t xml:space="preserve">Clark, Christopher. </w:t>
       </w:r>
-      <w:hyperlink w:history="1" r:id="rIdio0lzfin-hvmcgxequp-s">
+      <w:hyperlink w:history="1" r:id="rIdxdc1lqtriqm0diwmluqnp">
         <w:r>
           <w:rPr>
             <w:color w:val="0563C1"/>
@@ -17068,7 +17068,7 @@
       <w:r>
         <w:t xml:space="preserve">Strachan, Hew. </w:t>
       </w:r>
-      <w:hyperlink w:history="1" r:id="rIdptuq24yuhvc8nk3pml6lc">
+      <w:hyperlink w:history="1" r:id="rIdbsrr6mlmyebphwszsosti">
         <w:r>
           <w:rPr>
             <w:color w:val="0563C1"/>
@@ -17112,7 +17112,7 @@
       <w:r>
         <w:t xml:space="preserve">Weintraub, Stanley. </w:t>
       </w:r>
-      <w:hyperlink w:history="1" r:id="rIdgeowvbx7dcti6ydcshmjg">
+      <w:hyperlink w:history="1" r:id="rId8kjd6llsmebxjzqjxsair">
         <w:r>
           <w:rPr>
             <w:color w:val="0563C1"/>
@@ -17140,7 +17140,7 @@
       <w:r>
         <w:t xml:space="preserve">Johnson, Niall P. A. S., and Juergen Mueller. “</w:t>
       </w:r>
-      <w:hyperlink w:history="1" r:id="rIdntm0fbybvscouwve7os_y">
+      <w:hyperlink w:history="1" r:id="rIdyslo3g6cder4k5cjtqpv2">
         <w:r>
           <w:rPr>
             <w:color w:val="0563C1"/>
@@ -17168,7 +17168,7 @@
       <w:r>
         <w:t xml:space="preserve">Spreeuwenberg, Peter, et al. “</w:t>
       </w:r>
-      <w:hyperlink w:history="1" r:id="rId5gakb1ewyismdbskvublp">
+      <w:hyperlink w:history="1" r:id="rIdgtsqdwkqcmjajxvkbhrrr">
         <w:r>
           <w:rPr>
             <w:color w:val="0563C1"/>
@@ -17196,7 +17196,7 @@
       <w:r>
         <w:t xml:space="preserve">Keynes, John Maynard. </w:t>
       </w:r>
-      <w:hyperlink w:history="1" r:id="rIdr2p-27obqmd9dayei7euf">
+      <w:hyperlink w:history="1" r:id="rId-ubkc3dxcw3aq6gcvvido">
         <w:r>
           <w:rPr>
             <w:color w:val="0563C1"/>
@@ -17244,7 +17244,7 @@
       <w:r>
         <w:t xml:space="preserve">Evans, Richard J. </w:t>
       </w:r>
-      <w:hyperlink w:history="1" r:id="rId8o-8ut4wj_hbjb_dhcg7h">
+      <w:hyperlink w:history="1" r:id="rIdm7nq8qvn1pza1bi1u1uys">
         <w:r>
           <w:rPr>
             <w:color w:val="0563C1"/>
@@ -17272,7 +17272,7 @@
       <w:r>
         <w:t xml:space="preserve">Hilberg, Raul. </w:t>
       </w:r>
-      <w:hyperlink w:history="1" r:id="rId8a33todpaojd7_9yjb97q">
+      <w:hyperlink w:history="1" r:id="rIdglog1y0fs0renyhs3h2ip">
         <w:r>
           <w:rPr>
             <w:color w:val="0563C1"/>
@@ -17300,7 +17300,7 @@
       <w:r>
         <w:t xml:space="preserve">Kiernan, Ben. </w:t>
       </w:r>
-      <w:hyperlink w:history="1" r:id="rIdhuuvnmxn1atpodk3moodz">
+      <w:hyperlink w:history="1" r:id="rIdfj5nmdxfd0jdkffkeyf_j">
         <w:r>
           <w:rPr>
             <w:color w:val="0563C1"/>
@@ -17328,7 +17328,7 @@
       <w:r>
         <w:t xml:space="preserve">Levitsky, Steven, and Daniel Ziblatt. </w:t>
       </w:r>
-      <w:hyperlink w:history="1" r:id="rId_9dvb3qf4iovxevnbebhd">
+      <w:hyperlink w:history="1" r:id="rId3cw6glldozka4hygxgvdg">
         <w:r>
           <w:rPr>
             <w:color w:val="0563C1"/>
@@ -17356,7 +17356,7 @@
       <w:r>
         <w:t xml:space="preserve">Neiman, Susan. </w:t>
       </w:r>
-      <w:hyperlink w:history="1" r:id="rId3q1-lu2wi6cfeqvj_pl4f">
+      <w:hyperlink w:history="1" r:id="rId7l5qsgn2evqd2jwhhy6dd">
         <w:r>
           <w:rPr>
             <w:color w:val="0563C1"/>
@@ -17400,7 +17400,7 @@
       <w:r>
         <w:t xml:space="preserve">Broberg, Gunnar, and Nils Roll-Hansen, eds. </w:t>
       </w:r>
-      <w:hyperlink w:history="1" r:id="rId8rsqqa2nxwapvvh9o5nol">
+      <w:hyperlink w:history="1" r:id="rIdfmnp_45wmumqvrxm6omli">
         <w:r>
           <w:rPr>
             <w:color w:val="0563C1"/>
@@ -17448,7 +17448,7 @@
       <w:r>
         <w:t xml:space="preserve">Jansen, Marius B. </w:t>
       </w:r>
-      <w:hyperlink w:history="1" r:id="rIduvihn56yut9bcv3yc4tx9">
+      <w:hyperlink w:history="1" r:id="rId9rwcerovjlttioecx3w0d">
         <w:r>
           <w:rPr>
             <w:color w:val="0563C1"/>
@@ -17476,7 +17476,7 @@
       <w:r>
         <w:t xml:space="preserve">Fogel, Joshua A., ed. </w:t>
       </w:r>
-      <w:hyperlink w:history="1" r:id="rId9ho2tpfywsy9agcwzrxxf">
+      <w:hyperlink w:history="1" r:id="rIdv4wtbdbndh3hybcm0xdbu">
         <w:r>
           <w:rPr>
             <w:color w:val="0563C1"/>
@@ -17504,7 +17504,7 @@
       <w:r>
         <w:t xml:space="preserve">Ohnuki-Tierney, Emiko. </w:t>
       </w:r>
-      <w:hyperlink w:history="1" r:id="rIdz6wmqzz_w3vs5aftbzfgy">
+      <w:hyperlink w:history="1" r:id="rIdi57ifybzrih7mfgpxmxru">
         <w:r>
           <w:rPr>
             <w:color w:val="0563C1"/>
@@ -17532,7 +17532,7 @@
       <w:r>
         <w:t xml:space="preserve">Dower, John W. </w:t>
       </w:r>
-      <w:hyperlink w:history="1" r:id="rIdvc-adx9b_3xjlajhlqo29">
+      <w:hyperlink w:history="1" r:id="rIdojd-t2yimlxau9dclzh-r">
         <w:r>
           <w:rPr>
             <w:color w:val="0563C1"/>
@@ -17580,7 +17580,7 @@
       <w:r>
         <w:t xml:space="preserve">Duggan, Christopher. </w:t>
       </w:r>
-      <w:hyperlink w:history="1" r:id="rId_pgxws4vo4dz5r3qvecp9">
+      <w:hyperlink w:history="1" r:id="rId0du3igvzvmshnbkjcjgqk">
         <w:r>
           <w:rPr>
             <w:color w:val="0563C1"/>
@@ -17608,7 +17608,7 @@
       <w:r>
         <w:t xml:space="preserve">Bosworth, R. J. B. </w:t>
       </w:r>
-      <w:hyperlink w:history="1" r:id="rIduzfzntqevwcovswr7r2ct">
+      <w:hyperlink w:history="1" r:id="rId3cmoy2unrubpjv0anzeal">
         <w:r>
           <w:rPr>
             <w:color w:val="0563C1"/>
@@ -17636,7 +17636,7 @@
       <w:r>
         <w:t xml:space="preserve">Domenico, Roy Palmer. </w:t>
       </w:r>
-      <w:hyperlink w:history="1" r:id="rIdx5hrsk9pxb1osjzgl8ngw">
+      <w:hyperlink w:history="1" r:id="rIdv3zmyafiq2gmqqslfqljn">
         <w:r>
           <w:rPr>
             <w:color w:val="0563C1"/>
@@ -17684,7 +17684,7 @@
       <w:r>
         <w:t xml:space="preserve">Menocal, María Rosa. </w:t>
       </w:r>
-      <w:hyperlink w:history="1" r:id="rIdpvy1ymyvgbvi5bz2oati1">
+      <w:hyperlink w:history="1" r:id="rIdqqi_r_6-t5qqabfrc5zvm">
         <w:r>
           <w:rPr>
             <w:color w:val="0563C1"/>
@@ -17712,7 +17712,7 @@
       <w:r>
         <w:t xml:space="preserve">Fernández-Morera, Darío. </w:t>
       </w:r>
-      <w:hyperlink w:history="1" r:id="rIdldllunhv3emkervp8qc8d">
+      <w:hyperlink w:history="1" r:id="rIdlv9avjkggh3mz3i6y4mzg">
         <w:r>
           <w:rPr>
             <w:color w:val="0563C1"/>
@@ -17740,7 +17740,7 @@
       <w:r>
         <w:t xml:space="preserve">Kraemer, Joel L. </w:t>
       </w:r>
-      <w:hyperlink w:history="1" r:id="rIdwsjuosijiwj6dzdx6khnb">
+      <w:hyperlink w:history="1" r:id="rIdmy0kifbkl9hp6-proyuwg">
         <w:r>
           <w:rPr>
             <w:color w:val="0563C1"/>
@@ -17768,7 +17768,7 @@
       <w:r>
         <w:t xml:space="preserve">Preston, Paul. </w:t>
       </w:r>
-      <w:hyperlink w:history="1" r:id="rIdtisp_huuzxgnzfzs90xpw">
+      <w:hyperlink w:history="1" r:id="rIdkmbgsp5m05auwtkmrxggc">
         <w:r>
           <w:rPr>
             <w:color w:val="0563C1"/>
@@ -17796,7 +17796,7 @@
       <w:r>
         <w:t xml:space="preserve">Aguilar, Paloma. </w:t>
       </w:r>
-      <w:hyperlink w:history="1" r:id="rIdggsa0rgcnvy7sdjna8ppn">
+      <w:hyperlink w:history="1" r:id="rIdhx4b-rcmsohvs8_-2uj1s">
         <w:r>
           <w:rPr>
             <w:color w:val="0563C1"/>
@@ -17860,7 +17860,7 @@
       <w:r>
         <w:t xml:space="preserve">Applebaum, Anne. </w:t>
       </w:r>
-      <w:hyperlink w:history="1" r:id="rId70vtzt5retaamtqddfwy_">
+      <w:hyperlink w:history="1" r:id="rIdlf-9fftb62_99piqpxtiw">
         <w:r>
           <w:rPr>
             <w:color w:val="0563C1"/>
@@ -17888,7 +17888,7 @@
       <w:r>
         <w:t xml:space="preserve">Applebaum, Anne. </w:t>
       </w:r>
-      <w:hyperlink w:history="1" r:id="rIdhdblbi_mw7qubzes94umh">
+      <w:hyperlink w:history="1" r:id="rIdiqrxatbs514edw7avidqc">
         <w:r>
           <w:rPr>
             <w:color w:val="0563C1"/>
@@ -17916,7 +17916,7 @@
       <w:r>
         <w:t xml:space="preserve">Sanford, George. </w:t>
       </w:r>
-      <w:hyperlink w:history="1" r:id="rIdmg2spo546tzt6g33icm2w">
+      <w:hyperlink w:history="1" r:id="rIdfzetskvzngnfjngxfgpr-">
         <w:r>
           <w:rPr>
             <w:color w:val="0563C1"/>
@@ -17944,7 +17944,7 @@
       <w:r>
         <w:t xml:space="preserve">Plokhy, Serhii. </w:t>
       </w:r>
-      <w:hyperlink w:history="1" r:id="rIdywndo0tcxpxsxfxn79ffh">
+      <w:hyperlink w:history="1" r:id="rIddqmh-yncowgzwoh0z57kt">
         <w:r>
           <w:rPr>
             <w:color w:val="0563C1"/>
@@ -17972,7 +17972,7 @@
       <w:r>
         <w:t xml:space="preserve">Roberts, Geoffrey. </w:t>
       </w:r>
-      <w:hyperlink w:history="1" r:id="rIdr9obcj8mfjugujlaqawgr">
+      <w:hyperlink w:history="1" r:id="rId2zabzgapk8_mhb_3_qjcg">
         <w:r>
           <w:rPr>
             <w:color w:val="0563C1"/>
@@ -18020,7 +18020,7 @@
       <w:r>
         <w:t xml:space="preserve">Dikötter, Frank. </w:t>
       </w:r>
-      <w:hyperlink w:history="1" r:id="rIdqiyttywmjwgn2wjqmbsup">
+      <w:hyperlink w:history="1" r:id="rIdxo5re2shjybdkocsy_jr_">
         <w:r>
           <w:rPr>
             <w:color w:val="0563C1"/>
@@ -18048,7 +18048,7 @@
       <w:r>
         <w:t xml:space="preserve">Yang Jisheng. </w:t>
       </w:r>
-      <w:hyperlink w:history="1" r:id="rIdeyzazsg1gywgrpzmntenr">
+      <w:hyperlink w:history="1" r:id="rIddtwwk2ma8d9pkcxnlthis">
         <w:r>
           <w:rPr>
             <w:color w:val="0563C1"/>
@@ -18076,7 +18076,7 @@
       <w:r>
         <w:t xml:space="preserve">MacFarquhar, Roderick, and Michael Schoenhals. </w:t>
       </w:r>
-      <w:hyperlink w:history="1" r:id="rIdc1xtelsgvnigd6rl3owxj">
+      <w:hyperlink w:history="1" r:id="rId852us5x_whfpbg-bjgpoc">
         <w:r>
           <w:rPr>
             <w:color w:val="0563C1"/>
@@ -18104,7 +18104,7 @@
       <w:r>
         <w:t xml:space="preserve">Jambeck, Jenna R., et al. “</w:t>
       </w:r>
-      <w:hyperlink w:history="1" r:id="rIdjhn-uvz4m0a5vct_tijux">
+      <w:hyperlink w:history="1" r:id="rId6j7vgsotmnxk_qtwaau_m">
         <w:r>
           <w:rPr>
             <w:color w:val="0563C1"/>
@@ -18132,7 +18132,7 @@
       <w:r>
         <w:t xml:space="preserve">Meijer, Lourens J. J., et al. “</w:t>
       </w:r>
-      <w:hyperlink w:history="1" r:id="rIdeulc2pwa7cb4nsuczz1k_">
+      <w:hyperlink w:history="1" r:id="rIdi5lewtc2ddijvwnzcfl9r">
         <w:r>
           <w:rPr>
             <w:color w:val="0563C1"/>
@@ -18160,7 +18160,7 @@
       <w:r>
         <w:t xml:space="preserve">Economy, Elizabeth C. </w:t>
       </w:r>
-      <w:hyperlink w:history="1" r:id="rIddi6svorw-gxg-gt0zlviv">
+      <w:hyperlink w:history="1" r:id="rIdyc-cowcfheop5rpv0p4fh">
         <w:r>
           <w:rPr>
             <w:color w:val="0563C1"/>
@@ -18220,7 +18220,7 @@
       <w:r>
         <w:t xml:space="preserve">McDonell, Stephen. “</w:t>
       </w:r>
-      <w:hyperlink w:history="1" r:id="rIdo8ncobpl0i3c6bcaktplt">
+      <w:hyperlink w:history="1" r:id="rIdyaugdd0ej0vw9nlnufi7a">
         <w:r>
           <w:rPr>
             <w:color w:val="0563C1"/>
@@ -18248,7 +18248,7 @@
       <w:r>
         <w:t xml:space="preserve">Agence France-Presse. “‘Oh, Bother’: </w:t>
       </w:r>
-      <w:hyperlink w:history="1" r:id="rIdiqcz9wxz9f3wpm1lgdrgn">
+      <w:hyperlink w:history="1" r:id="rIdulcm4rzqbc7itiaz0sih3">
         <w:r>
           <w:rPr>
             <w:color w:val="0563C1"/>
@@ -18296,7 +18296,7 @@
       <w:r>
         <w:t xml:space="preserve">Schama, Simon. </w:t>
       </w:r>
-      <w:hyperlink w:history="1" r:id="rIdqc79kfstuzgyxwjh6lbuq">
+      <w:hyperlink w:history="1" r:id="rIdzd-etoca1tlk6ktuermtj">
         <w:r>
           <w:rPr>
             <w:color w:val="0563C1"/>
@@ -18324,7 +18324,7 @@
       <w:r>
         <w:t xml:space="preserve">Finkelstein, Israel, and Neil Asher Silberman. </w:t>
       </w:r>
-      <w:hyperlink w:history="1" r:id="rIdcqgu4yudhoc9ehznt7m1a">
+      <w:hyperlink w:history="1" r:id="rId2o3e1_9o842li9ktnaq_c">
         <w:r>
           <w:rPr>
             <w:color w:val="0563C1"/>
@@ -18352,7 +18352,7 @@
       <w:r>
         <w:t xml:space="preserve">VanderKam, James C. </w:t>
       </w:r>
-      <w:hyperlink w:history="1" r:id="rIdl1ntirbcohmqpnzl2pj-a">
+      <w:hyperlink w:history="1" r:id="rIdjmz1ftxzvdnitgv5jassz">
         <w:r>
           <w:rPr>
             <w:color w:val="0563C1"/>
@@ -18380,7 +18380,7 @@
       <w:r>
         <w:t xml:space="preserve">Magness, Jodi. </w:t>
       </w:r>
-      <w:hyperlink w:history="1" r:id="rIdmjyj3vgc1mm1vcpymturq">
+      <w:hyperlink w:history="1" r:id="rIdsd_mzf2qpfar-kb4p7con">
         <w:r>
           <w:rPr>
             <w:color w:val="0563C1"/>
@@ -18408,7 +18408,7 @@
       <w:r>
         <w:t xml:space="preserve">Morris, Benny. </w:t>
       </w:r>
-      <w:hyperlink w:history="1" r:id="rIdvdku4piaikrliyrjymmic">
+      <w:hyperlink w:history="1" r:id="rId_j2bpautucrelpym00ytd">
         <w:r>
           <w:rPr>
             <w:color w:val="0563C1"/>
@@ -18456,7 +18456,7 @@
       <w:r>
         <w:t xml:space="preserve">Gaddis, John Lewis. </w:t>
       </w:r>
-      <w:hyperlink w:history="1" r:id="rIdh8sven02awg_dtojxhast">
+      <w:hyperlink w:history="1" r:id="rIdpthvthb9_6uip7q7kyiyk">
         <w:r>
           <w:rPr>
             <w:color w:val="0563C1"/>
@@ -18484,7 +18484,7 @@
       <w:r>
         <w:t xml:space="preserve">Savranskaya, Svetlana V. “</w:t>
       </w:r>
-      <w:hyperlink w:history="1" r:id="rIdmhjzexe7g9exbsbmkutm3">
+      <w:hyperlink w:history="1" r:id="rIdr4ye907xwiqbrtj9tjpkl">
         <w:r>
           <w:rPr>
             <w:color w:val="0563C1"/>
@@ -18512,7 +18512,7 @@
       <w:r>
         <w:t xml:space="preserve">Hoffman, David E. </w:t>
       </w:r>
-      <w:hyperlink w:history="1" r:id="rIdb9zv6-ul7vsa8usvts8gz">
+      <w:hyperlink w:history="1" r:id="rIdpwdaps6bsoe61jgzixfwe">
         <w:r>
           <w:rPr>
             <w:color w:val="0563C1"/>
@@ -18540,7 +18540,7 @@
       <w:r>
         <w:t xml:space="preserve">Rhodes, Richard. </w:t>
       </w:r>
-      <w:hyperlink w:history="1" r:id="rIdzrcwycizlglxwh5htwg1o">
+      <w:hyperlink w:history="1" r:id="rIdlf-f2oeoeaiiaww0ie3sq">
         <w:r>
           <w:rPr>
             <w:color w:val="0563C1"/>
@@ -18568,7 +18568,7 @@
       <w:r>
         <w:t xml:space="preserve">Niedenthal, Jack. </w:t>
       </w:r>
-      <w:hyperlink w:history="1" r:id="rIdrnv1fddl9xedckjg0bivx">
+      <w:hyperlink w:history="1" r:id="rIdmukzuz4udbdqe_-nlygwb">
         <w:r>
           <w:rPr>
             <w:color w:val="0563C1"/>
@@ -18616,7 +18616,7 @@
       <w:r>
         <w:t xml:space="preserve">NASA. “</w:t>
       </w:r>
-      <w:hyperlink w:history="1" r:id="rIdbty_ewg5anix4lokcecny">
+      <w:hyperlink w:history="1" r:id="rIdfwjxlerdpftoinc6ct08m">
         <w:r>
           <w:rPr>
             <w:color w:val="0563C1"/>
@@ -18644,7 +18644,7 @@
       <w:r>
         <w:t xml:space="preserve">Chaikin, Andrew. </w:t>
       </w:r>
-      <w:hyperlink w:history="1" r:id="rIdmicwqx0_irij5k042rava">
+      <w:hyperlink w:history="1" r:id="rIdqylezrascckyiwwi_g5_7">
         <w:r>
           <w:rPr>
             <w:color w:val="0563C1"/>
@@ -18672,7 +18672,7 @@
       <w:r>
         <w:t xml:space="preserve">Siddiqi, Asif A. </w:t>
       </w:r>
-      <w:hyperlink w:history="1" r:id="rIdtpi9l9rfi48bgsefvgti8">
+      <w:hyperlink w:history="1" r:id="rIdheeu3hh5m-rcy9ptmevog">
         <w:r>
           <w:rPr>
             <w:color w:val="0563C1"/>
@@ -18700,7 +18700,7 @@
       <w:r>
         <w:t xml:space="preserve">Colaprete, Anthony, et al. “</w:t>
       </w:r>
-      <w:hyperlink w:history="1" r:id="rIdi2xsclgzr3yy7xk88z7tz">
+      <w:hyperlink w:history="1" r:id="rIdm48rihjhvx1h4um6udrvg">
         <w:r>
           <w:rPr>
             <w:color w:val="0563C1"/>
@@ -18728,7 +18728,7 @@
       <w:r>
         <w:t xml:space="preserve">Sheehan, William. </w:t>
       </w:r>
-      <w:hyperlink w:history="1" r:id="rIdiq-rjjwelo-2bg__e8-nd">
+      <w:hyperlink w:history="1" r:id="rIdrstkmd_ubquz9zqu72rpw">
         <w:r>
           <w:rPr>
             <w:color w:val="0563C1"/>
@@ -18756,7 +18756,7 @@
       <w:r>
         <w:t xml:space="preserve">Grotzinger, John P., et al. “</w:t>
       </w:r>
-      <w:hyperlink w:history="1" r:id="rId0c8j6lbvnuuvbj2u_lnmf">
+      <w:hyperlink w:history="1" r:id="rIdg4dnww2u59c3bfmeqfcni">
         <w:r>
           <w:rPr>
             <w:color w:val="0563C1"/>
@@ -18784,7 +18784,7 @@
       <w:r>
         <w:t xml:space="preserve">Mangold, Nicolas, et al. “</w:t>
       </w:r>
-      <w:hyperlink w:history="1" r:id="rIdg4djzyvus1ylkufttwlsg">
+      <w:hyperlink w:history="1" r:id="rIdsrjv--1egwsllrivld8o6">
         <w:r>
           <w:rPr>
             <w:color w:val="0563C1"/>
@@ -18832,7 +18832,7 @@
       <w:r>
         <w:t xml:space="preserve">Ashby, Neil. “</w:t>
       </w:r>
-      <w:hyperlink w:history="1" r:id="rIdzipnx3hmc9bm-pdcr8a7i">
+      <w:hyperlink w:history="1" r:id="rIdbi3j5nwjiauhazavqzfse">
         <w:r>
           <w:rPr>
             <w:color w:val="0563C1"/>
@@ -18860,7 +18860,7 @@
       <w:r>
         <w:t xml:space="preserve">Dyson, F. W., A. S. Eddington, and C. Davidson. “</w:t>
       </w:r>
-      <w:hyperlink w:history="1" r:id="rIdswbeb8sa2hexlys58mlch">
+      <w:hyperlink w:history="1" r:id="rIdgum_mika7drns9lbgfkff">
         <w:r>
           <w:rPr>
             <w:color w:val="0563C1"/>
@@ -18888,7 +18888,7 @@
       <w:r>
         <w:t xml:space="preserve">Au, Whitlow W. L. </w:t>
       </w:r>
-      <w:hyperlink w:history="1" r:id="rIdnvvnccdtrxjlss2bcewoa">
+      <w:hyperlink w:history="1" r:id="rIdrp6fcpgun59pujtgevl8c">
         <w:r>
           <w:rPr>
             <w:color w:val="0563C1"/>
@@ -18916,7 +18916,7 @@
       <w:r>
         <w:t xml:space="preserve">Susskind, Leonard. “</w:t>
       </w:r>
-      <w:hyperlink w:history="1" r:id="rIdwsee_atkptxzkp_yaqq_t">
+      <w:hyperlink w:history="1" r:id="rIdip4la0j141cncex6_lhv1">
         <w:r>
           <w:rPr>
             <w:color w:val="0563C1"/>
@@ -18944,7 +18944,7 @@
       <w:r>
         <w:t xml:space="preserve">Scerri, Eric R. </w:t>
       </w:r>
-      <w:hyperlink w:history="1" r:id="rId_raanmqgbkitjufoxu5m1">
+      <w:hyperlink w:history="1" r:id="rIdyep0eravq7hg6q4iwcmqy">
         <w:r>
           <w:rPr>
             <w:color w:val="0563C1"/>
@@ -18972,7 +18972,7 @@
       <w:r>
         <w:t xml:space="preserve">Erisman, Jan Willem, et al. “</w:t>
       </w:r>
-      <w:hyperlink w:history="1" r:id="rIduisgr5hvzc1k0h90dvv1g">
+      <w:hyperlink w:history="1" r:id="rIdin5hqlsl38p7r5xtuzsrb">
         <w:r>
           <w:rPr>
             <w:color w:val="0563C1"/>
@@ -19000,7 +19000,7 @@
       <w:r>
         <w:t xml:space="preserve">Watson, J. D., and F. H. C. Crick. “</w:t>
       </w:r>
-      <w:hyperlink w:history="1" r:id="rId43pdgvqy6zbkgcouqntbx">
+      <w:hyperlink w:history="1" r:id="rIdzj7rypxu-lfjwypxxozox">
         <w:r>
           <w:rPr>
             <w:color w:val="0563C1"/>
@@ -19028,7 +19028,7 @@
       <w:r>
         <w:t xml:space="preserve">Franklin, Rosalind E., and R. G. Gosling. “</w:t>
       </w:r>
-      <w:hyperlink w:history="1" r:id="rIdqdghymv_qd4rldn4a2qcp">
+      <w:hyperlink w:history="1" r:id="rIdvd2dqnbnl-qs-yrd_voka">
         <w:r>
           <w:rPr>
             <w:color w:val="0563C1"/>
@@ -19056,7 +19056,7 @@
       <w:r>
         <w:t xml:space="preserve">International Human Genome Sequencing Consortium. “</w:t>
       </w:r>
-      <w:hyperlink w:history="1" r:id="rIdlfje1yryqixfrfbbxlker">
+      <w:hyperlink w:history="1" r:id="rIdiwlgc98dpcwjyonjuhzts">
         <w:r>
           <w:rPr>
             <w:color w:val="0563C1"/>
@@ -19084,7 +19084,7 @@
       <w:r>
         <w:t xml:space="preserve">International Human Genome Sequencing Consortium. “</w:t>
       </w:r>
-      <w:hyperlink w:history="1" r:id="rIdlvb2wweoevxuuslvaospr">
+      <w:hyperlink w:history="1" r:id="rIdus4mbqvdpaevb1vmhh4no">
         <w:r>
           <w:rPr>
             <w:color w:val="0563C1"/>
@@ -19112,7 +19112,7 @@
       <w:r>
         <w:t xml:space="preserve">Nurk, Sergey, et al. “</w:t>
       </w:r>
-      <w:hyperlink w:history="1" r:id="rId1gm6rmleo-1o9pm5kxgld">
+      <w:hyperlink w:history="1" r:id="rIdz72yymd0ifz9m1hnlom2c">
         <w:r>
           <w:rPr>
             <w:color w:val="0563C1"/>
@@ -19140,7 +19140,7 @@
       <w:r>
         <w:t xml:space="preserve">Vine, F. J., and D. H. Matthews. “</w:t>
       </w:r>
-      <w:hyperlink w:history="1" r:id="rId65gr7mwfe9voxlk9waxdd">
+      <w:hyperlink w:history="1" r:id="rIdpqfvd2h9ggadbgnbanf5r">
         <w:r>
           <w:rPr>
             <w:color w:val="0563C1"/>
@@ -19168,7 +19168,7 @@
       <w:r>
         <w:t xml:space="preserve">Alpher, Ralph A., and Robert Herman. “</w:t>
       </w:r>
-      <w:hyperlink w:history="1" r:id="rIdnpl5gdhcryymtci2b2gyb">
+      <w:hyperlink w:history="1" r:id="rIdhu3xf5ihsj5hnix0axnmj">
         <w:r>
           <w:rPr>
             <w:color w:val="0563C1"/>
@@ -19196,7 +19196,7 @@
       <w:r>
         <w:t xml:space="preserve">Penzias, A. A., and R. W. Wilson. “</w:t>
       </w:r>
-      <w:hyperlink w:history="1" r:id="rIdh_euhov7q0w-alqhj6ycp">
+      <w:hyperlink w:history="1" r:id="rId_szqt2vehmfjikofhbmmk">
         <w:r>
           <w:rPr>
             <w:color w:val="0563C1"/>
@@ -19224,7 +19224,7 @@
       <w:r>
         <w:t xml:space="preserve">Fleischmann, Martin, and Stanley Pons. “</w:t>
       </w:r>
-      <w:hyperlink w:history="1" r:id="rIdposan7ktkkbhjvlpucuqq">
+      <w:hyperlink w:history="1" r:id="rIdtobz4t_-db3akpwdirsne">
         <w:r>
           <w:rPr>
             <w:color w:val="0563C1"/>
@@ -19252,7 +19252,7 @@
       <w:r>
         <w:t xml:space="preserve">Wolfe-Simon, Felisa, et al. “</w:t>
       </w:r>
-      <w:hyperlink w:history="1" r:id="rIdzjwzw0rqovu8avw2ch7ws">
+      <w:hyperlink w:history="1" r:id="rIds7jtg4pkyb-wi54lqzwzn">
         <w:r>
           <w:rPr>
             <w:color w:val="0563C1"/>
@@ -19280,7 +19280,7 @@
       <w:r>
         <w:t xml:space="preserve">Reaves, Marshall Louis, et al. “</w:t>
       </w:r>
-      <w:hyperlink w:history="1" r:id="rIdmfxbkc9zg2aw4gy5k9r3r">
+      <w:hyperlink w:history="1" r:id="rId-awuio_xkbje4uthboiom">
         <w:r>
           <w:rPr>
             <w:color w:val="0563C1"/>
@@ -19328,7 +19328,7 @@
       <w:r>
         <w:t xml:space="preserve">Dalrymple, William. </w:t>
       </w:r>
-      <w:hyperlink w:history="1" r:id="rIdv1e4k11uq__aupwjumhoo">
+      <w:hyperlink w:history="1" r:id="rIdykomra9ovi5scsldgy_mo">
         <w:r>
           <w:rPr>
             <w:color w:val="0563C1"/>
@@ -19356,7 +19356,7 @@
       <w:r>
         <w:t xml:space="preserve">Maddison, Angus. </w:t>
       </w:r>
-      <w:hyperlink w:history="1" r:id="rId6kknqr8im9ic_zpov_paw">
+      <w:hyperlink w:history="1" r:id="rIdiskdnfawlbk-rktbsrowg">
         <w:r>
           <w:rPr>
             <w:color w:val="0563C1"/>
@@ -19384,7 +19384,7 @@
       <w:r>
         <w:t xml:space="preserve">Sen, Amartya. </w:t>
       </w:r>
-      <w:hyperlink w:history="1" r:id="rIdvqghfm5gnho5ok4_zsqep">
+      <w:hyperlink w:history="1" r:id="rIda2llnvyqtms1zmmmftosu">
         <w:r>
           <w:rPr>
             <w:color w:val="0563C1"/>
@@ -19412,7 +19412,7 @@
       <w:r>
         <w:t xml:space="preserve">Khan, Yasmin. </w:t>
       </w:r>
-      <w:hyperlink w:history="1" r:id="rIditnyc_lk3osfo6rueu88d">
+      <w:hyperlink w:history="1" r:id="rIdzdwnavfbh00rupimtwmgp">
         <w:r>
           <w:rPr>
             <w:color w:val="0563C1"/>
@@ -19440,7 +19440,7 @@
       <w:r>
         <w:t xml:space="preserve">Elkins, Caroline. </w:t>
       </w:r>
-      <w:hyperlink w:history="1" r:id="rIdjazg-raqhxxqx2oiirs4o">
+      <w:hyperlink w:history="1" r:id="rIdqchylmhdymnzaupjrdqrp">
         <w:r>
           <w:rPr>
             <w:color w:val="0563C1"/>
@@ -19468,7 +19468,7 @@
       <w:r>
         <w:t xml:space="preserve">Jansen, Jan C., and Jürgen Osterhammel. </w:t>
       </w:r>
-      <w:hyperlink w:history="1" r:id="rId6tkybg-o74pkcnkyf8jx0">
+      <w:hyperlink w:history="1" r:id="rIdtbhrnvnw4_6zuv-4polxp">
         <w:r>
           <w:rPr>
             <w:color w:val="0563C1"/>
@@ -19496,7 +19496,7 @@
       <w:r>
         <w:t xml:space="preserve">Des Forges, Alison. </w:t>
       </w:r>
-      <w:hyperlink w:history="1" r:id="rIdlzino1dndzcnjoylg3moz">
+      <w:hyperlink w:history="1" r:id="rIdlqds43fa_halckbtsjox9">
         <w:r>
           <w:rPr>
             <w:color w:val="0563C1"/>
@@ -19524,7 +19524,7 @@
       <w:r>
         <w:t xml:space="preserve">Newbury, Catharine. </w:t>
       </w:r>
-      <w:hyperlink w:history="1" r:id="rIdzsrqb4b9gzclgxsdd_kvk">
+      <w:hyperlink w:history="1" r:id="rIds3luge2er-el0vczrhpp3">
         <w:r>
           <w:rPr>
             <w:color w:val="0563C1"/>
@@ -19572,7 +19572,7 @@
       <w:r>
         <w:t xml:space="preserve">Branch, Taylor. </w:t>
       </w:r>
-      <w:hyperlink w:history="1" r:id="rIdcdzaerjoksfhdoec27qgd">
+      <w:hyperlink w:history="1" r:id="rIdec-vtmf7bl1mcpwzhmgyj">
         <w:r>
           <w:rPr>
             <w:color w:val="0563C1"/>
@@ -19600,7 +19600,7 @@
       <w:r>
         <w:t xml:space="preserve">Hoose, Phillip. </w:t>
       </w:r>
-      <w:hyperlink w:history="1" r:id="rIdatfolosv_xygikblkl1sq">
+      <w:hyperlink w:history="1" r:id="rIdet0i_dmw6ibejgx6smlbl">
         <w:r>
           <w:rPr>
             <w:color w:val="0563C1"/>
@@ -19628,7 +19628,7 @@
       <w:r>
         <w:t xml:space="preserve">Tyson, Timothy B. </w:t>
       </w:r>
-      <w:hyperlink w:history="1" r:id="rId5nsuk8jphmbzfir5jby9p">
+      <w:hyperlink w:history="1" r:id="rId8oeygyymfvkqwmx9k8v7-">
         <w:r>
           <w:rPr>
             <w:color w:val="0563C1"/>
@@ -19656,7 +19656,7 @@
       <w:r>
         <w:t xml:space="preserve">Mandela, Nelson. </w:t>
       </w:r>
-      <w:hyperlink w:history="1" r:id="rId-emgder9lp9brmzzcmyyv">
+      <w:hyperlink w:history="1" r:id="rIdyqpsstpsth0rswifsojsl">
         <w:r>
           <w:rPr>
             <w:color w:val="0563C1"/>
@@ -19684,7 +19684,7 @@
       <w:r>
         <w:t xml:space="preserve">Carter, David. </w:t>
       </w:r>
-      <w:hyperlink w:history="1" r:id="rIdaayx-p-k9zsv4qgzq5cz2">
+      <w:hyperlink w:history="1" r:id="rId06wpnfai8bpxxo6ktfy2a">
         <w:r>
           <w:rPr>
             <w:color w:val="0563C1"/>
@@ -19732,7 +19732,7 @@
       <w:r>
         <w:t xml:space="preserve">Turing, A. M. “</w:t>
       </w:r>
-      <w:hyperlink w:history="1" r:id="rIdf5pjux1byxqucvayxixfn">
+      <w:hyperlink w:history="1" r:id="rIdpbhf3emvm2kmr6zlfndfr">
         <w:r>
           <w:rPr>
             <w:color w:val="0563C1"/>
@@ -19760,7 +19760,7 @@
       <w:r>
         <w:t xml:space="preserve">Copeland, B. Jack, ed. </w:t>
       </w:r>
-      <w:hyperlink w:history="1" r:id="rIdb-xvguzopoiprguwalrau">
+      <w:hyperlink w:history="1" r:id="rIdopbw9yz77lvtgcxbbiocj">
         <w:r>
           <w:rPr>
             <w:color w:val="0563C1"/>
@@ -19788,7 +19788,7 @@
       <w:r>
         <w:t xml:space="preserve">Isaacson, Walter. </w:t>
       </w:r>
-      <w:hyperlink w:history="1" r:id="rIdqwcwcqwnc5kcwxge66bol">
+      <w:hyperlink w:history="1" r:id="rId8bbk8e_mkqfk5nnhsl0ff">
         <w:r>
           <w:rPr>
             <w:color w:val="0563C1"/>
@@ -19816,7 +19816,7 @@
       <w:r>
         <w:t xml:space="preserve">Vosoughi, Soroush, Deb Roy, and Sinan Aral. “</w:t>
       </w:r>
-      <w:hyperlink w:history="1" r:id="rIdnhhmnmlmr4ilnv34ghcim">
+      <w:hyperlink w:history="1" r:id="rIds25-cr_grwrx6fd670mgv">
         <w:r>
           <w:rPr>
             <w:color w:val="0563C1"/>
@@ -19864,7 +19864,7 @@
       <w:r>
         <w:t xml:space="preserve">Stuart, David. </w:t>
       </w:r>
-      <w:hyperlink w:history="1" r:id="rIdwngbfeg3eaivkj5iji1tc">
+      <w:hyperlink w:history="1" r:id="rIdpnttu5grafjj32hmxwt5p">
         <w:r>
           <w:rPr>
             <w:color w:val="0563C1"/>
@@ -19892,7 +19892,7 @@
       <w:r>
         <w:t xml:space="preserve">Aveni, Anthony. </w:t>
       </w:r>
-      <w:hyperlink w:history="1" r:id="rIdkmaxdhhoftpzbvd6hxrsd">
+      <w:hyperlink w:history="1" r:id="rIdnuuffgy11hkxyglt6dxzi">
         <w:r>
           <w:rPr>
             <w:color w:val="0563C1"/>
@@ -19940,7 +19940,7 @@
       <w:r>
         <w:t xml:space="preserve">Meech, Karen J., et al. “</w:t>
       </w:r>
-      <w:hyperlink w:history="1" r:id="rId0f0ffvldb_jkkmhb6erhg">
+      <w:hyperlink w:history="1" r:id="rIdtr-dpz6euvnmp2u7gc8wy">
         <w:r>
           <w:rPr>
             <w:color w:val="0563C1"/>
@@ -19968,7 +19968,7 @@
       <w:r>
         <w:t xml:space="preserve">Micheli, Marco, et al. “</w:t>
       </w:r>
-      <w:hyperlink w:history="1" r:id="rIdwvpbjcilynh1t745oaam3">
+      <w:hyperlink w:history="1" r:id="rIdh2dt8dvnp9zjpyothhaze">
         <w:r>
           <w:rPr>
             <w:color w:val="0563C1"/>
@@ -19996,7 +19996,7 @@
       <w:r>
         <w:t xml:space="preserve">‘Oumuamua ISSI Team. “</w:t>
       </w:r>
-      <w:hyperlink w:history="1" r:id="rId4w2qtmhxtaf-c2sfgz3nm">
+      <w:hyperlink w:history="1" r:id="rIduxpjsopfoxc1olhdfwnku">
         <w:r>
           <w:rPr>
             <w:color w:val="0563C1"/>
@@ -20024,7 +20024,7 @@
       <w:r>
         <w:t xml:space="preserve">Staff at the National Astronomy and Ionosphere Center. “</w:t>
       </w:r>
-      <w:hyperlink w:history="1" r:id="rIdf0qn5hjhwukvktyaaru1_">
+      <w:hyperlink w:history="1" r:id="rIdvcez1kzwnhrlcrkmilkni">
         <w:r>
           <w:rPr>
             <w:color w:val="0563C1"/>
@@ -20088,7 +20088,7 @@
       <w:r>
         <w:t xml:space="preserve">Riley, James C. “</w:t>
       </w:r>
-      <w:hyperlink w:history="1" r:id="rIdohx4pbqtk9omkpednzkbn">
+      <w:hyperlink w:history="1" r:id="rIdgcrto3xd9stgkoqjkx_wb">
         <w:r>
           <w:rPr>
             <w:color w:val="0563C1"/>
@@ -20116,7 +20116,7 @@
       <w:r>
         <w:t xml:space="preserve">Bliss, Michael. </w:t>
       </w:r>
-      <w:hyperlink w:history="1" r:id="rIdtntpnr3uiy5ofs6dn6foz">
+      <w:hyperlink w:history="1" r:id="rIddiachyghwepi6crwdzdru">
         <w:r>
           <w:rPr>
             <w:color w:val="0563C1"/>
@@ -20144,7 +20144,7 @@
       <w:r>
         <w:t xml:space="preserve">Reverby, Susan M. </w:t>
       </w:r>
-      <w:hyperlink w:history="1" r:id="rIdgstjiq55qlo-zwe48mbc4">
+      <w:hyperlink w:history="1" r:id="rIdtmwasd1-ufujmzfxdviyo">
         <w:r>
           <w:rPr>
             <w:color w:val="0563C1"/>
@@ -20172,7 +20172,7 @@
       <w:r>
         <w:t xml:space="preserve">Keefe, Patrick Radden. </w:t>
       </w:r>
-      <w:hyperlink w:history="1" r:id="rIdmzg0zqdmzaz4bjzoreuni">
+      <w:hyperlink w:history="1" r:id="rIdgxeil791fozlfusexarre">
         <w:r>
           <w:rPr>
             <w:color w:val="0563C1"/>
@@ -20200,7 +20200,7 @@
       <w:r>
         <w:t xml:space="preserve">Antimicrobial Resistance Collaborators. “</w:t>
       </w:r>
-      <w:hyperlink w:history="1" r:id="rIdnyntnqklcizrqstcvpkyt">
+      <w:hyperlink w:history="1" r:id="rId9w-iwsucanujac4ai-78p">
         <w:r>
           <w:rPr>
             <w:color w:val="0563C1"/>
@@ -20228,7 +20228,7 @@
       <w:r>
         <w:t xml:space="preserve">Van Bressem, Marie-Françoise, et al. “</w:t>
       </w:r>
-      <w:hyperlink w:history="1" r:id="rIdtm_cy-nwucryhla52yf6v">
+      <w:hyperlink w:history="1" r:id="rIdkkomkamvl4llbq6prf89c">
         <w:r>
           <w:rPr>
             <w:color w:val="0563C1"/>
@@ -20256,7 +20256,7 @@
       <w:r>
         <w:t xml:space="preserve">Oshinsky, David M. </w:t>
       </w:r>
-      <w:hyperlink w:history="1" r:id="rIdyjrjmy58noiuwsrtzuzwi">
+      <w:hyperlink w:history="1" r:id="rIda8uppgvacre44bumdbwl4">
         <w:r>
           <w:rPr>
             <w:color w:val="0563C1"/>
@@ -20284,7 +20284,7 @@
       <w:r>
         <w:t xml:space="preserve">Polack, Fernando P., et al. “</w:t>
       </w:r>
-      <w:hyperlink w:history="1" r:id="rIdliezi2inzvgxcoeiybccf">
+      <w:hyperlink w:history="1" r:id="rIdgq_fumny034crrildm4ek">
         <w:r>
           <w:rPr>
             <w:color w:val="0563C1"/>
@@ -20332,7 +20332,7 @@
       <w:r>
         <w:t xml:space="preserve">Arrhenius, Svante. “</w:t>
       </w:r>
-      <w:hyperlink w:history="1" r:id="rIdr-l9dodk23r-xelji5bvu">
+      <w:hyperlink w:history="1" r:id="rId9qhsxv7sa1muks_ci2_z9">
         <w:r>
           <w:rPr>
             <w:color w:val="0563C1"/>
@@ -20360,7 +20360,7 @@
       <w:r>
         <w:t xml:space="preserve">Philip, Sjoukje Y., et al. “</w:t>
       </w:r>
-      <w:hyperlink w:history="1" r:id="rIdsvs4kxisjxfvhtxckxc2d">
+      <w:hyperlink w:history="1" r:id="rIdauasjp6vcr9xhtpoi2kax">
         <w:r>
           <w:rPr>
             <w:color w:val="0563C1"/>
@@ -20388,7 +20388,7 @@
       <w:r>
         <w:t xml:space="preserve">Supran, G., S. Rahmstorf, and N. Oreskes. “</w:t>
       </w:r>
-      <w:hyperlink w:history="1" r:id="rId05vtqcmioki0himdd1_bc">
+      <w:hyperlink w:history="1" r:id="rIdh7-ppeawvv-zuj09fcwqc">
         <w:r>
           <w:rPr>
             <w:color w:val="0563C1"/>
@@ -20416,7 +20416,7 @@
       <w:r>
         <w:t xml:space="preserve">Witze, Alexandra. “</w:t>
       </w:r>
-      <w:hyperlink w:history="1" r:id="rIdcfhosuoqdmxmrtunj-t8l">
+      <w:hyperlink w:history="1" r:id="rIdrb-vsusnossz4cbx2q4__">
         <w:r>
           <w:rPr>
             <w:color w:val="0563C1"/>
@@ -20444,7 +20444,7 @@
       <w:r>
         <w:t xml:space="preserve">IPCC. </w:t>
       </w:r>
-      <w:hyperlink w:history="1" r:id="rIdadwdc4kun4aqvmhsfjzox">
+      <w:hyperlink w:history="1" r:id="rIdgks3qnbouszhuuxtcotlk">
         <w:r>
           <w:rPr>
             <w:color w:val="0563C1"/>
@@ -20472,7 +20472,7 @@
       <w:r>
         <w:t xml:space="preserve">Morlighem, Mathieu, et al. “</w:t>
       </w:r>
-      <w:hyperlink w:history="1" r:id="rIdurdkstsga38n5swgf4yah">
+      <w:hyperlink w:history="1" r:id="rIdvlnwh3s3sihngrhjgrwxu">
         <w:r>
           <w:rPr>
             <w:color w:val="0563C1"/>
@@ -20500,7 +20500,7 @@
       <w:r>
         <w:t xml:space="preserve">IMBIE Team. “</w:t>
       </w:r>
-      <w:hyperlink w:history="1" r:id="rIdi9slbytt-6egld3rv9s8e">
+      <w:hyperlink w:history="1" r:id="rIdgwuvnneqx-91ibjub61qt">
         <w:r>
           <w:rPr>
             <w:color w:val="0563C1"/>
@@ -20528,7 +20528,7 @@
       <w:r>
         <w:t xml:space="preserve">Joughin, Ian, Benjamin E. Smith, and Brooke Medley. “</w:t>
       </w:r>
-      <w:hyperlink w:history="1" r:id="rIdatjo1vf9nx7--3yaydvtw">
+      <w:hyperlink w:history="1" r:id="rIdagzlbxou3kdtvcwepspfj">
         <w:r>
           <w:rPr>
             <w:color w:val="0563C1"/>
@@ -20556,7 +20556,7 @@
       <w:r>
         <w:t xml:space="preserve">Secretariat of the Antarctic Treaty. “</w:t>
       </w:r>
-      <w:hyperlink w:history="1" r:id="rIdlj6eevxi5xmtqeausbe-b">
+      <w:hyperlink w:history="1" r:id="rId_cp85k6iulcllstjteph5">
         <w:r>
           <w:rPr>
             <w:color w:val="0563C1"/>
@@ -20584,7 +20584,7 @@
       <w:r>
         <w:t xml:space="preserve">Office of the Historian, US Department of State. </w:t>
       </w:r>
-      <w:hyperlink w:history="1" r:id="rIdfb-347hc5ml1dxrsmwrx0">
+      <w:hyperlink w:history="1" r:id="rId644orvmb115yp65xgokyo">
         <w:r>
           <w:rPr>
             <w:color w:val="0563C1"/>
@@ -20612,7 +20612,7 @@
       <w:r>
         <w:t xml:space="preserve">“‘Greenland Belongs to Greenland’: </w:t>
       </w:r>
-      <w:hyperlink w:history="1" r:id="rIdhgmmdiae3neqiipjmnbmj">
+      <w:hyperlink w:history="1" r:id="rIdsf4-5cvmhkyxgby4adq60">
         <w:r>
           <w:rPr>
             <w:color w:val="0563C1"/>
@@ -20640,7 +20640,7 @@
       <w:r>
         <w:t xml:space="preserve">BBC News. Report on </w:t>
       </w:r>
-      <w:hyperlink w:history="1" r:id="rIdaibp3ns5waxbkag635mrg">
+      <w:hyperlink w:history="1" r:id="rIdh4xkfqlihff_i2t1hgnjm">
         <w:r>
           <w:rPr>
             <w:color w:val="0563C1"/>
@@ -20668,7 +20668,7 @@
       <w:r>
         <w:t xml:space="preserve">BBC News. </w:t>
       </w:r>
-      <w:hyperlink w:history="1" r:id="rIdu3lq_tlv3wbos6pqb5jyv">
+      <w:hyperlink w:history="1" r:id="rIdu4eefgfl0pm2uc6b5lkgr">
         <w:r>
           <w:rPr>
             <w:color w:val="0563C1"/>
@@ -20696,7 +20696,7 @@
       <w:r>
         <w:t xml:space="preserve">Statistics Greenland. “</w:t>
       </w:r>
-      <w:hyperlink w:history="1" r:id="rIdcdago8fljxyhtma4t82ot">
+      <w:hyperlink w:history="1" r:id="rIdq0yj3bipsxnyctkcjk29x">
         <w:r>
           <w:rPr>
             <w:color w:val="0563C1"/>
@@ -20760,7 +20760,7 @@
       <w:r>
         <w:t xml:space="preserve">COVID-19 National Preparedness Collaborators. “</w:t>
       </w:r>
-      <w:hyperlink w:history="1" r:id="rIdvoschatsikn9rk1p07gff">
+      <w:hyperlink w:history="1" r:id="rId2xns0cjdereo6nxfdf9cc">
         <w:r>
           <w:rPr>
             <w:color w:val="0563C1"/>
@@ -20788,7 +20788,7 @@
       <w:r>
         <w:t xml:space="preserve">Msemburi, William, et al. “</w:t>
       </w:r>
-      <w:hyperlink w:history="1" r:id="rIdi4hhsda6nxv4eylzed8ja">
+      <w:hyperlink w:history="1" r:id="rIdepz-fxhewvm8p7may4pr0">
         <w:r>
           <w:rPr>
             <w:color w:val="0563C1"/>
@@ -20872,7 +20872,7 @@
       <w:r>
         <w:t xml:space="preserve">Jinek, Martin, et al. “</w:t>
       </w:r>
-      <w:hyperlink w:history="1" r:id="rIdfwbsex4au0d5y6lsvv8my">
+      <w:hyperlink w:history="1" r:id="rIddwzn7ao9o9jbgng0gzwbb">
         <w:r>
           <w:rPr>
             <w:color w:val="0563C1"/>
@@ -20900,7 +20900,7 @@
       <w:r>
         <w:t xml:space="preserve">Fehilly, Carole B., S. M. Willadsen, and Elizabeth M. Tucker. “</w:t>
       </w:r>
-      <w:hyperlink w:history="1" r:id="rIdzk5ihcadxpfxozhw6zsq-">
+      <w:hyperlink w:history="1" r:id="rIdikye6iexhqtq4kqlbiv9i">
         <w:r>
           <w:rPr>
             <w:color w:val="0563C1"/>
@@ -20948,7 +20948,7 @@
       <w:r>
         <w:t xml:space="preserve">Ganopolski, A., R. Winkelmann, and H. J. Schellnhuber. “</w:t>
       </w:r>
-      <w:hyperlink w:history="1" r:id="rIdf0anzldg3wwgwkvq2vjsi">
+      <w:hyperlink w:history="1" r:id="rIdrufnonwu0sd00ffo5db_r">
         <w:r>
           <w:rPr>
             <w:color w:val="0563C1"/>
@@ -20996,7 +20996,7 @@
       <w:r>
         <w:t xml:space="preserve">Hawking, S. W. “</w:t>
       </w:r>
-      <w:hyperlink w:history="1" r:id="rIdvni5lcutofqfykpptjnid">
+      <w:hyperlink w:history="1" r:id="rIdv2lhtuzfgf9o4m-wnt9bu">
         <w:r>
           <w:rPr>
             <w:color w:val="0563C1"/>
@@ -21024,7 +21024,7 @@
       <w:r>
         <w:t xml:space="preserve">LIGO Scientific Collaboration and Virgo Collaboration. “</w:t>
       </w:r>
-      <w:hyperlink w:history="1" r:id="rIdkyqvi0q_etgii4rdzx5gn">
+      <w:hyperlink w:history="1" r:id="rIdre5mun1ikv0-mglwi8jpy">
         <w:r>
           <w:rPr>
             <w:color w:val="0563C1"/>
@@ -21052,7 +21052,7 @@
       <w:r>
         <w:t xml:space="preserve">ATLAS Collaboration. “</w:t>
       </w:r>
-      <w:hyperlink w:history="1" r:id="rIdgv8achgoniwpehe7yjghp">
+      <w:hyperlink w:history="1" r:id="rIda042vwbuc_fzgrrhq5ixs">
         <w:r>
           <w:rPr>
             <w:color w:val="0563C1"/>
@@ -21080,7 +21080,7 @@
       <w:r>
         <w:t xml:space="preserve">Abu-Shawareb, H., et al. (Indirect Drive ICF Collaboration). “</w:t>
       </w:r>
-      <w:hyperlink w:history="1" r:id="rIdsxpc4owd7frrppm26oiil">
+      <w:hyperlink w:history="1" r:id="rIdbc8bbihhtprra32a6klqa">
         <w:r>
           <w:rPr>
             <w:color w:val="0563C1"/>
@@ -21132,7 +21132,7 @@
       <w:pPr>
         <w:spacing w:after="200"/>
       </w:pPr>
-      <w:hyperlink w:history="1" r:id="rIdxndts2lgtmfw9csm9wr4z">
+      <w:hyperlink w:history="1" r:id="rIdjjmihr1taxtypek5tx9kg">
         <w:r>
           <w:rPr>
             <w:b/>
@@ -21165,7 +21165,7 @@
       <w:pPr>
         <w:spacing w:after="200"/>
       </w:pPr>
-      <w:hyperlink w:history="1" r:id="rId44mhudvehtymtsboymjrk">
+      <w:hyperlink w:history="1" r:id="rIdis81ewkrxokmx9q3nkuf4">
         <w:r>
           <w:rPr>
             <w:b/>
@@ -21198,7 +21198,7 @@
       <w:pPr>
         <w:spacing w:after="200"/>
       </w:pPr>
-      <w:hyperlink w:history="1" r:id="rIdw-zvcdimfy0tmhdz1cnze">
+      <w:hyperlink w:history="1" r:id="rIdu90un5sliq0at_1z0jdpc">
         <w:r>
           <w:rPr>
             <w:b/>
@@ -21231,7 +21231,7 @@
       <w:pPr>
         <w:spacing w:after="200"/>
       </w:pPr>
-      <w:hyperlink w:history="1" r:id="rIdtse3fua0pbagjj2wc_lda">
+      <w:hyperlink w:history="1" r:id="rIdicx0vsvpshsbfw2-pwnmg">
         <w:r>
           <w:rPr>
             <w:b/>
@@ -21264,7 +21264,7 @@
       <w:pPr>
         <w:spacing w:after="200"/>
       </w:pPr>
-      <w:hyperlink w:history="1" r:id="rIdcv0vqqbpaaczrco7qc4ec">
+      <w:hyperlink w:history="1" r:id="rIdrrvgk4t7lybpltfoqwx2j">
         <w:r>
           <w:rPr>
             <w:b/>
@@ -21297,7 +21297,7 @@
       <w:pPr>
         <w:spacing w:after="200"/>
       </w:pPr>
-      <w:hyperlink w:history="1" r:id="rIde-cm9gjgkjsx0hgshmxxq">
+      <w:hyperlink w:history="1" r:id="rIdiunxrwbu76gs0fmwf6dtp">
         <w:r>
           <w:rPr>
             <w:b/>
@@ -21330,7 +21330,7 @@
       <w:pPr>
         <w:spacing w:after="200"/>
       </w:pPr>
-      <w:hyperlink w:history="1" r:id="rIdcjdwwl46hjfaowu3e88rf">
+      <w:hyperlink w:history="1" r:id="rIdq4acvqrlr93eosu4y2ipw">
         <w:r>
           <w:rPr>
             <w:b/>
@@ -21385,7 +21385,7 @@
       <w:pPr>
         <w:spacing w:after="200"/>
       </w:pPr>
-      <w:hyperlink w:history="1" r:id="rId8yhswzu-coolxgj5ylg9c">
+      <w:hyperlink w:history="1" r:id="rIdqfnktiwoie1tpyvi9pwff">
         <w:r>
           <w:rPr>
             <w:b/>
@@ -21418,7 +21418,7 @@
       <w:pPr>
         <w:spacing w:after="200"/>
       </w:pPr>
-      <w:hyperlink w:history="1" r:id="rIdhud47ec1ubl0_djyobpnh">
+      <w:hyperlink w:history="1" r:id="rIdxrlfownwdrpobxrkikx9i">
         <w:r>
           <w:rPr>
             <w:b/>
@@ -21451,7 +21451,7 @@
       <w:pPr>
         <w:spacing w:after="200"/>
       </w:pPr>
-      <w:hyperlink w:history="1" r:id="rIdezagqyhwfyy6jvoub3rjl">
+      <w:hyperlink w:history="1" r:id="rId0wjvy-ibtm4ufpkowyloy">
         <w:r>
           <w:rPr>
             <w:b/>
@@ -21484,7 +21484,7 @@
       <w:pPr>
         <w:spacing w:after="200"/>
       </w:pPr>
-      <w:hyperlink w:history="1" r:id="rIdwrfuulucq7upfhifrrprg">
+      <w:hyperlink w:history="1" r:id="rIdmxssbcfyj2urcmcuzr2bf">
         <w:r>
           <w:rPr>
             <w:b/>
@@ -21517,7 +21517,7 @@
       <w:pPr>
         <w:spacing w:after="200"/>
       </w:pPr>
-      <w:hyperlink w:history="1" r:id="rIdn6m6jcwxesxzbuz8kh5jo">
+      <w:hyperlink w:history="1" r:id="rId1e4qemqkgwxv3iori4p-z">
         <w:r>
           <w:rPr>
             <w:b/>
@@ -21550,7 +21550,7 @@
       <w:pPr>
         <w:spacing w:after="200"/>
       </w:pPr>
-      <w:hyperlink w:history="1" r:id="rId8egt9rqqw3afvkw9qebxl">
+      <w:hyperlink w:history="1" r:id="rIdmmbxk-bpj58ja3_bw2y21">
         <w:r>
           <w:rPr>
             <w:b/>
@@ -21583,7 +21583,7 @@
       <w:pPr>
         <w:spacing w:after="200"/>
       </w:pPr>
-      <w:hyperlink w:history="1" r:id="rIdfwkhw2s8bij1ydxdpoo9w">
+      <w:hyperlink w:history="1" r:id="rIdbeyqo1topzemjvf8auc0s">
         <w:r>
           <w:rPr>
             <w:b/>
@@ -21616,7 +21616,7 @@
       <w:pPr>
         <w:spacing w:after="200"/>
       </w:pPr>
-      <w:hyperlink w:history="1" r:id="rIdycptiftjqtrwdo0ytoc2-">
+      <w:hyperlink w:history="1" r:id="rIdohbkgbykchozmhwfza7jx">
         <w:r>
           <w:rPr>
             <w:b/>
@@ -21649,7 +21649,7 @@
       <w:pPr>
         <w:spacing w:after="200"/>
       </w:pPr>
-      <w:hyperlink w:history="1" r:id="rIdvxlkivj5jx7ltrxdbjoy9">
+      <w:hyperlink w:history="1" r:id="rId7vqvopjq7snzy3utqeenl">
         <w:r>
           <w:rPr>
             <w:b/>
@@ -21682,7 +21682,7 @@
       <w:pPr>
         <w:spacing w:after="200"/>
       </w:pPr>
-      <w:hyperlink w:history="1" r:id="rIdr8xvziunruoul36ajiyfy">
+      <w:hyperlink w:history="1" r:id="rIdwzgbs3-dryjqjg7_vl146">
         <w:r>
           <w:rPr>
             <w:b/>
@@ -21715,7 +21715,7 @@
       <w:pPr>
         <w:spacing w:after="200"/>
       </w:pPr>
-      <w:hyperlink w:history="1" r:id="rIdvalr1tm6cnfvabnfktuuk">
+      <w:hyperlink w:history="1" r:id="rIdrcegnneogpveswmqtoan-">
         <w:r>
           <w:rPr>
             <w:b/>
@@ -21748,7 +21748,7 @@
       <w:pPr>
         <w:spacing w:after="200"/>
       </w:pPr>
-      <w:hyperlink w:history="1" r:id="rId3o7cu071azfly7t9bitg1">
+      <w:hyperlink w:history="1" r:id="rIdhr92gkq9jdi3nrfef2hxu">
         <w:r>
           <w:rPr>
             <w:b/>
@@ -21781,7 +21781,7 @@
       <w:pPr>
         <w:spacing w:after="200"/>
       </w:pPr>
-      <w:hyperlink w:history="1" r:id="rIdjjhf_x84gaorlgh__fhsu">
+      <w:hyperlink w:history="1" r:id="rId6zdprjyoynh8hwiiwvag1">
         <w:r>
           <w:rPr>
             <w:b/>

</xml_diff>

<commit_message>
Dolphins: add a sourced Noah Webster aside to the American Republic chapter
A conversational aside about why American spelling diverged from British
English turned into a real addition: Webster's spelling reform was a
deliberate, decades-long nationalist project, not a product of frontier
illiteracy, and it fits the 1783-1828 window the American Republic chapter
already covers. Added one paragraph after the War of 1812 beat (both touch
on the new country building a distinct identity), with a new, verified
citation (Kendall's Webster biography), across scripts/_generate.js, the
chapter .md, Notes and Sources, and the Complete Manuscript .md.

node scripts/_generate.js and scripts/check_repeats.js both run clean;
spot-checked the rebuilt docx against both .md tracks.

Co-Authored-By: Claude Sonnet 5 <noreply@anthropic.com>
Claude-Session: https://claude.ai/code/session_01No3CTqqXoAC7DqUj3kRTnA
</commit_message>
<xml_diff>
--- a/The Dolphins' View of History/The Dolphins' View of History - Complete Manuscript.docx
+++ b/The Dolphins' View of History/The Dolphins' View of History - Complete Manuscript.docx
@@ -4720,6 +4720,14 @@
     </w:p>
     <w:p>
       <w:pPr>
+        <w:spacing w:after="200"/>
+      </w:pPr>
+      <w:r>
+        <w:t xml:space="preserve">The new country was arguing itself into a vocabulary as well as a government. Noah Webster’s 1783 spelling book taught generations of American schoolchildren to read from the same primer, and his An American Dictionary of the English Language, finished after roughly two decades of work and 26 self-taught languages pressed into service for word origins, appeared in 1828. Webster trimmed British spellings he judged redundant, colour to color, theatre to theater, travelled to traveled, on a mix of simplifying principle and plain nationalism: a country that had just finished arguing its way out of a king, he thought, had no further use for the king’s spelling either. Dolphin historians, who settle every linguistic dispute they will ever have with one whistle per individual, rate two decades and twenty-six languages a thorough way to argue about which letters to keep.</w:t>
+      </w:r>
+    </w:p>
+    <w:p>
+      <w:pPr>
         <w:pStyle w:val="Heading2"/>
         <w:keepNext/>
         <w:spacing w:after="150" w:before="300"/>
@@ -12070,7 +12078,7 @@
       <w:r>
         <w:t xml:space="preserve">Thewissen, J. G. M., et al. “</w:t>
       </w:r>
-      <w:hyperlink w:history="1" r:id="rIdie3ja-k-tpchvn2jhsb1v">
+      <w:hyperlink w:history="1" r:id="rIdgrweappxtykjtbtq3bu8i">
         <w:r>
           <w:rPr>
             <w:color w:val="0563C1"/>
@@ -12098,7 +12106,7 @@
       <w:r>
         <w:t xml:space="preserve">Stringer, Chris. </w:t>
       </w:r>
-      <w:hyperlink w:history="1" r:id="rIdbrljzotcsmnva77dnzobf">
+      <w:hyperlink w:history="1" r:id="rIdbtgnzkel1fbtm5dd8st3u">
         <w:r>
           <w:rPr>
             <w:color w:val="0563C1"/>
@@ -12146,7 +12154,7 @@
       <w:r>
         <w:t xml:space="preserve">Marino, Lori. “</w:t>
       </w:r>
-      <w:hyperlink w:history="1" r:id="rIdnvnsv1fesxflmxr_trukx">
+      <w:hyperlink w:history="1" r:id="rIds-isqhw33hjb4a1rgaxr0">
         <w:r>
           <w:rPr>
             <w:color w:val="0563C1"/>
@@ -12174,7 +12182,7 @@
       <w:r>
         <w:t xml:space="preserve">Janik, Vincent M., Laela S. Sayigh, and Randall S. Wells. “</w:t>
       </w:r>
-      <w:hyperlink w:history="1" r:id="rIdz5d_-mwfxs5ozuf-iwpac">
+      <w:hyperlink w:history="1" r:id="rIdlpf0vqq_uhr-o37nvjusl">
         <w:r>
           <w:rPr>
             <w:color w:val="0563C1"/>
@@ -12202,7 +12210,7 @@
       <w:r>
         <w:t xml:space="preserve">Krützen, Michael, et al. “</w:t>
       </w:r>
-      <w:hyperlink w:history="1" r:id="rId2d1elqv0unkqyjcpz8vyt">
+      <w:hyperlink w:history="1" r:id="rIdoc8dfbg8n3p5njfpzdiuv">
         <w:r>
           <w:rPr>
             <w:color w:val="0563C1"/>
@@ -12230,7 +12238,7 @@
       <w:r>
         <w:t xml:space="preserve">Tennie, Claudio, Josep Call, and Michael Tomasello. “</w:t>
       </w:r>
-      <w:hyperlink w:history="1" r:id="rId-ylgnv2q9h3j53vy2clge">
+      <w:hyperlink w:history="1" r:id="rIdyu1jhfll7p5p0xrzftcrl">
         <w:r>
           <w:rPr>
             <w:color w:val="0563C1"/>
@@ -12294,7 +12302,7 @@
       <w:r>
         <w:t xml:space="preserve">Hublin, Jean-Jacques, et al. “</w:t>
       </w:r>
-      <w:hyperlink w:history="1" r:id="rIdqtkwokpa3xyj9afc8zqm5">
+      <w:hyperlink w:history="1" r:id="rIdep3lrgl7ag-ygi4jgtbjo">
         <w:r>
           <w:rPr>
             <w:color w:val="0563C1"/>
@@ -12322,7 +12330,7 @@
       <w:r>
         <w:t xml:space="preserve">Scerri, Eleanor M. L., et al. “</w:t>
       </w:r>
-      <w:hyperlink w:history="1" r:id="rIdmi4mlxgptukx27hzrkynw">
+      <w:hyperlink w:history="1" r:id="rIdksk-m6yl3drxdizyrhnqz">
         <w:r>
           <w:rPr>
             <w:color w:val="0563C1"/>
@@ -12350,7 +12358,7 @@
       <w:r>
         <w:t xml:space="preserve">Leakey, M. D., and R. L. Hay. “</w:t>
       </w:r>
-      <w:hyperlink w:history="1" r:id="rIdzifvq5blujuzkhwi5cpt0">
+      <w:hyperlink w:history="1" r:id="rIdfmmedbiwcl7ye2p5jdt3o">
         <w:r>
           <w:rPr>
             <w:color w:val="0563C1"/>
@@ -12378,7 +12386,7 @@
       <w:r>
         <w:t xml:space="preserve">Villmoare, Brian, et al. “</w:t>
       </w:r>
-      <w:hyperlink w:history="1" r:id="rIdpr0fwdgckn7408lx_wda9">
+      <w:hyperlink w:history="1" r:id="rIdqxqdlnus4p98zhkiwwys2">
         <w:r>
           <w:rPr>
             <w:color w:val="0563C1"/>
@@ -12406,7 +12414,7 @@
       <w:r>
         <w:t xml:space="preserve">Lordkipanidze, David, et al. “</w:t>
       </w:r>
-      <w:hyperlink w:history="1" r:id="rIdrok-nai1hql7cvur7_xxf">
+      <w:hyperlink w:history="1" r:id="rIdcd-gvwkga06ycbzhjtzfg">
         <w:r>
           <w:rPr>
             <w:color w:val="0563C1"/>
@@ -12434,7 +12442,7 @@
       <w:r>
         <w:t xml:space="preserve">Dirks, Paul H. G. M., et al. “</w:t>
       </w:r>
-      <w:hyperlink w:history="1" r:id="rId1kk68ce6jbgyhkq39x7ac">
+      <w:hyperlink w:history="1" r:id="rIdn9ncl4_wx7yjyhtk189zh">
         <w:r>
           <w:rPr>
             <w:color w:val="0563C1"/>
@@ -12462,7 +12470,7 @@
       <w:r>
         <w:t xml:space="preserve">Henshilwood, Christopher S., et al. “</w:t>
       </w:r>
-      <w:hyperlink w:history="1" r:id="rId0wwdp0txxbsi7_4vb7u3d">
+      <w:hyperlink w:history="1" r:id="rIdeyvsao_7po9vx8wv2ax3g">
         <w:r>
           <w:rPr>
             <w:color w:val="0563C1"/>
@@ -12526,7 +12534,7 @@
       <w:r>
         <w:t xml:space="preserve">Berna, Francesco, et al. “</w:t>
       </w:r>
-      <w:hyperlink w:history="1" r:id="rIdvlgs0q0ph6rchbc6wj70k">
+      <w:hyperlink w:history="1" r:id="rId6iuti-kjxznauajhyltcr">
         <w:r>
           <w:rPr>
             <w:color w:val="0563C1"/>
@@ -12554,7 +12562,7 @@
       <w:r>
         <w:t xml:space="preserve">Shahack-Gross, Ruth, et al. “</w:t>
       </w:r>
-      <w:hyperlink w:history="1" r:id="rIdb55jrzmozwdreabojcowo">
+      <w:hyperlink w:history="1" r:id="rIdn59aqo9pp5pfr7l4ewezp">
         <w:r>
           <w:rPr>
             <w:color w:val="0563C1"/>
@@ -12582,7 +12590,7 @@
       <w:r>
         <w:t xml:space="preserve">Harmand, Sonia, et al. “</w:t>
       </w:r>
-      <w:hyperlink w:history="1" r:id="rId1xijooxcibqp7qru7tnuy">
+      <w:hyperlink w:history="1" r:id="rIdpkatbb_5ndtmx0xexza-z">
         <w:r>
           <w:rPr>
             <w:color w:val="0563C1"/>
@@ -12610,7 +12618,7 @@
       <w:r>
         <w:t xml:space="preserve">Lepre, Christopher J., et al. “</w:t>
       </w:r>
-      <w:hyperlink w:history="1" r:id="rIdxr2uw9py4g0kr0nbqafxe">
+      <w:hyperlink w:history="1" r:id="rIdw3kdgkc5nklndvgoucmct">
         <w:r>
           <w:rPr>
             <w:color w:val="0563C1"/>
@@ -12638,7 +12646,7 @@
       <w:r>
         <w:t xml:space="preserve">Brown, Kyle S., et al. “</w:t>
       </w:r>
-      <w:hyperlink w:history="1" r:id="rIdfuclcgjguikg1ykkemzkk">
+      <w:hyperlink w:history="1" r:id="rIdj_zzmeejhkboudoo2jwnj">
         <w:r>
           <w:rPr>
             <w:color w:val="0563C1"/>
@@ -12666,7 +12674,7 @@
       <w:r>
         <w:t xml:space="preserve">Wrangham, Richard. </w:t>
       </w:r>
-      <w:hyperlink w:history="1" r:id="rIdfkwwqrru-nru3khfcf3zl">
+      <w:hyperlink w:history="1" r:id="rId6u_lkdr6214nwa3btndrc">
         <w:r>
           <w:rPr>
             <w:color w:val="0563C1"/>
@@ -12694,7 +12702,7 @@
       <w:r>
         <w:t xml:space="preserve">Fitch, W. Tecumseh. </w:t>
       </w:r>
-      <w:hyperlink w:history="1" r:id="rIdyjvdqsse_me8qcybwiydp">
+      <w:hyperlink w:history="1" r:id="rIdot1swtxfq9djhogva4ohl">
         <w:r>
           <w:rPr>
             <w:color w:val="0563C1"/>
@@ -12742,7 +12750,7 @@
       <w:r>
         <w:t xml:space="preserve">Clarkson, Chris, et al. “</w:t>
       </w:r>
-      <w:hyperlink w:history="1" r:id="rId6az3y8ahhdjdlmphrwqex">
+      <w:hyperlink w:history="1" r:id="rIdd4hijrjclghulsgdkr7nh">
         <w:r>
           <w:rPr>
             <w:color w:val="0563C1"/>
@@ -12770,7 +12778,7 @@
       <w:r>
         <w:t xml:space="preserve">O’Connell, James F., et al. “</w:t>
       </w:r>
-      <w:hyperlink w:history="1" r:id="rIdsnxqcsgmns6xyypt85oza">
+      <w:hyperlink w:history="1" r:id="rIdhknrt_ueb6yk3dupu66lv">
         <w:r>
           <w:rPr>
             <w:color w:val="0563C1"/>
@@ -12798,7 +12806,7 @@
       <w:r>
         <w:t xml:space="preserve">Reich, David, et al. “</w:t>
       </w:r>
-      <w:hyperlink w:history="1" r:id="rId-gn3me5qs3yahe50nsx9j">
+      <w:hyperlink w:history="1" r:id="rIdifob-tpybs5rchpfuy-1s">
         <w:r>
           <w:rPr>
             <w:color w:val="0563C1"/>
@@ -12826,7 +12834,7 @@
       <w:r>
         <w:t xml:space="preserve">Chen, Fahu, et al. “</w:t>
       </w:r>
-      <w:hyperlink w:history="1" r:id="rIdfjavuczbf5dst8er-ftk1">
+      <w:hyperlink w:history="1" r:id="rIdnyopglgx_bt0vxtm3v8pw">
         <w:r>
           <w:rPr>
             <w:color w:val="0563C1"/>
@@ -12854,7 +12862,7 @@
       <w:r>
         <w:t xml:space="preserve">Higham, Tom, et al. “</w:t>
       </w:r>
-      <w:hyperlink w:history="1" r:id="rIdktnlgzaytemvbqhiobcd1">
+      <w:hyperlink w:history="1" r:id="rIdhdttr3se5mpdx0r4qyeqb">
         <w:r>
           <w:rPr>
             <w:color w:val="0563C1"/>
@@ -12882,7 +12890,7 @@
       <w:r>
         <w:t xml:space="preserve">Sutikna, Thomas, et al. “</w:t>
       </w:r>
-      <w:hyperlink w:history="1" r:id="rIdg3qb7wsialbxlsacouaqg">
+      <w:hyperlink w:history="1" r:id="rIdfm6ju9aggi5uetmp5z3zl">
         <w:r>
           <w:rPr>
             <w:color w:val="0563C1"/>
@@ -12910,7 +12918,7 @@
       <w:r>
         <w:t xml:space="preserve">Oktaviana, Adhi Agus, et al. “</w:t>
       </w:r>
-      <w:hyperlink w:history="1" r:id="rIdcwof4wi7fgeokv4setbff">
+      <w:hyperlink w:history="1" r:id="rIdxs06ypbe8shrdmcpec758">
         <w:r>
           <w:rPr>
             <w:color w:val="0563C1"/>
@@ -12938,7 +12946,7 @@
       <w:r>
         <w:t xml:space="preserve">Bennett, Matthew R., et al. “</w:t>
       </w:r>
-      <w:hyperlink w:history="1" r:id="rId66r4dro45folx_gwgwxav">
+      <w:hyperlink w:history="1" r:id="rIdv0g5vsm2lxxrbiu-b_25n">
         <w:r>
           <w:rPr>
             <w:color w:val="0563C1"/>
@@ -12966,7 +12974,7 @@
       <w:r>
         <w:t xml:space="preserve">Reich, David. </w:t>
       </w:r>
-      <w:hyperlink w:history="1" r:id="rIdrtoegetf44itbjzvvak9c">
+      <w:hyperlink w:history="1" r:id="rIdryvhoy1k9hn48ykurzhtf">
         <w:r>
           <w:rPr>
             <w:color w:val="0563C1"/>
@@ -13014,7 +13022,7 @@
       <w:r>
         <w:t xml:space="preserve">Dietrich, Oliver, et al. “</w:t>
       </w:r>
-      <w:hyperlink w:history="1" r:id="rIdnu-togoyrikxqptydtneq">
+      <w:hyperlink w:history="1" r:id="rIdkz4ckl65_qb442ptiiuwi">
         <w:r>
           <w:rPr>
             <w:color w:val="0563C1"/>
@@ -13042,7 +13050,7 @@
       <w:r>
         <w:t xml:space="preserve">Larson, Greger, et al. “</w:t>
       </w:r>
-      <w:hyperlink w:history="1" r:id="rIdh7o9kk6vm4hor3ioxco2_">
+      <w:hyperlink w:history="1" r:id="rIdg2l-_20ydnlvbe88ykkvo">
         <w:r>
           <w:rPr>
             <w:color w:val="0563C1"/>
@@ -13070,7 +13078,7 @@
       <w:r>
         <w:t xml:space="preserve">Fuller, Dorian Q., et al. “</w:t>
       </w:r>
-      <w:hyperlink w:history="1" r:id="rIdw72mbegreqauzf1397tzo">
+      <w:hyperlink w:history="1" r:id="rIdg_vkvfrcl7_0ijoq9shjt">
         <w:r>
           <w:rPr>
             <w:color w:val="0563C1"/>
@@ -13098,7 +13106,7 @@
       <w:r>
         <w:t xml:space="preserve">Larsen, Clark Spencer. “</w:t>
       </w:r>
-      <w:hyperlink w:history="1" r:id="rId_mi6wxnp7mripfpbzlipu">
+      <w:hyperlink w:history="1" r:id="rId-1devxp7pxbozuqt9l2q6">
         <w:r>
           <w:rPr>
             <w:color w:val="0563C1"/>
@@ -13126,7 +13134,7 @@
       <w:r>
         <w:t xml:space="preserve">Hodder, Ian. </w:t>
       </w:r>
-      <w:hyperlink w:history="1" r:id="rIduplrfcrvj1lqesyw94qj3">
+      <w:hyperlink w:history="1" r:id="rId_j-y2ibxura3saafuswx1">
         <w:r>
           <w:rPr>
             <w:color w:val="0563C1"/>
@@ -13154,7 +13162,7 @@
       <w:r>
         <w:t xml:space="preserve">Scott, James C. </w:t>
       </w:r>
-      <w:hyperlink w:history="1" r:id="rIdw9jvsybrwcibvskt7nnzw">
+      <w:hyperlink w:history="1" r:id="rIdtul0zt-q_txldzi1jh2wy">
         <w:r>
           <w:rPr>
             <w:color w:val="0563C1"/>
@@ -13218,7 +13226,7 @@
       <w:r>
         <w:t xml:space="preserve">Schmandt-Besserat, Denise. </w:t>
       </w:r>
-      <w:hyperlink w:history="1" r:id="rIdmwwpaztby6qwznopover1">
+      <w:hyperlink w:history="1" r:id="rId92_4vrlh1axlxdd2jk1aw">
         <w:r>
           <w:rPr>
             <w:color w:val="0563C1"/>
@@ -13246,7 +13254,7 @@
       <w:r>
         <w:t xml:space="preserve">Nissen, Hans J., Peter Damerow, and Robert K. Englund. </w:t>
       </w:r>
-      <w:hyperlink w:history="1" r:id="rIdyzw4wamfgrsaq2gzmqbfq">
+      <w:hyperlink w:history="1" r:id="rIdrt-esjhjc3eayn0wig6ph">
         <w:r>
           <w:rPr>
             <w:color w:val="0563C1"/>
@@ -13274,7 +13282,7 @@
       <w:r>
         <w:t xml:space="preserve">Houston, Stephen D., ed. </w:t>
       </w:r>
-      <w:hyperlink w:history="1" r:id="rIdxwp7d59md9pbyjaonnkz0">
+      <w:hyperlink w:history="1" r:id="rIda9ubtofeqohwnisvu2jxh">
         <w:r>
           <w:rPr>
             <w:color w:val="0563C1"/>
@@ -13302,7 +13310,7 @@
       <w:r>
         <w:t xml:space="preserve">Schacter, Daniel L. </w:t>
       </w:r>
-      <w:hyperlink w:history="1" r:id="rIdnlfjfg9tpqxc0dmvbhlp2">
+      <w:hyperlink w:history="1" r:id="rId-qczqxmv7tnukxdt_qfqz">
         <w:r>
           <w:rPr>
             <w:color w:val="0563C1"/>
@@ -13382,7 +13390,7 @@
       <w:r>
         <w:t xml:space="preserve">Van De Mieroop, Marc. </w:t>
       </w:r>
-      <w:hyperlink w:history="1" r:id="rId-rbuzohmtb3evnfcuvhsk">
+      <w:hyperlink w:history="1" r:id="rIdcjdcq2viuijpnavf84jwm">
         <w:r>
           <w:rPr>
             <w:color w:val="0563C1"/>
@@ -13410,7 +13418,7 @@
       <w:r>
         <w:t xml:space="preserve">Lehner, Mark, and Zahi Hawass. </w:t>
       </w:r>
-      <w:hyperlink w:history="1" r:id="rIdakf0dagnbyrs7_maxzn5u">
+      <w:hyperlink w:history="1" r:id="rId3od2dvpt0qwhhv9p45en7">
         <w:r>
           <w:rPr>
             <w:color w:val="0563C1"/>
@@ -13438,7 +13446,7 @@
       <w:r>
         <w:t xml:space="preserve">Edgerton, William F. “</w:t>
       </w:r>
-      <w:hyperlink w:history="1" r:id="rIdtuno3krc_hdipblu36_fr">
+      <w:hyperlink w:history="1" r:id="rIdmdho5dgt8ht7arcqoyqwy">
         <w:r>
           <w:rPr>
             <w:color w:val="0563C1"/>
@@ -13466,7 +13474,7 @@
       <w:r>
         <w:t xml:space="preserve">Roth, Martha T. </w:t>
       </w:r>
-      <w:hyperlink w:history="1" r:id="rIdowgooec3scpgyhatlaqot">
+      <w:hyperlink w:history="1" r:id="rIdquk6b4hvgenbpfj9atate">
         <w:r>
           <w:rPr>
             <w:color w:val="0563C1"/>
@@ -13494,7 +13502,7 @@
       <w:r>
         <w:t xml:space="preserve">Bryce, Trevor. </w:t>
       </w:r>
-      <w:hyperlink w:history="1" r:id="rIddqt1kdzz5oqjapm2elqhn">
+      <w:hyperlink w:history="1" r:id="rIdmtczcwguyu5dqcw_y_vcp">
         <w:r>
           <w:rPr>
             <w:color w:val="0563C1"/>
@@ -13522,7 +13530,7 @@
       <w:r>
         <w:t xml:space="preserve">Parkinson, Richard. </w:t>
       </w:r>
-      <w:hyperlink w:history="1" r:id="rIdznnvet55wgopemhtins13">
+      <w:hyperlink w:history="1" r:id="rIdb4a3l7la8vwhvsepuyi6c">
         <w:r>
           <w:rPr>
             <w:color w:val="0563C1"/>
@@ -13570,7 +13578,7 @@
       <w:r>
         <w:t xml:space="preserve">Keightley, David N. </w:t>
       </w:r>
-      <w:hyperlink w:history="1" r:id="rId83vdnu0iq5_rhlwvnlb0p">
+      <w:hyperlink w:history="1" r:id="rIdqlykkfoguyniumnl23czg">
         <w:r>
           <w:rPr>
             <w:color w:val="0563C1"/>
@@ -13598,7 +13606,7 @@
       <w:r>
         <w:t xml:space="preserve">Lewis, Mark Edward. </w:t>
       </w:r>
-      <w:hyperlink w:history="1" r:id="rIdp23jahbtstwrxdjmutvdm">
+      <w:hyperlink w:history="1" r:id="rId9dpjq7rrgvrqsoyxx7gin">
         <w:r>
           <w:rPr>
             <w:color w:val="0563C1"/>
@@ -13626,7 +13634,7 @@
       <w:r>
         <w:t xml:space="preserve">Elman, Benjamin A. </w:t>
       </w:r>
-      <w:hyperlink w:history="1" r:id="rIdvzyaak38tpnawfopwoatz">
+      <w:hyperlink w:history="1" r:id="rIdnbaydy5lof6ngdjfybz9k">
         <w:r>
           <w:rPr>
             <w:color w:val="0563C1"/>
@@ -13654,7 +13662,7 @@
       <w:r>
         <w:t xml:space="preserve">Liu, Li, and Xingcan Chen. </w:t>
       </w:r>
-      <w:hyperlink w:history="1" r:id="rIdjjauh9yspf7dzx82mvqke">
+      <w:hyperlink w:history="1" r:id="rId-cve9t0qihcrm3uiiomem">
         <w:r>
           <w:rPr>
             <w:color w:val="0563C1"/>
@@ -13718,7 +13726,7 @@
       <w:r>
         <w:t xml:space="preserve">Possehl, Gregory L. </w:t>
       </w:r>
-      <w:hyperlink w:history="1" r:id="rId-mx1k0g9wk0swwet1ylwz">
+      <w:hyperlink w:history="1" r:id="rIdiqgaff_e9aheosfmf6fqg">
         <w:r>
           <w:rPr>
             <w:color w:val="0563C1"/>
@@ -13746,7 +13754,7 @@
       <w:r>
         <w:t xml:space="preserve">Thapar, Romila. </w:t>
       </w:r>
-      <w:hyperlink w:history="1" r:id="rIdsk_gvpge1f4phumwtxggv">
+      <w:hyperlink w:history="1" r:id="rIdhvcmd44ujfrt5xnky2jan">
         <w:r>
           <w:rPr>
             <w:color w:val="0563C1"/>
@@ -13774,7 +13782,7 @@
       <w:r>
         <w:t xml:space="preserve">Plofker, Kim. </w:t>
       </w:r>
-      <w:hyperlink w:history="1" r:id="rId4ucavkpc6juibcclfary8">
+      <w:hyperlink w:history="1" r:id="rId4eijjresuetbcetdblutf">
         <w:r>
           <w:rPr>
             <w:color w:val="0563C1"/>
@@ -13802,7 +13810,7 @@
       <w:r>
         <w:t xml:space="preserve">Dirks, Nicholas B. </w:t>
       </w:r>
-      <w:hyperlink w:history="1" r:id="rIda0jeo1nzr0wxo49wtydsf">
+      <w:hyperlink w:history="1" r:id="rIdvxhtg9gvuw3xf0hvdkhyl">
         <w:r>
           <w:rPr>
             <w:color w:val="0563C1"/>
@@ -13830,7 +13838,7 @@
       <w:r>
         <w:t xml:space="preserve">Dundas, Paul. </w:t>
       </w:r>
-      <w:hyperlink w:history="1" r:id="rIdxzdh0twzyx9rrpck-0oyz">
+      <w:hyperlink w:history="1" r:id="rIdnhx1m-qnqlzlrhjdrptrp">
         <w:r>
           <w:rPr>
             <w:color w:val="0563C1"/>
@@ -13910,7 +13918,7 @@
       <w:r>
         <w:t xml:space="preserve">Cartledge, Paul. </w:t>
       </w:r>
-      <w:hyperlink w:history="1" r:id="rIdsial0ds-j6z0pn_cvtgzu">
+      <w:hyperlink w:history="1" r:id="rIdz7brxxk7feuguqftsaadj">
         <w:r>
           <w:rPr>
             <w:color w:val="0563C1"/>
@@ -13938,7 +13946,7 @@
       <w:r>
         <w:t xml:space="preserve">Freeth, Tony, et al. “</w:t>
       </w:r>
-      <w:hyperlink w:history="1" r:id="rId3uiu9aytbn7brqbyr-chz">
+      <w:hyperlink w:history="1" r:id="rIdnxzfqwhnfc8etyjiqlqgc">
         <w:r>
           <w:rPr>
             <w:color w:val="0563C1"/>
@@ -13966,7 +13974,7 @@
       <w:r>
         <w:t xml:space="preserve">Freeth, Tony, et al. “</w:t>
       </w:r>
-      <w:hyperlink w:history="1" r:id="rIdfo0beohiixijnrb8haft8">
+      <w:hyperlink w:history="1" r:id="rIdjiwcdmsk97jbzxeqpvr2m">
         <w:r>
           <w:rPr>
             <w:color w:val="0563C1"/>
@@ -14014,7 +14022,7 @@
       <w:r>
         <w:t xml:space="preserve">Beard, Mary. </w:t>
       </w:r>
-      <w:hyperlink w:history="1" r:id="rIdbbp8coefcextuumdg5gou">
+      <w:hyperlink w:history="1" r:id="rIdzaacm07_efrcw9astzl5w">
         <w:r>
           <w:rPr>
             <w:color w:val="0563C1"/>
@@ -14042,7 +14050,7 @@
       <w:r>
         <w:t xml:space="preserve">Ward-Perkins, Bryan. </w:t>
       </w:r>
-      <w:hyperlink w:history="1" r:id="rIduxhdzkbvwcfviqvwx1dpm">
+      <w:hyperlink w:history="1" r:id="rIdd8bbtlxmbhoqp2lvuffj2">
         <w:r>
           <w:rPr>
             <w:color w:val="0563C1"/>
@@ -14070,7 +14078,7 @@
       <w:r>
         <w:t xml:space="preserve">Brown, Peter. </w:t>
       </w:r>
-      <w:hyperlink w:history="1" r:id="rIdjucrssgjmbxa_x-1cb6xw">
+      <w:hyperlink w:history="1" r:id="rIdxikfmhn7pdc8bhcvawwvp">
         <w:r>
           <w:rPr>
             <w:color w:val="0563C1"/>
@@ -14098,7 +14106,7 @@
       <w:r>
         <w:t xml:space="preserve">Harper, Kyle. </w:t>
       </w:r>
-      <w:hyperlink w:history="1" r:id="rIdvmw5tl296wqkrpfjybt8z">
+      <w:hyperlink w:history="1" r:id="rIddeltk5mrfjdfslu-wbxui">
         <w:r>
           <w:rPr>
             <w:color w:val="0563C1"/>
@@ -14146,7 +14154,7 @@
       <w:r>
         <w:t xml:space="preserve">Kennedy, Hugh. </w:t>
       </w:r>
-      <w:hyperlink w:history="1" r:id="rIditwgwe-s3br9_nizmhfqj">
+      <w:hyperlink w:history="1" r:id="rIdxpczv0sji30yap-kgmpxi">
         <w:r>
           <w:rPr>
             <w:color w:val="0563C1"/>
@@ -14174,7 +14182,7 @@
       <w:r>
         <w:t xml:space="preserve">Gutas, Dimitri. </w:t>
       </w:r>
-      <w:hyperlink w:history="1" r:id="rIda9vwyfus78pisjjav5vkw">
+      <w:hyperlink w:history="1" r:id="rIdvx-hkikt6vylzne3iajte">
         <w:r>
           <w:rPr>
             <w:color w:val="0563C1"/>
@@ -14234,7 +14242,7 @@
       <w:r>
         <w:t xml:space="preserve">Riley-Smith, Jonathan. </w:t>
       </w:r>
-      <w:hyperlink w:history="1" r:id="rId_ddxs0gw64q3vus3dvssh">
+      <w:hyperlink w:history="1" r:id="rId9o27psxfulsnkzzr4pv0z">
         <w:r>
           <w:rPr>
             <w:color w:val="0563C1"/>
@@ -14278,7 +14286,7 @@
       <w:r>
         <w:t xml:space="preserve">Phillips, Jonathan. </w:t>
       </w:r>
-      <w:hyperlink w:history="1" r:id="rIdtwwfwed8_40cuqac2vgx6">
+      <w:hyperlink w:history="1" r:id="rIdepojn_da2jav6mndpdzby">
         <w:r>
           <w:rPr>
             <w:color w:val="0563C1"/>
@@ -14306,7 +14314,7 @@
       <w:r>
         <w:t xml:space="preserve">Stark, Rodney. </w:t>
       </w:r>
-      <w:hyperlink w:history="1" r:id="rIdh0swdr6ioieeprtq13ux8">
+      <w:hyperlink w:history="1" r:id="rIddszrurli0qrki-d0yguk4">
         <w:r>
           <w:rPr>
             <w:color w:val="0563C1"/>
@@ -14354,7 +14362,7 @@
       <w:r>
         <w:t xml:space="preserve">Mommsen, Theodor E. “</w:t>
       </w:r>
-      <w:hyperlink w:history="1" r:id="rIdyzymxichthgxnvfsrkxgk">
+      <w:hyperlink w:history="1" r:id="rIdnhqkfa1fmmxow2iug3qup">
         <w:r>
           <w:rPr>
             <w:color w:val="0563C1"/>
@@ -14382,7 +14390,7 @@
       <w:r>
         <w:t xml:space="preserve">Wickham, Chris. </w:t>
       </w:r>
-      <w:hyperlink w:history="1" r:id="rIdpaobwouajfqbakx6d6yrx">
+      <w:hyperlink w:history="1" r:id="rIdkrf7sk-3onsrbkeho_rek">
         <w:r>
           <w:rPr>
             <w:color w:val="0563C1"/>
@@ -14410,7 +14418,7 @@
       <w:r>
         <w:t xml:space="preserve">Russell, Jeffrey Burton. </w:t>
       </w:r>
-      <w:hyperlink w:history="1" r:id="rIdton_2l3oukaomtteart4t">
+      <w:hyperlink w:history="1" r:id="rIdzmm5cjm_pja4ru-qboa3d">
         <w:r>
           <w:rPr>
             <w:color w:val="0563C1"/>
@@ -14474,7 +14482,7 @@
       <w:r>
         <w:t xml:space="preserve">Hansen, Valerie. </w:t>
       </w:r>
-      <w:hyperlink w:history="1" r:id="rIdfhonst_yhsxvxipj6n9it">
+      <w:hyperlink w:history="1" r:id="rIdbwauq9x78uq9zpiilhvod">
         <w:r>
           <w:rPr>
             <w:color w:val="0563C1"/>
@@ -14502,7 +14510,7 @@
       <w:r>
         <w:t xml:space="preserve">Spyrou, Maria A., et al. “</w:t>
       </w:r>
-      <w:hyperlink w:history="1" r:id="rIdyhzpuoapaevho-oif6lzw">
+      <w:hyperlink w:history="1" r:id="rIdpytl2nd3b_-qg3cjyn6pv">
         <w:r>
           <w:rPr>
             <w:color w:val="0563C1"/>
@@ -14530,7 +14538,7 @@
       <w:r>
         <w:t xml:space="preserve">Wheelis, Mark. “</w:t>
       </w:r>
-      <w:hyperlink w:history="1" r:id="rId4hfzl15716_uorknta8on">
+      <w:hyperlink w:history="1" r:id="rIds9vuqjzygcx1pggbbb4s2">
         <w:r>
           <w:rPr>
             <w:color w:val="0563C1"/>
@@ -14558,7 +14566,7 @@
       <w:r>
         <w:t xml:space="preserve">Dean, Katharine R., et al. “</w:t>
       </w:r>
-      <w:hyperlink w:history="1" r:id="rIdj1exbo2ipps7ahuvuch2a">
+      <w:hyperlink w:history="1" r:id="rId9ixznu34pmlzq77sqgnj3">
         <w:r>
           <w:rPr>
             <w:color w:val="0563C1"/>
@@ -14586,7 +14594,7 @@
       <w:r>
         <w:t xml:space="preserve">Benedictow, Ole J. </w:t>
       </w:r>
-      <w:hyperlink w:history="1" r:id="rIdui7uf88j34nik0a_u8dqk">
+      <w:hyperlink w:history="1" r:id="rIdba2qssw6kpniaw30zhdof">
         <w:r>
           <w:rPr>
             <w:color w:val="0563C1"/>
@@ -14650,7 +14658,7 @@
       <w:r>
         <w:t xml:space="preserve">Gomez, Michael A. </w:t>
       </w:r>
-      <w:hyperlink w:history="1" r:id="rIdhid8ffs_dtw07kadepj5i">
+      <w:hyperlink w:history="1" r:id="rId6vcrpw_dhf7aqr69ujwng">
         <w:r>
           <w:rPr>
             <w:color w:val="0563C1"/>
@@ -14710,7 +14718,7 @@
       <w:r>
         <w:t xml:space="preserve">Edwards, David N. </w:t>
       </w:r>
-      <w:hyperlink w:history="1" r:id="rIdebd-uunfxbgyuokvpgr5s">
+      <w:hyperlink w:history="1" r:id="rId5ff8iaeeedjafmoa1nww9">
         <w:r>
           <w:rPr>
             <w:color w:val="0563C1"/>
@@ -14738,7 +14746,7 @@
       <w:r>
         <w:t xml:space="preserve">Pikirayi, Innocent. </w:t>
       </w:r>
-      <w:hyperlink w:history="1" r:id="rIdpicex9mmpgiwd--fc46a-">
+      <w:hyperlink w:history="1" r:id="rIdo_j040ha9bymvusv8sxi4">
         <w:r>
           <w:rPr>
             <w:color w:val="0563C1"/>
@@ -14766,7 +14774,7 @@
       <w:r>
         <w:t xml:space="preserve">Hicks, Dan. </w:t>
       </w:r>
-      <w:hyperlink w:history="1" r:id="rIdzokgey6hgcd9y-xzj5mlx">
+      <w:hyperlink w:history="1" r:id="rIdtl_rcfkrp9g22tor-xkbh">
         <w:r>
           <w:rPr>
             <w:color w:val="0563C1"/>
@@ -14814,7 +14822,7 @@
       <w:r>
         <w:t xml:space="preserve">Thornton, John K. </w:t>
       </w:r>
-      <w:hyperlink w:history="1" r:id="rIdyyzxq8i53h9y43dmzndzo">
+      <w:hyperlink w:history="1" r:id="rId8r6ildmqncwlyuoqydima">
         <w:r>
           <w:rPr>
             <w:color w:val="0563C1"/>
@@ -14842,7 +14850,7 @@
       <w:r>
         <w:t xml:space="preserve">McCaskie, T. C. </w:t>
       </w:r>
-      <w:hyperlink w:history="1" r:id="rId4ud6wienqhglci1_nahpp">
+      <w:hyperlink w:history="1" r:id="rIdsgman9vuku8ogxsjfizog">
         <w:r>
           <w:rPr>
             <w:color w:val="0563C1"/>
@@ -14870,7 +14878,7 @@
       <w:r>
         <w:t xml:space="preserve">Hochschild, Adam. </w:t>
       </w:r>
-      <w:hyperlink w:history="1" r:id="rIdcs3hclchx_xbmmjplopjg">
+      <w:hyperlink w:history="1" r:id="rIdi0uev3qqnpdtnnzu0n0b-">
         <w:r>
           <w:rPr>
             <w:color w:val="0563C1"/>
@@ -14914,7 +14922,7 @@
       <w:r>
         <w:t xml:space="preserve">Kara, Siddharth. </w:t>
       </w:r>
-      <w:hyperlink w:history="1" r:id="rIddhbjl50ojc6xip7jq4h0q">
+      <w:hyperlink w:history="1" r:id="rIdm1uwgor0cmxvrrjbxlctv">
         <w:r>
           <w:rPr>
             <w:color w:val="0563C1"/>
@@ -14978,7 +14986,7 @@
       <w:r>
         <w:t xml:space="preserve">Mann, Charles C. </w:t>
       </w:r>
-      <w:hyperlink w:history="1" r:id="rIdwyre2apjanq7khgayzpou">
+      <w:hyperlink w:history="1" r:id="rIdxs7vxpku4lxiaexni53jd">
         <w:r>
           <w:rPr>
             <w:color w:val="0563C1"/>
@@ -15006,7 +15014,7 @@
       <w:r>
         <w:t xml:space="preserve">Matsuoka, Yoshihiro, et al. “</w:t>
       </w:r>
-      <w:hyperlink w:history="1" r:id="rIdld_ovxtbot0phwqvoxwzk">
+      <w:hyperlink w:history="1" r:id="rIdq9u-8bvwalok_u7kpfmiu">
         <w:r>
           <w:rPr>
             <w:color w:val="0563C1"/>
@@ -15034,7 +15042,7 @@
       <w:r>
         <w:t xml:space="preserve">Shady Solis, Ruth, Jonathan Haas, and Winifred Creamer. “</w:t>
       </w:r>
-      <w:hyperlink w:history="1" r:id="rIdwi8jsifqo574dbdzdqfoj">
+      <w:hyperlink w:history="1" r:id="rIdwc4bsqz8pbib2ltn90pto">
         <w:r>
           <w:rPr>
             <w:color w:val="0563C1"/>
@@ -15062,7 +15070,7 @@
       <w:r>
         <w:t xml:space="preserve">Urton, Gary. </w:t>
       </w:r>
-      <w:hyperlink w:history="1" r:id="rId2syxy4rkxmyrrjliqgosw">
+      <w:hyperlink w:history="1" r:id="rIdclbhcd96oakuiva4v6ooc">
         <w:r>
           <w:rPr>
             <w:color w:val="0563C1"/>
@@ -15090,7 +15098,7 @@
       <w:r>
         <w:t xml:space="preserve">Denevan, William M., ed. </w:t>
       </w:r>
-      <w:hyperlink w:history="1" r:id="rIdz2tg2e3kltkugbpwiv4iy">
+      <w:hyperlink w:history="1" r:id="rIdpk3oogffqvynhc20n7ylb">
         <w:r>
           <w:rPr>
             <w:color w:val="0563C1"/>
@@ -15118,7 +15126,7 @@
       <w:r>
         <w:t xml:space="preserve">Henige, David. </w:t>
       </w:r>
-      <w:hyperlink w:history="1" r:id="rIdieqmsctbc4itbtxzqgnqc">
+      <w:hyperlink w:history="1" r:id="rIdk2ieua09aum83h0vgpkg_">
         <w:r>
           <w:rPr>
             <w:color w:val="0563C1"/>
@@ -15146,7 +15154,7 @@
       <w:r>
         <w:t xml:space="preserve">Koch, Alexander, Chris Brierley, Mark M. Maslin, and Simon L. Lewis. “</w:t>
       </w:r>
-      <w:hyperlink w:history="1" r:id="rIdofzquuchfyhd16_gyap28">
+      <w:hyperlink w:history="1" r:id="rIdwcamhdcgodktvlmjctpl6">
         <w:r>
           <w:rPr>
             <w:color w:val="0563C1"/>
@@ -15174,7 +15182,7 @@
       <w:r>
         <w:t xml:space="preserve">Ioannidis, Alexander G., et al. “</w:t>
       </w:r>
-      <w:hyperlink w:history="1" r:id="rIdyyiftvibliaqdobc_blwu">
+      <w:hyperlink w:history="1" r:id="rId6qlrzmkb3bdjvwedtvcxg">
         <w:r>
           <w:rPr>
             <w:color w:val="0563C1"/>
@@ -15202,7 +15210,7 @@
       <w:r>
         <w:t xml:space="preserve">Pauketat, Timothy R. </w:t>
       </w:r>
-      <w:hyperlink w:history="1" r:id="rId38eeqkbmgz9o93bfkazk8">
+      <w:hyperlink w:history="1" r:id="rIdvi2bw_5-jkksrmbfg4yp5">
         <w:r>
           <w:rPr>
             <w:color w:val="0563C1"/>
@@ -15230,7 +15238,7 @@
       <w:r>
         <w:t xml:space="preserve">Dobyns, Henry F. “</w:t>
       </w:r>
-      <w:hyperlink w:history="1" r:id="rIdihbj-x89a6vb7f7chlbgz">
+      <w:hyperlink w:history="1" r:id="rIdrg8cp5myqi4_exeslxuop">
         <w:r>
           <w:rPr>
             <w:color w:val="0563C1"/>
@@ -15291,7 +15299,7 @@
         </w:rPr>
         <w:t xml:space="preserve">The voyages database behind those numbers. </w:t>
       </w:r>
-      <w:hyperlink w:history="1" r:id="rIdftj-u7yhj3z7ar_isihxa">
+      <w:hyperlink w:history="1" r:id="rIdd-vdlb-5bixmqscgfvruc">
         <w:r>
           <w:rPr>
             <w:color w:val="0563C1"/>
@@ -15319,7 +15327,7 @@
       <w:r>
         <w:t xml:space="preserve">Equiano, Olaudah. </w:t>
       </w:r>
-      <w:hyperlink w:history="1" r:id="rIdyae1mnrrtbbvspvpg7_si">
+      <w:hyperlink w:history="1" r:id="rId_2qkf5yfhioqzr-0pflxb">
         <w:r>
           <w:rPr>
             <w:color w:val="0563C1"/>
@@ -15347,7 +15355,7 @@
       <w:r>
         <w:t xml:space="preserve">Carretta, Vincent. </w:t>
       </w:r>
-      <w:hyperlink w:history="1" r:id="rId5gktlr286lxhgkptpok25">
+      <w:hyperlink w:history="1" r:id="rId4ykimlbc0idw029is9lhz">
         <w:r>
           <w:rPr>
             <w:color w:val="0563C1"/>
@@ -15375,7 +15383,7 @@
       <w:r>
         <w:t xml:space="preserve">Hurston, Zora Neale. </w:t>
       </w:r>
-      <w:hyperlink w:history="1" r:id="rId_kj1_qd1n8spux6iz-zic">
+      <w:hyperlink w:history="1" r:id="rId7elgwoo57mqlx9nv_hb_v">
         <w:r>
           <w:rPr>
             <w:color w:val="0563C1"/>
@@ -15403,7 +15411,7 @@
       <w:r>
         <w:t xml:space="preserve">Diouf, Sylviane A. </w:t>
       </w:r>
-      <w:hyperlink w:history="1" r:id="rIdc1geh_vg_6fe2gxdc7bux">
+      <w:hyperlink w:history="1" r:id="rIdwjy2q4l2ctruikd_7drce">
         <w:r>
           <w:rPr>
             <w:color w:val="0563C1"/>
@@ -15431,7 +15439,7 @@
       <w:r>
         <w:t xml:space="preserve">Livi Bacci, Massimo. </w:t>
       </w:r>
-      <w:hyperlink w:history="1" r:id="rIdnfgrrz6qpv-rlurwghscn">
+      <w:hyperlink w:history="1" r:id="rIdp4kkozqza7cdwttzyeo9o">
         <w:r>
           <w:rPr>
             <w:color w:val="0563C1"/>
@@ -15459,7 +15467,7 @@
       <w:r>
         <w:t xml:space="preserve">Reséndez, Andrés. </w:t>
       </w:r>
-      <w:hyperlink w:history="1" r:id="rIdexkiqnssaqupxmjg2xifn">
+      <w:hyperlink w:history="1" r:id="rIditag73nbuzg49ujnfccil">
         <w:r>
           <w:rPr>
             <w:color w:val="0563C1"/>
@@ -15487,7 +15495,7 @@
       <w:r>
         <w:t xml:space="preserve">Dreyer, Edward L. </w:t>
       </w:r>
-      <w:hyperlink w:history="1" r:id="rId-wi790ncfr6ideu0sgt3n">
+      <w:hyperlink w:history="1" r:id="rIdrle6xzdtx7ocitx5annus">
         <w:r>
           <w:rPr>
             <w:color w:val="0563C1"/>
@@ -15551,7 +15559,7 @@
       <w:r>
         <w:t xml:space="preserve">Eisenstein, Elizabeth L. </w:t>
       </w:r>
-      <w:hyperlink w:history="1" r:id="rIdylbgiswcb3julgzbnaner">
+      <w:hyperlink w:history="1" r:id="rIdna2unubucojco1qclksza">
         <w:r>
           <w:rPr>
             <w:color w:val="0563C1"/>
@@ -15579,7 +15587,7 @@
       <w:r>
         <w:t xml:space="preserve">Allen, Robert C. </w:t>
       </w:r>
-      <w:hyperlink w:history="1" r:id="rId-ymsbk5oy_40y2f6rjkmd">
+      <w:hyperlink w:history="1" r:id="rId0k9kkx_kog3t6akgzgafc">
         <w:r>
           <w:rPr>
             <w:color w:val="0563C1"/>
@@ -15607,7 +15615,7 @@
       <w:r>
         <w:t xml:space="preserve">Humphries, Jane. </w:t>
       </w:r>
-      <w:hyperlink w:history="1" r:id="rIdtege7k_6ivmpbzgq0u_ba">
+      <w:hyperlink w:history="1" r:id="rId-j4za0ofa4a9kgheqcfyj">
         <w:r>
           <w:rPr>
             <w:color w:val="0563C1"/>
@@ -15635,7 +15643,7 @@
       <w:r>
         <w:t xml:space="preserve">Pomeranz, Kenneth. </w:t>
       </w:r>
-      <w:hyperlink w:history="1" r:id="rIdakbpgw_hh0chemza-fuo2">
+      <w:hyperlink w:history="1" r:id="rIdualdzzuxhuoqzwa9p_xk6">
         <w:r>
           <w:rPr>
             <w:color w:val="0563C1"/>
@@ -15663,7 +15671,7 @@
       <w:r>
         <w:t xml:space="preserve">Bell, Michelle L., and Devra Lee Davis. “</w:t>
       </w:r>
-      <w:hyperlink w:history="1" r:id="rIdzq5jszkxxodfzaqjmpinl">
+      <w:hyperlink w:history="1" r:id="rIdhwds8tuhnkueb26wk6et0">
         <w:r>
           <w:rPr>
             <w:color w:val="0563C1"/>
@@ -15706,12 +15714,28 @@
           <w:i/>
           <w:iCs/>
         </w:rPr>
+        <w:t xml:space="preserve">Noah Webster’s dictionary and the American spelling reform. </w:t>
+      </w:r>
+      <w:r>
+        <w:t xml:space="preserve">Kendall, Joshua. The Forgotten Founding Father: Noah Webster’s Obsession and the Creation of an American Culture. New York: G. P. Putnam’s Sons, 2010.</w:t>
+      </w:r>
+    </w:p>
+    <w:p>
+      <w:pPr>
+        <w:spacing w:after="120"/>
+        <w:ind w:left="360" w:hanging="360"/>
+      </w:pPr>
+      <w:r>
+        <w:rPr>
+          <w:i/>
+          <w:iCs/>
+        </w:rPr>
         <w:t xml:space="preserve">The Civil War death toll. </w:t>
       </w:r>
       <w:r>
         <w:t xml:space="preserve">Hacker, J. David. “</w:t>
       </w:r>
-      <w:hyperlink w:history="1" r:id="rIdotp-8ytatjubldq6j55b9">
+      <w:hyperlink w:history="1" r:id="rIdvv7t3-nqmimln0wqymw8w">
         <w:r>
           <w:rPr>
             <w:color w:val="0563C1"/>
@@ -15739,7 +15763,7 @@
       <w:r>
         <w:t xml:space="preserve">Foner, Eric. </w:t>
       </w:r>
-      <w:hyperlink w:history="1" r:id="rIdkxrievhlilazpwawed7ey">
+      <w:hyperlink w:history="1" r:id="rIdjlrry0oloabdhipmc_afo">
         <w:r>
           <w:rPr>
             <w:color w:val="0563C1"/>
@@ -15767,7 +15791,7 @@
       <w:r>
         <w:t xml:space="preserve">Saunt, Claudio. </w:t>
       </w:r>
-      <w:hyperlink w:history="1" r:id="rIdio2ptaboflqvznqxddv7e">
+      <w:hyperlink w:history="1" r:id="rIdqm55cqtsnko2ozihizpaj">
         <w:r>
           <w:rPr>
             <w:color w:val="0563C1"/>
@@ -15795,7 +15819,7 @@
       <w:r>
         <w:t xml:space="preserve">Horn, James. </w:t>
       </w:r>
-      <w:hyperlink w:history="1" r:id="rIdd_wdobjeausrhqfpnxq8p">
+      <w:hyperlink w:history="1" r:id="rId3lbtf5dnhckvurlfrcyya">
         <w:r>
           <w:rPr>
             <w:color w:val="0563C1"/>
@@ -15823,7 +15847,7 @@
       <w:r>
         <w:t xml:space="preserve">Wilentz, Sean. </w:t>
       </w:r>
-      <w:hyperlink w:history="1" r:id="rId04trggcplsgswvn0euntv">
+      <w:hyperlink w:history="1" r:id="rIdsr3qkyj899bjrxa7yvewe">
         <w:r>
           <w:rPr>
             <w:color w:val="0563C1"/>
@@ -15871,7 +15895,7 @@
       <w:r>
         <w:t xml:space="preserve">Equal Justice Initiative. </w:t>
       </w:r>
-      <w:hyperlink w:history="1" r:id="rIdlfbfb89l49akqrls2pnzd">
+      <w:hyperlink w:history="1" r:id="rIdwvl_2ax-ihbjjbkfw1you">
         <w:r>
           <w:rPr>
             <w:color w:val="0563C1"/>
@@ -15915,7 +15939,7 @@
       <w:r>
         <w:t xml:space="preserve">Robinson, Greg. </w:t>
       </w:r>
-      <w:hyperlink w:history="1" r:id="rId85jpxm4rg3nf72ccbe54o">
+      <w:hyperlink w:history="1" r:id="rIddvmamwfcpuy5ctmj4bfi6">
         <w:r>
           <w:rPr>
             <w:color w:val="0563C1"/>
@@ -15943,7 +15967,7 @@
       <w:r>
         <w:t xml:space="preserve">Blinder, Alan S. </w:t>
       </w:r>
-      <w:hyperlink w:history="1" r:id="rIdiu_xxw0ll9y-tjuve7qw_">
+      <w:hyperlink w:history="1" r:id="rIduvpl7weeszytb_no7qx4k">
         <w:r>
           <w:rPr>
             <w:color w:val="0563C1"/>
@@ -15991,7 +16015,7 @@
       <w:r>
         <w:t xml:space="preserve">Butler, Jon. </w:t>
       </w:r>
-      <w:hyperlink w:history="1" r:id="rId925t8dcaaq9k1oplxypdw">
+      <w:hyperlink w:history="1" r:id="rIdml155_hsycm9p72awl_cf">
         <w:r>
           <w:rPr>
             <w:color w:val="0563C1"/>
@@ -16019,7 +16043,7 @@
       <w:r>
         <w:t xml:space="preserve">Hatch, Nathan O. </w:t>
       </w:r>
-      <w:hyperlink w:history="1" r:id="rIda2reuufdzvgvnbqvlvj5x">
+      <w:hyperlink w:history="1" r:id="rIdhgt2_cjjvnmiaewfaiiib">
         <w:r>
           <w:rPr>
             <w:color w:val="0563C1"/>
@@ -16047,7 +16071,7 @@
       <w:r>
         <w:t xml:space="preserve">Bushman, Richard Lyman. </w:t>
       </w:r>
-      <w:hyperlink w:history="1" r:id="rIdywzs-h_dpbq0kwp7tofwj">
+      <w:hyperlink w:history="1" r:id="rIds62vh3hvnb0w7tv9ysy7b">
         <w:r>
           <w:rPr>
             <w:color w:val="0563C1"/>
@@ -16075,7 +16099,7 @@
       <w:r>
         <w:t xml:space="preserve">Kraybill, Donald B., Karen M. Johnson-Weiner, and Steven M. Nolt. </w:t>
       </w:r>
-      <w:hyperlink w:history="1" r:id="rIdcn7eqxnx6gxoh5ratoa2c">
+      <w:hyperlink w:history="1" r:id="rIdsvlurxdpnfalesn-4wvuy">
         <w:r>
           <w:rPr>
             <w:color w:val="0563C1"/>
@@ -16103,7 +16127,7 @@
       <w:r>
         <w:t xml:space="preserve">Moore, Rebecca. </w:t>
       </w:r>
-      <w:hyperlink w:history="1" r:id="rId4iofsdwkhtxxdvp0jxgb-">
+      <w:hyperlink w:history="1" r:id="rIde4zf8uiuxjj1zo3dafva2">
         <w:r>
           <w:rPr>
             <w:color w:val="0563C1"/>
@@ -16167,7 +16191,7 @@
       <w:r>
         <w:t xml:space="preserve">Lynch, John. </w:t>
       </w:r>
-      <w:hyperlink w:history="1" r:id="rIdxidxudvvf-41xkywna7lt">
+      <w:hyperlink w:history="1" r:id="rIdk8d79rk6ep3ch_xi8cjam">
         <w:r>
           <w:rPr>
             <w:color w:val="0563C1"/>
@@ -16195,7 +16219,7 @@
       <w:r>
         <w:t xml:space="preserve">Dubois, Laurent. </w:t>
       </w:r>
-      <w:hyperlink w:history="1" r:id="rIddmkydocqwjzywpvczwcql">
+      <w:hyperlink w:history="1" r:id="rIdurtb54hdt0drnau2n81g3">
         <w:r>
           <w:rPr>
             <w:color w:val="0563C1"/>
@@ -16223,7 +16247,7 @@
       <w:r>
         <w:t xml:space="preserve">Conrad, Robert Edgar. </w:t>
       </w:r>
-      <w:hyperlink w:history="1" r:id="rId7brtxb0irhoemfm-miumk">
+      <w:hyperlink w:history="1" r:id="rIdyukixpampot5ebk_rvlh7">
         <w:r>
           <w:rPr>
             <w:color w:val="0563C1"/>
@@ -16248,7 +16272,7 @@
         </w:rPr>
         <w:t xml:space="preserve">Brazil’s share of the Atlantic slave trade. </w:t>
       </w:r>
-      <w:hyperlink w:history="1" r:id="rIdxmnelbg2ylb9kthq9szqy">
+      <w:hyperlink w:history="1" r:id="rIdw_rirmqgqgdyswkfo724j">
         <w:r>
           <w:rPr>
             <w:color w:val="0563C1"/>
@@ -16276,7 +16300,7 @@
       <w:r>
         <w:t xml:space="preserve">Smith, Peter H. </w:t>
       </w:r>
-      <w:hyperlink w:history="1" r:id="rIdvbzr5rjblwwtug2su66al">
+      <w:hyperlink w:history="1" r:id="rIdxcntuo4rpztrbeobmcq3f">
         <w:r>
           <w:rPr>
             <w:color w:val="0563C1"/>
@@ -16304,7 +16328,7 @@
       <w:r>
         <w:t xml:space="preserve">Schlesinger, Stephen, and Stephen Kinzer. </w:t>
       </w:r>
-      <w:hyperlink w:history="1" r:id="rIdsjixkhtjsnbs2wv37d8m8">
+      <w:hyperlink w:history="1" r:id="rIdwonw5pwpek_66z15jajrh">
         <w:r>
           <w:rPr>
             <w:color w:val="0563C1"/>
@@ -16332,7 +16356,7 @@
       <w:r>
         <w:t xml:space="preserve">Slater, Candace. </w:t>
       </w:r>
-      <w:hyperlink w:history="1" r:id="rIdrkrdaffl5g3ewcvblg2kq">
+      <w:hyperlink w:history="1" r:id="rIds5sz6rrpkrszcjmvngyhm">
         <w:r>
           <w:rPr>
             <w:color w:val="0563C1"/>
@@ -16360,7 +16384,7 @@
       <w:r>
         <w:t xml:space="preserve">Taylor, Barbara L., et al. “</w:t>
       </w:r>
-      <w:hyperlink w:history="1" r:id="rIdf83k6tf8bdtw0u61vibwp">
+      <w:hyperlink w:history="1" r:id="rIdwx7yxnxhjcug99hvcoh_b">
         <w:r>
           <w:rPr>
             <w:color w:val="0563C1"/>
@@ -16388,7 +16412,7 @@
       <w:r>
         <w:t xml:space="preserve">NOAA Fisheries. “</w:t>
       </w:r>
-      <w:hyperlink w:history="1" r:id="rId3yyg6klx26phjm-w6cgwb">
+      <w:hyperlink w:history="1" r:id="rIdcy-z2bqwvpqcbbtd-12xp">
         <w:r>
           <w:rPr>
             <w:color w:val="0563C1"/>
@@ -16416,7 +16440,7 @@
       <w:r>
         <w:t xml:space="preserve">Skidmore, Thomas E. </w:t>
       </w:r>
-      <w:hyperlink w:history="1" r:id="rIdxculkchuzpwuj9uj029hj">
+      <w:hyperlink w:history="1" r:id="rIdk917r5jbjt-4fwyvmtkrh">
         <w:r>
           <w:rPr>
             <w:color w:val="0563C1"/>
@@ -16444,7 +16468,7 @@
       <w:r>
         <w:t xml:space="preserve">Comisión Nacional sobre la Desaparición de Personas. </w:t>
       </w:r>
-      <w:hyperlink w:history="1" r:id="rIdhuu06huexbq5qk9oh7ypb">
+      <w:hyperlink w:history="1" r:id="rIdb-rea1wo3np_wo-hvyail">
         <w:r>
           <w:rPr>
             <w:color w:val="0563C1"/>
@@ -16472,7 +16496,7 @@
       <w:r>
         <w:t xml:space="preserve">Nino, Carlos Santiago. </w:t>
       </w:r>
-      <w:hyperlink w:history="1" r:id="rId5avtcgf4xd1ly9mww9mgz">
+      <w:hyperlink w:history="1" r:id="rId3rz_fwcmofrrv4g9y6ekn">
         <w:r>
           <w:rPr>
             <w:color w:val="0563C1"/>
@@ -16500,7 +16524,7 @@
       <w:r>
         <w:t xml:space="preserve">Bouvard, Marguerite Guzman. </w:t>
       </w:r>
-      <w:hyperlink w:history="1" r:id="rIdrinftpba4pt_qk2hfiwwp">
+      <w:hyperlink w:history="1" r:id="rIdmesv8jy43egz7am7kzacv">
         <w:r>
           <w:rPr>
             <w:color w:val="0563C1"/>
@@ -16528,7 +16552,7 @@
       <w:r>
         <w:t xml:space="preserve">Kornbluh, Peter. </w:t>
       </w:r>
-      <w:hyperlink w:history="1" r:id="rIduko3ebrjrprhjxjrhdyfj">
+      <w:hyperlink w:history="1" r:id="rIdqcpevqgqkj5wxt-2lwhhj">
         <w:r>
           <w:rPr>
             <w:color w:val="0563C1"/>
@@ -16556,7 +16580,7 @@
       <w:r>
         <w:t xml:space="preserve">Jara, Joan. </w:t>
       </w:r>
-      <w:hyperlink w:history="1" r:id="rIdj8izm7abc-lcpn9lizqql">
+      <w:hyperlink w:history="1" r:id="rIdlyanjonlwtaruj0pj8v8c">
         <w:r>
           <w:rPr>
             <w:color w:val="0563C1"/>
@@ -16584,7 +16608,7 @@
       <w:r>
         <w:t xml:space="preserve">LeoGrande, William M., and Peter Kornbluh. </w:t>
       </w:r>
-      <w:hyperlink w:history="1" r:id="rIdntvurzuovuedyclakxatv">
+      <w:hyperlink w:history="1" r:id="rId1h_npahbv5rxqyrmhnqgl">
         <w:r>
           <w:rPr>
             <w:color w:val="0563C1"/>
@@ -16644,7 +16668,7 @@
       <w:r>
         <w:t xml:space="preserve">Secretaría de Gobernación (Mexico). “</w:t>
       </w:r>
-      <w:hyperlink w:history="1" r:id="rIdqwyoaeuhtz2wglu2bwaja">
+      <w:hyperlink w:history="1" r:id="rIddmtp--rckgyep0nrwqevr">
         <w:r>
           <w:rPr>
             <w:color w:val="0563C1"/>
@@ -16692,7 +16716,7 @@
       <w:r>
         <w:t xml:space="preserve">Finkel, Caroline. </w:t>
       </w:r>
-      <w:hyperlink w:history="1" r:id="rIdovrqjwh0tqew6z3saoids">
+      <w:hyperlink w:history="1" r:id="rIdoadxlgi1lk8uqmsgig9oi">
         <w:r>
           <w:rPr>
             <w:color w:val="0563C1"/>
@@ -16720,7 +16744,7 @@
       <w:r>
         <w:t xml:space="preserve">Crowley, Roger. </w:t>
       </w:r>
-      <w:hyperlink w:history="1" r:id="rIdhl1kahcwods9cirzqbq88">
+      <w:hyperlink w:history="1" r:id="rIdjrwscws6uj1qijc842b8c">
         <w:r>
           <w:rPr>
             <w:color w:val="0563C1"/>
@@ -16748,7 +16772,7 @@
       <w:r>
         <w:t xml:space="preserve">Barkey, Karen. </w:t>
       </w:r>
-      <w:hyperlink w:history="1" r:id="rIdkllktfh3co2kkjszpbrxw">
+      <w:hyperlink w:history="1" r:id="rIdqfprp5tqhhv-ohftp_scs">
         <w:r>
           <w:rPr>
             <w:color w:val="0563C1"/>
@@ -16776,7 +16800,7 @@
       <w:r>
         <w:t xml:space="preserve">Mazower, Mark. </w:t>
       </w:r>
-      <w:hyperlink w:history="1" r:id="rIdofy2iteagyjvhjatwpcha">
+      <w:hyperlink w:history="1" r:id="rIdrhyl0shb8hm_x36kbm-iq">
         <w:r>
           <w:rPr>
             <w:color w:val="0563C1"/>
@@ -16804,7 +16828,7 @@
       <w:r>
         <w:t xml:space="preserve">Suny, Ronald Grigor. “</w:t>
       </w:r>
-      <w:hyperlink w:history="1" r:id="rIdrptryi3j_fqdzj8efhkxh">
+      <w:hyperlink w:history="1" r:id="rIdk2xgzz5e7yuy_zwbsqlps">
         <w:r>
           <w:rPr>
             <w:color w:val="0563C1"/>
@@ -16832,7 +16856,7 @@
       <w:r>
         <w:t xml:space="preserve">Power, Samantha. “</w:t>
       </w:r>
-      <w:hyperlink w:history="1" r:id="rIdbvpo3f_1wjnrcpdsdufvq">
+      <w:hyperlink w:history="1" r:id="rId8fzt1vmxcwsjorj-ip00-">
         <w:r>
           <w:rPr>
             <w:color w:val="0563C1"/>
@@ -16860,7 +16884,7 @@
       <w:r>
         <w:t xml:space="preserve">Hirschon, Renée, ed. </w:t>
       </w:r>
-      <w:hyperlink w:history="1" r:id="rId6d9tkhu9of7cghmlrq63e">
+      <w:hyperlink w:history="1" r:id="rIdswd2bjqjzkiyd8bog_rzi">
         <w:r>
           <w:rPr>
             <w:color w:val="0563C1"/>
@@ -16888,7 +16912,7 @@
       <w:r>
         <w:t xml:space="preserve">Rogan, Eugene. </w:t>
       </w:r>
-      <w:hyperlink w:history="1" r:id="rId7tcqriwmnuuiwj9rctezm">
+      <w:hyperlink w:history="1" r:id="rIdy31eehmj7rdcxixs35j4b">
         <w:r>
           <w:rPr>
             <w:color w:val="0563C1"/>
@@ -16916,7 +16940,7 @@
       <w:r>
         <w:t xml:space="preserve">Barr, James. </w:t>
       </w:r>
-      <w:hyperlink w:history="1" r:id="rIdv9rhbmsdwhzh2tdlrfnbu">
+      <w:hyperlink w:history="1" r:id="rIdticwkajoa6a_l_9ah5-km">
         <w:r>
           <w:rPr>
             <w:color w:val="0563C1"/>
@@ -16944,7 +16968,7 @@
       <w:r>
         <w:t xml:space="preserve">McDowall, David. </w:t>
       </w:r>
-      <w:hyperlink w:history="1" r:id="rIdj4x_evee46j91ght9fw9g">
+      <w:hyperlink w:history="1" r:id="rIda28u7nvdkqwhrjrioacs8">
         <w:r>
           <w:rPr>
             <w:color w:val="0563C1"/>
@@ -16972,7 +16996,7 @@
       <w:r>
         <w:t xml:space="preserve">Abrahamian, Ervand. </w:t>
       </w:r>
-      <w:hyperlink w:history="1" r:id="rId-cizbgpsf23irc5l92suq">
+      <w:hyperlink w:history="1" r:id="rIdli6lddbd9fm7tfbp93jse">
         <w:r>
           <w:rPr>
             <w:color w:val="0563C1"/>
@@ -17000,7 +17024,7 @@
       <w:r>
         <w:t xml:space="preserve">Razoux, Pierre. </w:t>
       </w:r>
-      <w:hyperlink w:history="1" r:id="rIdzn2kgcbgzkdqr43yaex6-">
+      <w:hyperlink w:history="1" r:id="rIdtwytwbemv57pbtctamdyx">
         <w:r>
           <w:rPr>
             <w:color w:val="0563C1"/>
@@ -17048,7 +17072,7 @@
       <w:r>
         <w:t xml:space="preserve">Clark, Christopher. </w:t>
       </w:r>
-      <w:hyperlink w:history="1" r:id="rIdoz4dkqlirpslmgflvoe4j">
+      <w:hyperlink w:history="1" r:id="rIdonb9w0vf6e8bwg2_u52_k">
         <w:r>
           <w:rPr>
             <w:color w:val="0563C1"/>
@@ -17076,7 +17100,7 @@
       <w:r>
         <w:t xml:space="preserve">Strachan, Hew. </w:t>
       </w:r>
-      <w:hyperlink w:history="1" r:id="rIdeq-nzprdrt7f-9fkaebuj">
+      <w:hyperlink w:history="1" r:id="rId2bgjcag21z8q7vn4f7ipp">
         <w:r>
           <w:rPr>
             <w:color w:val="0563C1"/>
@@ -17120,7 +17144,7 @@
       <w:r>
         <w:t xml:space="preserve">Weintraub, Stanley. </w:t>
       </w:r>
-      <w:hyperlink w:history="1" r:id="rId7hvxsedjffome8_4ogtd2">
+      <w:hyperlink w:history="1" r:id="rIdxey0v_wt-zyv6rwnudcfz">
         <w:r>
           <w:rPr>
             <w:color w:val="0563C1"/>
@@ -17148,7 +17172,7 @@
       <w:r>
         <w:t xml:space="preserve">Johnson, Niall P. A. S., and Juergen Mueller. “</w:t>
       </w:r>
-      <w:hyperlink w:history="1" r:id="rIdsmlzznzvkaymrtvf3so5t">
+      <w:hyperlink w:history="1" r:id="rIdv3ced52i1ixiq-kp3jjj3">
         <w:r>
           <w:rPr>
             <w:color w:val="0563C1"/>
@@ -17176,7 +17200,7 @@
       <w:r>
         <w:t xml:space="preserve">Spreeuwenberg, Peter, et al. “</w:t>
       </w:r>
-      <w:hyperlink w:history="1" r:id="rIdbqw8k-einxd_thiacv4fh">
+      <w:hyperlink w:history="1" r:id="rIdvxqbsakvodic7t6u7hv2z">
         <w:r>
           <w:rPr>
             <w:color w:val="0563C1"/>
@@ -17204,7 +17228,7 @@
       <w:r>
         <w:t xml:space="preserve">Keynes, John Maynard. </w:t>
       </w:r>
-      <w:hyperlink w:history="1" r:id="rId_m4yjkcwu_6ofuglr84ib">
+      <w:hyperlink w:history="1" r:id="rIdrmjengf_jri18omdzufzn">
         <w:r>
           <w:rPr>
             <w:color w:val="0563C1"/>
@@ -17252,7 +17276,7 @@
       <w:r>
         <w:t xml:space="preserve">Evans, Richard J. </w:t>
       </w:r>
-      <w:hyperlink w:history="1" r:id="rIdkmj7v5jkgx_5q4ohhysh_">
+      <w:hyperlink w:history="1" r:id="rIdi4gzdlnrfiwbk9aegwsjc">
         <w:r>
           <w:rPr>
             <w:color w:val="0563C1"/>
@@ -17280,7 +17304,7 @@
       <w:r>
         <w:t xml:space="preserve">Hilberg, Raul. </w:t>
       </w:r>
-      <w:hyperlink w:history="1" r:id="rIdwjuobzn8_q5_mtymzid50">
+      <w:hyperlink w:history="1" r:id="rIdc2binvishs6ktfw-an8sh">
         <w:r>
           <w:rPr>
             <w:color w:val="0563C1"/>
@@ -17308,7 +17332,7 @@
       <w:r>
         <w:t xml:space="preserve">Kiernan, Ben. </w:t>
       </w:r>
-      <w:hyperlink w:history="1" r:id="rIdpeunyi7exyafgtb-rqiie">
+      <w:hyperlink w:history="1" r:id="rId9_gtbwv2qs7aailsj2ncu">
         <w:r>
           <w:rPr>
             <w:color w:val="0563C1"/>
@@ -17336,7 +17360,7 @@
       <w:r>
         <w:t xml:space="preserve">Levitsky, Steven, and Daniel Ziblatt. </w:t>
       </w:r>
-      <w:hyperlink w:history="1" r:id="rId8xmqsjgmlwum7wmkoeh6o">
+      <w:hyperlink w:history="1" r:id="rIdpzopa7c3tr8ep0d3wvws8">
         <w:r>
           <w:rPr>
             <w:color w:val="0563C1"/>
@@ -17364,7 +17388,7 @@
       <w:r>
         <w:t xml:space="preserve">Neiman, Susan. </w:t>
       </w:r>
-      <w:hyperlink w:history="1" r:id="rIdawf7xlhkgq7wugzx3yfzv">
+      <w:hyperlink w:history="1" r:id="rIdskkc8rxiaws4nhx-zkke6">
         <w:r>
           <w:rPr>
             <w:color w:val="0563C1"/>
@@ -17408,7 +17432,7 @@
       <w:r>
         <w:t xml:space="preserve">Broberg, Gunnar, and Nils Roll-Hansen, eds. </w:t>
       </w:r>
-      <w:hyperlink w:history="1" r:id="rId3krzilj5j702ficxyqalp">
+      <w:hyperlink w:history="1" r:id="rId6xvpjmklsqvwtflpzyr1e">
         <w:r>
           <w:rPr>
             <w:color w:val="0563C1"/>
@@ -17456,7 +17480,7 @@
       <w:r>
         <w:t xml:space="preserve">Jansen, Marius B. </w:t>
       </w:r>
-      <w:hyperlink w:history="1" r:id="rIdkgzggt4vwqljkjw92tw0s">
+      <w:hyperlink w:history="1" r:id="rIdj_dsoxhb0iuzcxsv5r-6_">
         <w:r>
           <w:rPr>
             <w:color w:val="0563C1"/>
@@ -17484,7 +17508,7 @@
       <w:r>
         <w:t xml:space="preserve">Fogel, Joshua A., ed. </w:t>
       </w:r>
-      <w:hyperlink w:history="1" r:id="rIdjeeulgo2x7y-qeyfxzaaf">
+      <w:hyperlink w:history="1" r:id="rIdxvme45grgf-k8_xe1ul63">
         <w:r>
           <w:rPr>
             <w:color w:val="0563C1"/>
@@ -17512,7 +17536,7 @@
       <w:r>
         <w:t xml:space="preserve">Ohnuki-Tierney, Emiko. </w:t>
       </w:r>
-      <w:hyperlink w:history="1" r:id="rIdxbignjr4tz5onkkr_j4g_">
+      <w:hyperlink w:history="1" r:id="rIdud__9mzszissh1xehlccx">
         <w:r>
           <w:rPr>
             <w:color w:val="0563C1"/>
@@ -17540,7 +17564,7 @@
       <w:r>
         <w:t xml:space="preserve">Dower, John W. </w:t>
       </w:r>
-      <w:hyperlink w:history="1" r:id="rId1rbarrklrbwouuf0b7p4b">
+      <w:hyperlink w:history="1" r:id="rIdjr_yb2-scqxaqh1ezpoed">
         <w:r>
           <w:rPr>
             <w:color w:val="0563C1"/>
@@ -17588,7 +17612,7 @@
       <w:r>
         <w:t xml:space="preserve">Duggan, Christopher. </w:t>
       </w:r>
-      <w:hyperlink w:history="1" r:id="rIdf8faxqazonj3xzvllw6ni">
+      <w:hyperlink w:history="1" r:id="rIdjdxe3vxo4bwdqg9-oj1px">
         <w:r>
           <w:rPr>
             <w:color w:val="0563C1"/>
@@ -17616,7 +17640,7 @@
       <w:r>
         <w:t xml:space="preserve">Bosworth, R. J. B. </w:t>
       </w:r>
-      <w:hyperlink w:history="1" r:id="rIduyl9qzxycxhk4s071naba">
+      <w:hyperlink w:history="1" r:id="rIdehnc4r8pcqjnoschxw8y3">
         <w:r>
           <w:rPr>
             <w:color w:val="0563C1"/>
@@ -17644,7 +17668,7 @@
       <w:r>
         <w:t xml:space="preserve">Domenico, Roy Palmer. </w:t>
       </w:r>
-      <w:hyperlink w:history="1" r:id="rIdke12zg7lndt1npg3z52e4">
+      <w:hyperlink w:history="1" r:id="rIdwnjsgl3jequhr0goj8rqm">
         <w:r>
           <w:rPr>
             <w:color w:val="0563C1"/>
@@ -17692,7 +17716,7 @@
       <w:r>
         <w:t xml:space="preserve">Menocal, María Rosa. </w:t>
       </w:r>
-      <w:hyperlink w:history="1" r:id="rIdnqsixj1skfn-0mrinvz0s">
+      <w:hyperlink w:history="1" r:id="rIdqx0bdhihrv-cgfetr1kga">
         <w:r>
           <w:rPr>
             <w:color w:val="0563C1"/>
@@ -17720,7 +17744,7 @@
       <w:r>
         <w:t xml:space="preserve">Fernández-Morera, Darío. </w:t>
       </w:r>
-      <w:hyperlink w:history="1" r:id="rIdlb_ebsu8rc9dwgdgt7xrj">
+      <w:hyperlink w:history="1" r:id="rIdeeaotr7jiypnccxz49qjw">
         <w:r>
           <w:rPr>
             <w:color w:val="0563C1"/>
@@ -17748,7 +17772,7 @@
       <w:r>
         <w:t xml:space="preserve">Kraemer, Joel L. </w:t>
       </w:r>
-      <w:hyperlink w:history="1" r:id="rId-2v5hatxxvhrqhhmsnc8x">
+      <w:hyperlink w:history="1" r:id="rIdcue7ty65wmdtl0pwntn9o">
         <w:r>
           <w:rPr>
             <w:color w:val="0563C1"/>
@@ -17776,7 +17800,7 @@
       <w:r>
         <w:t xml:space="preserve">Preston, Paul. </w:t>
       </w:r>
-      <w:hyperlink w:history="1" r:id="rIdp2eqvtpoweliclhzlkibd">
+      <w:hyperlink w:history="1" r:id="rIdmucqsfmwvpzeuca-6e_be">
         <w:r>
           <w:rPr>
             <w:color w:val="0563C1"/>
@@ -17804,7 +17828,7 @@
       <w:r>
         <w:t xml:space="preserve">Aguilar, Paloma. </w:t>
       </w:r>
-      <w:hyperlink w:history="1" r:id="rIdiybtgy1c2j9gbi67drmdb">
+      <w:hyperlink w:history="1" r:id="rIdqrmob0aseley0veblppeb">
         <w:r>
           <w:rPr>
             <w:color w:val="0563C1"/>
@@ -17868,7 +17892,7 @@
       <w:r>
         <w:t xml:space="preserve">Applebaum, Anne. </w:t>
       </w:r>
-      <w:hyperlink w:history="1" r:id="rIdpuoof8btyg-g4uinzyydd">
+      <w:hyperlink w:history="1" r:id="rId1eodblempkjolukrbqtk0">
         <w:r>
           <w:rPr>
             <w:color w:val="0563C1"/>
@@ -17896,7 +17920,7 @@
       <w:r>
         <w:t xml:space="preserve">Applebaum, Anne. </w:t>
       </w:r>
-      <w:hyperlink w:history="1" r:id="rIdtbmav4f4bzme3s1pd0zcl">
+      <w:hyperlink w:history="1" r:id="rIdjvjapcubeje1gv9bu3stf">
         <w:r>
           <w:rPr>
             <w:color w:val="0563C1"/>
@@ -17924,7 +17948,7 @@
       <w:r>
         <w:t xml:space="preserve">Sanford, George. </w:t>
       </w:r>
-      <w:hyperlink w:history="1" r:id="rIdizg56gusen6xgo1dk28ys">
+      <w:hyperlink w:history="1" r:id="rId4j0ocgfw4cu6alg4h1ntn">
         <w:r>
           <w:rPr>
             <w:color w:val="0563C1"/>
@@ -17952,7 +17976,7 @@
       <w:r>
         <w:t xml:space="preserve">Plokhy, Serhii. </w:t>
       </w:r>
-      <w:hyperlink w:history="1" r:id="rId5bquqql4j0sovj1qofqac">
+      <w:hyperlink w:history="1" r:id="rIdwgmf9gu5bf-ib7ts2ypyn">
         <w:r>
           <w:rPr>
             <w:color w:val="0563C1"/>
@@ -17980,7 +18004,7 @@
       <w:r>
         <w:t xml:space="preserve">Roberts, Geoffrey. </w:t>
       </w:r>
-      <w:hyperlink w:history="1" r:id="rIdoml9g4ztfpwbkpm0psx2v">
+      <w:hyperlink w:history="1" r:id="rIdubw_mmw_x1902nh57fs0z">
         <w:r>
           <w:rPr>
             <w:color w:val="0563C1"/>
@@ -18028,7 +18052,7 @@
       <w:r>
         <w:t xml:space="preserve">Dikötter, Frank. </w:t>
       </w:r>
-      <w:hyperlink w:history="1" r:id="rIdplbujiixfvpvm0umqrfuf">
+      <w:hyperlink w:history="1" r:id="rIdpsx21qmvbvibwrgldhjyp">
         <w:r>
           <w:rPr>
             <w:color w:val="0563C1"/>
@@ -18056,7 +18080,7 @@
       <w:r>
         <w:t xml:space="preserve">Yang Jisheng. </w:t>
       </w:r>
-      <w:hyperlink w:history="1" r:id="rIdapwrcqxonu7oae7kkmwqr">
+      <w:hyperlink w:history="1" r:id="rIdrxaq9aapeewzrpjv39hdi">
         <w:r>
           <w:rPr>
             <w:color w:val="0563C1"/>
@@ -18084,7 +18108,7 @@
       <w:r>
         <w:t xml:space="preserve">MacFarquhar, Roderick, and Michael Schoenhals. </w:t>
       </w:r>
-      <w:hyperlink w:history="1" r:id="rIdtqzy9ji1smhtvn-k-lhxo">
+      <w:hyperlink w:history="1" r:id="rIdyapqxy63oa2fkykwuytkb">
         <w:r>
           <w:rPr>
             <w:color w:val="0563C1"/>
@@ -18112,7 +18136,7 @@
       <w:r>
         <w:t xml:space="preserve">Jambeck, Jenna R., et al. “</w:t>
       </w:r>
-      <w:hyperlink w:history="1" r:id="rIdf2rduas23zqi4koucml_6">
+      <w:hyperlink w:history="1" r:id="rIdh4u8wnc2rrtu-3zfu6w0v">
         <w:r>
           <w:rPr>
             <w:color w:val="0563C1"/>
@@ -18140,7 +18164,7 @@
       <w:r>
         <w:t xml:space="preserve">Meijer, Lourens J. J., et al. “</w:t>
       </w:r>
-      <w:hyperlink w:history="1" r:id="rIdwtyoeer_zytw74mwwnyzd">
+      <w:hyperlink w:history="1" r:id="rIdpivc4fm9zmxupgaharff5">
         <w:r>
           <w:rPr>
             <w:color w:val="0563C1"/>
@@ -18168,7 +18192,7 @@
       <w:r>
         <w:t xml:space="preserve">Economy, Elizabeth C. </w:t>
       </w:r>
-      <w:hyperlink w:history="1" r:id="rIdciotedd-t8njzja7svzdj">
+      <w:hyperlink w:history="1" r:id="rIdojhuxzu0vroexvfpbjzid">
         <w:r>
           <w:rPr>
             <w:color w:val="0563C1"/>
@@ -18228,7 +18252,7 @@
       <w:r>
         <w:t xml:space="preserve">McDonell, Stephen. “</w:t>
       </w:r>
-      <w:hyperlink w:history="1" r:id="rIdkuvrds1qjsxoihb5edqsa">
+      <w:hyperlink w:history="1" r:id="rIdasgbsjjmphngbhnrqwfyb">
         <w:r>
           <w:rPr>
             <w:color w:val="0563C1"/>
@@ -18256,7 +18280,7 @@
       <w:r>
         <w:t xml:space="preserve">Agence France-Presse. “‘Oh, Bother’: </w:t>
       </w:r>
-      <w:hyperlink w:history="1" r:id="rId0amnxsopdfnrekpfxunzu">
+      <w:hyperlink w:history="1" r:id="rIdy_wvnzwimcvmidyv7o9zi">
         <w:r>
           <w:rPr>
             <w:color w:val="0563C1"/>
@@ -18304,7 +18328,7 @@
       <w:r>
         <w:t xml:space="preserve">Schama, Simon. </w:t>
       </w:r>
-      <w:hyperlink w:history="1" r:id="rIdsaa0-pelkq4ngqklc7uof">
+      <w:hyperlink w:history="1" r:id="rIddbqobvcmqhijbcupdqbdd">
         <w:r>
           <w:rPr>
             <w:color w:val="0563C1"/>
@@ -18332,7 +18356,7 @@
       <w:r>
         <w:t xml:space="preserve">Finkelstein, Israel, and Neil Asher Silberman. </w:t>
       </w:r>
-      <w:hyperlink w:history="1" r:id="rIdxqv-vddknbxzepebihew6">
+      <w:hyperlink w:history="1" r:id="rIdus_inykypiyyrtaarzgqo">
         <w:r>
           <w:rPr>
             <w:color w:val="0563C1"/>
@@ -18360,7 +18384,7 @@
       <w:r>
         <w:t xml:space="preserve">VanderKam, James C. </w:t>
       </w:r>
-      <w:hyperlink w:history="1" r:id="rIdlmgn2ttaxg7atrtrjil7i">
+      <w:hyperlink w:history="1" r:id="rId_kxdrxh7etul4ypvqvo4w">
         <w:r>
           <w:rPr>
             <w:color w:val="0563C1"/>
@@ -18388,7 +18412,7 @@
       <w:r>
         <w:t xml:space="preserve">Magness, Jodi. </w:t>
       </w:r>
-      <w:hyperlink w:history="1" r:id="rIdsblnlufwx7kosf5pu6emz">
+      <w:hyperlink w:history="1" r:id="rIdgza7kasfr2nmtpube1gc0">
         <w:r>
           <w:rPr>
             <w:color w:val="0563C1"/>
@@ -18416,7 +18440,7 @@
       <w:r>
         <w:t xml:space="preserve">Morris, Benny. </w:t>
       </w:r>
-      <w:hyperlink w:history="1" r:id="rIdfvrrp4bs-vpui-lqpbros">
+      <w:hyperlink w:history="1" r:id="rIdlcpqijifc9pplpogxri04">
         <w:r>
           <w:rPr>
             <w:color w:val="0563C1"/>
@@ -18464,7 +18488,7 @@
       <w:r>
         <w:t xml:space="preserve">Gaddis, John Lewis. </w:t>
       </w:r>
-      <w:hyperlink w:history="1" r:id="rIdgc05vlj9xcb3x4wlrtcqs">
+      <w:hyperlink w:history="1" r:id="rIdnaejknra4f4fkwzxmmvpg">
         <w:r>
           <w:rPr>
             <w:color w:val="0563C1"/>
@@ -18492,7 +18516,7 @@
       <w:r>
         <w:t xml:space="preserve">Savranskaya, Svetlana V. “</w:t>
       </w:r>
-      <w:hyperlink w:history="1" r:id="rIdkblat-zgfcqrx5e3xu0rz">
+      <w:hyperlink w:history="1" r:id="rId0ghirfjfgegcd171gas-b">
         <w:r>
           <w:rPr>
             <w:color w:val="0563C1"/>
@@ -18520,7 +18544,7 @@
       <w:r>
         <w:t xml:space="preserve">Hoffman, David E. </w:t>
       </w:r>
-      <w:hyperlink w:history="1" r:id="rIdxdbehjhihvnypfx8i32uj">
+      <w:hyperlink w:history="1" r:id="rId5n0fjob5uhuyrowhzl3ej">
         <w:r>
           <w:rPr>
             <w:color w:val="0563C1"/>
@@ -18548,7 +18572,7 @@
       <w:r>
         <w:t xml:space="preserve">Rhodes, Richard. </w:t>
       </w:r>
-      <w:hyperlink w:history="1" r:id="rIdu4frg5r747xyhdfesqnx0">
+      <w:hyperlink w:history="1" r:id="rIdpv0lbpgocckp5tycubyhk">
         <w:r>
           <w:rPr>
             <w:color w:val="0563C1"/>
@@ -18576,7 +18600,7 @@
       <w:r>
         <w:t xml:space="preserve">Niedenthal, Jack. </w:t>
       </w:r>
-      <w:hyperlink w:history="1" r:id="rIdagj29iffhvq7nl3z6va7h">
+      <w:hyperlink w:history="1" r:id="rIdkpsbogwet752mm2z5axlr">
         <w:r>
           <w:rPr>
             <w:color w:val="0563C1"/>
@@ -18624,7 +18648,7 @@
       <w:r>
         <w:t xml:space="preserve">NASA. “</w:t>
       </w:r>
-      <w:hyperlink w:history="1" r:id="rIdzdlhr6hv5gs-aqlkqpdnn">
+      <w:hyperlink w:history="1" r:id="rIdixkmak68sexqxu9c9l-mr">
         <w:r>
           <w:rPr>
             <w:color w:val="0563C1"/>
@@ -18652,7 +18676,7 @@
       <w:r>
         <w:t xml:space="preserve">Chaikin, Andrew. </w:t>
       </w:r>
-      <w:hyperlink w:history="1" r:id="rId1abhapovk5gzttiqbom34">
+      <w:hyperlink w:history="1" r:id="rIdrukcpr4cfqqbs_iwx0zme">
         <w:r>
           <w:rPr>
             <w:color w:val="0563C1"/>
@@ -18680,7 +18704,7 @@
       <w:r>
         <w:t xml:space="preserve">Siddiqi, Asif A. </w:t>
       </w:r>
-      <w:hyperlink w:history="1" r:id="rIdkwotcegzu3sllx11vi2mz">
+      <w:hyperlink w:history="1" r:id="rId7voicfumuzroyvnxib8os">
         <w:r>
           <w:rPr>
             <w:color w:val="0563C1"/>
@@ -18708,7 +18732,7 @@
       <w:r>
         <w:t xml:space="preserve">Colaprete, Anthony, et al. “</w:t>
       </w:r>
-      <w:hyperlink w:history="1" r:id="rIdqcyvvv5gcds9zqnao8fda">
+      <w:hyperlink w:history="1" r:id="rIdm3rdaa22lfhemt_x7glso">
         <w:r>
           <w:rPr>
             <w:color w:val="0563C1"/>
@@ -18736,7 +18760,7 @@
       <w:r>
         <w:t xml:space="preserve">Sheehan, William. </w:t>
       </w:r>
-      <w:hyperlink w:history="1" r:id="rIdnkna695fcejz6sim4vh2t">
+      <w:hyperlink w:history="1" r:id="rIdbxdivhmytdyqimxbeqgnk">
         <w:r>
           <w:rPr>
             <w:color w:val="0563C1"/>
@@ -18764,7 +18788,7 @@
       <w:r>
         <w:t xml:space="preserve">Grotzinger, John P., et al. “</w:t>
       </w:r>
-      <w:hyperlink w:history="1" r:id="rIde9vpqvfdndb4umbbqslzg">
+      <w:hyperlink w:history="1" r:id="rIdf1gybe4nqpvvr99roluyu">
         <w:r>
           <w:rPr>
             <w:color w:val="0563C1"/>
@@ -18792,7 +18816,7 @@
       <w:r>
         <w:t xml:space="preserve">Mangold, Nicolas, et al. “</w:t>
       </w:r>
-      <w:hyperlink w:history="1" r:id="rIdrtgauwmg3zjthjzmfu-fp">
+      <w:hyperlink w:history="1" r:id="rIdrosxta4eqjl3rw71xhcyb">
         <w:r>
           <w:rPr>
             <w:color w:val="0563C1"/>
@@ -18840,7 +18864,7 @@
       <w:r>
         <w:t xml:space="preserve">Ashby, Neil. “</w:t>
       </w:r>
-      <w:hyperlink w:history="1" r:id="rIdiozupslnwsnb9gnyx0xoi">
+      <w:hyperlink w:history="1" r:id="rIdtmrkqw_cbuxt9ojjyc3nv">
         <w:r>
           <w:rPr>
             <w:color w:val="0563C1"/>
@@ -18868,7 +18892,7 @@
       <w:r>
         <w:t xml:space="preserve">Dyson, F. W., A. S. Eddington, and C. Davidson. “</w:t>
       </w:r>
-      <w:hyperlink w:history="1" r:id="rId6kyx7ram2kuiuudtdybbq">
+      <w:hyperlink w:history="1" r:id="rIdrrviyide6zj0yx__ozenv">
         <w:r>
           <w:rPr>
             <w:color w:val="0563C1"/>
@@ -18896,7 +18920,7 @@
       <w:r>
         <w:t xml:space="preserve">Au, Whitlow W. L. </w:t>
       </w:r>
-      <w:hyperlink w:history="1" r:id="rIdlb2okabdvovz0ie5e80jm">
+      <w:hyperlink w:history="1" r:id="rIdeok59obcb2qqw5javfxle">
         <w:r>
           <w:rPr>
             <w:color w:val="0563C1"/>
@@ -18924,7 +18948,7 @@
       <w:r>
         <w:t xml:space="preserve">Susskind, Leonard. “</w:t>
       </w:r>
-      <w:hyperlink w:history="1" r:id="rIds_ixzf5zueiycvzqekqx2">
+      <w:hyperlink w:history="1" r:id="rIduvvp3dvlldhbuqflts_qm">
         <w:r>
           <w:rPr>
             <w:color w:val="0563C1"/>
@@ -18952,7 +18976,7 @@
       <w:r>
         <w:t xml:space="preserve">Scerri, Eric R. </w:t>
       </w:r>
-      <w:hyperlink w:history="1" r:id="rIdtbgiycdk5natev8apuz2g">
+      <w:hyperlink w:history="1" r:id="rIdrqhy_uepep13msj8s08-j">
         <w:r>
           <w:rPr>
             <w:color w:val="0563C1"/>
@@ -18980,7 +19004,7 @@
       <w:r>
         <w:t xml:space="preserve">Erisman, Jan Willem, et al. “</w:t>
       </w:r>
-      <w:hyperlink w:history="1" r:id="rIdzni1a2ugct92mq45_5mtd">
+      <w:hyperlink w:history="1" r:id="rIdt-v991ipu7-vgpcwz9iya">
         <w:r>
           <w:rPr>
             <w:color w:val="0563C1"/>
@@ -19008,7 +19032,7 @@
       <w:r>
         <w:t xml:space="preserve">Watson, J. D., and F. H. C. Crick. “</w:t>
       </w:r>
-      <w:hyperlink w:history="1" r:id="rIdsrwrvr7ltoufdcivlmnvb">
+      <w:hyperlink w:history="1" r:id="rIdt9d9lczfkme6lgy7cys_w">
         <w:r>
           <w:rPr>
             <w:color w:val="0563C1"/>
@@ -19036,7 +19060,7 @@
       <w:r>
         <w:t xml:space="preserve">Franklin, Rosalind E., and R. G. Gosling. “</w:t>
       </w:r>
-      <w:hyperlink w:history="1" r:id="rIdbb1v1cjzqbbtrrihannjj">
+      <w:hyperlink w:history="1" r:id="rIdaljpzvxjbtdjrheukgl-4">
         <w:r>
           <w:rPr>
             <w:color w:val="0563C1"/>
@@ -19064,7 +19088,7 @@
       <w:r>
         <w:t xml:space="preserve">International Human Genome Sequencing Consortium. “</w:t>
       </w:r>
-      <w:hyperlink w:history="1" r:id="rId6pxe2bzfjfptkcxbwdfel">
+      <w:hyperlink w:history="1" r:id="rIdhv5ttl9mwcxu2rrrk_o7t">
         <w:r>
           <w:rPr>
             <w:color w:val="0563C1"/>
@@ -19092,7 +19116,7 @@
       <w:r>
         <w:t xml:space="preserve">International Human Genome Sequencing Consortium. “</w:t>
       </w:r>
-      <w:hyperlink w:history="1" r:id="rIdrmp4tht3dao5zytmh9oop">
+      <w:hyperlink w:history="1" r:id="rIdsofeh4ns0wgx8qaivkxsg">
         <w:r>
           <w:rPr>
             <w:color w:val="0563C1"/>
@@ -19120,7 +19144,7 @@
       <w:r>
         <w:t xml:space="preserve">Nurk, Sergey, et al. “</w:t>
       </w:r>
-      <w:hyperlink w:history="1" r:id="rIdtibjnhg4nhquaqkioq0cf">
+      <w:hyperlink w:history="1" r:id="rId57emlgs9_opqhhkdw2ana">
         <w:r>
           <w:rPr>
             <w:color w:val="0563C1"/>
@@ -19148,7 +19172,7 @@
       <w:r>
         <w:t xml:space="preserve">Vine, F. J., and D. H. Matthews. “</w:t>
       </w:r>
-      <w:hyperlink w:history="1" r:id="rIdsnjgccmndhntnur0p_k4k">
+      <w:hyperlink w:history="1" r:id="rId2a7zdsgf4_zy1pqjufyxj">
         <w:r>
           <w:rPr>
             <w:color w:val="0563C1"/>
@@ -19176,7 +19200,7 @@
       <w:r>
         <w:t xml:space="preserve">Alpher, Ralph A., and Robert Herman. “</w:t>
       </w:r>
-      <w:hyperlink w:history="1" r:id="rIdrjs_dhikbek81q2kxoctc">
+      <w:hyperlink w:history="1" r:id="rIdx61ky-g9d3sqp7ddhjdzb">
         <w:r>
           <w:rPr>
             <w:color w:val="0563C1"/>
@@ -19204,7 +19228,7 @@
       <w:r>
         <w:t xml:space="preserve">Penzias, A. A., and R. W. Wilson. “</w:t>
       </w:r>
-      <w:hyperlink w:history="1" r:id="rIdkrcj9ld0oby5c5cucgcyg">
+      <w:hyperlink w:history="1" r:id="rIdj7abkyzpgn8tw7quymrca">
         <w:r>
           <w:rPr>
             <w:color w:val="0563C1"/>
@@ -19232,7 +19256,7 @@
       <w:r>
         <w:t xml:space="preserve">Fleischmann, Martin, and Stanley Pons. “</w:t>
       </w:r>
-      <w:hyperlink w:history="1" r:id="rId8yly_sqqzpsiawmtp-ggs">
+      <w:hyperlink w:history="1" r:id="rIdb7xfrvadzzii7o2fbmbsi">
         <w:r>
           <w:rPr>
             <w:color w:val="0563C1"/>
@@ -19260,7 +19284,7 @@
       <w:r>
         <w:t xml:space="preserve">Wolfe-Simon, Felisa, et al. “</w:t>
       </w:r>
-      <w:hyperlink w:history="1" r:id="rIdvusjkzeucrbhlf-scs9ke">
+      <w:hyperlink w:history="1" r:id="rIdwaporlyekhdekjwscgdvu">
         <w:r>
           <w:rPr>
             <w:color w:val="0563C1"/>
@@ -19288,7 +19312,7 @@
       <w:r>
         <w:t xml:space="preserve">Reaves, Marshall Louis, et al. “</w:t>
       </w:r>
-      <w:hyperlink w:history="1" r:id="rIduindecdj2pv4qg2bdj_mz">
+      <w:hyperlink w:history="1" r:id="rIdtcf6kxjfjl4oceemgvshm">
         <w:r>
           <w:rPr>
             <w:color w:val="0563C1"/>
@@ -19336,7 +19360,7 @@
       <w:r>
         <w:t xml:space="preserve">Dalrymple, William. </w:t>
       </w:r>
-      <w:hyperlink w:history="1" r:id="rId8wa6kycqbywb6f3hgblro">
+      <w:hyperlink w:history="1" r:id="rIdsqxrqxhzzkueehbkqqnsf">
         <w:r>
           <w:rPr>
             <w:color w:val="0563C1"/>
@@ -19364,7 +19388,7 @@
       <w:r>
         <w:t xml:space="preserve">Maddison, Angus. </w:t>
       </w:r>
-      <w:hyperlink w:history="1" r:id="rIdm7jh54ltsklx_rzyl6vax">
+      <w:hyperlink w:history="1" r:id="rIdzugr9bugqhjt3ocfy7viq">
         <w:r>
           <w:rPr>
             <w:color w:val="0563C1"/>
@@ -19392,7 +19416,7 @@
       <w:r>
         <w:t xml:space="preserve">Sen, Amartya. </w:t>
       </w:r>
-      <w:hyperlink w:history="1" r:id="rIdtuepi_tvrmqdrhcnya93b">
+      <w:hyperlink w:history="1" r:id="rIdmfuszyjnus8u79dj-tzuf">
         <w:r>
           <w:rPr>
             <w:color w:val="0563C1"/>
@@ -19420,7 +19444,7 @@
       <w:r>
         <w:t xml:space="preserve">Khan, Yasmin. </w:t>
       </w:r>
-      <w:hyperlink w:history="1" r:id="rIdt5h9kf0ob_xvbdnug03jt">
+      <w:hyperlink w:history="1" r:id="rIdjwuxilofcps-7azdutqin">
         <w:r>
           <w:rPr>
             <w:color w:val="0563C1"/>
@@ -19464,7 +19488,7 @@
       <w:r>
         <w:t xml:space="preserve">Elkins, Caroline. </w:t>
       </w:r>
-      <w:hyperlink w:history="1" r:id="rId8grbx93kjgdzl4yu_bqdu">
+      <w:hyperlink w:history="1" r:id="rIdlin637xtlzfuio6ajcxb3">
         <w:r>
           <w:rPr>
             <w:color w:val="0563C1"/>
@@ -19492,7 +19516,7 @@
       <w:r>
         <w:t xml:space="preserve">Jansen, Jan C., and Jürgen Osterhammel. </w:t>
       </w:r>
-      <w:hyperlink w:history="1" r:id="rIdakvrbslxhymaslawjggrl">
+      <w:hyperlink w:history="1" r:id="rIdpufqflwfrikyaslybtznu">
         <w:r>
           <w:rPr>
             <w:color w:val="0563C1"/>
@@ -19520,7 +19544,7 @@
       <w:r>
         <w:t xml:space="preserve">Des Forges, Alison. </w:t>
       </w:r>
-      <w:hyperlink w:history="1" r:id="rIdefccmemldu7zxeohramrm">
+      <w:hyperlink w:history="1" r:id="rIdef_ajtxl7rxzujn-0jkeg">
         <w:r>
           <w:rPr>
             <w:color w:val="0563C1"/>
@@ -19548,7 +19572,7 @@
       <w:r>
         <w:t xml:space="preserve">Newbury, Catharine. </w:t>
       </w:r>
-      <w:hyperlink w:history="1" r:id="rIdbnulurmfkdw9zfekdwmi1">
+      <w:hyperlink w:history="1" r:id="rIdoskysqjykurjpxv2jjwsm">
         <w:r>
           <w:rPr>
             <w:color w:val="0563C1"/>
@@ -19596,7 +19620,7 @@
       <w:r>
         <w:t xml:space="preserve">Branch, Taylor. </w:t>
       </w:r>
-      <w:hyperlink w:history="1" r:id="rIdzgyc1ojwegyhdcuc08xsg">
+      <w:hyperlink w:history="1" r:id="rIdiqnitliwhbdpaxydzwlpq">
         <w:r>
           <w:rPr>
             <w:color w:val="0563C1"/>
@@ -19624,7 +19648,7 @@
       <w:r>
         <w:t xml:space="preserve">Hoose, Phillip. </w:t>
       </w:r>
-      <w:hyperlink w:history="1" r:id="rIdf8tgruxziydvrvps83zi0">
+      <w:hyperlink w:history="1" r:id="rIdigdc6-bbfcioax-1geght">
         <w:r>
           <w:rPr>
             <w:color w:val="0563C1"/>
@@ -19652,7 +19676,7 @@
       <w:r>
         <w:t xml:space="preserve">Tyson, Timothy B. </w:t>
       </w:r>
-      <w:hyperlink w:history="1" r:id="rIdrmfxmoizhb8vrhboz8q2o">
+      <w:hyperlink w:history="1" r:id="rIdk_to2kkdp2gitzqgjuiuk">
         <w:r>
           <w:rPr>
             <w:color w:val="0563C1"/>
@@ -19680,7 +19704,7 @@
       <w:r>
         <w:t xml:space="preserve">Mandela, Nelson. </w:t>
       </w:r>
-      <w:hyperlink w:history="1" r:id="rIdpfgdewgmlmpols2rbkyzr">
+      <w:hyperlink w:history="1" r:id="rId85p-g_k5phq4wvyxk0ba3">
         <w:r>
           <w:rPr>
             <w:color w:val="0563C1"/>
@@ -19724,7 +19748,7 @@
       <w:r>
         <w:t xml:space="preserve">Carter, David. </w:t>
       </w:r>
-      <w:hyperlink w:history="1" r:id="rIdrtbnlzmnby4nt1e28pitv">
+      <w:hyperlink w:history="1" r:id="rId1wxxu3xgjftvfz2stmwjj">
         <w:r>
           <w:rPr>
             <w:color w:val="0563C1"/>
@@ -19772,7 +19796,7 @@
       <w:r>
         <w:t xml:space="preserve">Turing, A. M. “</w:t>
       </w:r>
-      <w:hyperlink w:history="1" r:id="rIdcytn1rhynxroo663mfiqd">
+      <w:hyperlink w:history="1" r:id="rIds942_ifpjlku-qxzcddss">
         <w:r>
           <w:rPr>
             <w:color w:val="0563C1"/>
@@ -19800,7 +19824,7 @@
       <w:r>
         <w:t xml:space="preserve">Copeland, B. Jack, ed. </w:t>
       </w:r>
-      <w:hyperlink w:history="1" r:id="rId6xmv1qttk1htopwbmvy5k">
+      <w:hyperlink w:history="1" r:id="rIdj30ukitae88zg-ydc9fca">
         <w:r>
           <w:rPr>
             <w:color w:val="0563C1"/>
@@ -19828,7 +19852,7 @@
       <w:r>
         <w:t xml:space="preserve">Isaacson, Walter. </w:t>
       </w:r>
-      <w:hyperlink w:history="1" r:id="rIdv21kzkcq0siybyi062tuw">
+      <w:hyperlink w:history="1" r:id="rIdakvzrvlwg1whn0wyldpij">
         <w:r>
           <w:rPr>
             <w:color w:val="0563C1"/>
@@ -19856,7 +19880,7 @@
       <w:r>
         <w:t xml:space="preserve">Vosoughi, Soroush, Deb Roy, and Sinan Aral. “</w:t>
       </w:r>
-      <w:hyperlink w:history="1" r:id="rIdmxoizz9u9ekfsv-ekmo7x">
+      <w:hyperlink w:history="1" r:id="rIddomdaqf_76kbjsad2vphw">
         <w:r>
           <w:rPr>
             <w:color w:val="0563C1"/>
@@ -19904,7 +19928,7 @@
       <w:r>
         <w:t xml:space="preserve">Stuart, David. </w:t>
       </w:r>
-      <w:hyperlink w:history="1" r:id="rIdycttjf_qqj3-k_artzgb5">
+      <w:hyperlink w:history="1" r:id="rIdx2eeneqyunfzquxwbgpg0">
         <w:r>
           <w:rPr>
             <w:color w:val="0563C1"/>
@@ -19932,7 +19956,7 @@
       <w:r>
         <w:t xml:space="preserve">Aveni, Anthony. </w:t>
       </w:r>
-      <w:hyperlink w:history="1" r:id="rIddqpa4k3ctja6ustiqzqie">
+      <w:hyperlink w:history="1" r:id="rIdsfdlbtqfnsfg2tmrivaus">
         <w:r>
           <w:rPr>
             <w:color w:val="0563C1"/>
@@ -19980,7 +20004,7 @@
       <w:r>
         <w:t xml:space="preserve">Meech, Karen J., et al. “</w:t>
       </w:r>
-      <w:hyperlink w:history="1" r:id="rIdhn7euudpatxnocmvot37e">
+      <w:hyperlink w:history="1" r:id="rIdkm_pxfe_8dyj1v4sa1y4z">
         <w:r>
           <w:rPr>
             <w:color w:val="0563C1"/>
@@ -20008,7 +20032,7 @@
       <w:r>
         <w:t xml:space="preserve">Micheli, Marco, et al. “</w:t>
       </w:r>
-      <w:hyperlink w:history="1" r:id="rIdwkmhqnokrbu4h6s9gru5v">
+      <w:hyperlink w:history="1" r:id="rIdwohpvbyjsd_yewiu3yyod">
         <w:r>
           <w:rPr>
             <w:color w:val="0563C1"/>
@@ -20036,7 +20060,7 @@
       <w:r>
         <w:t xml:space="preserve">‘Oumuamua ISSI Team. “</w:t>
       </w:r>
-      <w:hyperlink w:history="1" r:id="rIdlegyfo5bed58sjspvojoy">
+      <w:hyperlink w:history="1" r:id="rIdzhdth1iwowcd9gzxricao">
         <w:r>
           <w:rPr>
             <w:color w:val="0563C1"/>
@@ -20064,7 +20088,7 @@
       <w:r>
         <w:t xml:space="preserve">Staff at the National Astronomy and Ionosphere Center. “</w:t>
       </w:r>
-      <w:hyperlink w:history="1" r:id="rIdhrjqz7alkphjvxojeqcoo">
+      <w:hyperlink w:history="1" r:id="rId01tjatkpcjyr1_eb6wn_k">
         <w:r>
           <w:rPr>
             <w:color w:val="0563C1"/>
@@ -20128,7 +20152,7 @@
       <w:r>
         <w:t xml:space="preserve">Riley, James C. “</w:t>
       </w:r>
-      <w:hyperlink w:history="1" r:id="rIdvob1f_srj4pde0mxaowue">
+      <w:hyperlink w:history="1" r:id="rIddjqh3byanp--ady9kbg_e">
         <w:r>
           <w:rPr>
             <w:color w:val="0563C1"/>
@@ -20156,7 +20180,7 @@
       <w:r>
         <w:t xml:space="preserve">Bliss, Michael. </w:t>
       </w:r>
-      <w:hyperlink w:history="1" r:id="rIdgafh6xa1zzmi_dooqciuz">
+      <w:hyperlink w:history="1" r:id="rIdemtvadtkwc9tbl6y1bd91">
         <w:r>
           <w:rPr>
             <w:color w:val="0563C1"/>
@@ -20184,7 +20208,7 @@
       <w:r>
         <w:t xml:space="preserve">Reverby, Susan M. </w:t>
       </w:r>
-      <w:hyperlink w:history="1" r:id="rIdchsxfqoa5pnzn28iwv_j5">
+      <w:hyperlink w:history="1" r:id="rId338asebckit0eue92nqlu">
         <w:r>
           <w:rPr>
             <w:color w:val="0563C1"/>
@@ -20212,7 +20236,7 @@
       <w:r>
         <w:t xml:space="preserve">Keefe, Patrick Radden. </w:t>
       </w:r>
-      <w:hyperlink w:history="1" r:id="rIdemkp3sdt_af5cr-o93lqo">
+      <w:hyperlink w:history="1" r:id="rIdznetlvjudgqknbjij0yhe">
         <w:r>
           <w:rPr>
             <w:color w:val="0563C1"/>
@@ -20240,7 +20264,7 @@
       <w:r>
         <w:t xml:space="preserve">Antimicrobial Resistance Collaborators. “</w:t>
       </w:r>
-      <w:hyperlink w:history="1" r:id="rIdei-moydwaztkn19sei3n_">
+      <w:hyperlink w:history="1" r:id="rIdbhbtbdmgn-tk_5fgsngsy">
         <w:r>
           <w:rPr>
             <w:color w:val="0563C1"/>
@@ -20268,7 +20292,7 @@
       <w:r>
         <w:t xml:space="preserve">Van Bressem, Marie-Françoise, et al. “</w:t>
       </w:r>
-      <w:hyperlink w:history="1" r:id="rIdjy3rmtdhsdoheizt5c1ev">
+      <w:hyperlink w:history="1" r:id="rIdf1ckjeswzroqehnnizbxg">
         <w:r>
           <w:rPr>
             <w:color w:val="0563C1"/>
@@ -20296,7 +20320,7 @@
       <w:r>
         <w:t xml:space="preserve">Oshinsky, David M. </w:t>
       </w:r>
-      <w:hyperlink w:history="1" r:id="rIdjvqgaescdmkvebws2dvkh">
+      <w:hyperlink w:history="1" r:id="rId-wtldvq28i4i58s1y6u6p">
         <w:r>
           <w:rPr>
             <w:color w:val="0563C1"/>
@@ -20324,7 +20348,7 @@
       <w:r>
         <w:t xml:space="preserve">Polack, Fernando P., et al. “</w:t>
       </w:r>
-      <w:hyperlink w:history="1" r:id="rIdhabsvf63znn4tjncjdfec">
+      <w:hyperlink w:history="1" r:id="rId68kqki7c6fs-mlgotaanc">
         <w:r>
           <w:rPr>
             <w:color w:val="0563C1"/>
@@ -20372,7 +20396,7 @@
       <w:r>
         <w:t xml:space="preserve">Arrhenius, Svante. “</w:t>
       </w:r>
-      <w:hyperlink w:history="1" r:id="rIdb1bn90bmlw3s2hel0ca-f">
+      <w:hyperlink w:history="1" r:id="rIdaohtxsvt0huyp3gv1tvmx">
         <w:r>
           <w:rPr>
             <w:color w:val="0563C1"/>
@@ -20400,7 +20424,7 @@
       <w:r>
         <w:t xml:space="preserve">Philip, Sjoukje Y., et al. “</w:t>
       </w:r>
-      <w:hyperlink w:history="1" r:id="rIdyjbqhmj-p3aa9uyubl0ql">
+      <w:hyperlink w:history="1" r:id="rIda1gbvhhu-iflqondzvkcl">
         <w:r>
           <w:rPr>
             <w:color w:val="0563C1"/>
@@ -20428,7 +20452,7 @@
       <w:r>
         <w:t xml:space="preserve">Supran, G., S. Rahmstorf, and N. Oreskes. “</w:t>
       </w:r>
-      <w:hyperlink w:history="1" r:id="rIdzb0qbdav1c37cfgpjczth">
+      <w:hyperlink w:history="1" r:id="rId2cjdfz3u8a_x41bqru-eh">
         <w:r>
           <w:rPr>
             <w:color w:val="0563C1"/>
@@ -20456,7 +20480,7 @@
       <w:r>
         <w:t xml:space="preserve">Witze, Alexandra. “</w:t>
       </w:r>
-      <w:hyperlink w:history="1" r:id="rIdcrua_n3y5kim7zpbjty1e">
+      <w:hyperlink w:history="1" r:id="rIdixgmzjq8jhn4cbaekkzcd">
         <w:r>
           <w:rPr>
             <w:color w:val="0563C1"/>
@@ -20484,7 +20508,7 @@
       <w:r>
         <w:t xml:space="preserve">IPCC. </w:t>
       </w:r>
-      <w:hyperlink w:history="1" r:id="rIdffd6kvcf_h1qs9s_1zyca">
+      <w:hyperlink w:history="1" r:id="rIdqqze2kjz761bt1hrymu_k">
         <w:r>
           <w:rPr>
             <w:color w:val="0563C1"/>
@@ -20512,7 +20536,7 @@
       <w:r>
         <w:t xml:space="preserve">Morlighem, Mathieu, et al. “</w:t>
       </w:r>
-      <w:hyperlink w:history="1" r:id="rIds26rdlprto1zv_pi1_5f_">
+      <w:hyperlink w:history="1" r:id="rIdpt7vopezqnfswjcfyuj5x">
         <w:r>
           <w:rPr>
             <w:color w:val="0563C1"/>
@@ -20540,7 +20564,7 @@
       <w:r>
         <w:t xml:space="preserve">IMBIE Team. “</w:t>
       </w:r>
-      <w:hyperlink w:history="1" r:id="rId5kvozryvx6uw-qrqm458r">
+      <w:hyperlink w:history="1" r:id="rIdtlzhadbb69dxtje2ycdgr">
         <w:r>
           <w:rPr>
             <w:color w:val="0563C1"/>
@@ -20568,7 +20592,7 @@
       <w:r>
         <w:t xml:space="preserve">Joughin, Ian, Benjamin E. Smith, and Brooke Medley. “</w:t>
       </w:r>
-      <w:hyperlink w:history="1" r:id="rIdweqxhzvs4fo_wefornke0">
+      <w:hyperlink w:history="1" r:id="rIdpf_rwgyixiqfa0bipy5gc">
         <w:r>
           <w:rPr>
             <w:color w:val="0563C1"/>
@@ -20596,7 +20620,7 @@
       <w:r>
         <w:t xml:space="preserve">Secretariat of the Antarctic Treaty. “</w:t>
       </w:r>
-      <w:hyperlink w:history="1" r:id="rIdm3nlbilzaqlrztufxgx0k">
+      <w:hyperlink w:history="1" r:id="rIdsf_o1tpy0c18mjdjsk7uv">
         <w:r>
           <w:rPr>
             <w:color w:val="0563C1"/>
@@ -20624,7 +20648,7 @@
       <w:r>
         <w:t xml:space="preserve">Office of the Historian, US Department of State. </w:t>
       </w:r>
-      <w:hyperlink w:history="1" r:id="rIdis2w-x1l9q2c-hwtipbu_">
+      <w:hyperlink w:history="1" r:id="rIdhyujexnnon4tpdkixcpio">
         <w:r>
           <w:rPr>
             <w:color w:val="0563C1"/>
@@ -20652,7 +20676,7 @@
       <w:r>
         <w:t xml:space="preserve">“‘Greenland Belongs to Greenland’: </w:t>
       </w:r>
-      <w:hyperlink w:history="1" r:id="rIdq_5m_irhg8tjgcl5y5wr-">
+      <w:hyperlink w:history="1" r:id="rIddmynz5jxmpwerjdb8nuar">
         <w:r>
           <w:rPr>
             <w:color w:val="0563C1"/>
@@ -20680,7 +20704,7 @@
       <w:r>
         <w:t xml:space="preserve">BBC News. Report on </w:t>
       </w:r>
-      <w:hyperlink w:history="1" r:id="rId2yttahgl_h8mmqxqykvfk">
+      <w:hyperlink w:history="1" r:id="rId_npfnhswtlfevs1zgsq2y">
         <w:r>
           <w:rPr>
             <w:color w:val="0563C1"/>
@@ -20708,7 +20732,7 @@
       <w:r>
         <w:t xml:space="preserve">BBC News. </w:t>
       </w:r>
-      <w:hyperlink w:history="1" r:id="rIdout-f3v8qr2wxkz110e9u">
+      <w:hyperlink w:history="1" r:id="rIdarrg38vgy639h466rdho4">
         <w:r>
           <w:rPr>
             <w:color w:val="0563C1"/>
@@ -20736,7 +20760,7 @@
       <w:r>
         <w:t xml:space="preserve">Statistics Greenland. “</w:t>
       </w:r>
-      <w:hyperlink w:history="1" r:id="rIdajrqpohctj_o92nngyx1w">
+      <w:hyperlink w:history="1" r:id="rIdrinbpzt3uvegvw9jwkfww">
         <w:r>
           <w:rPr>
             <w:color w:val="0563C1"/>
@@ -20800,7 +20824,7 @@
       <w:r>
         <w:t xml:space="preserve">COVID-19 National Preparedness Collaborators. “</w:t>
       </w:r>
-      <w:hyperlink w:history="1" r:id="rId72nje5m8llah3es0a7jov">
+      <w:hyperlink w:history="1" r:id="rIdtamcubnd6ww3tvawooepb">
         <w:r>
           <w:rPr>
             <w:color w:val="0563C1"/>
@@ -20828,7 +20852,7 @@
       <w:r>
         <w:t xml:space="preserve">Msemburi, William, et al. “</w:t>
       </w:r>
-      <w:hyperlink w:history="1" r:id="rIdof06hv94ufzjczn_hgf6l">
+      <w:hyperlink w:history="1" r:id="rIdbifgcncuot02w1br36xis">
         <w:r>
           <w:rPr>
             <w:color w:val="0563C1"/>
@@ -20912,7 +20936,7 @@
       <w:r>
         <w:t xml:space="preserve">Jinek, Martin, et al. “</w:t>
       </w:r>
-      <w:hyperlink w:history="1" r:id="rIdqkol3ngzsautg_mupwadb">
+      <w:hyperlink w:history="1" r:id="rIdakjlqxgied3pumvifmhvs">
         <w:r>
           <w:rPr>
             <w:color w:val="0563C1"/>
@@ -20940,7 +20964,7 @@
       <w:r>
         <w:t xml:space="preserve">Fehilly, Carole B., S. M. Willadsen, and Elizabeth M. Tucker. “</w:t>
       </w:r>
-      <w:hyperlink w:history="1" r:id="rIdfztg6uejzth7wl2uw5vag">
+      <w:hyperlink w:history="1" r:id="rIdudatxtrruk-42u2ctnmbc">
         <w:r>
           <w:rPr>
             <w:color w:val="0563C1"/>
@@ -20988,7 +21012,7 @@
       <w:r>
         <w:t xml:space="preserve">Ganopolski, A., R. Winkelmann, and H. J. Schellnhuber. “</w:t>
       </w:r>
-      <w:hyperlink w:history="1" r:id="rId3qtspkhk6b4mzhuyoaptg">
+      <w:hyperlink w:history="1" r:id="rIdfrwngzvcmy7os3dt9ct9y">
         <w:r>
           <w:rPr>
             <w:color w:val="0563C1"/>
@@ -21036,7 +21060,7 @@
       <w:r>
         <w:t xml:space="preserve">Hawking, S. W. “</w:t>
       </w:r>
-      <w:hyperlink w:history="1" r:id="rId3xnvdorr93eafdwh5gyfb">
+      <w:hyperlink w:history="1" r:id="rId1v1m3rjws6lzstz2eszza">
         <w:r>
           <w:rPr>
             <w:color w:val="0563C1"/>
@@ -21064,7 +21088,7 @@
       <w:r>
         <w:t xml:space="preserve">LIGO Scientific Collaboration and Virgo Collaboration. “</w:t>
       </w:r>
-      <w:hyperlink w:history="1" r:id="rIdqf22e-qjcovqhd3savzuw">
+      <w:hyperlink w:history="1" r:id="rIdz-robqlplkxdym3g53-fp">
         <w:r>
           <w:rPr>
             <w:color w:val="0563C1"/>
@@ -21092,7 +21116,7 @@
       <w:r>
         <w:t xml:space="preserve">ATLAS Collaboration. “</w:t>
       </w:r>
-      <w:hyperlink w:history="1" r:id="rIdoqi8r5-dtu3c1uae4uori">
+      <w:hyperlink w:history="1" r:id="rId3y0qe4d6aape_mr1t4wjq">
         <w:r>
           <w:rPr>
             <w:color w:val="0563C1"/>
@@ -21120,7 +21144,7 @@
       <w:r>
         <w:t xml:space="preserve">Abu-Shawareb, H., et al. (Indirect Drive ICF Collaboration). “</w:t>
       </w:r>
-      <w:hyperlink w:history="1" r:id="rIdu97ojmgj30wqxbs0slfym">
+      <w:hyperlink w:history="1" r:id="rIdipn-waspa6msmzwrd5z11">
         <w:r>
           <w:rPr>
             <w:color w:val="0563C1"/>
@@ -21172,7 +21196,7 @@
       <w:pPr>
         <w:spacing w:after="200"/>
       </w:pPr>
-      <w:hyperlink w:history="1" r:id="rId0bok81nxyzhvvqxkaz3ln">
+      <w:hyperlink w:history="1" r:id="rIda1_q4ly35_noaj_kwew7d">
         <w:r>
           <w:rPr>
             <w:b/>
@@ -21205,7 +21229,7 @@
       <w:pPr>
         <w:spacing w:after="200"/>
       </w:pPr>
-      <w:hyperlink w:history="1" r:id="rId_v4epn-79asu8uzzqxtcn">
+      <w:hyperlink w:history="1" r:id="rId3p2ftlmto6gojn9wcbjps">
         <w:r>
           <w:rPr>
             <w:b/>
@@ -21238,7 +21262,7 @@
       <w:pPr>
         <w:spacing w:after="200"/>
       </w:pPr>
-      <w:hyperlink w:history="1" r:id="rId_49p9qla4nedbhhtedadx">
+      <w:hyperlink w:history="1" r:id="rIdwn6js2thkuhwyacm9hngr">
         <w:r>
           <w:rPr>
             <w:b/>
@@ -21271,7 +21295,7 @@
       <w:pPr>
         <w:spacing w:after="200"/>
       </w:pPr>
-      <w:hyperlink w:history="1" r:id="rIda7menkyckcnhwbpsyrrtw">
+      <w:hyperlink w:history="1" r:id="rId5_8ngvsluwwgajefzkq8a">
         <w:r>
           <w:rPr>
             <w:b/>
@@ -21304,7 +21328,7 @@
       <w:pPr>
         <w:spacing w:after="200"/>
       </w:pPr>
-      <w:hyperlink w:history="1" r:id="rId2jav8bwsdlhfhopv91sru">
+      <w:hyperlink w:history="1" r:id="rIdp2iyab9gov_gdgwhqfbcs">
         <w:r>
           <w:rPr>
             <w:b/>
@@ -21337,7 +21361,7 @@
       <w:pPr>
         <w:spacing w:after="200"/>
       </w:pPr>
-      <w:hyperlink w:history="1" r:id="rId3rbxbvczmhg9s4wtg4djj">
+      <w:hyperlink w:history="1" r:id="rIdwkaf-ub7ofydkvnbdev2z">
         <w:r>
           <w:rPr>
             <w:b/>
@@ -21370,7 +21394,7 @@
       <w:pPr>
         <w:spacing w:after="200"/>
       </w:pPr>
-      <w:hyperlink w:history="1" r:id="rIdaakyfhsg6ev6-csmpc6tv">
+      <w:hyperlink w:history="1" r:id="rIdntr__wkta4fcitafnjifr">
         <w:r>
           <w:rPr>
             <w:b/>
@@ -21425,7 +21449,7 @@
       <w:pPr>
         <w:spacing w:after="200"/>
       </w:pPr>
-      <w:hyperlink w:history="1" r:id="rIdmbmjqhpri4i-lscg8qixn">
+      <w:hyperlink w:history="1" r:id="rId6fia12zc1yao_a8y3humg">
         <w:r>
           <w:rPr>
             <w:b/>
@@ -21458,7 +21482,7 @@
       <w:pPr>
         <w:spacing w:after="200"/>
       </w:pPr>
-      <w:hyperlink w:history="1" r:id="rIdmdbdzdqonpngudq0-m-cq">
+      <w:hyperlink w:history="1" r:id="rIdw13ei6_wmuozuvbqjem2m">
         <w:r>
           <w:rPr>
             <w:b/>
@@ -21491,7 +21515,7 @@
       <w:pPr>
         <w:spacing w:after="200"/>
       </w:pPr>
-      <w:hyperlink w:history="1" r:id="rIdinv72zrdbtn3h-hm4hkks">
+      <w:hyperlink w:history="1" r:id="rIdxgnlf39fxz8tqxq77e7-v">
         <w:r>
           <w:rPr>
             <w:b/>
@@ -21524,7 +21548,7 @@
       <w:pPr>
         <w:spacing w:after="200"/>
       </w:pPr>
-      <w:hyperlink w:history="1" r:id="rIdmzsi4qtlhuqoluv0hgxnm">
+      <w:hyperlink w:history="1" r:id="rIdozkvbbc-2rg7bwnmai5zc">
         <w:r>
           <w:rPr>
             <w:b/>
@@ -21557,7 +21581,7 @@
       <w:pPr>
         <w:spacing w:after="200"/>
       </w:pPr>
-      <w:hyperlink w:history="1" r:id="rIdi4jb8hxaunedeer929chp">
+      <w:hyperlink w:history="1" r:id="rId5tmu1y06oati57byrjqsl">
         <w:r>
           <w:rPr>
             <w:b/>
@@ -21590,7 +21614,7 @@
       <w:pPr>
         <w:spacing w:after="200"/>
       </w:pPr>
-      <w:hyperlink w:history="1" r:id="rIdfuvkehkqgnkd4soratuq-">
+      <w:hyperlink w:history="1" r:id="rId8dqs1xidvcc2o8soj-4yf">
         <w:r>
           <w:rPr>
             <w:b/>
@@ -21623,7 +21647,7 @@
       <w:pPr>
         <w:spacing w:after="200"/>
       </w:pPr>
-      <w:hyperlink w:history="1" r:id="rIdoielt9ebnyyns_2ww0-d7">
+      <w:hyperlink w:history="1" r:id="rIduxs-zbxpfuvy7rdul0zfz">
         <w:r>
           <w:rPr>
             <w:b/>
@@ -21656,7 +21680,7 @@
       <w:pPr>
         <w:spacing w:after="200"/>
       </w:pPr>
-      <w:hyperlink w:history="1" r:id="rIdkjcci-mfydmy7o5k7dgik">
+      <w:hyperlink w:history="1" r:id="rIdm1tqnnpek35p3qldgitx5">
         <w:r>
           <w:rPr>
             <w:b/>
@@ -21689,7 +21713,7 @@
       <w:pPr>
         <w:spacing w:after="200"/>
       </w:pPr>
-      <w:hyperlink w:history="1" r:id="rIdzmwtu-8kr9zdjh9o1pojy">
+      <w:hyperlink w:history="1" r:id="rIdvqkhey5ktejesbufvzmm1">
         <w:r>
           <w:rPr>
             <w:b/>
@@ -21722,7 +21746,7 @@
       <w:pPr>
         <w:spacing w:after="200"/>
       </w:pPr>
-      <w:hyperlink w:history="1" r:id="rIdvp6vb47lzio-clakrmqtw">
+      <w:hyperlink w:history="1" r:id="rIddwha67t4elz2bhaq72biy">
         <w:r>
           <w:rPr>
             <w:b/>
@@ -21755,7 +21779,7 @@
       <w:pPr>
         <w:spacing w:after="200"/>
       </w:pPr>
-      <w:hyperlink w:history="1" r:id="rIdsobwjfvrgbujwdcn5_ivn">
+      <w:hyperlink w:history="1" r:id="rIdkilf9czdn7bv10wy2mkj3">
         <w:r>
           <w:rPr>
             <w:b/>
@@ -21788,7 +21812,7 @@
       <w:pPr>
         <w:spacing w:after="200"/>
       </w:pPr>
-      <w:hyperlink w:history="1" r:id="rIdsmrkctyl4pkoe40d1oep9">
+      <w:hyperlink w:history="1" r:id="rIdrewsf-0ryvdiezizbfbj9">
         <w:r>
           <w:rPr>
             <w:b/>
@@ -21821,7 +21845,7 @@
       <w:pPr>
         <w:spacing w:after="200"/>
       </w:pPr>
-      <w:hyperlink w:history="1" r:id="rIdimada96dfblvp3vlpcp10">
+      <w:hyperlink w:history="1" r:id="rId8jelfm-yehqzl0c89h2vl">
         <w:r>
           <w:rPr>
             <w:b/>

</xml_diff>